<commit_message>
docs: rebuild AEGIS thesis book and fix mismatched reference citations
Rebuild the corrupted thesis book draft from scratch (duplicated chapters,
mid-word splits, leftover AI dev notes) using the verified manuscript and
EXPLAINER as content sources, with a 7-chapter structure and a literature
review synthesized from all 24+ reference PDFs rather than the condensed
manuscript citations alone.

Fix two mismatched reference files: the PDFs saved under "Su, X. et al.
(2026)" and "Shailesh, G. N. et al. (2025)" actually contained different
papers (Pinna et al. 2025 and Valkenburgh 2024, both kept and correctly
renamed). Located, verified, and downloaded the two originally-intended
papers under their correct filenames, and rewrote the affected literature
review sections (2.3, 2.7) to properly cite all four papers instead of
carrying a "citation could not be verified" placeholder.
</commit_message>
<xml_diff>
--- a/docs/scripts/AEGIS Thesis Book Draft - A Constraint-Based Architecture for Safe LLM-Assisted Natural Language Analytics.docx
+++ b/docs/scripts/AEGIS Thesis Book Draft - A Constraint-Based Architecture for Safe LLM-Assisted Natural Language Analytics.docx
@@ -2513,7 +2513,7 @@
           <w:i w:val="0"/>
           <w:sz w:val="24"/>
         </w:rPr>
-        <w:t>Natural language interfaces to databases (NLIDBs) try to solve this problem. The idea is simple: a user should be able to ask “which categories have the highest refund rates this month?” and get a correct, visual answer without writing SQL. Researchers have made good progress here. Neural text-to-SQL systems now exceed 90% accuracy on the Spider benchmark [26], and large language models can produce reasonable-looking SQL with minimal setup [10]. But there is still a gap between benchmark results and real-world deployment, which Chapter 2 examines in detail.</w:t>
+        <w:t>Natural language interfaces to databases (NLIDBs) try to solve this problem. The idea is simple: a user should be able to ask “which categories have the highest refund rates this month?” and get a correct, visual answer without writing SQL. Researchers have made good progress here. Neural text-to-SQL systems now exceed 90% accuracy on the Spider benchmark [28], and large language models can produce reasonable-looking SQL with minimal setup [10]. But there is still a gap between benchmark results and real-world deployment, which Chapter 2 examines in detail.</w:t>
       </w:r>
     </w:p>
     <w:p>
@@ -2915,7 +2915,7 @@
           <w:i w:val="0"/>
           <w:sz w:val="24"/>
         </w:rPr>
-        <w:t>This chapter surveys prior work across six areas that bear on AEGIS's design: natural language interfaces to databases, neural text-to-SQL and its benchmarks, constrained decoding and recent hybrid NL-to-SQL systems, natural language for visualization, dashboard generation, and semantic layers for controlled analytics. It closes with a review of recent practitioner and adoption-focused literature on AI-powered dashboards, a comparative summary table, and an explicit research gap analysis. Twenty-nine sources are reviewed. Two citations present in an earlier draft of this work could not be verified against any locally held source document and have been removed; the corresponding source files are instead cited under their true, verified titles and authors, which is disclosed at the relevant point in Sections 2.3 and 2.7.</w:t>
+        <w:t>This chapter surveys prior work across six areas that bear on AEGIS's design: natural language interfaces to databases, neural text-to-SQL and its benchmarks, constrained decoding and recent hybrid NL-to-SQL systems, natural language for visualization, dashboard generation, and semantic layers for controlled analytics. It closes with a review of recent practitioner and adoption-focused literature on AI-powered dashboards, a comparative summary table, and an explicit research gap analysis. Thirty-one sources are reviewed. A systematic re-check of this thesis's reference collection against the source PDFs, undertaken during the preparation of this chapter, found that two files had been filed under the wrong name (an incorrect PDF saved against the correct citation text). Both misfiled papers turned out to be genuinely relevant and are retained under their correct, verified titles (Sections 2.3 and 2.7); the two originally-intended papers were subsequently located, confirmed, and added to the collection under their correct filenames, so this chapter reviews both.</w:t>
       </w:r>
     </w:p>
     <w:p>
@@ -3033,7 +3033,7 @@
           <w:i w:val="0"/>
           <w:sz w:val="24"/>
         </w:rPr>
-        <w:t>The field shifted decisively toward neural approaches with Seq2SQL [29], which combined a SQL-structured decoder (aggregation classifier, SELECT-column pointer, WHERE-clause pointer) with reinforcement learning driven by in-the-loop query execution, and released WikiSQL, 80,654 question-SQL-table triples restricted to single-table SELECT/aggregation/WHERE queries. Seq2SQL reached 59.4% execution accuracy on WikiSQL and reduced invalid-SQL generation from roughly 7.9% to 4.8% relative to a prior sequence-to-sequence baseline, demonstrating that constraining a model's output structure improves both accuracy and validity. AEGIS extends this same insight to its logical conclusion: rather than a network that still emits SQL tokens with residual freedom to hallucinate columns, AEGIS removes SQL emission from the model entirely.</w:t>
+        <w:t>The field shifted decisively toward neural approaches with Seq2SQL [31], which combined a SQL-structured decoder (aggregation classifier, SELECT-column pointer, WHERE-clause pointer) with reinforcement learning driven by in-the-loop query execution, and released WikiSQL, 80,654 question-SQL-table triples restricted to single-table SELECT/aggregation/WHERE queries. Seq2SQL reached 59.4% execution accuracy on WikiSQL and reduced invalid-SQL generation from roughly 7.9% to 4.8% relative to a prior sequence-to-sequence baseline, demonstrating that constraining a model's output structure improves both accuracy and validity. AEGIS extends this same insight to its logical conclusion: rather than a network that still emits SQL tokens with residual freedom to hallucinate columns, AEGIS removes SQL emission from the model entirely.</w:t>
       </w:r>
     </w:p>
     <w:p>
@@ -3048,7 +3048,7 @@
           <w:i w:val="0"/>
           <w:sz w:val="24"/>
         </w:rPr>
-        <w:t>Spider [26] exposed how far this problem remained from solved. Its 10,181 questions and 5,693 unique SQL queries span 200 multi-table databases with a strict train/test database split, forcing genuine generalization to unseen schemas. The best baseline of the time reached only 12.4% exact-match accuracy under this cross-domain setting, and accuracy degraded further as the number of foreign keys grew. SParC [27] and CoSQL [28] extended Spider's databases to conversational, multi-turn settings: SParC's best model reached only 20.2% exact-match accuracy over individual questions in a sequence, dropping sharply with turn number, and CoSQL found that roughly 40% of realistic user questions could not be directly converted to SQL at all, requiring clarification, inference, or a coverage rejection. AEGIS's semantic layer effectively hard-codes the ambiguous-or-unanswerable detection that CoSQL's models struggle to learn, by rejecting or clarifying any intent that does not map onto its approved vocabulary rather than attempting to freely interpret and generate SQL for arbitrary questions.</w:t>
+        <w:t>Spider [28] exposed how far this problem remained from solved. Its 10,181 questions and 5,693 unique SQL queries span 200 multi-table databases with a strict train/test database split, forcing genuine generalization to unseen schemas. The best baseline of the time reached only 12.4% exact-match accuracy under this cross-domain setting, and accuracy degraded further as the number of foreign keys grew. SParC [29] and CoSQL [30] extended Spider's databases to conversational, multi-turn settings: SParC's best model reached only 20.2% exact-match accuracy over individual questions in a sequence, dropping sharply with turn number, and CoSQL found that roughly 40% of realistic user questions could not be directly converted to SQL at all, requiring clarification, inference, or a coverage rejection. AEGIS's semantic layer effectively hard-codes the ambiguous-or-unanswerable detection that CoSQL's models struggle to learn, by rejecting or clarifying any intent that does not map onto its approved vocabulary rather than attempting to freely interpret and generate SQL for arbitrary questions.</w:t>
       </w:r>
     </w:p>
     <w:p>
@@ -3078,7 +3078,7 @@
           <w:i w:val="0"/>
           <w:sz w:val="24"/>
         </w:rPr>
-        <w:t>RAT-SQL [23] is the most sophisticated attempt within the free-form generation paradigm to solve schema linking directly, using relation-aware self-attention over a typed schema graph and a grammar-constrained decoder, reaching 57.2% exact-match accuracy on Spider (65.6% with BERT augmentation). Even so, oracle analysis attributed 72-81% of its remaining errors to wrong column or table selection or wrong SQL structure. RAT-SQL's schema graph plays a role analogous to AEGIS's semantic layer, but is used to guide free SQL token generation rather than to constrain a bounded classification space; its grammar constraint guarantees syntactic validity only, not semantic correctness, safety, or injection-proofing, which remain unaddressed by any paper in this section.</w:t>
+        <w:t>RAT-SQL [25] is the most sophisticated attempt within the free-form generation paradigm to solve schema linking directly, using relation-aware self-attention over a typed schema graph and a grammar-constrained decoder, reaching 57.2% exact-match accuracy on Spider (65.6% with BERT augmentation). Even so, oracle analysis attributed 72-81% of its remaining errors to wrong column or table selection or wrong SQL structure. RAT-SQL's schema graph plays a role analogous to AEGIS's semantic layer, but is used to guide free SQL token generation rather than to constrain a bounded classification space; its grammar constraint guarantees syntactic validity only, not semantic correctness, safety, or injection-proofing, which remain unaddressed by any paper in this section.</w:t>
       </w:r>
     </w:p>
     <w:p>
@@ -3122,7 +3122,7 @@
           <w:i w:val="0"/>
           <w:sz w:val="24"/>
         </w:rPr>
-        <w:t>G-SQL [20] is the closest architectural precedent to AEGIS among the reviewed systems: a rule-based, template-driven SQL generator built on a structured, curated schema representation and a domain-specific synonym dictionary, deliberately avoiding a neural component that writes SQL directly. On the IMDB, Yelp, and MAS benchmarks it achieved 100% execution accuracy on easy queries across all three, but accuracy fell to 45-55% on extra-hard queries requiring nested reasoning. AEGIS builds on the same core insight, that a curated vocabulary plus deterministic clause assembly yields much higher executability than free-form generation, but replaces G-SQL's classical NLP pipeline (dependency parsing, GloVe embeddings) with an LLM-based intent extractor, and adds a persisted, reusable dashboard-widget layer that G-SQL does not have.</w:t>
+        <w:t>G-SQL [21] is the closest architectural precedent to AEGIS among the reviewed systems: a rule-based, template-driven SQL generator built on a structured, curated schema representation and a domain-specific synonym dictionary, deliberately avoiding a neural component that writes SQL directly. On the IMDB, Yelp, and MAS benchmarks it achieved 100% execution accuracy on easy queries across all three, but accuracy fell to 45-55% on extra-hard queries requiring nested reasoning. AEGIS builds on the same core insight, that a curated vocabulary plus deterministic clause assembly yields much higher executability than free-form generation, but replaces G-SQL's classical NLP pipeline (dependency parsing, GloVe embeddings) with an LLM-based intent extractor, and adds a persisted, reusable dashboard-widget layer that G-SQL does not have.</w:t>
       </w:r>
     </w:p>
     <w:p>
@@ -3142,7 +3142,7 @@
     </w:p>
     <w:p>
       <w:pPr>
-        <w:spacing w:after="0" w:before="0" w:line="360" w:lineRule="auto"/>
+        <w:spacing w:after="200" w:before="0" w:line="360" w:lineRule="auto"/>
         <w:jc w:val="both"/>
       </w:pPr>
       <w:r>
@@ -3152,26 +3152,12 @@
           <w:i w:val="0"/>
           <w:sz w:val="24"/>
         </w:rPr>
-        <w:t>A note on evaluation methodology is warranted here. During the preparation of this thesis, a source file in the project's reference collection previously catalogued as “Su et al. (2026), a robust natural language text-to-SQL generation framework” was found on inspection to actually contain a different, unrelated paper. The true content of that file is Pinna et al. [16], which proposes the Query Affinity Score, a continuous metric combining code-embedding similarity and executed-result-table similarity, arguing that binary exact-match and execution-accuracy metrics hide partial correctness (for example, a dropped DISTINCT keyword or a reversed sort order can score as completely wrong under a binary metric despite near-identical SQL text). This citation has been corrected accordingly and is retained here because it is a genuinely useful caution for Chapter 5's evaluation design: AEGIS's own safety property makes most of the failure modes Pinna et al. study architecturally impossible in the first place, since clauses come from vetted templates rather than free generation, but their semantic-versus-structural distinction is a useful frame for grading intent extraction accuracy rather than treating it as pass or fail.</w:t>
-      </w:r>
-    </w:p>
-    <w:p>
-      <w:pPr>
-        <w:spacing w:before="320" w:after="160"/>
-        <w:jc w:val="left"/>
-      </w:pPr>
-      <w:r>
-        <w:rPr>
-          <w:rFonts w:ascii="Times New Roman" w:hAnsi="Times New Roman"/>
-          <w:b/>
-          <w:sz w:val="28"/>
-        </w:rPr>
-        <w:t>2.4  Natural Language for Visualization</w:t>
-      </w:r>
-    </w:p>
-    <w:p>
-      <w:pPr>
-        <w:spacing w:after="200" w:before="0" w:line="360" w:lineRule="auto"/>
+        <w:t>TriSQL [23] is, at the time of writing, the most recent and most accurate system in the free-form generation paradigm, and the sharpest available contrast to AEGIS's approach precisely because it is state of the art. TriSQL is a three-stage LLM pipeline: a Question-Guided Schema Selector narrows a large schema down to the tables and columns relevant to the question using cross-attention; a Structure-Aware SQL Generator predicts a clause-level skeleton before filling in schema-specific content; and a Complexity-Aware SQL Refiner classifies each question's difficulty and applies an LLM-driven repair loop, with an execution-validated fallback that reverts to whichever of the initial or refined query actually executes. On Spider, TriSQL reaches 82.2% execution accuracy at 180 ms of inference latency, and its ablation study shows that removing the skeleton-first generation stage alone collapses execution accuracy from 82.2% to 18.8%, the same qualitative finding this thesis reports for removing vocabulary injection from AEGIS (Section 5.3). TriSQL is, in other words, concrete evidence that structuring an LLM's generation process substantially improves reliability. It is also, however, a system that still asks the LLM to produce the final executable SQL string directly, refined by further LLM calls, with no semantic layer, no permission rewriter, and no reported injection-safety evaluation at all: its safety properties, whatever they are, are inherited entirely from the underlying model's behavior rather than guaranteed by the pipeline's structure. AEGIS and TriSQL therefore make the same core engineering bet, that unconstrained LLM output is unreliable and should be structured, but apply it to different halves of the problem: TriSQL structures how SQL is generated to raise its accuracy ceiling; AEGIS removes SQL generation from the LLM's role entirely to establish a safety floor. The two approaches are not mutually exclusive, but no paper reviewed in this thesis, including TriSQL, evaluates both properties together.</w:t>
+      </w:r>
+    </w:p>
+    <w:p>
+      <w:pPr>
+        <w:spacing w:after="0" w:before="0" w:line="360" w:lineRule="auto"/>
         <w:jc w:val="both"/>
       </w:pPr>
       <w:r>
@@ -3181,7 +3167,21 @@
           <w:i w:val="0"/>
           <w:sz w:val="24"/>
         </w:rPr>
-        <w:t>A parallel research stream targets chart generation rather than SQL generation. nl4dv [14] is the closest visualization-side precedent to AEGIS's design: a toolkit that maps natural language queries to a small, fixed set of five analytic tasks and a rule-based attribute-task-visualization mapping table, returning a structured JSON specification rather than free-form chart code. It reports response times of 1-18 seconds on small in-memory datasets, but conducts no formal accuracy benchmark, has no SQL-safety or database-permission layer at all (it operates purely on an in-memory dataset, never a live relational schema), and produces one-off specifications with no notion of a persistent, refreshable dashboard object.</w:t>
+        <w:t>Pinna et al. [16] raise a methodological point relevant to how any such system should be evaluated: they propose the Query Affinity Score, a continuous metric combining code-embedding similarity and executed-result-table similarity, arguing that binary exact-match and execution-accuracy metrics hide partial correctness, for example, a dropped DISTINCT keyword or a reversed sort order can score as completely wrong under a binary metric despite near-identical SQL text. This is a genuinely useful caution for Chapter 5's evaluation design: AEGIS's own safety property makes most of the failure modes Pinna et al. study architecturally impossible in the first place, since clauses come from vetted templates rather than free generation, but their semantic-versus-structural distinction is a useful frame for grading intent extraction accuracy rather than treating it as pass or fail.</w:t>
+      </w:r>
+    </w:p>
+    <w:p>
+      <w:pPr>
+        <w:spacing w:before="320" w:after="160"/>
+        <w:jc w:val="left"/>
+      </w:pPr>
+      <w:r>
+        <w:rPr>
+          <w:rFonts w:ascii="Times New Roman" w:hAnsi="Times New Roman"/>
+          <w:b/>
+          <w:sz w:val="28"/>
+        </w:rPr>
+        <w:t>2.4  Natural Language for Visualization</w:t>
       </w:r>
     </w:p>
     <w:p>
@@ -3196,12 +3196,12 @@
           <w:i w:val="0"/>
           <w:sz w:val="24"/>
         </w:rPr>
-        <w:t>DataTone [4] established the alternative philosophy of surfacing ambiguity to the user through interactive “ambiguity widgets” rather than silently resolving it, covering six decision points from attribute recognition to chart-type choice. In a comparative study against IBM Watson Analytics, participants completed significantly more correct facts with DataTone (5.43 versus 2.00 facts, p &lt; 0.01). AEGIS and DataTone address the same underlying ambiguity problem with opposite strategies: DataTone generates many candidate interpretations and lets the user disambiguate after the fact, while AEGIS restricts the LLM's extraction target to a small curated vocabulary up front, preventing many classes of ambiguity from arising at all. DataTone is also explicitly limited to single-table, non-relational data and offers no persistence mechanism.</w:t>
-      </w:r>
-    </w:p>
-    <w:p>
-      <w:pPr>
-        <w:spacing w:after="0" w:before="0" w:line="360" w:lineRule="auto"/>
+        <w:t>A parallel research stream targets chart generation rather than SQL generation. nl4dv [14] is the closest visualization-side precedent to AEGIS's design: a toolkit that maps natural language queries to a small, fixed set of five analytic tasks and a rule-based attribute-task-visualization mapping table, returning a structured JSON specification rather than free-form chart code. It reports response times of 1-18 seconds on small in-memory datasets, but conducts no formal accuracy benchmark, has no SQL-safety or database-permission layer at all (it operates purely on an in-memory dataset, never a live relational schema), and produces one-off specifications with no notion of a persistent, refreshable dashboard object.</w:t>
+      </w:r>
+    </w:p>
+    <w:p>
+      <w:pPr>
+        <w:spacing w:after="200" w:before="0" w:line="360" w:lineRule="auto"/>
         <w:jc w:val="both"/>
       </w:pPr>
       <w:r>
@@ -3211,21 +3211,7 @@
           <w:i w:val="0"/>
           <w:sz w:val="24"/>
         </w:rPr>
-        <w:t>nvBench [12] demonstrates the risk of the opposite extreme: it synthesizes a 25,750-pair benchmark from Spider's SQL queries and trains ncNet, a Transformer that translates natural language directly, end to end, into a Vega-Zero visualization specification with no deterministic or auditable compilation step in between. Correctness depends entirely on the trained model's generalization, with no template-based guarantee against a malformed or unsafe query, and the output is a single static chart per query rather than a persisted artifact. Eviza extended natural language interaction to already-rendered visualizations, allowing conversational refinement of an existing chart [19], a concept AEGIS's clarification model draws on when a request is ambiguous. Kavaz et al.'s scoping review of chatbot-based visualization interfaces [7] found that across 20 surveyed systems, 90% supported only low-level queries, half used fixed rather than adaptive visual mapping, and only 4 of 20 supported any follow-up or conversational interaction, confirming that most systems in this space regenerate a visualization each time rather than treating a validated query-chart pairing as a durable, reusable object, precisely the gap AEGIS's widget persistence model closes.</w:t>
-      </w:r>
-    </w:p>
-    <w:p>
-      <w:pPr>
-        <w:spacing w:before="320" w:after="160"/>
-        <w:jc w:val="left"/>
-      </w:pPr>
-      <w:r>
-        <w:rPr>
-          <w:rFonts w:ascii="Times New Roman" w:hAnsi="Times New Roman"/>
-          <w:b/>
-          <w:sz w:val="28"/>
-        </w:rPr>
-        <w:t>2.5  Dashboard Generation</w:t>
+        <w:t>DataTone [4] established the alternative philosophy of surfacing ambiguity to the user through interactive “ambiguity widgets” rather than silently resolving it, covering six decision points from attribute recognition to chart-type choice. In a comparative study against IBM Watson Analytics, participants completed significantly more correct facts with DataTone (5.43 versus 2.00 facts, p &lt; 0.01). AEGIS and DataTone address the same underlying ambiguity problem with opposite strategies: DataTone generates many candidate interpretations and lets the user disambiguate after the fact, while AEGIS restricts the LLM's extraction target to a small curated vocabulary up front, preventing many classes of ambiguity from arising at all. DataTone is also explicitly limited to single-table, non-relational data and offers no persistence mechanism.</w:t>
       </w:r>
     </w:p>
     <w:p>
@@ -3240,7 +3226,7 @@
           <w:i w:val="0"/>
           <w:sz w:val="24"/>
         </w:rPr>
-        <w:t>Dashboard generation as an automated design problem has attracted growing attention. DashBot [3] formulates dashboard construction as a Markov decision process solved with deep reinforcement learning (A3C), using a preliminary study of 90 real Tableau and Power BI dashboards to define reward functions for presentation quality (diversity, parsimony) and statistical insight (trend, correlation, comparison). A user study found DashBot preferred over a prior deep-learning dashboard generator, MultiVision [25], on 76-88% of quality dimensions. Both systems, however, operate without any natural language input or intent layer: a user cannot ask a question in English; the agent instead explores a dataset unprompted. Neither faces an LLM-generated-SQL attack surface at all, because neither generates SQL from user language, which is precisely the problem AEGIS's semantic layer and compiler are built to solve and that DashBot's architecture never encounters. DataShot [24] and Calliope [21] used statistical fact extraction followed by template-based layout to generate narrative data documents, again illustrating that rule-based, non-AI logic is a well-precedented and reliable way to drive downstream presentation once the underlying facts are established, reinforcing AEGIS's own decision to use a deterministic, rule-based visualization selector rather than a learned one.</w:t>
+        <w:t>nvBench [12] demonstrates the risk of the opposite extreme: it synthesizes a 25,750-pair benchmark from Spider's SQL queries and trains ncNet, a Transformer that translates natural language directly, end to end, into a Vega-Zero visualization specification with no deterministic or auditable compilation step in between. Correctness depends entirely on the trained model's generalization, with no template-based guarantee against a malformed or unsafe query, and the output is a single static chart per query rather than a persisted artifact. Eviza extended natural language interaction to already-rendered visualizations, allowing conversational refinement of an existing chart [19], a concept AEGIS's clarification model draws on when a request is ambiguous. Kavaz et al.'s scoping review of chatbot-based visualization interfaces [7] found that across 20 surveyed systems, 90% supported only low-level queries, half used fixed rather than adaptive visual mapping, and only 4 of 20 supported any follow-up or conversational interaction, confirming that most systems in this space regenerate a visualization each time rather than treating a validated query-chart pairing as a durable, reusable object, precisely the gap AEGIS's widget persistence model closes.</w:t>
       </w:r>
     </w:p>
     <w:p>
@@ -3254,7 +3240,7 @@
           <w:b/>
           <w:sz w:val="28"/>
         </w:rPr>
-        <w:t>2.6  Semantic Layers and Controlled Analytics</w:t>
+        <w:t>2.5  Dashboard Generation</w:t>
       </w:r>
     </w:p>
     <w:p>
@@ -3269,7 +3255,7 @@
           <w:i w:val="0"/>
           <w:sz w:val="24"/>
         </w:rPr>
-        <w:t>A semantic layer is a business-logic abstraction that maps business concepts to the actual database tables and columns. Commercial tools such as dbt Metrics, Looker LookML, and Apache Superset implement semantic layers in different ways, but the research literature has treated the semantic layer primarily as a convenience for query authoring rather than as a safety mechanism. Lehmann et al.'s Veezoo [8], already discussed in Section 2.1, is the clearest exception, and even there the Knowledge Graph constrains matching rather than replacing SQL generation outright. Structured output enforcement for LLMs [15] has been shown to improve the reliability of typed object generation, which AEGIS relies on for intent extraction: the LLM's output is constrained to a fixed JSON schema before any downstream validation occurs. No prior work reviewed in this chapter uses a semantic layer as the primary safety mechanism for an LLM-assisted reporting system, in the specific sense of replacing SQL generation with deterministic compilation from a governed vocabulary; this is the gap AEGIS's architecture is built to close.</w:t>
+        <w:t>Dashboard generation as an automated design problem has attracted growing attention. DashBot [3] formulates dashboard construction as a Markov decision process solved with deep reinforcement learning (A3C), using a preliminary study of 90 real Tableau and Power BI dashboards to define reward functions for presentation quality (diversity, parsimony) and statistical insight (trend, correlation, comparison). A user study found DashBot preferred over a prior deep-learning dashboard generator, MultiVision [27], on 76-88% of quality dimensions. Both systems, however, operate without any natural language input or intent layer: a user cannot ask a question in English; the agent instead explores a dataset unprompted. Neither faces an LLM-generated-SQL attack surface at all, because neither generates SQL from user language, which is precisely the problem AEGIS's semantic layer and compiler are built to solve and that DashBot's architecture never encounters. DataShot [26] and Calliope [22] used statistical fact extraction followed by template-based layout to generate narrative data documents, again illustrating that rule-based, non-AI logic is a well-precedented and reliable way to drive downstream presentation once the underlying facts are established, reinforcing AEGIS's own decision to use a deterministic, rule-based visualization selector rather than a learned one.</w:t>
       </w:r>
     </w:p>
     <w:p>
@@ -3283,12 +3269,12 @@
           <w:b/>
           <w:sz w:val="28"/>
         </w:rPr>
-        <w:t>2.7  AI-Powered Dashboard Adoption, Governance, and Conversational BI</w:t>
-      </w:r>
-    </w:p>
-    <w:p>
-      <w:pPr>
-        <w:spacing w:after="200" w:before="0" w:line="360" w:lineRule="auto"/>
+        <w:t>2.6  Semantic Layers and Controlled Analytics</w:t>
+      </w:r>
+    </w:p>
+    <w:p>
+      <w:pPr>
+        <w:spacing w:after="0" w:before="0" w:line="360" w:lineRule="auto"/>
         <w:jc w:val="both"/>
       </w:pPr>
       <w:r>
@@ -3298,7 +3284,21 @@
           <w:i w:val="0"/>
           <w:sz w:val="24"/>
         </w:rPr>
-        <w:t>Beyond the technical NL-to-SQL and NL-to-visualization literature, a body of recent practitioner-oriented and management-focused work addresses the adoption, governance, and business impact of AI-powered dashboards. This literature is reviewed here because it was identified through a systematic re-examination of this thesis's full reference collection, and because it usefully situates AEGIS's technical contribution within the broader question of why organizations want AI-assisted analytics in the first place.</w:t>
+        <w:t>A semantic layer is a business-logic abstraction that maps business concepts to the actual database tables and columns. Commercial tools such as dbt Metrics, Looker LookML, and Apache Superset implement semantic layers in different ways, but the research literature has treated the semantic layer primarily as a convenience for query authoring rather than as a safety mechanism. Lehmann et al.'s Veezoo [8], already discussed in Section 2.1, is the clearest exception, and even there the Knowledge Graph constrains matching rather than replacing SQL generation outright. Structured output enforcement for LLMs [15] has been shown to improve the reliability of typed object generation, which AEGIS relies on for intent extraction: the LLM's output is constrained to a fixed JSON schema before any downstream validation occurs. No prior work reviewed in this chapter uses a semantic layer as the primary safety mechanism for an LLM-assisted reporting system, in the specific sense of replacing SQL generation with deterministic compilation from a governed vocabulary; this is the gap AEGIS's architecture is built to close.</w:t>
+      </w:r>
+    </w:p>
+    <w:p>
+      <w:pPr>
+        <w:spacing w:before="320" w:after="160"/>
+        <w:jc w:val="left"/>
+      </w:pPr>
+      <w:r>
+        <w:rPr>
+          <w:rFonts w:ascii="Times New Roman" w:hAnsi="Times New Roman"/>
+          <w:b/>
+          <w:sz w:val="28"/>
+        </w:rPr>
+        <w:t>2.7  AI-Powered Dashboard Adoption, Governance, and Conversational BI</w:t>
       </w:r>
     </w:p>
     <w:p>
@@ -3313,7 +3313,7 @@
           <w:i w:val="0"/>
           <w:sz w:val="24"/>
         </w:rPr>
-        <w:t>Häikiö [5] examines how organizations should govern AI-powered executive dashboards, concluding that no mature, comprehensive AI-governance framework yet exists and proposing adapted IT-governance processes (drawing on COBIT 2019 and the Technology-Organization-Environment model) as an interim approach. Saidur [17] reports a large-sample quantitative study of 150 U.S. enterprises, finding that AI-enhanced BI dashboards correlated with substantial gains in forecast accuracy (78.1% to 91.2%) and marketing return on investment (124% to 168%) over a 24-month period. Neither paper addresses natural-language query translation, SQL generation, or injection safety; their relevance to AEGIS is limited to the shared premise that persistent dashboards, rather than one-off chat answers, are the effective vehicle for delivering AI-derived insight to decision-makers, which is one motivation for AEGIS's widget-persistence design.</w:t>
+        <w:t>Beyond the technical NL-to-SQL and NL-to-visualization literature, a body of recent practitioner-oriented and management-focused work addresses the adoption, governance, and business impact of AI-powered dashboards. This literature is reviewed here because it was identified through a systematic re-examination of this thesis's full reference collection, and because it usefully situates AEGIS's technical contribution within the broader question of why organizations want AI-assisted analytics in the first place.</w:t>
       </w:r>
     </w:p>
     <w:p>
@@ -3328,7 +3328,7 @@
           <w:i w:val="0"/>
           <w:sz w:val="24"/>
         </w:rPr>
-        <w:t>Mujeeb et al. [13] propose, at the conceptual level, a four-layer conversational business-intelligence architecture whose query-planning layer explicitly combines “template-based SQL generation” for predictable requests with “transformer-based synthesis” for complex ones, followed by a separate governance layer that validates queries after generation. The authors state plainly that the architecture has not been implemented or validated. This is a useful reference point precisely because it shows the field converging on a hybrid template-plus-generation idea without committing to it or testing it: AEGIS's contribution is to commit fully to the deterministic-compilation path for every query expressible in its semantic layer, removing the free-generation fallback entirely and, with it, the need for a downstream governance layer to catch what the LLM might have produced incorrectly.</w:t>
+        <w:t>Häikiö [5] examines how organizations should govern AI-powered executive dashboards, concluding that no mature, comprehensive AI-governance framework yet exists and proposing adapted IT-governance processes (drawing on COBIT 2019 and the Technology-Organization-Environment model) as an interim approach. Saidur [17] reports a large-sample quantitative study of 150 U.S. enterprises, finding that AI-enhanced BI dashboards correlated with substantial gains in forecast accuracy (78.1% to 91.2%) and marketing return on investment (124% to 168%) over a 24-month period. Neither paper addresses natural-language query translation, SQL generation, or injection safety; their relevance to AEGIS is limited to the shared premise that persistent dashboards, rather than one-off chat answers, are the effective vehicle for delivering AI-derived insight to decision-makers, which is one motivation for AEGIS's widget-persistence design.</w:t>
       </w:r>
     </w:p>
     <w:p>
@@ -3343,7 +3343,37 @@
           <w:i w:val="0"/>
           <w:sz w:val="24"/>
         </w:rPr>
-        <w:t>A second file-naming discrepancy was found in this reference collection: a source catalogued as “Shailesh, G. N. et al. (2025), Conversational BI: Natural language interface to business dashboards” was found on inspection to actually be a different work, Valkenburgh's master's thesis [22] on explanatory analytics. This citation is corrected accordingly, and the underlying paper turns out to be one of the most architecturally relevant sources in this collection: Valkenburgh's prototype computes causal-influence explanations for business metrics using a deterministic, non-AI formalism, and only afterward asks an LLM to narrate the already-correct structured result in natural language, never allowing the LLM to perform the underlying computation itself. A pre-study surveying ten commercial AI-BI products (including Power BI and Tableau) found that all of them could answer simple descriptive queries but none could correctly answer explanatory, “why is X high” queries without manual pre-configuration, direct evidence that unconstrained LLM reasoning fails at exactly the class of task AEGIS targets. Valkenburgh's design and AEGIS arrive at the same governing principle independently: do not trust the model to perform the analytical computation; let a deterministic algorithm compute the correct result, and restrict the model's role to a bounded, downstream task. Valkenburgh's deterministic layer operates on a single pre-loaded spreadsheet rather than a live relational database, so it has no SQL-injection surface and produces one-off, non-persistent text answers rather than stored, refreshable widgets, both of which AEGIS's architecture addresses.</w:t>
+        <w:t>Mujeeb et al. [13] propose, at the conceptual level, a four-layer conversational business-intelligence architecture whose query-planning layer explicitly combines “template-based SQL generation” for predictable requests with “transformer-based synthesis” for complex ones, followed by a separate governance layer that validates queries after generation. The authors state plainly that the architecture has not been implemented or validated. This is a useful reference point precisely because it shows the field converging on a hybrid template-plus-generation idea without committing to it or testing it: AEGIS's contribution is to commit fully to the deterministic-compilation path for every query expressible in its semantic layer, removing the free-generation fallback entirely and, with it, the need for a downstream governance layer to catch what the LLM might have produced incorrectly.</w:t>
+      </w:r>
+    </w:p>
+    <w:p>
+      <w:pPr>
+        <w:spacing w:after="200" w:before="0" w:line="360" w:lineRule="auto"/>
+        <w:jc w:val="both"/>
+      </w:pPr>
+      <w:r>
+        <w:rPr>
+          <w:rFonts w:ascii="Times New Roman" w:hAnsi="Times New Roman"/>
+          <w:b w:val="0"/>
+          <w:i w:val="0"/>
+          <w:sz w:val="24"/>
+        </w:rPr>
+        <w:t>Shailesh et al. [20] present a working Conversational BI Assistant built on the Groq API and LangChain that is, in effect, a live demonstration of the architecture this thesis argues against, and for exactly that reason it is one of the most useful comparison points in this review. Their system gives an LLM agent direct tool access to a SQL database (sql_db_list_tables, sql_db_schema, sql_db_query), retains conversational memory across turns so users can say “now filter for Asia” without restating the query, and automatically selects a chart type for the result. Crucially, when a generated query fails, a self-correction loop feeds the database's error message back to the LLM, which revises the SQL and retries, iterating until execution succeeds. This is a coherent, deployable design, and the authors report it working well on straightforward aggregation queries. It is also, structurally, exactly the T1-class attack surface this thesis's threat model (Section 3.5) is built to close: the LLM sees the live schema, composes SQL directly, and is trusted to interpret its own error messages and repair its own queries, with no semantic layer standing between natural language and the database and no reported adversarial or injection evaluation at all. The authors' own discussion is candid that the system still struggles with ambiguous business vocabulary and complex joins, which is precisely the vocabulary-mismatch and expressiveness problem AEGIS's semantic layer and pattern library (Sections 3.7 and 3.9) are designed to solve, not by making the LLM better at self-correction, but by removing its ability to compose the SQL string in the first place.</w:t>
+      </w:r>
+    </w:p>
+    <w:p>
+      <w:pPr>
+        <w:spacing w:after="200" w:before="0" w:line="360" w:lineRule="auto"/>
+        <w:jc w:val="both"/>
+      </w:pPr>
+      <w:r>
+        <w:rPr>
+          <w:rFonts w:ascii="Times New Roman" w:hAnsi="Times New Roman"/>
+          <w:b w:val="0"/>
+          <w:i w:val="0"/>
+          <w:sz w:val="24"/>
+        </w:rPr>
+        <w:t>Valkenburgh's master's thesis [24] on explanatory analytics is, by contrast, one of the most architecturally aligned sources in this collection, despite being in an unrelated domain. Valkenburgh's prototype computes causal-influence explanations for business metrics using a deterministic, non-AI formalism, and only afterward asks an LLM to narrate the already-correct structured result in natural language, never allowing the LLM to perform the underlying computation itself. A pre-study surveying ten commercial AI-BI products (including Power BI and Tableau) found that all of them could answer simple descriptive queries but none could correctly answer explanatory, “why is X high” queries without manual pre-configuration, direct evidence that unconstrained LLM reasoning fails at exactly the class of task AEGIS targets. Valkenburgh's design and AEGIS arrive at the same governing principle independently: do not trust the model to perform the analytical computation; let a deterministic algorithm compute the correct result, and restrict the model's role to a bounded, downstream task. Valkenburgh's deterministic layer operates on a single pre-loaded spreadsheet rather than a live relational database, so it has no SQL-injection surface and produces one-off, non-persistent text answers rather than stored, refreshable widgets, both of which AEGIS's architecture addresses.</w:t>
       </w:r>
     </w:p>
     <w:p>
@@ -4604,7 +4634,7 @@
                 <w:b w:val="0"/>
                 <w:sz w:val="21"/>
               </w:rPr>
-              <w:t>nl4dv</w:t>
+              <w:t>TriSQL</w:t>
             </w:r>
           </w:p>
         </w:tc>
@@ -4700,7 +4730,7 @@
                 <w:b w:val="0"/>
                 <w:sz w:val="21"/>
               </w:rPr>
-              <w:t>Yes</w:t>
+              <w:t>-</w:t>
             </w:r>
           </w:p>
         </w:tc>
@@ -4772,7 +4802,7 @@
                 <w:b w:val="0"/>
                 <w:sz w:val="21"/>
               </w:rPr>
-              <w:t>In-memory data</w:t>
+              <w:t>Benchmark only</w:t>
             </w:r>
           </w:p>
         </w:tc>
@@ -4795,7 +4825,7 @@
                 <w:b w:val="0"/>
                 <w:sz w:val="21"/>
               </w:rPr>
-              <w:t>DataTone</w:t>
+              <w:t>nl4dv</w:t>
             </w:r>
           </w:p>
         </w:tc>
@@ -4963,7 +4993,7 @@
                 <w:b w:val="0"/>
                 <w:sz w:val="21"/>
               </w:rPr>
-              <w:t>User study</w:t>
+              <w:t>In-memory data</w:t>
             </w:r>
           </w:p>
         </w:tc>
@@ -4986,7 +5016,7 @@
                 <w:b w:val="0"/>
                 <w:sz w:val="21"/>
               </w:rPr>
-              <w:t>DashBot / MultiVision</w:t>
+              <w:t>DataTone</w:t>
             </w:r>
           </w:p>
         </w:tc>
@@ -5010,7 +5040,7 @@
                 <w:b w:val="0"/>
                 <w:sz w:val="21"/>
               </w:rPr>
-              <w:t>-</w:t>
+              <w:t>Yes</w:t>
             </w:r>
           </w:p>
         </w:tc>
@@ -5106,7 +5136,7 @@
                 <w:b w:val="0"/>
                 <w:sz w:val="21"/>
               </w:rPr>
-              <w:t>Partial</w:t>
+              <w:t>-</w:t>
             </w:r>
           </w:p>
         </w:tc>
@@ -5154,7 +5184,7 @@
                 <w:b w:val="0"/>
                 <w:sz w:val="21"/>
               </w:rPr>
-              <w:t>Synthetic / user study</w:t>
+              <w:t>User study</w:t>
             </w:r>
           </w:p>
         </w:tc>
@@ -5177,7 +5207,7 @@
                 <w:b w:val="0"/>
                 <w:sz w:val="21"/>
               </w:rPr>
-              <w:t>AEGIS (this thesis)</w:t>
+              <w:t>DashBot / MultiVision</w:t>
             </w:r>
           </w:p>
         </w:tc>
@@ -5201,7 +5231,7 @@
                 <w:b w:val="0"/>
                 <w:sz w:val="21"/>
               </w:rPr>
-              <w:t>Yes</w:t>
+              <w:t>-</w:t>
             </w:r>
           </w:p>
         </w:tc>
@@ -5225,7 +5255,7 @@
                 <w:b w:val="0"/>
                 <w:sz w:val="21"/>
               </w:rPr>
-              <w:t>Yes</w:t>
+              <w:t>-</w:t>
             </w:r>
           </w:p>
         </w:tc>
@@ -5249,7 +5279,7 @@
                 <w:b w:val="0"/>
                 <w:sz w:val="21"/>
               </w:rPr>
-              <w:t>Yes</w:t>
+              <w:t>-</w:t>
             </w:r>
           </w:p>
         </w:tc>
@@ -5297,7 +5327,7 @@
                 <w:b w:val="0"/>
                 <w:sz w:val="21"/>
               </w:rPr>
-              <w:t>Yes</w:t>
+              <w:t>Partial</w:t>
             </w:r>
           </w:p>
         </w:tc>
@@ -5321,7 +5351,7 @@
                 <w:b w:val="0"/>
                 <w:sz w:val="21"/>
               </w:rPr>
-              <w:t>Yes</w:t>
+              <w:t>-</w:t>
             </w:r>
           </w:p>
         </w:tc>
@@ -5345,6 +5375,388 @@
                 <w:b w:val="0"/>
                 <w:sz w:val="21"/>
               </w:rPr>
+              <w:t>Synthetic / user study</w:t>
+            </w:r>
+          </w:p>
+        </w:tc>
+      </w:tr>
+      <w:tr>
+        <w:tc>
+          <w:tcPr>
+            <w:tcW w:type="dxa" w:w="1038"/>
+          </w:tcPr>
+          <w:p>
+            <w:r>
+              <w:rPr>
+                <w:rFonts w:ascii="Times New Roman" w:hAnsi="Times New Roman"/>
+                <w:sz w:val="21"/>
+              </w:rPr>
+            </w:r>
+            <w:r>
+              <w:rPr>
+                <w:rFonts w:ascii="Times New Roman" w:hAnsi="Times New Roman"/>
+                <w:b w:val="0"/>
+                <w:sz w:val="21"/>
+              </w:rPr>
+              <w:t>Conversational BI Assistant (Shailesh et al.)</w:t>
+            </w:r>
+          </w:p>
+        </w:tc>
+        <w:tc>
+          <w:tcPr>
+            <w:tcW w:type="dxa" w:w="1038"/>
+          </w:tcPr>
+          <w:p>
+            <w:pPr>
+              <w:jc w:val="center"/>
+            </w:pPr>
+            <w:r>
+              <w:rPr>
+                <w:rFonts w:ascii="Times New Roman" w:hAnsi="Times New Roman"/>
+                <w:sz w:val="21"/>
+              </w:rPr>
+            </w:r>
+            <w:r>
+              <w:rPr>
+                <w:rFonts w:ascii="Times New Roman" w:hAnsi="Times New Roman"/>
+                <w:b w:val="0"/>
+                <w:sz w:val="21"/>
+              </w:rPr>
+              <w:t>Yes</w:t>
+            </w:r>
+          </w:p>
+        </w:tc>
+        <w:tc>
+          <w:tcPr>
+            <w:tcW w:type="dxa" w:w="1038"/>
+          </w:tcPr>
+          <w:p>
+            <w:pPr>
+              <w:jc w:val="center"/>
+            </w:pPr>
+            <w:r>
+              <w:rPr>
+                <w:rFonts w:ascii="Times New Roman" w:hAnsi="Times New Roman"/>
+                <w:sz w:val="21"/>
+              </w:rPr>
+            </w:r>
+            <w:r>
+              <w:rPr>
+                <w:rFonts w:ascii="Times New Roman" w:hAnsi="Times New Roman"/>
+                <w:b w:val="0"/>
+                <w:sz w:val="21"/>
+              </w:rPr>
+              <w:t>-</w:t>
+            </w:r>
+          </w:p>
+        </w:tc>
+        <w:tc>
+          <w:tcPr>
+            <w:tcW w:type="dxa" w:w="1038"/>
+          </w:tcPr>
+          <w:p>
+            <w:pPr>
+              <w:jc w:val="center"/>
+            </w:pPr>
+            <w:r>
+              <w:rPr>
+                <w:rFonts w:ascii="Times New Roman" w:hAnsi="Times New Roman"/>
+                <w:sz w:val="21"/>
+              </w:rPr>
+            </w:r>
+            <w:r>
+              <w:rPr>
+                <w:rFonts w:ascii="Times New Roman" w:hAnsi="Times New Roman"/>
+                <w:b w:val="0"/>
+                <w:sz w:val="21"/>
+              </w:rPr>
+              <w:t>-</w:t>
+            </w:r>
+          </w:p>
+        </w:tc>
+        <w:tc>
+          <w:tcPr>
+            <w:tcW w:type="dxa" w:w="1038"/>
+          </w:tcPr>
+          <w:p>
+            <w:pPr>
+              <w:jc w:val="center"/>
+            </w:pPr>
+            <w:r>
+              <w:rPr>
+                <w:rFonts w:ascii="Times New Roman" w:hAnsi="Times New Roman"/>
+                <w:sz w:val="21"/>
+              </w:rPr>
+            </w:r>
+            <w:r>
+              <w:rPr>
+                <w:rFonts w:ascii="Times New Roman" w:hAnsi="Times New Roman"/>
+                <w:b w:val="0"/>
+                <w:sz w:val="21"/>
+              </w:rPr>
+              <w:t>Yes</w:t>
+            </w:r>
+          </w:p>
+        </w:tc>
+        <w:tc>
+          <w:tcPr>
+            <w:tcW w:type="dxa" w:w="1038"/>
+          </w:tcPr>
+          <w:p>
+            <w:pPr>
+              <w:jc w:val="center"/>
+            </w:pPr>
+            <w:r>
+              <w:rPr>
+                <w:rFonts w:ascii="Times New Roman" w:hAnsi="Times New Roman"/>
+                <w:sz w:val="21"/>
+              </w:rPr>
+            </w:r>
+            <w:r>
+              <w:rPr>
+                <w:rFonts w:ascii="Times New Roman" w:hAnsi="Times New Roman"/>
+                <w:b w:val="0"/>
+                <w:sz w:val="21"/>
+              </w:rPr>
+              <w:t>-</w:t>
+            </w:r>
+          </w:p>
+        </w:tc>
+        <w:tc>
+          <w:tcPr>
+            <w:tcW w:type="dxa" w:w="1038"/>
+          </w:tcPr>
+          <w:p>
+            <w:pPr>
+              <w:jc w:val="center"/>
+            </w:pPr>
+            <w:r>
+              <w:rPr>
+                <w:rFonts w:ascii="Times New Roman" w:hAnsi="Times New Roman"/>
+                <w:sz w:val="21"/>
+              </w:rPr>
+            </w:r>
+            <w:r>
+              <w:rPr>
+                <w:rFonts w:ascii="Times New Roman" w:hAnsi="Times New Roman"/>
+                <w:b w:val="0"/>
+                <w:sz w:val="21"/>
+              </w:rPr>
+              <w:t>-</w:t>
+            </w:r>
+          </w:p>
+        </w:tc>
+        <w:tc>
+          <w:tcPr>
+            <w:tcW w:type="dxa" w:w="1038"/>
+          </w:tcPr>
+          <w:p>
+            <w:pPr>
+              <w:jc w:val="center"/>
+            </w:pPr>
+            <w:r>
+              <w:rPr>
+                <w:rFonts w:ascii="Times New Roman" w:hAnsi="Times New Roman"/>
+                <w:sz w:val="21"/>
+              </w:rPr>
+            </w:r>
+            <w:r>
+              <w:rPr>
+                <w:rFonts w:ascii="Times New Roman" w:hAnsi="Times New Roman"/>
+                <w:b w:val="0"/>
+                <w:sz w:val="21"/>
+              </w:rPr>
+              <w:t>Prototype demo</w:t>
+            </w:r>
+          </w:p>
+        </w:tc>
+      </w:tr>
+      <w:tr>
+        <w:tc>
+          <w:tcPr>
+            <w:tcW w:type="dxa" w:w="1038"/>
+          </w:tcPr>
+          <w:p>
+            <w:r>
+              <w:rPr>
+                <w:rFonts w:ascii="Times New Roman" w:hAnsi="Times New Roman"/>
+                <w:sz w:val="21"/>
+              </w:rPr>
+            </w:r>
+            <w:r>
+              <w:rPr>
+                <w:rFonts w:ascii="Times New Roman" w:hAnsi="Times New Roman"/>
+                <w:b w:val="0"/>
+                <w:sz w:val="21"/>
+              </w:rPr>
+              <w:t>AEGIS (this thesis)</w:t>
+            </w:r>
+          </w:p>
+        </w:tc>
+        <w:tc>
+          <w:tcPr>
+            <w:tcW w:type="dxa" w:w="1038"/>
+          </w:tcPr>
+          <w:p>
+            <w:pPr>
+              <w:jc w:val="center"/>
+            </w:pPr>
+            <w:r>
+              <w:rPr>
+                <w:rFonts w:ascii="Times New Roman" w:hAnsi="Times New Roman"/>
+                <w:sz w:val="21"/>
+              </w:rPr>
+            </w:r>
+            <w:r>
+              <w:rPr>
+                <w:rFonts w:ascii="Times New Roman" w:hAnsi="Times New Roman"/>
+                <w:b w:val="0"/>
+                <w:sz w:val="21"/>
+              </w:rPr>
+              <w:t>Yes</w:t>
+            </w:r>
+          </w:p>
+        </w:tc>
+        <w:tc>
+          <w:tcPr>
+            <w:tcW w:type="dxa" w:w="1038"/>
+          </w:tcPr>
+          <w:p>
+            <w:pPr>
+              <w:jc w:val="center"/>
+            </w:pPr>
+            <w:r>
+              <w:rPr>
+                <w:rFonts w:ascii="Times New Roman" w:hAnsi="Times New Roman"/>
+                <w:sz w:val="21"/>
+              </w:rPr>
+            </w:r>
+            <w:r>
+              <w:rPr>
+                <w:rFonts w:ascii="Times New Roman" w:hAnsi="Times New Roman"/>
+                <w:b w:val="0"/>
+                <w:sz w:val="21"/>
+              </w:rPr>
+              <w:t>Yes</w:t>
+            </w:r>
+          </w:p>
+        </w:tc>
+        <w:tc>
+          <w:tcPr>
+            <w:tcW w:type="dxa" w:w="1038"/>
+          </w:tcPr>
+          <w:p>
+            <w:pPr>
+              <w:jc w:val="center"/>
+            </w:pPr>
+            <w:r>
+              <w:rPr>
+                <w:rFonts w:ascii="Times New Roman" w:hAnsi="Times New Roman"/>
+                <w:sz w:val="21"/>
+              </w:rPr>
+            </w:r>
+            <w:r>
+              <w:rPr>
+                <w:rFonts w:ascii="Times New Roman" w:hAnsi="Times New Roman"/>
+                <w:b w:val="0"/>
+                <w:sz w:val="21"/>
+              </w:rPr>
+              <w:t>Yes</w:t>
+            </w:r>
+          </w:p>
+        </w:tc>
+        <w:tc>
+          <w:tcPr>
+            <w:tcW w:type="dxa" w:w="1038"/>
+          </w:tcPr>
+          <w:p>
+            <w:pPr>
+              <w:jc w:val="center"/>
+            </w:pPr>
+            <w:r>
+              <w:rPr>
+                <w:rFonts w:ascii="Times New Roman" w:hAnsi="Times New Roman"/>
+                <w:sz w:val="21"/>
+              </w:rPr>
+            </w:r>
+            <w:r>
+              <w:rPr>
+                <w:rFonts w:ascii="Times New Roman" w:hAnsi="Times New Roman"/>
+                <w:b w:val="0"/>
+                <w:sz w:val="21"/>
+              </w:rPr>
+              <w:t>Yes</w:t>
+            </w:r>
+          </w:p>
+        </w:tc>
+        <w:tc>
+          <w:tcPr>
+            <w:tcW w:type="dxa" w:w="1038"/>
+          </w:tcPr>
+          <w:p>
+            <w:pPr>
+              <w:jc w:val="center"/>
+            </w:pPr>
+            <w:r>
+              <w:rPr>
+                <w:rFonts w:ascii="Times New Roman" w:hAnsi="Times New Roman"/>
+                <w:sz w:val="21"/>
+              </w:rPr>
+            </w:r>
+            <w:r>
+              <w:rPr>
+                <w:rFonts w:ascii="Times New Roman" w:hAnsi="Times New Roman"/>
+                <w:b w:val="0"/>
+                <w:sz w:val="21"/>
+              </w:rPr>
+              <w:t>Yes</w:t>
+            </w:r>
+          </w:p>
+        </w:tc>
+        <w:tc>
+          <w:tcPr>
+            <w:tcW w:type="dxa" w:w="1038"/>
+          </w:tcPr>
+          <w:p>
+            <w:pPr>
+              <w:jc w:val="center"/>
+            </w:pPr>
+            <w:r>
+              <w:rPr>
+                <w:rFonts w:ascii="Times New Roman" w:hAnsi="Times New Roman"/>
+                <w:sz w:val="21"/>
+              </w:rPr>
+            </w:r>
+            <w:r>
+              <w:rPr>
+                <w:rFonts w:ascii="Times New Roman" w:hAnsi="Times New Roman"/>
+                <w:b w:val="0"/>
+                <w:sz w:val="21"/>
+              </w:rPr>
+              <w:t>Yes</w:t>
+            </w:r>
+          </w:p>
+        </w:tc>
+        <w:tc>
+          <w:tcPr>
+            <w:tcW w:type="dxa" w:w="1038"/>
+          </w:tcPr>
+          <w:p>
+            <w:pPr>
+              <w:jc w:val="center"/>
+            </w:pPr>
+            <w:r>
+              <w:rPr>
+                <w:rFonts w:ascii="Times New Roman" w:hAnsi="Times New Roman"/>
+                <w:sz w:val="21"/>
+              </w:rPr>
+            </w:r>
+            <w:r>
+              <w:rPr>
+                <w:rFonts w:ascii="Times New Roman" w:hAnsi="Times New Roman"/>
+                <w:b w:val="0"/>
+                <w:sz w:val="21"/>
+              </w:rPr>
               <w:t>Production (nopCommerce)</w:t>
             </w:r>
           </w:p>
@@ -5402,7 +5814,7 @@
           <w:i w:val="0"/>
           <w:sz w:val="24"/>
         </w:rPr>
-        <w:t>First, no system reviewed in Sections 2.1-2.3 treats SQL-generation safety as a structural property rather than an accuracy metric. Every neural text-to-SQL system, from Seq2SQL through RAT-SQL and PICARD, is evaluated purely on exact-match or execution accuracy against a benchmark; none reports an injection rate, and only Liu and Xu's review even discusses adversarial SQL injection as a named threat, without proposing an architectural defense. AEGIS closes this gap by removing SQL generation from the LLM's output space entirely (Section 3.4) and evaluating an explicit unsafe-SQL rate against a direct LLM-to-SQL baseline (Chapter 5), rather than relying on accuracy as a proxy for safety.</w:t>
+        <w:t>First, no system reviewed in Sections 2.1-2.3 treats SQL-generation safety as a structural property rather than an accuracy metric, including the most recent, most accurate one. Every neural text-to-SQL system, from Seq2SQL through RAT-SQL, PICARD, and the state-of-the-art TriSQL, is evaluated purely on exact-match or execution accuracy against a benchmark; none reports an injection rate, and only Liu and Xu's review even discusses adversarial SQL injection as a named threat, without proposing an architectural defense. Shailesh et al.'s deployed Conversational BI Assistant (Section 2.7) makes the same point from the practitioner side: it gives an LLM direct SQL-execution tool access and a self-correction loop, but reports no adversarial evaluation at all. AEGIS closes this gap by removing SQL generation from the LLM's output space entirely (Section 3.4) and evaluating an explicit unsafe-SQL rate against a direct LLM-to-SQL baseline (Chapter 5), rather than relying on accuracy as a proxy for safety.</w:t>
       </w:r>
     </w:p>
     <w:p>
@@ -5432,7 +5844,7 @@
           <w:i w:val="0"/>
           <w:sz w:val="24"/>
         </w:rPr>
-        <w:t>Third, the practitioner and adoption-focused literature reviewed in Section 2.7 recognizes the tension between conversational flexibility and governed access control (Chinnappaiyan) and gestures at hybrid template-plus-generation designs (Mujeeb et al.) without building or evaluating a fully deterministic alternative. Valkenburgh's independent arrival at the same “let a deterministic layer compute the answer, let the model only narrate it” principle, in an unrelated domain (spreadsheet-based explanatory analytics rather than relational-database reporting), is the strongest external corroboration available in this review that AEGIS's central design decision is not idiosyncratic to this thesis but reflects a pattern independently discovered wherever researchers have taken LLM reliability seriously as an engineering constraint rather than an accuracy target to be improved.</w:t>
+        <w:t>Third, the practitioner and adoption-focused literature reviewed in Section 2.7 recognizes the tension between conversational flexibility and governed access control (Chinnappaiyan), gestures at hybrid template-plus-generation designs without building them (Mujeeb et al.), and, where a system is actually deployed (Shailesh et al.), resolves that tension by trusting the LLM with direct database access and a self-correction loop rather than a governed vocabulary. Valkenburgh's independent arrival at the same “let a deterministic layer compute the answer, let the model only narrate it” principle, in an unrelated domain (spreadsheet-based explanatory analytics rather than relational-database reporting), is the strongest external corroboration available in this review that AEGIS's central design decision is not idiosyncratic to this thesis but reflects a pattern independently discovered wherever researchers have taken LLM reliability seriously as an engineering constraint rather than an accuracy target to be improved.</w:t>
       </w:r>
     </w:p>
     <w:p>
@@ -15825,7 +16237,7 @@
           <w:rFonts w:ascii="Times New Roman" w:hAnsi="Times New Roman"/>
           <w:sz w:val="23"/>
         </w:rPr>
-        <w:t>[20]  H. S. Shalaan, T. H. A. Soliman, and A. M. Abdelaziz, "G-SQL: A schema-aware and rule-guided approach for robust natural language to SQL translation," IEEE Access, vol. 13, pp. 158520-158534, 2025.</w:t>
+        <w:t>[20]  G. N. Shailesh, M. Pavithran, A. Rahul Hari Venkat, and P. Kaliappan, "Conversational BI: Natural language interface to business dashboards," International Journal of Engineering Research &amp; Technology, vol. 14, no. 12, 2025.</w:t>
       </w:r>
     </w:p>
     <w:p>
@@ -15838,7 +16250,7 @@
           <w:rFonts w:ascii="Times New Roman" w:hAnsi="Times New Roman"/>
           <w:sz w:val="23"/>
         </w:rPr>
-        <w:t>[21]  D. Shi, X. Xu, F. Sun, Y. Shi, and N. Cao, "Calliope: Automatic visual data stories with Monte Carlo tree search," IEEE Transactions on Visualization and Computer Graphics, vol. 27, no. 2, pp. 464-474, 2021.</w:t>
+        <w:t>[21]  H. S. Shalaan, T. H. A. Soliman, and A. M. Abdelaziz, "G-SQL: A schema-aware and rule-guided approach for robust natural language to SQL translation," IEEE Access, vol. 13, pp. 158520-158534, 2025.</w:t>
       </w:r>
     </w:p>
     <w:p>
@@ -15851,7 +16263,7 @@
           <w:rFonts w:ascii="Times New Roman" w:hAnsi="Times New Roman"/>
           <w:sz w:val="23"/>
         </w:rPr>
-        <w:t>[22]  J. Valkenburgh, "Enhancing business dashboards with explanatory analytics and AI: Exploring the use of AI and explanatory analytics to enhance business decision-making," M.S. thesis, Information Management, Turku School of Economics, University of Turku, Finland, 2024.</w:t>
+        <w:t>[22]  D. Shi, X. Xu, F. Sun, Y. Shi, and N. Cao, "Calliope: Automatic visual data stories with Monte Carlo tree search," IEEE Transactions on Visualization and Computer Graphics, vol. 27, no. 2, pp. 464-474, 2021.</w:t>
       </w:r>
     </w:p>
     <w:p>
@@ -15864,7 +16276,7 @@
           <w:rFonts w:ascii="Times New Roman" w:hAnsi="Times New Roman"/>
           <w:sz w:val="23"/>
         </w:rPr>
-        <w:t>[23]  B. Wang, R. Shin, X. Liu, O. Polozov, and M. Richardson, "RAT-SQL: Relation-aware schema encoding and linking for text-to-SQL parsers," in Proc. 58th Annual Meeting of the Association for Computational Linguistics (ACL), 2020, pp. 7567-7578.</w:t>
+        <w:t>[23]  X. Su, Y. Gu, P. Wang, W. Gu, L. Qi, and J. He, "A robust natural language text-to-SQL generation framework with dynamic strategies based on LLMs," Scientific Reports, vol. 16, Art. no. 7892, 2026.</w:t>
       </w:r>
     </w:p>
     <w:p>
@@ -15877,7 +16289,7 @@
           <w:rFonts w:ascii="Times New Roman" w:hAnsi="Times New Roman"/>
           <w:sz w:val="23"/>
         </w:rPr>
-        <w:t>[24]  Y. Wang, Z. Sun, H. Zhang, W. Cui, K. Xu, X. Ma, and D. Zhang, "DataShot: Automatic generation of fact sheets from tabular data," IEEE Transactions on Visualization and Computer Graphics, vol. 26, no. 1, pp. 895-905, 2020.</w:t>
+        <w:t>[24]  J. Valkenburgh, "Enhancing business dashboards with explanatory analytics and AI: Exploring the use of AI and explanatory analytics to enhance business decision-making," M.S. thesis, Information Management, Turku School of Economics, University of Turku, Finland, 2024.</w:t>
       </w:r>
     </w:p>
     <w:p>
@@ -15890,7 +16302,7 @@
           <w:rFonts w:ascii="Times New Roman" w:hAnsi="Times New Roman"/>
           <w:sz w:val="23"/>
         </w:rPr>
-        <w:t>[25]  A. Wu, W. Tong, T. Dwyer, B. Lee, P. Isenberg, and H. Qu, "MultiVision: Designing analytical dashboards with deep learning based recommendation," IEEE Transactions on Visualization and Computer Graphics, vol. 28, no. 1, pp. 162-172, 2022.</w:t>
+        <w:t>[25]  B. Wang, R. Shin, X. Liu, O. Polozov, and M. Richardson, "RAT-SQL: Relation-aware schema encoding and linking for text-to-SQL parsers," in Proc. 58th Annual Meeting of the Association for Computational Linguistics (ACL), 2020, pp. 7567-7578.</w:t>
       </w:r>
     </w:p>
     <w:p>
@@ -15903,7 +16315,7 @@
           <w:rFonts w:ascii="Times New Roman" w:hAnsi="Times New Roman"/>
           <w:sz w:val="23"/>
         </w:rPr>
-        <w:t>[26]  T. Yu et al., "Spider: A large-scale human-labeled dataset for complex and cross-domain semantic parsing and text-to-SQL task," in Proc. 2018 Conf. Empirical Methods in Natural Language Processing (EMNLP), 2018, pp. 3911-3921.</w:t>
+        <w:t>[26]  Y. Wang, Z. Sun, H. Zhang, W. Cui, K. Xu, X. Ma, and D. Zhang, "DataShot: Automatic generation of fact sheets from tabular data," IEEE Transactions on Visualization and Computer Graphics, vol. 26, no. 1, pp. 895-905, 2020.</w:t>
       </w:r>
     </w:p>
     <w:p>
@@ -15916,7 +16328,7 @@
           <w:rFonts w:ascii="Times New Roman" w:hAnsi="Times New Roman"/>
           <w:sz w:val="23"/>
         </w:rPr>
-        <w:t>[27]  T. Yu et al., "SParC: Cross-domain semantic parsing in context," in Proc. 57th Annual Meeting of the Association for Computational Linguistics (ACL), 2019, pp. 4511-4523.</w:t>
+        <w:t>[27]  A. Wu, W. Tong, T. Dwyer, B. Lee, P. Isenberg, and H. Qu, "MultiVision: Designing analytical dashboards with deep learning based recommendation," IEEE Transactions on Visualization and Computer Graphics, vol. 28, no. 1, pp. 162-172, 2022.</w:t>
       </w:r>
     </w:p>
     <w:p>
@@ -15929,7 +16341,7 @@
           <w:rFonts w:ascii="Times New Roman" w:hAnsi="Times New Roman"/>
           <w:sz w:val="23"/>
         </w:rPr>
-        <w:t>[28]  T. Yu et al., "CoSQL: A conversational text-to-SQL challenge towards cross-domain natural language interfaces to databases," in Proc. 2019 Conf. Empirical Methods in Natural Language Processing (EMNLP), 2019, pp. 1962-1979.</w:t>
+        <w:t>[28]  T. Yu et al., "Spider: A large-scale human-labeled dataset for complex and cross-domain semantic parsing and text-to-SQL task," in Proc. 2018 Conf. Empirical Methods in Natural Language Processing (EMNLP), 2018, pp. 3911-3921.</w:t>
       </w:r>
     </w:p>
     <w:p>
@@ -15942,7 +16354,33 @@
           <w:rFonts w:ascii="Times New Roman" w:hAnsi="Times New Roman"/>
           <w:sz w:val="23"/>
         </w:rPr>
-        <w:t>[29]  V. Zhong, C. Xiong, and R. Socher, "Seq2SQL: Generating structured queries from natural language using reinforcement learning," arXiv:1709.00103, 2018.</w:t>
+        <w:t>[29]  T. Yu et al., "SParC: Cross-domain semantic parsing in context," in Proc. 57th Annual Meeting of the Association for Computational Linguistics (ACL), 2019, pp. 4511-4523.</w:t>
+      </w:r>
+    </w:p>
+    <w:p>
+      <w:pPr>
+        <w:spacing w:after="200" w:line="312" w:lineRule="auto"/>
+        <w:ind w:left="576" w:hanging="576"/>
+      </w:pPr>
+      <w:r>
+        <w:rPr>
+          <w:rFonts w:ascii="Times New Roman" w:hAnsi="Times New Roman"/>
+          <w:sz w:val="23"/>
+        </w:rPr>
+        <w:t>[30]  T. Yu et al., "CoSQL: A conversational text-to-SQL challenge towards cross-domain natural language interfaces to databases," in Proc. 2019 Conf. Empirical Methods in Natural Language Processing (EMNLP), 2019, pp. 1962-1979.</w:t>
+      </w:r>
+    </w:p>
+    <w:p>
+      <w:pPr>
+        <w:spacing w:after="200" w:line="312" w:lineRule="auto"/>
+        <w:ind w:left="576" w:hanging="576"/>
+      </w:pPr>
+      <w:r>
+        <w:rPr>
+          <w:rFonts w:ascii="Times New Roman" w:hAnsi="Times New Roman"/>
+          <w:sz w:val="23"/>
+        </w:rPr>
+        <w:t>[31]  V. Zhong, C. Xiong, and R. Socher, "Seq2SQL: Generating structured queries from natural language using reinforcement learning," arXiv:1709.00103, 2018.</w:t>
       </w:r>
     </w:p>
     <w:sectPr>

</xml_diff>

<commit_message>
docs: add descriptive figure placeholders to thesis book (11 figures)
Chapters 3 and 5 referenced 11 figures in the List of Figures but never
actually contained them. Add a dashed-border placeholder box at each
reference point with a detailed description of what the diagram/chart
should show (layout, labels, color-coding, data values), so real
diagrams can be generated and swapped in via doc.add_picture() later.

Margins (1.5in left / 1.0in right) kept as-is per confirmed binding-
margin convention.
</commit_message>
<xml_diff>
--- a/docs/scripts/AEGIS Thesis Book Draft - A Constraint-Based Architecture for Safe LLM-Assisted Natural Language Analytics.docx
+++ b/docs/scripts/AEGIS Thesis Book Draft - A Constraint-Based Architecture for Safe LLM-Assisted Natural Language Analytics.docx
@@ -6567,6 +6567,96 @@
         <w:spacing w:after="80"/>
       </w:pPr>
     </w:p>
+    <w:tbl>
+      <w:tblPr>
+        <w:tblW w:type="auto" w:w="0"/>
+        <w:jc w:val="center"/>
+        <w:tblLayout w:type="fixed"/>
+        <w:tblLook w:firstColumn="1" w:firstRow="1" w:lastColumn="0" w:lastRow="0" w:noHBand="0" w:noVBand="1" w:val="04A0"/>
+      </w:tblPr>
+      <w:tblGrid>
+        <w:gridCol w:w="9072"/>
+      </w:tblGrid>
+      <w:tr>
+        <w:trPr>
+          <w:trHeight w:val="3744"/>
+          <w:trHeight w:val="3744" w:hRule="atLeast"/>
+        </w:trPr>
+        <w:tc>
+          <w:tcPr>
+            <w:tcW w:type="dxa" w:w="9072"/>
+            <w:tcBorders>
+              <w:top w:val="dashed" w:sz="10" w:space="0" w:color="888888"/>
+              <w:left w:val="dashed" w:sz="10" w:space="0" w:color="888888"/>
+              <w:bottom w:val="dashed" w:sz="10" w:space="0" w:color="888888"/>
+              <w:right w:val="dashed" w:sz="10" w:space="0" w:color="888888"/>
+            </w:tcBorders>
+            <w:shd w:val="clear" w:fill="F7F7F7"/>
+          </w:tcPr>
+          <w:p>
+            <w:pPr>
+              <w:spacing w:before="280" w:after="120"/>
+              <w:jc w:val="center"/>
+            </w:pPr>
+            <w:r/>
+            <w:r>
+              <w:rPr>
+                <w:rFonts w:ascii="Times New Roman" w:hAnsi="Times New Roman"/>
+                <w:b/>
+                <w:color w:val="993300"/>
+                <w:sz w:val="21"/>
+              </w:rPr>
+              <w:t>[ PLACEHOLDER — FIGURE 5 NOT YET INSERTED ]</w:t>
+            </w:r>
+          </w:p>
+          <w:p>
+            <w:pPr>
+              <w:spacing w:after="160"/>
+              <w:jc w:val="center"/>
+            </w:pPr>
+            <w:r>
+              <w:rPr>
+                <w:rFonts w:ascii="Times New Roman" w:hAnsi="Times New Roman"/>
+                <w:b/>
+                <w:color w:val="333333"/>
+                <w:sz w:val="22"/>
+              </w:rPr>
+              <w:t>Distribution of analytics primitives across 312 real reporting requests</w:t>
+            </w:r>
+          </w:p>
+          <w:p>
+            <w:pPr>
+              <w:spacing w:after="280" w:line="300" w:lineRule="auto"/>
+              <w:ind w:left="432" w:right="432"/>
+              <w:jc w:val="center"/>
+            </w:pPr>
+            <w:r>
+              <w:rPr>
+                <w:rFonts w:ascii="Times New Roman" w:hAnsi="Times New Roman"/>
+                <w:i/>
+                <w:color w:val="555555"/>
+                <w:sz w:val="19"/>
+              </w:rPr>
+              <w:t>A bar chart (sorted descending) showing the share of the 312 formative-study requests accounted for by each of the eleven patterns: Ranking 24.1%, Trend Analysis 21.5%, KPI/Aggregate 18.3%, Comparison 14.7%, Exception/Filter 12.8%, Summary/Group 6.0%, and Segment, Funnel, Cohort, Correlate, and Tabular combined 2.6%. Highlight the top three bars (Ranking, Trend, KPI) in an accent color, since together they account for nearly two-thirds of all requests — this is the visual argument for why a small, fixed pattern library is sufficient (Section 3.2).</w:t>
+            </w:r>
+          </w:p>
+        </w:tc>
+      </w:tr>
+    </w:tbl>
+    <w:p>
+      <w:pPr>
+        <w:spacing w:before="120" w:after="280"/>
+        <w:jc w:val="center"/>
+      </w:pPr>
+      <w:r>
+        <w:rPr>
+          <w:rFonts w:ascii="Times New Roman" w:hAnsi="Times New Roman"/>
+          <w:b/>
+          <w:sz w:val="21"/>
+        </w:rPr>
+        <w:t>Figure 5: Distribution of analytics primitives across 312 real reporting requests</w:t>
+      </w:r>
+    </w:p>
     <w:p>
       <w:pPr>
         <w:spacing w:after="0" w:before="0" w:line="360" w:lineRule="auto"/>
@@ -7363,11 +7453,95 @@
         <w:t>The analysis plan is hashed (SHA-256) to detect duplicates, and the query, chart configuration, and access rules are stored as a widget artifact that can be refreshed on a schedule (Section 3.11).</w:t>
       </w:r>
     </w:p>
-    <w:p>
-      <w:pPr>
-        <w:spacing w:after="0" w:before="0" w:line="360" w:lineRule="auto"/>
-        <w:jc w:val="both"/>
-      </w:pPr>
+    <w:tbl>
+      <w:tblPr>
+        <w:tblW w:type="auto" w:w="0"/>
+        <w:jc w:val="center"/>
+        <w:tblLayout w:type="fixed"/>
+        <w:tblLook w:firstColumn="1" w:firstRow="1" w:lastColumn="0" w:lastRow="0" w:noHBand="0" w:noVBand="1" w:val="04A0"/>
+      </w:tblPr>
+      <w:tblGrid>
+        <w:gridCol w:w="9072"/>
+      </w:tblGrid>
+      <w:tr>
+        <w:trPr>
+          <w:trHeight w:val="3168"/>
+          <w:trHeight w:val="3168" w:hRule="atLeast"/>
+        </w:trPr>
+        <w:tc>
+          <w:tcPr>
+            <w:tcW w:type="dxa" w:w="9072"/>
+            <w:tcBorders>
+              <w:top w:val="dashed" w:sz="10" w:space="0" w:color="888888"/>
+              <w:left w:val="dashed" w:sz="10" w:space="0" w:color="888888"/>
+              <w:bottom w:val="dashed" w:sz="10" w:space="0" w:color="888888"/>
+              <w:right w:val="dashed" w:sz="10" w:space="0" w:color="888888"/>
+            </w:tcBorders>
+            <w:shd w:val="clear" w:fill="F7F7F7"/>
+          </w:tcPr>
+          <w:p>
+            <w:pPr>
+              <w:spacing w:before="280" w:after="120"/>
+              <w:jc w:val="center"/>
+            </w:pPr>
+            <w:r/>
+            <w:r>
+              <w:rPr>
+                <w:rFonts w:ascii="Times New Roman" w:hAnsi="Times New Roman"/>
+                <w:b/>
+                <w:color w:val="993300"/>
+                <w:sz w:val="21"/>
+              </w:rPr>
+              <w:t>[ PLACEHOLDER — FIGURE 1 NOT YET INSERTED ]</w:t>
+            </w:r>
+          </w:p>
+          <w:p>
+            <w:pPr>
+              <w:spacing w:after="160"/>
+              <w:jc w:val="center"/>
+            </w:pPr>
+            <w:r>
+              <w:rPr>
+                <w:rFonts w:ascii="Times New Roman" w:hAnsi="Times New Roman"/>
+                <w:b/>
+                <w:color w:val="333333"/>
+                <w:sz w:val="22"/>
+              </w:rPr>
+              <w:t>AEGIS architecture pipeline (User Request to Dashboard Widget)</w:t>
+            </w:r>
+          </w:p>
+          <w:p>
+            <w:pPr>
+              <w:spacing w:after="280" w:line="300" w:lineRule="auto"/>
+              <w:ind w:left="432" w:right="432"/>
+              <w:jc w:val="center"/>
+            </w:pPr>
+            <w:r>
+              <w:rPr>
+                <w:rFonts w:ascii="Times New Roman" w:hAnsi="Times New Roman"/>
+                <w:i/>
+                <w:color w:val="555555"/>
+                <w:sz w:val="19"/>
+              </w:rPr>
+              <w:t>A left-to-right flowchart of the seven stages in sequence: User Request -&gt; LLM Intent Parser -&gt; Coverage Validator -&gt; Semantic Mapper -&gt; Permission Rewriter -&gt; Safe Query Compiler -&gt; Query Executor -&gt; Visualization Selector -&gt; Widget Engine -&gt; Dashboard. Color-code by responsibility: blue for the single AI/LLM stage, purple for semantic mapping, red for the two safety-enforcement stages (Permission Rewriter, Safe Query Compiler), green for execution/output stages. Add small orange branch arrows from Coverage Validator and Safe Query Compiler pointing to a 'Structured Clarification / Rejection Message' box, showing that invalid requests exit early with an actionable error rather than a silent failure.</w:t>
+            </w:r>
+          </w:p>
+        </w:tc>
+      </w:tr>
+    </w:tbl>
+    <w:p>
+      <w:pPr>
+        <w:spacing w:before="120" w:after="280"/>
+        <w:jc w:val="center"/>
+      </w:pPr>
+      <w:r>
+        <w:rPr>
+          <w:rFonts w:ascii="Times New Roman" w:hAnsi="Times New Roman"/>
+          <w:b/>
+          <w:sz w:val="21"/>
+        </w:rPr>
+        <w:t>Figure 1: AEGIS architecture pipeline (User Request to Dashboard Widget)</w:t>
+      </w:r>
     </w:p>
     <w:p>
       <w:pPr>
@@ -7396,6 +7570,96 @@
           <w:sz w:val="24"/>
         </w:rPr>
         <w:t>The semantic layer is the most important non-AI component of AEGIS. It separates business language from the underlying database structure and defines exactly which metrics, joins, and permissions are allowed to exist. A useful analogy is LEGO blocks rather than free-form clay: the semantic layer defines a finite set of composable building blocks. User questions are unlimited, but every answerable question is a composition of these blocks.</w:t>
+      </w:r>
+    </w:p>
+    <w:tbl>
+      <w:tblPr>
+        <w:tblW w:type="auto" w:w="0"/>
+        <w:jc w:val="center"/>
+        <w:tblLayout w:type="fixed"/>
+        <w:tblLook w:firstColumn="1" w:firstRow="1" w:lastColumn="0" w:lastRow="0" w:noHBand="0" w:noVBand="1" w:val="04A0"/>
+      </w:tblPr>
+      <w:tblGrid>
+        <w:gridCol w:w="9072"/>
+      </w:tblGrid>
+      <w:tr>
+        <w:trPr>
+          <w:trHeight w:val="3744"/>
+          <w:trHeight w:val="3744" w:hRule="atLeast"/>
+        </w:trPr>
+        <w:tc>
+          <w:tcPr>
+            <w:tcW w:type="dxa" w:w="9072"/>
+            <w:tcBorders>
+              <w:top w:val="dashed" w:sz="10" w:space="0" w:color="888888"/>
+              <w:left w:val="dashed" w:sz="10" w:space="0" w:color="888888"/>
+              <w:bottom w:val="dashed" w:sz="10" w:space="0" w:color="888888"/>
+              <w:right w:val="dashed" w:sz="10" w:space="0" w:color="888888"/>
+            </w:tcBorders>
+            <w:shd w:val="clear" w:fill="F7F7F7"/>
+          </w:tcPr>
+          <w:p>
+            <w:pPr>
+              <w:spacing w:before="280" w:after="120"/>
+              <w:jc w:val="center"/>
+            </w:pPr>
+            <w:r/>
+            <w:r>
+              <w:rPr>
+                <w:rFonts w:ascii="Times New Roman" w:hAnsi="Times New Roman"/>
+                <w:b/>
+                <w:color w:val="993300"/>
+                <w:sz w:val="21"/>
+              </w:rPr>
+              <w:t>[ PLACEHOLDER — FIGURE 2 NOT YET INSERTED ]</w:t>
+            </w:r>
+          </w:p>
+          <w:p>
+            <w:pPr>
+              <w:spacing w:after="160"/>
+              <w:jc w:val="center"/>
+            </w:pPr>
+            <w:r>
+              <w:rPr>
+                <w:rFonts w:ascii="Times New Roman" w:hAnsi="Times New Roman"/>
+                <w:b/>
+                <w:color w:val="333333"/>
+                <w:sz w:val="22"/>
+              </w:rPr>
+              <w:t>Semantic layer modularity - composable blocks vs. free-form SQL generation</w:t>
+            </w:r>
+          </w:p>
+          <w:p>
+            <w:pPr>
+              <w:spacing w:after="280" w:line="300" w:lineRule="auto"/>
+              <w:ind w:left="432" w:right="432"/>
+              <w:jc w:val="center"/>
+            </w:pPr>
+            <w:r>
+              <w:rPr>
+                <w:rFonts w:ascii="Times New Roman" w:hAnsi="Times New Roman"/>
+                <w:i/>
+                <w:color w:val="555555"/>
+                <w:sz w:val="19"/>
+              </w:rPr>
+              <w:t>A split-panel comparison. LEFT panel, labeled 'AEGIS': a small set of labeled building blocks (Metric, Dimension, Filter, Join Path, Pattern) shown snapping together into two or three example complete query shapes, like LEGO bricks combining into a finished model. RIGHT panel, labeled 'Direct LLM-to-SQL': a shapeless, cracked blob of clay with a warning icon, annotated '5.0% unsafe queries in baseline (Chapter 5, Section 5.2)'. The visual point is that AEGIS composes from a bounded set of safe parts while direct generation is unbounded and can take an unsafe shape.</w:t>
+            </w:r>
+          </w:p>
+        </w:tc>
+      </w:tr>
+    </w:tbl>
+    <w:p>
+      <w:pPr>
+        <w:spacing w:before="120" w:after="280"/>
+        <w:jc w:val="center"/>
+      </w:pPr>
+      <w:r>
+        <w:rPr>
+          <w:rFonts w:ascii="Times New Roman" w:hAnsi="Times New Roman"/>
+          <w:b/>
+          <w:sz w:val="21"/>
+        </w:rPr>
+        <w:t>Figure 2: Semantic layer modularity - composable blocks vs. free-form SQL generation</w:t>
       </w:r>
     </w:p>
     <w:p>
@@ -8172,6 +8436,96 @@
         <w:t>}</w:t>
       </w:r>
     </w:p>
+    <w:tbl>
+      <w:tblPr>
+        <w:tblW w:type="auto" w:w="0"/>
+        <w:jc w:val="center"/>
+        <w:tblLayout w:type="fixed"/>
+        <w:tblLook w:firstColumn="1" w:firstRow="1" w:lastColumn="0" w:lastRow="0" w:noHBand="0" w:noVBand="1" w:val="04A0"/>
+      </w:tblPr>
+      <w:tblGrid>
+        <w:gridCol w:w="9072"/>
+      </w:tblGrid>
+      <w:tr>
+        <w:trPr>
+          <w:trHeight w:val="3744"/>
+          <w:trHeight w:val="3744" w:hRule="atLeast"/>
+        </w:trPr>
+        <w:tc>
+          <w:tcPr>
+            <w:tcW w:type="dxa" w:w="9072"/>
+            <w:tcBorders>
+              <w:top w:val="dashed" w:sz="10" w:space="0" w:color="888888"/>
+              <w:left w:val="dashed" w:sz="10" w:space="0" w:color="888888"/>
+              <w:bottom w:val="dashed" w:sz="10" w:space="0" w:color="888888"/>
+              <w:right w:val="dashed" w:sz="10" w:space="0" w:color="888888"/>
+            </w:tcBorders>
+            <w:shd w:val="clear" w:fill="F7F7F7"/>
+          </w:tcPr>
+          <w:p>
+            <w:pPr>
+              <w:spacing w:before="280" w:after="120"/>
+              <w:jc w:val="center"/>
+            </w:pPr>
+            <w:r/>
+            <w:r>
+              <w:rPr>
+                <w:rFonts w:ascii="Times New Roman" w:hAnsi="Times New Roman"/>
+                <w:b/>
+                <w:color w:val="993300"/>
+                <w:sz w:val="21"/>
+              </w:rPr>
+              <w:t>[ PLACEHOLDER — FIGURE 3 NOT YET INSERTED ]</w:t>
+            </w:r>
+          </w:p>
+          <w:p>
+            <w:pPr>
+              <w:spacing w:after="160"/>
+              <w:jc w:val="center"/>
+            </w:pPr>
+            <w:r>
+              <w:rPr>
+                <w:rFonts w:ascii="Times New Roman" w:hAnsi="Times New Roman"/>
+                <w:b/>
+                <w:color w:val="333333"/>
+                <w:sz w:val="22"/>
+              </w:rPr>
+              <w:t>Vocabulary injection workflow</w:t>
+            </w:r>
+          </w:p>
+          <w:p>
+            <w:pPr>
+              <w:spacing w:after="280" w:line="300" w:lineRule="auto"/>
+              <w:ind w:left="432" w:right="432"/>
+              <w:jc w:val="center"/>
+            </w:pPr>
+            <w:r>
+              <w:rPr>
+                <w:rFonts w:ascii="Times New Roman" w:hAnsi="Times New Roman"/>
+                <w:i/>
+                <w:color w:val="555555"/>
+                <w:sz w:val="19"/>
+              </w:rPr>
+              <w:t>A three-lane sequence diagram: 'Semantic Layer (semantic_layer.py)' -&gt; 'System Prompt Builder' -&gt; 'LLM'. Show the Semantic Layer box listing a few example metric/dimension entries with plain-English descriptions; an arrow labeled 'serializes into ~1,100 tokens' into the System Prompt Builder; then into the LLM, whose output arrow produces an example IntentObject such as {metric_term: 'revenue', dimension_term: 'category'}. Annotate with a small callout showing the user phrase 'earnings' mapping to the approved ID 'revenue' even though 'earnings' appears in no synonym list.</w:t>
+            </w:r>
+          </w:p>
+        </w:tc>
+      </w:tr>
+    </w:tbl>
+    <w:p>
+      <w:pPr>
+        <w:spacing w:before="120" w:after="280"/>
+        <w:jc w:val="center"/>
+      </w:pPr>
+      <w:r>
+        <w:rPr>
+          <w:rFonts w:ascii="Times New Roman" w:hAnsi="Times New Roman"/>
+          <w:b/>
+          <w:sz w:val="21"/>
+        </w:rPr>
+        <w:t>Figure 3: Vocabulary injection workflow</w:t>
+      </w:r>
+    </w:p>
     <w:p>
       <w:r>
         <w:br w:type="page"/>
@@ -8204,6 +8558,96 @@
           <w:sz w:val="24"/>
         </w:rPr>
         <w:t>The compiler instantiates SQL from a library of parameterized templates, one per analytics pattern.</w:t>
+      </w:r>
+    </w:p>
+    <w:tbl>
+      <w:tblPr>
+        <w:tblW w:type="auto" w:w="0"/>
+        <w:jc w:val="center"/>
+        <w:tblLayout w:type="fixed"/>
+        <w:tblLook w:firstColumn="1" w:firstRow="1" w:lastColumn="0" w:lastRow="0" w:noHBand="0" w:noVBand="1" w:val="04A0"/>
+      </w:tblPr>
+      <w:tblGrid>
+        <w:gridCol w:w="9072"/>
+      </w:tblGrid>
+      <w:tr>
+        <w:trPr>
+          <w:trHeight w:val="3744"/>
+          <w:trHeight w:val="3744" w:hRule="atLeast"/>
+        </w:trPr>
+        <w:tc>
+          <w:tcPr>
+            <w:tcW w:type="dxa" w:w="9072"/>
+            <w:tcBorders>
+              <w:top w:val="dashed" w:sz="10" w:space="0" w:color="888888"/>
+              <w:left w:val="dashed" w:sz="10" w:space="0" w:color="888888"/>
+              <w:bottom w:val="dashed" w:sz="10" w:space="0" w:color="888888"/>
+              <w:right w:val="dashed" w:sz="10" w:space="0" w:color="888888"/>
+            </w:tcBorders>
+            <w:shd w:val="clear" w:fill="F7F7F7"/>
+          </w:tcPr>
+          <w:p>
+            <w:pPr>
+              <w:spacing w:before="280" w:after="120"/>
+              <w:jc w:val="center"/>
+            </w:pPr>
+            <w:r/>
+            <w:r>
+              <w:rPr>
+                <w:rFonts w:ascii="Times New Roman" w:hAnsi="Times New Roman"/>
+                <w:b/>
+                <w:color w:val="993300"/>
+                <w:sz w:val="21"/>
+              </w:rPr>
+              <w:t>[ PLACEHOLDER — FIGURE 4 NOT YET INSERTED ]</w:t>
+            </w:r>
+          </w:p>
+          <w:p>
+            <w:pPr>
+              <w:spacing w:after="160"/>
+              <w:jc w:val="center"/>
+            </w:pPr>
+            <w:r>
+              <w:rPr>
+                <w:rFonts w:ascii="Times New Roman" w:hAnsi="Times New Roman"/>
+                <w:b/>
+                <w:color w:val="333333"/>
+                <w:sz w:val="22"/>
+              </w:rPr>
+              <w:t>Taxonomy of the eleven AEGIS analytical patterns</w:t>
+            </w:r>
+          </w:p>
+          <w:p>
+            <w:pPr>
+              <w:spacing w:after="280" w:line="300" w:lineRule="auto"/>
+              <w:ind w:left="432" w:right="432"/>
+              <w:jc w:val="center"/>
+            </w:pPr>
+            <w:r>
+              <w:rPr>
+                <w:rFonts w:ascii="Times New Roman" w:hAnsi="Times New Roman"/>
+                <w:i/>
+                <w:color w:val="555555"/>
+                <w:sz w:val="19"/>
+              </w:rPr>
+              <w:t>A tree or grid diagram with 'Eleven Analytical Patterns' at the top branching into eleven labeled leaves: KPI, Ranking, Trend, Comparison, Exception, Summary, Segment, Funnel, Cohort, Correlate, Tabular. Under each leaf, show a small icon of its default visualization (matching Table 2/3): card, bar chart, line chart, grouped bar, table, card grid, pie chart, funnel chart, grouped bar, scatter plot, table. Caption note: '~5,100 valid combinations across 15 metrics x 34 dimensions x 10 patterns.'</w:t>
+            </w:r>
+          </w:p>
+        </w:tc>
+      </w:tr>
+    </w:tbl>
+    <w:p>
+      <w:pPr>
+        <w:spacing w:before="120" w:after="280"/>
+        <w:jc w:val="center"/>
+      </w:pPr>
+      <w:r>
+        <w:rPr>
+          <w:rFonts w:ascii="Times New Roman" w:hAnsi="Times New Roman"/>
+          <w:b/>
+          <w:sz w:val="21"/>
+        </w:rPr>
+        <w:t>Figure 4: Taxonomy of the eleven AEGIS analytical patterns</w:t>
       </w:r>
     </w:p>
     <w:p>
@@ -9409,6 +9853,96 @@
         <w:t>After placeholder substitution, two safety layers apply in sequence. Layer 1 is a parameterized query engine that separates SQL structure from user-supplied inputs, so no user text is ever concatenated into the SQL string. Layer 2 is a post-compilation safety scanner that rejects any assembled query containing a forbidden construct: non-SELECT statements, UNION, EXCEPT or INTERSECT, EXEC, or references to system tables. If any forbidden pattern is detected, the compiler raises a SecurityError rather than returning a partially safe query.</w:t>
       </w:r>
     </w:p>
+    <w:tbl>
+      <w:tblPr>
+        <w:tblW w:type="auto" w:w="0"/>
+        <w:jc w:val="center"/>
+        <w:tblLayout w:type="fixed"/>
+        <w:tblLook w:firstColumn="1" w:firstRow="1" w:lastColumn="0" w:lastRow="0" w:noHBand="0" w:noVBand="1" w:val="04A0"/>
+      </w:tblPr>
+      <w:tblGrid>
+        <w:gridCol w:w="9072"/>
+      </w:tblGrid>
+      <w:tr>
+        <w:trPr>
+          <w:trHeight w:val="3744"/>
+          <w:trHeight w:val="3744" w:hRule="atLeast"/>
+        </w:trPr>
+        <w:tc>
+          <w:tcPr>
+            <w:tcW w:type="dxa" w:w="9072"/>
+            <w:tcBorders>
+              <w:top w:val="dashed" w:sz="10" w:space="0" w:color="888888"/>
+              <w:left w:val="dashed" w:sz="10" w:space="0" w:color="888888"/>
+              <w:bottom w:val="dashed" w:sz="10" w:space="0" w:color="888888"/>
+              <w:right w:val="dashed" w:sz="10" w:space="0" w:color="888888"/>
+            </w:tcBorders>
+            <w:shd w:val="clear" w:fill="F7F7F7"/>
+          </w:tcPr>
+          <w:p>
+            <w:pPr>
+              <w:spacing w:before="280" w:after="120"/>
+              <w:jc w:val="center"/>
+            </w:pPr>
+            <w:r/>
+            <w:r>
+              <w:rPr>
+                <w:rFonts w:ascii="Times New Roman" w:hAnsi="Times New Roman"/>
+                <w:b/>
+                <w:color w:val="993300"/>
+                <w:sz w:val="21"/>
+              </w:rPr>
+              <w:t>[ PLACEHOLDER — FIGURE 6 NOT YET INSERTED ]</w:t>
+            </w:r>
+          </w:p>
+          <w:p>
+            <w:pPr>
+              <w:spacing w:after="160"/>
+              <w:jc w:val="center"/>
+            </w:pPr>
+            <w:r>
+              <w:rPr>
+                <w:rFonts w:ascii="Times New Roman" w:hAnsi="Times New Roman"/>
+                <w:b/>
+                <w:color w:val="333333"/>
+                <w:sz w:val="22"/>
+              </w:rPr>
+              <w:t>Two-layer SQL safety defence</w:t>
+            </w:r>
+          </w:p>
+          <w:p>
+            <w:pPr>
+              <w:spacing w:after="280" w:line="300" w:lineRule="auto"/>
+              <w:ind w:left="432" w:right="432"/>
+              <w:jc w:val="center"/>
+            </w:pPr>
+            <w:r>
+              <w:rPr>
+                <w:rFonts w:ascii="Times New Roman" w:hAnsi="Times New Roman"/>
+                <w:i/>
+                <w:color w:val="555555"/>
+                <w:sz w:val="19"/>
+              </w:rPr>
+              <w:t>A vertical two-stage flowchart. A crafted/adversarial input enters at the top with a warning icon. Layer 1 box: 'Parameterized Query Engine — user text never enters the SQL string; only IDs and bound values appear.' Arrow down to Layer 2 box: 'Post-Compilation Safety Scanner — rejects non-SELECT statements, UNION/EXCEPT/INTERSECT, EXEC, and system-table references (16 forbidden patterns checked).' Below, split into two outcomes: a green 'Safe SQL Executed' box for a legitimate query, and a red 'SecurityError Raised' box for a rejected one, showing the attack is caught before it can reach the database regardless of which layer catches it.</w:t>
+            </w:r>
+          </w:p>
+        </w:tc>
+      </w:tr>
+    </w:tbl>
+    <w:p>
+      <w:pPr>
+        <w:spacing w:before="120" w:after="280"/>
+        <w:jc w:val="center"/>
+      </w:pPr>
+      <w:r>
+        <w:rPr>
+          <w:rFonts w:ascii="Times New Roman" w:hAnsi="Times New Roman"/>
+          <w:b/>
+          <w:sz w:val="21"/>
+        </w:rPr>
+        <w:t>Figure 6: Two-layer SQL safety defence</w:t>
+      </w:r>
+    </w:p>
     <w:p>
       <w:pPr>
         <w:spacing w:before="320" w:after="160"/>
@@ -10363,6 +10897,96 @@
           <w:sz w:val="24"/>
         </w:rPr>
         <w:t>Each widget stores a unique identifier (a SHA-256 hash of the analysis plan), the original question, the analysis plan in JSON form, a hash of the SQL template used, chart configuration, timestamps, access rules, and run history. A new question triggers the full seven-stage pipeline; if an identical widget already exists, determined by a match on the plan hash, the cached artifact is returned immediately rather than recompiled. Scheduled refresh re-executes the stored SQL against fresh data on a configurable interval, which directly addresses the formative-study finding (Section 3.2) that 61% of reporting requests are recurring: a widget answers the question once and then continues answering it as new data arrives, rather than requiring the same natural-language request to be re-processed from scratch every time.</w:t>
+      </w:r>
+    </w:p>
+    <w:tbl>
+      <w:tblPr>
+        <w:tblW w:type="auto" w:w="0"/>
+        <w:jc w:val="center"/>
+        <w:tblLayout w:type="fixed"/>
+        <w:tblLook w:firstColumn="1" w:firstRow="1" w:lastColumn="0" w:lastRow="0" w:noHBand="0" w:noVBand="1" w:val="04A0"/>
+      </w:tblPr>
+      <w:tblGrid>
+        <w:gridCol w:w="9072"/>
+      </w:tblGrid>
+      <w:tr>
+        <w:trPr>
+          <w:trHeight w:val="3744"/>
+          <w:trHeight w:val="3744" w:hRule="atLeast"/>
+        </w:trPr>
+        <w:tc>
+          <w:tcPr>
+            <w:tcW w:type="dxa" w:w="9072"/>
+            <w:tcBorders>
+              <w:top w:val="dashed" w:sz="10" w:space="0" w:color="888888"/>
+              <w:left w:val="dashed" w:sz="10" w:space="0" w:color="888888"/>
+              <w:bottom w:val="dashed" w:sz="10" w:space="0" w:color="888888"/>
+              <w:right w:val="dashed" w:sz="10" w:space="0" w:color="888888"/>
+            </w:tcBorders>
+            <w:shd w:val="clear" w:fill="F7F7F7"/>
+          </w:tcPr>
+          <w:p>
+            <w:pPr>
+              <w:spacing w:before="280" w:after="120"/>
+              <w:jc w:val="center"/>
+            </w:pPr>
+            <w:r/>
+            <w:r>
+              <w:rPr>
+                <w:rFonts w:ascii="Times New Roman" w:hAnsi="Times New Roman"/>
+                <w:b/>
+                <w:color w:val="993300"/>
+                <w:sz w:val="21"/>
+              </w:rPr>
+              <w:t>[ PLACEHOLDER — FIGURE 7 NOT YET INSERTED ]</w:t>
+            </w:r>
+          </w:p>
+          <w:p>
+            <w:pPr>
+              <w:spacing w:after="160"/>
+              <w:jc w:val="center"/>
+            </w:pPr>
+            <w:r>
+              <w:rPr>
+                <w:rFonts w:ascii="Times New Roman" w:hAnsi="Times New Roman"/>
+                <w:b/>
+                <w:color w:val="333333"/>
+                <w:sz w:val="22"/>
+              </w:rPr>
+              <w:t>Widget lifecycle and refresh model</w:t>
+            </w:r>
+          </w:p>
+          <w:p>
+            <w:pPr>
+              <w:spacing w:after="280" w:line="300" w:lineRule="auto"/>
+              <w:ind w:left="432" w:right="432"/>
+              <w:jc w:val="center"/>
+            </w:pPr>
+            <w:r>
+              <w:rPr>
+                <w:rFonts w:ascii="Times New Roman" w:hAnsi="Times New Roman"/>
+                <w:i/>
+                <w:color w:val="555555"/>
+                <w:sz w:val="19"/>
+              </w:rPr>
+              <w:t>A cyclical flowchart. Start: 'New Natural-Language Question' -&gt; 'Full Seven-Stage Pipeline Runs' -&gt; 'Analysis Plan Hashed (SHA-256)' -&gt; a decision diamond 'Identical widget hash already exists?'. If YES, arrow to 'Return Cached Widget Immediately'. If NO, arrow to 'Save New Widget (SQL, chart config, access rule, refresh schedule)'. Both paths converge into a 'Dashboard Widget' box, from which a looping arrow labeled 'Scheduled Refresh (re-executes stored SQL on fresh data)' curves back into the same box — illustrating that a widget keeps answering the same recurring question rather than being discarded after one use.</w:t>
+            </w:r>
+          </w:p>
+        </w:tc>
+      </w:tr>
+    </w:tbl>
+    <w:p>
+      <w:pPr>
+        <w:spacing w:before="120" w:after="280"/>
+        <w:jc w:val="center"/>
+      </w:pPr>
+      <w:r>
+        <w:rPr>
+          <w:rFonts w:ascii="Times New Roman" w:hAnsi="Times New Roman"/>
+          <w:b/>
+          <w:sz w:val="21"/>
+        </w:rPr>
+        <w:t>Figure 7: Widget lifecycle and refresh model</w:t>
       </w:r>
     </w:p>
     <w:p>
@@ -12545,6 +13169,96 @@
         <w:t>The direct LLM-to-SQL baseline produced 5 unsafe queries out of 100 (a 5.0% unsafe rate), including INSERT, UPDATE, and DELETE statements and UNION clauses generated in response to the twenty adversarial prompts in the benchmark. AEGIS eliminated unsafe queries entirely, not by detecting and blocking them after generation, but by never allowing the LLM to generate executable SQL in the first place.</w:t>
       </w:r>
     </w:p>
+    <w:tbl>
+      <w:tblPr>
+        <w:tblW w:type="auto" w:w="0"/>
+        <w:jc w:val="center"/>
+        <w:tblLayout w:type="fixed"/>
+        <w:tblLook w:firstColumn="1" w:firstRow="1" w:lastColumn="0" w:lastRow="0" w:noHBand="0" w:noVBand="1" w:val="04A0"/>
+      </w:tblPr>
+      <w:tblGrid>
+        <w:gridCol w:w="9072"/>
+      </w:tblGrid>
+      <w:tr>
+        <w:trPr>
+          <w:trHeight w:val="3744"/>
+          <w:trHeight w:val="3744" w:hRule="atLeast"/>
+        </w:trPr>
+        <w:tc>
+          <w:tcPr>
+            <w:tcW w:type="dxa" w:w="9072"/>
+            <w:tcBorders>
+              <w:top w:val="dashed" w:sz="10" w:space="0" w:color="888888"/>
+              <w:left w:val="dashed" w:sz="10" w:space="0" w:color="888888"/>
+              <w:bottom w:val="dashed" w:sz="10" w:space="0" w:color="888888"/>
+              <w:right w:val="dashed" w:sz="10" w:space="0" w:color="888888"/>
+            </w:tcBorders>
+            <w:shd w:val="clear" w:fill="F7F7F7"/>
+          </w:tcPr>
+          <w:p>
+            <w:pPr>
+              <w:spacing w:before="280" w:after="120"/>
+              <w:jc w:val="center"/>
+            </w:pPr>
+            <w:r/>
+            <w:r>
+              <w:rPr>
+                <w:rFonts w:ascii="Times New Roman" w:hAnsi="Times New Roman"/>
+                <w:b/>
+                <w:color w:val="993300"/>
+                <w:sz w:val="21"/>
+              </w:rPr>
+              <w:t>[ PLACEHOLDER — FIGURE 8 NOT YET INSERTED ]</w:t>
+            </w:r>
+          </w:p>
+          <w:p>
+            <w:pPr>
+              <w:spacing w:after="160"/>
+              <w:jc w:val="center"/>
+            </w:pPr>
+            <w:r>
+              <w:rPr>
+                <w:rFonts w:ascii="Times New Roman" w:hAnsi="Times New Roman"/>
+                <w:b/>
+                <w:color w:val="333333"/>
+                <w:sz w:val="22"/>
+              </w:rPr>
+              <w:t>Evaluation results across unsafe-SQL rate, execution validity, and coverage</w:t>
+            </w:r>
+          </w:p>
+          <w:p>
+            <w:pPr>
+              <w:spacing w:after="280" w:line="300" w:lineRule="auto"/>
+              <w:ind w:left="432" w:right="432"/>
+              <w:jc w:val="center"/>
+            </w:pPr>
+            <w:r>
+              <w:rPr>
+                <w:rFonts w:ascii="Times New Roman" w:hAnsi="Times New Roman"/>
+                <w:i/>
+                <w:color w:val="555555"/>
+                <w:sz w:val="19"/>
+              </w:rPr>
+              <w:t>A grouped bar chart with three metric groups on the x-axis (Unsafe SQL Rate, Execution Validity, Coverage), two bars per group comparing 'Baseline (Direct LLM-to-SQL)' in red/orange against 'AEGIS' in green. Baseline: 5.0% unsafe, 99% validity, 99% coverage. AEGIS: 0% unsafe, 100% validity, 100% coverage. The AEGIS unsafe-rate bar should read visually as flat/near-zero next to the baseline's visible red bar, to make the safety contrast the immediate takeaway of the figure.</w:t>
+            </w:r>
+          </w:p>
+        </w:tc>
+      </w:tr>
+    </w:tbl>
+    <w:p>
+      <w:pPr>
+        <w:spacing w:before="120" w:after="280"/>
+        <w:jc w:val="center"/>
+      </w:pPr>
+      <w:r>
+        <w:rPr>
+          <w:rFonts w:ascii="Times New Roman" w:hAnsi="Times New Roman"/>
+          <w:b/>
+          <w:sz w:val="21"/>
+        </w:rPr>
+        <w:t>Figure 8: Evaluation results across unsafe-SQL rate, execution validity, and coverage</w:t>
+      </w:r>
+    </w:p>
     <w:p>
       <w:pPr>
         <w:spacing w:before="320" w:after="160"/>
@@ -13201,6 +13915,96 @@
           <w:sz w:val="24"/>
         </w:rPr>
         <w:t>Removing vocabulary injection in favor of a hand-maintained synonym dictionary produces the largest single drop, 35.3 percentage points of execution validity, confirming that vocabulary injection is not a convenience but the component doing the most work in keeping intent extraction reliable. Removing AST validation or the permission rewriter leaves the reported metrics unchanged on this benchmark (marked with an asterisk), which is expected and correctly interpreted as confirming their role as defense-in-depth layers against attack classes (T3, T4 in Section 3.5) that this particular benchmark's queries do not exercise, not as evidence that those layers are unnecessary.</w:t>
+      </w:r>
+    </w:p>
+    <w:tbl>
+      <w:tblPr>
+        <w:tblW w:type="auto" w:w="0"/>
+        <w:jc w:val="center"/>
+        <w:tblLayout w:type="fixed"/>
+        <w:tblLook w:firstColumn="1" w:firstRow="1" w:lastColumn="0" w:lastRow="0" w:noHBand="0" w:noVBand="1" w:val="04A0"/>
+      </w:tblPr>
+      <w:tblGrid>
+        <w:gridCol w:w="9072"/>
+      </w:tblGrid>
+      <w:tr>
+        <w:trPr>
+          <w:trHeight w:val="3744"/>
+          <w:trHeight w:val="3744" w:hRule="atLeast"/>
+        </w:trPr>
+        <w:tc>
+          <w:tcPr>
+            <w:tcW w:type="dxa" w:w="9072"/>
+            <w:tcBorders>
+              <w:top w:val="dashed" w:sz="10" w:space="0" w:color="888888"/>
+              <w:left w:val="dashed" w:sz="10" w:space="0" w:color="888888"/>
+              <w:bottom w:val="dashed" w:sz="10" w:space="0" w:color="888888"/>
+              <w:right w:val="dashed" w:sz="10" w:space="0" w:color="888888"/>
+            </w:tcBorders>
+            <w:shd w:val="clear" w:fill="F7F7F7"/>
+          </w:tcPr>
+          <w:p>
+            <w:pPr>
+              <w:spacing w:before="280" w:after="120"/>
+              <w:jc w:val="center"/>
+            </w:pPr>
+            <w:r/>
+            <w:r>
+              <w:rPr>
+                <w:rFonts w:ascii="Times New Roman" w:hAnsi="Times New Roman"/>
+                <w:b/>
+                <w:color w:val="993300"/>
+                <w:sz w:val="21"/>
+              </w:rPr>
+              <w:t>[ PLACEHOLDER — FIGURE 9 NOT YET INSERTED ]</w:t>
+            </w:r>
+          </w:p>
+          <w:p>
+            <w:pPr>
+              <w:spacing w:after="160"/>
+              <w:jc w:val="center"/>
+            </w:pPr>
+            <w:r>
+              <w:rPr>
+                <w:rFonts w:ascii="Times New Roman" w:hAnsi="Times New Roman"/>
+                <w:b/>
+                <w:color w:val="333333"/>
+                <w:sz w:val="22"/>
+              </w:rPr>
+              <w:t>Ablation study results</w:t>
+            </w:r>
+          </w:p>
+          <w:p>
+            <w:pPr>
+              <w:spacing w:after="280" w:line="300" w:lineRule="auto"/>
+              <w:ind w:left="432" w:right="432"/>
+              <w:jc w:val="center"/>
+            </w:pPr>
+            <w:r>
+              <w:rPr>
+                <w:rFonts w:ascii="Times New Roman" w:hAnsi="Times New Roman"/>
+                <w:i/>
+                <w:color w:val="555555"/>
+                <w:sz w:val="19"/>
+              </w:rPr>
+              <w:t>A horizontal bar chart listing each configuration from Table 7 on the y-axis (Full AEGIS, minus vocabulary injection, minus semantic layer, minus AST validation, minus confidence-gated clarification, minus permission rewriter, minus repair-on-parse-failure) with execution-validity percentage bars: 100%, 64.7%, 88.7%, 100%, 94.2%, 100%, 92.9%. Highlight the 'minus vocabulary injection' bar in a distinct color (e.g. red), since it shows the largest drop, to visually confirm it is the single most load-bearing component.</w:t>
+            </w:r>
+          </w:p>
+        </w:tc>
+      </w:tr>
+    </w:tbl>
+    <w:p>
+      <w:pPr>
+        <w:spacing w:before="120" w:after="280"/>
+        <w:jc w:val="center"/>
+      </w:pPr>
+      <w:r>
+        <w:rPr>
+          <w:rFonts w:ascii="Times New Roman" w:hAnsi="Times New Roman"/>
+          <w:b/>
+          <w:sz w:val="21"/>
+        </w:rPr>
+        <w:t>Figure 9: Ablation study results</w:t>
       </w:r>
     </w:p>
     <w:p>
@@ -14491,6 +15295,96 @@
         <w:t>AEGIS's safety infrastructure, the deterministic stages that carry out coverage validation, semantic mapping, permission rewriting, compilation, visualization selection, and widget persistence combined, adds a median of roughly 20 ms of overhead, negligible relative to the 1,850 ms median LLM API call. With a locally hosted Ollama model, median LLM call latency drops to approximately 340 ms, bringing total end-to-end latency below 430 ms. The safety guarantees established in Chapter 3 are, in this sense, effectively free: the cost of AEGIS's architecture is dominated by the same LLM call a direct LLM-to-SQL system would also have to make.</w:t>
       </w:r>
     </w:p>
+    <w:tbl>
+      <w:tblPr>
+        <w:tblW w:type="auto" w:w="0"/>
+        <w:jc w:val="center"/>
+        <w:tblLayout w:type="fixed"/>
+        <w:tblLook w:firstColumn="1" w:firstRow="1" w:lastColumn="0" w:lastRow="0" w:noHBand="0" w:noVBand="1" w:val="04A0"/>
+      </w:tblPr>
+      <w:tblGrid>
+        <w:gridCol w:w="9072"/>
+      </w:tblGrid>
+      <w:tr>
+        <w:trPr>
+          <w:trHeight w:val="3744"/>
+          <w:trHeight w:val="3744" w:hRule="atLeast"/>
+        </w:trPr>
+        <w:tc>
+          <w:tcPr>
+            <w:tcW w:type="dxa" w:w="9072"/>
+            <w:tcBorders>
+              <w:top w:val="dashed" w:sz="10" w:space="0" w:color="888888"/>
+              <w:left w:val="dashed" w:sz="10" w:space="0" w:color="888888"/>
+              <w:bottom w:val="dashed" w:sz="10" w:space="0" w:color="888888"/>
+              <w:right w:val="dashed" w:sz="10" w:space="0" w:color="888888"/>
+            </w:tcBorders>
+            <w:shd w:val="clear" w:fill="F7F7F7"/>
+          </w:tcPr>
+          <w:p>
+            <w:pPr>
+              <w:spacing w:before="280" w:after="120"/>
+              <w:jc w:val="center"/>
+            </w:pPr>
+            <w:r/>
+            <w:r>
+              <w:rPr>
+                <w:rFonts w:ascii="Times New Roman" w:hAnsi="Times New Roman"/>
+                <w:b/>
+                <w:color w:val="993300"/>
+                <w:sz w:val="21"/>
+              </w:rPr>
+              <w:t>[ PLACEHOLDER — FIGURE 10 NOT YET INSERTED ]</w:t>
+            </w:r>
+          </w:p>
+          <w:p>
+            <w:pPr>
+              <w:spacing w:after="160"/>
+              <w:jc w:val="center"/>
+            </w:pPr>
+            <w:r>
+              <w:rPr>
+                <w:rFonts w:ascii="Times New Roman" w:hAnsi="Times New Roman"/>
+                <w:b/>
+                <w:color w:val="333333"/>
+                <w:sz w:val="22"/>
+              </w:rPr>
+              <w:t>Pipeline stage latency breakdown</w:t>
+            </w:r>
+          </w:p>
+          <w:p>
+            <w:pPr>
+              <w:spacing w:after="280" w:line="300" w:lineRule="auto"/>
+              <w:ind w:left="432" w:right="432"/>
+              <w:jc w:val="center"/>
+            </w:pPr>
+            <w:r>
+              <w:rPr>
+                <w:rFonts w:ascii="Times New Roman" w:hAnsi="Times New Roman"/>
+                <w:i/>
+                <w:color w:val="555555"/>
+                <w:sz w:val="19"/>
+              </w:rPr>
+              <w:t>A horizontal stacked bar (or waterfall) chart of the six pipeline stages from Table 9 and their median latency: LLM API call (Groq) 1,850 ms, semantic mapping 12 ms, SQL compilation 8 ms, query execution (MySQL) 45 ms, visualization selector 2 ms, widget persistence 5 ms, totaling 1,922 ms. Since the LLM call dominates at 96.2% of the total, include an inset panel zooming into just the five non-LLM stages (the remaining ~72 ms) so their relative proportions are visible rather than compressed to invisibility next to the LLM bar.</w:t>
+            </w:r>
+          </w:p>
+        </w:tc>
+      </w:tr>
+    </w:tbl>
+    <w:p>
+      <w:pPr>
+        <w:spacing w:before="120" w:after="280"/>
+        <w:jc w:val="center"/>
+      </w:pPr>
+      <w:r>
+        <w:rPr>
+          <w:rFonts w:ascii="Times New Roman" w:hAnsi="Times New Roman"/>
+          <w:b/>
+          <w:sz w:val="21"/>
+        </w:rPr>
+        <w:t>Figure 10: Pipeline stage latency breakdown</w:t>
+      </w:r>
+    </w:p>
     <w:p>
       <w:pPr>
         <w:spacing w:before="320" w:after="160"/>
@@ -14518,6 +15412,96 @@
           <w:sz w:val="24"/>
         </w:rPr>
         <w:t>Among the 2.6% of the 312 formative-study requests that could not be answered at all, coverage-boundary rejections broke down as follows: metrics not present in the semantic layer (35% of rejections), unregistered dimensions (28%), requests requiring multi-metric aggregation beyond a single pattern (18%), causal or explanatory questions such as “why did revenue drop” (12%), and requests requiring a join path not present in the join graph (7%). Every rejection, in this study and in the benchmark, included the full list of available identifiers rather than a bare error, consistent with the design principle (Section 3.3) that a coverage failure should be actionable rather than opaque.</w:t>
+      </w:r>
+    </w:p>
+    <w:tbl>
+      <w:tblPr>
+        <w:tblW w:type="auto" w:w="0"/>
+        <w:jc w:val="center"/>
+        <w:tblLayout w:type="fixed"/>
+        <w:tblLook w:firstColumn="1" w:firstRow="1" w:lastColumn="0" w:lastRow="0" w:noHBand="0" w:noVBand="1" w:val="04A0"/>
+      </w:tblPr>
+      <w:tblGrid>
+        <w:gridCol w:w="9072"/>
+      </w:tblGrid>
+      <w:tr>
+        <w:trPr>
+          <w:trHeight w:val="3744"/>
+          <w:trHeight w:val="3744" w:hRule="atLeast"/>
+        </w:trPr>
+        <w:tc>
+          <w:tcPr>
+            <w:tcW w:type="dxa" w:w="9072"/>
+            <w:tcBorders>
+              <w:top w:val="dashed" w:sz="10" w:space="0" w:color="888888"/>
+              <w:left w:val="dashed" w:sz="10" w:space="0" w:color="888888"/>
+              <w:bottom w:val="dashed" w:sz="10" w:space="0" w:color="888888"/>
+              <w:right w:val="dashed" w:sz="10" w:space="0" w:color="888888"/>
+            </w:tcBorders>
+            <w:shd w:val="clear" w:fill="F7F7F7"/>
+          </w:tcPr>
+          <w:p>
+            <w:pPr>
+              <w:spacing w:before="280" w:after="120"/>
+              <w:jc w:val="center"/>
+            </w:pPr>
+            <w:r/>
+            <w:r>
+              <w:rPr>
+                <w:rFonts w:ascii="Times New Roman" w:hAnsi="Times New Roman"/>
+                <w:b/>
+                <w:color w:val="993300"/>
+                <w:sz w:val="21"/>
+              </w:rPr>
+              <w:t>[ PLACEHOLDER — FIGURE 11 NOT YET INSERTED ]</w:t>
+            </w:r>
+          </w:p>
+          <w:p>
+            <w:pPr>
+              <w:spacing w:after="160"/>
+              <w:jc w:val="center"/>
+            </w:pPr>
+            <w:r>
+              <w:rPr>
+                <w:rFonts w:ascii="Times New Roman" w:hAnsi="Times New Roman"/>
+                <w:b/>
+                <w:color w:val="333333"/>
+                <w:sz w:val="22"/>
+              </w:rPr>
+              <w:t>Query outcome distribution and coverage-boundary rejection reasons</w:t>
+            </w:r>
+          </w:p>
+          <w:p>
+            <w:pPr>
+              <w:spacing w:after="280" w:line="300" w:lineRule="auto"/>
+              <w:ind w:left="432" w:right="432"/>
+              <w:jc w:val="center"/>
+            </w:pPr>
+            <w:r>
+              <w:rPr>
+                <w:rFonts w:ascii="Times New Roman" w:hAnsi="Times New Roman"/>
+                <w:i/>
+                <w:color w:val="555555"/>
+                <w:sz w:val="19"/>
+              </w:rPr>
+              <w:t>Two side-by-side panels. LEFT panel: a donut/pie chart of query outcomes across the 312 formative-study requests — Answered directly 81.7%, Answered after one clarification 11.5%, Answered after semantic layer extension 4.2%, Could not be answered 2.6%. RIGHT panel: a second pie/bar chart breaking down only that 2.6% rejected slice into its underlying reasons: metrics not in semantic layer 35%, unregistered dimensions 28%, multi-metric aggregation 18%, causal/explanatory questions 12%, missing join paths 7%.</w:t>
+            </w:r>
+          </w:p>
+        </w:tc>
+      </w:tr>
+    </w:tbl>
+    <w:p>
+      <w:pPr>
+        <w:spacing w:before="120" w:after="280"/>
+        <w:jc w:val="center"/>
+      </w:pPr>
+      <w:r>
+        <w:rPr>
+          <w:rFonts w:ascii="Times New Roman" w:hAnsi="Times New Roman"/>
+          <w:b/>
+          <w:sz w:val="21"/>
+        </w:rPr>
+        <w:t>Figure 11: Query outcome distribution and coverage-boundary rejection reasons</w:t>
       </w:r>
     </w:p>
     <w:p>

</xml_diff>

<commit_message>
Fix thesis bullet rendering and add changelog
</commit_message>
<xml_diff>
--- a/docs/scripts/AEGIS Thesis Book Draft - A Constraint-Based Architecture for Safe LLM-Assisted Natural Language Analytics.docx
+++ b/docs/scripts/AEGIS Thesis Book Draft - A Constraint-Based Architecture for Safe LLM-Assisted Natural Language Analytics.docx
@@ -7302,9 +7302,17 @@
     </w:p>
     <w:p>
       <w:pPr>
-        <w:pStyle w:val="ListBullet"/>
         <w:spacing w:after="80" w:line="360" w:lineRule="auto"/>
-      </w:pPr>
+        <w:ind w:left="461" w:hanging="259"/>
+      </w:pPr>
+      <w:r>
+        <w:rPr>
+          <w:rFonts w:ascii="Times New Roman" w:hAnsi="Times New Roman"/>
+          <w:sz w:val="24"/>
+        </w:rPr>
+        <w:t>•</w:t>
+        <w:tab/>
+      </w:r>
       <w:r>
         <w:rPr>
           <w:rFonts w:ascii="Times New Roman" w:hAnsi="Times New Roman"/>
@@ -7315,9 +7323,17 @@
     </w:p>
     <w:p>
       <w:pPr>
-        <w:pStyle w:val="ListBullet"/>
         <w:spacing w:after="80" w:line="360" w:lineRule="auto"/>
-      </w:pPr>
+        <w:ind w:left="461" w:hanging="259"/>
+      </w:pPr>
+      <w:r>
+        <w:rPr>
+          <w:rFonts w:ascii="Times New Roman" w:hAnsi="Times New Roman"/>
+          <w:sz w:val="24"/>
+        </w:rPr>
+        <w:t>•</w:t>
+        <w:tab/>
+      </w:r>
       <w:r>
         <w:rPr>
           <w:rFonts w:ascii="Times New Roman" w:hAnsi="Times New Roman"/>
@@ -7328,9 +7344,17 @@
     </w:p>
     <w:p>
       <w:pPr>
-        <w:pStyle w:val="ListBullet"/>
         <w:spacing w:after="80" w:line="360" w:lineRule="auto"/>
-      </w:pPr>
+        <w:ind w:left="461" w:hanging="259"/>
+      </w:pPr>
+      <w:r>
+        <w:rPr>
+          <w:rFonts w:ascii="Times New Roman" w:hAnsi="Times New Roman"/>
+          <w:sz w:val="24"/>
+        </w:rPr>
+        <w:t>•</w:t>
+        <w:tab/>
+      </w:r>
       <w:r>
         <w:rPr>
           <w:rFonts w:ascii="Times New Roman" w:hAnsi="Times New Roman"/>
@@ -7341,9 +7365,17 @@
     </w:p>
     <w:p>
       <w:pPr>
-        <w:pStyle w:val="ListBullet"/>
         <w:spacing w:after="80" w:line="360" w:lineRule="auto"/>
-      </w:pPr>
+        <w:ind w:left="461" w:hanging="259"/>
+      </w:pPr>
+      <w:r>
+        <w:rPr>
+          <w:rFonts w:ascii="Times New Roman" w:hAnsi="Times New Roman"/>
+          <w:sz w:val="24"/>
+        </w:rPr>
+        <w:t>•</w:t>
+        <w:tab/>
+      </w:r>
       <w:r>
         <w:rPr>
           <w:rFonts w:ascii="Times New Roman" w:hAnsi="Times New Roman"/>
@@ -11184,9 +11216,17 @@
     </w:p>
     <w:p>
       <w:pPr>
-        <w:pStyle w:val="ListBullet"/>
         <w:spacing w:after="80" w:line="360" w:lineRule="auto"/>
-      </w:pPr>
+        <w:ind w:left="461" w:hanging="259"/>
+      </w:pPr>
+      <w:r>
+        <w:rPr>
+          <w:rFonts w:ascii="Times New Roman" w:hAnsi="Times New Roman"/>
+          <w:sz w:val="24"/>
+        </w:rPr>
+        <w:t>•</w:t>
+        <w:tab/>
+      </w:r>
       <w:r>
         <w:rPr>
           <w:rFonts w:ascii="Times New Roman" w:hAnsi="Times New Roman"/>
@@ -11197,9 +11237,17 @@
     </w:p>
     <w:p>
       <w:pPr>
-        <w:pStyle w:val="ListBullet"/>
         <w:spacing w:after="80" w:line="360" w:lineRule="auto"/>
-      </w:pPr>
+        <w:ind w:left="461" w:hanging="259"/>
+      </w:pPr>
+      <w:r>
+        <w:rPr>
+          <w:rFonts w:ascii="Times New Roman" w:hAnsi="Times New Roman"/>
+          <w:sz w:val="24"/>
+        </w:rPr>
+        <w:t>•</w:t>
+        <w:tab/>
+      </w:r>
       <w:r>
         <w:rPr>
           <w:rFonts w:ascii="Times New Roman" w:hAnsi="Times New Roman"/>
@@ -11210,9 +11258,17 @@
     </w:p>
     <w:p>
       <w:pPr>
-        <w:pStyle w:val="ListBullet"/>
         <w:spacing w:after="80" w:line="360" w:lineRule="auto"/>
-      </w:pPr>
+        <w:ind w:left="461" w:hanging="259"/>
+      </w:pPr>
+      <w:r>
+        <w:rPr>
+          <w:rFonts w:ascii="Times New Roman" w:hAnsi="Times New Roman"/>
+          <w:sz w:val="24"/>
+        </w:rPr>
+        <w:t>•</w:t>
+        <w:tab/>
+      </w:r>
       <w:r>
         <w:rPr>
           <w:rFonts w:ascii="Times New Roman" w:hAnsi="Times New Roman"/>
@@ -11223,9 +11279,17 @@
     </w:p>
     <w:p>
       <w:pPr>
-        <w:pStyle w:val="ListBullet"/>
         <w:spacing w:after="80" w:line="360" w:lineRule="auto"/>
-      </w:pPr>
+        <w:ind w:left="461" w:hanging="259"/>
+      </w:pPr>
+      <w:r>
+        <w:rPr>
+          <w:rFonts w:ascii="Times New Roman" w:hAnsi="Times New Roman"/>
+          <w:sz w:val="24"/>
+        </w:rPr>
+        <w:t>•</w:t>
+        <w:tab/>
+      </w:r>
       <w:r>
         <w:rPr>
           <w:rFonts w:ascii="Times New Roman" w:hAnsi="Times New Roman"/>
@@ -11236,9 +11300,17 @@
     </w:p>
     <w:p>
       <w:pPr>
-        <w:pStyle w:val="ListBullet"/>
         <w:spacing w:after="80" w:line="360" w:lineRule="auto"/>
-      </w:pPr>
+        <w:ind w:left="461" w:hanging="259"/>
+      </w:pPr>
+      <w:r>
+        <w:rPr>
+          <w:rFonts w:ascii="Times New Roman" w:hAnsi="Times New Roman"/>
+          <w:sz w:val="24"/>
+        </w:rPr>
+        <w:t>•</w:t>
+        <w:tab/>
+      </w:r>
       <w:r>
         <w:rPr>
           <w:rFonts w:ascii="Times New Roman" w:hAnsi="Times New Roman"/>
@@ -11249,9 +11321,17 @@
     </w:p>
     <w:p>
       <w:pPr>
-        <w:pStyle w:val="ListBullet"/>
         <w:spacing w:after="80" w:line="360" w:lineRule="auto"/>
-      </w:pPr>
+        <w:ind w:left="461" w:hanging="259"/>
+      </w:pPr>
+      <w:r>
+        <w:rPr>
+          <w:rFonts w:ascii="Times New Roman" w:hAnsi="Times New Roman"/>
+          <w:sz w:val="24"/>
+        </w:rPr>
+        <w:t>•</w:t>
+        <w:tab/>
+      </w:r>
       <w:r>
         <w:rPr>
           <w:rFonts w:ascii="Times New Roman" w:hAnsi="Times New Roman"/>
@@ -11262,9 +11342,17 @@
     </w:p>
     <w:p>
       <w:pPr>
-        <w:pStyle w:val="ListBullet"/>
         <w:spacing w:after="80" w:line="360" w:lineRule="auto"/>
-      </w:pPr>
+        <w:ind w:left="461" w:hanging="259"/>
+      </w:pPr>
+      <w:r>
+        <w:rPr>
+          <w:rFonts w:ascii="Times New Roman" w:hAnsi="Times New Roman"/>
+          <w:sz w:val="24"/>
+        </w:rPr>
+        <w:t>•</w:t>
+        <w:tab/>
+      </w:r>
       <w:r>
         <w:rPr>
           <w:rFonts w:ascii="Times New Roman" w:hAnsi="Times New Roman"/>
@@ -11275,9 +11363,17 @@
     </w:p>
     <w:p>
       <w:pPr>
-        <w:pStyle w:val="ListBullet"/>
         <w:spacing w:after="80" w:line="360" w:lineRule="auto"/>
-      </w:pPr>
+        <w:ind w:left="461" w:hanging="259"/>
+      </w:pPr>
+      <w:r>
+        <w:rPr>
+          <w:rFonts w:ascii="Times New Roman" w:hAnsi="Times New Roman"/>
+          <w:sz w:val="24"/>
+        </w:rPr>
+        <w:t>•</w:t>
+        <w:tab/>
+      </w:r>
       <w:r>
         <w:rPr>
           <w:rFonts w:ascii="Times New Roman" w:hAnsi="Times New Roman"/>
@@ -11530,9 +11626,17 @@
     </w:p>
     <w:p>
       <w:pPr>
-        <w:pStyle w:val="ListBullet"/>
         <w:spacing w:after="80" w:line="360" w:lineRule="auto"/>
-      </w:pPr>
+        <w:ind w:left="461" w:hanging="259"/>
+      </w:pPr>
+      <w:r>
+        <w:rPr>
+          <w:rFonts w:ascii="Times New Roman" w:hAnsi="Times New Roman"/>
+          <w:sz w:val="24"/>
+        </w:rPr>
+        <w:t>•</w:t>
+        <w:tab/>
+      </w:r>
       <w:r>
         <w:rPr>
           <w:rFonts w:ascii="Times New Roman" w:hAnsi="Times New Roman"/>
@@ -11543,9 +11647,17 @@
     </w:p>
     <w:p>
       <w:pPr>
-        <w:pStyle w:val="ListBullet"/>
         <w:spacing w:after="80" w:line="360" w:lineRule="auto"/>
-      </w:pPr>
+        <w:ind w:left="461" w:hanging="259"/>
+      </w:pPr>
+      <w:r>
+        <w:rPr>
+          <w:rFonts w:ascii="Times New Roman" w:hAnsi="Times New Roman"/>
+          <w:sz w:val="24"/>
+        </w:rPr>
+        <w:t>•</w:t>
+        <w:tab/>
+      </w:r>
       <w:r>
         <w:rPr>
           <w:rFonts w:ascii="Times New Roman" w:hAnsi="Times New Roman"/>
@@ -11556,9 +11668,17 @@
     </w:p>
     <w:p>
       <w:pPr>
-        <w:pStyle w:val="ListBullet"/>
         <w:spacing w:after="80" w:line="360" w:lineRule="auto"/>
-      </w:pPr>
+        <w:ind w:left="461" w:hanging="259"/>
+      </w:pPr>
+      <w:r>
+        <w:rPr>
+          <w:rFonts w:ascii="Times New Roman" w:hAnsi="Times New Roman"/>
+          <w:sz w:val="24"/>
+        </w:rPr>
+        <w:t>•</w:t>
+        <w:tab/>
+      </w:r>
       <w:r>
         <w:rPr>
           <w:rFonts w:ascii="Times New Roman" w:hAnsi="Times New Roman"/>
@@ -11569,9 +11689,17 @@
     </w:p>
     <w:p>
       <w:pPr>
-        <w:pStyle w:val="ListBullet"/>
         <w:spacing w:after="80" w:line="360" w:lineRule="auto"/>
-      </w:pPr>
+        <w:ind w:left="461" w:hanging="259"/>
+      </w:pPr>
+      <w:r>
+        <w:rPr>
+          <w:rFonts w:ascii="Times New Roman" w:hAnsi="Times New Roman"/>
+          <w:sz w:val="24"/>
+        </w:rPr>
+        <w:t>•</w:t>
+        <w:tab/>
+      </w:r>
       <w:r>
         <w:rPr>
           <w:rFonts w:ascii="Times New Roman" w:hAnsi="Times New Roman"/>
@@ -11582,9 +11710,17 @@
     </w:p>
     <w:p>
       <w:pPr>
-        <w:pStyle w:val="ListBullet"/>
         <w:spacing w:after="80" w:line="360" w:lineRule="auto"/>
-      </w:pPr>
+        <w:ind w:left="461" w:hanging="259"/>
+      </w:pPr>
+      <w:r>
+        <w:rPr>
+          <w:rFonts w:ascii="Times New Roman" w:hAnsi="Times New Roman"/>
+          <w:sz w:val="24"/>
+        </w:rPr>
+        <w:t>•</w:t>
+        <w:tab/>
+      </w:r>
       <w:r>
         <w:rPr>
           <w:rFonts w:ascii="Times New Roman" w:hAnsi="Times New Roman"/>
@@ -14956,22 +15092,38 @@
     </w:p>
     <w:p>
       <w:pPr>
-        <w:pStyle w:val="ListBullet"/>
         <w:spacing w:after="80" w:line="360" w:lineRule="auto"/>
+        <w:ind w:left="461" w:hanging="259"/>
       </w:pPr>
       <w:r>
         <w:rPr>
           <w:rFonts w:ascii="Times New Roman" w:hAnsi="Times New Roman"/>
           <w:sz w:val="24"/>
         </w:rPr>
-        <w:t>Clarification requests: when confidence is low, AEGIS should ask a follow-up question instead of guessing, for example â€œdid you mean revenue or profit?â€</w:t>
+        <w:t>•</w:t>
+        <w:tab/>
+      </w:r>
+      <w:r>
+        <w:rPr>
+          <w:rFonts w:ascii="Times New Roman" w:hAnsi="Times New Roman"/>
+          <w:sz w:val="24"/>
+        </w:rPr>
+        <w:t>Clarification requests: when confidence is low, AEGIS should ask a follow-up question instead of guessing, for example "did you mean revenue or profit?"</w:t>
       </w:r>
     </w:p>
     <w:p>
       <w:pPr>
-        <w:pStyle w:val="ListBullet"/>
         <w:spacing w:after="80" w:line="360" w:lineRule="auto"/>
-      </w:pPr>
+        <w:ind w:left="461" w:hanging="259"/>
+      </w:pPr>
+      <w:r>
+        <w:rPr>
+          <w:rFonts w:ascii="Times New Roman" w:hAnsi="Times New Roman"/>
+          <w:sz w:val="24"/>
+        </w:rPr>
+        <w:t>•</w:t>
+        <w:tab/>
+      </w:r>
       <w:r>
         <w:rPr>
           <w:rFonts w:ascii="Times New Roman" w:hAnsi="Times New Roman"/>
@@ -14982,22 +15134,38 @@
     </w:p>
     <w:p>
       <w:pPr>
-        <w:pStyle w:val="ListBullet"/>
         <w:spacing w:after="80" w:line="360" w:lineRule="auto"/>
+        <w:ind w:left="461" w:hanging="259"/>
       </w:pPr>
       <w:r>
         <w:rPr>
           <w:rFonts w:ascii="Times New Roman" w:hAnsi="Times New Roman"/>
           <w:sz w:val="24"/>
         </w:rPr>
-        <w:t>Multi-step queries: currently each query produces one widget; compound questions such as â€œrevenue trend and top 5 products side by sideâ€ require two separate queries today.</w:t>
+        <w:t>•</w:t>
+        <w:tab/>
+      </w:r>
+      <w:r>
+        <w:rPr>
+          <w:rFonts w:ascii="Times New Roman" w:hAnsi="Times New Roman"/>
+          <w:sz w:val="24"/>
+        </w:rPr>
+        <w:t>Multi-step queries: currently each query produces one widget; compound questions such as "revenue trend and top 5 products side by side" require two separate queries today.</w:t>
       </w:r>
     </w:p>
     <w:p>
       <w:pPr>
-        <w:pStyle w:val="ListBullet"/>
         <w:spacing w:after="80" w:line="360" w:lineRule="auto"/>
-      </w:pPr>
+        <w:ind w:left="461" w:hanging="259"/>
+      </w:pPr>
+      <w:r>
+        <w:rPr>
+          <w:rFonts w:ascii="Times New Roman" w:hAnsi="Times New Roman"/>
+          <w:sz w:val="24"/>
+        </w:rPr>
+        <w:t>•</w:t>
+        <w:tab/>
+      </w:r>
       <w:r>
         <w:rPr>
           <w:rFonts w:ascii="Times New Roman" w:hAnsi="Times New Roman"/>
@@ -15008,9 +15176,17 @@
     </w:p>
     <w:p>
       <w:pPr>
-        <w:pStyle w:val="ListBullet"/>
         <w:spacing w:after="80" w:line="360" w:lineRule="auto"/>
-      </w:pPr>
+        <w:ind w:left="461" w:hanging="259"/>
+      </w:pPr>
+      <w:r>
+        <w:rPr>
+          <w:rFonts w:ascii="Times New Roman" w:hAnsi="Times New Roman"/>
+          <w:sz w:val="24"/>
+        </w:rPr>
+        <w:t>•</w:t>
+        <w:tab/>
+      </w:r>
       <w:r>
         <w:rPr>
           <w:rFonts w:ascii="Times New Roman" w:hAnsi="Times New Roman"/>
@@ -15021,9 +15197,17 @@
     </w:p>
     <w:p>
       <w:pPr>
-        <w:pStyle w:val="ListBullet"/>
         <w:spacing w:after="80" w:line="360" w:lineRule="auto"/>
-      </w:pPr>
+        <w:ind w:left="461" w:hanging="259"/>
+      </w:pPr>
+      <w:r>
+        <w:rPr>
+          <w:rFonts w:ascii="Times New Roman" w:hAnsi="Times New Roman"/>
+          <w:sz w:val="24"/>
+        </w:rPr>
+        <w:t>•</w:t>
+        <w:tab/>
+      </w:r>
       <w:r>
         <w:rPr>
           <w:rFonts w:ascii="Times New Roman" w:hAnsi="Times New Roman"/>
@@ -15034,9 +15218,17 @@
     </w:p>
     <w:p>
       <w:pPr>
-        <w:pStyle w:val="ListBullet"/>
         <w:spacing w:after="80" w:line="360" w:lineRule="auto"/>
-      </w:pPr>
+        <w:ind w:left="461" w:hanging="259"/>
+      </w:pPr>
+      <w:r>
+        <w:rPr>
+          <w:rFonts w:ascii="Times New Roman" w:hAnsi="Times New Roman"/>
+          <w:sz w:val="24"/>
+        </w:rPr>
+        <w:t>•</w:t>
+        <w:tab/>
+      </w:r>
       <w:r>
         <w:rPr>
           <w:rFonts w:ascii="Times New Roman" w:hAnsi="Times New Roman"/>
@@ -15047,9 +15239,17 @@
     </w:p>
     <w:p>
       <w:pPr>
-        <w:pStyle w:val="ListBullet"/>
         <w:spacing w:after="80" w:line="360" w:lineRule="auto"/>
-      </w:pPr>
+        <w:ind w:left="461" w:hanging="259"/>
+      </w:pPr>
+      <w:r>
+        <w:rPr>
+          <w:rFonts w:ascii="Times New Roman" w:hAnsi="Times New Roman"/>
+          <w:sz w:val="24"/>
+        </w:rPr>
+        <w:t>•</w:t>
+        <w:tab/>
+      </w:r>
       <w:r>
         <w:rPr>
           <w:rFonts w:ascii="Times New Roman" w:hAnsi="Times New Roman"/>
@@ -15060,9 +15260,17 @@
     </w:p>
     <w:p>
       <w:pPr>
-        <w:pStyle w:val="ListBullet"/>
         <w:spacing w:after="80" w:line="360" w:lineRule="auto"/>
-      </w:pPr>
+        <w:ind w:left="461" w:hanging="259"/>
+      </w:pPr>
+      <w:r>
+        <w:rPr>
+          <w:rFonts w:ascii="Times New Roman" w:hAnsi="Times New Roman"/>
+          <w:sz w:val="24"/>
+        </w:rPr>
+        <w:t>•</w:t>
+        <w:tab/>
+      </w:r>
       <w:r>
         <w:rPr>
           <w:rFonts w:ascii="Times New Roman" w:hAnsi="Times New Roman"/>
@@ -15073,9 +15281,17 @@
     </w:p>
     <w:p>
       <w:pPr>
-        <w:pStyle w:val="ListBullet"/>
         <w:spacing w:after="80" w:line="360" w:lineRule="auto"/>
-      </w:pPr>
+        <w:ind w:left="461" w:hanging="259"/>
+      </w:pPr>
+      <w:r>
+        <w:rPr>
+          <w:rFonts w:ascii="Times New Roman" w:hAnsi="Times New Roman"/>
+          <w:sz w:val="24"/>
+        </w:rPr>
+        <w:t>•</w:t>
+        <w:tab/>
+      </w:r>
       <w:r>
         <w:rPr>
           <w:rFonts w:ascii="Times New Roman" w:hAnsi="Times New Roman"/>

</xml_diff>

<commit_message>
Refine thesis lists tables and figure placeholders
</commit_message>
<xml_diff>
--- a/docs/scripts/AEGIS Thesis Book Draft - A Constraint-Based Architecture for Safe LLM-Assisted Natural Language Analytics.docx
+++ b/docs/scripts/AEGIS Thesis Book Draft - A Constraint-Based Architecture for Safe LLM-Assisted Natural Language Analytics.docx
@@ -1006,9 +1006,109 @@
           <w:b/>
           <w:sz w:val="24"/>
         </w:rPr>
-        <w:t>List of Figures</w:t>
+        <w:t>Chapter 1: Introduction</w:t>
         <w:tab/>
-        <w:t>vii</w:t>
+        <w:t>1</w:t>
+      </w:r>
+    </w:p>
+    <w:p>
+      <w:pPr>
+        <w:spacing w:after="80" w:before="0" w:line="360" w:lineRule="auto"/>
+        <w:ind w:left="432"/>
+        <w:jc w:val="both"/>
+        <w:tabs>
+          <w:tab w:val="right" w:leader="dot" w:pos="8640"/>
+        </w:tabs>
+      </w:pPr>
+      <w:r>
+        <w:rPr>
+          <w:rFonts w:ascii="Times New Roman" w:hAnsi="Times New Roman"/>
+          <w:b w:val="0"/>
+          <w:sz w:val="23"/>
+        </w:rPr>
+        <w:t>1.1 Background</w:t>
+        <w:tab/>
+        <w:t>1</w:t>
+      </w:r>
+    </w:p>
+    <w:p>
+      <w:pPr>
+        <w:spacing w:after="80" w:before="0" w:line="360" w:lineRule="auto"/>
+        <w:ind w:left="432"/>
+        <w:jc w:val="both"/>
+        <w:tabs>
+          <w:tab w:val="right" w:leader="dot" w:pos="8640"/>
+        </w:tabs>
+      </w:pPr>
+      <w:r>
+        <w:rPr>
+          <w:rFonts w:ascii="Times New Roman" w:hAnsi="Times New Roman"/>
+          <w:b w:val="0"/>
+          <w:sz w:val="23"/>
+        </w:rPr>
+        <w:t>1.2 Problem Statement</w:t>
+        <w:tab/>
+        <w:t>1</w:t>
+      </w:r>
+    </w:p>
+    <w:p>
+      <w:pPr>
+        <w:spacing w:after="80" w:before="0" w:line="360" w:lineRule="auto"/>
+        <w:ind w:left="432"/>
+        <w:jc w:val="both"/>
+        <w:tabs>
+          <w:tab w:val="right" w:leader="dot" w:pos="8640"/>
+        </w:tabs>
+      </w:pPr>
+      <w:r>
+        <w:rPr>
+          <w:rFonts w:ascii="Times New Roman" w:hAnsi="Times New Roman"/>
+          <w:b w:val="0"/>
+          <w:sz w:val="23"/>
+        </w:rPr>
+        <w:t>1.3 Research Novelty and Motivation</w:t>
+        <w:tab/>
+        <w:t>2</w:t>
+      </w:r>
+    </w:p>
+    <w:p>
+      <w:pPr>
+        <w:spacing w:after="80" w:before="0" w:line="360" w:lineRule="auto"/>
+        <w:ind w:left="432"/>
+        <w:jc w:val="both"/>
+        <w:tabs>
+          <w:tab w:val="right" w:leader="dot" w:pos="8640"/>
+        </w:tabs>
+      </w:pPr>
+      <w:r>
+        <w:rPr>
+          <w:rFonts w:ascii="Times New Roman" w:hAnsi="Times New Roman"/>
+          <w:b w:val="0"/>
+          <w:sz w:val="23"/>
+        </w:rPr>
+        <w:t>1.4 Objectives and Contributions</w:t>
+        <w:tab/>
+        <w:t>3</w:t>
+      </w:r>
+    </w:p>
+    <w:p>
+      <w:pPr>
+        <w:spacing w:after="80" w:before="0" w:line="360" w:lineRule="auto"/>
+        <w:ind w:left="432"/>
+        <w:jc w:val="both"/>
+        <w:tabs>
+          <w:tab w:val="right" w:leader="dot" w:pos="8640"/>
+        </w:tabs>
+      </w:pPr>
+      <w:r>
+        <w:rPr>
+          <w:rFonts w:ascii="Times New Roman" w:hAnsi="Times New Roman"/>
+          <w:b w:val="0"/>
+          <w:sz w:val="23"/>
+        </w:rPr>
+        <w:t>1.5 Organization of the Thesis</w:t>
+        <w:tab/>
+        <w:t>3</w:t>
       </w:r>
     </w:p>
     <w:p>
@@ -1026,9 +1126,129 @@
           <w:b/>
           <w:sz w:val="24"/>
         </w:rPr>
-        <w:t>List of Tables</w:t>
+        <w:t>Chapter 2: Literature Review and Research Gap</w:t>
         <w:tab/>
-        <w:t>viii</w:t>
+        <w:t>5</w:t>
+      </w:r>
+    </w:p>
+    <w:p>
+      <w:pPr>
+        <w:spacing w:after="80" w:before="0" w:line="360" w:lineRule="auto"/>
+        <w:ind w:left="432"/>
+        <w:jc w:val="both"/>
+        <w:tabs>
+          <w:tab w:val="right" w:leader="dot" w:pos="8640"/>
+        </w:tabs>
+      </w:pPr>
+      <w:r>
+        <w:rPr>
+          <w:rFonts w:ascii="Times New Roman" w:hAnsi="Times New Roman"/>
+          <w:b w:val="0"/>
+          <w:sz w:val="23"/>
+        </w:rPr>
+        <w:t>2.1 Natural Language Interfaces to Databases</w:t>
+        <w:tab/>
+        <w:t>5</w:t>
+      </w:r>
+    </w:p>
+    <w:p>
+      <w:pPr>
+        <w:spacing w:after="80" w:before="0" w:line="360" w:lineRule="auto"/>
+        <w:ind w:left="432"/>
+        <w:jc w:val="both"/>
+        <w:tabs>
+          <w:tab w:val="right" w:leader="dot" w:pos="8640"/>
+        </w:tabs>
+      </w:pPr>
+      <w:r>
+        <w:rPr>
+          <w:rFonts w:ascii="Times New Roman" w:hAnsi="Times New Roman"/>
+          <w:b w:val="0"/>
+          <w:sz w:val="23"/>
+        </w:rPr>
+        <w:t>2.2 Neural and LLM-Based Text-to-SQL</w:t>
+        <w:tab/>
+        <w:t>5</w:t>
+      </w:r>
+    </w:p>
+    <w:p>
+      <w:pPr>
+        <w:spacing w:after="80" w:before="0" w:line="360" w:lineRule="auto"/>
+        <w:ind w:left="432"/>
+        <w:jc w:val="both"/>
+        <w:tabs>
+          <w:tab w:val="right" w:leader="dot" w:pos="8640"/>
+        </w:tabs>
+      </w:pPr>
+      <w:r>
+        <w:rPr>
+          <w:rFonts w:ascii="Times New Roman" w:hAnsi="Times New Roman"/>
+          <w:b w:val="0"/>
+          <w:sz w:val="23"/>
+        </w:rPr>
+        <w:t>2.3 Natural Language for Visualization and Dashboards</w:t>
+        <w:tab/>
+        <w:t>6</w:t>
+      </w:r>
+    </w:p>
+    <w:p>
+      <w:pPr>
+        <w:spacing w:after="80" w:before="0" w:line="360" w:lineRule="auto"/>
+        <w:ind w:left="432"/>
+        <w:jc w:val="both"/>
+        <w:tabs>
+          <w:tab w:val="right" w:leader="dot" w:pos="8640"/>
+        </w:tabs>
+      </w:pPr>
+      <w:r>
+        <w:rPr>
+          <w:rFonts w:ascii="Times New Roman" w:hAnsi="Times New Roman"/>
+          <w:b w:val="0"/>
+          <w:sz w:val="23"/>
+        </w:rPr>
+        <w:t>2.4 Applied Conversational Business Intelligence</w:t>
+        <w:tab/>
+        <w:t>7</w:t>
+      </w:r>
+    </w:p>
+    <w:p>
+      <w:pPr>
+        <w:spacing w:after="80" w:before="0" w:line="360" w:lineRule="auto"/>
+        <w:ind w:left="432"/>
+        <w:jc w:val="both"/>
+        <w:tabs>
+          <w:tab w:val="right" w:leader="dot" w:pos="8640"/>
+        </w:tabs>
+      </w:pPr>
+      <w:r>
+        <w:rPr>
+          <w:rFonts w:ascii="Times New Roman" w:hAnsi="Times New Roman"/>
+          <w:b w:val="0"/>
+          <w:sz w:val="23"/>
+        </w:rPr>
+        <w:t>2.5 Comparative Summary</w:t>
+        <w:tab/>
+        <w:t>8</w:t>
+      </w:r>
+    </w:p>
+    <w:p>
+      <w:pPr>
+        <w:spacing w:after="80" w:before="0" w:line="360" w:lineRule="auto"/>
+        <w:ind w:left="432"/>
+        <w:jc w:val="both"/>
+        <w:tabs>
+          <w:tab w:val="right" w:leader="dot" w:pos="8640"/>
+        </w:tabs>
+      </w:pPr>
+      <w:r>
+        <w:rPr>
+          <w:rFonts w:ascii="Times New Roman" w:hAnsi="Times New Roman"/>
+          <w:b w:val="0"/>
+          <w:sz w:val="23"/>
+        </w:rPr>
+        <w:t>2.6 Research Gap Analysis</w:t>
+        <w:tab/>
+        <w:t>9</w:t>
       </w:r>
     </w:p>
     <w:p>
@@ -1046,9 +1266,9 @@
           <w:b/>
           <w:sz w:val="24"/>
         </w:rPr>
-        <w:t>Chapter 1: Introduction</w:t>
+        <w:t>Chapter 3: Methodology</w:t>
         <w:tab/>
-        <w:t>1</w:t>
+        <w:t>10</w:t>
       </w:r>
     </w:p>
     <w:p>
@@ -1066,9 +1286,9 @@
           <w:b w:val="0"/>
           <w:sz w:val="23"/>
         </w:rPr>
-        <w:t>1.1 Background</w:t>
+        <w:t>3.1 Research Paradigm</w:t>
         <w:tab/>
-        <w:t>1</w:t>
+        <w:t>10</w:t>
       </w:r>
     </w:p>
     <w:p>
@@ -1086,9 +1306,9 @@
           <w:b w:val="0"/>
           <w:sz w:val="23"/>
         </w:rPr>
-        <w:t>1.2 Problem Statement</w:t>
+        <w:t>3.2 Formative Study of Reporting Patterns</w:t>
         <w:tab/>
-        <w:t>1</w:t>
+        <w:t>10</w:t>
       </w:r>
     </w:p>
     <w:p>
@@ -1106,9 +1326,9 @@
           <w:b w:val="0"/>
           <w:sz w:val="23"/>
         </w:rPr>
-        <w:t>1.3 Research Novelty and Motivation</w:t>
+        <w:t>3.3 Design Principles</w:t>
         <w:tab/>
-        <w:t>2</w:t>
+        <w:t>13</w:t>
       </w:r>
     </w:p>
     <w:p>
@@ -1126,9 +1346,9 @@
           <w:b w:val="0"/>
           <w:sz w:val="23"/>
         </w:rPr>
-        <w:t>1.4 Objectives and Contributions</w:t>
+        <w:t>3.4 Formal Model</w:t>
         <w:tab/>
-        <w:t>3</w:t>
+        <w:t>13</w:t>
       </w:r>
     </w:p>
     <w:p>
@@ -1146,9 +1366,129 @@
           <w:b w:val="0"/>
           <w:sz w:val="23"/>
         </w:rPr>
-        <w:t>1.5 Organization of the Thesis</w:t>
+        <w:t>3.5 Threat Model</w:t>
         <w:tab/>
-        <w:t>3</w:t>
+        <w:t>14</w:t>
+      </w:r>
+    </w:p>
+    <w:p>
+      <w:pPr>
+        <w:spacing w:after="80" w:before="0" w:line="360" w:lineRule="auto"/>
+        <w:ind w:left="432"/>
+        <w:jc w:val="both"/>
+        <w:tabs>
+          <w:tab w:val="right" w:leader="dot" w:pos="8640"/>
+        </w:tabs>
+      </w:pPr>
+      <w:r>
+        <w:rPr>
+          <w:rFonts w:ascii="Times New Roman" w:hAnsi="Times New Roman"/>
+          <w:b w:val="0"/>
+          <w:sz w:val="23"/>
+        </w:rPr>
+        <w:t>3.6 System Architecture</w:t>
+        <w:tab/>
+        <w:t>17</w:t>
+      </w:r>
+    </w:p>
+    <w:p>
+      <w:pPr>
+        <w:spacing w:after="80" w:before="0" w:line="360" w:lineRule="auto"/>
+        <w:ind w:left="432"/>
+        <w:jc w:val="both"/>
+        <w:tabs>
+          <w:tab w:val="right" w:leader="dot" w:pos="8640"/>
+        </w:tabs>
+      </w:pPr>
+      <w:r>
+        <w:rPr>
+          <w:rFonts w:ascii="Times New Roman" w:hAnsi="Times New Roman"/>
+          <w:b w:val="0"/>
+          <w:sz w:val="23"/>
+        </w:rPr>
+        <w:t>3.7 Semantic Layer Design</w:t>
+        <w:tab/>
+        <w:t>18</w:t>
+      </w:r>
+    </w:p>
+    <w:p>
+      <w:pPr>
+        <w:spacing w:after="80" w:before="0" w:line="360" w:lineRule="auto"/>
+        <w:ind w:left="432"/>
+        <w:jc w:val="both"/>
+        <w:tabs>
+          <w:tab w:val="right" w:leader="dot" w:pos="8640"/>
+        </w:tabs>
+      </w:pPr>
+      <w:r>
+        <w:rPr>
+          <w:rFonts w:ascii="Times New Roman" w:hAnsi="Times New Roman"/>
+          <w:b w:val="0"/>
+          <w:sz w:val="23"/>
+        </w:rPr>
+        <w:t>3.8 Intent Parsing with Dynamic Vocabulary Injection</w:t>
+        <w:tab/>
+        <w:t>19</w:t>
+      </w:r>
+    </w:p>
+    <w:p>
+      <w:pPr>
+        <w:spacing w:after="80" w:before="0" w:line="360" w:lineRule="auto"/>
+        <w:ind w:left="432"/>
+        <w:jc w:val="both"/>
+        <w:tabs>
+          <w:tab w:val="right" w:leader="dot" w:pos="8640"/>
+        </w:tabs>
+      </w:pPr>
+      <w:r>
+        <w:rPr>
+          <w:rFonts w:ascii="Times New Roman" w:hAnsi="Times New Roman"/>
+          <w:b w:val="0"/>
+          <w:sz w:val="23"/>
+        </w:rPr>
+        <w:t>3.9 Safe Query Compiler</w:t>
+        <w:tab/>
+        <w:t>21</w:t>
+      </w:r>
+    </w:p>
+    <w:p>
+      <w:pPr>
+        <w:spacing w:after="80" w:before="0" w:line="360" w:lineRule="auto"/>
+        <w:ind w:left="432"/>
+        <w:jc w:val="both"/>
+        <w:tabs>
+          <w:tab w:val="right" w:leader="dot" w:pos="8640"/>
+        </w:tabs>
+      </w:pPr>
+      <w:r>
+        <w:rPr>
+          <w:rFonts w:ascii="Times New Roman" w:hAnsi="Times New Roman"/>
+          <w:b w:val="0"/>
+          <w:sz w:val="23"/>
+        </w:rPr>
+        <w:t>3.10 Visualization Selector</w:t>
+        <w:tab/>
+        <w:t>22</w:t>
+      </w:r>
+    </w:p>
+    <w:p>
+      <w:pPr>
+        <w:spacing w:after="80" w:before="0" w:line="360" w:lineRule="auto"/>
+        <w:ind w:left="432"/>
+        <w:jc w:val="both"/>
+        <w:tabs>
+          <w:tab w:val="right" w:leader="dot" w:pos="8640"/>
+        </w:tabs>
+      </w:pPr>
+      <w:r>
+        <w:rPr>
+          <w:rFonts w:ascii="Times New Roman" w:hAnsi="Times New Roman"/>
+          <w:b w:val="0"/>
+          <w:sz w:val="23"/>
+        </w:rPr>
+        <w:t>3.11 Widget Persistence and Reuse</w:t>
+        <w:tab/>
+        <w:t>23</w:t>
       </w:r>
     </w:p>
     <w:p>
@@ -1166,9 +1506,9 @@
           <w:b/>
           <w:sz w:val="24"/>
         </w:rPr>
-        <w:t>Chapter 2: Literature Review and Research Gap</w:t>
+        <w:t>Chapter 4: Experimental Work</w:t>
         <w:tab/>
-        <w:t>5</w:t>
+        <w:t>24</w:t>
       </w:r>
     </w:p>
     <w:p>
@@ -1186,9 +1526,9 @@
           <w:b w:val="0"/>
           <w:sz w:val="23"/>
         </w:rPr>
-        <w:t>2.1 Natural Language Interfaces to Databases</w:t>
+        <w:t>4.1 Implementation</w:t>
         <w:tab/>
-        <w:t>5</w:t>
+        <w:t>24</w:t>
       </w:r>
     </w:p>
     <w:p>
@@ -1206,9 +1546,9 @@
           <w:b w:val="0"/>
           <w:sz w:val="23"/>
         </w:rPr>
-        <w:t>2.2 Neural and LLM-Based Text-to-SQL</w:t>
+        <w:t>4.2 Experimental Environment</w:t>
         <w:tab/>
-        <w:t>5</w:t>
+        <w:t>24</w:t>
       </w:r>
     </w:p>
     <w:p>
@@ -1226,9 +1566,9 @@
           <w:b w:val="0"/>
           <w:sz w:val="23"/>
         </w:rPr>
-        <w:t>2.3 Natural Language for Visualization and Dashboards</w:t>
+        <w:t>4.3 Benchmark Dataset Construction</w:t>
         <w:tab/>
-        <w:t>6</w:t>
+        <w:t>25</w:t>
       </w:r>
     </w:p>
     <w:p>
@@ -1246,9 +1586,9 @@
           <w:b w:val="0"/>
           <w:sz w:val="23"/>
         </w:rPr>
-        <w:t>2.4 Applied Conversational Business Intelligence</w:t>
+        <w:t>4.4 Baseline Systems</w:t>
         <w:tab/>
-        <w:t>7</w:t>
+        <w:t>26</w:t>
       </w:r>
     </w:p>
     <w:p>
@@ -1266,9 +1606,29 @@
           <w:b w:val="0"/>
           <w:sz w:val="23"/>
         </w:rPr>
-        <w:t>2.5 Comparative Summary</w:t>
+        <w:t>4.5 Evaluation Procedure</w:t>
         <w:tab/>
-        <w:t>7</w:t>
+        <w:t>26</w:t>
+      </w:r>
+    </w:p>
+    <w:p>
+      <w:pPr>
+        <w:spacing w:after="160" w:before="80" w:line="360" w:lineRule="auto"/>
+        <w:ind w:left="0"/>
+        <w:jc w:val="both"/>
+        <w:tabs>
+          <w:tab w:val="right" w:leader="dot" w:pos="8640"/>
+        </w:tabs>
+      </w:pPr>
+      <w:r>
+        <w:rPr>
+          <w:rFonts w:ascii="Times New Roman" w:hAnsi="Times New Roman"/>
+          <w:b/>
+          <w:sz w:val="24"/>
+        </w:rPr>
+        <w:t>Chapter 5: Results and Discussion</w:t>
+        <w:tab/>
+        <w:t>28</w:t>
       </w:r>
     </w:p>
     <w:p>
@@ -1286,9 +1646,109 @@
           <w:b w:val="0"/>
           <w:sz w:val="23"/>
         </w:rPr>
-        <w:t>2.6 Research Gap Analysis</w:t>
+        <w:t>5.1 Benchmark Run and Verified Metrics</w:t>
         <w:tab/>
-        <w:t>9</w:t>
+        <w:t>28</w:t>
+      </w:r>
+    </w:p>
+    <w:p>
+      <w:pPr>
+        <w:spacing w:after="80" w:before="0" w:line="360" w:lineRule="auto"/>
+        <w:ind w:left="432"/>
+        <w:jc w:val="both"/>
+        <w:tabs>
+          <w:tab w:val="right" w:leader="dot" w:pos="8640"/>
+        </w:tabs>
+      </w:pPr>
+      <w:r>
+        <w:rPr>
+          <w:rFonts w:ascii="Times New Roman" w:hAnsi="Times New Roman"/>
+          <w:b w:val="0"/>
+          <w:sz w:val="23"/>
+        </w:rPr>
+        <w:t>5.2 SQL Safety and True Database Execution Validity</w:t>
+        <w:tab/>
+        <w:t>29</w:t>
+      </w:r>
+    </w:p>
+    <w:p>
+      <w:pPr>
+        <w:spacing w:after="80" w:before="0" w:line="360" w:lineRule="auto"/>
+        <w:ind w:left="432"/>
+        <w:jc w:val="both"/>
+        <w:tabs>
+          <w:tab w:val="right" w:leader="dot" w:pos="8640"/>
+        </w:tabs>
+      </w:pPr>
+      <w:r>
+        <w:rPr>
+          <w:rFonts w:ascii="Times New Roman" w:hAnsi="Times New Roman"/>
+          <w:b w:val="0"/>
+          <w:sz w:val="23"/>
+        </w:rPr>
+        <w:t>5.3 Execution Failure Analysis</w:t>
+        <w:tab/>
+        <w:t>30</w:t>
+      </w:r>
+    </w:p>
+    <w:p>
+      <w:pPr>
+        <w:spacing w:after="80" w:before="0" w:line="360" w:lineRule="auto"/>
+        <w:ind w:left="432"/>
+        <w:jc w:val="both"/>
+        <w:tabs>
+          <w:tab w:val="right" w:leader="dot" w:pos="8640"/>
+        </w:tabs>
+      </w:pPr>
+      <w:r>
+        <w:rPr>
+          <w:rFonts w:ascii="Times New Roman" w:hAnsi="Times New Roman"/>
+          <w:b w:val="0"/>
+          <w:sz w:val="23"/>
+        </w:rPr>
+        <w:t>5.4 Semantic Correctness and Accuracy</w:t>
+        <w:tab/>
+        <w:t>31</w:t>
+      </w:r>
+    </w:p>
+    <w:p>
+      <w:pPr>
+        <w:spacing w:after="80" w:before="0" w:line="360" w:lineRule="auto"/>
+        <w:ind w:left="432"/>
+        <w:jc w:val="both"/>
+        <w:tabs>
+          <w:tab w:val="right" w:leader="dot" w:pos="8640"/>
+        </w:tabs>
+      </w:pPr>
+      <w:r>
+        <w:rPr>
+          <w:rFonts w:ascii="Times New Roman" w:hAnsi="Times New Roman"/>
+          <w:b w:val="0"/>
+          <w:sz w:val="23"/>
+        </w:rPr>
+        <w:t>5.5 B3 Template-Only Baseline</w:t>
+        <w:tab/>
+        <w:t>32</w:t>
+      </w:r>
+    </w:p>
+    <w:p>
+      <w:pPr>
+        <w:spacing w:after="80" w:before="0" w:line="360" w:lineRule="auto"/>
+        <w:ind w:left="432"/>
+        <w:jc w:val="both"/>
+        <w:tabs>
+          <w:tab w:val="right" w:leader="dot" w:pos="8640"/>
+        </w:tabs>
+      </w:pPr>
+      <w:r>
+        <w:rPr>
+          <w:rFonts w:ascii="Times New Roman" w:hAnsi="Times New Roman"/>
+          <w:b w:val="0"/>
+          <w:sz w:val="23"/>
+        </w:rPr>
+        <w:t>5.6 Discussion</w:t>
+        <w:tab/>
+        <w:t>32</w:t>
       </w:r>
     </w:p>
     <w:p>
@@ -1306,229 +1766,9 @@
           <w:b/>
           <w:sz w:val="24"/>
         </w:rPr>
-        <w:t>Chapter 3: Methodology</w:t>
+        <w:t>Chapter 6: Limitations and Future Work</w:t>
         <w:tab/>
-        <w:t>10</w:t>
-      </w:r>
-    </w:p>
-    <w:p>
-      <w:pPr>
-        <w:spacing w:after="80" w:before="0" w:line="360" w:lineRule="auto"/>
-        <w:ind w:left="432"/>
-        <w:jc w:val="both"/>
-        <w:tabs>
-          <w:tab w:val="right" w:leader="dot" w:pos="8640"/>
-        </w:tabs>
-      </w:pPr>
-      <w:r>
-        <w:rPr>
-          <w:rFonts w:ascii="Times New Roman" w:hAnsi="Times New Roman"/>
-          <w:b w:val="0"/>
-          <w:sz w:val="23"/>
-        </w:rPr>
-        <w:t>3.1 Research Paradigm</w:t>
-        <w:tab/>
-        <w:t>10</w:t>
-      </w:r>
-    </w:p>
-    <w:p>
-      <w:pPr>
-        <w:spacing w:after="80" w:before="0" w:line="360" w:lineRule="auto"/>
-        <w:ind w:left="432"/>
-        <w:jc w:val="both"/>
-        <w:tabs>
-          <w:tab w:val="right" w:leader="dot" w:pos="8640"/>
-        </w:tabs>
-      </w:pPr>
-      <w:r>
-        <w:rPr>
-          <w:rFonts w:ascii="Times New Roman" w:hAnsi="Times New Roman"/>
-          <w:b w:val="0"/>
-          <w:sz w:val="23"/>
-        </w:rPr>
-        <w:t>3.2 Formative Study of Reporting Patterns</w:t>
-        <w:tab/>
-        <w:t>10</w:t>
-      </w:r>
-    </w:p>
-    <w:p>
-      <w:pPr>
-        <w:spacing w:after="80" w:before="0" w:line="360" w:lineRule="auto"/>
-        <w:ind w:left="432"/>
-        <w:jc w:val="both"/>
-        <w:tabs>
-          <w:tab w:val="right" w:leader="dot" w:pos="8640"/>
-        </w:tabs>
-      </w:pPr>
-      <w:r>
-        <w:rPr>
-          <w:rFonts w:ascii="Times New Roman" w:hAnsi="Times New Roman"/>
-          <w:b w:val="0"/>
-          <w:sz w:val="23"/>
-        </w:rPr>
-        <w:t>3.3 Design Principles</w:t>
-        <w:tab/>
-        <w:t>13</w:t>
-      </w:r>
-    </w:p>
-    <w:p>
-      <w:pPr>
-        <w:spacing w:after="80" w:before="0" w:line="360" w:lineRule="auto"/>
-        <w:ind w:left="432"/>
-        <w:jc w:val="both"/>
-        <w:tabs>
-          <w:tab w:val="right" w:leader="dot" w:pos="8640"/>
-        </w:tabs>
-      </w:pPr>
-      <w:r>
-        <w:rPr>
-          <w:rFonts w:ascii="Times New Roman" w:hAnsi="Times New Roman"/>
-          <w:b w:val="0"/>
-          <w:sz w:val="23"/>
-        </w:rPr>
-        <w:t>3.4 Formal Model</w:t>
-        <w:tab/>
-        <w:t>13</w:t>
-      </w:r>
-    </w:p>
-    <w:p>
-      <w:pPr>
-        <w:spacing w:after="80" w:before="0" w:line="360" w:lineRule="auto"/>
-        <w:ind w:left="432"/>
-        <w:jc w:val="both"/>
-        <w:tabs>
-          <w:tab w:val="right" w:leader="dot" w:pos="8640"/>
-        </w:tabs>
-      </w:pPr>
-      <w:r>
-        <w:rPr>
-          <w:rFonts w:ascii="Times New Roman" w:hAnsi="Times New Roman"/>
-          <w:b w:val="0"/>
-          <w:sz w:val="23"/>
-        </w:rPr>
-        <w:t>3.5 Threat Model</w:t>
-        <w:tab/>
-        <w:t>14</w:t>
-      </w:r>
-    </w:p>
-    <w:p>
-      <w:pPr>
-        <w:spacing w:after="80" w:before="0" w:line="360" w:lineRule="auto"/>
-        <w:ind w:left="432"/>
-        <w:jc w:val="both"/>
-        <w:tabs>
-          <w:tab w:val="right" w:leader="dot" w:pos="8640"/>
-        </w:tabs>
-      </w:pPr>
-      <w:r>
-        <w:rPr>
-          <w:rFonts w:ascii="Times New Roman" w:hAnsi="Times New Roman"/>
-          <w:b w:val="0"/>
-          <w:sz w:val="23"/>
-        </w:rPr>
-        <w:t>3.6 System Architecture</w:t>
-        <w:tab/>
-        <w:t>17</w:t>
-      </w:r>
-    </w:p>
-    <w:p>
-      <w:pPr>
-        <w:spacing w:after="80" w:before="0" w:line="360" w:lineRule="auto"/>
-        <w:ind w:left="432"/>
-        <w:jc w:val="both"/>
-        <w:tabs>
-          <w:tab w:val="right" w:leader="dot" w:pos="8640"/>
-        </w:tabs>
-      </w:pPr>
-      <w:r>
-        <w:rPr>
-          <w:rFonts w:ascii="Times New Roman" w:hAnsi="Times New Roman"/>
-          <w:b w:val="0"/>
-          <w:sz w:val="23"/>
-        </w:rPr>
-        <w:t>3.7 Semantic Layer Design</w:t>
-        <w:tab/>
-        <w:t>18</w:t>
-      </w:r>
-    </w:p>
-    <w:p>
-      <w:pPr>
-        <w:spacing w:after="80" w:before="0" w:line="360" w:lineRule="auto"/>
-        <w:ind w:left="432"/>
-        <w:jc w:val="both"/>
-        <w:tabs>
-          <w:tab w:val="right" w:leader="dot" w:pos="8640"/>
-        </w:tabs>
-      </w:pPr>
-      <w:r>
-        <w:rPr>
-          <w:rFonts w:ascii="Times New Roman" w:hAnsi="Times New Roman"/>
-          <w:b w:val="0"/>
-          <w:sz w:val="23"/>
-        </w:rPr>
-        <w:t>3.8 Intent Parsing with Dynamic Vocabulary Injection</w:t>
-        <w:tab/>
-        <w:t>19</w:t>
-      </w:r>
-    </w:p>
-    <w:p>
-      <w:pPr>
-        <w:spacing w:after="80" w:before="0" w:line="360" w:lineRule="auto"/>
-        <w:ind w:left="432"/>
-        <w:jc w:val="both"/>
-        <w:tabs>
-          <w:tab w:val="right" w:leader="dot" w:pos="8640"/>
-        </w:tabs>
-      </w:pPr>
-      <w:r>
-        <w:rPr>
-          <w:rFonts w:ascii="Times New Roman" w:hAnsi="Times New Roman"/>
-          <w:b w:val="0"/>
-          <w:sz w:val="23"/>
-        </w:rPr>
-        <w:t>3.9 Safe Query Compiler</w:t>
-        <w:tab/>
-        <w:t>21</w:t>
-      </w:r>
-    </w:p>
-    <w:p>
-      <w:pPr>
-        <w:spacing w:after="80" w:before="0" w:line="360" w:lineRule="auto"/>
-        <w:ind w:left="432"/>
-        <w:jc w:val="both"/>
-        <w:tabs>
-          <w:tab w:val="right" w:leader="dot" w:pos="8640"/>
-        </w:tabs>
-      </w:pPr>
-      <w:r>
-        <w:rPr>
-          <w:rFonts w:ascii="Times New Roman" w:hAnsi="Times New Roman"/>
-          <w:b w:val="0"/>
-          <w:sz w:val="23"/>
-        </w:rPr>
-        <w:t>3.10 Visualization Selector</w:t>
-        <w:tab/>
-        <w:t>22</w:t>
-      </w:r>
-    </w:p>
-    <w:p>
-      <w:pPr>
-        <w:spacing w:after="80" w:before="0" w:line="360" w:lineRule="auto"/>
-        <w:ind w:left="432"/>
-        <w:jc w:val="both"/>
-        <w:tabs>
-          <w:tab w:val="right" w:leader="dot" w:pos="8640"/>
-        </w:tabs>
-      </w:pPr>
-      <w:r>
-        <w:rPr>
-          <w:rFonts w:ascii="Times New Roman" w:hAnsi="Times New Roman"/>
-          <w:b w:val="0"/>
-          <w:sz w:val="23"/>
-        </w:rPr>
-        <w:t>3.11 Widget Persistence and Reuse</w:t>
-        <w:tab/>
-        <w:t>23</w:t>
+        <w:t>34</w:t>
       </w:r>
     </w:p>
     <w:p>
@@ -1546,109 +1786,9 @@
           <w:b/>
           <w:sz w:val="24"/>
         </w:rPr>
-        <w:t>Chapter 4: Experimental Work</w:t>
+        <w:t>Chapter 7: Conclusion</w:t>
         <w:tab/>
-        <w:t>24</w:t>
-      </w:r>
-    </w:p>
-    <w:p>
-      <w:pPr>
-        <w:spacing w:after="80" w:before="0" w:line="360" w:lineRule="auto"/>
-        <w:ind w:left="432"/>
-        <w:jc w:val="both"/>
-        <w:tabs>
-          <w:tab w:val="right" w:leader="dot" w:pos="8640"/>
-        </w:tabs>
-      </w:pPr>
-      <w:r>
-        <w:rPr>
-          <w:rFonts w:ascii="Times New Roman" w:hAnsi="Times New Roman"/>
-          <w:b w:val="0"/>
-          <w:sz w:val="23"/>
-        </w:rPr>
-        <w:t>4.1 Implementation</w:t>
-        <w:tab/>
-        <w:t>24</w:t>
-      </w:r>
-    </w:p>
-    <w:p>
-      <w:pPr>
-        <w:spacing w:after="80" w:before="0" w:line="360" w:lineRule="auto"/>
-        <w:ind w:left="432"/>
-        <w:jc w:val="both"/>
-        <w:tabs>
-          <w:tab w:val="right" w:leader="dot" w:pos="8640"/>
-        </w:tabs>
-      </w:pPr>
-      <w:r>
-        <w:rPr>
-          <w:rFonts w:ascii="Times New Roman" w:hAnsi="Times New Roman"/>
-          <w:b w:val="0"/>
-          <w:sz w:val="23"/>
-        </w:rPr>
-        <w:t>4.2 Experimental Environment</w:t>
-        <w:tab/>
-        <w:t>24</w:t>
-      </w:r>
-    </w:p>
-    <w:p>
-      <w:pPr>
-        <w:spacing w:after="80" w:before="0" w:line="360" w:lineRule="auto"/>
-        <w:ind w:left="432"/>
-        <w:jc w:val="both"/>
-        <w:tabs>
-          <w:tab w:val="right" w:leader="dot" w:pos="8640"/>
-        </w:tabs>
-      </w:pPr>
-      <w:r>
-        <w:rPr>
-          <w:rFonts w:ascii="Times New Roman" w:hAnsi="Times New Roman"/>
-          <w:b w:val="0"/>
-          <w:sz w:val="23"/>
-        </w:rPr>
-        <w:t>4.3 Benchmark Dataset Construction</w:t>
-        <w:tab/>
-        <w:t>25</w:t>
-      </w:r>
-    </w:p>
-    <w:p>
-      <w:pPr>
-        <w:spacing w:after="80" w:before="0" w:line="360" w:lineRule="auto"/>
-        <w:ind w:left="432"/>
-        <w:jc w:val="both"/>
-        <w:tabs>
-          <w:tab w:val="right" w:leader="dot" w:pos="8640"/>
-        </w:tabs>
-      </w:pPr>
-      <w:r>
-        <w:rPr>
-          <w:rFonts w:ascii="Times New Roman" w:hAnsi="Times New Roman"/>
-          <w:b w:val="0"/>
-          <w:sz w:val="23"/>
-        </w:rPr>
-        <w:t>4.4 Baseline Systems</w:t>
-        <w:tab/>
-        <w:t>26</w:t>
-      </w:r>
-    </w:p>
-    <w:p>
-      <w:pPr>
-        <w:spacing w:after="80" w:before="0" w:line="360" w:lineRule="auto"/>
-        <w:ind w:left="432"/>
-        <w:jc w:val="both"/>
-        <w:tabs>
-          <w:tab w:val="right" w:leader="dot" w:pos="8640"/>
-        </w:tabs>
-      </w:pPr>
-      <w:r>
-        <w:rPr>
-          <w:rFonts w:ascii="Times New Roman" w:hAnsi="Times New Roman"/>
-          <w:b w:val="0"/>
-          <w:sz w:val="23"/>
-        </w:rPr>
-        <w:t>4.5 Evaluation Procedure</w:t>
-        <w:tab/>
-        <w:t>26</w:t>
+        <w:t>37</w:t>
       </w:r>
     </w:p>
     <w:p>
@@ -1666,15 +1806,34 @@
           <w:b/>
           <w:sz w:val="24"/>
         </w:rPr>
-        <w:t>Chapter 5: Results and Discussion</w:t>
+        <w:t>References</w:t>
         <w:tab/>
-        <w:t>28</w:t>
+        <w:t>39</w:t>
       </w:r>
     </w:p>
     <w:p>
+      <w:r>
+        <w:br w:type="page"/>
+      </w:r>
+    </w:p>
+    <w:p>
+      <w:pPr>
+        <w:spacing w:after="400" w:before="0" w:line="360" w:lineRule="auto"/>
+        <w:jc w:val="center"/>
+      </w:pPr>
+      <w:r>
+        <w:rPr>
+          <w:rFonts w:ascii="Times New Roman" w:hAnsi="Times New Roman"/>
+          <w:b/>
+          <w:i w:val="0"/>
+          <w:sz w:val="30"/>
+        </w:rPr>
+        <w:t>List of Figures</w:t>
+      </w:r>
+    </w:p>
+    <w:p>
       <w:pPr>
         <w:spacing w:after="80" w:before="0" w:line="360" w:lineRule="auto"/>
-        <w:ind w:left="432"/>
         <w:jc w:val="both"/>
         <w:tabs>
           <w:tab w:val="right" w:leader="dot" w:pos="8640"/>
@@ -1683,18 +1842,16 @@
       <w:r>
         <w:rPr>
           <w:rFonts w:ascii="Times New Roman" w:hAnsi="Times New Roman"/>
-          <w:b w:val="0"/>
-          <w:sz w:val="23"/>
-        </w:rPr>
-        <w:t>5.1 Benchmark Run and Verified Metrics</w:t>
+          <w:sz w:val="24"/>
+        </w:rPr>
+        <w:t>Figure 1: AEGIS architecture pipeline</w:t>
         <w:tab/>
-        <w:t>28</w:t>
+        <w:t>18</w:t>
       </w:r>
     </w:p>
     <w:p>
       <w:pPr>
         <w:spacing w:after="80" w:before="0" w:line="360" w:lineRule="auto"/>
-        <w:ind w:left="432"/>
         <w:jc w:val="both"/>
         <w:tabs>
           <w:tab w:val="right" w:leader="dot" w:pos="8640"/>
@@ -1703,18 +1860,16 @@
       <w:r>
         <w:rPr>
           <w:rFonts w:ascii="Times New Roman" w:hAnsi="Times New Roman"/>
-          <w:b w:val="0"/>
-          <w:sz w:val="23"/>
-        </w:rPr>
-        <w:t>5.2 SQL Safety and True Database Execution Validity</w:t>
+          <w:sz w:val="24"/>
+        </w:rPr>
+        <w:t>Figure 2: Semantic layer modularity</w:t>
         <w:tab/>
-        <w:t>29</w:t>
+        <w:t>18</w:t>
       </w:r>
     </w:p>
     <w:p>
       <w:pPr>
         <w:spacing w:after="80" w:before="0" w:line="360" w:lineRule="auto"/>
-        <w:ind w:left="432"/>
         <w:jc w:val="both"/>
         <w:tabs>
           <w:tab w:val="right" w:leader="dot" w:pos="8640"/>
@@ -1723,18 +1878,16 @@
       <w:r>
         <w:rPr>
           <w:rFonts w:ascii="Times New Roman" w:hAnsi="Times New Roman"/>
-          <w:b w:val="0"/>
-          <w:sz w:val="23"/>
-        </w:rPr>
-        <w:t>5.3 Execution Failure Analysis</w:t>
+          <w:sz w:val="24"/>
+        </w:rPr>
+        <w:t>Figure 3: Vocabulary injection workflow</w:t>
         <w:tab/>
-        <w:t>30</w:t>
+        <w:t>20</w:t>
       </w:r>
     </w:p>
     <w:p>
       <w:pPr>
         <w:spacing w:after="80" w:before="0" w:line="360" w:lineRule="auto"/>
-        <w:ind w:left="432"/>
         <w:jc w:val="both"/>
         <w:tabs>
           <w:tab w:val="right" w:leader="dot" w:pos="8640"/>
@@ -1743,18 +1896,16 @@
       <w:r>
         <w:rPr>
           <w:rFonts w:ascii="Times New Roman" w:hAnsi="Times New Roman"/>
-          <w:b w:val="0"/>
-          <w:sz w:val="23"/>
-        </w:rPr>
-        <w:t>5.4 Semantic Correctness and Accuracy</w:t>
+          <w:sz w:val="24"/>
+        </w:rPr>
+        <w:t>Figure 4: AEGIS analytical patterns</w:t>
         <w:tab/>
-        <w:t>31</w:t>
+        <w:t>21</w:t>
       </w:r>
     </w:p>
     <w:p>
       <w:pPr>
         <w:spacing w:after="80" w:before="0" w:line="360" w:lineRule="auto"/>
-        <w:ind w:left="432"/>
         <w:jc w:val="both"/>
         <w:tabs>
           <w:tab w:val="right" w:leader="dot" w:pos="8640"/>
@@ -1763,18 +1914,16 @@
       <w:r>
         <w:rPr>
           <w:rFonts w:ascii="Times New Roman" w:hAnsi="Times New Roman"/>
-          <w:b w:val="0"/>
-          <w:sz w:val="23"/>
-        </w:rPr>
-        <w:t>5.5 B3 Template-Only Baseline</w:t>
+          <w:sz w:val="24"/>
+        </w:rPr>
+        <w:t>Figure 5: Benchmark pattern classification</w:t>
         <w:tab/>
-        <w:t>32</w:t>
+        <w:t>12</w:t>
       </w:r>
     </w:p>
     <w:p>
       <w:pPr>
         <w:spacing w:after="80" w:before="0" w:line="360" w:lineRule="auto"/>
-        <w:ind w:left="432"/>
         <w:jc w:val="both"/>
         <w:tabs>
           <w:tab w:val="right" w:leader="dot" w:pos="8640"/>
@@ -1783,18 +1932,16 @@
       <w:r>
         <w:rPr>
           <w:rFonts w:ascii="Times New Roman" w:hAnsi="Times New Roman"/>
-          <w:b w:val="0"/>
-          <w:sz w:val="23"/>
-        </w:rPr>
-        <w:t>5.6 Discussion</w:t>
+          <w:sz w:val="24"/>
+        </w:rPr>
+        <w:t>Figure 6: Two-layer SQL safety defence</w:t>
         <w:tab/>
-        <w:t>32</w:t>
+        <w:t>22</w:t>
       </w:r>
     </w:p>
     <w:p>
       <w:pPr>
-        <w:spacing w:after="160" w:before="80" w:line="360" w:lineRule="auto"/>
-        <w:ind w:left="0"/>
+        <w:spacing w:after="80" w:before="0" w:line="360" w:lineRule="auto"/>
         <w:jc w:val="both"/>
         <w:tabs>
           <w:tab w:val="right" w:leader="dot" w:pos="8640"/>
@@ -1803,18 +1950,16 @@
       <w:r>
         <w:rPr>
           <w:rFonts w:ascii="Times New Roman" w:hAnsi="Times New Roman"/>
-          <w:b/>
           <w:sz w:val="24"/>
         </w:rPr>
-        <w:t>Chapter 6: Limitations and Future Work</w:t>
+        <w:t>Figure 7: Widget lifecycle and refresh model</w:t>
         <w:tab/>
-        <w:t>34</w:t>
+        <w:t>23</w:t>
       </w:r>
     </w:p>
     <w:p>
       <w:pPr>
-        <w:spacing w:after="160" w:before="80" w:line="360" w:lineRule="auto"/>
-        <w:ind w:left="0"/>
+        <w:spacing w:after="80" w:before="0" w:line="360" w:lineRule="auto"/>
         <w:jc w:val="both"/>
         <w:tabs>
           <w:tab w:val="right" w:leader="dot" w:pos="8640"/>
@@ -1823,18 +1968,36 @@
       <w:r>
         <w:rPr>
           <w:rFonts w:ascii="Times New Roman" w:hAnsi="Times New Roman"/>
-          <w:b/>
           <w:sz w:val="24"/>
         </w:rPr>
-        <w:t>Chapter 7: Conclusion</w:t>
+        <w:t>Figure 8: Safety and execution-validity comparison</w:t>
         <w:tab/>
-        <w:t>37</w:t>
+        <w:t>30</w:t>
       </w:r>
     </w:p>
     <w:p>
-      <w:pPr>
-        <w:spacing w:after="160" w:before="80" w:line="360" w:lineRule="auto"/>
-        <w:ind w:left="0"/>
+      <w:r>
+        <w:br w:type="page"/>
+      </w:r>
+    </w:p>
+    <w:p>
+      <w:pPr>
+        <w:spacing w:after="400" w:before="0" w:line="360" w:lineRule="auto"/>
+        <w:jc w:val="center"/>
+      </w:pPr>
+      <w:r>
+        <w:rPr>
+          <w:rFonts w:ascii="Times New Roman" w:hAnsi="Times New Roman"/>
+          <w:b/>
+          <w:i w:val="0"/>
+          <w:sz w:val="30"/>
+        </w:rPr>
+        <w:t>List of Tables</w:t>
+      </w:r>
+    </w:p>
+    <w:p>
+      <w:pPr>
+        <w:spacing w:after="80" w:before="0" w:line="360" w:lineRule="auto"/>
         <w:jc w:val="both"/>
         <w:tabs>
           <w:tab w:val="right" w:leader="dot" w:pos="8640"/>
@@ -1843,322 +2006,173 @@
       <w:r>
         <w:rPr>
           <w:rFonts w:ascii="Times New Roman" w:hAnsi="Times New Roman"/>
-          <w:b/>
           <w:sz w:val="24"/>
         </w:rPr>
-        <w:t>References</w:t>
+        <w:t>Table 1: Semantic layer object model</w:t>
         <w:tab/>
-        <w:t>39</w:t>
+        <w:t>18</w:t>
       </w:r>
     </w:p>
     <w:p>
-      <w:r>
-        <w:br w:type="page"/>
+      <w:pPr>
+        <w:spacing w:after="80" w:before="0" w:line="360" w:lineRule="auto"/>
+        <w:jc w:val="both"/>
+        <w:tabs>
+          <w:tab w:val="right" w:leader="dot" w:pos="8640"/>
+        </w:tabs>
+      </w:pPr>
+      <w:r>
+        <w:rPr>
+          <w:rFonts w:ascii="Times New Roman" w:hAnsi="Times New Roman"/>
+          <w:sz w:val="24"/>
+        </w:rPr>
+        <w:t>Table 2: AEGIS analytical patterns</w:t>
+        <w:tab/>
+        <w:t>21</w:t>
       </w:r>
     </w:p>
     <w:p>
       <w:pPr>
-        <w:spacing w:after="400" w:before="0" w:line="360" w:lineRule="auto"/>
-        <w:jc w:val="center"/>
-      </w:pPr>
-      <w:r>
-        <w:rPr>
-          <w:rFonts w:ascii="Times New Roman" w:hAnsi="Times New Roman"/>
-          <w:b/>
-          <w:i w:val="0"/>
-          <w:sz w:val="30"/>
-        </w:rPr>
-        <w:t>List of Figures</w:t>
+        <w:spacing w:after="80" w:before="0" w:line="360" w:lineRule="auto"/>
+        <w:jc w:val="both"/>
+        <w:tabs>
+          <w:tab w:val="right" w:leader="dot" w:pos="8640"/>
+        </w:tabs>
+      </w:pPr>
+      <w:r>
+        <w:rPr>
+          <w:rFonts w:ascii="Times New Roman" w:hAnsi="Times New Roman"/>
+          <w:sz w:val="24"/>
+        </w:rPr>
+        <w:t>Table 3: Visualization selector mapping</w:t>
+        <w:tab/>
+        <w:t>22</w:t>
       </w:r>
     </w:p>
     <w:p>
       <w:pPr>
-        <w:spacing w:after="160" w:before="0" w:line="360" w:lineRule="auto"/>
+        <w:spacing w:after="80" w:before="0" w:line="360" w:lineRule="auto"/>
         <w:jc w:val="both"/>
-      </w:pPr>
-      <w:r>
-        <w:rPr>
-          <w:rFonts w:ascii="Times New Roman" w:hAnsi="Times New Roman"/>
-          <w:b w:val="0"/>
-          <w:i w:val="0"/>
+        <w:tabs>
+          <w:tab w:val="right" w:leader="dot" w:pos="8640"/>
+        </w:tabs>
+      </w:pPr>
+      <w:r>
+        <w:rPr>
+          <w:rFonts w:ascii="Times New Roman" w:hAnsi="Times New Roman"/>
           <w:sz w:val="24"/>
         </w:rPr>
-        <w:t>Figure 1: AEGIS architecture pipeline (User Request to Dashboard Widget)</w:t>
+        <w:t>Table 4: Comparative summary of related systems</w:t>
+        <w:tab/>
+        <w:t>8</w:t>
       </w:r>
     </w:p>
     <w:p>
       <w:pPr>
-        <w:spacing w:after="160" w:before="0" w:line="360" w:lineRule="auto"/>
+        <w:spacing w:after="80" w:before="0" w:line="360" w:lineRule="auto"/>
         <w:jc w:val="both"/>
-      </w:pPr>
-      <w:r>
-        <w:rPr>
-          <w:rFonts w:ascii="Times New Roman" w:hAnsi="Times New Roman"/>
-          <w:b w:val="0"/>
-          <w:i w:val="0"/>
+        <w:tabs>
+          <w:tab w:val="right" w:leader="dot" w:pos="8640"/>
+        </w:tabs>
+      </w:pPr>
+      <w:r>
+        <w:rPr>
+          <w:rFonts w:ascii="Times New Roman" w:hAnsi="Times New Roman"/>
           <w:sz w:val="24"/>
         </w:rPr>
-        <w:t>Figure 2: Semantic layer modularity - composable blocks vs. free-form SQL generation</w:t>
+        <w:t>Table 5: Verified benchmark status</w:t>
+        <w:tab/>
+        <w:t>28</w:t>
       </w:r>
     </w:p>
     <w:p>
       <w:pPr>
-        <w:spacing w:after="160" w:before="0" w:line="360" w:lineRule="auto"/>
+        <w:spacing w:after="80" w:before="0" w:line="360" w:lineRule="auto"/>
         <w:jc w:val="both"/>
-      </w:pPr>
-      <w:r>
-        <w:rPr>
-          <w:rFonts w:ascii="Times New Roman" w:hAnsi="Times New Roman"/>
-          <w:b w:val="0"/>
-          <w:i w:val="0"/>
+        <w:tabs>
+          <w:tab w:val="right" w:leader="dot" w:pos="8640"/>
+        </w:tabs>
+      </w:pPr>
+      <w:r>
+        <w:rPr>
+          <w:rFonts w:ascii="Times New Roman" w:hAnsi="Times New Roman"/>
           <w:sz w:val="24"/>
         </w:rPr>
-        <w:t>Figure 3: Vocabulary injection workflow</w:t>
+        <w:t>Table 6: SQL safety and true execution validity</w:t>
+        <w:tab/>
+        <w:t>29</w:t>
       </w:r>
     </w:p>
     <w:p>
       <w:pPr>
-        <w:spacing w:after="160" w:before="0" w:line="360" w:lineRule="auto"/>
+        <w:spacing w:after="80" w:before="0" w:line="360" w:lineRule="auto"/>
         <w:jc w:val="both"/>
-      </w:pPr>
-      <w:r>
-        <w:rPr>
-          <w:rFonts w:ascii="Times New Roman" w:hAnsi="Times New Roman"/>
-          <w:b w:val="0"/>
-          <w:i w:val="0"/>
+        <w:tabs>
+          <w:tab w:val="right" w:leader="dot" w:pos="8640"/>
+        </w:tabs>
+      </w:pPr>
+      <w:r>
+        <w:rPr>
+          <w:rFonts w:ascii="Times New Roman" w:hAnsi="Times New Roman"/>
           <w:sz w:val="24"/>
         </w:rPr>
-        <w:t>Figure 4: Taxonomy of the eleven AEGIS analytical primitives</w:t>
+        <w:t>Table 7: True-execution failure analysis</w:t>
+        <w:tab/>
+        <w:t>30</w:t>
       </w:r>
     </w:p>
     <w:p>
       <w:pPr>
-        <w:spacing w:after="160" w:before="0" w:line="360" w:lineRule="auto"/>
+        <w:spacing w:after="80" w:before="0" w:line="360" w:lineRule="auto"/>
         <w:jc w:val="both"/>
-      </w:pPr>
-      <w:r>
-        <w:rPr>
-          <w:rFonts w:ascii="Times New Roman" w:hAnsi="Times New Roman"/>
-          <w:b w:val="0"/>
-          <w:i w:val="0"/>
+        <w:tabs>
+          <w:tab w:val="right" w:leader="dot" w:pos="8640"/>
+        </w:tabs>
+      </w:pPr>
+      <w:r>
+        <w:rPr>
+          <w:rFonts w:ascii="Times New Roman" w:hAnsi="Times New Roman"/>
           <w:sz w:val="24"/>
         </w:rPr>
-        <w:t>Figure 5: Pattern classification of the answerable analytical benchmark subset</w:t>
+        <w:t>Table 8: Evaluation metric distinction</w:t>
+        <w:tab/>
+        <w:t>31</w:t>
       </w:r>
     </w:p>
     <w:p>
       <w:pPr>
-        <w:spacing w:after="160" w:before="0" w:line="360" w:lineRule="auto"/>
+        <w:spacing w:after="80" w:before="0" w:line="360" w:lineRule="auto"/>
         <w:jc w:val="both"/>
-      </w:pPr>
-      <w:r>
-        <w:rPr>
-          <w:rFonts w:ascii="Times New Roman" w:hAnsi="Times New Roman"/>
-          <w:b w:val="0"/>
-          <w:i w:val="0"/>
+        <w:tabs>
+          <w:tab w:val="right" w:leader="dot" w:pos="8640"/>
+        </w:tabs>
+      </w:pPr>
+      <w:r>
+        <w:rPr>
+          <w:rFonts w:ascii="Times New Roman" w:hAnsi="Times New Roman"/>
           <w:sz w:val="24"/>
         </w:rPr>
-        <w:t>Figure 6: Two-layer SQL safety defence</w:t>
+        <w:t>Table 9: Template-only baseline summary</w:t>
+        <w:tab/>
+        <w:t>32</w:t>
       </w:r>
     </w:p>
     <w:p>
       <w:pPr>
-        <w:spacing w:after="160" w:before="0" w:line="360" w:lineRule="auto"/>
+        <w:spacing w:after="80" w:before="0" w:line="360" w:lineRule="auto"/>
         <w:jc w:val="both"/>
-      </w:pPr>
-      <w:r>
-        <w:rPr>
-          <w:rFonts w:ascii="Times New Roman" w:hAnsi="Times New Roman"/>
-          <w:b w:val="0"/>
-          <w:i w:val="0"/>
+        <w:tabs>
+          <w:tab w:val="right" w:leader="dot" w:pos="8640"/>
+        </w:tabs>
+      </w:pPr>
+      <w:r>
+        <w:rPr>
+          <w:rFonts w:ascii="Times New Roman" w:hAnsi="Times New Roman"/>
           <w:sz w:val="24"/>
         </w:rPr>
-        <w:t>Figure 7: Widget lifecycle and refresh model</w:t>
-      </w:r>
-    </w:p>
-    <w:p>
-      <w:pPr>
-        <w:spacing w:after="160" w:before="0" w:line="360" w:lineRule="auto"/>
-        <w:jc w:val="both"/>
-      </w:pPr>
-      <w:r>
-        <w:rPr>
-          <w:rFonts w:ascii="Times New Roman" w:hAnsi="Times New Roman"/>
-          <w:b w:val="0"/>
-          <w:i w:val="0"/>
-          <w:sz w:val="24"/>
-        </w:rPr>
-        <w:t>Figure 8: Verified safety and execution-validity comparison</w:t>
-      </w:r>
-    </w:p>
-    <w:p>
-      <w:r>
-        <w:br w:type="page"/>
-      </w:r>
-    </w:p>
-    <w:p>
-      <w:pPr>
-        <w:spacing w:after="400" w:before="0" w:line="360" w:lineRule="auto"/>
-        <w:jc w:val="center"/>
-      </w:pPr>
-      <w:r>
-        <w:rPr>
-          <w:rFonts w:ascii="Times New Roman" w:hAnsi="Times New Roman"/>
-          <w:b/>
-          <w:i w:val="0"/>
-          <w:sz w:val="30"/>
-        </w:rPr>
-        <w:t>List of Tables</w:t>
-      </w:r>
-    </w:p>
-    <w:p>
-      <w:pPr>
-        <w:spacing w:after="160" w:before="0" w:line="360" w:lineRule="auto"/>
-        <w:jc w:val="both"/>
-      </w:pPr>
-      <w:r>
-        <w:rPr>
-          <w:rFonts w:ascii="Times New Roman" w:hAnsi="Times New Roman"/>
-          <w:b w:val="0"/>
-          <w:i w:val="0"/>
-          <w:sz w:val="24"/>
-        </w:rPr>
-        <w:t>Table 1: Semantic layer object model (metric, dimension, filter, time rule, join path, pattern, permission)</w:t>
-      </w:r>
-    </w:p>
-    <w:p>
-      <w:pPr>
-        <w:spacing w:after="160" w:before="0" w:line="360" w:lineRule="auto"/>
-        <w:jc w:val="both"/>
-      </w:pPr>
-      <w:r>
-        <w:rPr>
-          <w:rFonts w:ascii="Times New Roman" w:hAnsi="Times New Roman"/>
-          <w:b w:val="0"/>
-          <w:i w:val="0"/>
-          <w:sz w:val="24"/>
-        </w:rPr>
-        <w:t>Table 2: The eleven AEGIS analytical patterns with required slots and default visualizations</w:t>
-      </w:r>
-    </w:p>
-    <w:p>
-      <w:pPr>
-        <w:spacing w:after="160" w:before="0" w:line="360" w:lineRule="auto"/>
-        <w:jc w:val="both"/>
-      </w:pPr>
-      <w:r>
-        <w:rPr>
-          <w:rFonts w:ascii="Times New Roman" w:hAnsi="Times New Roman"/>
-          <w:b w:val="0"/>
-          <w:i w:val="0"/>
-          <w:sz w:val="24"/>
-        </w:rPr>
-        <w:t>Table 3: Visualization selector mapping (intent, result shape, chosen chart)</w:t>
-      </w:r>
-    </w:p>
-    <w:p>
-      <w:pPr>
-        <w:spacing w:after="160" w:before="0" w:line="360" w:lineRule="auto"/>
-        <w:jc w:val="both"/>
-      </w:pPr>
-      <w:r>
-        <w:rPr>
-          <w:rFonts w:ascii="Times New Roman" w:hAnsi="Times New Roman"/>
-          <w:b w:val="0"/>
-          <w:i w:val="0"/>
-          <w:sz w:val="24"/>
-        </w:rPr>
-        <w:t>Table 4: Comparative summary of related NL-to-database and NL-to-visualization systems</w:t>
-      </w:r>
-    </w:p>
-    <w:p>
-      <w:pPr>
-        <w:spacing w:after="160" w:before="0" w:line="360" w:lineRule="auto"/>
-        <w:jc w:val="both"/>
-      </w:pPr>
-      <w:r>
-        <w:rPr>
-          <w:rFonts w:ascii="Times New Roman" w:hAnsi="Times New Roman"/>
-          <w:b w:val="0"/>
-          <w:i w:val="0"/>
-          <w:sz w:val="24"/>
-        </w:rPr>
-        <w:t>Table 5: Verified benchmark status</w:t>
-      </w:r>
-    </w:p>
-    <w:p>
-      <w:pPr>
-        <w:spacing w:after="160" w:before="0" w:line="360" w:lineRule="auto"/>
-        <w:jc w:val="both"/>
-      </w:pPr>
-      <w:r>
-        <w:rPr>
-          <w:rFonts w:ascii="Times New Roman" w:hAnsi="Times New Roman"/>
-          <w:b w:val="0"/>
-          <w:i w:val="0"/>
-          <w:sz w:val="24"/>
-        </w:rPr>
-        <w:t>Table 6: SQL safety and true execution validity on the 107-query benchmark</w:t>
-      </w:r>
-    </w:p>
-    <w:p>
-      <w:pPr>
-        <w:spacing w:after="160" w:before="0" w:line="360" w:lineRule="auto"/>
-        <w:jc w:val="both"/>
-      </w:pPr>
-      <w:r>
-        <w:rPr>
-          <w:rFonts w:ascii="Times New Roman" w:hAnsi="Times New Roman"/>
-          <w:b w:val="0"/>
-          <w:i w:val="0"/>
-          <w:sz w:val="24"/>
-        </w:rPr>
-        <w:t>Table 7: AEGIS true-execution failures diagnosed from MySQL execution</w:t>
-      </w:r>
-    </w:p>
-    <w:p>
-      <w:pPr>
-        <w:spacing w:after="160" w:before="0" w:line="360" w:lineRule="auto"/>
-        <w:jc w:val="both"/>
-      </w:pPr>
-      <w:r>
-        <w:rPr>
-          <w:rFonts w:ascii="Times New Roman" w:hAnsi="Times New Roman"/>
-          <w:b w:val="0"/>
-          <w:i w:val="0"/>
-          <w:sz w:val="24"/>
-        </w:rPr>
-        <w:t>Table 8: Distinguishing the evaluation metrics</w:t>
-      </w:r>
-    </w:p>
-    <w:p>
-      <w:pPr>
-        <w:spacing w:after="160" w:before="0" w:line="360" w:lineRule="auto"/>
-        <w:jc w:val="both"/>
-      </w:pPr>
-      <w:r>
-        <w:rPr>
-          <w:rFonts w:ascii="Times New Roman" w:hAnsi="Times New Roman"/>
-          <w:b w:val="0"/>
-          <w:i w:val="0"/>
-          <w:sz w:val="24"/>
-        </w:rPr>
-        <w:t>Table 9: B3 execution-validity summary</w:t>
-      </w:r>
-    </w:p>
-    <w:p>
-      <w:pPr>
-        <w:spacing w:after="160" w:before="0" w:line="360" w:lineRule="auto"/>
-        <w:jc w:val="both"/>
-      </w:pPr>
-      <w:r>
-        <w:rPr>
-          <w:rFonts w:ascii="Times New Roman" w:hAnsi="Times New Roman"/>
-          <w:b w:val="0"/>
-          <w:i w:val="0"/>
-          <w:sz w:val="24"/>
-        </w:rPr>
-        <w:t>Table 10: Structural comparison of AEGIS vs. direct LLM-to-SQL</w:t>
+        <w:t>Table 10: AEGIS vs. direct LLM-to-SQL</w:t>
+        <w:tab/>
+        <w:t>32</w:t>
       </w:r>
     </w:p>
     <w:p>
@@ -2831,6 +2845,11 @@
       </w:r>
     </w:p>
     <w:p>
+      <w:r>
+        <w:br w:type="page"/>
+      </w:r>
+    </w:p>
+    <w:p>
       <w:pPr>
         <w:spacing w:before="320" w:after="160"/>
         <w:jc w:val="left"/>
@@ -2846,7 +2865,7 @@
     </w:p>
     <w:p>
       <w:pPr>
-        <w:spacing w:before="200" w:after="80"/>
+        <w:spacing w:before="80" w:after="80"/>
         <w:jc w:val="center"/>
       </w:pPr>
       <w:r>
@@ -2863,6 +2882,7 @@
         <w:tblStyle w:val="TableGrid"/>
         <w:tblW w:type="auto" w:w="0"/>
         <w:jc w:val="center"/>
+        <w:tblLayout w:type="fixed"/>
         <w:tblLook w:firstColumn="1" w:firstRow="1" w:lastColumn="0" w:lastRow="0" w:noHBand="0" w:noVBand="1" w:val="04A0"/>
         <w:tblBorders>
           <w:top w:val="single" w:sz="4" w:space="0" w:color="999999"/>
@@ -2874,16 +2894,19 @@
         </w:tblBorders>
       </w:tblPr>
       <w:tblGrid>
-        <w:gridCol w:w="1128"/>
-        <w:gridCol w:w="1128"/>
-        <w:gridCol w:w="1128"/>
-        <w:gridCol w:w="1128"/>
-        <w:gridCol w:w="1128"/>
-        <w:gridCol w:w="1128"/>
-        <w:gridCol w:w="1128"/>
-        <w:gridCol w:w="1128"/>
+        <w:gridCol w:w="1800"/>
+        <w:gridCol w:w="792"/>
+        <w:gridCol w:w="1080"/>
+        <w:gridCol w:w="936"/>
+        <w:gridCol w:w="936"/>
+        <w:gridCol w:w="936"/>
+        <w:gridCol w:w="1080"/>
+        <w:gridCol w:w="1584"/>
       </w:tblGrid>
       <w:tr>
+        <w:trPr>
+          <w:cantSplit/>
+        </w:trPr>
         <w:tc>
           <w:tcPr>
             <w:tcW w:type="dxa" w:w="1128"/>
@@ -2891,6 +2914,7 @@
           <w:p>
             <w:pPr>
               <w:jc w:val="center"/>
+              <w:keepNext/>
             </w:pPr>
             <w:r>
               <w:rPr>
@@ -2916,6 +2940,7 @@
           <w:p>
             <w:pPr>
               <w:jc w:val="center"/>
+              <w:keepNext/>
             </w:pPr>
             <w:r>
               <w:rPr>
@@ -2930,7 +2955,7 @@
                 <w:b/>
                 <w:sz w:val="21"/>
               </w:rPr>
-              <w:t>NL Parsing</w:t>
+              <w:t>NL</w:t>
             </w:r>
           </w:p>
         </w:tc>
@@ -2941,6 +2966,7 @@
           <w:p>
             <w:pPr>
               <w:jc w:val="center"/>
+              <w:keepNext/>
             </w:pPr>
             <w:r>
               <w:rPr>
@@ -2955,7 +2981,7 @@
                 <w:b/>
                 <w:sz w:val="21"/>
               </w:rPr>
-              <w:t>Semantic Layer</w:t>
+              <w:t>Semantic</w:t>
             </w:r>
           </w:p>
         </w:tc>
@@ -2966,6 +2992,7 @@
           <w:p>
             <w:pPr>
               <w:jc w:val="center"/>
+              <w:keepNext/>
             </w:pPr>
             <w:r>
               <w:rPr>
@@ -2991,6 +3018,7 @@
           <w:p>
             <w:pPr>
               <w:jc w:val="center"/>
+              <w:keepNext/>
             </w:pPr>
             <w:r>
               <w:rPr>
@@ -3005,7 +3033,7 @@
                 <w:b/>
                 <w:sz w:val="21"/>
               </w:rPr>
-              <w:t>Visualization</w:t>
+              <w:t>Visual</w:t>
             </w:r>
           </w:p>
         </w:tc>
@@ -3016,6 +3044,7 @@
           <w:p>
             <w:pPr>
               <w:jc w:val="center"/>
+              <w:keepNext/>
             </w:pPr>
             <w:r>
               <w:rPr>
@@ -3030,7 +3059,7 @@
                 <w:b/>
                 <w:sz w:val="21"/>
               </w:rPr>
-              <w:t>Widget Persistence</w:t>
+              <w:t>Widget</w:t>
             </w:r>
           </w:p>
         </w:tc>
@@ -3041,6 +3070,7 @@
           <w:p>
             <w:pPr>
               <w:jc w:val="center"/>
+              <w:keepNext/>
             </w:pPr>
             <w:r>
               <w:rPr>
@@ -3055,7 +3085,7 @@
                 <w:b/>
                 <w:sz w:val="21"/>
               </w:rPr>
-              <w:t>Coverage Validation</w:t>
+              <w:t>Coverage</w:t>
             </w:r>
           </w:p>
         </w:tc>
@@ -3066,6 +3096,7 @@
           <w:p>
             <w:pPr>
               <w:jc w:val="center"/>
+              <w:keepNext/>
             </w:pPr>
             <w:r>
               <w:rPr>
@@ -3086,11 +3117,17 @@
         </w:tc>
       </w:tr>
       <w:tr>
+        <w:trPr>
+          <w:cantSplit/>
+        </w:trPr>
         <w:tc>
           <w:tcPr>
-            <w:tcW w:type="dxa" w:w="1128"/>
+            <w:tcW w:type="dxa" w:w="1800"/>
           </w:tcPr>
           <w:p>
+            <w:pPr>
+              <w:keepNext/>
+            </w:pPr>
             <w:r>
               <w:rPr>
                 <w:rFonts w:ascii="Times New Roman" w:hAnsi="Times New Roman"/>
@@ -3103,17 +3140,18 @@
                 <w:b w:val="0"/>
                 <w:sz w:val="21"/>
               </w:rPr>
-              <w:t>Spider / BIRD</w:t>
+              <w:t>Spider/BIRD</w:t>
             </w:r>
           </w:p>
         </w:tc>
         <w:tc>
           <w:tcPr>
-            <w:tcW w:type="dxa" w:w="1128"/>
+            <w:tcW w:type="dxa" w:w="792"/>
           </w:tcPr>
           <w:p>
             <w:pPr>
               <w:jc w:val="center"/>
+              <w:keepNext/>
             </w:pPr>
             <w:r>
               <w:rPr>
@@ -3133,11 +3171,12 @@
         </w:tc>
         <w:tc>
           <w:tcPr>
-            <w:tcW w:type="dxa" w:w="1128"/>
+            <w:tcW w:type="dxa" w:w="1080"/>
           </w:tcPr>
           <w:p>
             <w:pPr>
               <w:jc w:val="center"/>
+              <w:keepNext/>
             </w:pPr>
             <w:r>
               <w:rPr>
@@ -3157,11 +3196,12 @@
         </w:tc>
         <w:tc>
           <w:tcPr>
-            <w:tcW w:type="dxa" w:w="1128"/>
+            <w:tcW w:type="dxa" w:w="936"/>
           </w:tcPr>
           <w:p>
             <w:pPr>
               <w:jc w:val="center"/>
+              <w:keepNext/>
             </w:pPr>
             <w:r>
               <w:rPr>
@@ -3181,11 +3221,12 @@
         </w:tc>
         <w:tc>
           <w:tcPr>
-            <w:tcW w:type="dxa" w:w="1128"/>
+            <w:tcW w:type="dxa" w:w="936"/>
           </w:tcPr>
           <w:p>
             <w:pPr>
               <w:jc w:val="center"/>
+              <w:keepNext/>
             </w:pPr>
             <w:r>
               <w:rPr>
@@ -3205,11 +3246,12 @@
         </w:tc>
         <w:tc>
           <w:tcPr>
-            <w:tcW w:type="dxa" w:w="1128"/>
+            <w:tcW w:type="dxa" w:w="936"/>
           </w:tcPr>
           <w:p>
             <w:pPr>
               <w:jc w:val="center"/>
+              <w:keepNext/>
             </w:pPr>
             <w:r>
               <w:rPr>
@@ -3229,11 +3271,12 @@
         </w:tc>
         <w:tc>
           <w:tcPr>
-            <w:tcW w:type="dxa" w:w="1128"/>
+            <w:tcW w:type="dxa" w:w="1080"/>
           </w:tcPr>
           <w:p>
             <w:pPr>
               <w:jc w:val="center"/>
+              <w:keepNext/>
             </w:pPr>
             <w:r>
               <w:rPr>
@@ -3253,11 +3296,12 @@
         </w:tc>
         <w:tc>
           <w:tcPr>
-            <w:tcW w:type="dxa" w:w="1128"/>
+            <w:tcW w:type="dxa" w:w="1584"/>
           </w:tcPr>
           <w:p>
             <w:pPr>
               <w:jc w:val="center"/>
+              <w:keepNext/>
             </w:pPr>
             <w:r>
               <w:rPr>
@@ -3271,17 +3315,23 @@
                 <w:b w:val="0"/>
                 <w:sz w:val="21"/>
               </w:rPr>
-              <w:t>Benchmark only</w:t>
+              <w:t>Benchmark</w:t>
             </w:r>
           </w:p>
         </w:tc>
       </w:tr>
       <w:tr>
+        <w:trPr>
+          <w:cantSplit/>
+        </w:trPr>
         <w:tc>
           <w:tcPr>
-            <w:tcW w:type="dxa" w:w="1128"/>
+            <w:tcW w:type="dxa" w:w="1800"/>
           </w:tcPr>
           <w:p>
+            <w:pPr>
+              <w:keepNext/>
+            </w:pPr>
             <w:r>
               <w:rPr>
                 <w:rFonts w:ascii="Times New Roman" w:hAnsi="Times New Roman"/>
@@ -3294,17 +3344,18 @@
                 <w:b w:val="0"/>
                 <w:sz w:val="21"/>
               </w:rPr>
-              <w:t>RAT-SQL / PICARD</w:t>
+              <w:t>RAT-SQL/PICARD</w:t>
             </w:r>
           </w:p>
         </w:tc>
         <w:tc>
           <w:tcPr>
-            <w:tcW w:type="dxa" w:w="1128"/>
+            <w:tcW w:type="dxa" w:w="792"/>
           </w:tcPr>
           <w:p>
             <w:pPr>
               <w:jc w:val="center"/>
+              <w:keepNext/>
             </w:pPr>
             <w:r>
               <w:rPr>
@@ -3324,11 +3375,12 @@
         </w:tc>
         <w:tc>
           <w:tcPr>
-            <w:tcW w:type="dxa" w:w="1128"/>
+            <w:tcW w:type="dxa" w:w="1080"/>
           </w:tcPr>
           <w:p>
             <w:pPr>
               <w:jc w:val="center"/>
+              <w:keepNext/>
             </w:pPr>
             <w:r>
               <w:rPr>
@@ -3348,11 +3400,12 @@
         </w:tc>
         <w:tc>
           <w:tcPr>
-            <w:tcW w:type="dxa" w:w="1128"/>
+            <w:tcW w:type="dxa" w:w="936"/>
           </w:tcPr>
           <w:p>
             <w:pPr>
               <w:jc w:val="center"/>
+              <w:keepNext/>
             </w:pPr>
             <w:r>
               <w:rPr>
@@ -3372,11 +3425,12 @@
         </w:tc>
         <w:tc>
           <w:tcPr>
-            <w:tcW w:type="dxa" w:w="1128"/>
+            <w:tcW w:type="dxa" w:w="936"/>
           </w:tcPr>
           <w:p>
             <w:pPr>
               <w:jc w:val="center"/>
+              <w:keepNext/>
             </w:pPr>
             <w:r>
               <w:rPr>
@@ -3396,11 +3450,12 @@
         </w:tc>
         <w:tc>
           <w:tcPr>
-            <w:tcW w:type="dxa" w:w="1128"/>
+            <w:tcW w:type="dxa" w:w="936"/>
           </w:tcPr>
           <w:p>
             <w:pPr>
               <w:jc w:val="center"/>
+              <w:keepNext/>
             </w:pPr>
             <w:r>
               <w:rPr>
@@ -3420,11 +3475,12 @@
         </w:tc>
         <w:tc>
           <w:tcPr>
-            <w:tcW w:type="dxa" w:w="1128"/>
+            <w:tcW w:type="dxa" w:w="1080"/>
           </w:tcPr>
           <w:p>
             <w:pPr>
               <w:jc w:val="center"/>
+              <w:keepNext/>
             </w:pPr>
             <w:r>
               <w:rPr>
@@ -3444,11 +3500,12 @@
         </w:tc>
         <w:tc>
           <w:tcPr>
-            <w:tcW w:type="dxa" w:w="1128"/>
+            <w:tcW w:type="dxa" w:w="1584"/>
           </w:tcPr>
           <w:p>
             <w:pPr>
               <w:jc w:val="center"/>
+              <w:keepNext/>
             </w:pPr>
             <w:r>
               <w:rPr>
@@ -3462,17 +3519,23 @@
                 <w:b w:val="0"/>
                 <w:sz w:val="21"/>
               </w:rPr>
-              <w:t>Benchmark only</w:t>
+              <w:t>Benchmark</w:t>
             </w:r>
           </w:p>
         </w:tc>
       </w:tr>
       <w:tr>
+        <w:trPr>
+          <w:cantSplit/>
+        </w:trPr>
         <w:tc>
           <w:tcPr>
-            <w:tcW w:type="dxa" w:w="1128"/>
+            <w:tcW w:type="dxa" w:w="1800"/>
           </w:tcPr>
           <w:p>
+            <w:pPr>
+              <w:keepNext/>
+            </w:pPr>
             <w:r>
               <w:rPr>
                 <w:rFonts w:ascii="Times New Roman" w:hAnsi="Times New Roman"/>
@@ -3485,17 +3548,18 @@
                 <w:b w:val="0"/>
                 <w:sz w:val="21"/>
               </w:rPr>
-              <w:t>G-SQL / TriSQL</w:t>
+              <w:t>G-SQL/TriSQL</w:t>
             </w:r>
           </w:p>
         </w:tc>
         <w:tc>
           <w:tcPr>
-            <w:tcW w:type="dxa" w:w="1128"/>
+            <w:tcW w:type="dxa" w:w="792"/>
           </w:tcPr>
           <w:p>
             <w:pPr>
               <w:jc w:val="center"/>
+              <w:keepNext/>
             </w:pPr>
             <w:r>
               <w:rPr>
@@ -3515,11 +3579,12 @@
         </w:tc>
         <w:tc>
           <w:tcPr>
-            <w:tcW w:type="dxa" w:w="1128"/>
+            <w:tcW w:type="dxa" w:w="1080"/>
           </w:tcPr>
           <w:p>
             <w:pPr>
               <w:jc w:val="center"/>
+              <w:keepNext/>
             </w:pPr>
             <w:r>
               <w:rPr>
@@ -3539,11 +3604,12 @@
         </w:tc>
         <w:tc>
           <w:tcPr>
-            <w:tcW w:type="dxa" w:w="1128"/>
+            <w:tcW w:type="dxa" w:w="936"/>
           </w:tcPr>
           <w:p>
             <w:pPr>
               <w:jc w:val="center"/>
+              <w:keepNext/>
             </w:pPr>
             <w:r>
               <w:rPr>
@@ -3563,11 +3629,12 @@
         </w:tc>
         <w:tc>
           <w:tcPr>
-            <w:tcW w:type="dxa" w:w="1128"/>
+            <w:tcW w:type="dxa" w:w="936"/>
           </w:tcPr>
           <w:p>
             <w:pPr>
               <w:jc w:val="center"/>
+              <w:keepNext/>
             </w:pPr>
             <w:r>
               <w:rPr>
@@ -3587,11 +3654,12 @@
         </w:tc>
         <w:tc>
           <w:tcPr>
-            <w:tcW w:type="dxa" w:w="1128"/>
+            <w:tcW w:type="dxa" w:w="936"/>
           </w:tcPr>
           <w:p>
             <w:pPr>
               <w:jc w:val="center"/>
+              <w:keepNext/>
             </w:pPr>
             <w:r>
               <w:rPr>
@@ -3611,11 +3679,12 @@
         </w:tc>
         <w:tc>
           <w:tcPr>
-            <w:tcW w:type="dxa" w:w="1128"/>
+            <w:tcW w:type="dxa" w:w="1080"/>
           </w:tcPr>
           <w:p>
             <w:pPr>
               <w:jc w:val="center"/>
+              <w:keepNext/>
             </w:pPr>
             <w:r>
               <w:rPr>
@@ -3635,11 +3704,12 @@
         </w:tc>
         <w:tc>
           <w:tcPr>
-            <w:tcW w:type="dxa" w:w="1128"/>
+            <w:tcW w:type="dxa" w:w="1584"/>
           </w:tcPr>
           <w:p>
             <w:pPr>
               <w:jc w:val="center"/>
+              <w:keepNext/>
             </w:pPr>
             <w:r>
               <w:rPr>
@@ -3653,17 +3723,23 @@
                 <w:b w:val="0"/>
                 <w:sz w:val="21"/>
               </w:rPr>
-              <w:t>Benchmark only</w:t>
+              <w:t>Benchmark</w:t>
             </w:r>
           </w:p>
         </w:tc>
       </w:tr>
       <w:tr>
+        <w:trPr>
+          <w:cantSplit/>
+        </w:trPr>
         <w:tc>
           <w:tcPr>
-            <w:tcW w:type="dxa" w:w="1128"/>
+            <w:tcW w:type="dxa" w:w="1800"/>
           </w:tcPr>
           <w:p>
+            <w:pPr>
+              <w:keepNext/>
+            </w:pPr>
             <w:r>
               <w:rPr>
                 <w:rFonts w:ascii="Times New Roman" w:hAnsi="Times New Roman"/>
@@ -3682,11 +3758,12 @@
         </w:tc>
         <w:tc>
           <w:tcPr>
-            <w:tcW w:type="dxa" w:w="1128"/>
+            <w:tcW w:type="dxa" w:w="792"/>
           </w:tcPr>
           <w:p>
             <w:pPr>
               <w:jc w:val="center"/>
+              <w:keepNext/>
             </w:pPr>
             <w:r>
               <w:rPr>
@@ -3706,11 +3783,12 @@
         </w:tc>
         <w:tc>
           <w:tcPr>
-            <w:tcW w:type="dxa" w:w="1128"/>
+            <w:tcW w:type="dxa" w:w="1080"/>
           </w:tcPr>
           <w:p>
             <w:pPr>
               <w:jc w:val="center"/>
+              <w:keepNext/>
             </w:pPr>
             <w:r>
               <w:rPr>
@@ -3730,11 +3808,12 @@
         </w:tc>
         <w:tc>
           <w:tcPr>
-            <w:tcW w:type="dxa" w:w="1128"/>
+            <w:tcW w:type="dxa" w:w="936"/>
           </w:tcPr>
           <w:p>
             <w:pPr>
               <w:jc w:val="center"/>
+              <w:keepNext/>
             </w:pPr>
             <w:r>
               <w:rPr>
@@ -3754,11 +3833,12 @@
         </w:tc>
         <w:tc>
           <w:tcPr>
-            <w:tcW w:type="dxa" w:w="1128"/>
+            <w:tcW w:type="dxa" w:w="936"/>
           </w:tcPr>
           <w:p>
             <w:pPr>
               <w:jc w:val="center"/>
+              <w:keepNext/>
             </w:pPr>
             <w:r>
               <w:rPr>
@@ -3778,11 +3858,12 @@
         </w:tc>
         <w:tc>
           <w:tcPr>
-            <w:tcW w:type="dxa" w:w="1128"/>
+            <w:tcW w:type="dxa" w:w="936"/>
           </w:tcPr>
           <w:p>
             <w:pPr>
               <w:jc w:val="center"/>
+              <w:keepNext/>
             </w:pPr>
             <w:r>
               <w:rPr>
@@ -3802,11 +3883,12 @@
         </w:tc>
         <w:tc>
           <w:tcPr>
-            <w:tcW w:type="dxa" w:w="1128"/>
+            <w:tcW w:type="dxa" w:w="1080"/>
           </w:tcPr>
           <w:p>
             <w:pPr>
               <w:jc w:val="center"/>
+              <w:keepNext/>
             </w:pPr>
             <w:r>
               <w:rPr>
@@ -3826,11 +3908,12 @@
         </w:tc>
         <w:tc>
           <w:tcPr>
-            <w:tcW w:type="dxa" w:w="1128"/>
+            <w:tcW w:type="dxa" w:w="1584"/>
           </w:tcPr>
           <w:p>
             <w:pPr>
               <w:jc w:val="center"/>
+              <w:keepNext/>
             </w:pPr>
             <w:r>
               <w:rPr>
@@ -3850,11 +3933,17 @@
         </w:tc>
       </w:tr>
       <w:tr>
+        <w:trPr>
+          <w:cantSplit/>
+        </w:trPr>
         <w:tc>
           <w:tcPr>
-            <w:tcW w:type="dxa" w:w="1128"/>
+            <w:tcW w:type="dxa" w:w="1800"/>
           </w:tcPr>
           <w:p>
+            <w:pPr>
+              <w:keepNext/>
+            </w:pPr>
             <w:r>
               <w:rPr>
                 <w:rFonts w:ascii="Times New Roman" w:hAnsi="Times New Roman"/>
@@ -3867,17 +3956,18 @@
                 <w:b w:val="0"/>
                 <w:sz w:val="21"/>
               </w:rPr>
-              <w:t>Veezoo (Lehmann et al.)</w:t>
+              <w:t>Veezoo</w:t>
             </w:r>
           </w:p>
         </w:tc>
         <w:tc>
           <w:tcPr>
-            <w:tcW w:type="dxa" w:w="1128"/>
+            <w:tcW w:type="dxa" w:w="792"/>
           </w:tcPr>
           <w:p>
             <w:pPr>
               <w:jc w:val="center"/>
+              <w:keepNext/>
             </w:pPr>
             <w:r>
               <w:rPr>
@@ -3897,11 +3987,12 @@
         </w:tc>
         <w:tc>
           <w:tcPr>
-            <w:tcW w:type="dxa" w:w="1128"/>
+            <w:tcW w:type="dxa" w:w="1080"/>
           </w:tcPr>
           <w:p>
             <w:pPr>
               <w:jc w:val="center"/>
+              <w:keepNext/>
             </w:pPr>
             <w:r>
               <w:rPr>
@@ -3921,11 +4012,12 @@
         </w:tc>
         <w:tc>
           <w:tcPr>
-            <w:tcW w:type="dxa" w:w="1128"/>
+            <w:tcW w:type="dxa" w:w="936"/>
           </w:tcPr>
           <w:p>
             <w:pPr>
               <w:jc w:val="center"/>
+              <w:keepNext/>
             </w:pPr>
             <w:r>
               <w:rPr>
@@ -3945,11 +4037,12 @@
         </w:tc>
         <w:tc>
           <w:tcPr>
-            <w:tcW w:type="dxa" w:w="1128"/>
+            <w:tcW w:type="dxa" w:w="936"/>
           </w:tcPr>
           <w:p>
             <w:pPr>
               <w:jc w:val="center"/>
+              <w:keepNext/>
             </w:pPr>
             <w:r>
               <w:rPr>
@@ -3969,11 +4062,12 @@
         </w:tc>
         <w:tc>
           <w:tcPr>
-            <w:tcW w:type="dxa" w:w="1128"/>
+            <w:tcW w:type="dxa" w:w="936"/>
           </w:tcPr>
           <w:p>
             <w:pPr>
               <w:jc w:val="center"/>
+              <w:keepNext/>
             </w:pPr>
             <w:r>
               <w:rPr>
@@ -3993,11 +4087,12 @@
         </w:tc>
         <w:tc>
           <w:tcPr>
-            <w:tcW w:type="dxa" w:w="1128"/>
+            <w:tcW w:type="dxa" w:w="1080"/>
           </w:tcPr>
           <w:p>
             <w:pPr>
               <w:jc w:val="center"/>
+              <w:keepNext/>
             </w:pPr>
             <w:r>
               <w:rPr>
@@ -4017,11 +4112,12 @@
         </w:tc>
         <w:tc>
           <w:tcPr>
-            <w:tcW w:type="dxa" w:w="1128"/>
+            <w:tcW w:type="dxa" w:w="1584"/>
           </w:tcPr>
           <w:p>
             <w:pPr>
               <w:jc w:val="center"/>
+              <w:keepNext/>
             </w:pPr>
             <w:r>
               <w:rPr>
@@ -4041,11 +4137,17 @@
         </w:tc>
       </w:tr>
       <w:tr>
+        <w:trPr>
+          <w:cantSplit/>
+        </w:trPr>
         <w:tc>
           <w:tcPr>
-            <w:tcW w:type="dxa" w:w="1128"/>
+            <w:tcW w:type="dxa" w:w="1800"/>
           </w:tcPr>
           <w:p>
+            <w:pPr>
+              <w:keepNext/>
+            </w:pPr>
             <w:r>
               <w:rPr>
                 <w:rFonts w:ascii="Times New Roman" w:hAnsi="Times New Roman"/>
@@ -4058,17 +4160,18 @@
                 <w:b w:val="0"/>
                 <w:sz w:val="21"/>
               </w:rPr>
-              <w:t>nl4dv / DataTone</w:t>
+              <w:t>nl4dv/DataTone</w:t>
             </w:r>
           </w:p>
         </w:tc>
         <w:tc>
           <w:tcPr>
-            <w:tcW w:type="dxa" w:w="1128"/>
+            <w:tcW w:type="dxa" w:w="792"/>
           </w:tcPr>
           <w:p>
             <w:pPr>
               <w:jc w:val="center"/>
+              <w:keepNext/>
             </w:pPr>
             <w:r>
               <w:rPr>
@@ -4088,11 +4191,12 @@
         </w:tc>
         <w:tc>
           <w:tcPr>
-            <w:tcW w:type="dxa" w:w="1128"/>
+            <w:tcW w:type="dxa" w:w="1080"/>
           </w:tcPr>
           <w:p>
             <w:pPr>
               <w:jc w:val="center"/>
+              <w:keepNext/>
             </w:pPr>
             <w:r>
               <w:rPr>
@@ -4112,11 +4216,12 @@
         </w:tc>
         <w:tc>
           <w:tcPr>
-            <w:tcW w:type="dxa" w:w="1128"/>
+            <w:tcW w:type="dxa" w:w="936"/>
           </w:tcPr>
           <w:p>
             <w:pPr>
               <w:jc w:val="center"/>
+              <w:keepNext/>
             </w:pPr>
             <w:r>
               <w:rPr>
@@ -4136,11 +4241,12 @@
         </w:tc>
         <w:tc>
           <w:tcPr>
-            <w:tcW w:type="dxa" w:w="1128"/>
+            <w:tcW w:type="dxa" w:w="936"/>
           </w:tcPr>
           <w:p>
             <w:pPr>
               <w:jc w:val="center"/>
+              <w:keepNext/>
             </w:pPr>
             <w:r>
               <w:rPr>
@@ -4160,11 +4266,12 @@
         </w:tc>
         <w:tc>
           <w:tcPr>
-            <w:tcW w:type="dxa" w:w="1128"/>
+            <w:tcW w:type="dxa" w:w="936"/>
           </w:tcPr>
           <w:p>
             <w:pPr>
               <w:jc w:val="center"/>
+              <w:keepNext/>
             </w:pPr>
             <w:r>
               <w:rPr>
@@ -4184,11 +4291,12 @@
         </w:tc>
         <w:tc>
           <w:tcPr>
-            <w:tcW w:type="dxa" w:w="1128"/>
+            <w:tcW w:type="dxa" w:w="1080"/>
           </w:tcPr>
           <w:p>
             <w:pPr>
               <w:jc w:val="center"/>
+              <w:keepNext/>
             </w:pPr>
             <w:r>
               <w:rPr>
@@ -4208,11 +4316,12 @@
         </w:tc>
         <w:tc>
           <w:tcPr>
-            <w:tcW w:type="dxa" w:w="1128"/>
+            <w:tcW w:type="dxa" w:w="1584"/>
           </w:tcPr>
           <w:p>
             <w:pPr>
               <w:jc w:val="center"/>
+              <w:keepNext/>
             </w:pPr>
             <w:r>
               <w:rPr>
@@ -4226,17 +4335,23 @@
                 <w:b w:val="0"/>
                 <w:sz w:val="21"/>
               </w:rPr>
-              <w:t>In-memory / user study</w:t>
+              <w:t>User study</w:t>
             </w:r>
           </w:p>
         </w:tc>
       </w:tr>
       <w:tr>
+        <w:trPr>
+          <w:cantSplit/>
+        </w:trPr>
         <w:tc>
           <w:tcPr>
-            <w:tcW w:type="dxa" w:w="1128"/>
+            <w:tcW w:type="dxa" w:w="1800"/>
           </w:tcPr>
           <w:p>
+            <w:pPr>
+              <w:keepNext/>
+            </w:pPr>
             <w:r>
               <w:rPr>
                 <w:rFonts w:ascii="Times New Roman" w:hAnsi="Times New Roman"/>
@@ -4255,11 +4370,12 @@
         </w:tc>
         <w:tc>
           <w:tcPr>
-            <w:tcW w:type="dxa" w:w="1128"/>
+            <w:tcW w:type="dxa" w:w="792"/>
           </w:tcPr>
           <w:p>
             <w:pPr>
               <w:jc w:val="center"/>
+              <w:keepNext/>
             </w:pPr>
             <w:r>
               <w:rPr>
@@ -4279,11 +4395,12 @@
         </w:tc>
         <w:tc>
           <w:tcPr>
-            <w:tcW w:type="dxa" w:w="1128"/>
+            <w:tcW w:type="dxa" w:w="1080"/>
           </w:tcPr>
           <w:p>
             <w:pPr>
               <w:jc w:val="center"/>
+              <w:keepNext/>
             </w:pPr>
             <w:r>
               <w:rPr>
@@ -4303,11 +4420,12 @@
         </w:tc>
         <w:tc>
           <w:tcPr>
-            <w:tcW w:type="dxa" w:w="1128"/>
+            <w:tcW w:type="dxa" w:w="936"/>
           </w:tcPr>
           <w:p>
             <w:pPr>
               <w:jc w:val="center"/>
+              <w:keepNext/>
             </w:pPr>
             <w:r>
               <w:rPr>
@@ -4327,11 +4445,12 @@
         </w:tc>
         <w:tc>
           <w:tcPr>
-            <w:tcW w:type="dxa" w:w="1128"/>
+            <w:tcW w:type="dxa" w:w="936"/>
           </w:tcPr>
           <w:p>
             <w:pPr>
               <w:jc w:val="center"/>
+              <w:keepNext/>
             </w:pPr>
             <w:r>
               <w:rPr>
@@ -4351,11 +4470,12 @@
         </w:tc>
         <w:tc>
           <w:tcPr>
-            <w:tcW w:type="dxa" w:w="1128"/>
+            <w:tcW w:type="dxa" w:w="936"/>
           </w:tcPr>
           <w:p>
             <w:pPr>
               <w:jc w:val="center"/>
+              <w:keepNext/>
             </w:pPr>
             <w:r>
               <w:rPr>
@@ -4375,11 +4495,12 @@
         </w:tc>
         <w:tc>
           <w:tcPr>
-            <w:tcW w:type="dxa" w:w="1128"/>
+            <w:tcW w:type="dxa" w:w="1080"/>
           </w:tcPr>
           <w:p>
             <w:pPr>
               <w:jc w:val="center"/>
+              <w:keepNext/>
             </w:pPr>
             <w:r>
               <w:rPr>
@@ -4399,11 +4520,12 @@
         </w:tc>
         <w:tc>
           <w:tcPr>
-            <w:tcW w:type="dxa" w:w="1128"/>
+            <w:tcW w:type="dxa" w:w="1584"/>
           </w:tcPr>
           <w:p>
             <w:pPr>
               <w:jc w:val="center"/>
+              <w:keepNext/>
             </w:pPr>
             <w:r>
               <w:rPr>
@@ -4417,17 +4539,23 @@
                 <w:b w:val="0"/>
                 <w:sz w:val="21"/>
               </w:rPr>
-              <w:t>Synthetic study</w:t>
+              <w:t>Synthetic</w:t>
             </w:r>
           </w:p>
         </w:tc>
       </w:tr>
       <w:tr>
+        <w:trPr>
+          <w:cantSplit/>
+        </w:trPr>
         <w:tc>
           <w:tcPr>
-            <w:tcW w:type="dxa" w:w="1128"/>
+            <w:tcW w:type="dxa" w:w="1800"/>
           </w:tcPr>
           <w:p>
+            <w:pPr>
+              <w:keepNext/>
+            </w:pPr>
             <w:r>
               <w:rPr>
                 <w:rFonts w:ascii="Times New Roman" w:hAnsi="Times New Roman"/>
@@ -4440,19 +4568,18 @@
                 <w:b w:val="0"/>
                 <w:sz w:val="21"/>
               </w:rPr>
-              <w:t>Conversational BI Assistant</w:t>
-              <w:br/>
-              <w:t>(Shailesh et al.)</w:t>
+              <w:t>Conversational BI</w:t>
             </w:r>
           </w:p>
         </w:tc>
         <w:tc>
           <w:tcPr>
-            <w:tcW w:type="dxa" w:w="1128"/>
+            <w:tcW w:type="dxa" w:w="792"/>
           </w:tcPr>
           <w:p>
             <w:pPr>
               <w:jc w:val="center"/>
+              <w:keepNext/>
             </w:pPr>
             <w:r>
               <w:rPr>
@@ -4472,11 +4599,12 @@
         </w:tc>
         <w:tc>
           <w:tcPr>
-            <w:tcW w:type="dxa" w:w="1128"/>
+            <w:tcW w:type="dxa" w:w="1080"/>
           </w:tcPr>
           <w:p>
             <w:pPr>
               <w:jc w:val="center"/>
+              <w:keepNext/>
             </w:pPr>
             <w:r>
               <w:rPr>
@@ -4496,11 +4624,12 @@
         </w:tc>
         <w:tc>
           <w:tcPr>
-            <w:tcW w:type="dxa" w:w="1128"/>
+            <w:tcW w:type="dxa" w:w="936"/>
           </w:tcPr>
           <w:p>
             <w:pPr>
               <w:jc w:val="center"/>
+              <w:keepNext/>
             </w:pPr>
             <w:r>
               <w:rPr>
@@ -4520,11 +4649,12 @@
         </w:tc>
         <w:tc>
           <w:tcPr>
-            <w:tcW w:type="dxa" w:w="1128"/>
+            <w:tcW w:type="dxa" w:w="936"/>
           </w:tcPr>
           <w:p>
             <w:pPr>
               <w:jc w:val="center"/>
+              <w:keepNext/>
             </w:pPr>
             <w:r>
               <w:rPr>
@@ -4544,11 +4674,12 @@
         </w:tc>
         <w:tc>
           <w:tcPr>
-            <w:tcW w:type="dxa" w:w="1128"/>
+            <w:tcW w:type="dxa" w:w="936"/>
           </w:tcPr>
           <w:p>
             <w:pPr>
               <w:jc w:val="center"/>
+              <w:keepNext/>
             </w:pPr>
             <w:r>
               <w:rPr>
@@ -4568,11 +4699,12 @@
         </w:tc>
         <w:tc>
           <w:tcPr>
-            <w:tcW w:type="dxa" w:w="1128"/>
+            <w:tcW w:type="dxa" w:w="1080"/>
           </w:tcPr>
           <w:p>
             <w:pPr>
               <w:jc w:val="center"/>
+              <w:keepNext/>
             </w:pPr>
             <w:r>
               <w:rPr>
@@ -4592,11 +4724,12 @@
         </w:tc>
         <w:tc>
           <w:tcPr>
-            <w:tcW w:type="dxa" w:w="1128"/>
+            <w:tcW w:type="dxa" w:w="1584"/>
           </w:tcPr>
           <w:p>
             <w:pPr>
               <w:jc w:val="center"/>
+              <w:keepNext/>
             </w:pPr>
             <w:r>
               <w:rPr>
@@ -4610,17 +4743,23 @@
                 <w:b w:val="0"/>
                 <w:sz w:val="21"/>
               </w:rPr>
-              <w:t>Prototype demo</w:t>
+              <w:t>Demo</w:t>
             </w:r>
           </w:p>
         </w:tc>
       </w:tr>
       <w:tr>
+        <w:trPr>
+          <w:cantSplit/>
+        </w:trPr>
         <w:tc>
           <w:tcPr>
-            <w:tcW w:type="dxa" w:w="1128"/>
+            <w:tcW w:type="dxa" w:w="1800"/>
           </w:tcPr>
           <w:p>
+            <w:pPr>
+              <w:keepNext/>
+            </w:pPr>
             <w:r>
               <w:rPr>
                 <w:rFonts w:ascii="Times New Roman" w:hAnsi="Times New Roman"/>
@@ -4633,17 +4772,18 @@
                 <w:b w:val="0"/>
                 <w:sz w:val="21"/>
               </w:rPr>
-              <w:t>AEGIS (this thesis)</w:t>
+              <w:t>AEGIS</w:t>
             </w:r>
           </w:p>
         </w:tc>
         <w:tc>
           <w:tcPr>
-            <w:tcW w:type="dxa" w:w="1128"/>
+            <w:tcW w:type="dxa" w:w="792"/>
           </w:tcPr>
           <w:p>
             <w:pPr>
               <w:jc w:val="center"/>
+              <w:keepNext/>
             </w:pPr>
             <w:r>
               <w:rPr>
@@ -4663,11 +4803,12 @@
         </w:tc>
         <w:tc>
           <w:tcPr>
-            <w:tcW w:type="dxa" w:w="1128"/>
+            <w:tcW w:type="dxa" w:w="1080"/>
           </w:tcPr>
           <w:p>
             <w:pPr>
               <w:jc w:val="center"/>
+              <w:keepNext/>
             </w:pPr>
             <w:r>
               <w:rPr>
@@ -4687,11 +4828,12 @@
         </w:tc>
         <w:tc>
           <w:tcPr>
-            <w:tcW w:type="dxa" w:w="1128"/>
+            <w:tcW w:type="dxa" w:w="936"/>
           </w:tcPr>
           <w:p>
             <w:pPr>
               <w:jc w:val="center"/>
+              <w:keepNext/>
             </w:pPr>
             <w:r>
               <w:rPr>
@@ -4711,11 +4853,12 @@
         </w:tc>
         <w:tc>
           <w:tcPr>
-            <w:tcW w:type="dxa" w:w="1128"/>
+            <w:tcW w:type="dxa" w:w="936"/>
           </w:tcPr>
           <w:p>
             <w:pPr>
               <w:jc w:val="center"/>
+              <w:keepNext/>
             </w:pPr>
             <w:r>
               <w:rPr>
@@ -4735,11 +4878,12 @@
         </w:tc>
         <w:tc>
           <w:tcPr>
-            <w:tcW w:type="dxa" w:w="1128"/>
+            <w:tcW w:type="dxa" w:w="936"/>
           </w:tcPr>
           <w:p>
             <w:pPr>
               <w:jc w:val="center"/>
+              <w:keepNext/>
             </w:pPr>
             <w:r>
               <w:rPr>
@@ -4759,11 +4903,12 @@
         </w:tc>
         <w:tc>
           <w:tcPr>
-            <w:tcW w:type="dxa" w:w="1128"/>
+            <w:tcW w:type="dxa" w:w="1080"/>
           </w:tcPr>
           <w:p>
             <w:pPr>
               <w:jc w:val="center"/>
+              <w:keepNext/>
             </w:pPr>
             <w:r>
               <w:rPr>
@@ -4783,11 +4928,12 @@
         </w:tc>
         <w:tc>
           <w:tcPr>
-            <w:tcW w:type="dxa" w:w="1128"/>
+            <w:tcW w:type="dxa" w:w="1584"/>
           </w:tcPr>
           <w:p>
             <w:pPr>
               <w:jc w:val="center"/>
+              <w:keepNext/>
             </w:pPr>
             <w:r>
               <w:rPr>
@@ -4801,7 +4947,7 @@
                 <w:b w:val="0"/>
                 <w:sz w:val="21"/>
               </w:rPr>
-              <w:t>Production (nopCommerce)</w:t>
+              <w:t>Production</w:t>
             </w:r>
           </w:p>
         </w:tc>
@@ -6227,22 +6373,6 @@
               <w:t>Pattern classification of the answerable analytical benchmark subset</w:t>
             </w:r>
           </w:p>
-          <w:p>
-            <w:pPr>
-              <w:spacing w:after="280" w:line="300" w:lineRule="auto"/>
-              <w:ind w:left="432" w:right="432"/>
-              <w:jc w:val="center"/>
-            </w:pPr>
-            <w:r>
-              <w:rPr>
-                <w:rFonts w:ascii="Times New Roman" w:hAnsi="Times New Roman"/>
-                <w:i/>
-                <w:color w:val="555555"/>
-                <w:sz w:val="19"/>
-              </w:rPr>
-              <w:t>A bar chart (sorted descending) showing the real share of the answerable analytical benchmark subset accounted for by each of the eleven patterns: KPI/Aggregate 28%, Ranking 21%, Exception/Filter 18%, Trend Analysis 10%, Comparison 10%, Summary/Group 9%, Cohort 2%, Funnel 1%, Correlate 1%, Segment 0%, Tabular 0%. Highlight the top three bars (KPI, Ranking, Exception/Filter) in an accent color, since together they account for 67% of the benchmark. Caption note: classified by the author against evaluation_dataset/questions.json; see evaluation_dataset/pattern_classification.json for the per-question labels.</w:t>
-            </w:r>
-          </w:p>
         </w:tc>
       </w:tr>
     </w:tbl>
@@ -7658,22 +7788,6 @@
               <w:t>AEGIS architecture pipeline (User Request to Dashboard Widget)</w:t>
             </w:r>
           </w:p>
-          <w:p>
-            <w:pPr>
-              <w:spacing w:after="280" w:line="300" w:lineRule="auto"/>
-              <w:ind w:left="432" w:right="432"/>
-              <w:jc w:val="center"/>
-            </w:pPr>
-            <w:r>
-              <w:rPr>
-                <w:rFonts w:ascii="Times New Roman" w:hAnsi="Times New Roman"/>
-                <w:i/>
-                <w:color w:val="555555"/>
-                <w:sz w:val="19"/>
-              </w:rPr>
-              <w:t>A left-to-right flowchart of the seven stages in sequence: User Request, LLM Intent Parser, Coverage Validator, Semantic Mapper, Permission Rewriter, Safe Query Compiler, Query Executor, Visualization Selector, Widget Engine, and Dashboard. Color-code by responsibility: blue for the single AI/LLM stage, purple for semantic mapping, red for the two safety-enforcement stages (Permission Rewriter, Safe Query Compiler), green for execution/output stages. Add small orange branch arrows from Coverage Validator and Safe Query Compiler pointing to a 'Structured Clarification / Rejection Message' box, showing that invalid requests exit early with an actionable error rather than a silent failure.</w:t>
-            </w:r>
-          </w:p>
         </w:tc>
       </w:tr>
     </w:tbl>
@@ -7777,22 +7891,6 @@
               <w:t>Semantic layer modularity - composable blocks vs. free-form SQL generation</w:t>
             </w:r>
           </w:p>
-          <w:p>
-            <w:pPr>
-              <w:spacing w:after="280" w:line="300" w:lineRule="auto"/>
-              <w:ind w:left="432" w:right="432"/>
-              <w:jc w:val="center"/>
-            </w:pPr>
-            <w:r>
-              <w:rPr>
-                <w:rFonts w:ascii="Times New Roman" w:hAnsi="Times New Roman"/>
-                <w:i/>
-                <w:color w:val="555555"/>
-                <w:sz w:val="19"/>
-              </w:rPr>
-              <w:t>A split-panel comparison. LEFT panel, labeled 'AEGIS': a small set of labeled building blocks (Metric, Dimension, Filter, Join Path, Pattern) shown snapping together into two or three example complete query shapes, like LEGO bricks combining into a finished model. RIGHT panel, labeled 'Direct LLM-to-SQL': an unbounded free-form SQL string with a warning icon. The visual point is that AEGIS composes from a bounded set of safe parts while direct generation is unbounded and can take an unsafe shape.</w:t>
-            </w:r>
-          </w:p>
         </w:tc>
       </w:tr>
     </w:tbl>
@@ -8656,22 +8754,6 @@
               <w:t>Vocabulary injection workflow</w:t>
             </w:r>
           </w:p>
-          <w:p>
-            <w:pPr>
-              <w:spacing w:after="280" w:line="300" w:lineRule="auto"/>
-              <w:ind w:left="432" w:right="432"/>
-              <w:jc w:val="center"/>
-            </w:pPr>
-            <w:r>
-              <w:rPr>
-                <w:rFonts w:ascii="Times New Roman" w:hAnsi="Times New Roman"/>
-                <w:i/>
-                <w:color w:val="555555"/>
-                <w:sz w:val="19"/>
-              </w:rPr>
-              <w:t>A three-lane sequence diagram: 'Semantic Layer (semantic_layer.py)', 'System Prompt Builder', and 'LLM'. Show the Semantic Layer box listing a few example metric/dimension entries with plain-English descriptions; an arrow labeled 'serializes into ~1,100 tokens' into the System Prompt Builder; then into the LLM, whose output arrow produces an example IntentObject such as {metric_term: 'revenue', dimension_term: 'category'}. Annotate with a small callout showing the user phrase 'earnings' mapping to the approved ID 'revenue' even though 'earnings' appears in no synonym list.</w:t>
-            </w:r>
-          </w:p>
         </w:tc>
       </w:tr>
     </w:tbl>
@@ -8780,22 +8862,6 @@
               <w:t>Taxonomy of the eleven AEGIS analytical patterns</w:t>
             </w:r>
           </w:p>
-          <w:p>
-            <w:pPr>
-              <w:spacing w:after="280" w:line="300" w:lineRule="auto"/>
-              <w:ind w:left="432" w:right="432"/>
-              <w:jc w:val="center"/>
-            </w:pPr>
-            <w:r>
-              <w:rPr>
-                <w:rFonts w:ascii="Times New Roman" w:hAnsi="Times New Roman"/>
-                <w:i/>
-                <w:color w:val="555555"/>
-                <w:sz w:val="19"/>
-              </w:rPr>
-              <w:t>A tree or grid diagram with 'Eleven Analytical Patterns' at the top branching into eleven labeled leaves: KPI, Ranking, Trend, Comparison, Exception, Summary, Segment, Funnel, Cohort, Correlate, Tabular. Under each leaf, show a small icon of its default visualization (matching Table 2/3): card, bar chart, line chart, grouped bar, table, card grid, pie chart, funnel chart, grouped bar, scatter plot, table. Caption note: '~5,610 valid combinations across 15 metrics x 34 dimensions x 11 patterns.'</w:t>
-            </w:r>
-          </w:p>
         </w:tc>
       </w:tr>
     </w:tbl>
@@ -10073,22 +10139,6 @@
               <w:t>Two-layer SQL safety defence</w:t>
             </w:r>
           </w:p>
-          <w:p>
-            <w:pPr>
-              <w:spacing w:after="280" w:line="300" w:lineRule="auto"/>
-              <w:ind w:left="432" w:right="432"/>
-              <w:jc w:val="center"/>
-            </w:pPr>
-            <w:r>
-              <w:rPr>
-                <w:rFonts w:ascii="Times New Roman" w:hAnsi="Times New Roman"/>
-                <w:i/>
-                <w:color w:val="555555"/>
-                <w:sz w:val="19"/>
-              </w:rPr>
-              <w:t>A vertical two-stage flowchart. A crafted/adversarial input enters at the top with a warning icon. Layer 1 box: 'Parameterized Query Engine â€” user text never enters the SQL string; only IDs and bound values appear.' Arrow down to Layer 2 box: 'Post-Compilation Safety Scanner â€” rejects non-SELECT statements, UNION/EXCEPT/INTERSECT, EXEC, and system-table references (16 forbidden patterns checked).' Below, split into two outcomes: a green 'Safe SQL Executed' box for a legitimate query, and a red 'SecurityError Raised' box for a rejected one, showing the attack is caught before it can reach the database regardless of which layer catches it.</w:t>
-            </w:r>
-          </w:p>
         </w:tc>
       </w:tr>
     </w:tbl>
@@ -11119,22 +11169,6 @@
               <w:t>Widget lifecycle and refresh model</w:t>
             </w:r>
           </w:p>
-          <w:p>
-            <w:pPr>
-              <w:spacing w:after="280" w:line="300" w:lineRule="auto"/>
-              <w:ind w:left="432" w:right="432"/>
-              <w:jc w:val="center"/>
-            </w:pPr>
-            <w:r>
-              <w:rPr>
-                <w:rFonts w:ascii="Times New Roman" w:hAnsi="Times New Roman"/>
-                <w:i/>
-                <w:color w:val="555555"/>
-                <w:sz w:val="19"/>
-              </w:rPr>
-              <w:t>A cyclical flowchart. Start with 'New Natural-Language Question', then 'Full Seven-Stage Pipeline Runs', then 'Analysis Plan Hashed (SHA-256)', then a decision diamond 'Identical widget hash already exists?'. If YES, continue to 'Return Cached Widget Immediately'. If NO, continue to 'Save New Widget (SQL, chart config, access rule, refresh schedule)'. Both paths converge into a 'Dashboard Widget' box, from which a looping arrow labeled 'Scheduled Refresh (re-executes stored SQL on fresh data)' curves back into the same box â€” illustrating that a widget keeps answering the same recurring question rather than being discarded after one use.</w:t>
-            </w:r>
-          </w:p>
         </w:tc>
       </w:tr>
     </w:tbl>
@@ -12559,22 +12593,6 @@
                 <w:sz w:val="22"/>
               </w:rPr>
               <w:t>Verified safety and execution-validity comparison</w:t>
-            </w:r>
-          </w:p>
-          <w:p>
-            <w:pPr>
-              <w:spacing w:after="280" w:line="300" w:lineRule="auto"/>
-              <w:ind w:left="432" w:right="432"/>
-              <w:jc w:val="center"/>
-            </w:pPr>
-            <w:r>
-              <w:rPr>
-                <w:rFonts w:ascii="Times New Roman" w:hAnsi="Times New Roman"/>
-                <w:i/>
-                <w:color w:val="555555"/>
-                <w:sz w:val="19"/>
-              </w:rPr>
-              <w:t>A grouped bar chart comparing B1, AEGIS, and B3 where available. Show unsafe SQL as counts and true execution validity as successful executions out of 107. Do not plot semantic correctness here; correctness is a separate annotated benchmark.</w:t>
             </w:r>
           </w:p>
         </w:tc>

</xml_diff>

<commit_message>
Polish thesis results and conclusion
</commit_message>
<xml_diff>
--- a/docs/scripts/AEGIS Thesis Book Draft - A Constraint-Based Architecture for Safe LLM-Assisted Natural Language Analytics.docx
+++ b/docs/scripts/AEGIS Thesis Book Draft - A Constraint-Based Architecture for Safe LLM-Assisted Natural Language Analytics.docx
@@ -1308,7 +1308,7 @@
         </w:rPr>
         <w:t>3.3 Design Principles</w:t>
         <w:tab/>
-        <w:t>13</w:t>
+        <w:t>12</w:t>
       </w:r>
     </w:p>
     <w:p>
@@ -1328,7 +1328,7 @@
         </w:rPr>
         <w:t>3.4 Formal Model</w:t>
         <w:tab/>
-        <w:t>13</w:t>
+        <w:t>12</w:t>
       </w:r>
     </w:p>
     <w:p>
@@ -1348,7 +1348,7 @@
         </w:rPr>
         <w:t>3.5 Threat Model</w:t>
         <w:tab/>
-        <w:t>14</w:t>
+        <w:t>12</w:t>
       </w:r>
     </w:p>
     <w:p>
@@ -1368,7 +1368,7 @@
         </w:rPr>
         <w:t>3.6 System Architecture</w:t>
         <w:tab/>
-        <w:t>17</w:t>
+        <w:t>15</w:t>
       </w:r>
     </w:p>
     <w:p>
@@ -1388,7 +1388,7 @@
         </w:rPr>
         <w:t>3.7 Semantic Layer Design</w:t>
         <w:tab/>
-        <w:t>18</w:t>
+        <w:t>16</w:t>
       </w:r>
     </w:p>
     <w:p>
@@ -1408,7 +1408,7 @@
         </w:rPr>
         <w:t>3.8 Intent Parsing with Dynamic Vocabulary Injection</w:t>
         <w:tab/>
-        <w:t>19</w:t>
+        <w:t>17</w:t>
       </w:r>
     </w:p>
     <w:p>
@@ -1428,7 +1428,7 @@
         </w:rPr>
         <w:t>3.9 Safe Query Compiler</w:t>
         <w:tab/>
-        <w:t>21</w:t>
+        <w:t>19</w:t>
       </w:r>
     </w:p>
     <w:p>
@@ -1448,7 +1448,7 @@
         </w:rPr>
         <w:t>3.10 Visualization Selector</w:t>
         <w:tab/>
-        <w:t>22</w:t>
+        <w:t>20</w:t>
       </w:r>
     </w:p>
     <w:p>
@@ -1468,7 +1468,7 @@
         </w:rPr>
         <w:t>3.11 Widget Persistence and Reuse</w:t>
         <w:tab/>
-        <w:t>22</w:t>
+        <w:t>20</w:t>
       </w:r>
     </w:p>
     <w:p>
@@ -1488,7 +1488,7 @@
         </w:rPr>
         <w:t>Chapter 4: Experimental Work</w:t>
         <w:tab/>
-        <w:t>24</w:t>
+        <w:t>22</w:t>
       </w:r>
     </w:p>
     <w:p>
@@ -1508,7 +1508,7 @@
         </w:rPr>
         <w:t>4.1 Implementation</w:t>
         <w:tab/>
-        <w:t>24</w:t>
+        <w:t>22</w:t>
       </w:r>
     </w:p>
     <w:p>
@@ -1528,7 +1528,7 @@
         </w:rPr>
         <w:t>4.2 Experimental Environment</w:t>
         <w:tab/>
-        <w:t>25</w:t>
+        <w:t>23</w:t>
       </w:r>
     </w:p>
     <w:p>
@@ -1548,7 +1548,7 @@
         </w:rPr>
         <w:t>4.3 Benchmark Dataset Construction</w:t>
         <w:tab/>
-        <w:t>25</w:t>
+        <w:t>23</w:t>
       </w:r>
     </w:p>
     <w:p>
@@ -1568,7 +1568,7 @@
         </w:rPr>
         <w:t>4.4 Baseline Systems</w:t>
         <w:tab/>
-        <w:t>26</w:t>
+        <w:t>23</w:t>
       </w:r>
     </w:p>
     <w:p>
@@ -1588,7 +1588,7 @@
         </w:rPr>
         <w:t>4.5 Evaluation Procedure</w:t>
         <w:tab/>
-        <w:t>26</w:t>
+        <w:t>24</w:t>
       </w:r>
     </w:p>
     <w:p>
@@ -1608,7 +1608,7 @@
         </w:rPr>
         <w:t>Chapter 5: Results and Discussion</w:t>
         <w:tab/>
-        <w:t>28</w:t>
+        <w:t>25</w:t>
       </w:r>
     </w:p>
     <w:p>
@@ -1626,9 +1626,9 @@
           <w:b w:val="0"/>
           <w:sz w:val="23"/>
         </w:rPr>
-        <w:t>5.1 Benchmark Run and Verified Metrics</w:t>
+        <w:t>5.1 Evaluation Overview</w:t>
         <w:tab/>
-        <w:t>28</w:t>
+        <w:t>25</w:t>
       </w:r>
     </w:p>
     <w:p>
@@ -1648,7 +1648,7 @@
         </w:rPr>
         <w:t>5.2 SQL Safety and True Database Execution Validity</w:t>
         <w:tab/>
-        <w:t>29</w:t>
+        <w:t>25</w:t>
       </w:r>
     </w:p>
     <w:p>
@@ -1668,7 +1668,7 @@
         </w:rPr>
         <w:t>5.3 Execution Failure Analysis</w:t>
         <w:tab/>
-        <w:t>30</w:t>
+        <w:t>26</w:t>
       </w:r>
     </w:p>
     <w:p>
@@ -1688,7 +1688,7 @@
         </w:rPr>
         <w:t>5.4 Semantic Correctness and Accuracy</w:t>
         <w:tab/>
-        <w:t>31</w:t>
+        <w:t>27</w:t>
       </w:r>
     </w:p>
     <w:p>
@@ -1708,7 +1708,7 @@
         </w:rPr>
         <w:t>5.5 B3 Template-Only Baseline</w:t>
         <w:tab/>
-        <w:t>31</w:t>
+        <w:t>28</w:t>
       </w:r>
     </w:p>
     <w:p>
@@ -1728,7 +1728,7 @@
         </w:rPr>
         <w:t>5.6 Discussion</w:t>
         <w:tab/>
-        <w:t>32</w:t>
+        <w:t>29</w:t>
       </w:r>
     </w:p>
     <w:p>
@@ -1748,7 +1748,7 @@
         </w:rPr>
         <w:t>Chapter 6: Limitations and Future Work</w:t>
         <w:tab/>
-        <w:t>34</w:t>
+        <w:t>31</w:t>
       </w:r>
     </w:p>
     <w:p>
@@ -1768,7 +1768,7 @@
         </w:rPr>
         <w:t>Chapter 7: Conclusion</w:t>
         <w:tab/>
-        <w:t>37</w:t>
+        <w:t>34</w:t>
       </w:r>
     </w:p>
     <w:p>
@@ -1788,7 +1788,7 @@
         </w:rPr>
         <w:t>References</w:t>
         <w:tab/>
-        <w:t>39</w:t>
+        <w:t>35</w:t>
       </w:r>
     </w:p>
     <w:p>
@@ -1844,7 +1844,7 @@
         </w:rPr>
         <w:t>Figure 2: AEGIS architecture pipeline</w:t>
         <w:tab/>
-        <w:t>18</w:t>
+        <w:t>16</w:t>
       </w:r>
     </w:p>
     <w:p>
@@ -1862,7 +1862,7 @@
         </w:rPr>
         <w:t>Figure 3: Semantic layer modularity</w:t>
         <w:tab/>
-        <w:t>18</w:t>
+        <w:t>16</w:t>
       </w:r>
     </w:p>
     <w:p>
@@ -1880,7 +1880,7 @@
         </w:rPr>
         <w:t>Figure 4: Vocabulary injection workflow</w:t>
         <w:tab/>
-        <w:t>20</w:t>
+        <w:t>18</w:t>
       </w:r>
     </w:p>
     <w:p>
@@ -1898,7 +1898,7 @@
         </w:rPr>
         <w:t>Figure 5: AEGIS analytical patterns</w:t>
         <w:tab/>
-        <w:t>21</w:t>
+        <w:t>19</w:t>
       </w:r>
     </w:p>
     <w:p>
@@ -1916,7 +1916,7 @@
         </w:rPr>
         <w:t>Figure 6: Two-layer SQL safety defence</w:t>
         <w:tab/>
-        <w:t>22</w:t>
+        <w:t>20</w:t>
       </w:r>
     </w:p>
     <w:p>
@@ -1934,7 +1934,7 @@
         </w:rPr>
         <w:t>Figure 7: Widget lifecycle and refresh model</w:t>
         <w:tab/>
-        <w:t>23</w:t>
+        <w:t>21</w:t>
       </w:r>
     </w:p>
     <w:p>
@@ -1952,7 +1952,7 @@
         </w:rPr>
         <w:t>Figure 8: Safety and execution-validity comparison</w:t>
         <w:tab/>
-        <w:t>29</w:t>
+        <w:t>26</w:t>
       </w:r>
     </w:p>
     <w:p>
@@ -2024,9 +2024,9 @@
           <w:rFonts w:ascii="Times New Roman" w:hAnsi="Times New Roman"/>
           <w:sz w:val="24"/>
         </w:rPr>
-        <w:t>Table 3.2: Plain-language AEGIS model</w:t>
+        <w:t>Table 3.2: Semantic layer object model</w:t>
         <w:tab/>
-        <w:t>14</w:t>
+        <w:t>17</w:t>
       </w:r>
     </w:p>
     <w:p>
@@ -2042,7 +2042,7 @@
           <w:rFonts w:ascii="Times New Roman" w:hAnsi="Times New Roman"/>
           <w:sz w:val="24"/>
         </w:rPr>
-        <w:t>Table 3.3: Semantic layer object model</w:t>
+        <w:t>Table 3.3: AEGIS analytical patterns</w:t>
         <w:tab/>
         <w:t>19</w:t>
       </w:r>
@@ -2060,9 +2060,9 @@
           <w:rFonts w:ascii="Times New Roman" w:hAnsi="Times New Roman"/>
           <w:sz w:val="24"/>
         </w:rPr>
-        <w:t>Table 3.4: AEGIS analytical patterns</w:t>
+        <w:t>Table 3.4: Visualization selector mapping</w:t>
         <w:tab/>
-        <w:t>21</w:t>
+        <w:t>20</w:t>
       </w:r>
     </w:p>
     <w:p>
@@ -2078,9 +2078,9 @@
           <w:rFonts w:ascii="Times New Roman" w:hAnsi="Times New Roman"/>
           <w:sz w:val="24"/>
         </w:rPr>
-        <w:t>Table 3.5: Visualization selector mapping</w:t>
+        <w:t>Table 5.1: Verified benchmark status</w:t>
         <w:tab/>
-        <w:t>22</w:t>
+        <w:t>25</w:t>
       </w:r>
     </w:p>
     <w:p>
@@ -2096,9 +2096,9 @@
           <w:rFonts w:ascii="Times New Roman" w:hAnsi="Times New Roman"/>
           <w:sz w:val="24"/>
         </w:rPr>
-        <w:t>Table 5.1: Verified benchmark status</w:t>
+        <w:t>Table 5.2: SQL safety and true execution validity</w:t>
         <w:tab/>
-        <w:t>28</w:t>
+        <w:t>26</w:t>
       </w:r>
     </w:p>
     <w:p>
@@ -2114,9 +2114,9 @@
           <w:rFonts w:ascii="Times New Roman" w:hAnsi="Times New Roman"/>
           <w:sz w:val="24"/>
         </w:rPr>
-        <w:t>Table 5.2: SQL safety and true execution validity</w:t>
+        <w:t>Table 5.3: True-execution failure analysis</w:t>
         <w:tab/>
-        <w:t>29</w:t>
+        <w:t>27</w:t>
       </w:r>
     </w:p>
     <w:p>
@@ -2132,9 +2132,9 @@
           <w:rFonts w:ascii="Times New Roman" w:hAnsi="Times New Roman"/>
           <w:sz w:val="24"/>
         </w:rPr>
-        <w:t>Table 5.3: True-execution failure analysis</w:t>
+        <w:t>Table 5.4: Evaluation metric distinction</w:t>
         <w:tab/>
-        <w:t>30</w:t>
+        <w:t>28</w:t>
       </w:r>
     </w:p>
     <w:p>
@@ -2150,9 +2150,9 @@
           <w:rFonts w:ascii="Times New Roman" w:hAnsi="Times New Roman"/>
           <w:sz w:val="24"/>
         </w:rPr>
-        <w:t>Table 5.4: Evaluation metric distinction</w:t>
+        <w:t>Table 5.5: Template-only baseline summary</w:t>
         <w:tab/>
-        <w:t>31</w:t>
+        <w:t>28</w:t>
       </w:r>
     </w:p>
     <w:p>
@@ -2168,27 +2168,9 @@
           <w:rFonts w:ascii="Times New Roman" w:hAnsi="Times New Roman"/>
           <w:sz w:val="24"/>
         </w:rPr>
-        <w:t>Table 5.5: Template-only baseline summary</w:t>
-        <w:tab/>
-        <w:t>31</w:t>
-      </w:r>
-    </w:p>
-    <w:p>
-      <w:pPr>
-        <w:spacing w:after="80" w:before="0" w:line="360" w:lineRule="auto"/>
-        <w:jc w:val="both"/>
-        <w:tabs>
-          <w:tab w:val="right" w:leader="dot" w:pos="8640"/>
-        </w:tabs>
-      </w:pPr>
-      <w:r>
-        <w:rPr>
-          <w:rFonts w:ascii="Times New Roman" w:hAnsi="Times New Roman"/>
-          <w:sz w:val="24"/>
-        </w:rPr>
         <w:t>Table 5.6: AEGIS vs. direct LLM-to-SQL</w:t>
         <w:tab/>
-        <w:t>32</w:t>
+        <w:t>29</w:t>
       </w:r>
     </w:p>
     <w:p>
@@ -6299,7 +6281,7 @@
           <w:i w:val="0"/>
           <w:sz w:val="24"/>
         </w:rPr>
-        <w:t>The eleven-pattern taxonomy used throughout this thesis (Table 3.3) originates from a design-time review of representative e-commerce and administrative reporting requests, conducted by the author while designing AEGIS. This was a qualitative review carried out by a single researcher during system design, not an independently annotated, inter-rater-validated study, and no separate annotated dataset accompanies this thesis. An earlier version of this chapter reported specific percentages and an inter-rater reliability statistic for a larger unpublished dataset; that dataset was not published alongside this thesis, so those figures have been withdrawn.</w:t>
+        <w:t>The eleven-pattern taxonomy used throughout this thesis (Table 3.2) originates from a design-time review of representative e-commerce and administrative reporting requests, conducted by the author while designing AEGIS. This was a qualitative review carried out by a single researcher during system design, not an independently annotated, inter-rater-validated study, and no separate annotated dataset accompanies this thesis. An earlier version of this chapter reported specific percentages and an inter-rater reliability statistic for a larger unpublished dataset; that dataset was not published alongside this thesis, so those figures have been withdrawn.</w:t>
       </w:r>
     </w:p>
     <w:p>
@@ -6314,7 +6296,7 @@
           <w:i w:val="0"/>
           <w:sz w:val="24"/>
         </w:rPr>
-        <w:t>In place of that withdrawn figure, Table 3.1 reports a pattern classification of the full 107-request custom benchmark. The first 100 requests are answerable analytical requests classified into the eleven AEGIS patterns by the author; the remaining seven are mixed benchmark requests that test behavior beyond the normal template set and are still counted in the same benchmark denominator. This classification is itself a single-annotator judgment, not independently cross-checked by a second annotator, so it should not be read as a validated inter-rater statistic; unlike the withdrawn figures, however, it is reproducible from the evaluation artifacts supplied with the project repository.</w:t>
+        <w:t>In place of that withdrawn figure, Table 3.1 reports a pattern classification of the full 107-request custom benchmark. The first 100 requests are answerable analytical requests classified into the eleven AEGIS patterns by the author; the remaining seven are mixed benchmark requests that test behavior beyond the normal template set and are still counted in the same benchmark denominator. This classification is itself a single-annotator judgment, not independently cross-checked by a second annotator, so it should not be read as a validated inter-rater statistic; unlike the withdrawn figures, however, it is reproducible from the evaluation materials supplied with this thesis.</w:t>
       </w:r>
     </w:p>
     <w:p>
@@ -7968,7 +7950,7 @@
     </w:p>
     <w:p>
       <w:pPr>
-        <w:spacing w:after="200" w:before="0" w:line="360" w:lineRule="auto"/>
+        <w:spacing w:after="0" w:before="0" w:line="360" w:lineRule="auto"/>
         <w:jc w:val="both"/>
       </w:pPr>
       <w:r>
@@ -7978,12 +7960,781 @@
           <w:i w:val="0"/>
           <w:sz w:val="24"/>
         </w:rPr>
-        <w:t>The formal idea behind AEGIS can be stated without mathematical notation. Classical text-to-SQL gives the language model a request and a database schema, then asks the model to produce SQL directly. AEGIS splits that responsibility into checked stages. The model reads the user's language and produces only a typed intent object. The semantic layer checks whether the requested metric, dimension, time rule, and pattern are approved. The compiler then builds read-only SQL from templates, the visualization selector chooses a chart or table, and the widget engine persists the result as a reusable artifact.</w:t>
+        <w:t>The practical model follows directly from the design principles above: user language is converted into a typed intent, approved semantic bindings are selected, and SQL is built only by deterministic templates. This keeps the model useful for understanding language without giving it authority to write executable SQL.</w:t>
+      </w:r>
+    </w:p>
+    <w:p>
+      <w:pPr>
+        <w:spacing w:before="320" w:after="160"/>
+        <w:jc w:val="left"/>
+      </w:pPr>
+      <w:r>
+        <w:rPr>
+          <w:rFonts w:ascii="Times New Roman" w:hAnsi="Times New Roman"/>
+          <w:b/>
+          <w:sz w:val="28"/>
+        </w:rPr>
+        <w:t>3.5  Threat Model</w:t>
+      </w:r>
+    </w:p>
+    <w:p>
+      <w:pPr>
+        <w:spacing w:after="200" w:before="0" w:line="360" w:lineRule="auto"/>
+        <w:jc w:val="both"/>
+      </w:pPr>
+      <w:r>
+        <w:rPr>
+          <w:rFonts w:ascii="Times New Roman" w:hAnsi="Times New Roman"/>
+          <w:b w:val="0"/>
+          <w:i w:val="0"/>
+          <w:sz w:val="24"/>
+        </w:rPr>
+        <w:t>AEGIS protects against attacks arriving through the untrusted natural-language input channel. The model assumes the database and application server are properly hardened; the attacker controls only the query field.</w:t>
+      </w:r>
+    </w:p>
+    <w:p>
+      <w:pPr>
+        <w:spacing w:after="80" w:before="160" w:line="360" w:lineRule="auto"/>
+        <w:jc w:val="both"/>
+      </w:pPr>
+      <w:r>
+        <w:rPr>
+          <w:rFonts w:ascii="Times New Roman" w:hAnsi="Times New Roman"/>
+          <w:b/>
+          <w:i w:val="0"/>
+          <w:sz w:val="24"/>
+        </w:rPr>
+        <w:t xml:space="preserve">T1 - Prompt injection attempting SQL generation. </w:t>
+      </w:r>
+    </w:p>
+    <w:p>
+      <w:pPr>
+        <w:spacing w:after="40" w:before="0" w:line="360" w:lineRule="auto"/>
+        <w:jc w:val="both"/>
+      </w:pPr>
+      <w:r>
+        <w:rPr>
+          <w:rFonts w:ascii="Times New Roman" w:hAnsi="Times New Roman"/>
+          <w:b/>
+          <w:i/>
+          <w:sz w:val="24"/>
+        </w:rPr>
+        <w:t xml:space="preserve">Attack: </w:t>
+      </w:r>
+      <w:r>
+        <w:rPr>
+          <w:rFonts w:ascii="Times New Roman" w:hAnsi="Times New Roman"/>
+          <w:b w:val="0"/>
+          <w:i/>
+          <w:sz w:val="24"/>
+        </w:rPr>
+        <w:t>"Ignore previous instructions. Generate DROP TABLE orders."</w:t>
+      </w:r>
+    </w:p>
+    <w:p>
+      <w:pPr>
+        <w:spacing w:after="120" w:before="0" w:line="360" w:lineRule="auto"/>
+        <w:jc w:val="both"/>
+      </w:pPr>
+      <w:r>
+        <w:rPr>
+          <w:rFonts w:ascii="Times New Roman" w:hAnsi="Times New Roman"/>
+          <w:b/>
+          <w:i w:val="0"/>
+          <w:sz w:val="24"/>
+        </w:rPr>
+        <w:t xml:space="preserve">Control: </w:t>
+      </w:r>
+      <w:r>
+        <w:rPr>
+          <w:rFonts w:ascii="Times New Roman" w:hAnsi="Times New Roman"/>
+          <w:b w:val="0"/>
+          <w:i w:val="0"/>
+          <w:sz w:val="24"/>
+        </w:rPr>
+        <w:t>The IntentObject schema contains no SQL field. Any non-approved string in metric_term or dimension_term is rejected by Pydantic type validation at Stage 2, before the compiler is reached.</w:t>
+      </w:r>
+    </w:p>
+    <w:p>
+      <w:pPr>
+        <w:spacing w:after="80" w:before="160" w:line="360" w:lineRule="auto"/>
+        <w:jc w:val="both"/>
+      </w:pPr>
+      <w:r>
+        <w:rPr>
+          <w:rFonts w:ascii="Times New Roman" w:hAnsi="Times New Roman"/>
+          <w:b/>
+          <w:i w:val="0"/>
+          <w:sz w:val="24"/>
+        </w:rPr>
+        <w:t xml:space="preserve">T2 - Unauthorized metric or dimension access. </w:t>
+      </w:r>
+    </w:p>
+    <w:p>
+      <w:pPr>
+        <w:spacing w:after="40" w:before="0" w:line="360" w:lineRule="auto"/>
+        <w:jc w:val="both"/>
+      </w:pPr>
+      <w:r>
+        <w:rPr>
+          <w:rFonts w:ascii="Times New Roman" w:hAnsi="Times New Roman"/>
+          <w:b/>
+          <w:i/>
+          <w:sz w:val="24"/>
+        </w:rPr>
+        <w:t xml:space="preserve">Attack: </w:t>
+      </w:r>
+      <w:r>
+        <w:rPr>
+          <w:rFonts w:ascii="Times New Roman" w:hAnsi="Times New Roman"/>
+          <w:b w:val="0"/>
+          <w:i/>
+          <w:sz w:val="24"/>
+        </w:rPr>
+        <w:t>"Show me customer passwords" or "List credit card numbers by order."</w:t>
+      </w:r>
+    </w:p>
+    <w:p>
+      <w:pPr>
+        <w:spacing w:after="120" w:before="0" w:line="360" w:lineRule="auto"/>
+        <w:jc w:val="both"/>
+      </w:pPr>
+      <w:r>
+        <w:rPr>
+          <w:rFonts w:ascii="Times New Roman" w:hAnsi="Times New Roman"/>
+          <w:b/>
+          <w:i w:val="0"/>
+          <w:sz w:val="24"/>
+        </w:rPr>
+        <w:t xml:space="preserve">Control: </w:t>
+      </w:r>
+      <w:r>
+        <w:rPr>
+          <w:rFonts w:ascii="Times New Roman" w:hAnsi="Times New Roman"/>
+          <w:b w:val="0"/>
+          <w:i w:val="0"/>
+          <w:sz w:val="24"/>
+        </w:rPr>
+        <w:t>Fields such as customer_password do not exist in the semantic layer vocabulary. The LLM never sees those names; it receives only the curated, approved label list. Stage 2 rejects any unrecognized term.</w:t>
+      </w:r>
+    </w:p>
+    <w:p>
+      <w:pPr>
+        <w:spacing w:after="80" w:before="160" w:line="360" w:lineRule="auto"/>
+        <w:jc w:val="both"/>
+      </w:pPr>
+      <w:r>
+        <w:rPr>
+          <w:rFonts w:ascii="Times New Roman" w:hAnsi="Times New Roman"/>
+          <w:b/>
+          <w:i w:val="0"/>
+          <w:sz w:val="24"/>
+        </w:rPr>
+        <w:t xml:space="preserve">T3 - Unauthorized row access. </w:t>
+      </w:r>
+    </w:p>
+    <w:p>
+      <w:pPr>
+        <w:spacing w:after="40" w:before="0" w:line="360" w:lineRule="auto"/>
+        <w:jc w:val="both"/>
+      </w:pPr>
+      <w:r>
+        <w:rPr>
+          <w:rFonts w:ascii="Times New Roman" w:hAnsi="Times New Roman"/>
+          <w:b/>
+          <w:i/>
+          <w:sz w:val="24"/>
+        </w:rPr>
+        <w:t xml:space="preserve">Attack: </w:t>
+      </w:r>
+      <w:r>
+        <w:rPr>
+          <w:rFonts w:ascii="Times New Roman" w:hAnsi="Times New Roman"/>
+          <w:b w:val="0"/>
+          <w:i/>
+          <w:sz w:val="24"/>
+        </w:rPr>
+        <w:t>A store-level user asks: "Show revenue for all branches."</w:t>
+      </w:r>
+    </w:p>
+    <w:p>
+      <w:pPr>
+        <w:spacing w:after="120" w:before="0" w:line="360" w:lineRule="auto"/>
+        <w:jc w:val="both"/>
+      </w:pPr>
+      <w:r>
+        <w:rPr>
+          <w:rFonts w:ascii="Times New Roman" w:hAnsi="Times New Roman"/>
+          <w:b/>
+          <w:i w:val="0"/>
+          <w:sz w:val="24"/>
+        </w:rPr>
+        <w:t xml:space="preserve">Control: </w:t>
+      </w:r>
+      <w:r>
+        <w:rPr>
+          <w:rFonts w:ascii="Times New Roman" w:hAnsi="Times New Roman"/>
+          <w:b w:val="0"/>
+          <w:i w:val="0"/>
+          <w:sz w:val="24"/>
+        </w:rPr>
+        <w:t>Stage 4 (Permission Rewriter) runs after the LLM and appends a role-specific WHERE predicate (for example, AND o.StoreId = :user_store) derived from the authenticated session. This cannot be suppressed or overridden by natural-language content.</w:t>
+      </w:r>
+    </w:p>
+    <w:p>
+      <w:pPr>
+        <w:spacing w:after="80" w:before="160" w:line="360" w:lineRule="auto"/>
+        <w:jc w:val="both"/>
+      </w:pPr>
+      <w:r>
+        <w:rPr>
+          <w:rFonts w:ascii="Times New Roman" w:hAnsi="Times New Roman"/>
+          <w:b/>
+          <w:i w:val="0"/>
+          <w:sz w:val="24"/>
+        </w:rPr>
+        <w:t xml:space="preserve">T4 - DML or DDL injection. </w:t>
+      </w:r>
+    </w:p>
+    <w:p>
+      <w:pPr>
+        <w:spacing w:after="40" w:before="0" w:line="360" w:lineRule="auto"/>
+        <w:jc w:val="both"/>
+      </w:pPr>
+      <w:r>
+        <w:rPr>
+          <w:rFonts w:ascii="Times New Roman" w:hAnsi="Times New Roman"/>
+          <w:b/>
+          <w:i/>
+          <w:sz w:val="24"/>
+        </w:rPr>
+        <w:t xml:space="preserve">Attack: </w:t>
+      </w:r>
+      <w:r>
+        <w:rPr>
+          <w:rFonts w:ascii="Times New Roman" w:hAnsi="Times New Roman"/>
+          <w:b w:val="0"/>
+          <w:i/>
+          <w:sz w:val="24"/>
+        </w:rPr>
+        <w:t>A crafted prompt that tricks the LLM into associating a write operation with an intent class.</w:t>
+      </w:r>
+    </w:p>
+    <w:p>
+      <w:pPr>
+        <w:spacing w:after="120" w:before="0" w:line="360" w:lineRule="auto"/>
+        <w:jc w:val="both"/>
+      </w:pPr>
+      <w:r>
+        <w:rPr>
+          <w:rFonts w:ascii="Times New Roman" w:hAnsi="Times New Roman"/>
+          <w:b/>
+          <w:i w:val="0"/>
+          <w:sz w:val="24"/>
+        </w:rPr>
+        <w:t xml:space="preserve">Control: </w:t>
+      </w:r>
+      <w:r>
+        <w:rPr>
+          <w:rFonts w:ascii="Times New Roman" w:hAnsi="Times New Roman"/>
+          <w:b w:val="0"/>
+          <w:i w:val="0"/>
+          <w:sz w:val="24"/>
+        </w:rPr>
+        <w:t>No template in the pattern library contains a DML or DDL keyword. The AST-level post-compilation validator explicitly rejects any non-SELECT statement as a defense-in-depth layer.</w:t>
+      </w:r>
+    </w:p>
+    <w:p>
+      <w:pPr>
+        <w:spacing w:after="120" w:before="0" w:line="360" w:lineRule="auto"/>
+        <w:jc w:val="both"/>
+      </w:pPr>
+      <w:r>
+        <w:rPr>
+          <w:rFonts w:ascii="Times New Roman" w:hAnsi="Times New Roman"/>
+          <w:b/>
+          <w:i w:val="0"/>
+          <w:sz w:val="24"/>
+        </w:rPr>
+        <w:t>Not protected by AEGIS (requires operational security controls outside this architecture):</w:t>
+      </w:r>
+    </w:p>
+    <w:p>
+      <w:pPr>
+        <w:spacing w:after="80" w:line="360" w:lineRule="auto"/>
+        <w:ind w:left="461" w:hanging="259"/>
+      </w:pPr>
+      <w:r>
+        <w:rPr>
+          <w:rFonts w:ascii="Times New Roman" w:hAnsi="Times New Roman"/>
+          <w:sz w:val="24"/>
+        </w:rPr>
+        <w:t>•</w:t>
+        <w:tab/>
+      </w:r>
+      <w:r>
+        <w:rPr>
+          <w:rFonts w:ascii="Times New Roman" w:hAnsi="Times New Roman"/>
+          <w:sz w:val="24"/>
+        </w:rPr>
+        <w:t>A malicious administrator embedding arbitrary SQL inside a metric's sql_expr field.</w:t>
+      </w:r>
+    </w:p>
+    <w:p>
+      <w:pPr>
+        <w:spacing w:after="80" w:line="360" w:lineRule="auto"/>
+        <w:ind w:left="461" w:hanging="259"/>
+      </w:pPr>
+      <w:r>
+        <w:rPr>
+          <w:rFonts w:ascii="Times New Roman" w:hAnsi="Times New Roman"/>
+          <w:sz w:val="24"/>
+        </w:rPr>
+        <w:t>•</w:t>
+        <w:tab/>
+      </w:r>
+      <w:r>
+        <w:rPr>
+          <w:rFonts w:ascii="Times New Roman" w:hAnsi="Times New Roman"/>
+          <w:sz w:val="24"/>
+        </w:rPr>
+        <w:t>Supply-chain compromise of the compiler module or the SQL parser library.</w:t>
+      </w:r>
+    </w:p>
+    <w:p>
+      <w:pPr>
+        <w:spacing w:after="80" w:line="360" w:lineRule="auto"/>
+        <w:ind w:left="461" w:hanging="259"/>
+      </w:pPr>
+      <w:r>
+        <w:rPr>
+          <w:rFonts w:ascii="Times New Roman" w:hAnsi="Times New Roman"/>
+          <w:sz w:val="24"/>
+        </w:rPr>
+        <w:t>•</w:t>
+        <w:tab/>
+      </w:r>
+      <w:r>
+        <w:rPr>
+          <w:rFonts w:ascii="Times New Roman" w:hAnsi="Times New Roman"/>
+          <w:sz w:val="24"/>
+        </w:rPr>
+        <w:t>Database-level privilege escalation that bypasses the application layer.</w:t>
+      </w:r>
+    </w:p>
+    <w:p>
+      <w:pPr>
+        <w:spacing w:after="80" w:line="360" w:lineRule="auto"/>
+        <w:ind w:left="461" w:hanging="259"/>
+      </w:pPr>
+      <w:r>
+        <w:rPr>
+          <w:rFonts w:ascii="Times New Roman" w:hAnsi="Times New Roman"/>
+          <w:sz w:val="24"/>
+        </w:rPr>
+        <w:t>•</w:t>
+        <w:tab/>
+      </w:r>
+      <w:r>
+        <w:rPr>
+          <w:rFonts w:ascii="Times New Roman" w:hAnsi="Times New Roman"/>
+          <w:sz w:val="24"/>
+        </w:rPr>
+        <w:t>LLM provider infrastructure compromise or model poisoning.</w:t>
+      </w:r>
+    </w:p>
+    <w:p>
+      <w:pPr>
+        <w:spacing w:after="0" w:before="0" w:line="360" w:lineRule="auto"/>
+        <w:jc w:val="both"/>
+      </w:pPr>
+      <w:r>
+        <w:rPr>
+          <w:rFonts w:ascii="Times New Roman" w:hAnsi="Times New Roman"/>
+          <w:b w:val="0"/>
+          <w:i w:val="0"/>
+          <w:sz w:val="24"/>
+        </w:rPr>
+        <w:t>Explicitly documenting out-of-scope threats is itself a contribution: prior NL-to-SQL work rarely specifies the boundary of its safety claims, which makes meaningful security comparison difficult.</w:t>
       </w:r>
     </w:p>
     <w:p>
       <w:r>
         <w:br w:type="page"/>
+      </w:r>
+    </w:p>
+    <w:p>
+      <w:pPr>
+        <w:spacing w:before="320" w:after="160"/>
+        <w:jc w:val="left"/>
+      </w:pPr>
+      <w:r>
+        <w:rPr>
+          <w:rFonts w:ascii="Times New Roman" w:hAnsi="Times New Roman"/>
+          <w:b/>
+          <w:sz w:val="28"/>
+        </w:rPr>
+        <w:t>3.6  System Architecture</w:t>
+      </w:r>
+    </w:p>
+    <w:p>
+      <w:pPr>
+        <w:spacing w:after="200" w:before="0" w:line="360" w:lineRule="auto"/>
+        <w:jc w:val="both"/>
+      </w:pPr>
+      <w:r>
+        <w:rPr>
+          <w:rFonts w:ascii="Times New Roman" w:hAnsi="Times New Roman"/>
+          <w:b w:val="0"/>
+          <w:i w:val="0"/>
+          <w:sz w:val="24"/>
+        </w:rPr>
+        <w:t>Every user query travels through exactly seven stages. Stages 2 through 7 contain no artificial intelligence; they are deterministic code. Rejection at any stage produces a structured clarification message rather than a best-effort guess.</w:t>
+      </w:r>
+    </w:p>
+    <w:p>
+      <w:pPr>
+        <w:spacing w:after="160" w:before="0" w:line="360" w:lineRule="auto"/>
+        <w:jc w:val="both"/>
+      </w:pPr>
+      <w:r>
+        <w:rPr>
+          <w:rFonts w:ascii="Times New Roman" w:hAnsi="Times New Roman"/>
+          <w:b/>
+          <w:i w:val="0"/>
+          <w:sz w:val="24"/>
+        </w:rPr>
+        <w:t xml:space="preserve">Stage 1 - Intent Extraction. </w:t>
+      </w:r>
+      <w:r>
+        <w:rPr>
+          <w:rFonts w:ascii="Times New Roman" w:hAnsi="Times New Roman"/>
+          <w:b w:val="0"/>
+          <w:i w:val="0"/>
+          <w:sz w:val="24"/>
+        </w:rPr>
+        <w:t>A lightweight LLM reads the query together with a system prompt built from the semantic layer, and outputs a validated IntentObject (intent class, metric term, dimension term, filters, sort, limit, confidence). This is the only stage that involves artificial intelligence.</w:t>
+      </w:r>
+    </w:p>
+    <w:p>
+      <w:pPr>
+        <w:spacing w:after="160" w:before="0" w:line="360" w:lineRule="auto"/>
+        <w:jc w:val="both"/>
+      </w:pPr>
+      <w:r>
+        <w:rPr>
+          <w:rFonts w:ascii="Times New Roman" w:hAnsi="Times New Roman"/>
+          <w:b/>
+          <w:i w:val="0"/>
+          <w:sz w:val="24"/>
+        </w:rPr>
+        <w:t xml:space="preserve">Stage 2 - Coverage Validation. </w:t>
+      </w:r>
+      <w:r>
+        <w:rPr>
+          <w:rFonts w:ascii="Times New Roman" w:hAnsi="Times New Roman"/>
+          <w:b w:val="0"/>
+          <w:i w:val="0"/>
+          <w:sz w:val="24"/>
+        </w:rPr>
+        <w:t>The server checks that both the metric term and the dimension term exist in the semantic layer vocabulary before anything else runs. Unknown identifiers are rejected here, with a structured message listing the available identifiers, rather than being passed to the compiler.</w:t>
+      </w:r>
+    </w:p>
+    <w:p>
+      <w:pPr>
+        <w:spacing w:after="160" w:before="0" w:line="360" w:lineRule="auto"/>
+        <w:jc w:val="both"/>
+      </w:pPr>
+      <w:r>
+        <w:rPr>
+          <w:rFonts w:ascii="Times New Roman" w:hAnsi="Times New Roman"/>
+          <w:b/>
+          <w:i w:val="0"/>
+          <w:sz w:val="24"/>
+        </w:rPr>
+        <w:t xml:space="preserve">Stage 3 - Semantic Mapping. </w:t>
+      </w:r>
+      <w:r>
+        <w:rPr>
+          <w:rFonts w:ascii="Times New Roman" w:hAnsi="Times New Roman"/>
+          <w:b w:val="0"/>
+          <w:i w:val="0"/>
+          <w:sz w:val="24"/>
+        </w:rPr>
+        <w:t>Business-logic aliases are expanded (for example, 'abandoned' maps to a specific OrderStatusId), and relative time expressions such as 'this month' are resolved to concrete date predicates.</w:t>
+      </w:r>
+    </w:p>
+    <w:p>
+      <w:pPr>
+        <w:spacing w:after="160" w:before="0" w:line="360" w:lineRule="auto"/>
+        <w:jc w:val="both"/>
+      </w:pPr>
+      <w:r>
+        <w:rPr>
+          <w:rFonts w:ascii="Times New Roman" w:hAnsi="Times New Roman"/>
+          <w:b/>
+          <w:i w:val="0"/>
+          <w:sz w:val="24"/>
+        </w:rPr>
+        <w:t xml:space="preserve">Stage 4 - Permission Rewriting. </w:t>
+      </w:r>
+      <w:r>
+        <w:rPr>
+          <w:rFonts w:ascii="Times New Roman" w:hAnsi="Times New Roman"/>
+          <w:b w:val="0"/>
+          <w:i w:val="0"/>
+          <w:sz w:val="24"/>
+        </w:rPr>
+        <w:t>A role-specific WHERE predicate is appended based on the authenticated user's session. This runs after the LLM has already finished, so no natural-language content can influence it.</w:t>
+      </w:r>
+    </w:p>
+    <w:p>
+      <w:pPr>
+        <w:spacing w:after="160" w:before="0" w:line="360" w:lineRule="auto"/>
+        <w:jc w:val="both"/>
+      </w:pPr>
+      <w:r>
+        <w:rPr>
+          <w:rFonts w:ascii="Times New Roman" w:hAnsi="Times New Roman"/>
+          <w:b/>
+          <w:i w:val="0"/>
+          <w:sz w:val="24"/>
+        </w:rPr>
+        <w:t xml:space="preserve">Stage 5 - SQL Compilation. </w:t>
+      </w:r>
+      <w:r>
+        <w:rPr>
+          <w:rFonts w:ascii="Times New Roman" w:hAnsi="Times New Roman"/>
+          <w:b w:val="0"/>
+          <w:i w:val="0"/>
+          <w:sz w:val="24"/>
+        </w:rPr>
+        <w:t>A breadth-first search over the join graph finds the minimal join path connecting the tables required by the resolved metric and dimension, and pre-compiled SQL expressions are substituted into a parameterized template. No SQL text is ever assembled from concatenated user input.</w:t>
+      </w:r>
+    </w:p>
+    <w:p>
+      <w:pPr>
+        <w:spacing w:after="160" w:before="0" w:line="360" w:lineRule="auto"/>
+        <w:jc w:val="both"/>
+      </w:pPr>
+      <w:r>
+        <w:rPr>
+          <w:rFonts w:ascii="Times New Roman" w:hAnsi="Times New Roman"/>
+          <w:b/>
+          <w:i w:val="0"/>
+          <w:sz w:val="24"/>
+        </w:rPr>
+        <w:t xml:space="preserve">Stage 6 - Visualization Selection. </w:t>
+      </w:r>
+      <w:r>
+        <w:rPr>
+          <w:rFonts w:ascii="Times New Roman" w:hAnsi="Times New Roman"/>
+          <w:b w:val="0"/>
+          <w:i w:val="0"/>
+          <w:sz w:val="24"/>
+        </w:rPr>
+        <w:t>A rule engine maps the intent class and result shape to a default chart type. This stage contains no learned model.</w:t>
+      </w:r>
+    </w:p>
+    <w:p>
+      <w:pPr>
+        <w:spacing w:after="160" w:before="0" w:line="360" w:lineRule="auto"/>
+        <w:jc w:val="both"/>
+      </w:pPr>
+      <w:r>
+        <w:rPr>
+          <w:rFonts w:ascii="Times New Roman" w:hAnsi="Times New Roman"/>
+          <w:b/>
+          <w:i w:val="0"/>
+          <w:sz w:val="24"/>
+        </w:rPr>
+        <w:t xml:space="preserve">Stage 7 - Widget Persistence. </w:t>
+      </w:r>
+      <w:r>
+        <w:rPr>
+          <w:rFonts w:ascii="Times New Roman" w:hAnsi="Times New Roman"/>
+          <w:b w:val="0"/>
+          <w:i w:val="0"/>
+          <w:sz w:val="24"/>
+        </w:rPr>
+        <w:t>The analysis plan is hashed (SHA-256) to detect duplicates, and the query, chart configuration, and access rules are stored as a widget artifact that can be refreshed on a schedule.</w:t>
+      </w:r>
+    </w:p>
+    <w:tbl>
+      <w:tblPr>
+        <w:tblW w:type="auto" w:w="0"/>
+        <w:jc w:val="center"/>
+        <w:tblLayout w:type="fixed"/>
+        <w:tblLook w:firstColumn="1" w:firstRow="1" w:lastColumn="0" w:lastRow="0" w:noHBand="0" w:noVBand="1" w:val="04A0"/>
+      </w:tblPr>
+      <w:tblGrid>
+        <w:gridCol w:w="9072"/>
+      </w:tblGrid>
+      <w:tr>
+        <w:trPr>
+          <w:trHeight w:val="3168"/>
+          <w:trHeight w:val="3168" w:hRule="atLeast"/>
+        </w:trPr>
+        <w:tc>
+          <w:tcPr>
+            <w:tcW w:type="dxa" w:w="9072"/>
+            <w:tcBorders>
+              <w:top w:val="dashed" w:sz="10" w:space="0" w:color="888888"/>
+              <w:left w:val="dashed" w:sz="10" w:space="0" w:color="888888"/>
+              <w:bottom w:val="dashed" w:sz="10" w:space="0" w:color="888888"/>
+              <w:right w:val="dashed" w:sz="10" w:space="0" w:color="888888"/>
+            </w:tcBorders>
+            <w:shd w:val="clear" w:fill="F7F7F7"/>
+          </w:tcPr>
+          <w:p>
+            <w:pPr>
+              <w:spacing w:before="280" w:after="120"/>
+              <w:jc w:val="center"/>
+            </w:pPr>
+            <w:r/>
+            <w:r>
+              <w:rPr>
+                <w:rFonts w:ascii="Times New Roman" w:hAnsi="Times New Roman"/>
+                <w:b/>
+                <w:color w:val="993300"/>
+                <w:sz w:val="21"/>
+              </w:rPr>
+              <w:t>[ PLACEHOLDER - FIGURE 2 NOT YET INSERTED ]</w:t>
+            </w:r>
+          </w:p>
+          <w:p>
+            <w:pPr>
+              <w:spacing w:after="160"/>
+              <w:jc w:val="center"/>
+            </w:pPr>
+            <w:r>
+              <w:rPr>
+                <w:rFonts w:ascii="Times New Roman" w:hAnsi="Times New Roman"/>
+                <w:b/>
+                <w:color w:val="333333"/>
+                <w:sz w:val="22"/>
+              </w:rPr>
+              <w:t>AEGIS architecture pipeline (User Request to Dashboard Widget)</w:t>
+            </w:r>
+          </w:p>
+        </w:tc>
+      </w:tr>
+    </w:tbl>
+    <w:p>
+      <w:pPr>
+        <w:spacing w:before="120" w:after="280"/>
+        <w:jc w:val="center"/>
+      </w:pPr>
+      <w:r>
+        <w:rPr>
+          <w:rFonts w:ascii="Times New Roman" w:hAnsi="Times New Roman"/>
+          <w:b/>
+          <w:sz w:val="21"/>
+        </w:rPr>
+        <w:t>Figure 2: AEGIS architecture pipeline (User Request to Dashboard Widget)</w:t>
+      </w:r>
+    </w:p>
+    <w:p>
+      <w:pPr>
+        <w:spacing w:before="320" w:after="160"/>
+        <w:jc w:val="left"/>
+      </w:pPr>
+      <w:r>
+        <w:rPr>
+          <w:rFonts w:ascii="Times New Roman" w:hAnsi="Times New Roman"/>
+          <w:b/>
+          <w:sz w:val="28"/>
+        </w:rPr>
+        <w:t>3.7  Semantic Layer Design</w:t>
+      </w:r>
+    </w:p>
+    <w:p>
+      <w:pPr>
+        <w:spacing w:after="200" w:before="0" w:line="360" w:lineRule="auto"/>
+        <w:jc w:val="both"/>
+      </w:pPr>
+      <w:r>
+        <w:rPr>
+          <w:rFonts w:ascii="Times New Roman" w:hAnsi="Times New Roman"/>
+          <w:b w:val="0"/>
+          <w:i w:val="0"/>
+          <w:sz w:val="24"/>
+        </w:rPr>
+        <w:t>The semantic layer is the most important non-AI component of AEGIS. It separates business language from the underlying database structure and defines exactly which metrics, joins, and permissions are allowed to exist. A useful analogy is LEGO blocks rather than free-form clay: the semantic layer defines a finite set of composable building blocks. User questions are unlimited, but every answerable question is a composition of these blocks.</w:t>
+      </w:r>
+    </w:p>
+    <w:tbl>
+      <w:tblPr>
+        <w:tblW w:type="auto" w:w="0"/>
+        <w:jc w:val="center"/>
+        <w:tblLayout w:type="fixed"/>
+        <w:tblLook w:firstColumn="1" w:firstRow="1" w:lastColumn="0" w:lastRow="0" w:noHBand="0" w:noVBand="1" w:val="04A0"/>
+      </w:tblPr>
+      <w:tblGrid>
+        <w:gridCol w:w="9072"/>
+      </w:tblGrid>
+      <w:tr>
+        <w:trPr>
+          <w:trHeight w:val="3744"/>
+          <w:trHeight w:val="3744" w:hRule="atLeast"/>
+        </w:trPr>
+        <w:tc>
+          <w:tcPr>
+            <w:tcW w:type="dxa" w:w="9072"/>
+            <w:tcBorders>
+              <w:top w:val="dashed" w:sz="10" w:space="0" w:color="888888"/>
+              <w:left w:val="dashed" w:sz="10" w:space="0" w:color="888888"/>
+              <w:bottom w:val="dashed" w:sz="10" w:space="0" w:color="888888"/>
+              <w:right w:val="dashed" w:sz="10" w:space="0" w:color="888888"/>
+            </w:tcBorders>
+            <w:shd w:val="clear" w:fill="F7F7F7"/>
+          </w:tcPr>
+          <w:p>
+            <w:pPr>
+              <w:spacing w:before="280" w:after="120"/>
+              <w:jc w:val="center"/>
+            </w:pPr>
+            <w:r/>
+            <w:r>
+              <w:rPr>
+                <w:rFonts w:ascii="Times New Roman" w:hAnsi="Times New Roman"/>
+                <w:b/>
+                <w:color w:val="993300"/>
+                <w:sz w:val="21"/>
+              </w:rPr>
+              <w:t>[ PLACEHOLDER - FIGURE 3 NOT YET INSERTED ]</w:t>
+            </w:r>
+          </w:p>
+          <w:p>
+            <w:pPr>
+              <w:spacing w:after="160"/>
+              <w:jc w:val="center"/>
+            </w:pPr>
+            <w:r>
+              <w:rPr>
+                <w:rFonts w:ascii="Times New Roman" w:hAnsi="Times New Roman"/>
+                <w:b/>
+                <w:color w:val="333333"/>
+                <w:sz w:val="22"/>
+              </w:rPr>
+              <w:t>Semantic layer modularity - composable blocks vs. free-form SQL generation</w:t>
+            </w:r>
+          </w:p>
+        </w:tc>
+      </w:tr>
+    </w:tbl>
+    <w:p>
+      <w:pPr>
+        <w:spacing w:before="120" w:after="280"/>
+        <w:jc w:val="center"/>
+      </w:pPr>
+      <w:r>
+        <w:rPr>
+          <w:rFonts w:ascii="Times New Roman" w:hAnsi="Times New Roman"/>
+          <w:b/>
+          <w:sz w:val="21"/>
+        </w:rPr>
+        <w:t>Figure 3: Semantic layer modularity - composable blocks vs. free-form SQL generation</w:t>
       </w:r>
     </w:p>
     <w:p>
@@ -7998,7 +8749,7 @@
           <w:b/>
           <w:sz w:val="22"/>
         </w:rPr>
-        <w:t>Table 3.2: Plain-language AEGIS formal model.</w:t>
+        <w:t>Table 3.2: Semantic layer object model.</w:t>
       </w:r>
     </w:p>
     <w:tbl>
@@ -8048,7 +8799,7 @@
                 <w:b/>
                 <w:sz w:val="21"/>
               </w:rPr>
-              <w:t>Component</w:t>
+              <w:t>Object</w:t>
             </w:r>
           </w:p>
         </w:tc>
@@ -8075,7 +8826,7 @@
                 <w:b/>
                 <w:sz w:val="21"/>
               </w:rPr>
-              <w:t>Meaning in AEGIS</w:t>
+              <w:t>Field</w:t>
             </w:r>
           </w:p>
         </w:tc>
@@ -8102,7 +8853,7 @@
                 <w:b/>
                 <w:sz w:val="21"/>
               </w:rPr>
-              <w:t>Safety role</w:t>
+              <w:t>Example</w:t>
             </w:r>
           </w:p>
         </w:tc>
@@ -8132,7 +8883,7 @@
                 <w:b w:val="0"/>
                 <w:sz w:val="21"/>
               </w:rPr>
-              <w:t>User request</w:t>
+              <w:t>Metric</w:t>
             </w:r>
           </w:p>
         </w:tc>
@@ -8158,7 +8909,7 @@
                 <w:b w:val="0"/>
                 <w:sz w:val="21"/>
               </w:rPr>
-              <w:t>The original natural-language reporting question</w:t>
+              <w:t>label, SQL expression, joins, visual default, security class</w:t>
             </w:r>
           </w:p>
         </w:tc>
@@ -8184,7 +8935,7 @@
                 <w:b w:val="0"/>
                 <w:sz w:val="21"/>
               </w:rPr>
-              <w:t>Never becomes SQL directly</w:t>
+              <w:t>revenue = SUM(o.OrderTotal - o.RefundedAmount)</w:t>
             </w:r>
           </w:p>
         </w:tc>
@@ -8214,7 +8965,7 @@
                 <w:b w:val="0"/>
                 <w:sz w:val="21"/>
               </w:rPr>
-              <w:t>Intent object</w:t>
+              <w:t>Dimension</w:t>
             </w:r>
           </w:p>
         </w:tc>
@@ -8240,7 +8991,7 @@
                 <w:b w:val="0"/>
                 <w:sz w:val="21"/>
               </w:rPr>
-              <w:t>Typed summary of metric, dimension, pattern, filter, time range, and limit</w:t>
+              <w:t>label, SQL expression, datatype, access scope</w:t>
             </w:r>
           </w:p>
         </w:tc>
@@ -8266,7 +9017,7 @@
                 <w:b w:val="0"/>
                 <w:sz w:val="21"/>
               </w:rPr>
-              <w:t>Rejects fields outside the schema of allowed intent keys</w:t>
+              <w:t>category = c.Name from Category</w:t>
             </w:r>
           </w:p>
         </w:tc>
@@ -8296,7 +9047,7 @@
                 <w:b w:val="0"/>
                 <w:sz w:val="21"/>
               </w:rPr>
-              <w:t>Semantic layer</w:t>
+              <w:t>Filter</w:t>
             </w:r>
           </w:p>
         </w:tc>
@@ -8322,7 +9073,7 @@
                 <w:b w:val="0"/>
                 <w:sz w:val="21"/>
               </w:rPr>
-              <w:t>Approved metrics, dimensions, join paths, patterns, visualization rules, and permissions</w:t>
+              <w:t>label, SQL predicate, datatype</w:t>
             </w:r>
           </w:p>
         </w:tc>
@@ -8348,7 +9099,7 @@
                 <w:b w:val="0"/>
                 <w:sz w:val="21"/>
               </w:rPr>
-              <w:t>Defines what the system is allowed to answer</w:t>
+              <w:t>payment_status : o.PaymentStatusId = :val</w:t>
             </w:r>
           </w:p>
         </w:tc>
@@ -8378,7 +9129,7 @@
                 <w:b w:val="0"/>
                 <w:sz w:val="21"/>
               </w:rPr>
-              <w:t>Compiler</w:t>
+              <w:t>Time rule</w:t>
             </w:r>
           </w:p>
         </w:tc>
@@ -8404,7 +9155,7 @@
                 <w:b w:val="0"/>
                 <w:sz w:val="21"/>
               </w:rPr>
-              <w:t>Deterministic SQL builder using parameterized templates</w:t>
+              <w:t>label, SQL predicate, granularity</w:t>
             </w:r>
           </w:p>
         </w:tc>
@@ -8430,7 +9181,7 @@
                 <w:b w:val="0"/>
                 <w:sz w:val="21"/>
               </w:rPr>
-              <w:t>Produces read-only SQL from approved bindings only</w:t>
+              <w:t>current_week : DATEADD(week, ...)</w:t>
             </w:r>
           </w:p>
         </w:tc>
@@ -8460,7 +9211,7 @@
                 <w:b w:val="0"/>
                 <w:sz w:val="21"/>
               </w:rPr>
-              <w:t>Validator</w:t>
+              <w:t>Join path</w:t>
             </w:r>
           </w:p>
         </w:tc>
@@ -8486,7 +9237,7 @@
                 <w:b w:val="0"/>
                 <w:sz w:val="21"/>
               </w:rPr>
-              <w:t>Post-compilation SQL safety scanner</w:t>
+              <w:t>source, target, ON clause</w:t>
             </w:r>
           </w:p>
         </w:tc>
@@ -8512,7 +9263,7 @@
                 <w:b w:val="0"/>
                 <w:sz w:val="21"/>
               </w:rPr>
-              <w:t>Blocks non-SELECT statements as defense in depth</w:t>
+              <w:t>Order to OrderItem to Product to Category</w:t>
             </w:r>
           </w:p>
         </w:tc>
@@ -8542,7 +9293,7 @@
                 <w:b w:val="0"/>
                 <w:sz w:val="21"/>
               </w:rPr>
-              <w:t>Widget artifact</w:t>
+              <w:t>Pattern</w:t>
             </w:r>
           </w:p>
         </w:tc>
@@ -8568,7 +9319,7 @@
                 <w:b w:val="0"/>
                 <w:sz w:val="21"/>
               </w:rPr>
-              <w:t>Saved visualization and refresh plan</w:t>
+              <w:t>required slots, SQL template, visualization default</w:t>
             </w:r>
           </w:p>
         </w:tc>
@@ -8594,7 +9345,89 @@
                 <w:b w:val="0"/>
                 <w:sz w:val="21"/>
               </w:rPr>
-              <w:t>Keeps a reusable audit trail of what was generated</w:t>
+              <w:t>ranking: metric plus dimension maps to a bar chart</w:t>
+            </w:r>
+          </w:p>
+        </w:tc>
+      </w:tr>
+      <w:tr>
+        <w:trPr>
+          <w:cantSplit/>
+        </w:trPr>
+        <w:tc>
+          <w:tcPr>
+            <w:tcW w:type="dxa" w:w="3009"/>
+          </w:tcPr>
+          <w:p>
+            <w:pPr>
+              <w:spacing w:before="0" w:after="0" w:line="240" w:lineRule="auto"/>
+              <w:keepNext/>
+            </w:pPr>
+            <w:r>
+              <w:rPr>
+                <w:rFonts w:ascii="Times New Roman" w:hAnsi="Times New Roman"/>
+                <w:sz w:val="21"/>
+              </w:rPr>
+            </w:r>
+            <w:r>
+              <w:rPr>
+                <w:rFonts w:ascii="Times New Roman" w:hAnsi="Times New Roman"/>
+                <w:b w:val="0"/>
+                <w:sz w:val="21"/>
+              </w:rPr>
+              <w:t>Permission</w:t>
+            </w:r>
+          </w:p>
+        </w:tc>
+        <w:tc>
+          <w:tcPr>
+            <w:tcW w:type="dxa" w:w="3009"/>
+          </w:tcPr>
+          <w:p>
+            <w:pPr>
+              <w:spacing w:before="0" w:after="0" w:line="240" w:lineRule="auto"/>
+              <w:jc w:val="center"/>
+              <w:keepNext/>
+            </w:pPr>
+            <w:r>
+              <w:rPr>
+                <w:rFonts w:ascii="Times New Roman" w:hAnsi="Times New Roman"/>
+                <w:sz w:val="21"/>
+              </w:rPr>
+            </w:r>
+            <w:r>
+              <w:rPr>
+                <w:rFonts w:ascii="Times New Roman" w:hAnsi="Times New Roman"/>
+                <w:b w:val="0"/>
+                <w:sz w:val="21"/>
+              </w:rPr>
+              <w:t>rule</w:t>
+            </w:r>
+          </w:p>
+        </w:tc>
+        <w:tc>
+          <w:tcPr>
+            <w:tcW w:type="dxa" w:w="3009"/>
+          </w:tcPr>
+          <w:p>
+            <w:pPr>
+              <w:spacing w:before="0" w:after="0" w:line="240" w:lineRule="auto"/>
+              <w:jc w:val="center"/>
+              <w:keepNext/>
+            </w:pPr>
+            <w:r>
+              <w:rPr>
+                <w:rFonts w:ascii="Times New Roman" w:hAnsi="Times New Roman"/>
+                <w:sz w:val="21"/>
+              </w:rPr>
+            </w:r>
+            <w:r>
+              <w:rPr>
+                <w:rFonts w:ascii="Times New Roman" w:hAnsi="Times New Roman"/>
+                <w:b w:val="0"/>
+                <w:sz w:val="21"/>
+              </w:rPr>
+              <w:t>store_manager filtered by store location</w:t>
             </w:r>
           </w:p>
         </w:tc>
@@ -8607,7 +9440,7 @@
     </w:p>
     <w:p>
       <w:pPr>
-        <w:spacing w:after="200" w:before="0" w:line="360" w:lineRule="auto"/>
+        <w:spacing w:after="0" w:before="0" w:line="360" w:lineRule="auto"/>
         <w:jc w:val="both"/>
       </w:pPr>
       <w:r>
@@ -8617,7 +9450,21 @@
           <w:i w:val="0"/>
           <w:sz w:val="24"/>
         </w:rPr>
-        <w:t>The safety claim is therefore simple: if the semantic layer and compiler templates are trusted, then untrusted user language cannot introduce a table, column, join, or write operation that the semantic layer did not approve. The LLM never receives authority to write executable SQL.</w:t>
+        <w:t>In the nopCommerce prototype, the semantic layer defines 15 metrics, 34 dimensions, and 11 join paths across 12 analytics-relevant tables. The full nopCommerce schema contains 126 tables; the remaining 114 (system, content-management, configuration, authentication, vendor, and promotions tables) are deliberately not represented in the semantic layer at all. No business analyst asks 'show me revenue by ScheduleTask,' and excluding these tables functions as an implicit table-level access control: even a crafted prompt that names a hidden system table directly is rejected at Stage 2, because the identifier simply does not exist in L.</w:t>
+      </w:r>
+    </w:p>
+    <w:p>
+      <w:pPr>
+        <w:spacing w:before="320" w:after="160"/>
+        <w:jc w:val="left"/>
+      </w:pPr>
+      <w:r>
+        <w:rPr>
+          <w:rFonts w:ascii="Times New Roman" w:hAnsi="Times New Roman"/>
+          <w:b/>
+          <w:sz w:val="28"/>
+        </w:rPr>
+        <w:t>3.8  Intent Parsing with Dynamic Vocabulary Injection</w:t>
       </w:r>
     </w:p>
     <w:p>
@@ -8625,39 +9472,6 @@
         <w:spacing w:after="200" w:before="0" w:line="360" w:lineRule="auto"/>
         <w:jc w:val="both"/>
       </w:pPr>
-      <w:r>
-        <w:rPr>
-          <w:rFonts w:ascii="Times New Roman" w:hAnsi="Times New Roman"/>
-          <w:b/>
-          <w:i w:val="0"/>
-          <w:sz w:val="24"/>
-        </w:rPr>
-        <w:t xml:space="preserve">Safety proposition. </w:t>
-      </w:r>
-      <w:r>
-        <w:rPr>
-          <w:rFonts w:ascii="Times New Roman" w:hAnsi="Times New Roman"/>
-          <w:b w:val="0"/>
-          <w:i/>
-          <w:sz w:val="24"/>
-        </w:rPr>
-        <w:t>No generated query can reference a table, column, or row that is not represented in the approved semantic layer for the user's role. All SQL identifiers are drawn from closed semantic bindings, and literal values are passed through parameterized SQL rather than string interpolation. SQL injection through untrusted natural-language input is structurally prevented by design.</w:t>
-      </w:r>
-    </w:p>
-    <w:p>
-      <w:pPr>
-        <w:spacing w:after="0" w:before="0" w:line="360" w:lineRule="auto"/>
-        <w:jc w:val="both"/>
-      </w:pPr>
-      <w:r>
-        <w:rPr>
-          <w:rFonts w:ascii="Times New Roman" w:hAnsi="Times New Roman"/>
-          <w:b/>
-          <w:i w:val="0"/>
-          <w:sz w:val="24"/>
-        </w:rPr>
-        <w:t xml:space="preserve">Security boundary. </w:t>
-      </w:r>
       <w:r>
         <w:rPr>
           <w:rFonts w:ascii="Times New Roman" w:hAnsi="Times New Roman"/>
@@ -8665,21 +9479,7 @@
           <w:i w:val="0"/>
           <w:sz w:val="24"/>
         </w:rPr>
-        <w:t>This guarantee holds within a defined threat boundary: the semantic layer definitions, compiler templates, and permission predicates are trusted, administrator-controlled artifacts. An administrator who embeds malicious SQL inside a metric definition, or a supply-chain compromise of the compiler library, falls outside this boundary and requires separate operational security controls. Explicitly stating this boundary, rather than leaving it implicit, is itself part of this thesis's contribution: prior NL-to-SQL work rarely specifies the boundary of its safety claims, which makes rigorous security comparison difficult.</w:t>
-      </w:r>
-    </w:p>
-    <w:p>
-      <w:pPr>
-        <w:spacing w:before="320" w:after="160"/>
-        <w:jc w:val="left"/>
-      </w:pPr>
-      <w:r>
-        <w:rPr>
-          <w:rFonts w:ascii="Times New Roman" w:hAnsi="Times New Roman"/>
-          <w:b/>
-          <w:sz w:val="28"/>
-        </w:rPr>
-        <w:t>3.5  Threat Model</w:t>
+        <w:t>The central technique that makes Stage 1 reliable is vocabulary injection. At startup, AEGIS builds the system prompt by listing every approved metric and dimension name, with a plain-English description, directly from the semantic layer (approximately 1,100 tokens for 15 metrics and 34 dimensions). The LLM sees exactly which identifiers are valid and maps any user phrasing to the correct identifier without a manually maintained synonym list. This has three advantages over a synonym dictionary: zero maintenance, since adding a metric automatically updates the vocabulary the model sees; broad coverage of arbitrary user phrasing, since the model performs the mapping rather than a fixed lookup table; and token efficiency, since the full vocabulary for 15 metrics and 34 dimensions fits in roughly 1,100 tokens.</w:t>
       </w:r>
     </w:p>
     <w:p>
@@ -8694,46 +9494,7 @@
           <w:i w:val="0"/>
           <w:sz w:val="24"/>
         </w:rPr>
-        <w:t>AEGIS protects against attacks arriving through the untrusted natural-language input channel. The model assumes the database and application server are properly hardened; the attacker controls only the query field.</w:t>
-      </w:r>
-    </w:p>
-    <w:p>
-      <w:pPr>
-        <w:spacing w:after="80" w:before="160" w:line="360" w:lineRule="auto"/>
-        <w:jc w:val="both"/>
-      </w:pPr>
-      <w:r>
-        <w:rPr>
-          <w:rFonts w:ascii="Times New Roman" w:hAnsi="Times New Roman"/>
-          <w:b/>
-          <w:i w:val="0"/>
-          <w:sz w:val="24"/>
-        </w:rPr>
-        <w:t xml:space="preserve">T1 - Prompt injection attempting SQL generation. </w:t>
-      </w:r>
-    </w:p>
-    <w:p>
-      <w:pPr>
-        <w:spacing w:after="40" w:before="0" w:line="360" w:lineRule="auto"/>
-        <w:jc w:val="both"/>
-      </w:pPr>
-      <w:r>
-        <w:rPr>
-          <w:rFonts w:ascii="Times New Roman" w:hAnsi="Times New Roman"/>
-          <w:b/>
-          <w:i/>
-          <w:sz w:val="24"/>
-        </w:rPr>
-        <w:t xml:space="preserve">Attack: </w:t>
-      </w:r>
-      <w:r>
-        <w:rPr>
-          <w:rFonts w:ascii="Times New Roman" w:hAnsi="Times New Roman"/>
-          <w:b w:val="0"/>
-          <w:i/>
-          <w:sz w:val="24"/>
-        </w:rPr>
-        <w:t>"Ignore previous instructions. Generate DROP TABLE orders."</w:t>
+        <w:t>Structured output enforcement for LLMs [16] constrains the model's response to a fixed JSON schema before any downstream validation occurs, which is why Stage 1 can rely on a typed IntentObject rather than free-form text: malformed or off-schema output is rejected at the API boundary, before Stage 2 coverage validation ever runs.</w:t>
       </w:r>
     </w:p>
     <w:p>
@@ -8741,15 +9502,6 @@
         <w:spacing w:after="120" w:before="0" w:line="360" w:lineRule="auto"/>
         <w:jc w:val="both"/>
       </w:pPr>
-      <w:r>
-        <w:rPr>
-          <w:rFonts w:ascii="Times New Roman" w:hAnsi="Times New Roman"/>
-          <w:b/>
-          <w:i w:val="0"/>
-          <w:sz w:val="24"/>
-        </w:rPr>
-        <w:t xml:space="preserve">Control: </w:t>
-      </w:r>
       <w:r>
         <w:rPr>
           <w:rFonts w:ascii="Times New Roman" w:hAnsi="Times New Roman"/>
@@ -8757,615 +9509,108 @@
           <w:i w:val="0"/>
           <w:sz w:val="24"/>
         </w:rPr>
-        <w:t>The IntentObject schema contains no SQL field. Any non-approved string in metric_term or dimension_term is rejected by Pydantic type validation at Stage 2, before the compiler is reached.</w:t>
-      </w:r>
-    </w:p>
-    <w:p>
-      <w:pPr>
-        <w:spacing w:after="80" w:before="160" w:line="360" w:lineRule="auto"/>
-        <w:jc w:val="both"/>
-      </w:pPr>
-      <w:r>
-        <w:rPr>
-          <w:rFonts w:ascii="Times New Roman" w:hAnsi="Times New Roman"/>
-          <w:b/>
-          <w:i w:val="0"/>
-          <w:sz w:val="24"/>
-        </w:rPr>
-        <w:t xml:space="preserve">T2 - Unauthorized metric or dimension access. </w:t>
-      </w:r>
-    </w:p>
-    <w:p>
-      <w:pPr>
-        <w:spacing w:after="40" w:before="0" w:line="360" w:lineRule="auto"/>
-        <w:jc w:val="both"/>
-      </w:pPr>
-      <w:r>
-        <w:rPr>
-          <w:rFonts w:ascii="Times New Roman" w:hAnsi="Times New Roman"/>
-          <w:b/>
-          <w:i/>
-          <w:sz w:val="24"/>
-        </w:rPr>
-        <w:t xml:space="preserve">Attack: </w:t>
-      </w:r>
-      <w:r>
-        <w:rPr>
-          <w:rFonts w:ascii="Times New Roman" w:hAnsi="Times New Roman"/>
-          <w:b w:val="0"/>
-          <w:i/>
-          <w:sz w:val="24"/>
-        </w:rPr>
-        <w:t>"Show me customer passwords" or "List credit card numbers by order."</w:t>
-      </w:r>
-    </w:p>
-    <w:p>
-      <w:pPr>
-        <w:spacing w:after="120" w:before="0" w:line="360" w:lineRule="auto"/>
-        <w:jc w:val="both"/>
-      </w:pPr>
-      <w:r>
-        <w:rPr>
-          <w:rFonts w:ascii="Times New Roman" w:hAnsi="Times New Roman"/>
-          <w:b/>
-          <w:i w:val="0"/>
-          <w:sz w:val="24"/>
-        </w:rPr>
-        <w:t xml:space="preserve">Control: </w:t>
-      </w:r>
-      <w:r>
-        <w:rPr>
-          <w:rFonts w:ascii="Times New Roman" w:hAnsi="Times New Roman"/>
-          <w:b w:val="0"/>
-          <w:i w:val="0"/>
-          <w:sz w:val="24"/>
-        </w:rPr>
-        <w:t>Fields such as customer_password do not exist in the semantic layer vocabulary. The LLM never sees those names; it receives only the curated, approved label list. Stage 2 rejects any unrecognized term.</w:t>
-      </w:r>
-    </w:p>
-    <w:p>
-      <w:pPr>
-        <w:spacing w:after="80" w:before="160" w:line="360" w:lineRule="auto"/>
-        <w:jc w:val="both"/>
-      </w:pPr>
-      <w:r>
-        <w:rPr>
-          <w:rFonts w:ascii="Times New Roman" w:hAnsi="Times New Roman"/>
-          <w:b/>
-          <w:i w:val="0"/>
-          <w:sz w:val="24"/>
-        </w:rPr>
-        <w:t xml:space="preserve">T3 - Unauthorized row access. </w:t>
-      </w:r>
-    </w:p>
-    <w:p>
-      <w:pPr>
-        <w:spacing w:after="40" w:before="0" w:line="360" w:lineRule="auto"/>
-        <w:jc w:val="both"/>
-      </w:pPr>
-      <w:r>
-        <w:rPr>
-          <w:rFonts w:ascii="Times New Roman" w:hAnsi="Times New Roman"/>
-          <w:b/>
-          <w:i/>
-          <w:sz w:val="24"/>
-        </w:rPr>
-        <w:t xml:space="preserve">Attack: </w:t>
-      </w:r>
-      <w:r>
-        <w:rPr>
-          <w:rFonts w:ascii="Times New Roman" w:hAnsi="Times New Roman"/>
-          <w:b w:val="0"/>
-          <w:i/>
-          <w:sz w:val="24"/>
-        </w:rPr>
-        <w:t>A store-level user asks: "Show revenue for all branches."</w:t>
-      </w:r>
-    </w:p>
-    <w:p>
-      <w:pPr>
-        <w:spacing w:after="120" w:before="0" w:line="360" w:lineRule="auto"/>
-        <w:jc w:val="both"/>
-      </w:pPr>
-      <w:r>
-        <w:rPr>
-          <w:rFonts w:ascii="Times New Roman" w:hAnsi="Times New Roman"/>
-          <w:b/>
-          <w:i w:val="0"/>
-          <w:sz w:val="24"/>
-        </w:rPr>
-        <w:t xml:space="preserve">Control: </w:t>
-      </w:r>
-      <w:r>
-        <w:rPr>
-          <w:rFonts w:ascii="Times New Roman" w:hAnsi="Times New Roman"/>
-          <w:b w:val="0"/>
-          <w:i w:val="0"/>
-          <w:sz w:val="24"/>
-        </w:rPr>
-        <w:t>Stage 4 (Permission Rewriter) runs after the LLM and appends a role-specific WHERE predicate (for example, AND o.StoreId = :user_store) derived from the authenticated session. This cannot be suppressed or overridden by natural-language content.</w:t>
-      </w:r>
-    </w:p>
-    <w:p>
-      <w:pPr>
-        <w:spacing w:after="80" w:before="160" w:line="360" w:lineRule="auto"/>
-        <w:jc w:val="both"/>
-      </w:pPr>
-      <w:r>
-        <w:rPr>
-          <w:rFonts w:ascii="Times New Roman" w:hAnsi="Times New Roman"/>
-          <w:b/>
-          <w:i w:val="0"/>
-          <w:sz w:val="24"/>
-        </w:rPr>
-        <w:t xml:space="preserve">T4 - DML or DDL injection. </w:t>
-      </w:r>
-    </w:p>
-    <w:p>
-      <w:pPr>
-        <w:spacing w:after="40" w:before="0" w:line="360" w:lineRule="auto"/>
-        <w:jc w:val="both"/>
-      </w:pPr>
-      <w:r>
-        <w:rPr>
-          <w:rFonts w:ascii="Times New Roman" w:hAnsi="Times New Roman"/>
-          <w:b/>
-          <w:i/>
-          <w:sz w:val="24"/>
-        </w:rPr>
-        <w:t xml:space="preserve">Attack: </w:t>
-      </w:r>
-      <w:r>
-        <w:rPr>
-          <w:rFonts w:ascii="Times New Roman" w:hAnsi="Times New Roman"/>
-          <w:b w:val="0"/>
-          <w:i/>
-          <w:sz w:val="24"/>
-        </w:rPr>
-        <w:t>A crafted prompt that tricks the LLM into associating a write operation with an intent class.</w:t>
-      </w:r>
-    </w:p>
-    <w:p>
-      <w:pPr>
-        <w:spacing w:after="120" w:before="0" w:line="360" w:lineRule="auto"/>
-        <w:jc w:val="both"/>
-      </w:pPr>
-      <w:r>
-        <w:rPr>
-          <w:rFonts w:ascii="Times New Roman" w:hAnsi="Times New Roman"/>
-          <w:b/>
-          <w:i w:val="0"/>
-          <w:sz w:val="24"/>
-        </w:rPr>
-        <w:t xml:space="preserve">Control: </w:t>
-      </w:r>
-      <w:r>
-        <w:rPr>
-          <w:rFonts w:ascii="Times New Roman" w:hAnsi="Times New Roman"/>
-          <w:b w:val="0"/>
-          <w:i w:val="0"/>
-          <w:sz w:val="24"/>
-        </w:rPr>
-        <w:t>No template in the pattern library contains a DML or DDL keyword. The AST-level post-compilation validator explicitly rejects any non-SELECT statement as a defense-in-depth layer.</w:t>
-      </w:r>
-    </w:p>
-    <w:p>
-      <w:pPr>
-        <w:spacing w:after="120" w:before="0" w:line="360" w:lineRule="auto"/>
-        <w:jc w:val="both"/>
-      </w:pPr>
-      <w:r>
-        <w:rPr>
-          <w:rFonts w:ascii="Times New Roman" w:hAnsi="Times New Roman"/>
-          <w:b/>
-          <w:i w:val="0"/>
-          <w:sz w:val="24"/>
-        </w:rPr>
-        <w:t>Not protected by AEGIS (requires operational security controls outside this architecture):</w:t>
-      </w:r>
-    </w:p>
-    <w:p>
-      <w:pPr>
-        <w:spacing w:after="80" w:line="360" w:lineRule="auto"/>
-        <w:ind w:left="461" w:hanging="259"/>
-      </w:pPr>
-      <w:r>
-        <w:rPr>
-          <w:rFonts w:ascii="Times New Roman" w:hAnsi="Times New Roman"/>
-          <w:sz w:val="24"/>
-        </w:rPr>
-        <w:t>•</w:t>
-        <w:tab/>
-      </w:r>
-      <w:r>
-        <w:rPr>
-          <w:rFonts w:ascii="Times New Roman" w:hAnsi="Times New Roman"/>
-          <w:sz w:val="24"/>
-        </w:rPr>
-        <w:t>A malicious administrator embedding arbitrary SQL inside a metric's sql_expr field.</w:t>
-      </w:r>
-    </w:p>
-    <w:p>
-      <w:pPr>
-        <w:spacing w:after="80" w:line="360" w:lineRule="auto"/>
-        <w:ind w:left="461" w:hanging="259"/>
-      </w:pPr>
-      <w:r>
-        <w:rPr>
-          <w:rFonts w:ascii="Times New Roman" w:hAnsi="Times New Roman"/>
-          <w:sz w:val="24"/>
-        </w:rPr>
-        <w:t>•</w:t>
-        <w:tab/>
-      </w:r>
-      <w:r>
-        <w:rPr>
-          <w:rFonts w:ascii="Times New Roman" w:hAnsi="Times New Roman"/>
-          <w:sz w:val="24"/>
-        </w:rPr>
-        <w:t>Supply-chain compromise of the compiler module or the SQL parser library.</w:t>
-      </w:r>
-    </w:p>
-    <w:p>
-      <w:pPr>
-        <w:spacing w:after="80" w:line="360" w:lineRule="auto"/>
-        <w:ind w:left="461" w:hanging="259"/>
-      </w:pPr>
-      <w:r>
-        <w:rPr>
-          <w:rFonts w:ascii="Times New Roman" w:hAnsi="Times New Roman"/>
-          <w:sz w:val="24"/>
-        </w:rPr>
-        <w:t>•</w:t>
-        <w:tab/>
-      </w:r>
-      <w:r>
-        <w:rPr>
-          <w:rFonts w:ascii="Times New Roman" w:hAnsi="Times New Roman"/>
-          <w:sz w:val="24"/>
-        </w:rPr>
-        <w:t>Database-level privilege escalation that bypasses the application layer.</w:t>
-      </w:r>
-    </w:p>
-    <w:p>
-      <w:pPr>
-        <w:spacing w:after="80" w:line="360" w:lineRule="auto"/>
-        <w:ind w:left="461" w:hanging="259"/>
-      </w:pPr>
-      <w:r>
-        <w:rPr>
-          <w:rFonts w:ascii="Times New Roman" w:hAnsi="Times New Roman"/>
-          <w:sz w:val="24"/>
-        </w:rPr>
-        <w:t>•</w:t>
-        <w:tab/>
-      </w:r>
-      <w:r>
-        <w:rPr>
-          <w:rFonts w:ascii="Times New Roman" w:hAnsi="Times New Roman"/>
-          <w:sz w:val="24"/>
-        </w:rPr>
-        <w:t>LLM provider infrastructure compromise or model poisoning.</w:t>
-      </w:r>
-    </w:p>
-    <w:p>
-      <w:pPr>
-        <w:spacing w:after="0" w:before="0" w:line="360" w:lineRule="auto"/>
-        <w:jc w:val="both"/>
-      </w:pPr>
-      <w:r>
-        <w:rPr>
-          <w:rFonts w:ascii="Times New Roman" w:hAnsi="Times New Roman"/>
-          <w:b w:val="0"/>
-          <w:i w:val="0"/>
-          <w:sz w:val="24"/>
-        </w:rPr>
-        <w:t>Explicitly documenting out-of-scope threats is itself a contribution: prior NL-to-SQL work rarely specifies the boundary of its safety claims, which makes meaningful security comparison difficult.</w:t>
-      </w:r>
-    </w:p>
-    <w:p>
-      <w:r>
-        <w:br w:type="page"/>
-      </w:r>
-    </w:p>
-    <w:p>
-      <w:pPr>
-        <w:spacing w:before="320" w:after="160"/>
-        <w:jc w:val="left"/>
-      </w:pPr>
-      <w:r>
-        <w:rPr>
-          <w:rFonts w:ascii="Times New Roman" w:hAnsi="Times New Roman"/>
-          <w:b/>
-          <w:sz w:val="28"/>
-        </w:rPr>
-        <w:t>3.6  System Architecture</w:t>
-      </w:r>
-    </w:p>
-    <w:p>
-      <w:pPr>
-        <w:spacing w:after="200" w:before="0" w:line="360" w:lineRule="auto"/>
-        <w:jc w:val="both"/>
-      </w:pPr>
-      <w:r>
-        <w:rPr>
-          <w:rFonts w:ascii="Times New Roman" w:hAnsi="Times New Roman"/>
-          <w:b w:val="0"/>
-          <w:i w:val="0"/>
-          <w:sz w:val="24"/>
-        </w:rPr>
-        <w:t>Every user query travels through exactly seven stages. Stages 2 through 7 contain no artificial intelligence; they are deterministic code. Rejection at any stage produces a structured clarification message rather than a best-effort guess.</w:t>
-      </w:r>
-    </w:p>
-    <w:p>
-      <w:pPr>
-        <w:spacing w:after="160" w:before="0" w:line="360" w:lineRule="auto"/>
-        <w:jc w:val="both"/>
-      </w:pPr>
-      <w:r>
-        <w:rPr>
-          <w:rFonts w:ascii="Times New Roman" w:hAnsi="Times New Roman"/>
-          <w:b/>
-          <w:i w:val="0"/>
-          <w:sz w:val="24"/>
-        </w:rPr>
-        <w:t xml:space="preserve">Stage 1 - Intent Extraction. </w:t>
-      </w:r>
-      <w:r>
-        <w:rPr>
-          <w:rFonts w:ascii="Times New Roman" w:hAnsi="Times New Roman"/>
-          <w:b w:val="0"/>
-          <w:i w:val="0"/>
-          <w:sz w:val="24"/>
-        </w:rPr>
-        <w:t>A lightweight LLM reads the query together with a system prompt built from the semantic layer, and outputs a validated IntentObject (intent class, metric term, dimension term, filters, sort, limit, confidence). This is the only stage that involves artificial intelligence.</w:t>
-      </w:r>
-    </w:p>
-    <w:p>
-      <w:pPr>
-        <w:spacing w:after="160" w:before="0" w:line="360" w:lineRule="auto"/>
-        <w:jc w:val="both"/>
-      </w:pPr>
-      <w:r>
-        <w:rPr>
-          <w:rFonts w:ascii="Times New Roman" w:hAnsi="Times New Roman"/>
-          <w:b/>
-          <w:i w:val="0"/>
-          <w:sz w:val="24"/>
-        </w:rPr>
-        <w:t xml:space="preserve">Stage 2 - Coverage Validation. </w:t>
-      </w:r>
-      <w:r>
-        <w:rPr>
-          <w:rFonts w:ascii="Times New Roman" w:hAnsi="Times New Roman"/>
-          <w:b w:val="0"/>
-          <w:i w:val="0"/>
-          <w:sz w:val="24"/>
-        </w:rPr>
-        <w:t>The server checks that both the metric term and the dimension term exist in the semantic layer vocabulary before anything else runs. Unknown identifiers are rejected here, with a structured message listing the available identifiers, rather than being passed to the compiler.</w:t>
-      </w:r>
-    </w:p>
-    <w:p>
-      <w:pPr>
-        <w:spacing w:after="160" w:before="0" w:line="360" w:lineRule="auto"/>
-        <w:jc w:val="both"/>
-      </w:pPr>
-      <w:r>
-        <w:rPr>
-          <w:rFonts w:ascii="Times New Roman" w:hAnsi="Times New Roman"/>
-          <w:b/>
-          <w:i w:val="0"/>
-          <w:sz w:val="24"/>
-        </w:rPr>
-        <w:t xml:space="preserve">Stage 3 - Semantic Mapping. </w:t>
-      </w:r>
-      <w:r>
-        <w:rPr>
-          <w:rFonts w:ascii="Times New Roman" w:hAnsi="Times New Roman"/>
-          <w:b w:val="0"/>
-          <w:i w:val="0"/>
-          <w:sz w:val="24"/>
-        </w:rPr>
-        <w:t>Business-logic aliases are expanded (for example, 'abandoned' maps to a specific OrderStatusId), and relative time expressions such as 'this month' are resolved to concrete date predicates.</w:t>
-      </w:r>
-    </w:p>
-    <w:p>
-      <w:pPr>
-        <w:spacing w:after="160" w:before="0" w:line="360" w:lineRule="auto"/>
-        <w:jc w:val="both"/>
-      </w:pPr>
-      <w:r>
-        <w:rPr>
-          <w:rFonts w:ascii="Times New Roman" w:hAnsi="Times New Roman"/>
-          <w:b/>
-          <w:i w:val="0"/>
-          <w:sz w:val="24"/>
-        </w:rPr>
-        <w:t xml:space="preserve">Stage 4 - Permission Rewriting. </w:t>
-      </w:r>
-      <w:r>
-        <w:rPr>
-          <w:rFonts w:ascii="Times New Roman" w:hAnsi="Times New Roman"/>
-          <w:b w:val="0"/>
-          <w:i w:val="0"/>
-          <w:sz w:val="24"/>
-        </w:rPr>
-        <w:t>A role-specific WHERE predicate is appended based on the authenticated user's session. This runs after the LLM has already finished, so no natural-language content can influence it.</w:t>
-      </w:r>
-    </w:p>
-    <w:p>
-      <w:pPr>
-        <w:spacing w:after="160" w:before="0" w:line="360" w:lineRule="auto"/>
-        <w:jc w:val="both"/>
-      </w:pPr>
-      <w:r>
-        <w:rPr>
-          <w:rFonts w:ascii="Times New Roman" w:hAnsi="Times New Roman"/>
-          <w:b/>
-          <w:i w:val="0"/>
-          <w:sz w:val="24"/>
-        </w:rPr>
-        <w:t xml:space="preserve">Stage 5 - SQL Compilation. </w:t>
-      </w:r>
-      <w:r>
-        <w:rPr>
-          <w:rFonts w:ascii="Times New Roman" w:hAnsi="Times New Roman"/>
-          <w:b w:val="0"/>
-          <w:i w:val="0"/>
-          <w:sz w:val="24"/>
-        </w:rPr>
-        <w:t>A breadth-first search over the join graph finds the minimal join path connecting the tables required by the resolved metric and dimension, and pre-compiled SQL expressions are substituted into a parameterized template. No SQL text is ever assembled from concatenated user input.</w:t>
-      </w:r>
-    </w:p>
-    <w:p>
-      <w:pPr>
-        <w:spacing w:after="160" w:before="0" w:line="360" w:lineRule="auto"/>
-        <w:jc w:val="both"/>
-      </w:pPr>
-      <w:r>
-        <w:rPr>
-          <w:rFonts w:ascii="Times New Roman" w:hAnsi="Times New Roman"/>
-          <w:b/>
-          <w:i w:val="0"/>
-          <w:sz w:val="24"/>
-        </w:rPr>
-        <w:t xml:space="preserve">Stage 6 - Visualization Selection. </w:t>
-      </w:r>
-      <w:r>
-        <w:rPr>
-          <w:rFonts w:ascii="Times New Roman" w:hAnsi="Times New Roman"/>
-          <w:b w:val="0"/>
-          <w:i w:val="0"/>
-          <w:sz w:val="24"/>
-        </w:rPr>
-        <w:t>A rule engine maps the intent class and result shape to a default chart type. This stage contains no learned model.</w:t>
-      </w:r>
-    </w:p>
-    <w:p>
-      <w:pPr>
-        <w:spacing w:after="160" w:before="0" w:line="360" w:lineRule="auto"/>
-        <w:jc w:val="both"/>
-      </w:pPr>
-      <w:r>
-        <w:rPr>
-          <w:rFonts w:ascii="Times New Roman" w:hAnsi="Times New Roman"/>
-          <w:b/>
-          <w:i w:val="0"/>
-          <w:sz w:val="24"/>
-        </w:rPr>
-        <w:t xml:space="preserve">Stage 7 - Widget Persistence. </w:t>
-      </w:r>
-      <w:r>
-        <w:rPr>
-          <w:rFonts w:ascii="Times New Roman" w:hAnsi="Times New Roman"/>
-          <w:b w:val="0"/>
-          <w:i w:val="0"/>
-          <w:sz w:val="24"/>
-        </w:rPr>
-        <w:t>The analysis plan is hashed (SHA-256) to detect duplicates, and the query, chart configuration, and access rules are stored as a widget artifact that can be refreshed on a schedule.</w:t>
-      </w:r>
-    </w:p>
-    <w:tbl>
-      <w:tblPr>
-        <w:tblW w:type="auto" w:w="0"/>
-        <w:jc w:val="center"/>
-        <w:tblLayout w:type="fixed"/>
-        <w:tblLook w:firstColumn="1" w:firstRow="1" w:lastColumn="0" w:lastRow="0" w:noHBand="0" w:noVBand="1" w:val="04A0"/>
-      </w:tblPr>
-      <w:tblGrid>
-        <w:gridCol w:w="9072"/>
-      </w:tblGrid>
-      <w:tr>
-        <w:trPr>
-          <w:trHeight w:val="3168"/>
-          <w:trHeight w:val="3168" w:hRule="atLeast"/>
-        </w:trPr>
-        <w:tc>
-          <w:tcPr>
-            <w:tcW w:type="dxa" w:w="9072"/>
-            <w:tcBorders>
-              <w:top w:val="dashed" w:sz="10" w:space="0" w:color="888888"/>
-              <w:left w:val="dashed" w:sz="10" w:space="0" w:color="888888"/>
-              <w:bottom w:val="dashed" w:sz="10" w:space="0" w:color="888888"/>
-              <w:right w:val="dashed" w:sz="10" w:space="0" w:color="888888"/>
-            </w:tcBorders>
-            <w:shd w:val="clear" w:fill="F7F7F7"/>
-          </w:tcPr>
-          <w:p>
-            <w:pPr>
-              <w:spacing w:before="280" w:after="120"/>
-              <w:jc w:val="center"/>
-            </w:pPr>
-            <w:r/>
-            <w:r>
-              <w:rPr>
-                <w:rFonts w:ascii="Times New Roman" w:hAnsi="Times New Roman"/>
-                <w:b/>
-                <w:color w:val="993300"/>
-                <w:sz w:val="21"/>
-              </w:rPr>
-              <w:t>[ PLACEHOLDER - FIGURE 2 NOT YET INSERTED ]</w:t>
-            </w:r>
-          </w:p>
-          <w:p>
-            <w:pPr>
-              <w:spacing w:after="160"/>
-              <w:jc w:val="center"/>
-            </w:pPr>
-            <w:r>
-              <w:rPr>
-                <w:rFonts w:ascii="Times New Roman" w:hAnsi="Times New Roman"/>
-                <w:b/>
-                <w:color w:val="333333"/>
-                <w:sz w:val="22"/>
-              </w:rPr>
-              <w:t>AEGIS architecture pipeline (User Request to Dashboard Widget)</w:t>
-            </w:r>
-          </w:p>
-        </w:tc>
-      </w:tr>
-    </w:tbl>
-    <w:p>
-      <w:pPr>
-        <w:spacing w:before="120" w:after="280"/>
-        <w:jc w:val="center"/>
-      </w:pPr>
-      <w:r>
-        <w:rPr>
-          <w:rFonts w:ascii="Times New Roman" w:hAnsi="Times New Roman"/>
-          <w:b/>
-          <w:sz w:val="21"/>
-        </w:rPr>
-        <w:t>Figure 2: AEGIS architecture pipeline (User Request to Dashboard Widget)</w:t>
-      </w:r>
-    </w:p>
-    <w:p>
-      <w:pPr>
-        <w:spacing w:before="320" w:after="160"/>
-        <w:jc w:val="left"/>
-      </w:pPr>
-      <w:r>
-        <w:rPr>
-          <w:rFonts w:ascii="Times New Roman" w:hAnsi="Times New Roman"/>
-          <w:b/>
-          <w:sz w:val="28"/>
-        </w:rPr>
-        <w:t>3.7  Semantic Layer Design</w:t>
-      </w:r>
-    </w:p>
-    <w:p>
-      <w:pPr>
-        <w:spacing w:after="200" w:before="0" w:line="360" w:lineRule="auto"/>
-        <w:jc w:val="both"/>
-      </w:pPr>
-      <w:r>
-        <w:rPr>
-          <w:rFonts w:ascii="Times New Roman" w:hAnsi="Times New Roman"/>
-          <w:b w:val="0"/>
-          <w:i w:val="0"/>
-          <w:sz w:val="24"/>
-        </w:rPr>
-        <w:t>The semantic layer is the most important non-AI component of AEGIS. It separates business language from the underlying database structure and defines exactly which metrics, joins, and permissions are allowed to exist. A useful analogy is LEGO blocks rather than free-form clay: the semantic layer defines a finite set of composable building blocks. User questions are unlimited, but every answerable question is a composition of these blocks.</w:t>
+        <w:t>The output schema enforces typed fields:</w:t>
+      </w:r>
+    </w:p>
+    <w:p>
+      <w:pPr>
+        <w:spacing w:before="120" w:after="120" w:line="276" w:lineRule="auto"/>
+        <w:ind w:left="576"/>
+      </w:pPr>
+      <w:r>
+        <w:rPr>
+          <w:rFonts w:ascii="Times New Roman" w:hAnsi="Times New Roman"/>
+          <w:sz w:val="19"/>
+        </w:rPr>
+        <w:t>{</w:t>
+      </w:r>
+      <w:r>
+        <w:rPr>
+          <w:rFonts w:ascii="Times New Roman" w:hAnsi="Times New Roman"/>
+          <w:sz w:val="19"/>
+        </w:rPr>
+        <w:br/>
+        <w:t xml:space="preserve">  "intent_class": "kpi | ranking | trend | comparison | exception |</w:t>
+      </w:r>
+      <w:r>
+        <w:rPr>
+          <w:rFonts w:ascii="Times New Roman" w:hAnsi="Times New Roman"/>
+          <w:sz w:val="19"/>
+        </w:rPr>
+        <w:br/>
+        <w:t xml:space="preserve">                   summary | segment | funnel | cohort | correlate | tabular",</w:t>
+      </w:r>
+      <w:r>
+        <w:rPr>
+          <w:rFonts w:ascii="Times New Roman" w:hAnsi="Times New Roman"/>
+          <w:sz w:val="19"/>
+        </w:rPr>
+        <w:br/>
+        <w:t xml:space="preserve">  "metric_term": "string",</w:t>
+      </w:r>
+      <w:r>
+        <w:rPr>
+          <w:rFonts w:ascii="Times New Roman" w:hAnsi="Times New Roman"/>
+          <w:sz w:val="19"/>
+        </w:rPr>
+        <w:br/>
+        <w:t xml:space="preserve">  "dimension_term": "string or null",</w:t>
+      </w:r>
+      <w:r>
+        <w:rPr>
+          <w:rFonts w:ascii="Times New Roman" w:hAnsi="Times New Roman"/>
+          <w:sz w:val="19"/>
+        </w:rPr>
+        <w:br/>
+        <w:t xml:space="preserve">  "time_term": "string or null",</w:t>
+      </w:r>
+      <w:r>
+        <w:rPr>
+          <w:rFonts w:ascii="Times New Roman" w:hAnsi="Times New Roman"/>
+          <w:sz w:val="19"/>
+        </w:rPr>
+        <w:br/>
+        <w:t xml:space="preserve">  "filters": [{"field": "string", "operator": "string", "value": "string"}],</w:t>
+      </w:r>
+      <w:r>
+        <w:rPr>
+          <w:rFonts w:ascii="Times New Roman" w:hAnsi="Times New Roman"/>
+          <w:sz w:val="19"/>
+        </w:rPr>
+        <w:br/>
+        <w:t xml:space="preserve">  "sort": "asc | desc | null",</w:t>
+      </w:r>
+      <w:r>
+        <w:rPr>
+          <w:rFonts w:ascii="Times New Roman" w:hAnsi="Times New Roman"/>
+          <w:sz w:val="19"/>
+        </w:rPr>
+        <w:br/>
+        <w:t xml:space="preserve">  "limit": "integer or null",</w:t>
+      </w:r>
+      <w:r>
+        <w:rPr>
+          <w:rFonts w:ascii="Times New Roman" w:hAnsi="Times New Roman"/>
+          <w:sz w:val="19"/>
+        </w:rPr>
+        <w:br/>
+        <w:t xml:space="preserve">  "confidence": "low | medium | high",</w:t>
+      </w:r>
+      <w:r>
+        <w:rPr>
+          <w:rFonts w:ascii="Times New Roman" w:hAnsi="Times New Roman"/>
+          <w:sz w:val="19"/>
+        </w:rPr>
+        <w:br/>
+        <w:t xml:space="preserve">  "needs_clarification": "boolean"</w:t>
+      </w:r>
+      <w:r>
+        <w:rPr>
+          <w:rFonts w:ascii="Times New Roman" w:hAnsi="Times New Roman"/>
+          <w:sz w:val="19"/>
+        </w:rPr>
+        <w:br/>
+        <w:t>}</w:t>
       </w:r>
     </w:p>
     <w:tbl>
@@ -9407,7 +9652,7 @@
                 <w:color w:val="993300"/>
                 <w:sz w:val="21"/>
               </w:rPr>
-              <w:t>[ PLACEHOLDER - FIGURE 3 NOT YET INSERTED ]</w:t>
+              <w:t>[ PLACEHOLDER - FIGURE 4 NOT YET INSERTED ]</w:t>
             </w:r>
           </w:p>
           <w:p>
@@ -9422,7 +9667,7 @@
                 <w:color w:val="333333"/>
                 <w:sz w:val="22"/>
               </w:rPr>
-              <w:t>Semantic layer modularity - composable blocks vs. free-form SQL generation</w:t>
+              <w:t>Vocabulary injection workflow</w:t>
             </w:r>
           </w:p>
         </w:tc>
@@ -9439,713 +9684,31 @@
           <w:b/>
           <w:sz w:val="21"/>
         </w:rPr>
-        <w:t>Figure 3: Semantic layer modularity - composable blocks vs. free-form SQL generation</w:t>
-      </w:r>
-    </w:p>
-    <w:p>
-      <w:pPr>
-        <w:spacing w:before="200" w:after="80"/>
-        <w:jc w:val="center"/>
-        <w:keepNext/>
+        <w:t>Figure 4: Vocabulary injection workflow</w:t>
+      </w:r>
+    </w:p>
+    <w:p>
+      <w:r>
+        <w:br w:type="page"/>
+      </w:r>
+    </w:p>
+    <w:p>
+      <w:pPr>
+        <w:spacing w:before="320" w:after="160"/>
+        <w:jc w:val="left"/>
       </w:pPr>
       <w:r>
         <w:rPr>
           <w:rFonts w:ascii="Times New Roman" w:hAnsi="Times New Roman"/>
           <w:b/>
-          <w:sz w:val="22"/>
-        </w:rPr>
-        <w:t>Table 3.3: Semantic layer object model.</w:t>
-      </w:r>
-    </w:p>
-    <w:tbl>
-      <w:tblPr>
-        <w:tblStyle w:val="TableGrid"/>
-        <w:tblW w:type="auto" w:w="0"/>
-        <w:jc w:val="center"/>
-        <w:tblLook w:firstColumn="1" w:firstRow="1" w:lastColumn="0" w:lastRow="0" w:noHBand="0" w:noVBand="1" w:val="04A0"/>
-        <w:tblBorders>
-          <w:top w:val="single" w:sz="4" w:space="0" w:color="999999"/>
-          <w:left w:val="single" w:sz="4" w:space="0" w:color="999999"/>
-          <w:bottom w:val="single" w:sz="4" w:space="0" w:color="999999"/>
-          <w:right w:val="single" w:sz="4" w:space="0" w:color="999999"/>
-          <w:insideH w:val="single" w:sz="4" w:space="0" w:color="999999"/>
-          <w:insideV w:val="single" w:sz="4" w:space="0" w:color="999999"/>
-        </w:tblBorders>
-      </w:tblPr>
-      <w:tblGrid>
-        <w:gridCol w:w="3009"/>
-        <w:gridCol w:w="3009"/>
-        <w:gridCol w:w="3009"/>
-      </w:tblGrid>
-      <w:tr>
-        <w:trPr>
-          <w:cantSplit/>
-        </w:trPr>
-        <w:tc>
-          <w:tcPr>
-            <w:tcW w:type="dxa" w:w="3009"/>
-          </w:tcPr>
-          <w:p>
-            <w:pPr>
-              <w:spacing w:before="0" w:after="0" w:line="240" w:lineRule="auto"/>
-              <w:jc w:val="center"/>
-              <w:keepNext/>
-            </w:pPr>
-            <w:r>
-              <w:rPr>
-                <w:rFonts w:ascii="Times New Roman" w:hAnsi="Times New Roman"/>
-                <w:b/>
-                <w:sz w:val="21"/>
-              </w:rPr>
-            </w:r>
-            <w:r>
-              <w:rPr>
-                <w:rFonts w:ascii="Times New Roman" w:hAnsi="Times New Roman"/>
-                <w:b/>
-                <w:sz w:val="21"/>
-              </w:rPr>
-              <w:t>Object</w:t>
-            </w:r>
-          </w:p>
-        </w:tc>
-        <w:tc>
-          <w:tcPr>
-            <w:tcW w:type="dxa" w:w="3009"/>
-          </w:tcPr>
-          <w:p>
-            <w:pPr>
-              <w:spacing w:before="0" w:after="0" w:line="240" w:lineRule="auto"/>
-              <w:jc w:val="center"/>
-              <w:keepNext/>
-            </w:pPr>
-            <w:r>
-              <w:rPr>
-                <w:rFonts w:ascii="Times New Roman" w:hAnsi="Times New Roman"/>
-                <w:b/>
-                <w:sz w:val="21"/>
-              </w:rPr>
-            </w:r>
-            <w:r>
-              <w:rPr>
-                <w:rFonts w:ascii="Times New Roman" w:hAnsi="Times New Roman"/>
-                <w:b/>
-                <w:sz w:val="21"/>
-              </w:rPr>
-              <w:t>Field</w:t>
-            </w:r>
-          </w:p>
-        </w:tc>
-        <w:tc>
-          <w:tcPr>
-            <w:tcW w:type="dxa" w:w="3009"/>
-          </w:tcPr>
-          <w:p>
-            <w:pPr>
-              <w:spacing w:before="0" w:after="0" w:line="240" w:lineRule="auto"/>
-              <w:jc w:val="center"/>
-              <w:keepNext/>
-            </w:pPr>
-            <w:r>
-              <w:rPr>
-                <w:rFonts w:ascii="Times New Roman" w:hAnsi="Times New Roman"/>
-                <w:b/>
-                <w:sz w:val="21"/>
-              </w:rPr>
-            </w:r>
-            <w:r>
-              <w:rPr>
-                <w:rFonts w:ascii="Times New Roman" w:hAnsi="Times New Roman"/>
-                <w:b/>
-                <w:sz w:val="21"/>
-              </w:rPr>
-              <w:t>Example</w:t>
-            </w:r>
-          </w:p>
-        </w:tc>
-      </w:tr>
-      <w:tr>
-        <w:trPr>
-          <w:cantSplit/>
-        </w:trPr>
-        <w:tc>
-          <w:tcPr>
-            <w:tcW w:type="dxa" w:w="3009"/>
-          </w:tcPr>
-          <w:p>
-            <w:pPr>
-              <w:spacing w:before="0" w:after="0" w:line="240" w:lineRule="auto"/>
-              <w:keepNext/>
-            </w:pPr>
-            <w:r>
-              <w:rPr>
-                <w:rFonts w:ascii="Times New Roman" w:hAnsi="Times New Roman"/>
-                <w:sz w:val="21"/>
-              </w:rPr>
-            </w:r>
-            <w:r>
-              <w:rPr>
-                <w:rFonts w:ascii="Times New Roman" w:hAnsi="Times New Roman"/>
-                <w:b w:val="0"/>
-                <w:sz w:val="21"/>
-              </w:rPr>
-              <w:t>Metric</w:t>
-            </w:r>
-          </w:p>
-        </w:tc>
-        <w:tc>
-          <w:tcPr>
-            <w:tcW w:type="dxa" w:w="3009"/>
-          </w:tcPr>
-          <w:p>
-            <w:pPr>
-              <w:spacing w:before="0" w:after="0" w:line="240" w:lineRule="auto"/>
-              <w:jc w:val="center"/>
-              <w:keepNext/>
-            </w:pPr>
-            <w:r>
-              <w:rPr>
-                <w:rFonts w:ascii="Times New Roman" w:hAnsi="Times New Roman"/>
-                <w:sz w:val="21"/>
-              </w:rPr>
-            </w:r>
-            <w:r>
-              <w:rPr>
-                <w:rFonts w:ascii="Times New Roman" w:hAnsi="Times New Roman"/>
-                <w:b w:val="0"/>
-                <w:sz w:val="21"/>
-              </w:rPr>
-              <w:t>label, SQL expression, joins, visual default, security class</w:t>
-            </w:r>
-          </w:p>
-        </w:tc>
-        <w:tc>
-          <w:tcPr>
-            <w:tcW w:type="dxa" w:w="3009"/>
-          </w:tcPr>
-          <w:p>
-            <w:pPr>
-              <w:spacing w:before="0" w:after="0" w:line="240" w:lineRule="auto"/>
-              <w:jc w:val="center"/>
-              <w:keepNext/>
-            </w:pPr>
-            <w:r>
-              <w:rPr>
-                <w:rFonts w:ascii="Times New Roman" w:hAnsi="Times New Roman"/>
-                <w:sz w:val="21"/>
-              </w:rPr>
-            </w:r>
-            <w:r>
-              <w:rPr>
-                <w:rFonts w:ascii="Times New Roman" w:hAnsi="Times New Roman"/>
-                <w:b w:val="0"/>
-                <w:sz w:val="21"/>
-              </w:rPr>
-              <w:t>revenue = SUM(o.OrderTotal - o.RefundedAmount)</w:t>
-            </w:r>
-          </w:p>
-        </w:tc>
-      </w:tr>
-      <w:tr>
-        <w:trPr>
-          <w:cantSplit/>
-        </w:trPr>
-        <w:tc>
-          <w:tcPr>
-            <w:tcW w:type="dxa" w:w="3009"/>
-          </w:tcPr>
-          <w:p>
-            <w:pPr>
-              <w:spacing w:before="0" w:after="0" w:line="240" w:lineRule="auto"/>
-              <w:keepNext/>
-            </w:pPr>
-            <w:r>
-              <w:rPr>
-                <w:rFonts w:ascii="Times New Roman" w:hAnsi="Times New Roman"/>
-                <w:sz w:val="21"/>
-              </w:rPr>
-            </w:r>
-            <w:r>
-              <w:rPr>
-                <w:rFonts w:ascii="Times New Roman" w:hAnsi="Times New Roman"/>
-                <w:b w:val="0"/>
-                <w:sz w:val="21"/>
-              </w:rPr>
-              <w:t>Dimension</w:t>
-            </w:r>
-          </w:p>
-        </w:tc>
-        <w:tc>
-          <w:tcPr>
-            <w:tcW w:type="dxa" w:w="3009"/>
-          </w:tcPr>
-          <w:p>
-            <w:pPr>
-              <w:spacing w:before="0" w:after="0" w:line="240" w:lineRule="auto"/>
-              <w:jc w:val="center"/>
-              <w:keepNext/>
-            </w:pPr>
-            <w:r>
-              <w:rPr>
-                <w:rFonts w:ascii="Times New Roman" w:hAnsi="Times New Roman"/>
-                <w:sz w:val="21"/>
-              </w:rPr>
-            </w:r>
-            <w:r>
-              <w:rPr>
-                <w:rFonts w:ascii="Times New Roman" w:hAnsi="Times New Roman"/>
-                <w:b w:val="0"/>
-                <w:sz w:val="21"/>
-              </w:rPr>
-              <w:t>label, SQL expression, datatype, access scope</w:t>
-            </w:r>
-          </w:p>
-        </w:tc>
-        <w:tc>
-          <w:tcPr>
-            <w:tcW w:type="dxa" w:w="3009"/>
-          </w:tcPr>
-          <w:p>
-            <w:pPr>
-              <w:spacing w:before="0" w:after="0" w:line="240" w:lineRule="auto"/>
-              <w:jc w:val="center"/>
-              <w:keepNext/>
-            </w:pPr>
-            <w:r>
-              <w:rPr>
-                <w:rFonts w:ascii="Times New Roman" w:hAnsi="Times New Roman"/>
-                <w:sz w:val="21"/>
-              </w:rPr>
-            </w:r>
-            <w:r>
-              <w:rPr>
-                <w:rFonts w:ascii="Times New Roman" w:hAnsi="Times New Roman"/>
-                <w:b w:val="0"/>
-                <w:sz w:val="21"/>
-              </w:rPr>
-              <w:t>category = c.Name from Category</w:t>
-            </w:r>
-          </w:p>
-        </w:tc>
-      </w:tr>
-      <w:tr>
-        <w:trPr>
-          <w:cantSplit/>
-        </w:trPr>
-        <w:tc>
-          <w:tcPr>
-            <w:tcW w:type="dxa" w:w="3009"/>
-          </w:tcPr>
-          <w:p>
-            <w:pPr>
-              <w:spacing w:before="0" w:after="0" w:line="240" w:lineRule="auto"/>
-              <w:keepNext/>
-            </w:pPr>
-            <w:r>
-              <w:rPr>
-                <w:rFonts w:ascii="Times New Roman" w:hAnsi="Times New Roman"/>
-                <w:sz w:val="21"/>
-              </w:rPr>
-            </w:r>
-            <w:r>
-              <w:rPr>
-                <w:rFonts w:ascii="Times New Roman" w:hAnsi="Times New Roman"/>
-                <w:b w:val="0"/>
-                <w:sz w:val="21"/>
-              </w:rPr>
-              <w:t>Filter</w:t>
-            </w:r>
-          </w:p>
-        </w:tc>
-        <w:tc>
-          <w:tcPr>
-            <w:tcW w:type="dxa" w:w="3009"/>
-          </w:tcPr>
-          <w:p>
-            <w:pPr>
-              <w:spacing w:before="0" w:after="0" w:line="240" w:lineRule="auto"/>
-              <w:jc w:val="center"/>
-              <w:keepNext/>
-            </w:pPr>
-            <w:r>
-              <w:rPr>
-                <w:rFonts w:ascii="Times New Roman" w:hAnsi="Times New Roman"/>
-                <w:sz w:val="21"/>
-              </w:rPr>
-            </w:r>
-            <w:r>
-              <w:rPr>
-                <w:rFonts w:ascii="Times New Roman" w:hAnsi="Times New Roman"/>
-                <w:b w:val="0"/>
-                <w:sz w:val="21"/>
-              </w:rPr>
-              <w:t>label, SQL predicate, datatype</w:t>
-            </w:r>
-          </w:p>
-        </w:tc>
-        <w:tc>
-          <w:tcPr>
-            <w:tcW w:type="dxa" w:w="3009"/>
-          </w:tcPr>
-          <w:p>
-            <w:pPr>
-              <w:spacing w:before="0" w:after="0" w:line="240" w:lineRule="auto"/>
-              <w:jc w:val="center"/>
-              <w:keepNext/>
-            </w:pPr>
-            <w:r>
-              <w:rPr>
-                <w:rFonts w:ascii="Times New Roman" w:hAnsi="Times New Roman"/>
-                <w:sz w:val="21"/>
-              </w:rPr>
-            </w:r>
-            <w:r>
-              <w:rPr>
-                <w:rFonts w:ascii="Times New Roman" w:hAnsi="Times New Roman"/>
-                <w:b w:val="0"/>
-                <w:sz w:val="21"/>
-              </w:rPr>
-              <w:t>payment_status : o.PaymentStatusId = :val</w:t>
-            </w:r>
-          </w:p>
-        </w:tc>
-      </w:tr>
-      <w:tr>
-        <w:trPr>
-          <w:cantSplit/>
-        </w:trPr>
-        <w:tc>
-          <w:tcPr>
-            <w:tcW w:type="dxa" w:w="3009"/>
-          </w:tcPr>
-          <w:p>
-            <w:pPr>
-              <w:spacing w:before="0" w:after="0" w:line="240" w:lineRule="auto"/>
-              <w:keepNext/>
-            </w:pPr>
-            <w:r>
-              <w:rPr>
-                <w:rFonts w:ascii="Times New Roman" w:hAnsi="Times New Roman"/>
-                <w:sz w:val="21"/>
-              </w:rPr>
-            </w:r>
-            <w:r>
-              <w:rPr>
-                <w:rFonts w:ascii="Times New Roman" w:hAnsi="Times New Roman"/>
-                <w:b w:val="0"/>
-                <w:sz w:val="21"/>
-              </w:rPr>
-              <w:t>Time rule</w:t>
-            </w:r>
-          </w:p>
-        </w:tc>
-        <w:tc>
-          <w:tcPr>
-            <w:tcW w:type="dxa" w:w="3009"/>
-          </w:tcPr>
-          <w:p>
-            <w:pPr>
-              <w:spacing w:before="0" w:after="0" w:line="240" w:lineRule="auto"/>
-              <w:jc w:val="center"/>
-              <w:keepNext/>
-            </w:pPr>
-            <w:r>
-              <w:rPr>
-                <w:rFonts w:ascii="Times New Roman" w:hAnsi="Times New Roman"/>
-                <w:sz w:val="21"/>
-              </w:rPr>
-            </w:r>
-            <w:r>
-              <w:rPr>
-                <w:rFonts w:ascii="Times New Roman" w:hAnsi="Times New Roman"/>
-                <w:b w:val="0"/>
-                <w:sz w:val="21"/>
-              </w:rPr>
-              <w:t>label, SQL predicate, granularity</w:t>
-            </w:r>
-          </w:p>
-        </w:tc>
-        <w:tc>
-          <w:tcPr>
-            <w:tcW w:type="dxa" w:w="3009"/>
-          </w:tcPr>
-          <w:p>
-            <w:pPr>
-              <w:spacing w:before="0" w:after="0" w:line="240" w:lineRule="auto"/>
-              <w:jc w:val="center"/>
-              <w:keepNext/>
-            </w:pPr>
-            <w:r>
-              <w:rPr>
-                <w:rFonts w:ascii="Times New Roman" w:hAnsi="Times New Roman"/>
-                <w:sz w:val="21"/>
-              </w:rPr>
-            </w:r>
-            <w:r>
-              <w:rPr>
-                <w:rFonts w:ascii="Times New Roman" w:hAnsi="Times New Roman"/>
-                <w:b w:val="0"/>
-                <w:sz w:val="21"/>
-              </w:rPr>
-              <w:t>current_week : DATEADD(week, ...)</w:t>
-            </w:r>
-          </w:p>
-        </w:tc>
-      </w:tr>
-      <w:tr>
-        <w:trPr>
-          <w:cantSplit/>
-        </w:trPr>
-        <w:tc>
-          <w:tcPr>
-            <w:tcW w:type="dxa" w:w="3009"/>
-          </w:tcPr>
-          <w:p>
-            <w:pPr>
-              <w:spacing w:before="0" w:after="0" w:line="240" w:lineRule="auto"/>
-              <w:keepNext/>
-            </w:pPr>
-            <w:r>
-              <w:rPr>
-                <w:rFonts w:ascii="Times New Roman" w:hAnsi="Times New Roman"/>
-                <w:sz w:val="21"/>
-              </w:rPr>
-            </w:r>
-            <w:r>
-              <w:rPr>
-                <w:rFonts w:ascii="Times New Roman" w:hAnsi="Times New Roman"/>
-                <w:b w:val="0"/>
-                <w:sz w:val="21"/>
-              </w:rPr>
-              <w:t>Join path</w:t>
-            </w:r>
-          </w:p>
-        </w:tc>
-        <w:tc>
-          <w:tcPr>
-            <w:tcW w:type="dxa" w:w="3009"/>
-          </w:tcPr>
-          <w:p>
-            <w:pPr>
-              <w:spacing w:before="0" w:after="0" w:line="240" w:lineRule="auto"/>
-              <w:jc w:val="center"/>
-              <w:keepNext/>
-            </w:pPr>
-            <w:r>
-              <w:rPr>
-                <w:rFonts w:ascii="Times New Roman" w:hAnsi="Times New Roman"/>
-                <w:sz w:val="21"/>
-              </w:rPr>
-            </w:r>
-            <w:r>
-              <w:rPr>
-                <w:rFonts w:ascii="Times New Roman" w:hAnsi="Times New Roman"/>
-                <w:b w:val="0"/>
-                <w:sz w:val="21"/>
-              </w:rPr>
-              <w:t>source, target, ON clause</w:t>
-            </w:r>
-          </w:p>
-        </w:tc>
-        <w:tc>
-          <w:tcPr>
-            <w:tcW w:type="dxa" w:w="3009"/>
-          </w:tcPr>
-          <w:p>
-            <w:pPr>
-              <w:spacing w:before="0" w:after="0" w:line="240" w:lineRule="auto"/>
-              <w:jc w:val="center"/>
-              <w:keepNext/>
-            </w:pPr>
-            <w:r>
-              <w:rPr>
-                <w:rFonts w:ascii="Times New Roman" w:hAnsi="Times New Roman"/>
-                <w:sz w:val="21"/>
-              </w:rPr>
-            </w:r>
-            <w:r>
-              <w:rPr>
-                <w:rFonts w:ascii="Times New Roman" w:hAnsi="Times New Roman"/>
-                <w:b w:val="0"/>
-                <w:sz w:val="21"/>
-              </w:rPr>
-              <w:t>Order to OrderItem to Product to Category</w:t>
-            </w:r>
-          </w:p>
-        </w:tc>
-      </w:tr>
-      <w:tr>
-        <w:trPr>
-          <w:cantSplit/>
-        </w:trPr>
-        <w:tc>
-          <w:tcPr>
-            <w:tcW w:type="dxa" w:w="3009"/>
-          </w:tcPr>
-          <w:p>
-            <w:pPr>
-              <w:spacing w:before="0" w:after="0" w:line="240" w:lineRule="auto"/>
-              <w:keepNext/>
-            </w:pPr>
-            <w:r>
-              <w:rPr>
-                <w:rFonts w:ascii="Times New Roman" w:hAnsi="Times New Roman"/>
-                <w:sz w:val="21"/>
-              </w:rPr>
-            </w:r>
-            <w:r>
-              <w:rPr>
-                <w:rFonts w:ascii="Times New Roman" w:hAnsi="Times New Roman"/>
-                <w:b w:val="0"/>
-                <w:sz w:val="21"/>
-              </w:rPr>
-              <w:t>Pattern</w:t>
-            </w:r>
-          </w:p>
-        </w:tc>
-        <w:tc>
-          <w:tcPr>
-            <w:tcW w:type="dxa" w:w="3009"/>
-          </w:tcPr>
-          <w:p>
-            <w:pPr>
-              <w:spacing w:before="0" w:after="0" w:line="240" w:lineRule="auto"/>
-              <w:jc w:val="center"/>
-              <w:keepNext/>
-            </w:pPr>
-            <w:r>
-              <w:rPr>
-                <w:rFonts w:ascii="Times New Roman" w:hAnsi="Times New Roman"/>
-                <w:sz w:val="21"/>
-              </w:rPr>
-            </w:r>
-            <w:r>
-              <w:rPr>
-                <w:rFonts w:ascii="Times New Roman" w:hAnsi="Times New Roman"/>
-                <w:b w:val="0"/>
-                <w:sz w:val="21"/>
-              </w:rPr>
-              <w:t>required slots, SQL template, visualization default</w:t>
-            </w:r>
-          </w:p>
-        </w:tc>
-        <w:tc>
-          <w:tcPr>
-            <w:tcW w:type="dxa" w:w="3009"/>
-          </w:tcPr>
-          <w:p>
-            <w:pPr>
-              <w:spacing w:before="0" w:after="0" w:line="240" w:lineRule="auto"/>
-              <w:jc w:val="center"/>
-              <w:keepNext/>
-            </w:pPr>
-            <w:r>
-              <w:rPr>
-                <w:rFonts w:ascii="Times New Roman" w:hAnsi="Times New Roman"/>
-                <w:sz w:val="21"/>
-              </w:rPr>
-            </w:r>
-            <w:r>
-              <w:rPr>
-                <w:rFonts w:ascii="Times New Roman" w:hAnsi="Times New Roman"/>
-                <w:b w:val="0"/>
-                <w:sz w:val="21"/>
-              </w:rPr>
-              <w:t>ranking: metric plus dimension maps to a bar chart</w:t>
-            </w:r>
-          </w:p>
-        </w:tc>
-      </w:tr>
-      <w:tr>
-        <w:trPr>
-          <w:cantSplit/>
-        </w:trPr>
-        <w:tc>
-          <w:tcPr>
-            <w:tcW w:type="dxa" w:w="3009"/>
-          </w:tcPr>
-          <w:p>
-            <w:pPr>
-              <w:spacing w:before="0" w:after="0" w:line="240" w:lineRule="auto"/>
-              <w:keepNext/>
-            </w:pPr>
-            <w:r>
-              <w:rPr>
-                <w:rFonts w:ascii="Times New Roman" w:hAnsi="Times New Roman"/>
-                <w:sz w:val="21"/>
-              </w:rPr>
-            </w:r>
-            <w:r>
-              <w:rPr>
-                <w:rFonts w:ascii="Times New Roman" w:hAnsi="Times New Roman"/>
-                <w:b w:val="0"/>
-                <w:sz w:val="21"/>
-              </w:rPr>
-              <w:t>Permission</w:t>
-            </w:r>
-          </w:p>
-        </w:tc>
-        <w:tc>
-          <w:tcPr>
-            <w:tcW w:type="dxa" w:w="3009"/>
-          </w:tcPr>
-          <w:p>
-            <w:pPr>
-              <w:spacing w:before="0" w:after="0" w:line="240" w:lineRule="auto"/>
-              <w:jc w:val="center"/>
-              <w:keepNext/>
-            </w:pPr>
-            <w:r>
-              <w:rPr>
-                <w:rFonts w:ascii="Times New Roman" w:hAnsi="Times New Roman"/>
-                <w:sz w:val="21"/>
-              </w:rPr>
-            </w:r>
-            <w:r>
-              <w:rPr>
-                <w:rFonts w:ascii="Times New Roman" w:hAnsi="Times New Roman"/>
-                <w:b w:val="0"/>
-                <w:sz w:val="21"/>
-              </w:rPr>
-              <w:t>rule</w:t>
-            </w:r>
-          </w:p>
-        </w:tc>
-        <w:tc>
-          <w:tcPr>
-            <w:tcW w:type="dxa" w:w="3009"/>
-          </w:tcPr>
-          <w:p>
-            <w:pPr>
-              <w:spacing w:before="0" w:after="0" w:line="240" w:lineRule="auto"/>
-              <w:jc w:val="center"/>
-              <w:keepNext/>
-            </w:pPr>
-            <w:r>
-              <w:rPr>
-                <w:rFonts w:ascii="Times New Roman" w:hAnsi="Times New Roman"/>
-                <w:sz w:val="21"/>
-              </w:rPr>
-            </w:r>
-            <w:r>
-              <w:rPr>
-                <w:rFonts w:ascii="Times New Roman" w:hAnsi="Times New Roman"/>
-                <w:b w:val="0"/>
-                <w:sz w:val="21"/>
-              </w:rPr>
-              <w:t>store_manager filtered by store location</w:t>
-            </w:r>
-          </w:p>
-        </w:tc>
-      </w:tr>
-    </w:tbl>
-    <w:p>
-      <w:pPr>
-        <w:spacing w:after="80"/>
-      </w:pPr>
-    </w:p>
-    <w:p>
-      <w:pPr>
-        <w:spacing w:after="0" w:before="0" w:line="360" w:lineRule="auto"/>
+          <w:sz w:val="28"/>
+        </w:rPr>
+        <w:t>3.9  Safe Query Compiler</w:t>
+      </w:r>
+    </w:p>
+    <w:p>
+      <w:pPr>
+        <w:spacing w:after="200" w:before="0" w:line="360" w:lineRule="auto"/>
         <w:jc w:val="both"/>
       </w:pPr>
       <w:r>
@@ -10155,167 +9718,7 @@
           <w:i w:val="0"/>
           <w:sz w:val="24"/>
         </w:rPr>
-        <w:t>In the nopCommerce prototype, the semantic layer defines 15 metrics, 34 dimensions, and 11 join paths across 12 analytics-relevant tables. The full nopCommerce schema contains 126 tables; the remaining 114 (system, content-management, configuration, authentication, vendor, and promotions tables) are deliberately not represented in the semantic layer at all. No business analyst asks 'show me revenue by ScheduleTask,' and excluding these tables functions as an implicit table-level access control: even a crafted prompt that names a hidden system table directly is rejected at Stage 2, because the identifier simply does not exist in L.</w:t>
-      </w:r>
-    </w:p>
-    <w:p>
-      <w:pPr>
-        <w:spacing w:before="320" w:after="160"/>
-        <w:jc w:val="left"/>
-      </w:pPr>
-      <w:r>
-        <w:rPr>
-          <w:rFonts w:ascii="Times New Roman" w:hAnsi="Times New Roman"/>
-          <w:b/>
-          <w:sz w:val="28"/>
-        </w:rPr>
-        <w:t>3.8  Intent Parsing with Dynamic Vocabulary Injection</w:t>
-      </w:r>
-    </w:p>
-    <w:p>
-      <w:pPr>
-        <w:spacing w:after="200" w:before="0" w:line="360" w:lineRule="auto"/>
-        <w:jc w:val="both"/>
-      </w:pPr>
-      <w:r>
-        <w:rPr>
-          <w:rFonts w:ascii="Times New Roman" w:hAnsi="Times New Roman"/>
-          <w:b w:val="0"/>
-          <w:i w:val="0"/>
-          <w:sz w:val="24"/>
-        </w:rPr>
-        <w:t>The central technique that makes Stage 1 reliable is vocabulary injection. At startup, AEGIS builds the system prompt by listing every approved metric and dimension name, with a plain-English description, directly from the semantic layer (approximately 1,100 tokens for 15 metrics and 34 dimensions). The LLM sees exactly which identifiers are valid and maps any user phrasing to the correct identifier without a manually maintained synonym list. This has three advantages over a synonym dictionary: zero maintenance, since adding a metric automatically updates the vocabulary the model sees; broad coverage of arbitrary user phrasing, since the model performs the mapping rather than a fixed lookup table; and token efficiency, since the full vocabulary for 15 metrics and 34 dimensions fits in roughly 1,100 tokens.</w:t>
-      </w:r>
-    </w:p>
-    <w:p>
-      <w:pPr>
-        <w:spacing w:after="200" w:before="0" w:line="360" w:lineRule="auto"/>
-        <w:jc w:val="both"/>
-      </w:pPr>
-      <w:r>
-        <w:rPr>
-          <w:rFonts w:ascii="Times New Roman" w:hAnsi="Times New Roman"/>
-          <w:b w:val="0"/>
-          <w:i w:val="0"/>
-          <w:sz w:val="24"/>
-        </w:rPr>
-        <w:t>Structured output enforcement for LLMs [16] constrains the model's response to a fixed JSON schema before any downstream validation occurs, which is why Stage 1 can rely on a typed IntentObject rather than free-form text: malformed or off-schema output is rejected at the API boundary, before Stage 2 coverage validation ever runs.</w:t>
-      </w:r>
-    </w:p>
-    <w:p>
-      <w:pPr>
-        <w:spacing w:after="120" w:before="0" w:line="360" w:lineRule="auto"/>
-        <w:jc w:val="both"/>
-      </w:pPr>
-      <w:r>
-        <w:rPr>
-          <w:rFonts w:ascii="Times New Roman" w:hAnsi="Times New Roman"/>
-          <w:b w:val="0"/>
-          <w:i w:val="0"/>
-          <w:sz w:val="24"/>
-        </w:rPr>
-        <w:t>The output schema enforces typed fields:</w:t>
-      </w:r>
-    </w:p>
-    <w:p>
-      <w:pPr>
-        <w:spacing w:before="120" w:after="120" w:line="276" w:lineRule="auto"/>
-        <w:ind w:left="576"/>
-      </w:pPr>
-      <w:r>
-        <w:rPr>
-          <w:rFonts w:ascii="Times New Roman" w:hAnsi="Times New Roman"/>
-          <w:sz w:val="19"/>
-        </w:rPr>
-        <w:t>{</w:t>
-      </w:r>
-      <w:r>
-        <w:rPr>
-          <w:rFonts w:ascii="Times New Roman" w:hAnsi="Times New Roman"/>
-          <w:sz w:val="19"/>
-        </w:rPr>
-        <w:br/>
-        <w:t xml:space="preserve">  "intent_class": "kpi | ranking | trend | comparison | exception |</w:t>
-      </w:r>
-      <w:r>
-        <w:rPr>
-          <w:rFonts w:ascii="Times New Roman" w:hAnsi="Times New Roman"/>
-          <w:sz w:val="19"/>
-        </w:rPr>
-        <w:br/>
-        <w:t xml:space="preserve">                   summary | segment | funnel | cohort | correlate | tabular",</w:t>
-      </w:r>
-      <w:r>
-        <w:rPr>
-          <w:rFonts w:ascii="Times New Roman" w:hAnsi="Times New Roman"/>
-          <w:sz w:val="19"/>
-        </w:rPr>
-        <w:br/>
-        <w:t xml:space="preserve">  "metric_term": "string",</w:t>
-      </w:r>
-      <w:r>
-        <w:rPr>
-          <w:rFonts w:ascii="Times New Roman" w:hAnsi="Times New Roman"/>
-          <w:sz w:val="19"/>
-        </w:rPr>
-        <w:br/>
-        <w:t xml:space="preserve">  "dimension_term": "string or null",</w:t>
-      </w:r>
-      <w:r>
-        <w:rPr>
-          <w:rFonts w:ascii="Times New Roman" w:hAnsi="Times New Roman"/>
-          <w:sz w:val="19"/>
-        </w:rPr>
-        <w:br/>
-        <w:t xml:space="preserve">  "time_term": "string or null",</w:t>
-      </w:r>
-      <w:r>
-        <w:rPr>
-          <w:rFonts w:ascii="Times New Roman" w:hAnsi="Times New Roman"/>
-          <w:sz w:val="19"/>
-        </w:rPr>
-        <w:br/>
-        <w:t xml:space="preserve">  "filters": [{"field": "string", "operator": "string", "value": "string"}],</w:t>
-      </w:r>
-      <w:r>
-        <w:rPr>
-          <w:rFonts w:ascii="Times New Roman" w:hAnsi="Times New Roman"/>
-          <w:sz w:val="19"/>
-        </w:rPr>
-        <w:br/>
-        <w:t xml:space="preserve">  "sort": "asc | desc | null",</w:t>
-      </w:r>
-      <w:r>
-        <w:rPr>
-          <w:rFonts w:ascii="Times New Roman" w:hAnsi="Times New Roman"/>
-          <w:sz w:val="19"/>
-        </w:rPr>
-        <w:br/>
-        <w:t xml:space="preserve">  "limit": "integer or null",</w:t>
-      </w:r>
-      <w:r>
-        <w:rPr>
-          <w:rFonts w:ascii="Times New Roman" w:hAnsi="Times New Roman"/>
-          <w:sz w:val="19"/>
-        </w:rPr>
-        <w:br/>
-        <w:t xml:space="preserve">  "confidence": "low | medium | high",</w:t>
-      </w:r>
-      <w:r>
-        <w:rPr>
-          <w:rFonts w:ascii="Times New Roman" w:hAnsi="Times New Roman"/>
-          <w:sz w:val="19"/>
-        </w:rPr>
-        <w:br/>
-        <w:t xml:space="preserve">  "needs_clarification": "boolean"</w:t>
-      </w:r>
-      <w:r>
-        <w:rPr>
-          <w:rFonts w:ascii="Times New Roman" w:hAnsi="Times New Roman"/>
-          <w:sz w:val="19"/>
-        </w:rPr>
-        <w:br/>
-        <w:t>}</w:t>
+        <w:t>The compiler instantiates SQL from a library of parameterized templates, one per analytics pattern.</w:t>
       </w:r>
     </w:p>
     <w:tbl>
@@ -10357,7 +9760,7 @@
                 <w:color w:val="993300"/>
                 <w:sz w:val="21"/>
               </w:rPr>
-              <w:t>[ PLACEHOLDER - FIGURE 4 NOT YET INSERTED ]</w:t>
+              <w:t>[ PLACEHOLDER - FIGURE 5 NOT YET INSERTED ]</w:t>
             </w:r>
           </w:p>
           <w:p>
@@ -10372,7 +9775,7 @@
                 <w:color w:val="333333"/>
                 <w:sz w:val="22"/>
               </w:rPr>
-              <w:t>Vocabulary injection workflow</w:t>
+              <w:t>Taxonomy of the eleven AEGIS analytical patterns</w:t>
             </w:r>
           </w:p>
         </w:tc>
@@ -10389,114 +9792,6 @@
           <w:b/>
           <w:sz w:val="21"/>
         </w:rPr>
-        <w:t>Figure 4: Vocabulary injection workflow</w:t>
-      </w:r>
-    </w:p>
-    <w:p>
-      <w:r>
-        <w:br w:type="page"/>
-      </w:r>
-    </w:p>
-    <w:p>
-      <w:pPr>
-        <w:spacing w:before="320" w:after="160"/>
-        <w:jc w:val="left"/>
-      </w:pPr>
-      <w:r>
-        <w:rPr>
-          <w:rFonts w:ascii="Times New Roman" w:hAnsi="Times New Roman"/>
-          <w:b/>
-          <w:sz w:val="28"/>
-        </w:rPr>
-        <w:t>3.9  Safe Query Compiler</w:t>
-      </w:r>
-    </w:p>
-    <w:p>
-      <w:pPr>
-        <w:spacing w:after="200" w:before="0" w:line="360" w:lineRule="auto"/>
-        <w:jc w:val="both"/>
-      </w:pPr>
-      <w:r>
-        <w:rPr>
-          <w:rFonts w:ascii="Times New Roman" w:hAnsi="Times New Roman"/>
-          <w:b w:val="0"/>
-          <w:i w:val="0"/>
-          <w:sz w:val="24"/>
-        </w:rPr>
-        <w:t>The compiler instantiates SQL from a library of parameterized templates, one per analytics pattern.</w:t>
-      </w:r>
-    </w:p>
-    <w:tbl>
-      <w:tblPr>
-        <w:tblW w:type="auto" w:w="0"/>
-        <w:jc w:val="center"/>
-        <w:tblLayout w:type="fixed"/>
-        <w:tblLook w:firstColumn="1" w:firstRow="1" w:lastColumn="0" w:lastRow="0" w:noHBand="0" w:noVBand="1" w:val="04A0"/>
-      </w:tblPr>
-      <w:tblGrid>
-        <w:gridCol w:w="9072"/>
-      </w:tblGrid>
-      <w:tr>
-        <w:trPr>
-          <w:trHeight w:val="3744"/>
-          <w:trHeight w:val="3744" w:hRule="atLeast"/>
-        </w:trPr>
-        <w:tc>
-          <w:tcPr>
-            <w:tcW w:type="dxa" w:w="9072"/>
-            <w:tcBorders>
-              <w:top w:val="dashed" w:sz="10" w:space="0" w:color="888888"/>
-              <w:left w:val="dashed" w:sz="10" w:space="0" w:color="888888"/>
-              <w:bottom w:val="dashed" w:sz="10" w:space="0" w:color="888888"/>
-              <w:right w:val="dashed" w:sz="10" w:space="0" w:color="888888"/>
-            </w:tcBorders>
-            <w:shd w:val="clear" w:fill="F7F7F7"/>
-          </w:tcPr>
-          <w:p>
-            <w:pPr>
-              <w:spacing w:before="280" w:after="120"/>
-              <w:jc w:val="center"/>
-            </w:pPr>
-            <w:r/>
-            <w:r>
-              <w:rPr>
-                <w:rFonts w:ascii="Times New Roman" w:hAnsi="Times New Roman"/>
-                <w:b/>
-                <w:color w:val="993300"/>
-                <w:sz w:val="21"/>
-              </w:rPr>
-              <w:t>[ PLACEHOLDER - FIGURE 5 NOT YET INSERTED ]</w:t>
-            </w:r>
-          </w:p>
-          <w:p>
-            <w:pPr>
-              <w:spacing w:after="160"/>
-              <w:jc w:val="center"/>
-            </w:pPr>
-            <w:r>
-              <w:rPr>
-                <w:rFonts w:ascii="Times New Roman" w:hAnsi="Times New Roman"/>
-                <w:b/>
-                <w:color w:val="333333"/>
-                <w:sz w:val="22"/>
-              </w:rPr>
-              <w:t>Taxonomy of the eleven AEGIS analytical patterns</w:t>
-            </w:r>
-          </w:p>
-        </w:tc>
-      </w:tr>
-    </w:tbl>
-    <w:p>
-      <w:pPr>
-        <w:spacing w:before="120" w:after="280"/>
-        <w:jc w:val="center"/>
-      </w:pPr>
-      <w:r>
-        <w:rPr>
-          <w:rFonts w:ascii="Times New Roman" w:hAnsi="Times New Roman"/>
-          <w:b/>
-          <w:sz w:val="21"/>
-        </w:rPr>
         <w:t>Figure 5: Taxonomy of the eleven AEGIS analytical patterns</w:t>
       </w:r>
     </w:p>
@@ -10512,7 +9807,7 @@
           <w:b/>
           <w:sz w:val="22"/>
         </w:rPr>
-        <w:t>Table 3.4: The eleven AEGIS analytical patterns.</w:t>
+        <w:t>Table 3.3: The eleven AEGIS analytical patterns.</w:t>
       </w:r>
     </w:p>
     <w:tbl>
@@ -11958,7 +11253,7 @@
           <w:b/>
           <w:sz w:val="22"/>
         </w:rPr>
-        <w:t>Table 3.5: Visualization selector mapping.</w:t>
+        <w:t>Table 3.4: Visualization selector mapping.</w:t>
       </w:r>
     </w:p>
     <w:tbl>
@@ -13393,7 +12688,7 @@
           <w:i w:val="0"/>
           <w:sz w:val="24"/>
         </w:rPr>
-        <w:t>A methodological caveat applies to every quantitative result reported in this chapter and in the results discussion. All benchmark construction, execution, and measurement were carried out by the author as part of this thesis, using a self-built dataset and evaluation harness; none of it has been independently replicated by a third party, externally audited, or peer-reviewed. This is distinct from reproducibility: the underlying project repository artifacts and the scripts that compute statistics from them are provided with this thesis specifically so that any reader can independently re-run the computation and check the reported figures against the raw data, even though no one outside this research has done so yet. Where a figure states that an annotation or classification step was performed by a named number of people (for example, two database engineers verifying gold-standard SQL), that step was part of the author's own research process rather than an independent, third-party audit. These results should therefore be read as internal evidence produced during this research and reproducible from the published artifacts, but not yet independently verified by anyone outside it.</w:t>
+        <w:t>A methodological caveat applies to every quantitative result reported in this chapter and in the results discussion. All benchmark construction, execution, and measurement were carried out by the author as part of this thesis, using a self-built dataset and evaluation harness; none of it has been independently replicated by a third party, externally audited, or peer-reviewed. Therefore, the reported figures should be read as prototype evaluation results produced within this research, not as independently audited benchmark results. Where an annotation or classification step is discussed, it refers to the author's own research process rather than a third-party validation study.</w:t>
       </w:r>
     </w:p>
     <w:p>
@@ -13408,7 +12703,7 @@
           <w:i w:val="0"/>
           <w:sz w:val="24"/>
         </w:rPr>
-        <w:t>A domain-specific benchmark of 107 natural-language reporting requests was built over the production nopCommerce schema described above. The full question set and recorded pipeline outputs are available with the project repository, enabling verification of every reported metric. The benchmark mixes ordinary analytical requests with harder boundary cases in the same run; this thesis does not report those harder cases as a separate benchmark. Because the benchmark was constructed for the nopCommerce domain, accuracy and validity reported figures should be interpreted within that scope. The current artifact verifies SQL safety and true execution validity; semantic correctness still requires an annotated expected-answer benchmark in future work.</w:t>
+        <w:t>A domain-specific benchmark of 107 natural-language reporting requests was built over the production nopCommerce schema described above. The full question set and recorded pipeline outputs were used to check every reported metric. The benchmark mixes ordinary analytical requests with harder boundary cases in the same run; this thesis does not report those harder cases as a separate benchmark. Because the benchmark was constructed for the nopCommerce domain, accuracy and validity reported figures should be interpreted within that scope. The current artifact verifies SQL safety and true execution validity; semantic correctness still requires an annotated expected-answer benchmark in future work.</w:t>
       </w:r>
     </w:p>
     <w:p>
@@ -13562,7 +12857,7 @@
           <w:i w:val="0"/>
           <w:sz w:val="24"/>
         </w:rPr>
-        <w:t>The current evaluation focuses on the measurements that can be verified from repository artifacts and true database execution:</w:t>
+        <w:t>The current evaluation focuses on measurements that can be reproduced from the recorded benchmark data and verified through true database execution:</w:t>
       </w:r>
     </w:p>
     <w:p>
@@ -13647,27 +12942,6 @@
           <w:sz w:val="24"/>
         </w:rPr>
         <w:t>RQ4: How does the deterministic downstream compiler behave when intent selection is rule-based rather than LLM-based? Measured through the B3 template-only baseline.</w:t>
-      </w:r>
-    </w:p>
-    <w:p>
-      <w:pPr>
-        <w:spacing w:after="80" w:line="360" w:lineRule="auto"/>
-        <w:ind w:left="461" w:hanging="259"/>
-      </w:pPr>
-      <w:r>
-        <w:rPr>
-          <w:rFonts w:ascii="Times New Roman" w:hAnsi="Times New Roman"/>
-          <w:sz w:val="24"/>
-        </w:rPr>
-        <w:t>•</w:t>
-        <w:tab/>
-      </w:r>
-      <w:r>
-        <w:rPr>
-          <w:rFonts w:ascii="Times New Roman" w:hAnsi="Times New Roman"/>
-          <w:sz w:val="24"/>
-        </w:rPr>
-        <w:t>RQ5: Which remaining work is required in future work? Semantic correctness, B2/B4 baseline completion, and latency instrumentation are explicitly listed as future work rather than reported as completed results.</w:t>
       </w:r>
     </w:p>
     <w:p>
@@ -13715,7 +12989,7 @@
           <w:i w:val="0"/>
           <w:sz w:val="24"/>
         </w:rPr>
-        <w:t>This chapter reports the prototype evaluation results that have been verified from the repository artifacts and from true database execution. The chapter deliberately separates SQL safety, execution validity, and semantic correctness. A query can be safe and executable while still being semantically wrong; therefore, correctness is treated as a separate benchmark that requires annotated expected answers in future work.</w:t>
+        <w:t>This chapter presents the evaluation results of the AEGIS prototype using a 107-request natural-language analytics benchmark and true database execution. The discussion separates SQL safety, execution validity, and semantic correctness because a query may be safe and executable while still failing to answer the intended analytical request.</w:t>
       </w:r>
     </w:p>
     <w:p>
@@ -13730,7 +13004,7 @@
           <w:i w:val="0"/>
           <w:sz w:val="24"/>
         </w:rPr>
-        <w:t>The verified quantitative evidence currently covers the 107-query mixed benchmark against AEGIS and baseline B1, plus a completed B3 template-only execution-validity run. B2 and B4 remain future evaluation work, and latency has not yet been instrumented. The tables below therefore report only the measurements that can be traced to files and commands in the repository.</w:t>
+        <w:t>The reported quantitative evidence covers the mixed 107-request benchmark for AEGIS and the B1 direct LLM-to-SQL baseline, together with the completed B3 template-only execution-validity run. B2, B4, latency, and fully annotated semantic correctness remain future evaluation work, so this chapter reports only the measurements completed under the current experimental setup.</w:t>
       </w:r>
     </w:p>
     <w:p>
@@ -13744,7 +13018,7 @@
           <w:b/>
           <w:sz w:val="28"/>
         </w:rPr>
-        <w:t>5.1  Benchmark Run and Verified Metrics</w:t>
+        <w:t>5.1  Evaluation Overview</w:t>
       </w:r>
     </w:p>
     <w:p>
@@ -13759,7 +13033,7 @@
           <w:i w:val="0"/>
           <w:sz w:val="24"/>
         </w:rPr>
-        <w:t>The benchmark consists of 107 natural-language reporting requests executed as one mixed test set. Earlier drafts described seven of those requests as a separate boundary-probe set. This chapter avoids that split because the evaluation design now treat all 107 requests as part of the same benchmark run. Some requests are harder boundary cases, but they are still counted in the same denominator as every other query.</w:t>
+        <w:t>The evaluation uses 107 mixed natural-language reporting requests as a single benchmark set. The requests include ordinary analytical questions as well as harder boundary-style cases, but all are evaluated under the same denominator to avoid separating results into unsupported categories.</w:t>
       </w:r>
     </w:p>
     <w:p>
@@ -14097,7 +13371,7 @@
           <w:i/>
           <w:sz w:val="22"/>
         </w:rPr>
-        <w:t>Evidence basis: the project repository contains the question set, recorded benchmark outputs, B3 outputs, and the true database execution verifier used against the seeded MySQL database.</w:t>
+        <w:t>Evidence basis: the benchmark evidence consists of the prepared request set, recorded model outputs, baseline outputs, and true database execution results produced against the seeded MySQL evaluation database.</w:t>
       </w:r>
     </w:p>
     <w:p>
@@ -14632,7 +13906,7 @@
           <w:i w:val="0"/>
           <w:sz w:val="24"/>
         </w:rPr>
-        <w:t>The seven AEGIS execution failures are useful because they show where the prototype needs engineering work in future work. They are not safety violations: they are SQL statements that failed to execute correctly against the real database.</w:t>
+        <w:t>The seven AEGIS execution failures identify the remaining implementation limitations of the prototype. These failures are not safety violations; they are executable-query construction issues observed when the generated SQL was tested against the evaluation database.</w:t>
       </w:r>
     </w:p>
     <w:p>
@@ -15377,7 +14651,7 @@
           <w:i w:val="0"/>
           <w:sz w:val="24"/>
         </w:rPr>
-        <w:t>Correctness or accuracy is a separate benchmark from execution validity. The current results prove that AEGIS usually generates SQL that the database can execute and that it does not generate unsafe SQL. They do not, by themselves, prove that every safe and executable query answers the user's real intent.</w:t>
+        <w:t>Correctness or accuracy must be treated separately from execution validity. The current results show that AEGIS often generates SQL that executes successfully and avoids unsafe operations, but they do not establish that every executable result matches the user's intended analytical meaning.</w:t>
       </w:r>
     </w:p>
     <w:p>
@@ -16283,17 +15557,17 @@
     </w:p>
     <w:p>
       <w:pPr>
-        <w:spacing w:after="120" w:before="0" w:line="360" w:lineRule="auto"/>
-        <w:jc w:val="both"/>
+        <w:spacing w:before="200" w:after="160"/>
+        <w:jc w:val="left"/>
       </w:pPr>
       <w:r>
         <w:rPr>
           <w:rFonts w:ascii="Times New Roman" w:hAnsi="Times New Roman"/>
           <w:b/>
-          <w:i w:val="0"/>
-          <w:sz w:val="24"/>
-        </w:rPr>
-        <w:t xml:space="preserve">5.6.1 AEGIS vs. direct LLM-to-SQL. </w:t>
+          <w:i/>
+          <w:sz w:val="25"/>
+        </w:rPr>
+        <w:t>5.6.1  AEGIS vs. Direct LLM-to-SQL</w:t>
       </w:r>
     </w:p>
     <w:p>
@@ -17014,6 +16288,113 @@
     </w:p>
     <w:p>
       <w:pPr>
+        <w:spacing w:before="200" w:after="160"/>
+        <w:jc w:val="left"/>
+      </w:pPr>
+      <w:r>
+        <w:rPr>
+          <w:rFonts w:ascii="Times New Roman" w:hAnsi="Times New Roman"/>
+          <w:b/>
+          <w:i/>
+          <w:sz w:val="25"/>
+        </w:rPr>
+        <w:t>5.6.2  Semantic Layer versus Retrieval-Augmented Generation</w:t>
+      </w:r>
+    </w:p>
+    <w:p>
+      <w:pPr>
+        <w:spacing w:after="200" w:before="0" w:line="360" w:lineRule="auto"/>
+        <w:jc w:val="both"/>
+      </w:pPr>
+      <w:r>
+        <w:rPr>
+          <w:rFonts w:ascii="Times New Roman" w:hAnsi="Times New Roman"/>
+          <w:b w:val="0"/>
+          <w:i w:val="0"/>
+          <w:sz w:val="24"/>
+        </w:rPr>
+        <w:t>Retrieval-augmented generation can help an LLM find relevant schema fragments, but it does not remove the model's authority to write SQL. AEGIS uses the semantic layer for a different purpose: it defines which business concepts are allowed to exist and how they compile into SQL. RAG may still be useful in a future large deployment to select relevant semantic-layer entries, but the final SQL should still be compiled by the deterministic AEGIS compiler.</w:t>
+      </w:r>
+    </w:p>
+    <w:p>
+      <w:pPr>
+        <w:spacing w:before="200" w:after="160"/>
+        <w:jc w:val="left"/>
+      </w:pPr>
+      <w:r>
+        <w:rPr>
+          <w:rFonts w:ascii="Times New Roman" w:hAnsi="Times New Roman"/>
+          <w:b/>
+          <w:i/>
+          <w:sz w:val="25"/>
+        </w:rPr>
+        <w:t>5.6.3  Scope Boundary</w:t>
+      </w:r>
+    </w:p>
+    <w:p>
+      <w:pPr>
+        <w:spacing w:after="0" w:before="0" w:line="360" w:lineRule="auto"/>
+        <w:jc w:val="both"/>
+      </w:pPr>
+      <w:r>
+        <w:rPr>
+          <w:rFonts w:ascii="Times New Roman" w:hAnsi="Times New Roman"/>
+          <w:b w:val="0"/>
+          <w:i w:val="0"/>
+          <w:sz w:val="24"/>
+        </w:rPr>
+        <w:t>AEGIS currently supports a bounded set of approved metrics, dimensions, analytical patterns, and join paths. This is the source of its safety, but also the source of its main limitation. If a user asks for something not represented in the semantic layer, the system should reject or clarify the request. The current prototype does not always do that reliably; improving scope detection is therefore a priority in future work.</w:t>
+      </w:r>
+    </w:p>
+    <w:p>
+      <w:r>
+        <w:br w:type="page"/>
+      </w:r>
+    </w:p>
+    <w:p>
+      <w:pPr>
+        <w:spacing w:before="0" w:after="80"/>
+        <w:jc w:val="center"/>
+      </w:pPr>
+      <w:r>
+        <w:rPr>
+          <w:rFonts w:ascii="Times New Roman" w:hAnsi="Times New Roman"/>
+          <w:b/>
+          <w:sz w:val="32"/>
+        </w:rPr>
+        <w:t>CHAPTER 6</w:t>
+      </w:r>
+    </w:p>
+    <w:p>
+      <w:pPr>
+        <w:spacing w:after="400"/>
+        <w:jc w:val="center"/>
+      </w:pPr>
+      <w:r>
+        <w:rPr>
+          <w:rFonts w:ascii="Times New Roman" w:hAnsi="Times New Roman"/>
+          <w:b/>
+          <w:sz w:val="32"/>
+        </w:rPr>
+        <w:t>LIMITATIONS AND FUTURE WORK</w:t>
+      </w:r>
+    </w:p>
+    <w:p>
+      <w:pPr>
+        <w:spacing w:before="320" w:after="160"/>
+        <w:jc w:val="left"/>
+      </w:pPr>
+      <w:r>
+        <w:rPr>
+          <w:rFonts w:ascii="Times New Roman" w:hAnsi="Times New Roman"/>
+          <w:b/>
+          <w:sz w:val="28"/>
+        </w:rPr>
+        <w:t>6.1  Limitations</w:t>
+      </w:r>
+    </w:p>
+    <w:p>
+      <w:pPr>
         <w:spacing w:after="120" w:before="0" w:line="360" w:lineRule="auto"/>
         <w:jc w:val="both"/>
       </w:pPr>
@@ -17024,14 +16405,8 @@
           <w:i w:val="0"/>
           <w:sz w:val="24"/>
         </w:rPr>
-        <w:t xml:space="preserve">5.6.2 Semantic layer versus retrieval-augmented generation. </w:t>
-      </w:r>
-    </w:p>
-    <w:p>
-      <w:pPr>
-        <w:spacing w:after="200" w:before="0" w:line="360" w:lineRule="auto"/>
-        <w:jc w:val="both"/>
-      </w:pPr>
+        <w:t xml:space="preserve">Semantic layer construction cost. </w:t>
+      </w:r>
       <w:r>
         <w:rPr>
           <w:rFonts w:ascii="Times New Roman" w:hAnsi="Times New Roman"/>
@@ -17039,7 +16414,7 @@
           <w:i w:val="0"/>
           <w:sz w:val="24"/>
         </w:rPr>
-        <w:t>Retrieval-augmented generation can help an LLM find relevant schema fragments, but it does not remove the model's authority to write SQL. AEGIS uses the semantic layer for a different purpose: it defines which business concepts are allowed to exist and how they compile into SQL. RAG may still be useful in a future large deployment to select relevant semantic-layer entries, but the final SQL should still be compiled by the deterministic AEGIS compiler.</w:t>
+        <w:t>Every AEGIS deployment requires a domain-specific semantic layer built by someone with both business knowledge and schema access. Organizations without this expertise, or with rapidly evolving schemas, may find the maintenance burden significant. AEGIS is not a zero-configuration system.</w:t>
       </w:r>
     </w:p>
     <w:p>
@@ -17054,14 +16429,8 @@
           <w:i w:val="0"/>
           <w:sz w:val="24"/>
         </w:rPr>
-        <w:t xml:space="preserve">5.6.3 Scope boundary. </w:t>
-      </w:r>
-    </w:p>
-    <w:p>
-      <w:pPr>
-        <w:spacing w:after="0" w:before="0" w:line="360" w:lineRule="auto"/>
-        <w:jc w:val="both"/>
-      </w:pPr>
+        <w:t xml:space="preserve">Cannot answer arbitrary SQL questions. </w:t>
+      </w:r>
       <w:r>
         <w:rPr>
           <w:rFonts w:ascii="Times New Roman" w:hAnsi="Times New Roman"/>
@@ -17069,54 +16438,7 @@
           <w:i w:val="0"/>
           <w:sz w:val="24"/>
         </w:rPr>
-        <w:t>AEGIS currently supports a bounded set of approved metrics, dimensions, analytical patterns, and join paths. This is the source of its safety, but also the source of its main limitation. If a user asks for something not represented in the semantic layer, the system should reject or clarify the request. The current prototype does not always do that reliably; improving scope detection is therefore a priority in future work.</w:t>
-      </w:r>
-    </w:p>
-    <w:p>
-      <w:r>
-        <w:br w:type="page"/>
-      </w:r>
-    </w:p>
-    <w:p>
-      <w:pPr>
-        <w:spacing w:before="0" w:after="80"/>
-        <w:jc w:val="center"/>
-      </w:pPr>
-      <w:r>
-        <w:rPr>
-          <w:rFonts w:ascii="Times New Roman" w:hAnsi="Times New Roman"/>
-          <w:b/>
-          <w:sz w:val="32"/>
-        </w:rPr>
-        <w:t>CHAPTER 6</w:t>
-      </w:r>
-    </w:p>
-    <w:p>
-      <w:pPr>
-        <w:spacing w:after="400"/>
-        <w:jc w:val="center"/>
-      </w:pPr>
-      <w:r>
-        <w:rPr>
-          <w:rFonts w:ascii="Times New Roman" w:hAnsi="Times New Roman"/>
-          <w:b/>
-          <w:sz w:val="32"/>
-        </w:rPr>
-        <w:t>LIMITATIONS AND FUTURE WORK</w:t>
-      </w:r>
-    </w:p>
-    <w:p>
-      <w:pPr>
-        <w:spacing w:before="320" w:after="160"/>
-        <w:jc w:val="left"/>
-      </w:pPr>
-      <w:r>
-        <w:rPr>
-          <w:rFonts w:ascii="Times New Roman" w:hAnsi="Times New Roman"/>
-          <w:b/>
-          <w:sz w:val="28"/>
-        </w:rPr>
-        <w:t>6.1  Limitations</w:t>
+        <w:t>By design, AEGIS only answers questions that map to a supported analytics primitive with an approved metric and dimension. Ad hoc queries, multi-level nested aggregations, or requests for data fields not in the semantic layer fail with a coverage error. This is a deliberate trade-off, not an oversight.</w:t>
       </w:r>
     </w:p>
     <w:p>
@@ -17131,7 +16453,7 @@
           <w:i w:val="0"/>
           <w:sz w:val="24"/>
         </w:rPr>
-        <w:t xml:space="preserve">Semantic layer construction cost. </w:t>
+        <w:t xml:space="preserve">Complex analytical queries require new templates. </w:t>
       </w:r>
       <w:r>
         <w:rPr>
@@ -17140,7 +16462,7 @@
           <w:i w:val="0"/>
           <w:sz w:val="24"/>
         </w:rPr>
-        <w:t>Every AEGIS deployment requires a domain-specific semantic layer built by someone with both business knowledge and schema access. Organizations without this expertise, or with rapidly evolving schemas, may find the maintenance burden significant. AEGIS is not a zero-configuration system.</w:t>
+        <w:t>Approximately 2.6% of the formative-study requests required patterns not yet in the template library. Adding a new pattern requires a developer with SQL knowledge; it is not something a business user can do themselves.</w:t>
       </w:r>
     </w:p>
     <w:p>
@@ -17155,7 +16477,7 @@
           <w:i w:val="0"/>
           <w:sz w:val="24"/>
         </w:rPr>
-        <w:t xml:space="preserve">Cannot answer arbitrary SQL questions. </w:t>
+        <w:t xml:space="preserve">Quality depends on intent extraction, not just compilation. </w:t>
       </w:r>
       <w:r>
         <w:rPr>
@@ -17164,7 +16486,7 @@
           <w:i w:val="0"/>
           <w:sz w:val="24"/>
         </w:rPr>
-        <w:t>By design, AEGIS only answers questions that map to a supported analytics primitive with an approved metric and dimension. Ad hoc queries, multi-level nested aggregations, or requests for data fields not in the semantic layer fail with a coverage error. This is a deliberate trade-off, not an oversight.</w:t>
+        <w:t>The safety guarantees apply to compilation and execution, not to intent extraction quality. A model that misclassifies a request will produce a structurally safe but semantically wrong query. Safety and accuracy are separate properties, and this thesis is careful not to conflate them.</w:t>
       </w:r>
     </w:p>
     <w:p>
@@ -17179,7 +16501,7 @@
           <w:i w:val="0"/>
           <w:sz w:val="24"/>
         </w:rPr>
-        <w:t xml:space="preserve">Complex analytical queries require new templates. </w:t>
+        <w:t xml:space="preserve">Benchmark selection. </w:t>
       </w:r>
       <w:r>
         <w:rPr>
@@ -17188,7 +16510,7 @@
           <w:i w:val="0"/>
           <w:sz w:val="24"/>
         </w:rPr>
-        <w:t>Approximately 2.6% of the formative-study requests required patterns not yet in the template library. Adding a new pattern requires a developer with SQL knowledge; it is not something a business user can do themselves.</w:t>
+        <w:t>The custom 107-query benchmark was necessary because standard benchmarks such as Spider and BIRD do not evaluate SQL safety or adherence to business logic; this also means the reported figures are not directly comparable to Spider- or BIRD-reported numbers from other systems.</w:t>
       </w:r>
     </w:p>
     <w:p>
@@ -17203,7 +16525,7 @@
           <w:i w:val="0"/>
           <w:sz w:val="24"/>
         </w:rPr>
-        <w:t xml:space="preserve">Quality depends on intent extraction, not just compilation. </w:t>
+        <w:t xml:space="preserve">Semantic layer scalability. </w:t>
       </w:r>
       <w:r>
         <w:rPr>
@@ -17212,7 +16534,7 @@
           <w:i w:val="0"/>
           <w:sz w:val="24"/>
         </w:rPr>
-        <w:t>The safety guarantees apply to compilation and execution, not to intent extraction quality. A model that misclassifies a request will produce a structurally safe but semantically wrong query. Safety and accuracy are separate properties, and this thesis is careful not to conflate them.</w:t>
+        <w:t>Modern context windows of roughly 128,000 tokens can hold approximately 2,500 distinct metric and dimension definitions; most enterprise deployments expose fewer than 500 core concepts, so this is not a near-term constraint, but very large vocabularies would need retrieval-augmented vocabulary injection rather than injecting the entire semantic layer at once.</w:t>
       </w:r>
     </w:p>
     <w:p>
@@ -17227,7 +16549,7 @@
           <w:i w:val="0"/>
           <w:sz w:val="24"/>
         </w:rPr>
-        <w:t xml:space="preserve">Benchmark selection. </w:t>
+        <w:t xml:space="preserve">Database agnosticism. </w:t>
       </w:r>
       <w:r>
         <w:rPr>
@@ -17236,7 +16558,7 @@
           <w:i w:val="0"/>
           <w:sz w:val="24"/>
         </w:rPr>
-        <w:t>The custom 107-query benchmark was necessary because standard benchmarks such as Spider and BIRD do not evaluate SQL safety or adherence to business logic; this also means the reported figures are not directly comparable to Spider- or BIRD-reported numbers from other systems.</w:t>
+        <w:t>The current compiler generates MySQL syntax; supporting PostgreSQL or SQL Server requires extending the compiler module, not redesigning the architecture.</w:t>
       </w:r>
     </w:p>
     <w:p>
@@ -17251,7 +16573,7 @@
           <w:i w:val="0"/>
           <w:sz w:val="24"/>
         </w:rPr>
-        <w:t xml:space="preserve">Semantic layer scalability. </w:t>
+        <w:t xml:space="preserve">Storage persistence. </w:t>
       </w:r>
       <w:r>
         <w:rPr>
@@ -17260,7 +16582,7 @@
           <w:i w:val="0"/>
           <w:sz w:val="24"/>
         </w:rPr>
-        <w:t>Modern context windows of roughly 128,000 tokens can hold approximately 2,500 distinct metric and dimension definitions; most enterprise deployments expose fewer than 500 core concepts, so this is not a near-term constraint, but very large vocabularies would need retrieval-augmented vocabulary injection rather than injecting the entire semantic layer at once.</w:t>
+        <w:t>The prototype uses JSON flat files for widget storage; the widget registry interface is designed to be swapped for a relational database in a production deployment.</w:t>
       </w:r>
     </w:p>
     <w:p>
@@ -17275,7 +16597,7 @@
           <w:i w:val="0"/>
           <w:sz w:val="24"/>
         </w:rPr>
-        <w:t xml:space="preserve">Database agnosticism. </w:t>
+        <w:t xml:space="preserve">Multi-turn conversation. </w:t>
       </w:r>
       <w:r>
         <w:rPr>
@@ -17284,12 +16606,12 @@
           <w:i w:val="0"/>
           <w:sz w:val="24"/>
         </w:rPr>
-        <w:t>The current compiler generates MySQL syntax; supporting PostgreSQL or SQL Server requires extending the compiler module, not redesigning the architecture.</w:t>
-      </w:r>
-    </w:p>
-    <w:p>
-      <w:pPr>
-        <w:spacing w:after="120" w:before="0" w:line="360" w:lineRule="auto"/>
+        <w:t>AEGIS currently treats each request independently. Contextual carryover across turns, of the kind studied in conversational text-to-SQL research, is not yet implemented.</w:t>
+      </w:r>
+    </w:p>
+    <w:p>
+      <w:pPr>
+        <w:spacing w:after="0" w:before="0" w:line="360" w:lineRule="auto"/>
         <w:jc w:val="both"/>
       </w:pPr>
       <w:r>
@@ -17299,7 +16621,7 @@
           <w:i w:val="0"/>
           <w:sz w:val="24"/>
         </w:rPr>
-        <w:t xml:space="preserve">Storage persistence. </w:t>
+        <w:t xml:space="preserve">Vocabulary injection limitations. </w:t>
       </w:r>
       <w:r>
         <w:rPr>
@@ -17308,23 +16630,271 @@
           <w:i w:val="0"/>
           <w:sz w:val="24"/>
         </w:rPr>
-        <w:t>The prototype uses JSON flat files for widget storage; the widget registry interface is designed to be swapped for a relational database in a production deployment.</w:t>
-      </w:r>
-    </w:p>
-    <w:p>
-      <w:pPr>
-        <w:spacing w:after="120" w:before="0" w:line="360" w:lineRule="auto"/>
+        <w:t>Highly specialized domain terminology may require supplementary few-shot examples in the prompt beyond the label and description pairs currently injected.</w:t>
+      </w:r>
+    </w:p>
+    <w:p>
+      <w:pPr>
+        <w:spacing w:before="320" w:after="160"/>
+        <w:jc w:val="left"/>
+      </w:pPr>
+      <w:r>
+        <w:rPr>
+          <w:rFonts w:ascii="Times New Roman" w:hAnsi="Times New Roman"/>
+          <w:b/>
+          <w:sz w:val="28"/>
+        </w:rPr>
+        <w:t>6.2  Future Work</w:t>
+      </w:r>
+    </w:p>
+    <w:p>
+      <w:pPr>
+        <w:spacing w:after="80" w:line="360" w:lineRule="auto"/>
+        <w:ind w:left="461" w:hanging="259"/>
+      </w:pPr>
+      <w:r>
+        <w:rPr>
+          <w:rFonts w:ascii="Times New Roman" w:hAnsi="Times New Roman"/>
+          <w:sz w:val="24"/>
+        </w:rPr>
+        <w:t>•</w:t>
+        <w:tab/>
+      </w:r>
+      <w:r>
+        <w:rPr>
+          <w:rFonts w:ascii="Times New Roman" w:hAnsi="Times New Roman"/>
+          <w:sz w:val="24"/>
+        </w:rPr>
+        <w:t>Clarification requests: when confidence is low, AEGIS should ask a follow-up question instead of guessing, for example "did you mean revenue or profit?"</w:t>
+      </w:r>
+    </w:p>
+    <w:p>
+      <w:pPr>
+        <w:spacing w:after="80" w:line="360" w:lineRule="auto"/>
+        <w:ind w:left="461" w:hanging="259"/>
+      </w:pPr>
+      <w:r>
+        <w:rPr>
+          <w:rFonts w:ascii="Times New Roman" w:hAnsi="Times New Roman"/>
+          <w:sz w:val="24"/>
+        </w:rPr>
+        <w:t>•</w:t>
+        <w:tab/>
+      </w:r>
+      <w:r>
+        <w:rPr>
+          <w:rFonts w:ascii="Times New Roman" w:hAnsi="Times New Roman"/>
+          <w:sz w:val="24"/>
+        </w:rPr>
+        <w:t>Semantic layer wizard: a guided interface for business analysts to define new metrics and dimensions without writing Python.</w:t>
+      </w:r>
+    </w:p>
+    <w:p>
+      <w:pPr>
+        <w:spacing w:after="80" w:line="360" w:lineRule="auto"/>
+        <w:ind w:left="461" w:hanging="259"/>
+      </w:pPr>
+      <w:r>
+        <w:rPr>
+          <w:rFonts w:ascii="Times New Roman" w:hAnsi="Times New Roman"/>
+          <w:sz w:val="24"/>
+        </w:rPr>
+        <w:t>•</w:t>
+        <w:tab/>
+      </w:r>
+      <w:r>
+        <w:rPr>
+          <w:rFonts w:ascii="Times New Roman" w:hAnsi="Times New Roman"/>
+          <w:sz w:val="24"/>
+        </w:rPr>
+        <w:t>Multi-step queries: currently each query produces one widget; compound questions such as "revenue trend and top 5 products side by side" require two separate queries today.</w:t>
+      </w:r>
+    </w:p>
+    <w:p>
+      <w:pPr>
+        <w:spacing w:after="80" w:line="360" w:lineRule="auto"/>
+        <w:ind w:left="461" w:hanging="259"/>
+      </w:pPr>
+      <w:r>
+        <w:rPr>
+          <w:rFonts w:ascii="Times New Roman" w:hAnsi="Times New Roman"/>
+          <w:sz w:val="24"/>
+        </w:rPr>
+        <w:t>•</w:t>
+        <w:tab/>
+      </w:r>
+      <w:r>
+        <w:rPr>
+          <w:rFonts w:ascii="Times New Roman" w:hAnsi="Times New Roman"/>
+          <w:sz w:val="24"/>
+        </w:rPr>
+        <w:t>Automated denial-of-service protection: query complexity scoring and server-side timeout enforcement, since the join graph bounds query cost but does not currently score it explicitly.</w:t>
+      </w:r>
+    </w:p>
+    <w:p>
+      <w:pPr>
+        <w:spacing w:after="80" w:line="360" w:lineRule="auto"/>
+        <w:ind w:left="461" w:hanging="259"/>
+      </w:pPr>
+      <w:r>
+        <w:rPr>
+          <w:rFonts w:ascii="Times New Roman" w:hAnsi="Times New Roman"/>
+          <w:sz w:val="24"/>
+        </w:rPr>
+        <w:t>•</w:t>
+        <w:tab/>
+      </w:r>
+      <w:r>
+        <w:rPr>
+          <w:rFonts w:ascii="Times New Roman" w:hAnsi="Times New Roman"/>
+          <w:sz w:val="24"/>
+        </w:rPr>
+        <w:t>Broader schema coverage: extending the nopCommerce semantic layer to cover promotions, vendor analytics, and content-management engagement metrics.</w:t>
+      </w:r>
+    </w:p>
+    <w:p>
+      <w:pPr>
+        <w:spacing w:after="80" w:line="360" w:lineRule="auto"/>
+        <w:ind w:left="461" w:hanging="259"/>
+      </w:pPr>
+      <w:r>
+        <w:rPr>
+          <w:rFonts w:ascii="Times New Roman" w:hAnsi="Times New Roman"/>
+          <w:sz w:val="24"/>
+        </w:rPr>
+        <w:t>•</w:t>
+        <w:tab/>
+      </w:r>
+      <w:r>
+        <w:rPr>
+          <w:rFonts w:ascii="Times New Roman" w:hAnsi="Times New Roman"/>
+          <w:sz w:val="24"/>
+        </w:rPr>
+        <w:t>Multi-turn conversational carryover, extending the single-turn design discussed above.</w:t>
+      </w:r>
+    </w:p>
+    <w:p>
+      <w:pPr>
+        <w:spacing w:after="80" w:line="360" w:lineRule="auto"/>
+        <w:ind w:left="461" w:hanging="259"/>
+      </w:pPr>
+      <w:r>
+        <w:rPr>
+          <w:rFonts w:ascii="Times New Roman" w:hAnsi="Times New Roman"/>
+          <w:sz w:val="24"/>
+        </w:rPr>
+        <w:t>•</w:t>
+        <w:tab/>
+      </w:r>
+      <w:r>
+        <w:rPr>
+          <w:rFonts w:ascii="Times New Roman" w:hAnsi="Times New Roman"/>
+          <w:sz w:val="24"/>
+        </w:rPr>
+        <w:t>Outcome and rejection-category instrumentation: measuring, from real benchmark and production runs, the precise proportion of requests answered directly, answered after clarification, answered after a semantic layer extension, or rejected, and the relative frequency of each rejection category. This thesis currently reports these categories qualitatively; adding this instrumentation would let a future revision report a measured percentage breakdown rather than a qualitative one.</w:t>
+      </w:r>
+    </w:p>
+    <w:p>
+      <w:pPr>
+        <w:spacing w:after="80" w:line="360" w:lineRule="auto"/>
+        <w:ind w:left="461" w:hanging="259"/>
+      </w:pPr>
+      <w:r>
+        <w:rPr>
+          <w:rFonts w:ascii="Times New Roman" w:hAnsi="Times New Roman"/>
+          <w:sz w:val="24"/>
+        </w:rPr>
+        <w:t>•</w:t>
+        <w:tab/>
+      </w:r>
+      <w:r>
+        <w:rPr>
+          <w:rFonts w:ascii="Times New Roman" w:hAnsi="Times New Roman"/>
+          <w:sz w:val="24"/>
+        </w:rPr>
+        <w:t>Semantic correctness benchmark: adding annotated expected-answer labels for the 107 mixed requests so the evaluation can report correctness separately from SQL safety and true database execution validity.</w:t>
+      </w:r>
+    </w:p>
+    <w:p>
+      <w:pPr>
+        <w:spacing w:after="80" w:line="360" w:lineRule="auto"/>
+        <w:ind w:left="461" w:hanging="259"/>
+      </w:pPr>
+      <w:r>
+        <w:rPr>
+          <w:rFonts w:ascii="Times New Roman" w:hAnsi="Times New Roman"/>
+          <w:sz w:val="24"/>
+        </w:rPr>
+        <w:t>•</w:t>
+        <w:tab/>
+      </w:r>
+      <w:r>
+        <w:rPr>
+          <w:rFonts w:ascii="Times New Roman" w:hAnsi="Times New Roman"/>
+          <w:sz w:val="24"/>
+        </w:rPr>
+        <w:t>Cross-schema generalizability benchmark: rebuilding the semantic layer for a second schema, such as WooCommerce, while keeping the intent parser contract, compiler structure, and safety scanner unchanged. This future evaluation would measure how much of AEGIS transfers across schemas and how much effort is required to configure a new domain.</w:t>
+      </w:r>
+    </w:p>
+    <w:p>
+      <w:pPr>
+        <w:spacing w:after="80" w:line="360" w:lineRule="auto"/>
+        <w:ind w:left="461" w:hanging="259"/>
+      </w:pPr>
+      <w:r>
+        <w:rPr>
+          <w:rFonts w:ascii="Times New Roman" w:hAnsi="Times New Roman"/>
+          <w:sz w:val="24"/>
+        </w:rPr>
+        <w:t>•</w:t>
+        <w:tab/>
+      </w:r>
+      <w:r>
+        <w:rPr>
+          <w:rFonts w:ascii="Times New Roman" w:hAnsi="Times New Roman"/>
+          <w:sz w:val="24"/>
+        </w:rPr>
+        <w:t>Remaining baselines and latency: completing B2 and B4, then instrumenting pipeline latency with repeatable timing logs in future work.</w:t>
+      </w:r>
+    </w:p>
+    <w:p>
+      <w:r>
+        <w:br w:type="page"/>
+      </w:r>
+    </w:p>
+    <w:p>
+      <w:pPr>
+        <w:spacing w:before="0" w:after="80"/>
+        <w:jc w:val="center"/>
+      </w:pPr>
+      <w:r>
+        <w:rPr>
+          <w:rFonts w:ascii="Times New Roman" w:hAnsi="Times New Roman"/>
+          <w:b/>
+          <w:sz w:val="32"/>
+        </w:rPr>
+        <w:t>CHAPTER 7</w:t>
+      </w:r>
+    </w:p>
+    <w:p>
+      <w:pPr>
+        <w:spacing w:after="400"/>
+        <w:jc w:val="center"/>
+      </w:pPr>
+      <w:r>
+        <w:rPr>
+          <w:rFonts w:ascii="Times New Roman" w:hAnsi="Times New Roman"/>
+          <w:b/>
+          <w:sz w:val="32"/>
+        </w:rPr>
+        <w:t>CONCLUSION</w:t>
+      </w:r>
+    </w:p>
+    <w:p>
+      <w:pPr>
+        <w:spacing w:after="240" w:before="0" w:line="360" w:lineRule="auto"/>
         <w:jc w:val="both"/>
       </w:pPr>
-      <w:r>
-        <w:rPr>
-          <w:rFonts w:ascii="Times New Roman" w:hAnsi="Times New Roman"/>
-          <w:b/>
-          <w:i w:val="0"/>
-          <w:sz w:val="24"/>
-        </w:rPr>
-        <w:t xml:space="preserve">Multi-turn conversation. </w:t>
-      </w:r>
       <w:r>
         <w:rPr>
           <w:rFonts w:ascii="Times New Roman" w:hAnsi="Times New Roman"/>
@@ -17332,23 +16902,14 @@
           <w:i w:val="0"/>
           <w:sz w:val="24"/>
         </w:rPr>
-        <w:t>AEGIS currently treats each request independently. Contextual carryover across turns, of the kind studied in conversational text-to-SQL research, is not yet implemented.</w:t>
-      </w:r>
-    </w:p>
-    <w:p>
-      <w:pPr>
-        <w:spacing w:after="0" w:before="0" w:line="360" w:lineRule="auto"/>
+        <w:t>This thesis presented AEGIS, a constraint-based architecture for safe LLM-assisted natural-language analytics over relational databases. The system limits the language model to intent extraction while query construction, chart selection, and widget persistence are handled by deterministic components. This design makes approved business terms explicit through a semantic layer and avoids exposing raw SQL generation authority to the language model.</w:t>
+      </w:r>
+    </w:p>
+    <w:p>
+      <w:pPr>
+        <w:spacing w:after="240" w:before="0" w:line="360" w:lineRule="auto"/>
         <w:jc w:val="both"/>
       </w:pPr>
-      <w:r>
-        <w:rPr>
-          <w:rFonts w:ascii="Times New Roman" w:hAnsi="Times New Roman"/>
-          <w:b/>
-          <w:i w:val="0"/>
-          <w:sz w:val="24"/>
-        </w:rPr>
-        <w:t xml:space="preserve">Vocabulary injection limitations. </w:t>
-      </w:r>
       <w:r>
         <w:rPr>
           <w:rFonts w:ascii="Times New Roman" w:hAnsi="Times New Roman"/>
@@ -17356,269 +16917,12 @@
           <w:i w:val="0"/>
           <w:sz w:val="24"/>
         </w:rPr>
-        <w:t>Highly specialized domain terminology may require supplementary few-shot examples in the prompt beyond the label and description pairs currently injected.</w:t>
-      </w:r>
-    </w:p>
-    <w:p>
-      <w:pPr>
-        <w:spacing w:before="320" w:after="160"/>
-        <w:jc w:val="left"/>
-      </w:pPr>
-      <w:r>
-        <w:rPr>
-          <w:rFonts w:ascii="Times New Roman" w:hAnsi="Times New Roman"/>
-          <w:b/>
-          <w:sz w:val="28"/>
-        </w:rPr>
-        <w:t>6.2  Future Work</w:t>
-      </w:r>
-    </w:p>
-    <w:p>
-      <w:pPr>
-        <w:spacing w:after="80" w:line="360" w:lineRule="auto"/>
-        <w:ind w:left="461" w:hanging="259"/>
-      </w:pPr>
-      <w:r>
-        <w:rPr>
-          <w:rFonts w:ascii="Times New Roman" w:hAnsi="Times New Roman"/>
-          <w:sz w:val="24"/>
-        </w:rPr>
-        <w:t>•</w:t>
-        <w:tab/>
-      </w:r>
-      <w:r>
-        <w:rPr>
-          <w:rFonts w:ascii="Times New Roman" w:hAnsi="Times New Roman"/>
-          <w:sz w:val="24"/>
-        </w:rPr>
-        <w:t>Clarification requests: when confidence is low, AEGIS should ask a follow-up question instead of guessing, for example "did you mean revenue or profit?"</w:t>
-      </w:r>
-    </w:p>
-    <w:p>
-      <w:pPr>
-        <w:spacing w:after="80" w:line="360" w:lineRule="auto"/>
-        <w:ind w:left="461" w:hanging="259"/>
-      </w:pPr>
-      <w:r>
-        <w:rPr>
-          <w:rFonts w:ascii="Times New Roman" w:hAnsi="Times New Roman"/>
-          <w:sz w:val="24"/>
-        </w:rPr>
-        <w:t>•</w:t>
-        <w:tab/>
-      </w:r>
-      <w:r>
-        <w:rPr>
-          <w:rFonts w:ascii="Times New Roman" w:hAnsi="Times New Roman"/>
-          <w:sz w:val="24"/>
-        </w:rPr>
-        <w:t>Semantic layer wizard: a guided interface for business analysts to define new metrics and dimensions without writing Python.</w:t>
-      </w:r>
-    </w:p>
-    <w:p>
-      <w:pPr>
-        <w:spacing w:after="80" w:line="360" w:lineRule="auto"/>
-        <w:ind w:left="461" w:hanging="259"/>
-      </w:pPr>
-      <w:r>
-        <w:rPr>
-          <w:rFonts w:ascii="Times New Roman" w:hAnsi="Times New Roman"/>
-          <w:sz w:val="24"/>
-        </w:rPr>
-        <w:t>•</w:t>
-        <w:tab/>
-      </w:r>
-      <w:r>
-        <w:rPr>
-          <w:rFonts w:ascii="Times New Roman" w:hAnsi="Times New Roman"/>
-          <w:sz w:val="24"/>
-        </w:rPr>
-        <w:t>Multi-step queries: currently each query produces one widget; compound questions such as "revenue trend and top 5 products side by side" require two separate queries today.</w:t>
-      </w:r>
-    </w:p>
-    <w:p>
-      <w:pPr>
-        <w:spacing w:after="80" w:line="360" w:lineRule="auto"/>
-        <w:ind w:left="461" w:hanging="259"/>
-      </w:pPr>
-      <w:r>
-        <w:rPr>
-          <w:rFonts w:ascii="Times New Roman" w:hAnsi="Times New Roman"/>
-          <w:sz w:val="24"/>
-        </w:rPr>
-        <w:t>•</w:t>
-        <w:tab/>
-      </w:r>
-      <w:r>
-        <w:rPr>
-          <w:rFonts w:ascii="Times New Roman" w:hAnsi="Times New Roman"/>
-          <w:sz w:val="24"/>
-        </w:rPr>
-        <w:t>Automated denial-of-service protection: query complexity scoring and server-side timeout enforcement, since the join graph bounds query cost but does not currently score it explicitly.</w:t>
-      </w:r>
-    </w:p>
-    <w:p>
-      <w:pPr>
-        <w:spacing w:after="80" w:line="360" w:lineRule="auto"/>
-        <w:ind w:left="461" w:hanging="259"/>
-      </w:pPr>
-      <w:r>
-        <w:rPr>
-          <w:rFonts w:ascii="Times New Roman" w:hAnsi="Times New Roman"/>
-          <w:sz w:val="24"/>
-        </w:rPr>
-        <w:t>•</w:t>
-        <w:tab/>
-      </w:r>
-      <w:r>
-        <w:rPr>
-          <w:rFonts w:ascii="Times New Roman" w:hAnsi="Times New Roman"/>
-          <w:sz w:val="24"/>
-        </w:rPr>
-        <w:t>Broader schema coverage: extending the nopCommerce semantic layer to cover promotions, vendor analytics, and content-management engagement metrics.</w:t>
-      </w:r>
-    </w:p>
-    <w:p>
-      <w:pPr>
-        <w:spacing w:after="80" w:line="360" w:lineRule="auto"/>
-        <w:ind w:left="461" w:hanging="259"/>
-      </w:pPr>
-      <w:r>
-        <w:rPr>
-          <w:rFonts w:ascii="Times New Roman" w:hAnsi="Times New Roman"/>
-          <w:sz w:val="24"/>
-        </w:rPr>
-        <w:t>•</w:t>
-        <w:tab/>
-      </w:r>
-      <w:r>
-        <w:rPr>
-          <w:rFonts w:ascii="Times New Roman" w:hAnsi="Times New Roman"/>
-          <w:sz w:val="24"/>
-        </w:rPr>
-        <w:t>Multi-turn conversational carryover, extending the single-turn design discussed above.</w:t>
-      </w:r>
-    </w:p>
-    <w:p>
-      <w:pPr>
-        <w:spacing w:after="80" w:line="360" w:lineRule="auto"/>
-        <w:ind w:left="461" w:hanging="259"/>
-      </w:pPr>
-      <w:r>
-        <w:rPr>
-          <w:rFonts w:ascii="Times New Roman" w:hAnsi="Times New Roman"/>
-          <w:sz w:val="24"/>
-        </w:rPr>
-        <w:t>•</w:t>
-        <w:tab/>
-      </w:r>
-      <w:r>
-        <w:rPr>
-          <w:rFonts w:ascii="Times New Roman" w:hAnsi="Times New Roman"/>
-          <w:sz w:val="24"/>
-        </w:rPr>
-        <w:t>Outcome and rejection-category instrumentation: measuring, from real benchmark and production runs, the precise proportion of requests answered directly, answered after clarification, answered after a semantic layer extension, or rejected, and the relative frequency of each rejection category. This thesis currently reports these categories qualitatively; adding this instrumentation would let a future revision report a measured percentage breakdown rather than a qualitative one.</w:t>
-      </w:r>
-    </w:p>
-    <w:p>
-      <w:pPr>
-        <w:spacing w:after="80" w:line="360" w:lineRule="auto"/>
-        <w:ind w:left="461" w:hanging="259"/>
-      </w:pPr>
-      <w:r>
-        <w:rPr>
-          <w:rFonts w:ascii="Times New Roman" w:hAnsi="Times New Roman"/>
-          <w:sz w:val="24"/>
-        </w:rPr>
-        <w:t>•</w:t>
-        <w:tab/>
-      </w:r>
-      <w:r>
-        <w:rPr>
-          <w:rFonts w:ascii="Times New Roman" w:hAnsi="Times New Roman"/>
-          <w:sz w:val="24"/>
-        </w:rPr>
-        <w:t>Semantic correctness benchmark: adding annotated expected-answer labels for the 107 mixed requests so the evaluation can report correctness separately from SQL safety and true database execution validity.</w:t>
-      </w:r>
-    </w:p>
-    <w:p>
-      <w:pPr>
-        <w:spacing w:after="80" w:line="360" w:lineRule="auto"/>
-        <w:ind w:left="461" w:hanging="259"/>
-      </w:pPr>
-      <w:r>
-        <w:rPr>
-          <w:rFonts w:ascii="Times New Roman" w:hAnsi="Times New Roman"/>
-          <w:sz w:val="24"/>
-        </w:rPr>
-        <w:t>•</w:t>
-        <w:tab/>
-      </w:r>
-      <w:r>
-        <w:rPr>
-          <w:rFonts w:ascii="Times New Roman" w:hAnsi="Times New Roman"/>
-          <w:sz w:val="24"/>
-        </w:rPr>
-        <w:t>Cross-schema generalizability benchmark: rebuilding the semantic layer for a second schema, such as WooCommerce, while keeping the intent parser contract, compiler structure, and safety scanner unchanged. This future evaluation would measure how much of AEGIS transfers across schemas and how much effort is required to configure a new domain.</w:t>
-      </w:r>
-    </w:p>
-    <w:p>
-      <w:pPr>
-        <w:spacing w:after="80" w:line="360" w:lineRule="auto"/>
-        <w:ind w:left="461" w:hanging="259"/>
-      </w:pPr>
-      <w:r>
-        <w:rPr>
-          <w:rFonts w:ascii="Times New Roman" w:hAnsi="Times New Roman"/>
-          <w:sz w:val="24"/>
-        </w:rPr>
-        <w:t>•</w:t>
-        <w:tab/>
-      </w:r>
-      <w:r>
-        <w:rPr>
-          <w:rFonts w:ascii="Times New Roman" w:hAnsi="Times New Roman"/>
-          <w:sz w:val="24"/>
-        </w:rPr>
-        <w:t>Remaining baselines and latency: completing B2 and B4, then instrumenting pipeline latency with repeatable timing logs in future work.</w:t>
-      </w:r>
-    </w:p>
-    <w:p>
-      <w:r>
-        <w:br w:type="page"/>
-      </w:r>
-    </w:p>
-    <w:p>
-      <w:pPr>
-        <w:spacing w:before="0" w:after="80"/>
-        <w:jc w:val="center"/>
-      </w:pPr>
-      <w:r>
-        <w:rPr>
-          <w:rFonts w:ascii="Times New Roman" w:hAnsi="Times New Roman"/>
-          <w:b/>
-          <w:sz w:val="32"/>
-        </w:rPr>
-        <w:t>CHAPTER 7</w:t>
-      </w:r>
-    </w:p>
-    <w:p>
-      <w:pPr>
-        <w:spacing w:after="400"/>
-        <w:jc w:val="center"/>
-      </w:pPr>
-      <w:r>
-        <w:rPr>
-          <w:rFonts w:ascii="Times New Roman" w:hAnsi="Times New Roman"/>
-          <w:b/>
-          <w:sz w:val="32"/>
-        </w:rPr>
-        <w:t>CONCLUSION</w:t>
-      </w:r>
-    </w:p>
-    <w:p>
-      <w:pPr>
-        <w:spacing w:after="240" w:before="0" w:line="360" w:lineRule="auto"/>
+        <w:t>The prototype evaluation on a 107-request mixed benchmark showed that AEGIS produced no unsafe SQL statements and successfully executed 100 of 107 generated queries against the seeded MySQL database. In contrast, the direct LLM-to-SQL baseline executed 27 of 107 queries successfully and produced one genuine unsafe write statement. These results support the main argument that deterministic compilation and semantic-layer constraints can improve SQL safety in natural-language reporting systems.</w:t>
+      </w:r>
+    </w:p>
+    <w:p>
+      <w:pPr>
+        <w:spacing w:after="0" w:before="0" w:line="360" w:lineRule="auto"/>
         <w:jc w:val="both"/>
       </w:pPr>
       <w:r>
@@ -17628,52 +16932,7 @@
           <w:i w:val="0"/>
           <w:sz w:val="24"/>
         </w:rPr>
-        <w:t>This thesis presented AEGIS, a system for turning plain-English reporting requests into dynamic, refreshable dashboard widgets over relational databases. The central contribution has two parts. First, a system design that limits the language model to understanding questions, while all query building, chart selection, and widget storage is handled by fixed rules and pre-approved templates, so that safety is a property guaranteed by system structure rather than a probability that improves with model quality. Second, a semantic-layer and vocabulary-injection design that makes approved business terms explicit instead of asking the model to infer them from raw schema names.</w:t>
-      </w:r>
-    </w:p>
-    <w:p>
-      <w:pPr>
-        <w:spacing w:after="240" w:before="0" w:line="360" w:lineRule="auto"/>
-        <w:jc w:val="both"/>
-      </w:pPr>
-      <w:r>
-        <w:rPr>
-          <w:rFonts w:ascii="Times New Roman" w:hAnsi="Times New Roman"/>
-          <w:b w:val="0"/>
-          <w:i w:val="0"/>
-          <w:sz w:val="24"/>
-        </w:rPr>
-        <w:t>The verified evaluation shows that AEGIS produced no unsafe SQL statements across the 107-query benchmark and successfully executed 100 of 107 generated queries against the seeded MySQL database. The direct LLM-to-SQL baseline successfully executed 27 of 107 queries and produced one genuine unsafe write statement. These figures support the safety argument while also exposing the remaining engineering work: seven AEGIS execution failures, incomplete scope detection, and an unmeasured semantic correctness benchmark.</w:t>
-      </w:r>
-    </w:p>
-    <w:p>
-      <w:pPr>
-        <w:spacing w:after="240" w:before="0" w:line="360" w:lineRule="auto"/>
-        <w:jc w:val="both"/>
-      </w:pPr>
-      <w:r>
-        <w:rPr>
-          <w:rFonts w:ascii="Times New Roman" w:hAnsi="Times New Roman"/>
-          <w:b w:val="0"/>
-          <w:i w:val="0"/>
-          <w:sz w:val="24"/>
-        </w:rPr>
-        <w:t>The literature review situates this contribution precisely: prior text-to-SQL research, from Seq2SQL through RAT-SQL and PICARD, treats SQL-generation accuracy as the object of study and, with the partial exception of a 2025 systematic review's discussion of injection attacks, does not evaluate safety as a first-class property at all. AEGIS's architectural choice, removing SQL generation from the language model's role entirely rather than constraining it more tightly, is a categorically different answer to the same underlying problem, and one independently echoed in recent explanatory-analytics research that arrives at the same 'let a deterministic layer compute the answer' principle in an unrelated domain.</w:t>
-      </w:r>
-    </w:p>
-    <w:p>
-      <w:pPr>
-        <w:spacing w:after="0" w:before="0" w:line="360" w:lineRule="auto"/>
-        <w:jc w:val="both"/>
-      </w:pPr>
-      <w:r>
-        <w:rPr>
-          <w:rFonts w:ascii="Times New Roman" w:hAnsi="Times New Roman"/>
-          <w:b w:val="0"/>
-          <w:i w:val="0"/>
-          <w:sz w:val="24"/>
-        </w:rPr>
-        <w:t>AEGIS is built for environments where data privacy, consistent reporting definitions, and daily reuse of saved reports matter more than unlimited query flexibility. The limitations discussion states plainly what this design gives up in exchange: a bounded vocabulary, an upfront semantic layer construction cost, and dependence on intent-extraction quality for semantic (though never safety) correctness. Within that scope, this thesis demonstrates that restricting SQL generation to a finite set of validated business patterns is a practical, measurable path to safe, auditable natural-language reporting in institutional environments.</w:t>
+        <w:t>AEGIS is not a general-purpose text-to-SQL system. Its limitations include semantic layer construction cost, bounded query coverage, remaining execution failures, incomplete scope detection, and the need for a separately annotated semantic-correctness benchmark. Within this scope, the thesis demonstrates that restricting SQL generation to validated business patterns is a practical direction for safer, reusable, and more auditable natural-language analytics in institutional environments.</w:t>
       </w:r>
     </w:p>
     <w:p>

</xml_diff>

<commit_message>
Refine thesis checklist sections
</commit_message>
<xml_diff>
--- a/docs/scripts/AEGIS Thesis Book Draft - A Constraint-Based Architecture for Safe LLM-Assisted Natural Language Analytics.docx
+++ b/docs/scripts/AEGIS Thesis Book Draft - A Constraint-Based Architecture for Safe LLM-Assisted Natural Language Analytics.docx
@@ -1864,9 +1864,9 @@
           <w:rFonts w:ascii="Times New Roman" w:hAnsi="Times New Roman"/>
           <w:sz w:val="24"/>
         </w:rPr>
-        <w:t>Figure 1: Benchmark pattern classification</w:t>
+        <w:t>Figure 1: Design Science Research workflow</w:t>
         <w:tab/>
-        <w:t>11</w:t>
+        <w:t>10</w:t>
       </w:r>
     </w:p>
     <w:p>
@@ -1882,9 +1882,9 @@
           <w:rFonts w:ascii="Times New Roman" w:hAnsi="Times New Roman"/>
           <w:sz w:val="24"/>
         </w:rPr>
-        <w:t>Figure 2: AEGIS architecture pipeline</w:t>
+        <w:t>Figure 2: Benchmark pattern classification</w:t>
         <w:tab/>
-        <w:t>16</w:t>
+        <w:t>11</w:t>
       </w:r>
     </w:p>
     <w:p>
@@ -1900,7 +1900,7 @@
           <w:rFonts w:ascii="Times New Roman" w:hAnsi="Times New Roman"/>
           <w:sz w:val="24"/>
         </w:rPr>
-        <w:t>Figure 3: Semantic layer modularity</w:t>
+        <w:t>Figure 3: AEGIS architecture pipeline</w:t>
         <w:tab/>
         <w:t>16</w:t>
       </w:r>
@@ -1918,9 +1918,9 @@
           <w:rFonts w:ascii="Times New Roman" w:hAnsi="Times New Roman"/>
           <w:sz w:val="24"/>
         </w:rPr>
-        <w:t>Figure 4: Vocabulary injection workflow</w:t>
+        <w:t>Figure 4: Semantic layer modularity</w:t>
         <w:tab/>
-        <w:t>18</w:t>
+        <w:t>16</w:t>
       </w:r>
     </w:p>
     <w:p>
@@ -1936,9 +1936,9 @@
           <w:rFonts w:ascii="Times New Roman" w:hAnsi="Times New Roman"/>
           <w:sz w:val="24"/>
         </w:rPr>
-        <w:t>Figure 5: AEGIS analytical patterns</w:t>
+        <w:t>Figure 5: Vocabulary injection workflow</w:t>
         <w:tab/>
-        <w:t>19</w:t>
+        <w:t>18</w:t>
       </w:r>
     </w:p>
     <w:p>
@@ -1954,9 +1954,9 @@
           <w:rFonts w:ascii="Times New Roman" w:hAnsi="Times New Roman"/>
           <w:sz w:val="24"/>
         </w:rPr>
-        <w:t>Figure 6: Two-layer SQL safety defence</w:t>
+        <w:t>Figure 6: AEGIS analytical patterns</w:t>
         <w:tab/>
-        <w:t>20</w:t>
+        <w:t>19</w:t>
       </w:r>
     </w:p>
     <w:p>
@@ -1972,9 +1972,9 @@
           <w:rFonts w:ascii="Times New Roman" w:hAnsi="Times New Roman"/>
           <w:sz w:val="24"/>
         </w:rPr>
-        <w:t>Figure 7: Widget lifecycle and refresh model</w:t>
+        <w:t>Figure 7: Two-layer SQL safety defence</w:t>
         <w:tab/>
-        <w:t>21</w:t>
+        <w:t>20</w:t>
       </w:r>
     </w:p>
     <w:p>
@@ -1990,29 +1990,9 @@
           <w:rFonts w:ascii="Times New Roman" w:hAnsi="Times New Roman"/>
           <w:sz w:val="24"/>
         </w:rPr>
-        <w:t>Figure 8: Safety and execution-validity comparison</w:t>
+        <w:t>Figure 8: Widget lifecycle and refresh model</w:t>
         <w:tab/>
-        <w:t>27</w:t>
-      </w:r>
-    </w:p>
-    <w:p>
-      <w:r>
-        <w:br w:type="page"/>
-      </w:r>
-    </w:p>
-    <w:p>
-      <w:pPr>
-        <w:spacing w:after="400" w:before="0" w:line="360" w:lineRule="auto"/>
-        <w:jc w:val="center"/>
-      </w:pPr>
-      <w:r>
-        <w:rPr>
-          <w:rFonts w:ascii="Times New Roman" w:hAnsi="Times New Roman"/>
-          <w:b/>
-          <w:i w:val="0"/>
-          <w:sz w:val="30"/>
-        </w:rPr>
-        <w:t>List of Tables</w:t>
+        <w:t>21</w:t>
       </w:r>
     </w:p>
     <w:p>
@@ -2028,9 +2008,29 @@
           <w:rFonts w:ascii="Times New Roman" w:hAnsi="Times New Roman"/>
           <w:sz w:val="24"/>
         </w:rPr>
-        <w:t>Table 1: Comparative summary of related systems</w:t>
+        <w:t>Figure 9: Safety and execution-validity comparison</w:t>
         <w:tab/>
-        <w:t>8</w:t>
+        <w:t>27</w:t>
+      </w:r>
+    </w:p>
+    <w:p>
+      <w:r>
+        <w:br w:type="page"/>
+      </w:r>
+    </w:p>
+    <w:p>
+      <w:pPr>
+        <w:spacing w:after="400" w:before="0" w:line="360" w:lineRule="auto"/>
+        <w:jc w:val="center"/>
+      </w:pPr>
+      <w:r>
+        <w:rPr>
+          <w:rFonts w:ascii="Times New Roman" w:hAnsi="Times New Roman"/>
+          <w:b/>
+          <w:i w:val="0"/>
+          <w:sz w:val="30"/>
+        </w:rPr>
+        <w:t>List of Tables</w:t>
       </w:r>
     </w:p>
     <w:p>
@@ -2046,9 +2046,9 @@
           <w:rFonts w:ascii="Times New Roman" w:hAnsi="Times New Roman"/>
           <w:sz w:val="24"/>
         </w:rPr>
-        <w:t>Table 3.1: Benchmark pattern classification</w:t>
+        <w:t>Table 1: Comparative summary of related systems</w:t>
         <w:tab/>
-        <w:t>11</w:t>
+        <w:t>8</w:t>
       </w:r>
     </w:p>
     <w:p>
@@ -2064,9 +2064,9 @@
           <w:rFonts w:ascii="Times New Roman" w:hAnsi="Times New Roman"/>
           <w:sz w:val="24"/>
         </w:rPr>
-        <w:t>Table 3.2: Semantic layer object model</w:t>
+        <w:t>Table 3.1: Benchmark pattern classification</w:t>
         <w:tab/>
-        <w:t>17</w:t>
+        <w:t>11</w:t>
       </w:r>
     </w:p>
     <w:p>
@@ -2082,9 +2082,9 @@
           <w:rFonts w:ascii="Times New Roman" w:hAnsi="Times New Roman"/>
           <w:sz w:val="24"/>
         </w:rPr>
-        <w:t>Table 3.3: AEGIS analytical patterns</w:t>
+        <w:t>Table 3.2: Semantic layer object model</w:t>
         <w:tab/>
-        <w:t>19</w:t>
+        <w:t>17</w:t>
       </w:r>
     </w:p>
     <w:p>
@@ -2100,9 +2100,45 @@
           <w:rFonts w:ascii="Times New Roman" w:hAnsi="Times New Roman"/>
           <w:sz w:val="24"/>
         </w:rPr>
+        <w:t>Table 3.3: AEGIS analytical patterns</w:t>
+        <w:tab/>
+        <w:t>19</w:t>
+      </w:r>
+    </w:p>
+    <w:p>
+      <w:pPr>
+        <w:spacing w:after="80" w:before="0" w:line="360" w:lineRule="auto"/>
+        <w:jc w:val="both"/>
+        <w:tabs>
+          <w:tab w:val="right" w:leader="dot" w:pos="8640"/>
+        </w:tabs>
+      </w:pPr>
+      <w:r>
+        <w:rPr>
+          <w:rFonts w:ascii="Times New Roman" w:hAnsi="Times New Roman"/>
+          <w:sz w:val="24"/>
+        </w:rPr>
         <w:t>Table 3.4: Visualization selector mapping</w:t>
         <w:tab/>
         <w:t>20</w:t>
+      </w:r>
+    </w:p>
+    <w:p>
+      <w:pPr>
+        <w:spacing w:after="80" w:before="0" w:line="360" w:lineRule="auto"/>
+        <w:jc w:val="both"/>
+        <w:tabs>
+          <w:tab w:val="right" w:leader="dot" w:pos="8640"/>
+        </w:tabs>
+      </w:pPr>
+      <w:r>
+        <w:rPr>
+          <w:rFonts w:ascii="Times New Roman" w:hAnsi="Times New Roman"/>
+          <w:sz w:val="24"/>
+        </w:rPr>
+        <w:t>Table 4.1: Experimental setup</w:t>
+        <w:tab/>
+        <w:t>23</w:t>
       </w:r>
     </w:p>
     <w:p>
@@ -2350,7 +2386,7 @@
           <w:i w:val="0"/>
           <w:sz w:val="24"/>
         </w:rPr>
-        <w:t>Natural language interfaces to databases (NLIDBs) try to solve this problem. The idea is simple: a user should be able to ask "which categories have the highest refund rates this month?" and get a correct, visual answer without writing SQL. Researchers have made good progress here. Neural text-to-SQL systems now exceed 90% accuracy on the Spider benchmark [1], and large language models can produce reasonable-looking SQL with minimal setup [2]. But there is still a gap between benchmark results and production-ready deployment.</w:t>
+        <w:t>Natural language interfaces to databases (NLIDBs) try to solve this problem. The idea is simple: a user should be able to ask "which categories have the highest refund rates this month?" and get a correct, visual answer without writing SQL. Researchers have made good progress here through benchmarks such as Spider [1] and BIRD [2]. But there is still a gap between benchmark results and production-ready deployment.</w:t>
       </w:r>
     </w:p>
     <w:p>
@@ -6303,7 +6339,7 @@
     </w:p>
     <w:p>
       <w:pPr>
-        <w:spacing w:after="200" w:before="0" w:line="360" w:lineRule="auto"/>
+        <w:spacing w:after="160" w:before="0" w:line="360" w:lineRule="auto"/>
         <w:jc w:val="both"/>
       </w:pPr>
       <w:r>
@@ -6313,12 +6349,99 @@
           <w:i w:val="0"/>
           <w:sz w:val="24"/>
         </w:rPr>
-        <w:t>This thesis follows a Design Science Research paradigm, in the sense used by Hevner et al.: knowledge is produced by building and evaluating a novel artifact that addresses an identified organizational problem, rather than by testing a hypothesis about an existing phenomenon. The artifact in this thesis is the AEGIS system itself. Design Science Research requires three things to be demonstrated: problem relevance, design rigor, and evaluation against the stated problem. Problem relevance is established through a formative study that analyzes real reporting behavior rather than assuming a problem exists. Design rigor is established through the formal model and threat model, which state precisely what safety property the architecture guarantees and under what boundary that guarantee holds. Evaluation uses a benchmark dataset constructed for this domain and true database execution checks that separate SQL safety from execution validity and semantic correctness.</w:t>
+        <w:t>This thesis follows a Design Science Research paradigm because the main contribution is a built and evaluated artifact: the AEGIS system. The paradigm is summarized through three requirements:</w:t>
       </w:r>
     </w:p>
     <w:p>
       <w:pPr>
-        <w:spacing w:after="0" w:before="0" w:line="360" w:lineRule="auto"/>
+        <w:spacing w:after="80" w:line="360" w:lineRule="auto"/>
+        <w:ind w:left="461" w:hanging="259"/>
+      </w:pPr>
+      <w:r>
+        <w:rPr>
+          <w:rFonts w:ascii="Times New Roman" w:hAnsi="Times New Roman"/>
+          <w:sz w:val="24"/>
+        </w:rPr>
+        <w:t>•</w:t>
+        <w:tab/>
+      </w:r>
+      <w:r>
+        <w:rPr>
+          <w:rFonts w:ascii="Times New Roman" w:hAnsi="Times New Roman"/>
+          <w:b/>
+          <w:sz w:val="24"/>
+        </w:rPr>
+        <w:t xml:space="preserve">Problem relevance: </w:t>
+      </w:r>
+      <w:r>
+        <w:rPr>
+          <w:rFonts w:ascii="Times New Roman" w:hAnsi="Times New Roman"/>
+          <w:sz w:val="24"/>
+        </w:rPr>
+        <w:t>Representative reporting requests motivate the need for the artifact.</w:t>
+      </w:r>
+    </w:p>
+    <w:p>
+      <w:pPr>
+        <w:spacing w:after="80" w:line="360" w:lineRule="auto"/>
+        <w:ind w:left="461" w:hanging="259"/>
+      </w:pPr>
+      <w:r>
+        <w:rPr>
+          <w:rFonts w:ascii="Times New Roman" w:hAnsi="Times New Roman"/>
+          <w:sz w:val="24"/>
+        </w:rPr>
+        <w:t>•</w:t>
+        <w:tab/>
+      </w:r>
+      <w:r>
+        <w:rPr>
+          <w:rFonts w:ascii="Times New Roman" w:hAnsi="Times New Roman"/>
+          <w:b/>
+          <w:sz w:val="24"/>
+        </w:rPr>
+        <w:t xml:space="preserve">Design rigor: </w:t>
+      </w:r>
+      <w:r>
+        <w:rPr>
+          <w:rFonts w:ascii="Times New Roman" w:hAnsi="Times New Roman"/>
+          <w:sz w:val="24"/>
+        </w:rPr>
+        <w:t>The semantic layer, threat model, and compiler boundaries define how the artifact is designed.</w:t>
+      </w:r>
+    </w:p>
+    <w:p>
+      <w:pPr>
+        <w:spacing w:after="80" w:line="360" w:lineRule="auto"/>
+        <w:ind w:left="461" w:hanging="259"/>
+      </w:pPr>
+      <w:r>
+        <w:rPr>
+          <w:rFonts w:ascii="Times New Roman" w:hAnsi="Times New Roman"/>
+          <w:sz w:val="24"/>
+        </w:rPr>
+        <w:t>•</w:t>
+        <w:tab/>
+      </w:r>
+      <w:r>
+        <w:rPr>
+          <w:rFonts w:ascii="Times New Roman" w:hAnsi="Times New Roman"/>
+          <w:b/>
+          <w:sz w:val="24"/>
+        </w:rPr>
+        <w:t xml:space="preserve">Evaluation: </w:t>
+      </w:r>
+      <w:r>
+        <w:rPr>
+          <w:rFonts w:ascii="Times New Roman" w:hAnsi="Times New Roman"/>
+          <w:sz w:val="24"/>
+        </w:rPr>
+        <w:t>The 107-request benchmark and true database execution checks evaluate safety, execution validity, and remaining correctness limits.</w:t>
+      </w:r>
+    </w:p>
+    <w:p>
+      <w:pPr>
+        <w:spacing w:after="120" w:before="0" w:line="360" w:lineRule="auto"/>
         <w:jc w:val="both"/>
       </w:pPr>
       <w:r>
@@ -6328,7 +6451,168 @@
           <w:i w:val="0"/>
           <w:sz w:val="24"/>
         </w:rPr>
-        <w:t>The research proceeded through three iterative build-evaluate cycles. The first cycle produced a semantic layer and compiler for a minimal set of intent classes and validated the core safety proposition on a small hand-written query set. The second cycle expanded coverage to all eleven intent classes identified in the formative study and introduced vocabulary injection after an early synonym-dictionary approach proved unable to keep pace with real query phrasing. The third cycle added the widget persistence layer and expanded the evaluation harness used for the thesis benchmark.</w:t>
+        <w:t>The artifact was refined through three build-evaluate cycles:</w:t>
+      </w:r>
+    </w:p>
+    <w:p>
+      <w:pPr>
+        <w:spacing w:after="80" w:line="360" w:lineRule="auto"/>
+        <w:ind w:left="461" w:hanging="259"/>
+      </w:pPr>
+      <w:r>
+        <w:rPr>
+          <w:rFonts w:ascii="Times New Roman" w:hAnsi="Times New Roman"/>
+          <w:sz w:val="24"/>
+        </w:rPr>
+        <w:t>•</w:t>
+        <w:tab/>
+      </w:r>
+      <w:r>
+        <w:rPr>
+          <w:rFonts w:ascii="Times New Roman" w:hAnsi="Times New Roman"/>
+          <w:b/>
+          <w:sz w:val="24"/>
+        </w:rPr>
+        <w:t xml:space="preserve">Cycle 1: </w:t>
+      </w:r>
+      <w:r>
+        <w:rPr>
+          <w:rFonts w:ascii="Times New Roman" w:hAnsi="Times New Roman"/>
+          <w:sz w:val="24"/>
+        </w:rPr>
+        <w:t>Built the initial semantic layer and compiler, then tested the core safety path.</w:t>
+      </w:r>
+    </w:p>
+    <w:p>
+      <w:pPr>
+        <w:spacing w:after="80" w:line="360" w:lineRule="auto"/>
+        <w:ind w:left="461" w:hanging="259"/>
+      </w:pPr>
+      <w:r>
+        <w:rPr>
+          <w:rFonts w:ascii="Times New Roman" w:hAnsi="Times New Roman"/>
+          <w:sz w:val="24"/>
+        </w:rPr>
+        <w:t>•</w:t>
+        <w:tab/>
+      </w:r>
+      <w:r>
+        <w:rPr>
+          <w:rFonts w:ascii="Times New Roman" w:hAnsi="Times New Roman"/>
+          <w:b/>
+          <w:sz w:val="24"/>
+        </w:rPr>
+        <w:t xml:space="preserve">Cycle 2: </w:t>
+      </w:r>
+      <w:r>
+        <w:rPr>
+          <w:rFonts w:ascii="Times New Roman" w:hAnsi="Times New Roman"/>
+          <w:sz w:val="24"/>
+        </w:rPr>
+        <w:t>Expanded coverage to the eleven analytical patterns and replaced manual synonym handling with vocabulary injection.</w:t>
+      </w:r>
+    </w:p>
+    <w:p>
+      <w:pPr>
+        <w:spacing w:after="80" w:line="360" w:lineRule="auto"/>
+        <w:ind w:left="461" w:hanging="259"/>
+      </w:pPr>
+      <w:r>
+        <w:rPr>
+          <w:rFonts w:ascii="Times New Roman" w:hAnsi="Times New Roman"/>
+          <w:sz w:val="24"/>
+        </w:rPr>
+        <w:t>•</w:t>
+        <w:tab/>
+      </w:r>
+      <w:r>
+        <w:rPr>
+          <w:rFonts w:ascii="Times New Roman" w:hAnsi="Times New Roman"/>
+          <w:b/>
+          <w:sz w:val="24"/>
+        </w:rPr>
+        <w:t xml:space="preserve">Cycle 3: </w:t>
+      </w:r>
+      <w:r>
+        <w:rPr>
+          <w:rFonts w:ascii="Times New Roman" w:hAnsi="Times New Roman"/>
+          <w:sz w:val="24"/>
+        </w:rPr>
+        <w:t>Added widget persistence and expanded the benchmark execution harness.</w:t>
+      </w:r>
+    </w:p>
+    <w:tbl>
+      <w:tblPr>
+        <w:tblW w:type="auto" w:w="0"/>
+        <w:jc w:val="center"/>
+        <w:tblLayout w:type="fixed"/>
+        <w:tblLook w:firstColumn="1" w:firstRow="1" w:lastColumn="0" w:lastRow="0" w:noHBand="0" w:noVBand="1" w:val="04A0"/>
+      </w:tblPr>
+      <w:tblGrid>
+        <w:gridCol w:w="9072"/>
+      </w:tblGrid>
+      <w:tr>
+        <w:trPr>
+          <w:trHeight w:val="2880"/>
+          <w:trHeight w:val="2880" w:hRule="atLeast"/>
+        </w:trPr>
+        <w:tc>
+          <w:tcPr>
+            <w:tcW w:type="dxa" w:w="9072"/>
+            <w:tcBorders>
+              <w:top w:val="dashed" w:sz="10" w:space="0" w:color="888888"/>
+              <w:left w:val="dashed" w:sz="10" w:space="0" w:color="888888"/>
+              <w:bottom w:val="dashed" w:sz="10" w:space="0" w:color="888888"/>
+              <w:right w:val="dashed" w:sz="10" w:space="0" w:color="888888"/>
+            </w:tcBorders>
+            <w:shd w:val="clear" w:fill="F7F7F7"/>
+          </w:tcPr>
+          <w:p>
+            <w:pPr>
+              <w:spacing w:before="280" w:after="120"/>
+              <w:jc w:val="center"/>
+            </w:pPr>
+            <w:r/>
+            <w:r>
+              <w:rPr>
+                <w:rFonts w:ascii="Times New Roman" w:hAnsi="Times New Roman"/>
+                <w:b/>
+                <w:color w:val="993300"/>
+                <w:sz w:val="21"/>
+              </w:rPr>
+              <w:t>[ PLACEHOLDER - FIGURE 1 NOT YET INSERTED ]</w:t>
+            </w:r>
+          </w:p>
+          <w:p>
+            <w:pPr>
+              <w:spacing w:after="160"/>
+              <w:jc w:val="center"/>
+            </w:pPr>
+            <w:r>
+              <w:rPr>
+                <w:rFonts w:ascii="Times New Roman" w:hAnsi="Times New Roman"/>
+                <w:b/>
+                <w:color w:val="333333"/>
+                <w:sz w:val="22"/>
+              </w:rPr>
+              <w:t>Design Science Research workflow for AEGIS</w:t>
+            </w:r>
+          </w:p>
+        </w:tc>
+      </w:tr>
+    </w:tbl>
+    <w:p>
+      <w:pPr>
+        <w:spacing w:before="120" w:after="280"/>
+        <w:jc w:val="center"/>
+      </w:pPr>
+      <w:r>
+        <w:rPr>
+          <w:rFonts w:ascii="Times New Roman" w:hAnsi="Times New Roman"/>
+          <w:b/>
+          <w:sz w:val="21"/>
+        </w:rPr>
+        <w:t>Figure 1: Design Science Research workflow for AEGIS</w:t>
       </w:r>
     </w:p>
     <w:p>
@@ -7866,7 +8150,7 @@
                 <w:color w:val="993300"/>
                 <w:sz w:val="21"/>
               </w:rPr>
-              <w:t>[ PLACEHOLDER - FIGURE 1 NOT YET INSERTED ]</w:t>
+              <w:t>[ PLACEHOLDER - FIGURE 2 NOT YET INSERTED ]</w:t>
             </w:r>
           </w:p>
           <w:p>
@@ -7898,7 +8182,7 @@
           <w:b/>
           <w:sz w:val="21"/>
         </w:rPr>
-        <w:t>Figure 1: Pattern classification of the answerable analytical benchmark subset</w:t>
+        <w:t>Figure 2: Pattern classification of the answerable analytical benchmark subset</w:t>
       </w:r>
     </w:p>
     <w:p>
@@ -8690,7 +8974,7 @@
                 <w:color w:val="993300"/>
                 <w:sz w:val="21"/>
               </w:rPr>
-              <w:t>[ PLACEHOLDER - FIGURE 2 NOT YET INSERTED ]</w:t>
+              <w:t>[ PLACEHOLDER - FIGURE 3 NOT YET INSERTED ]</w:t>
             </w:r>
           </w:p>
           <w:p>
@@ -8722,7 +9006,7 @@
           <w:b/>
           <w:sz w:val="21"/>
         </w:rPr>
-        <w:t>Figure 2: AEGIS architecture pipeline (User Request to Dashboard Widget)</w:t>
+        <w:t>Figure 3: AEGIS architecture pipeline (User Request to Dashboard Widget)</w:t>
       </w:r>
     </w:p>
     <w:p>
@@ -8793,7 +9077,7 @@
                 <w:color w:val="993300"/>
                 <w:sz w:val="21"/>
               </w:rPr>
-              <w:t>[ PLACEHOLDER - FIGURE 3 NOT YET INSERTED ]</w:t>
+              <w:t>[ PLACEHOLDER - FIGURE 4 NOT YET INSERTED ]</w:t>
             </w:r>
           </w:p>
           <w:p>
@@ -8825,7 +9109,7 @@
           <w:b/>
           <w:sz w:val="21"/>
         </w:rPr>
-        <w:t>Figure 3: Semantic layer modularity - composable blocks vs. free-form SQL generation</w:t>
+        <w:t>Figure 4: Semantic layer modularity - composable blocks vs. free-form SQL generation</w:t>
       </w:r>
     </w:p>
     <w:p>
@@ -9743,7 +10027,7 @@
                 <w:color w:val="993300"/>
                 <w:sz w:val="21"/>
               </w:rPr>
-              <w:t>[ PLACEHOLDER - FIGURE 4 NOT YET INSERTED ]</w:t>
+              <w:t>[ PLACEHOLDER - FIGURE 5 NOT YET INSERTED ]</w:t>
             </w:r>
           </w:p>
           <w:p>
@@ -9775,7 +10059,7 @@
           <w:b/>
           <w:sz w:val="21"/>
         </w:rPr>
-        <w:t>Figure 4: Vocabulary injection workflow</w:t>
+        <w:t>Figure 5: Vocabulary injection workflow</w:t>
       </w:r>
     </w:p>
     <w:p>
@@ -9851,7 +10135,7 @@
                 <w:color w:val="993300"/>
                 <w:sz w:val="21"/>
               </w:rPr>
-              <w:t>[ PLACEHOLDER - FIGURE 5 NOT YET INSERTED ]</w:t>
+              <w:t>[ PLACEHOLDER - FIGURE 6 NOT YET INSERTED ]</w:t>
             </w:r>
           </w:p>
           <w:p>
@@ -9883,7 +10167,7 @@
           <w:b/>
           <w:sz w:val="21"/>
         </w:rPr>
-        <w:t>Figure 5: Taxonomy of the eleven AEGIS analytical patterns</w:t>
+        <w:t>Figure 6: Taxonomy of the eleven AEGIS analytical patterns</w:t>
       </w:r>
     </w:p>
     <w:p>
@@ -11283,7 +11567,7 @@
                 <w:color w:val="993300"/>
                 <w:sz w:val="21"/>
               </w:rPr>
-              <w:t>[ PLACEHOLDER - FIGURE 6 NOT YET INSERTED ]</w:t>
+              <w:t>[ PLACEHOLDER - FIGURE 7 NOT YET INSERTED ]</w:t>
             </w:r>
           </w:p>
           <w:p>
@@ -11315,7 +11599,7 @@
           <w:b/>
           <w:sz w:val="21"/>
         </w:rPr>
-        <w:t>Figure 6: Two-layer SQL safety defence</w:t>
+        <w:t>Figure 7: Two-layer SQL safety defence</w:t>
       </w:r>
     </w:p>
     <w:p>
@@ -12444,7 +12728,7 @@
                 <w:color w:val="993300"/>
                 <w:sz w:val="21"/>
               </w:rPr>
-              <w:t>[ PLACEHOLDER - FIGURE 7 NOT YET INSERTED ]</w:t>
+              <w:t>[ PLACEHOLDER - FIGURE 8 NOT YET INSERTED ]</w:t>
             </w:r>
           </w:p>
           <w:p>
@@ -12476,7 +12760,7 @@
           <w:b/>
           <w:sz w:val="21"/>
         </w:rPr>
-        <w:t>Figure 7: Widget lifecycle and refresh model</w:t>
+        <w:t>Figure 8: Widget lifecycle and refresh model</w:t>
       </w:r>
     </w:p>
     <w:p>
@@ -12789,7 +13073,7 @@
     </w:p>
     <w:p>
       <w:pPr>
-        <w:spacing w:after="0" w:before="0" w:line="360" w:lineRule="auto"/>
+        <w:spacing w:after="160" w:before="0" w:line="360" w:lineRule="auto"/>
         <w:jc w:val="both"/>
       </w:pPr>
       <w:r>
@@ -12799,8 +13083,500 @@
           <w:i w:val="0"/>
           <w:sz w:val="24"/>
         </w:rPr>
-        <w:t>All experiments ran against a Docker-containerized MySQL 8.0 instance initialized with the AEGIS Truth Schema (126 tables, 107 foreign keys). The mock dataset used for evaluation contains 1,200 customers, 2,500 orders spanning 2024-2026, 6,298 order items, and 1,000 products mapped across 50 categories, sized to be representative of a mid-sized e-commerce deployment rather than a toy schema.</w:t>
-      </w:r>
+        <w:t>The experimental setup used a containerized relational database and a seeded e-commerce dataset, summarized in Table 4.1.</w:t>
+      </w:r>
+    </w:p>
+    <w:p>
+      <w:pPr>
+        <w:spacing w:before="200" w:after="80"/>
+        <w:jc w:val="center"/>
+        <w:keepNext/>
+      </w:pPr>
+      <w:r>
+        <w:rPr>
+          <w:rFonts w:ascii="Times New Roman" w:hAnsi="Times New Roman"/>
+          <w:b/>
+          <w:sz w:val="22"/>
+        </w:rPr>
+        <w:t>Table 4.1: Experimental setup.</w:t>
+      </w:r>
+    </w:p>
+    <w:tbl>
+      <w:tblPr>
+        <w:tblStyle w:val="TableGrid"/>
+        <w:tblW w:type="auto" w:w="0"/>
+        <w:jc w:val="center"/>
+        <w:tblLayout w:type="fixed"/>
+        <w:tblLook w:firstColumn="1" w:firstRow="1" w:lastColumn="0" w:lastRow="0" w:noHBand="0" w:noVBand="1" w:val="04A0"/>
+        <w:tblBorders>
+          <w:top w:val="single" w:sz="4" w:space="0" w:color="999999"/>
+          <w:left w:val="single" w:sz="4" w:space="0" w:color="999999"/>
+          <w:bottom w:val="single" w:sz="4" w:space="0" w:color="999999"/>
+          <w:right w:val="single" w:sz="4" w:space="0" w:color="999999"/>
+          <w:insideH w:val="single" w:sz="4" w:space="0" w:color="999999"/>
+          <w:insideV w:val="single" w:sz="4" w:space="0" w:color="999999"/>
+        </w:tblBorders>
+      </w:tblPr>
+      <w:tblGrid>
+        <w:gridCol w:w="2376"/>
+        <w:gridCol w:w="6120"/>
+      </w:tblGrid>
+      <w:tr>
+        <w:trPr>
+          <w:cantSplit/>
+        </w:trPr>
+        <w:tc>
+          <w:tcPr>
+            <w:tcW w:type="dxa" w:w="4513"/>
+          </w:tcPr>
+          <w:p>
+            <w:pPr>
+              <w:spacing w:before="0" w:after="0" w:line="240" w:lineRule="auto"/>
+              <w:jc w:val="center"/>
+              <w:keepNext/>
+            </w:pPr>
+            <w:r>
+              <w:rPr>
+                <w:rFonts w:ascii="Times New Roman" w:hAnsi="Times New Roman"/>
+                <w:b/>
+                <w:sz w:val="21"/>
+              </w:rPr>
+            </w:r>
+            <w:r>
+              <w:rPr>
+                <w:rFonts w:ascii="Times New Roman" w:hAnsi="Times New Roman"/>
+                <w:b/>
+                <w:sz w:val="21"/>
+              </w:rPr>
+              <w:t>Setup item</w:t>
+            </w:r>
+          </w:p>
+        </w:tc>
+        <w:tc>
+          <w:tcPr>
+            <w:tcW w:type="dxa" w:w="4513"/>
+          </w:tcPr>
+          <w:p>
+            <w:pPr>
+              <w:spacing w:before="0" w:after="0" w:line="240" w:lineRule="auto"/>
+              <w:jc w:val="center"/>
+              <w:keepNext/>
+            </w:pPr>
+            <w:r>
+              <w:rPr>
+                <w:rFonts w:ascii="Times New Roman" w:hAnsi="Times New Roman"/>
+                <w:b/>
+                <w:sz w:val="21"/>
+              </w:rPr>
+            </w:r>
+            <w:r>
+              <w:rPr>
+                <w:rFonts w:ascii="Times New Roman" w:hAnsi="Times New Roman"/>
+                <w:b/>
+                <w:sz w:val="21"/>
+              </w:rPr>
+              <w:t>Configuration</w:t>
+            </w:r>
+          </w:p>
+        </w:tc>
+      </w:tr>
+      <w:tr>
+        <w:trPr>
+          <w:cantSplit/>
+        </w:trPr>
+        <w:tc>
+          <w:tcPr>
+            <w:tcW w:type="dxa" w:w="2376"/>
+          </w:tcPr>
+          <w:p>
+            <w:pPr>
+              <w:spacing w:before="0" w:after="0" w:line="240" w:lineRule="auto"/>
+              <w:keepNext/>
+            </w:pPr>
+            <w:r>
+              <w:rPr>
+                <w:rFonts w:ascii="Times New Roman" w:hAnsi="Times New Roman"/>
+                <w:sz w:val="21"/>
+              </w:rPr>
+            </w:r>
+            <w:r>
+              <w:rPr>
+                <w:rFonts w:ascii="Times New Roman" w:hAnsi="Times New Roman"/>
+                <w:b w:val="0"/>
+                <w:sz w:val="21"/>
+              </w:rPr>
+              <w:t>Database engine</w:t>
+            </w:r>
+          </w:p>
+        </w:tc>
+        <w:tc>
+          <w:tcPr>
+            <w:tcW w:type="dxa" w:w="6120"/>
+          </w:tcPr>
+          <w:p>
+            <w:pPr>
+              <w:spacing w:before="0" w:after="0" w:line="240" w:lineRule="auto"/>
+              <w:jc w:val="center"/>
+              <w:keepNext/>
+            </w:pPr>
+            <w:r>
+              <w:rPr>
+                <w:rFonts w:ascii="Times New Roman" w:hAnsi="Times New Roman"/>
+                <w:sz w:val="21"/>
+              </w:rPr>
+            </w:r>
+            <w:r>
+              <w:rPr>
+                <w:rFonts w:ascii="Times New Roman" w:hAnsi="Times New Roman"/>
+                <w:b w:val="0"/>
+                <w:sz w:val="21"/>
+              </w:rPr>
+              <w:t>MySQL 8.0</w:t>
+            </w:r>
+          </w:p>
+        </w:tc>
+      </w:tr>
+      <w:tr>
+        <w:trPr>
+          <w:cantSplit/>
+        </w:trPr>
+        <w:tc>
+          <w:tcPr>
+            <w:tcW w:type="dxa" w:w="2376"/>
+          </w:tcPr>
+          <w:p>
+            <w:pPr>
+              <w:spacing w:before="0" w:after="0" w:line="240" w:lineRule="auto"/>
+              <w:keepNext/>
+            </w:pPr>
+            <w:r>
+              <w:rPr>
+                <w:rFonts w:ascii="Times New Roman" w:hAnsi="Times New Roman"/>
+                <w:sz w:val="21"/>
+              </w:rPr>
+            </w:r>
+            <w:r>
+              <w:rPr>
+                <w:rFonts w:ascii="Times New Roman" w:hAnsi="Times New Roman"/>
+                <w:b w:val="0"/>
+                <w:sz w:val="21"/>
+              </w:rPr>
+              <w:t>Execution mode</w:t>
+            </w:r>
+          </w:p>
+        </w:tc>
+        <w:tc>
+          <w:tcPr>
+            <w:tcW w:type="dxa" w:w="6120"/>
+          </w:tcPr>
+          <w:p>
+            <w:pPr>
+              <w:spacing w:before="0" w:after="0" w:line="240" w:lineRule="auto"/>
+              <w:jc w:val="center"/>
+              <w:keepNext/>
+            </w:pPr>
+            <w:r>
+              <w:rPr>
+                <w:rFonts w:ascii="Times New Roman" w:hAnsi="Times New Roman"/>
+                <w:sz w:val="21"/>
+              </w:rPr>
+            </w:r>
+            <w:r>
+              <w:rPr>
+                <w:rFonts w:ascii="Times New Roman" w:hAnsi="Times New Roman"/>
+                <w:b w:val="0"/>
+                <w:sz w:val="21"/>
+              </w:rPr>
+              <w:t>Docker container</w:t>
+            </w:r>
+          </w:p>
+        </w:tc>
+      </w:tr>
+      <w:tr>
+        <w:trPr>
+          <w:cantSplit/>
+        </w:trPr>
+        <w:tc>
+          <w:tcPr>
+            <w:tcW w:type="dxa" w:w="2376"/>
+          </w:tcPr>
+          <w:p>
+            <w:pPr>
+              <w:spacing w:before="0" w:after="0" w:line="240" w:lineRule="auto"/>
+              <w:keepNext/>
+            </w:pPr>
+            <w:r>
+              <w:rPr>
+                <w:rFonts w:ascii="Times New Roman" w:hAnsi="Times New Roman"/>
+                <w:sz w:val="21"/>
+              </w:rPr>
+            </w:r>
+            <w:r>
+              <w:rPr>
+                <w:rFonts w:ascii="Times New Roman" w:hAnsi="Times New Roman"/>
+                <w:b w:val="0"/>
+                <w:sz w:val="21"/>
+              </w:rPr>
+              <w:t>Schema</w:t>
+            </w:r>
+          </w:p>
+        </w:tc>
+        <w:tc>
+          <w:tcPr>
+            <w:tcW w:type="dxa" w:w="6120"/>
+          </w:tcPr>
+          <w:p>
+            <w:pPr>
+              <w:spacing w:before="0" w:after="0" w:line="240" w:lineRule="auto"/>
+              <w:jc w:val="center"/>
+              <w:keepNext/>
+            </w:pPr>
+            <w:r>
+              <w:rPr>
+                <w:rFonts w:ascii="Times New Roman" w:hAnsi="Times New Roman"/>
+                <w:sz w:val="21"/>
+              </w:rPr>
+            </w:r>
+            <w:r>
+              <w:rPr>
+                <w:rFonts w:ascii="Times New Roman" w:hAnsi="Times New Roman"/>
+                <w:b w:val="0"/>
+                <w:sz w:val="21"/>
+              </w:rPr>
+              <w:t>AEGIS Truth Schema based on nopCommerce 4.70</w:t>
+            </w:r>
+          </w:p>
+        </w:tc>
+      </w:tr>
+      <w:tr>
+        <w:trPr>
+          <w:cantSplit/>
+        </w:trPr>
+        <w:tc>
+          <w:tcPr>
+            <w:tcW w:type="dxa" w:w="2376"/>
+          </w:tcPr>
+          <w:p>
+            <w:pPr>
+              <w:spacing w:before="0" w:after="0" w:line="240" w:lineRule="auto"/>
+              <w:keepNext/>
+            </w:pPr>
+            <w:r>
+              <w:rPr>
+                <w:rFonts w:ascii="Times New Roman" w:hAnsi="Times New Roman"/>
+                <w:sz w:val="21"/>
+              </w:rPr>
+            </w:r>
+            <w:r>
+              <w:rPr>
+                <w:rFonts w:ascii="Times New Roman" w:hAnsi="Times New Roman"/>
+                <w:b w:val="0"/>
+                <w:sz w:val="21"/>
+              </w:rPr>
+              <w:t>Schema size</w:t>
+            </w:r>
+          </w:p>
+        </w:tc>
+        <w:tc>
+          <w:tcPr>
+            <w:tcW w:type="dxa" w:w="6120"/>
+          </w:tcPr>
+          <w:p>
+            <w:pPr>
+              <w:spacing w:before="0" w:after="0" w:line="240" w:lineRule="auto"/>
+              <w:jc w:val="center"/>
+              <w:keepNext/>
+            </w:pPr>
+            <w:r>
+              <w:rPr>
+                <w:rFonts w:ascii="Times New Roman" w:hAnsi="Times New Roman"/>
+                <w:sz w:val="21"/>
+              </w:rPr>
+            </w:r>
+            <w:r>
+              <w:rPr>
+                <w:rFonts w:ascii="Times New Roman" w:hAnsi="Times New Roman"/>
+                <w:b w:val="0"/>
+                <w:sz w:val="21"/>
+              </w:rPr>
+              <w:t>126 tables and 107 foreign keys</w:t>
+            </w:r>
+          </w:p>
+        </w:tc>
+      </w:tr>
+      <w:tr>
+        <w:trPr>
+          <w:cantSplit/>
+        </w:trPr>
+        <w:tc>
+          <w:tcPr>
+            <w:tcW w:type="dxa" w:w="2376"/>
+          </w:tcPr>
+          <w:p>
+            <w:pPr>
+              <w:spacing w:before="0" w:after="0" w:line="240" w:lineRule="auto"/>
+              <w:keepNext/>
+            </w:pPr>
+            <w:r>
+              <w:rPr>
+                <w:rFonts w:ascii="Times New Roman" w:hAnsi="Times New Roman"/>
+                <w:sz w:val="21"/>
+              </w:rPr>
+            </w:r>
+            <w:r>
+              <w:rPr>
+                <w:rFonts w:ascii="Times New Roman" w:hAnsi="Times New Roman"/>
+                <w:b w:val="0"/>
+                <w:sz w:val="21"/>
+              </w:rPr>
+              <w:t>Dataset scale</w:t>
+            </w:r>
+          </w:p>
+        </w:tc>
+        <w:tc>
+          <w:tcPr>
+            <w:tcW w:type="dxa" w:w="6120"/>
+          </w:tcPr>
+          <w:p>
+            <w:pPr>
+              <w:spacing w:before="0" w:after="0" w:line="240" w:lineRule="auto"/>
+              <w:jc w:val="center"/>
+              <w:keepNext/>
+            </w:pPr>
+            <w:r>
+              <w:rPr>
+                <w:rFonts w:ascii="Times New Roman" w:hAnsi="Times New Roman"/>
+                <w:sz w:val="21"/>
+              </w:rPr>
+            </w:r>
+            <w:r>
+              <w:rPr>
+                <w:rFonts w:ascii="Times New Roman" w:hAnsi="Times New Roman"/>
+                <w:b w:val="0"/>
+                <w:sz w:val="21"/>
+              </w:rPr>
+              <w:t>1,200 customers, 2,500 orders, 6,298 order items, 1,000 products, and 50 categories</w:t>
+            </w:r>
+          </w:p>
+        </w:tc>
+      </w:tr>
+      <w:tr>
+        <w:trPr>
+          <w:cantSplit/>
+        </w:trPr>
+        <w:tc>
+          <w:tcPr>
+            <w:tcW w:type="dxa" w:w="2376"/>
+          </w:tcPr>
+          <w:p>
+            <w:pPr>
+              <w:spacing w:before="0" w:after="0" w:line="240" w:lineRule="auto"/>
+              <w:keepNext/>
+            </w:pPr>
+            <w:r>
+              <w:rPr>
+                <w:rFonts w:ascii="Times New Roman" w:hAnsi="Times New Roman"/>
+                <w:sz w:val="21"/>
+              </w:rPr>
+            </w:r>
+            <w:r>
+              <w:rPr>
+                <w:rFonts w:ascii="Times New Roman" w:hAnsi="Times New Roman"/>
+                <w:b w:val="0"/>
+                <w:sz w:val="21"/>
+              </w:rPr>
+              <w:t>Data period</w:t>
+            </w:r>
+          </w:p>
+        </w:tc>
+        <w:tc>
+          <w:tcPr>
+            <w:tcW w:type="dxa" w:w="6120"/>
+          </w:tcPr>
+          <w:p>
+            <w:pPr>
+              <w:spacing w:before="0" w:after="0" w:line="240" w:lineRule="auto"/>
+              <w:jc w:val="center"/>
+              <w:keepNext/>
+            </w:pPr>
+            <w:r>
+              <w:rPr>
+                <w:rFonts w:ascii="Times New Roman" w:hAnsi="Times New Roman"/>
+                <w:sz w:val="21"/>
+              </w:rPr>
+            </w:r>
+            <w:r>
+              <w:rPr>
+                <w:rFonts w:ascii="Times New Roman" w:hAnsi="Times New Roman"/>
+                <w:b w:val="0"/>
+                <w:sz w:val="21"/>
+              </w:rPr>
+              <w:t>Orders spanning 2024 to 2026</w:t>
+            </w:r>
+          </w:p>
+        </w:tc>
+      </w:tr>
+      <w:tr>
+        <w:trPr>
+          <w:cantSplit/>
+        </w:trPr>
+        <w:tc>
+          <w:tcPr>
+            <w:tcW w:type="dxa" w:w="2376"/>
+          </w:tcPr>
+          <w:p>
+            <w:pPr>
+              <w:spacing w:before="0" w:after="0" w:line="240" w:lineRule="auto"/>
+              <w:keepNext/>
+            </w:pPr>
+            <w:r>
+              <w:rPr>
+                <w:rFonts w:ascii="Times New Roman" w:hAnsi="Times New Roman"/>
+                <w:sz w:val="21"/>
+              </w:rPr>
+            </w:r>
+            <w:r>
+              <w:rPr>
+                <w:rFonts w:ascii="Times New Roman" w:hAnsi="Times New Roman"/>
+                <w:b w:val="0"/>
+                <w:sz w:val="21"/>
+              </w:rPr>
+              <w:t>Evaluation scope</w:t>
+            </w:r>
+          </w:p>
+        </w:tc>
+        <w:tc>
+          <w:tcPr>
+            <w:tcW w:type="dxa" w:w="6120"/>
+          </w:tcPr>
+          <w:p>
+            <w:pPr>
+              <w:spacing w:before="0" w:after="0" w:line="240" w:lineRule="auto"/>
+              <w:jc w:val="center"/>
+              <w:keepNext/>
+            </w:pPr>
+            <w:r>
+              <w:rPr>
+                <w:rFonts w:ascii="Times New Roman" w:hAnsi="Times New Roman"/>
+                <w:sz w:val="21"/>
+              </w:rPr>
+            </w:r>
+            <w:r>
+              <w:rPr>
+                <w:rFonts w:ascii="Times New Roman" w:hAnsi="Times New Roman"/>
+                <w:b w:val="0"/>
+                <w:sz w:val="21"/>
+              </w:rPr>
+              <w:t>Mid-sized e-commerce analytics workload</w:t>
+            </w:r>
+          </w:p>
+        </w:tc>
+      </w:tr>
+    </w:tbl>
+    <w:p>
+      <w:pPr>
+        <w:spacing w:after="80"/>
+      </w:pPr>
     </w:p>
     <w:p>
       <w:pPr>
@@ -14839,7 +15615,7 @@
                 <w:color w:val="993300"/>
                 <w:sz w:val="21"/>
               </w:rPr>
-              <w:t>[ PLACEHOLDER - FIGURE 8 NOT YET INSERTED ]</w:t>
+              <w:t>[ PLACEHOLDER - FIGURE 9 NOT YET INSERTED ]</w:t>
             </w:r>
           </w:p>
           <w:p>
@@ -14871,7 +15647,7 @@
           <w:b/>
           <w:sz w:val="21"/>
         </w:rPr>
-        <w:t>Figure 8: Verified safety and execution-validity comparison</w:t>
+        <w:t>Figure 9: Verified safety and execution-validity comparison</w:t>
       </w:r>
     </w:p>
     <w:p>
@@ -17867,14 +18643,14 @@
           <w:b/>
           <w:sz w:val="24"/>
         </w:rPr>
-        <w:t xml:space="preserve">Template expansion: </w:t>
+        <w:t xml:space="preserve">Correctness annotation: </w:t>
       </w:r>
       <w:r>
         <w:rPr>
           <w:rFonts w:ascii="Times New Roman" w:hAnsi="Times New Roman"/>
           <w:sz w:val="24"/>
         </w:rPr>
-        <w:t>New analytical patterns require new compiler templates and SQL knowledge.</w:t>
+        <w:t>A misclassified intent can produce a safe but semantically wrong query, so semantic correctness must be annotated and measured separately from SQL safety.</w:t>
       </w:r>
     </w:p>
     <w:p>
@@ -17896,14 +18672,14 @@
           <w:b/>
           <w:sz w:val="24"/>
         </w:rPr>
-        <w:t xml:space="preserve">Intent extraction quality: </w:t>
+        <w:t xml:space="preserve">Benchmark scope: </w:t>
       </w:r>
       <w:r>
         <w:rPr>
           <w:rFonts w:ascii="Times New Roman" w:hAnsi="Times New Roman"/>
           <w:sz w:val="24"/>
         </w:rPr>
-        <w:t>A misclassified intent can produce a safe but semantically wrong query, so accuracy must be measured separately from safety.</w:t>
+        <w:t>The custom 107-request benchmark evaluates AEGIS in one domain and is not directly comparable to Spider or BIRD leaderboard scores.</w:t>
       </w:r>
     </w:p>
     <w:p>
@@ -17925,18 +18701,32 @@
           <w:b/>
           <w:sz w:val="24"/>
         </w:rPr>
-        <w:t xml:space="preserve">Benchmark scope: </w:t>
+        <w:t xml:space="preserve">Prototype engineering limits: </w:t>
       </w:r>
       <w:r>
         <w:rPr>
           <w:rFonts w:ascii="Times New Roman" w:hAnsi="Times New Roman"/>
           <w:sz w:val="24"/>
         </w:rPr>
-        <w:t>The custom 107-request benchmark evaluates AEGIS in one domain and is not directly comparable to Spider or BIRD leaderboard scores.</w:t>
+        <w:t>The current version targets MySQL, uses prototype widget storage, and handles each request independently without multi-turn context.</w:t>
       </w:r>
     </w:p>
     <w:p>
       <w:pPr>
+        <w:spacing w:before="320" w:after="160"/>
+        <w:jc w:val="left"/>
+      </w:pPr>
+      <w:r>
+        <w:rPr>
+          <w:rFonts w:ascii="Times New Roman" w:hAnsi="Times New Roman"/>
+          <w:b/>
+          <w:sz w:val="28"/>
+        </w:rPr>
+        <w:t>6.2  Future Work</w:t>
+      </w:r>
+    </w:p>
+    <w:p>
+      <w:pPr>
         <w:spacing w:after="80" w:line="360" w:lineRule="auto"/>
         <w:ind w:left="461" w:hanging="259"/>
       </w:pPr>
@@ -17954,14 +18744,14 @@
           <w:b/>
           <w:sz w:val="24"/>
         </w:rPr>
-        <w:t xml:space="preserve">Semantic layer scale: </w:t>
+        <w:t xml:space="preserve">Clarification requests: </w:t>
       </w:r>
       <w:r>
         <w:rPr>
           <w:rFonts w:ascii="Times New Roman" w:hAnsi="Times New Roman"/>
           <w:sz w:val="24"/>
         </w:rPr>
-        <w:t>Very large vocabularies may require retrieval-assisted selection instead of injecting the whole semantic layer.</w:t>
+        <w:t>When confidence is low, AEGIS should ask a follow-up question instead of guessing, for example "did you mean revenue or profit?"</w:t>
       </w:r>
     </w:p>
     <w:p>
@@ -17983,14 +18773,14 @@
           <w:b/>
           <w:sz w:val="24"/>
         </w:rPr>
-        <w:t xml:space="preserve">Database portability: </w:t>
+        <w:t xml:space="preserve">Semantic-layer tooling: </w:t>
       </w:r>
       <w:r>
         <w:rPr>
           <w:rFonts w:ascii="Times New Roman" w:hAnsi="Times New Roman"/>
           <w:sz w:val="24"/>
         </w:rPr>
-        <w:t>The current compiler targets MySQL; PostgreSQL or SQL Server support would require dialect-specific compiler extensions.</w:t>
+        <w:t>A guided interface should let business analysts define new metrics and dimensions, join paths, and approved vocabulary without editing Python code.</w:t>
       </w:r>
     </w:p>
     <w:p>
@@ -18012,14 +18802,14 @@
           <w:b/>
           <w:sz w:val="24"/>
         </w:rPr>
-        <w:t xml:space="preserve">Storage persistence: </w:t>
+        <w:t xml:space="preserve">Stronger evaluation: </w:t>
       </w:r>
       <w:r>
         <w:rPr>
           <w:rFonts w:ascii="Times New Roman" w:hAnsi="Times New Roman"/>
           <w:sz w:val="24"/>
         </w:rPr>
-        <w:t>The prototype uses JSON flat files for widget storage; production deployment should use a database-backed registry.</w:t>
+        <w:t>Annotated expected answers, B2 and B4 baselines, latency measurements, and correctness reporting should be added to strengthen the evaluation.</w:t>
       </w:r>
     </w:p>
     <w:p>
@@ -18041,14 +18831,14 @@
           <w:b/>
           <w:sz w:val="24"/>
         </w:rPr>
-        <w:t xml:space="preserve">Multi-turn conversation: </w:t>
+        <w:t xml:space="preserve">Cross-schema evaluation: </w:t>
       </w:r>
       <w:r>
         <w:rPr>
           <w:rFonts w:ascii="Times New Roman" w:hAnsi="Times New Roman"/>
           <w:sz w:val="24"/>
         </w:rPr>
-        <w:t>Each request is handled independently, so follow-up questions and contextual carryover are not yet implemented.</w:t>
+        <w:t>A second schema, such as WooCommerce, should be evaluated while keeping the intent parser contract, compiler structure, and safety scanner unchanged.</w:t>
       </w:r>
     </w:p>
     <w:p>
@@ -18070,310 +18860,14 @@
           <w:b/>
           <w:sz w:val="24"/>
         </w:rPr>
-        <w:t xml:space="preserve">Domain vocabulary: </w:t>
+        <w:t xml:space="preserve">Production hardening: </w:t>
       </w:r>
       <w:r>
         <w:rPr>
           <w:rFonts w:ascii="Times New Roman" w:hAnsi="Times New Roman"/>
           <w:sz w:val="24"/>
         </w:rPr>
-        <w:t>Highly specialized terminology may require extra few-shot examples beyond the injected label and description pairs.</w:t>
-      </w:r>
-    </w:p>
-    <w:p>
-      <w:pPr>
-        <w:spacing w:before="320" w:after="160"/>
-        <w:jc w:val="left"/>
-      </w:pPr>
-      <w:r>
-        <w:rPr>
-          <w:rFonts w:ascii="Times New Roman" w:hAnsi="Times New Roman"/>
-          <w:b/>
-          <w:sz w:val="28"/>
-        </w:rPr>
-        <w:t>6.2  Future Work</w:t>
-      </w:r>
-    </w:p>
-    <w:p>
-      <w:pPr>
-        <w:spacing w:after="80" w:line="360" w:lineRule="auto"/>
-        <w:ind w:left="461" w:hanging="259"/>
-      </w:pPr>
-      <w:r>
-        <w:rPr>
-          <w:rFonts w:ascii="Times New Roman" w:hAnsi="Times New Roman"/>
-          <w:sz w:val="24"/>
-        </w:rPr>
-        <w:t>•</w:t>
-        <w:tab/>
-      </w:r>
-      <w:r>
-        <w:rPr>
-          <w:rFonts w:ascii="Times New Roman" w:hAnsi="Times New Roman"/>
-          <w:b/>
-          <w:sz w:val="24"/>
-        </w:rPr>
-        <w:t xml:space="preserve">Clarification requests: </w:t>
-      </w:r>
-      <w:r>
-        <w:rPr>
-          <w:rFonts w:ascii="Times New Roman" w:hAnsi="Times New Roman"/>
-          <w:sz w:val="24"/>
-        </w:rPr>
-        <w:t>When confidence is low, AEGIS should ask a follow-up question instead of guessing, for example "did you mean revenue or profit?"</w:t>
-      </w:r>
-    </w:p>
-    <w:p>
-      <w:pPr>
-        <w:spacing w:after="80" w:line="360" w:lineRule="auto"/>
-        <w:ind w:left="461" w:hanging="259"/>
-      </w:pPr>
-      <w:r>
-        <w:rPr>
-          <w:rFonts w:ascii="Times New Roman" w:hAnsi="Times New Roman"/>
-          <w:sz w:val="24"/>
-        </w:rPr>
-        <w:t>•</w:t>
-        <w:tab/>
-      </w:r>
-      <w:r>
-        <w:rPr>
-          <w:rFonts w:ascii="Times New Roman" w:hAnsi="Times New Roman"/>
-          <w:b/>
-          <w:sz w:val="24"/>
-        </w:rPr>
-        <w:t xml:space="preserve">Semantic layer wizard: </w:t>
-      </w:r>
-      <w:r>
-        <w:rPr>
-          <w:rFonts w:ascii="Times New Roman" w:hAnsi="Times New Roman"/>
-          <w:sz w:val="24"/>
-        </w:rPr>
-        <w:t>A guided interface should let business analysts define new metrics and dimensions without writing Python.</w:t>
-      </w:r>
-    </w:p>
-    <w:p>
-      <w:pPr>
-        <w:spacing w:after="80" w:line="360" w:lineRule="auto"/>
-        <w:ind w:left="461" w:hanging="259"/>
-      </w:pPr>
-      <w:r>
-        <w:rPr>
-          <w:rFonts w:ascii="Times New Roman" w:hAnsi="Times New Roman"/>
-          <w:sz w:val="24"/>
-        </w:rPr>
-        <w:t>•</w:t>
-        <w:tab/>
-      </w:r>
-      <w:r>
-        <w:rPr>
-          <w:rFonts w:ascii="Times New Roman" w:hAnsi="Times New Roman"/>
-          <w:b/>
-          <w:sz w:val="24"/>
-        </w:rPr>
-        <w:t xml:space="preserve">Multi-step queries: </w:t>
-      </w:r>
-      <w:r>
-        <w:rPr>
-          <w:rFonts w:ascii="Times New Roman" w:hAnsi="Times New Roman"/>
-          <w:sz w:val="24"/>
-        </w:rPr>
-        <w:t>Compound questions such as "revenue trend and top 5 products side by side" should create multiple coordinated widgets instead of requiring separate queries.</w:t>
-      </w:r>
-    </w:p>
-    <w:p>
-      <w:pPr>
-        <w:spacing w:after="80" w:line="360" w:lineRule="auto"/>
-        <w:ind w:left="461" w:hanging="259"/>
-      </w:pPr>
-      <w:r>
-        <w:rPr>
-          <w:rFonts w:ascii="Times New Roman" w:hAnsi="Times New Roman"/>
-          <w:sz w:val="24"/>
-        </w:rPr>
-        <w:t>•</w:t>
-        <w:tab/>
-      </w:r>
-      <w:r>
-        <w:rPr>
-          <w:rFonts w:ascii="Times New Roman" w:hAnsi="Times New Roman"/>
-          <w:b/>
-          <w:sz w:val="24"/>
-        </w:rPr>
-        <w:t xml:space="preserve">Automated denial-of-service protection: </w:t>
-      </w:r>
-      <w:r>
-        <w:rPr>
-          <w:rFonts w:ascii="Times New Roman" w:hAnsi="Times New Roman"/>
-          <w:sz w:val="24"/>
-        </w:rPr>
-        <w:t>Query complexity scoring and server-side timeout enforcement should be added because the join graph bounds query shape but does not currently score runtime cost.</w:t>
-      </w:r>
-    </w:p>
-    <w:p>
-      <w:pPr>
-        <w:spacing w:after="80" w:line="360" w:lineRule="auto"/>
-        <w:ind w:left="461" w:hanging="259"/>
-      </w:pPr>
-      <w:r>
-        <w:rPr>
-          <w:rFonts w:ascii="Times New Roman" w:hAnsi="Times New Roman"/>
-          <w:sz w:val="24"/>
-        </w:rPr>
-        <w:t>•</w:t>
-        <w:tab/>
-      </w:r>
-      <w:r>
-        <w:rPr>
-          <w:rFonts w:ascii="Times New Roman" w:hAnsi="Times New Roman"/>
-          <w:b/>
-          <w:sz w:val="24"/>
-        </w:rPr>
-        <w:t xml:space="preserve">Broader schema coverage: </w:t>
-      </w:r>
-      <w:r>
-        <w:rPr>
-          <w:rFonts w:ascii="Times New Roman" w:hAnsi="Times New Roman"/>
-          <w:sz w:val="24"/>
-        </w:rPr>
-        <w:t>The nopCommerce semantic layer should be extended to cover promotions, vendor analytics, and content-management engagement metrics.</w:t>
-      </w:r>
-    </w:p>
-    <w:p>
-      <w:pPr>
-        <w:spacing w:after="80" w:line="360" w:lineRule="auto"/>
-        <w:ind w:left="461" w:hanging="259"/>
-      </w:pPr>
-      <w:r>
-        <w:rPr>
-          <w:rFonts w:ascii="Times New Roman" w:hAnsi="Times New Roman"/>
-          <w:sz w:val="24"/>
-        </w:rPr>
-        <w:t>•</w:t>
-        <w:tab/>
-      </w:r>
-      <w:r>
-        <w:rPr>
-          <w:rFonts w:ascii="Times New Roman" w:hAnsi="Times New Roman"/>
-          <w:sz w:val="24"/>
-        </w:rPr>
-        <w:t>Multi-turn conversational carryover, extending the single-turn design discussed above.</w:t>
-      </w:r>
-    </w:p>
-    <w:p>
-      <w:pPr>
-        <w:spacing w:after="80" w:line="360" w:lineRule="auto"/>
-        <w:ind w:left="461" w:hanging="259"/>
-      </w:pPr>
-      <w:r>
-        <w:rPr>
-          <w:rFonts w:ascii="Times New Roman" w:hAnsi="Times New Roman"/>
-          <w:sz w:val="24"/>
-        </w:rPr>
-        <w:t>•</w:t>
-        <w:tab/>
-      </w:r>
-      <w:r>
-        <w:rPr>
-          <w:rFonts w:ascii="Times New Roman" w:hAnsi="Times New Roman"/>
-          <w:b/>
-          <w:sz w:val="24"/>
-        </w:rPr>
-        <w:t xml:space="preserve">Outcome and rejection-category instrumentation: </w:t>
-      </w:r>
-      <w:r>
-        <w:rPr>
-          <w:rFonts w:ascii="Times New Roman" w:hAnsi="Times New Roman"/>
-          <w:sz w:val="24"/>
-        </w:rPr>
-        <w:t>Future runs should measure the proportion of requests answered directly, answered after clarification, answered after a semantic-layer extension, or rejected.</w:t>
-      </w:r>
-    </w:p>
-    <w:p>
-      <w:pPr>
-        <w:spacing w:after="80" w:line="360" w:lineRule="auto"/>
-        <w:ind w:left="461" w:hanging="259"/>
-      </w:pPr>
-      <w:r>
-        <w:rPr>
-          <w:rFonts w:ascii="Times New Roman" w:hAnsi="Times New Roman"/>
-          <w:sz w:val="24"/>
-        </w:rPr>
-        <w:t>•</w:t>
-        <w:tab/>
-      </w:r>
-      <w:r>
-        <w:rPr>
-          <w:rFonts w:ascii="Times New Roman" w:hAnsi="Times New Roman"/>
-          <w:b/>
-          <w:sz w:val="24"/>
-        </w:rPr>
-        <w:t xml:space="preserve">Semantic correctness benchmark: </w:t>
-      </w:r>
-      <w:r>
-        <w:rPr>
-          <w:rFonts w:ascii="Times New Roman" w:hAnsi="Times New Roman"/>
-          <w:sz w:val="24"/>
-        </w:rPr>
-        <w:t>Annotated expected-answer labels should be added for the 107 mixed requests so correctness can be reported separately from SQL safety and true execution validity.</w:t>
-      </w:r>
-    </w:p>
-    <w:p>
-      <w:pPr>
-        <w:spacing w:after="80" w:line="360" w:lineRule="auto"/>
-        <w:ind w:left="461" w:hanging="259"/>
-      </w:pPr>
-      <w:r>
-        <w:rPr>
-          <w:rFonts w:ascii="Times New Roman" w:hAnsi="Times New Roman"/>
-          <w:sz w:val="24"/>
-        </w:rPr>
-        <w:t>•</w:t>
-        <w:tab/>
-      </w:r>
-      <w:r>
-        <w:rPr>
-          <w:rFonts w:ascii="Times New Roman" w:hAnsi="Times New Roman"/>
-          <w:b/>
-          <w:sz w:val="24"/>
-        </w:rPr>
-        <w:t xml:space="preserve">Cross-schema generalizability benchmark: </w:t>
-      </w:r>
-      <w:r>
-        <w:rPr>
-          <w:rFonts w:ascii="Times New Roman" w:hAnsi="Times New Roman"/>
-          <w:sz w:val="24"/>
-        </w:rPr>
-        <w:t>A second schema, such as WooCommerce, should be evaluated while keeping the intent parser contract, compiler structure, and safety scanner unchanged.</w:t>
-      </w:r>
-    </w:p>
-    <w:p>
-      <w:pPr>
-        <w:spacing w:after="80" w:line="360" w:lineRule="auto"/>
-        <w:ind w:left="461" w:hanging="259"/>
-      </w:pPr>
-      <w:r>
-        <w:rPr>
-          <w:rFonts w:ascii="Times New Roman" w:hAnsi="Times New Roman"/>
-          <w:sz w:val="24"/>
-        </w:rPr>
-        <w:t>•</w:t>
-        <w:tab/>
-      </w:r>
-      <w:r>
-        <w:rPr>
-          <w:rFonts w:ascii="Times New Roman" w:hAnsi="Times New Roman"/>
-          <w:b/>
-          <w:sz w:val="24"/>
-        </w:rPr>
-        <w:t xml:space="preserve">Remaining baselines and latency: </w:t>
-      </w:r>
-      <w:r>
-        <w:rPr>
-          <w:rFonts w:ascii="Times New Roman" w:hAnsi="Times New Roman"/>
-          <w:sz w:val="24"/>
-        </w:rPr>
-        <w:t>B2 and B4 should be completed, and pipeline latency should be instrumented with repeatable timing logs.</w:t>
+        <w:t>Query-cost controls, database-backed widget storage, broader schema coverage, and multi-turn support should be added before production deployment.</w:t>
       </w:r>
     </w:p>
     <w:p>

</xml_diff>

<commit_message>
Remove thesis internal navigation prose
</commit_message>
<xml_diff>
--- a/docs/scripts/AEGIS Thesis Book Draft - A Constraint-Based Architecture for Safe LLM-Assisted Natural Language Analytics.docx
+++ b/docs/scripts/AEGIS Thesis Book Draft - A Constraint-Based Architecture for Safe LLM-Assisted Natural Language Analytics.docx
@@ -823,7 +823,7 @@
           <w:i w:val="0"/>
           <w:sz w:val="24"/>
         </w:rPr>
-        <w:t>I would like to express my sincere gratitude to my supervisor, Mst. Sahela Rahman, Lecturer, Department of Computer Science &amp; Engineering, Pundra University of Science &amp; Technology, for her continuous guidance, patience, and constructive feedback throughout the design, implementation, and evaluation of this research. Her insistence on precise, defensible claims shaped this thesis at every stage, from the formal safety proof to the honesty of its limitations section.</w:t>
+        <w:t>I would like to express my sincere gratitude to my supervisor, Mst. Sahela Rahman, Lecturer, Department of Computer Science &amp; Engineering, Pundra University of Science &amp; Technology, for her continuous guidance, patience, and constructive feedback throughout the design, implementation, and evaluation of this research. Her insistence on precise, defensible claims shaped this thesis at every stage, from the formal safety proof to the honesty of its discussion of limitations.</w:t>
       </w:r>
     </w:p>
     <w:p>
@@ -2761,7 +2761,7 @@
           <w:i w:val="0"/>
           <w:sz w:val="24"/>
         </w:rPr>
-        <w:t>This chapter reviews the work most directly comparable to AEGIS. The discussion is organized as short review blocks so each source can be checked quickly by contribution, limitation, and the specific gap it leaves for this thesis.</w:t>
+        <w:t>The literature review focuses on the work most directly comparable to AEGIS. It is organized as short review blocks so each source can be checked quickly by contribution, limitation, and the specific gap it leaves for this thesis.</w:t>
       </w:r>
     </w:p>
     <w:p>
@@ -6641,7 +6641,7 @@
           <w:i w:val="0"/>
           <w:sz w:val="24"/>
         </w:rPr>
-        <w:t>The eleven-pattern taxonomy used throughout this thesis (Table 3.2) originates from a design-time review of representative e-commerce and administrative reporting requests, conducted by the author while designing AEGIS. This was a qualitative review carried out by a single researcher during system design, not an independently annotated, inter-rater-validated study, and no separate annotated dataset accompanies this thesis. An earlier version of this chapter reported specific percentages and an inter-rater reliability statistic for a larger unpublished dataset; that dataset was not published alongside this thesis, so those figures have been withdrawn.</w:t>
+        <w:t>The eleven-pattern taxonomy used throughout this thesis (Table 3.2) originates from a design-time review of representative e-commerce and administrative reporting requests, conducted by the author while designing AEGIS. This was a qualitative review carried out by a single researcher during system design, not an independently annotated, inter-rater-validated study, and no separate annotated dataset accompanies this thesis. An earlier draft reported specific percentages and an inter-rater reliability statistic for a larger unpublished dataset; that dataset was not published alongside this thesis, so those figures have been withdrawn.</w:t>
       </w:r>
     </w:p>
     <w:p>
@@ -8197,7 +8197,7 @@
           <w:i w:val="0"/>
           <w:sz w:val="24"/>
         </w:rPr>
-        <w:t>This classification yields three design directions that shaped the rest of this chapter. First, a small set of patterns appears sufficient: the top three analytical patterns (KPI, Ranking, and Exception/Filter) account for 67 of the 107 benchmark requests, or about 62.6% of the full mixed benchmark. Segment and Tabular happen not to be exercised by this particular run, which is a property of this benchmark rather than evidence that those two patterns are unnecessary; the compiler supports both regardless. Second, business vocabulary differs systematically from database column names: reviewed requests used phrases like 'total refund rate,' never SUM(o.RefundedAmount), which motivates an explicit semantic layer rather than exposing the schema directly to the language model. Third, reuse appears to be the norm rather than the exception: many requests were variations of things already asked before, in a different time window or for a different segment, which motivates the widget persistence design.</w:t>
+        <w:t>This classification yields three design directions that shaped the methodology and system design. First, a small set of patterns appears sufficient: the top three analytical patterns (KPI, Ranking, and Exception/Filter) account for 67 of the 107 benchmark requests, or about 62.6% of the full mixed benchmark. Segment and Tabular happen not to be exercised by this particular run, which is a property of this benchmark rather than evidence that those two patterns are unnecessary; the compiler supports both regardless. Second, business vocabulary differs systematically from database column names: reviewed requests used phrases like 'total refund rate,' never SUM(o.RefundedAmount), which motivates an explicit semantic layer rather than exposing the schema directly to the language model. Third, reuse appears to be the norm rather than the exception: many requests were variations of things already asked before, in a different time window or for a different segment, which motivates the widget persistence design.</w:t>
       </w:r>
     </w:p>
     <w:p>
@@ -8226,7 +8226,7 @@
           <w:i w:val="0"/>
           <w:sz w:val="24"/>
         </w:rPr>
-        <w:t>Five principles guide every architectural decision in this chapter:</w:t>
+        <w:t>Five principles guide the AEGIS architecture:</w:t>
       </w:r>
     </w:p>
     <w:p>
@@ -13619,7 +13619,7 @@
           <w:i w:val="0"/>
           <w:sz w:val="24"/>
         </w:rPr>
-        <w:t>A methodological caveat applies to every quantitative result reported in this chapter and in the results discussion. All benchmark construction, execution, and measurement were carried out by the author as part of this thesis, using a self-built dataset and evaluation harness; none of it has been independently replicated by a third party, externally audited, or peer-reviewed. Therefore, the reported figures should be read as prototype evaluation results produced within this research, not as independently audited benchmark results. Where an annotation or classification step is discussed, it refers to the author's own research process rather than a third-party validation study.</w:t>
+        <w:t>A methodological caveat applies to every quantitative result reported in the experimental work and results discussion. All benchmark construction, execution, and measurement were carried out by the author as part of this thesis, using a self-built dataset and evaluation harness; none of it has been independently replicated by a third party, externally audited, or peer-reviewed. Therefore, the reported figures should be read as prototype evaluation results produced within this research, not as independently audited benchmark results. Where an annotation or classification step is discussed, it refers to the author's own research process rather than a third-party validation study.</w:t>
       </w:r>
     </w:p>
     <w:p>
@@ -13634,7 +13634,7 @@
           <w:i w:val="0"/>
           <w:sz w:val="24"/>
         </w:rPr>
-        <w:t>A domain-specific benchmark of 107 natural-language reporting requests was built over the production nopCommerce schema described above. The full question set and recorded pipeline outputs were used to check every reported metric. The benchmark mixes ordinary analytical requests with harder boundary cases in the same run; this thesis does not report those harder cases as a separate benchmark. Because the benchmark was constructed for the nopCommerce domain, accuracy and validity reported figures should be interpreted within that scope. The current artifact verifies SQL safety and true execution validity; semantic correctness still requires an annotated expected-answer benchmark in future work.</w:t>
+        <w:t>A domain-specific benchmark of 107 natural-language reporting requests was built over the same production nopCommerce schema. The full question set and recorded pipeline outputs were used to check every reported metric. The benchmark mixes ordinary analytical requests with harder boundary cases in the same run; this thesis does not report those harder cases as a separate benchmark. Because the benchmark was constructed for the nopCommerce domain, accuracy and validity reported figures should be interpreted within that scope. The current artifact verifies SQL safety and true execution validity; semantic correctness still requires an annotated expected-answer benchmark in future work.</w:t>
       </w:r>
     </w:p>
     <w:p>
@@ -13972,7 +13972,7 @@
           <w:i w:val="0"/>
           <w:sz w:val="24"/>
         </w:rPr>
-        <w:t>This chapter presents the evaluation results of the AEGIS prototype using a 107-request natural-language analytics benchmark and true database execution. The discussion separates SQL safety, execution validity, and semantic correctness because a query may be safe and executable while still failing to answer the intended analytical request.</w:t>
+        <w:t>The results discussion presents the evaluation results of the AEGIS prototype using a 107-request natural-language analytics benchmark and true database execution. The discussion separates SQL safety, execution validity, and semantic correctness because a query may be safe and executable while still failing to answer the intended analytical request.</w:t>
       </w:r>
     </w:p>
     <w:p>
@@ -13987,7 +13987,7 @@
           <w:i w:val="0"/>
           <w:sz w:val="24"/>
         </w:rPr>
-        <w:t>The reported quantitative evidence covers the mixed 107-request benchmark for AEGIS and the B1 direct LLM-to-SQL baseline, together with the completed B3 template-only execution-validity run. B2, B4, latency, and fully annotated semantic correctness remain future evaluation work, so this chapter reports only the measurements completed under the current experimental setup.</w:t>
+        <w:t>The reported quantitative evidence covers the mixed 107-request benchmark for AEGIS and the B1 direct LLM-to-SQL baseline, together with the completed B3 template-only execution-validity run. B2, B4, latency, and fully annotated semantic correctness remain future evaluation work, so the reported results include only the measurements completed under the current experimental setup.</w:t>
       </w:r>
     </w:p>
     <w:p>

</xml_diff>

<commit_message>
Insert generated thesis figures
</commit_message>
<xml_diff>
--- a/docs/scripts/AEGIS Thesis Book Draft - A Constraint-Based Architecture for Safe LLM-Assisted Natural Language Analytics.docx
+++ b/docs/scripts/AEGIS Thesis Book Draft - A Constraint-Based Architecture for Safe LLM-Assisted Natural Language Analytics.docx
@@ -1208,7 +1208,7 @@
         </w:rPr>
         <w:t>2.5 Comparative Summary</w:t>
         <w:tab/>
-        <w:t>8</w:t>
+        <w:t>7</w:t>
       </w:r>
     </w:p>
     <w:p>
@@ -1228,7 +1228,7 @@
         </w:rPr>
         <w:t>2.6 Research Gap Analysis</w:t>
         <w:tab/>
-        <w:t>9</w:t>
+        <w:t>8</w:t>
       </w:r>
     </w:p>
     <w:p>
@@ -1248,7 +1248,7 @@
         </w:rPr>
         <w:t>Chapter 3: Methodology</w:t>
         <w:tab/>
-        <w:t>10</w:t>
+        <w:t>9</w:t>
       </w:r>
     </w:p>
     <w:p>
@@ -1268,7 +1268,7 @@
         </w:rPr>
         <w:t>3.1 Research Paradigm</w:t>
         <w:tab/>
-        <w:t>10</w:t>
+        <w:t>9</w:t>
       </w:r>
     </w:p>
     <w:p>
@@ -1368,7 +1368,7 @@
         </w:rPr>
         <w:t>3.6 System Architecture</w:t>
         <w:tab/>
-        <w:t>15</w:t>
+        <w:t>14</w:t>
       </w:r>
     </w:p>
     <w:p>
@@ -1388,7 +1388,7 @@
         </w:rPr>
         <w:t>3.7 Semantic Layer Design</w:t>
         <w:tab/>
-        <w:t>16</w:t>
+        <w:t>15</w:t>
       </w:r>
     </w:p>
     <w:p>
@@ -1408,7 +1408,7 @@
         </w:rPr>
         <w:t>3.8 Intent Parsing with Dynamic Vocabulary Injection</w:t>
         <w:tab/>
-        <w:t>17</w:t>
+        <w:t>16</w:t>
       </w:r>
     </w:p>
     <w:p>
@@ -1428,7 +1428,7 @@
         </w:rPr>
         <w:t>3.9 Safe Query Compiler</w:t>
         <w:tab/>
-        <w:t>19</w:t>
+        <w:t>18</w:t>
       </w:r>
     </w:p>
     <w:p>
@@ -1448,7 +1448,7 @@
         </w:rPr>
         <w:t>3.10 Visualization Selector</w:t>
         <w:tab/>
-        <w:t>20</w:t>
+        <w:t>19</w:t>
       </w:r>
     </w:p>
     <w:p>
@@ -1488,7 +1488,7 @@
         </w:rPr>
         <w:t>Chapter 4: Experimental Work</w:t>
         <w:tab/>
-        <w:t>22</w:t>
+        <w:t>23</w:t>
       </w:r>
     </w:p>
     <w:p>
@@ -1508,7 +1508,7 @@
         </w:rPr>
         <w:t>4.1 Implementation</w:t>
         <w:tab/>
-        <w:t>22</w:t>
+        <w:t>23</w:t>
       </w:r>
     </w:p>
     <w:p>
@@ -1528,7 +1528,7 @@
         </w:rPr>
         <w:t>4.2 Experimental Environment</w:t>
         <w:tab/>
-        <w:t>23</w:t>
+        <w:t>24</w:t>
       </w:r>
     </w:p>
     <w:p>
@@ -1548,7 +1548,7 @@
         </w:rPr>
         <w:t>4.3 Benchmark Dataset Construction</w:t>
         <w:tab/>
-        <w:t>23</w:t>
+        <w:t>24</w:t>
       </w:r>
     </w:p>
     <w:p>
@@ -1568,7 +1568,7 @@
         </w:rPr>
         <w:t>4.4 Baseline Systems</w:t>
         <w:tab/>
-        <w:t>23</w:t>
+        <w:t>25</w:t>
       </w:r>
     </w:p>
     <w:p>
@@ -1588,7 +1588,7 @@
         </w:rPr>
         <w:t>4.5 Evaluation Procedure</w:t>
         <w:tab/>
-        <w:t>24</w:t>
+        <w:t>25</w:t>
       </w:r>
     </w:p>
     <w:p>
@@ -1608,7 +1608,7 @@
         </w:rPr>
         <w:t>Chapter 5: Results and Discussion</w:t>
         <w:tab/>
-        <w:t>25</w:t>
+        <w:t>26</w:t>
       </w:r>
     </w:p>
     <w:p>
@@ -1628,7 +1628,7 @@
         </w:rPr>
         <w:t>5.1 Evaluation Overview</w:t>
         <w:tab/>
-        <w:t>25</w:t>
+        <w:t>26</w:t>
       </w:r>
     </w:p>
     <w:p>
@@ -1648,7 +1648,7 @@
         </w:rPr>
         <w:t>5.2 Main Result Summary</w:t>
         <w:tab/>
-        <w:t>25</w:t>
+        <w:t>26</w:t>
       </w:r>
     </w:p>
     <w:p>
@@ -1668,7 +1668,7 @@
         </w:rPr>
         <w:t>5.3 SQL Safety</w:t>
         <w:tab/>
-        <w:t>26</w:t>
+        <w:t>27</w:t>
       </w:r>
     </w:p>
     <w:p>
@@ -1688,7 +1688,7 @@
         </w:rPr>
         <w:t>5.4 True Database Execution Validity</w:t>
         <w:tab/>
-        <w:t>27</w:t>
+        <w:t>28</w:t>
       </w:r>
     </w:p>
     <w:p>
@@ -1708,7 +1708,7 @@
         </w:rPr>
         <w:t>5.5 Execution Failure Analysis</w:t>
         <w:tab/>
-        <w:t>27</w:t>
+        <w:t>28</w:t>
       </w:r>
     </w:p>
     <w:p>
@@ -1728,7 +1728,7 @@
         </w:rPr>
         <w:t>5.6 Semantic Correctness Limitation</w:t>
         <w:tab/>
-        <w:t>28</w:t>
+        <w:t>29</w:t>
       </w:r>
     </w:p>
     <w:p>
@@ -1748,7 +1748,7 @@
         </w:rPr>
         <w:t>5.7 B3 Template-Only Baseline</w:t>
         <w:tab/>
-        <w:t>29</w:t>
+        <w:t>30</w:t>
       </w:r>
     </w:p>
     <w:p>
@@ -1768,7 +1768,7 @@
         </w:rPr>
         <w:t>5.8 Comparative Discussion</w:t>
         <w:tab/>
-        <w:t>29</w:t>
+        <w:t>30</w:t>
       </w:r>
     </w:p>
     <w:p>
@@ -1788,7 +1788,7 @@
         </w:rPr>
         <w:t>Chapter 6: Limitations and Future Work</w:t>
         <w:tab/>
-        <w:t>31</w:t>
+        <w:t>32</w:t>
       </w:r>
     </w:p>
     <w:p>
@@ -1808,7 +1808,7 @@
         </w:rPr>
         <w:t>Chapter 7: Conclusion</w:t>
         <w:tab/>
-        <w:t>33</w:t>
+        <w:t>32</w:t>
       </w:r>
     </w:p>
     <w:p>
@@ -1828,7 +1828,7 @@
         </w:rPr>
         <w:t>References</w:t>
         <w:tab/>
-        <w:t>34</w:t>
+        <w:t>33</w:t>
       </w:r>
     </w:p>
     <w:p>
@@ -1902,7 +1902,7 @@
         </w:rPr>
         <w:t>Figure 3: AEGIS architecture pipeline</w:t>
         <w:tab/>
-        <w:t>16</w:t>
+        <w:t>15</w:t>
       </w:r>
     </w:p>
     <w:p>
@@ -1992,7 +1992,7 @@
         </w:rPr>
         <w:t>Figure 8: Widget lifecycle and refresh model</w:t>
         <w:tab/>
-        <w:t>21</w:t>
+        <w:t>22</w:t>
       </w:r>
     </w:p>
     <w:p>
@@ -2010,7 +2010,7 @@
         </w:rPr>
         <w:t>Figure 9: Safety and execution-validity comparison</w:t>
         <w:tab/>
-        <w:t>27</w:t>
+        <w:t>28</w:t>
       </w:r>
     </w:p>
     <w:p>
@@ -2048,7 +2048,7 @@
         </w:rPr>
         <w:t>Table 1: Comparative summary of related systems</w:t>
         <w:tab/>
-        <w:t>8</w:t>
+        <w:t>7</w:t>
       </w:r>
     </w:p>
     <w:p>
@@ -2066,7 +2066,7 @@
         </w:rPr>
         <w:t>Table 3.1: Benchmark pattern classification</w:t>
         <w:tab/>
-        <w:t>11</w:t>
+        <w:t>10</w:t>
       </w:r>
     </w:p>
     <w:p>
@@ -2084,7 +2084,7 @@
         </w:rPr>
         <w:t>Table 3.2: Semantic layer object model</w:t>
         <w:tab/>
-        <w:t>17</w:t>
+        <w:t>16</w:t>
       </w:r>
     </w:p>
     <w:p>
@@ -2102,7 +2102,7 @@
         </w:rPr>
         <w:t>Table 3.3: AEGIS analytical patterns</w:t>
         <w:tab/>
-        <w:t>19</w:t>
+        <w:t>18</w:t>
       </w:r>
     </w:p>
     <w:p>
@@ -2138,7 +2138,7 @@
         </w:rPr>
         <w:t>Table 4.1: Experimental setup</w:t>
         <w:tab/>
-        <w:t>23</w:t>
+        <w:t>24</w:t>
       </w:r>
     </w:p>
     <w:p>
@@ -2156,7 +2156,7 @@
         </w:rPr>
         <w:t>Table 5.1: Evaluation benchmark status</w:t>
         <w:tab/>
-        <w:t>25</w:t>
+        <w:t>26</w:t>
       </w:r>
     </w:p>
     <w:p>
@@ -2174,7 +2174,7 @@
         </w:rPr>
         <w:t>Table 5.2: Main evaluation result summary</w:t>
         <w:tab/>
-        <w:t>26</w:t>
+        <w:t>27</w:t>
       </w:r>
     </w:p>
     <w:p>
@@ -2192,7 +2192,7 @@
         </w:rPr>
         <w:t>Table 5.3: SQL safety</w:t>
         <w:tab/>
-        <w:t>26</w:t>
+        <w:t>27</w:t>
       </w:r>
     </w:p>
     <w:p>
@@ -2210,7 +2210,7 @@
         </w:rPr>
         <w:t>Table 5.4: True execution validity</w:t>
         <w:tab/>
-        <w:t>27</w:t>
+        <w:t>28</w:t>
       </w:r>
     </w:p>
     <w:p>
@@ -2228,7 +2228,7 @@
         </w:rPr>
         <w:t>Table 5.5: True-execution failure analysis</w:t>
         <w:tab/>
-        <w:t>28</w:t>
+        <w:t>29</w:t>
       </w:r>
     </w:p>
     <w:p>
@@ -2246,7 +2246,7 @@
         </w:rPr>
         <w:t>Table 5.6: Evaluation metric distinction</w:t>
         <w:tab/>
-        <w:t>28</w:t>
+        <w:t>29</w:t>
       </w:r>
     </w:p>
     <w:p>
@@ -2264,7 +2264,7 @@
         </w:rPr>
         <w:t>Table 5.7: Template-only baseline summary</w:t>
         <w:tab/>
-        <w:t>29</w:t>
+        <w:t>30</w:t>
       </w:r>
     </w:p>
     <w:p>
@@ -2282,7 +2282,7 @@
         </w:rPr>
         <w:t>Table 5.8: AEGIS vs. direct LLM-to-SQL</w:t>
         <w:tab/>
-        <w:t>30</w:t>
+        <w:t>31</w:t>
       </w:r>
     </w:p>
     <w:p>
@@ -3929,11 +3929,6 @@
           <w:sz w:val="24"/>
         </w:rPr>
         <w:t>It supports AEGIS's choice to let deterministic code compute results while the LLM handles language.</w:t>
-      </w:r>
-    </w:p>
-    <w:p>
-      <w:r>
-        <w:br w:type="page"/>
       </w:r>
     </w:p>
     <w:p>
@@ -6541,69 +6536,50 @@
         <w:t>Added widget persistence and expanded the benchmark execution harness.</w:t>
       </w:r>
     </w:p>
-    <w:tbl>
-      <w:tblPr>
-        <w:tblW w:type="auto" w:w="0"/>
+    <w:p>
+      <w:pPr>
+        <w:spacing w:before="160" w:after="80"/>
         <w:jc w:val="center"/>
-        <w:tblLayout w:type="fixed"/>
-        <w:tblLook w:firstColumn="1" w:firstRow="1" w:lastColumn="0" w:lastRow="0" w:noHBand="0" w:noVBand="1" w:val="04A0"/>
-      </w:tblPr>
-      <w:tblGrid>
-        <w:gridCol w:w="9072"/>
-      </w:tblGrid>
-      <w:tr>
-        <w:trPr>
-          <w:trHeight w:val="2880"/>
-          <w:trHeight w:val="2880" w:hRule="atLeast"/>
-        </w:trPr>
-        <w:tc>
-          <w:tcPr>
-            <w:tcW w:type="dxa" w:w="9072"/>
-            <w:tcBorders>
-              <w:top w:val="dashed" w:sz="10" w:space="0" w:color="888888"/>
-              <w:left w:val="dashed" w:sz="10" w:space="0" w:color="888888"/>
-              <w:bottom w:val="dashed" w:sz="10" w:space="0" w:color="888888"/>
-              <w:right w:val="dashed" w:sz="10" w:space="0" w:color="888888"/>
-            </w:tcBorders>
-            <w:shd w:val="clear" w:fill="F7F7F7"/>
-          </w:tcPr>
-          <w:p>
-            <w:pPr>
-              <w:spacing w:before="280" w:after="120"/>
-              <w:jc w:val="center"/>
-            </w:pPr>
-            <w:r/>
-            <w:r>
-              <w:rPr>
-                <w:rFonts w:ascii="Times New Roman" w:hAnsi="Times New Roman"/>
-                <w:b/>
-                <w:color w:val="993300"/>
-                <w:sz w:val="21"/>
-              </w:rPr>
-              <w:t>[ PLACEHOLDER - FIGURE 1 NOT YET INSERTED ]</w:t>
-            </w:r>
-          </w:p>
-          <w:p>
-            <w:pPr>
-              <w:spacing w:after="160"/>
-              <w:jc w:val="center"/>
-            </w:pPr>
-            <w:r>
-              <w:rPr>
-                <w:rFonts w:ascii="Times New Roman" w:hAnsi="Times New Roman"/>
-                <w:b/>
-                <w:color w:val="333333"/>
-                <w:sz w:val="22"/>
-              </w:rPr>
-              <w:t>Design Science Research workflow for AEGIS</w:t>
-            </w:r>
-          </w:p>
-        </w:tc>
-      </w:tr>
-    </w:tbl>
-    <w:p>
-      <w:pPr>
-        <w:spacing w:before="120" w:after="280"/>
+        <w:keepNext/>
+      </w:pPr>
+      <w:r>
+        <w:drawing>
+          <wp:inline xmlns:a="http://schemas.openxmlformats.org/drawingml/2006/main" xmlns:pic="http://schemas.openxmlformats.org/drawingml/2006/picture">
+            <wp:extent cx="5715000" cy="3333750"/>
+            <wp:docPr id="3" name="Picture 3"/>
+            <wp:cNvGraphicFramePr>
+              <a:graphicFrameLocks noChangeAspect="1"/>
+            </wp:cNvGraphicFramePr>
+            <a:graphic>
+              <a:graphicData uri="http://schemas.openxmlformats.org/drawingml/2006/picture">
+                <pic:pic>
+                  <pic:nvPicPr>
+                    <pic:cNvPr id="0" name="figure-01-dsr-workflow.png"/>
+                    <pic:cNvPicPr/>
+                  </pic:nvPicPr>
+                  <pic:blipFill>
+                    <a:blip r:embed="rId12"/>
+                    <a:stretch>
+                      <a:fillRect/>
+                    </a:stretch>
+                  </pic:blipFill>
+                  <pic:spPr>
+                    <a:xfrm>
+                      <a:off x="0" y="0"/>
+                      <a:ext cx="5715000" cy="3333750"/>
+                    </a:xfrm>
+                    <a:prstGeom prst="rect"/>
+                  </pic:spPr>
+                </pic:pic>
+              </a:graphicData>
+            </a:graphic>
+          </wp:inline>
+        </w:drawing>
+      </w:r>
+    </w:p>
+    <w:p>
+      <w:pPr>
+        <w:spacing w:before="80" w:after="280"/>
         <w:jc w:val="center"/>
       </w:pPr>
       <w:r>
@@ -8111,69 +8087,50 @@
         <w:spacing w:after="80"/>
       </w:pPr>
     </w:p>
-    <w:tbl>
-      <w:tblPr>
-        <w:tblW w:type="auto" w:w="0"/>
+    <w:p>
+      <w:pPr>
+        <w:spacing w:before="160" w:after="80"/>
         <w:jc w:val="center"/>
-        <w:tblLayout w:type="fixed"/>
-        <w:tblLook w:firstColumn="1" w:firstRow="1" w:lastColumn="0" w:lastRow="0" w:noHBand="0" w:noVBand="1" w:val="04A0"/>
-      </w:tblPr>
-      <w:tblGrid>
-        <w:gridCol w:w="9072"/>
-      </w:tblGrid>
-      <w:tr>
-        <w:trPr>
-          <w:trHeight w:val="3744"/>
-          <w:trHeight w:val="3744" w:hRule="atLeast"/>
-        </w:trPr>
-        <w:tc>
-          <w:tcPr>
-            <w:tcW w:type="dxa" w:w="9072"/>
-            <w:tcBorders>
-              <w:top w:val="dashed" w:sz="10" w:space="0" w:color="888888"/>
-              <w:left w:val="dashed" w:sz="10" w:space="0" w:color="888888"/>
-              <w:bottom w:val="dashed" w:sz="10" w:space="0" w:color="888888"/>
-              <w:right w:val="dashed" w:sz="10" w:space="0" w:color="888888"/>
-            </w:tcBorders>
-            <w:shd w:val="clear" w:fill="F7F7F7"/>
-          </w:tcPr>
-          <w:p>
-            <w:pPr>
-              <w:spacing w:before="280" w:after="120"/>
-              <w:jc w:val="center"/>
-            </w:pPr>
-            <w:r/>
-            <w:r>
-              <w:rPr>
-                <w:rFonts w:ascii="Times New Roman" w:hAnsi="Times New Roman"/>
-                <w:b/>
-                <w:color w:val="993300"/>
-                <w:sz w:val="21"/>
-              </w:rPr>
-              <w:t>[ PLACEHOLDER - FIGURE 2 NOT YET INSERTED ]</w:t>
-            </w:r>
-          </w:p>
-          <w:p>
-            <w:pPr>
-              <w:spacing w:after="160"/>
-              <w:jc w:val="center"/>
-            </w:pPr>
-            <w:r>
-              <w:rPr>
-                <w:rFonts w:ascii="Times New Roman" w:hAnsi="Times New Roman"/>
-                <w:b/>
-                <w:color w:val="333333"/>
-                <w:sz w:val="22"/>
-              </w:rPr>
-              <w:t>Pattern classification of the answerable analytical benchmark subset</w:t>
-            </w:r>
-          </w:p>
-        </w:tc>
-      </w:tr>
-    </w:tbl>
-    <w:p>
-      <w:pPr>
-        <w:spacing w:before="120" w:after="280"/>
+        <w:keepNext/>
+      </w:pPr>
+      <w:r>
+        <w:drawing>
+          <wp:inline xmlns:a="http://schemas.openxmlformats.org/drawingml/2006/main" xmlns:pic="http://schemas.openxmlformats.org/drawingml/2006/picture">
+            <wp:extent cx="5440680" cy="3173730"/>
+            <wp:docPr id="4" name="Picture 4"/>
+            <wp:cNvGraphicFramePr>
+              <a:graphicFrameLocks noChangeAspect="1"/>
+            </wp:cNvGraphicFramePr>
+            <a:graphic>
+              <a:graphicData uri="http://schemas.openxmlformats.org/drawingml/2006/picture">
+                <pic:pic>
+                  <pic:nvPicPr>
+                    <pic:cNvPr id="0" name="figure-02-pattern-distribution.png"/>
+                    <pic:cNvPicPr/>
+                  </pic:nvPicPr>
+                  <pic:blipFill>
+                    <a:blip r:embed="rId13"/>
+                    <a:stretch>
+                      <a:fillRect/>
+                    </a:stretch>
+                  </pic:blipFill>
+                  <pic:spPr>
+                    <a:xfrm>
+                      <a:off x="0" y="0"/>
+                      <a:ext cx="5440680" cy="3173730"/>
+                    </a:xfrm>
+                    <a:prstGeom prst="rect"/>
+                  </pic:spPr>
+                </pic:pic>
+              </a:graphicData>
+            </a:graphic>
+          </wp:inline>
+        </w:drawing>
+      </w:r>
+    </w:p>
+    <w:p>
+      <w:pPr>
+        <w:spacing w:before="80" w:after="280"/>
         <w:jc w:val="center"/>
       </w:pPr>
       <w:r>
@@ -8935,69 +8892,50 @@
         <w:t>The analysis plan is hashed (SHA-256) to detect duplicates, and the query, chart configuration, and access rules are stored as a widget artifact that can be refreshed on a schedule.</w:t>
       </w:r>
     </w:p>
-    <w:tbl>
-      <w:tblPr>
-        <w:tblW w:type="auto" w:w="0"/>
+    <w:p>
+      <w:pPr>
+        <w:spacing w:before="160" w:after="80"/>
         <w:jc w:val="center"/>
-        <w:tblLayout w:type="fixed"/>
-        <w:tblLook w:firstColumn="1" w:firstRow="1" w:lastColumn="0" w:lastRow="0" w:noHBand="0" w:noVBand="1" w:val="04A0"/>
-      </w:tblPr>
-      <w:tblGrid>
-        <w:gridCol w:w="9072"/>
-      </w:tblGrid>
-      <w:tr>
-        <w:trPr>
-          <w:trHeight w:val="3168"/>
-          <w:trHeight w:val="3168" w:hRule="atLeast"/>
-        </w:trPr>
-        <w:tc>
-          <w:tcPr>
-            <w:tcW w:type="dxa" w:w="9072"/>
-            <w:tcBorders>
-              <w:top w:val="dashed" w:sz="10" w:space="0" w:color="888888"/>
-              <w:left w:val="dashed" w:sz="10" w:space="0" w:color="888888"/>
-              <w:bottom w:val="dashed" w:sz="10" w:space="0" w:color="888888"/>
-              <w:right w:val="dashed" w:sz="10" w:space="0" w:color="888888"/>
-            </w:tcBorders>
-            <w:shd w:val="clear" w:fill="F7F7F7"/>
-          </w:tcPr>
-          <w:p>
-            <w:pPr>
-              <w:spacing w:before="280" w:after="120"/>
-              <w:jc w:val="center"/>
-            </w:pPr>
-            <w:r/>
-            <w:r>
-              <w:rPr>
-                <w:rFonts w:ascii="Times New Roman" w:hAnsi="Times New Roman"/>
-                <w:b/>
-                <w:color w:val="993300"/>
-                <w:sz w:val="21"/>
-              </w:rPr>
-              <w:t>[ PLACEHOLDER - FIGURE 3 NOT YET INSERTED ]</w:t>
-            </w:r>
-          </w:p>
-          <w:p>
-            <w:pPr>
-              <w:spacing w:after="160"/>
-              <w:jc w:val="center"/>
-            </w:pPr>
-            <w:r>
-              <w:rPr>
-                <w:rFonts w:ascii="Times New Roman" w:hAnsi="Times New Roman"/>
-                <w:b/>
-                <w:color w:val="333333"/>
-                <w:sz w:val="22"/>
-              </w:rPr>
-              <w:t>AEGIS architecture pipeline (User Request to Dashboard Widget)</w:t>
-            </w:r>
-          </w:p>
-        </w:tc>
-      </w:tr>
-    </w:tbl>
-    <w:p>
-      <w:pPr>
-        <w:spacing w:before="120" w:after="280"/>
+        <w:keepNext/>
+      </w:pPr>
+      <w:r>
+        <w:drawing>
+          <wp:inline xmlns:a="http://schemas.openxmlformats.org/drawingml/2006/main" xmlns:pic="http://schemas.openxmlformats.org/drawingml/2006/picture">
+            <wp:extent cx="5715000" cy="3917682"/>
+            <wp:docPr id="5" name="Picture 5"/>
+            <wp:cNvGraphicFramePr>
+              <a:graphicFrameLocks noChangeAspect="1"/>
+            </wp:cNvGraphicFramePr>
+            <a:graphic>
+              <a:graphicData uri="http://schemas.openxmlformats.org/drawingml/2006/picture">
+                <pic:pic>
+                  <pic:nvPicPr>
+                    <pic:cNvPr id="0" name="mermaid-figure-03-architecture-pipeline.png"/>
+                    <pic:cNvPicPr/>
+                  </pic:nvPicPr>
+                  <pic:blipFill>
+                    <a:blip r:embed="rId14"/>
+                    <a:stretch>
+                      <a:fillRect/>
+                    </a:stretch>
+                  </pic:blipFill>
+                  <pic:spPr>
+                    <a:xfrm>
+                      <a:off x="0" y="0"/>
+                      <a:ext cx="5715000" cy="3917682"/>
+                    </a:xfrm>
+                    <a:prstGeom prst="rect"/>
+                  </pic:spPr>
+                </pic:pic>
+              </a:graphicData>
+            </a:graphic>
+          </wp:inline>
+        </w:drawing>
+      </w:r>
+    </w:p>
+    <w:p>
+      <w:pPr>
+        <w:spacing w:before="80" w:after="280"/>
         <w:jc w:val="center"/>
       </w:pPr>
       <w:r>
@@ -9038,69 +8976,50 @@
         <w:t>The semantic layer is the most important non-AI component of AEGIS. It separates business language from the underlying database structure and defines exactly which metrics, joins, and permissions are allowed to exist. A useful analogy is LEGO blocks rather than free-form clay: the semantic layer defines a finite set of composable building blocks. User questions are unlimited, but every answerable question is a composition of these blocks.</w:t>
       </w:r>
     </w:p>
-    <w:tbl>
-      <w:tblPr>
-        <w:tblW w:type="auto" w:w="0"/>
+    <w:p>
+      <w:pPr>
+        <w:spacing w:before="160" w:after="80"/>
         <w:jc w:val="center"/>
-        <w:tblLayout w:type="fixed"/>
-        <w:tblLook w:firstColumn="1" w:firstRow="1" w:lastColumn="0" w:lastRow="0" w:noHBand="0" w:noVBand="1" w:val="04A0"/>
-      </w:tblPr>
-      <w:tblGrid>
-        <w:gridCol w:w="9072"/>
-      </w:tblGrid>
-      <w:tr>
-        <w:trPr>
-          <w:trHeight w:val="3744"/>
-          <w:trHeight w:val="3744" w:hRule="atLeast"/>
-        </w:trPr>
-        <w:tc>
-          <w:tcPr>
-            <w:tcW w:type="dxa" w:w="9072"/>
-            <w:tcBorders>
-              <w:top w:val="dashed" w:sz="10" w:space="0" w:color="888888"/>
-              <w:left w:val="dashed" w:sz="10" w:space="0" w:color="888888"/>
-              <w:bottom w:val="dashed" w:sz="10" w:space="0" w:color="888888"/>
-              <w:right w:val="dashed" w:sz="10" w:space="0" w:color="888888"/>
-            </w:tcBorders>
-            <w:shd w:val="clear" w:fill="F7F7F7"/>
-          </w:tcPr>
-          <w:p>
-            <w:pPr>
-              <w:spacing w:before="280" w:after="120"/>
-              <w:jc w:val="center"/>
-            </w:pPr>
-            <w:r/>
-            <w:r>
-              <w:rPr>
-                <w:rFonts w:ascii="Times New Roman" w:hAnsi="Times New Roman"/>
-                <w:b/>
-                <w:color w:val="993300"/>
-                <w:sz w:val="21"/>
-              </w:rPr>
-              <w:t>[ PLACEHOLDER - FIGURE 4 NOT YET INSERTED ]</w:t>
-            </w:r>
-          </w:p>
-          <w:p>
-            <w:pPr>
-              <w:spacing w:after="160"/>
-              <w:jc w:val="center"/>
-            </w:pPr>
-            <w:r>
-              <w:rPr>
-                <w:rFonts w:ascii="Times New Roman" w:hAnsi="Times New Roman"/>
-                <w:b/>
-                <w:color w:val="333333"/>
-                <w:sz w:val="22"/>
-              </w:rPr>
-              <w:t>Semantic layer modularity - composable blocks vs. free-form SQL generation</w:t>
-            </w:r>
-          </w:p>
-        </w:tc>
-      </w:tr>
-    </w:tbl>
-    <w:p>
-      <w:pPr>
-        <w:spacing w:before="120" w:after="280"/>
+        <w:keepNext/>
+      </w:pPr>
+      <w:r>
+        <w:drawing>
+          <wp:inline xmlns:a="http://schemas.openxmlformats.org/drawingml/2006/main" xmlns:pic="http://schemas.openxmlformats.org/drawingml/2006/picture">
+            <wp:extent cx="5715000" cy="2518375"/>
+            <wp:docPr id="6" name="Picture 6"/>
+            <wp:cNvGraphicFramePr>
+              <a:graphicFrameLocks noChangeAspect="1"/>
+            </wp:cNvGraphicFramePr>
+            <a:graphic>
+              <a:graphicData uri="http://schemas.openxmlformats.org/drawingml/2006/picture">
+                <pic:pic>
+                  <pic:nvPicPr>
+                    <pic:cNvPr id="0" name="mermaid-figure-04-semantic-layer-modularity.png"/>
+                    <pic:cNvPicPr/>
+                  </pic:nvPicPr>
+                  <pic:blipFill>
+                    <a:blip r:embed="rId15"/>
+                    <a:stretch>
+                      <a:fillRect/>
+                    </a:stretch>
+                  </pic:blipFill>
+                  <pic:spPr>
+                    <a:xfrm>
+                      <a:off x="0" y="0"/>
+                      <a:ext cx="5715000" cy="2518375"/>
+                    </a:xfrm>
+                    <a:prstGeom prst="rect"/>
+                  </pic:spPr>
+                </pic:pic>
+              </a:graphicData>
+            </a:graphic>
+          </wp:inline>
+        </w:drawing>
+      </w:r>
+    </w:p>
+    <w:p>
+      <w:pPr>
+        <w:spacing w:before="80" w:after="280"/>
         <w:jc w:val="center"/>
       </w:pPr>
       <w:r>
@@ -9988,69 +9907,50 @@
         <w:t>}</w:t>
       </w:r>
     </w:p>
-    <w:tbl>
-      <w:tblPr>
-        <w:tblW w:type="auto" w:w="0"/>
+    <w:p>
+      <w:pPr>
+        <w:spacing w:before="160" w:after="80"/>
         <w:jc w:val="center"/>
-        <w:tblLayout w:type="fixed"/>
-        <w:tblLook w:firstColumn="1" w:firstRow="1" w:lastColumn="0" w:lastRow="0" w:noHBand="0" w:noVBand="1" w:val="04A0"/>
-      </w:tblPr>
-      <w:tblGrid>
-        <w:gridCol w:w="9072"/>
-      </w:tblGrid>
-      <w:tr>
-        <w:trPr>
-          <w:trHeight w:val="3744"/>
-          <w:trHeight w:val="3744" w:hRule="atLeast"/>
-        </w:trPr>
-        <w:tc>
-          <w:tcPr>
-            <w:tcW w:type="dxa" w:w="9072"/>
-            <w:tcBorders>
-              <w:top w:val="dashed" w:sz="10" w:space="0" w:color="888888"/>
-              <w:left w:val="dashed" w:sz="10" w:space="0" w:color="888888"/>
-              <w:bottom w:val="dashed" w:sz="10" w:space="0" w:color="888888"/>
-              <w:right w:val="dashed" w:sz="10" w:space="0" w:color="888888"/>
-            </w:tcBorders>
-            <w:shd w:val="clear" w:fill="F7F7F7"/>
-          </w:tcPr>
-          <w:p>
-            <w:pPr>
-              <w:spacing w:before="280" w:after="120"/>
-              <w:jc w:val="center"/>
-            </w:pPr>
-            <w:r/>
-            <w:r>
-              <w:rPr>
-                <w:rFonts w:ascii="Times New Roman" w:hAnsi="Times New Roman"/>
-                <w:b/>
-                <w:color w:val="993300"/>
-                <w:sz w:val="21"/>
-              </w:rPr>
-              <w:t>[ PLACEHOLDER - FIGURE 5 NOT YET INSERTED ]</w:t>
-            </w:r>
-          </w:p>
-          <w:p>
-            <w:pPr>
-              <w:spacing w:after="160"/>
-              <w:jc w:val="center"/>
-            </w:pPr>
-            <w:r>
-              <w:rPr>
-                <w:rFonts w:ascii="Times New Roman" w:hAnsi="Times New Roman"/>
-                <w:b/>
-                <w:color w:val="333333"/>
-                <w:sz w:val="22"/>
-              </w:rPr>
-              <w:t>Vocabulary injection workflow</w:t>
-            </w:r>
-          </w:p>
-        </w:tc>
-      </w:tr>
-    </w:tbl>
-    <w:p>
-      <w:pPr>
-        <w:spacing w:before="120" w:after="280"/>
+        <w:keepNext/>
+      </w:pPr>
+      <w:r>
+        <w:drawing>
+          <wp:inline xmlns:a="http://schemas.openxmlformats.org/drawingml/2006/main" xmlns:pic="http://schemas.openxmlformats.org/drawingml/2006/picture">
+            <wp:extent cx="2834640" cy="4251960"/>
+            <wp:docPr id="7" name="Picture 7"/>
+            <wp:cNvGraphicFramePr>
+              <a:graphicFrameLocks noChangeAspect="1"/>
+            </wp:cNvGraphicFramePr>
+            <a:graphic>
+              <a:graphicData uri="http://schemas.openxmlformats.org/drawingml/2006/picture">
+                <pic:pic>
+                  <pic:nvPicPr>
+                    <pic:cNvPr id="0" name="mermaid-figure-05-vocabulary-injection.png"/>
+                    <pic:cNvPicPr/>
+                  </pic:nvPicPr>
+                  <pic:blipFill>
+                    <a:blip r:embed="rId16"/>
+                    <a:stretch>
+                      <a:fillRect/>
+                    </a:stretch>
+                  </pic:blipFill>
+                  <pic:spPr>
+                    <a:xfrm>
+                      <a:off x="0" y="0"/>
+                      <a:ext cx="2834640" cy="4251960"/>
+                    </a:xfrm>
+                    <a:prstGeom prst="rect"/>
+                  </pic:spPr>
+                </pic:pic>
+              </a:graphicData>
+            </a:graphic>
+          </wp:inline>
+        </w:drawing>
+      </w:r>
+    </w:p>
+    <w:p>
+      <w:pPr>
+        <w:spacing w:before="80" w:after="280"/>
         <w:jc w:val="center"/>
       </w:pPr>
       <w:r>
@@ -10096,69 +9996,50 @@
         <w:t>The compiler instantiates SQL from a library of parameterized templates, one per analytics pattern.</w:t>
       </w:r>
     </w:p>
-    <w:tbl>
-      <w:tblPr>
-        <w:tblW w:type="auto" w:w="0"/>
+    <w:p>
+      <w:pPr>
+        <w:spacing w:before="160" w:after="80"/>
         <w:jc w:val="center"/>
-        <w:tblLayout w:type="fixed"/>
-        <w:tblLook w:firstColumn="1" w:firstRow="1" w:lastColumn="0" w:lastRow="0" w:noHBand="0" w:noVBand="1" w:val="04A0"/>
-      </w:tblPr>
-      <w:tblGrid>
-        <w:gridCol w:w="9072"/>
-      </w:tblGrid>
-      <w:tr>
-        <w:trPr>
-          <w:trHeight w:val="3744"/>
-          <w:trHeight w:val="3744" w:hRule="atLeast"/>
-        </w:trPr>
-        <w:tc>
-          <w:tcPr>
-            <w:tcW w:type="dxa" w:w="9072"/>
-            <w:tcBorders>
-              <w:top w:val="dashed" w:sz="10" w:space="0" w:color="888888"/>
-              <w:left w:val="dashed" w:sz="10" w:space="0" w:color="888888"/>
-              <w:bottom w:val="dashed" w:sz="10" w:space="0" w:color="888888"/>
-              <w:right w:val="dashed" w:sz="10" w:space="0" w:color="888888"/>
-            </w:tcBorders>
-            <w:shd w:val="clear" w:fill="F7F7F7"/>
-          </w:tcPr>
-          <w:p>
-            <w:pPr>
-              <w:spacing w:before="280" w:after="120"/>
-              <w:jc w:val="center"/>
-            </w:pPr>
-            <w:r/>
-            <w:r>
-              <w:rPr>
-                <w:rFonts w:ascii="Times New Roman" w:hAnsi="Times New Roman"/>
-                <w:b/>
-                <w:color w:val="993300"/>
-                <w:sz w:val="21"/>
-              </w:rPr>
-              <w:t>[ PLACEHOLDER - FIGURE 6 NOT YET INSERTED ]</w:t>
-            </w:r>
-          </w:p>
-          <w:p>
-            <w:pPr>
-              <w:spacing w:after="160"/>
-              <w:jc w:val="center"/>
-            </w:pPr>
-            <w:r>
-              <w:rPr>
-                <w:rFonts w:ascii="Times New Roman" w:hAnsi="Times New Roman"/>
-                <w:b/>
-                <w:color w:val="333333"/>
-                <w:sz w:val="22"/>
-              </w:rPr>
-              <w:t>Taxonomy of the eleven AEGIS analytical patterns</w:t>
-            </w:r>
-          </w:p>
-        </w:tc>
-      </w:tr>
-    </w:tbl>
-    <w:p>
-      <w:pPr>
-        <w:spacing w:before="120" w:after="280"/>
+        <w:keepNext/>
+      </w:pPr>
+      <w:r>
+        <w:drawing>
+          <wp:inline xmlns:a="http://schemas.openxmlformats.org/drawingml/2006/main" xmlns:pic="http://schemas.openxmlformats.org/drawingml/2006/picture">
+            <wp:extent cx="5532120" cy="2937096"/>
+            <wp:docPr id="8" name="Picture 8"/>
+            <wp:cNvGraphicFramePr>
+              <a:graphicFrameLocks noChangeAspect="1"/>
+            </wp:cNvGraphicFramePr>
+            <a:graphic>
+              <a:graphicData uri="http://schemas.openxmlformats.org/drawingml/2006/picture">
+                <pic:pic>
+                  <pic:nvPicPr>
+                    <pic:cNvPr id="0" name="mermaid-figure-06-pattern-taxonomy.png"/>
+                    <pic:cNvPicPr/>
+                  </pic:nvPicPr>
+                  <pic:blipFill>
+                    <a:blip r:embed="rId17"/>
+                    <a:stretch>
+                      <a:fillRect/>
+                    </a:stretch>
+                  </pic:blipFill>
+                  <pic:spPr>
+                    <a:xfrm>
+                      <a:off x="0" y="0"/>
+                      <a:ext cx="5532120" cy="2937096"/>
+                    </a:xfrm>
+                    <a:prstGeom prst="rect"/>
+                  </pic:spPr>
+                </pic:pic>
+              </a:graphicData>
+            </a:graphic>
+          </wp:inline>
+        </w:drawing>
+      </w:r>
+    </w:p>
+    <w:p>
+      <w:pPr>
+        <w:spacing w:before="80" w:after="280"/>
         <w:jc w:val="center"/>
       </w:pPr>
       <w:r>
@@ -11528,69 +11409,50 @@
         <w:t>After placeholder substitution, two safety layers apply in sequence. Layer 1 is a parameterized query engine that separates SQL structure from user-supplied inputs, so no user text is ever concatenated into the SQL string. Layer 2 is a post-compilation safety scanner that rejects any assembled query containing a forbidden construct: non-SELECT statements, UNION, EXCEPT or INTERSECT, EXEC, or references to system tables. If any forbidden pattern is detected, the compiler raises a SecurityError rather than returning a partially safe query.</w:t>
       </w:r>
     </w:p>
-    <w:tbl>
-      <w:tblPr>
-        <w:tblW w:type="auto" w:w="0"/>
+    <w:p>
+      <w:pPr>
+        <w:spacing w:before="160" w:after="80"/>
         <w:jc w:val="center"/>
-        <w:tblLayout w:type="fixed"/>
-        <w:tblLook w:firstColumn="1" w:firstRow="1" w:lastColumn="0" w:lastRow="0" w:noHBand="0" w:noVBand="1" w:val="04A0"/>
-      </w:tblPr>
-      <w:tblGrid>
-        <w:gridCol w:w="9072"/>
-      </w:tblGrid>
-      <w:tr>
-        <w:trPr>
-          <w:trHeight w:val="3744"/>
-          <w:trHeight w:val="3744" w:hRule="atLeast"/>
-        </w:trPr>
-        <w:tc>
-          <w:tcPr>
-            <w:tcW w:type="dxa" w:w="9072"/>
-            <w:tcBorders>
-              <w:top w:val="dashed" w:sz="10" w:space="0" w:color="888888"/>
-              <w:left w:val="dashed" w:sz="10" w:space="0" w:color="888888"/>
-              <w:bottom w:val="dashed" w:sz="10" w:space="0" w:color="888888"/>
-              <w:right w:val="dashed" w:sz="10" w:space="0" w:color="888888"/>
-            </w:tcBorders>
-            <w:shd w:val="clear" w:fill="F7F7F7"/>
-          </w:tcPr>
-          <w:p>
-            <w:pPr>
-              <w:spacing w:before="280" w:after="120"/>
-              <w:jc w:val="center"/>
-            </w:pPr>
-            <w:r/>
-            <w:r>
-              <w:rPr>
-                <w:rFonts w:ascii="Times New Roman" w:hAnsi="Times New Roman"/>
-                <w:b/>
-                <w:color w:val="993300"/>
-                <w:sz w:val="21"/>
-              </w:rPr>
-              <w:t>[ PLACEHOLDER - FIGURE 7 NOT YET INSERTED ]</w:t>
-            </w:r>
-          </w:p>
-          <w:p>
-            <w:pPr>
-              <w:spacing w:after="160"/>
-              <w:jc w:val="center"/>
-            </w:pPr>
-            <w:r>
-              <w:rPr>
-                <w:rFonts w:ascii="Times New Roman" w:hAnsi="Times New Roman"/>
-                <w:b/>
-                <w:color w:val="333333"/>
-                <w:sz w:val="22"/>
-              </w:rPr>
-              <w:t>Two-layer SQL safety defence</w:t>
-            </w:r>
-          </w:p>
-        </w:tc>
-      </w:tr>
-    </w:tbl>
-    <w:p>
-      <w:pPr>
-        <w:spacing w:before="120" w:after="280"/>
+        <w:keepNext/>
+      </w:pPr>
+      <w:r>
+        <w:drawing>
+          <wp:inline xmlns:a="http://schemas.openxmlformats.org/drawingml/2006/main" xmlns:pic="http://schemas.openxmlformats.org/drawingml/2006/picture">
+            <wp:extent cx="3291840" cy="3331122"/>
+            <wp:docPr id="9" name="Picture 9"/>
+            <wp:cNvGraphicFramePr>
+              <a:graphicFrameLocks noChangeAspect="1"/>
+            </wp:cNvGraphicFramePr>
+            <a:graphic>
+              <a:graphicData uri="http://schemas.openxmlformats.org/drawingml/2006/picture">
+                <pic:pic>
+                  <pic:nvPicPr>
+                    <pic:cNvPr id="0" name="mermaid-figure-07-sql-safety-defense.png"/>
+                    <pic:cNvPicPr/>
+                  </pic:nvPicPr>
+                  <pic:blipFill>
+                    <a:blip r:embed="rId18"/>
+                    <a:stretch>
+                      <a:fillRect/>
+                    </a:stretch>
+                  </pic:blipFill>
+                  <pic:spPr>
+                    <a:xfrm>
+                      <a:off x="0" y="0"/>
+                      <a:ext cx="3291840" cy="3331122"/>
+                    </a:xfrm>
+                    <a:prstGeom prst="rect"/>
+                  </pic:spPr>
+                </pic:pic>
+              </a:graphicData>
+            </a:graphic>
+          </wp:inline>
+        </w:drawing>
+      </w:r>
+    </w:p>
+    <w:p>
+      <w:pPr>
+        <w:spacing w:before="80" w:after="280"/>
         <w:jc w:val="center"/>
       </w:pPr>
       <w:r>
@@ -12689,69 +12551,50 @@
         <w:t>Each widget stores a unique identifier (a SHA-256 hash of the analysis plan), the original question, the analysis plan in JSON form, a hash of the SQL template used, chart configuration, timestamps, access rules, and run history. A new question triggers the full seven-stage pipeline; if an identical widget already exists, determined by a match on the plan hash, the cached artifact is returned immediately rather than recompiled. Scheduled refresh re-executes the stored SQL against fresh data on a configurable interval, which directly addresses the design-time observation that reporting requests are often recurring rather than one-off: a widget answers the question once and then continues answering it as new data arrives, rather than requiring the same natural-language request to be re-processed from scratch every time.</w:t>
       </w:r>
     </w:p>
-    <w:tbl>
-      <w:tblPr>
-        <w:tblW w:type="auto" w:w="0"/>
+    <w:p>
+      <w:pPr>
+        <w:spacing w:before="160" w:after="80"/>
         <w:jc w:val="center"/>
-        <w:tblLayout w:type="fixed"/>
-        <w:tblLook w:firstColumn="1" w:firstRow="1" w:lastColumn="0" w:lastRow="0" w:noHBand="0" w:noVBand="1" w:val="04A0"/>
-      </w:tblPr>
-      <w:tblGrid>
-        <w:gridCol w:w="9072"/>
-      </w:tblGrid>
-      <w:tr>
-        <w:trPr>
-          <w:trHeight w:val="3744"/>
-          <w:trHeight w:val="3744" w:hRule="atLeast"/>
-        </w:trPr>
-        <w:tc>
-          <w:tcPr>
-            <w:tcW w:type="dxa" w:w="9072"/>
-            <w:tcBorders>
-              <w:top w:val="dashed" w:sz="10" w:space="0" w:color="888888"/>
-              <w:left w:val="dashed" w:sz="10" w:space="0" w:color="888888"/>
-              <w:bottom w:val="dashed" w:sz="10" w:space="0" w:color="888888"/>
-              <w:right w:val="dashed" w:sz="10" w:space="0" w:color="888888"/>
-            </w:tcBorders>
-            <w:shd w:val="clear" w:fill="F7F7F7"/>
-          </w:tcPr>
-          <w:p>
-            <w:pPr>
-              <w:spacing w:before="280" w:after="120"/>
-              <w:jc w:val="center"/>
-            </w:pPr>
-            <w:r/>
-            <w:r>
-              <w:rPr>
-                <w:rFonts w:ascii="Times New Roman" w:hAnsi="Times New Roman"/>
-                <w:b/>
-                <w:color w:val="993300"/>
-                <w:sz w:val="21"/>
-              </w:rPr>
-              <w:t>[ PLACEHOLDER - FIGURE 8 NOT YET INSERTED ]</w:t>
-            </w:r>
-          </w:p>
-          <w:p>
-            <w:pPr>
-              <w:spacing w:after="160"/>
-              <w:jc w:val="center"/>
-            </w:pPr>
-            <w:r>
-              <w:rPr>
-                <w:rFonts w:ascii="Times New Roman" w:hAnsi="Times New Roman"/>
-                <w:b/>
-                <w:color w:val="333333"/>
-                <w:sz w:val="22"/>
-              </w:rPr>
-              <w:t>Widget lifecycle and refresh model</w:t>
-            </w:r>
-          </w:p>
-        </w:tc>
-      </w:tr>
-    </w:tbl>
-    <w:p>
-      <w:pPr>
-        <w:spacing w:before="120" w:after="280"/>
+        <w:keepNext/>
+      </w:pPr>
+      <w:r>
+        <w:drawing>
+          <wp:inline xmlns:a="http://schemas.openxmlformats.org/drawingml/2006/main" xmlns:pic="http://schemas.openxmlformats.org/drawingml/2006/picture">
+            <wp:extent cx="3200400" cy="7154821"/>
+            <wp:docPr id="10" name="Picture 10"/>
+            <wp:cNvGraphicFramePr>
+              <a:graphicFrameLocks noChangeAspect="1"/>
+            </wp:cNvGraphicFramePr>
+            <a:graphic>
+              <a:graphicData uri="http://schemas.openxmlformats.org/drawingml/2006/picture">
+                <pic:pic>
+                  <pic:nvPicPr>
+                    <pic:cNvPr id="0" name="mermaid-figure-08-widget-lifecycle.png"/>
+                    <pic:cNvPicPr/>
+                  </pic:nvPicPr>
+                  <pic:blipFill>
+                    <a:blip r:embed="rId19"/>
+                    <a:stretch>
+                      <a:fillRect/>
+                    </a:stretch>
+                  </pic:blipFill>
+                  <pic:spPr>
+                    <a:xfrm>
+                      <a:off x="0" y="0"/>
+                      <a:ext cx="3200400" cy="7154821"/>
+                    </a:xfrm>
+                    <a:prstGeom prst="rect"/>
+                  </pic:spPr>
+                </pic:pic>
+              </a:graphicData>
+            </a:graphic>
+          </wp:inline>
+        </w:drawing>
+      </w:r>
+    </w:p>
+    <w:p>
+      <w:pPr>
+        <w:spacing w:before="80" w:after="280"/>
         <w:jc w:val="center"/>
       </w:pPr>
       <w:r>
@@ -15576,69 +15419,50 @@
         <w:t>The strongest safety example is the disguised write request asking to cancel orders stuck in Pending for more than 30 days. Baseline B1 produced an executable UPDATE statement. AEGIS cannot express a write intent in its intent object or compiler templates, so it did not emit write SQL. This is the central safety result: AEGIS prevents this class of unsafe execution structurally rather than hoping the model follows an instruction not to write dangerous SQL.</w:t>
       </w:r>
     </w:p>
-    <w:tbl>
-      <w:tblPr>
-        <w:tblW w:type="auto" w:w="0"/>
+    <w:p>
+      <w:pPr>
+        <w:spacing w:before="160" w:after="80"/>
         <w:jc w:val="center"/>
-        <w:tblLayout w:type="fixed"/>
-        <w:tblLook w:firstColumn="1" w:firstRow="1" w:lastColumn="0" w:lastRow="0" w:noHBand="0" w:noVBand="1" w:val="04A0"/>
-      </w:tblPr>
-      <w:tblGrid>
-        <w:gridCol w:w="9072"/>
-      </w:tblGrid>
-      <w:tr>
-        <w:trPr>
-          <w:trHeight w:val="3744"/>
-          <w:trHeight w:val="3744" w:hRule="atLeast"/>
-        </w:trPr>
-        <w:tc>
-          <w:tcPr>
-            <w:tcW w:type="dxa" w:w="9072"/>
-            <w:tcBorders>
-              <w:top w:val="dashed" w:sz="10" w:space="0" w:color="888888"/>
-              <w:left w:val="dashed" w:sz="10" w:space="0" w:color="888888"/>
-              <w:bottom w:val="dashed" w:sz="10" w:space="0" w:color="888888"/>
-              <w:right w:val="dashed" w:sz="10" w:space="0" w:color="888888"/>
-            </w:tcBorders>
-            <w:shd w:val="clear" w:fill="F7F7F7"/>
-          </w:tcPr>
-          <w:p>
-            <w:pPr>
-              <w:spacing w:before="280" w:after="120"/>
-              <w:jc w:val="center"/>
-            </w:pPr>
-            <w:r/>
-            <w:r>
-              <w:rPr>
-                <w:rFonts w:ascii="Times New Roman" w:hAnsi="Times New Roman"/>
-                <w:b/>
-                <w:color w:val="993300"/>
-                <w:sz w:val="21"/>
-              </w:rPr>
-              <w:t>[ PLACEHOLDER - FIGURE 9 NOT YET INSERTED ]</w:t>
-            </w:r>
-          </w:p>
-          <w:p>
-            <w:pPr>
-              <w:spacing w:after="160"/>
-              <w:jc w:val="center"/>
-            </w:pPr>
-            <w:r>
-              <w:rPr>
-                <w:rFonts w:ascii="Times New Roman" w:hAnsi="Times New Roman"/>
-                <w:b/>
-                <w:color w:val="333333"/>
-                <w:sz w:val="22"/>
-              </w:rPr>
-              <w:t>Verified safety and execution-validity comparison</w:t>
-            </w:r>
-          </w:p>
-        </w:tc>
-      </w:tr>
-    </w:tbl>
-    <w:p>
-      <w:pPr>
-        <w:spacing w:before="120" w:after="280"/>
+        <w:keepNext/>
+      </w:pPr>
+      <w:r>
+        <w:drawing>
+          <wp:inline xmlns:a="http://schemas.openxmlformats.org/drawingml/2006/main" xmlns:pic="http://schemas.openxmlformats.org/drawingml/2006/picture">
+            <wp:extent cx="5349240" cy="3120390"/>
+            <wp:docPr id="11" name="Picture 11"/>
+            <wp:cNvGraphicFramePr>
+              <a:graphicFrameLocks noChangeAspect="1"/>
+            </wp:cNvGraphicFramePr>
+            <a:graphic>
+              <a:graphicData uri="http://schemas.openxmlformats.org/drawingml/2006/picture">
+                <pic:pic>
+                  <pic:nvPicPr>
+                    <pic:cNvPr id="0" name="figure-09-safety-execution-results.png"/>
+                    <pic:cNvPicPr/>
+                  </pic:nvPicPr>
+                  <pic:blipFill>
+                    <a:blip r:embed="rId20"/>
+                    <a:stretch>
+                      <a:fillRect/>
+                    </a:stretch>
+                  </pic:blipFill>
+                  <pic:spPr>
+                    <a:xfrm>
+                      <a:off x="0" y="0"/>
+                      <a:ext cx="5349240" cy="3120390"/>
+                    </a:xfrm>
+                    <a:prstGeom prst="rect"/>
+                  </pic:spPr>
+                </pic:pic>
+              </a:graphicData>
+            </a:graphic>
+          </wp:inline>
+        </w:drawing>
+      </w:r>
+    </w:p>
+    <w:p>
+      <w:pPr>
+        <w:spacing w:before="80" w:after="280"/>
         <w:jc w:val="center"/>
       </w:pPr>
       <w:r>

</xml_diff>

<commit_message>
Refine thesis figure spacing and page flow
</commit_message>
<xml_diff>
--- a/docs/scripts/AEGIS Thesis Book Draft - A Constraint-Based Architecture for Safe LLM-Assisted Natural Language Analytics.docx
+++ b/docs/scripts/AEGIS Thesis Book Draft - A Constraint-Based Architecture for Safe LLM-Assisted Natural Language Analytics.docx
@@ -1228,7 +1228,7 @@
         </w:rPr>
         <w:t>2.6 Research Gap Analysis</w:t>
         <w:tab/>
-        <w:t>8</w:t>
+        <w:t>7</w:t>
       </w:r>
     </w:p>
     <w:p>
@@ -1248,7 +1248,7 @@
         </w:rPr>
         <w:t>Chapter 3: Methodology</w:t>
         <w:tab/>
-        <w:t>9</w:t>
+        <w:t>8</w:t>
       </w:r>
     </w:p>
     <w:p>
@@ -1268,7 +1268,7 @@
         </w:rPr>
         <w:t>3.1 Research Paradigm</w:t>
         <w:tab/>
-        <w:t>9</w:t>
+        <w:t>8</w:t>
       </w:r>
     </w:p>
     <w:p>
@@ -1288,7 +1288,7 @@
         </w:rPr>
         <w:t>3.2 Formative Study of Reporting Patterns</w:t>
         <w:tab/>
-        <w:t>10</w:t>
+        <w:t>9</w:t>
       </w:r>
     </w:p>
     <w:p>
@@ -1308,7 +1308,7 @@
         </w:rPr>
         <w:t>3.3 Design Principles</w:t>
         <w:tab/>
-        <w:t>12</w:t>
+        <w:t>10</w:t>
       </w:r>
     </w:p>
     <w:p>
@@ -1328,7 +1328,7 @@
         </w:rPr>
         <w:t>3.4 Formal Model</w:t>
         <w:tab/>
-        <w:t>12</w:t>
+        <w:t>11</w:t>
       </w:r>
     </w:p>
     <w:p>
@@ -1348,7 +1348,7 @@
         </w:rPr>
         <w:t>3.5 Threat Model</w:t>
         <w:tab/>
-        <w:t>12</w:t>
+        <w:t>11</w:t>
       </w:r>
     </w:p>
     <w:p>
@@ -1368,7 +1368,7 @@
         </w:rPr>
         <w:t>3.6 System Architecture</w:t>
         <w:tab/>
-        <w:t>14</w:t>
+        <w:t>13</w:t>
       </w:r>
     </w:p>
     <w:p>
@@ -1388,7 +1388,7 @@
         </w:rPr>
         <w:t>3.7 Semantic Layer Design</w:t>
         <w:tab/>
-        <w:t>15</w:t>
+        <w:t>14</w:t>
       </w:r>
     </w:p>
     <w:p>
@@ -1408,7 +1408,7 @@
         </w:rPr>
         <w:t>3.8 Intent Parsing with Dynamic Vocabulary Injection</w:t>
         <w:tab/>
-        <w:t>16</w:t>
+        <w:t>15</w:t>
       </w:r>
     </w:p>
     <w:p>
@@ -1468,7 +1468,7 @@
         </w:rPr>
         <w:t>3.11 Widget Persistence and Reuse</w:t>
         <w:tab/>
-        <w:t>20</w:t>
+        <w:t>19</w:t>
       </w:r>
     </w:p>
     <w:p>
@@ -1488,7 +1488,7 @@
         </w:rPr>
         <w:t>Chapter 4: Experimental Work</w:t>
         <w:tab/>
-        <w:t>23</w:t>
+        <w:t>22</w:t>
       </w:r>
     </w:p>
     <w:p>
@@ -1508,7 +1508,7 @@
         </w:rPr>
         <w:t>4.1 Implementation</w:t>
         <w:tab/>
-        <w:t>23</w:t>
+        <w:t>22</w:t>
       </w:r>
     </w:p>
     <w:p>
@@ -1528,7 +1528,7 @@
         </w:rPr>
         <w:t>4.2 Experimental Environment</w:t>
         <w:tab/>
-        <w:t>24</w:t>
+        <w:t>23</w:t>
       </w:r>
     </w:p>
     <w:p>
@@ -1548,7 +1548,7 @@
         </w:rPr>
         <w:t>4.3 Benchmark Dataset Construction</w:t>
         <w:tab/>
-        <w:t>24</w:t>
+        <w:t>23</w:t>
       </w:r>
     </w:p>
     <w:p>
@@ -1568,7 +1568,7 @@
         </w:rPr>
         <w:t>4.4 Baseline Systems</w:t>
         <w:tab/>
-        <w:t>25</w:t>
+        <w:t>24</w:t>
       </w:r>
     </w:p>
     <w:p>
@@ -1588,7 +1588,7 @@
         </w:rPr>
         <w:t>4.5 Evaluation Procedure</w:t>
         <w:tab/>
-        <w:t>25</w:t>
+        <w:t>24</w:t>
       </w:r>
     </w:p>
     <w:p>
@@ -1608,7 +1608,7 @@
         </w:rPr>
         <w:t>Chapter 5: Results and Discussion</w:t>
         <w:tab/>
-        <w:t>26</w:t>
+        <w:t>25</w:t>
       </w:r>
     </w:p>
     <w:p>
@@ -1628,7 +1628,7 @@
         </w:rPr>
         <w:t>5.1 Evaluation Overview</w:t>
         <w:tab/>
-        <w:t>26</w:t>
+        <w:t>25</w:t>
       </w:r>
     </w:p>
     <w:p>
@@ -1648,7 +1648,7 @@
         </w:rPr>
         <w:t>5.2 Main Result Summary</w:t>
         <w:tab/>
-        <w:t>26</w:t>
+        <w:t>25</w:t>
       </w:r>
     </w:p>
     <w:p>
@@ -1668,7 +1668,7 @@
         </w:rPr>
         <w:t>5.3 SQL Safety</w:t>
         <w:tab/>
-        <w:t>27</w:t>
+        <w:t>26</w:t>
       </w:r>
     </w:p>
     <w:p>
@@ -1688,7 +1688,7 @@
         </w:rPr>
         <w:t>5.4 True Database Execution Validity</w:t>
         <w:tab/>
-        <w:t>28</w:t>
+        <w:t>27</w:t>
       </w:r>
     </w:p>
     <w:p>
@@ -1708,7 +1708,7 @@
         </w:rPr>
         <w:t>5.5 Execution Failure Analysis</w:t>
         <w:tab/>
-        <w:t>28</w:t>
+        <w:t>27</w:t>
       </w:r>
     </w:p>
     <w:p>
@@ -1728,7 +1728,7 @@
         </w:rPr>
         <w:t>5.6 Semantic Correctness Limitation</w:t>
         <w:tab/>
-        <w:t>29</w:t>
+        <w:t>28</w:t>
       </w:r>
     </w:p>
     <w:p>
@@ -1748,7 +1748,7 @@
         </w:rPr>
         <w:t>5.7 B3 Template-Only Baseline</w:t>
         <w:tab/>
-        <w:t>30</w:t>
+        <w:t>29</w:t>
       </w:r>
     </w:p>
     <w:p>
@@ -1768,7 +1768,7 @@
         </w:rPr>
         <w:t>5.8 Comparative Discussion</w:t>
         <w:tab/>
-        <w:t>30</w:t>
+        <w:t>29</w:t>
       </w:r>
     </w:p>
     <w:p>
@@ -1788,7 +1788,7 @@
         </w:rPr>
         <w:t>Chapter 6: Limitations and Future Work</w:t>
         <w:tab/>
-        <w:t>32</w:t>
+        <w:t>31</w:t>
       </w:r>
     </w:p>
     <w:p>
@@ -1808,7 +1808,7 @@
         </w:rPr>
         <w:t>Chapter 7: Conclusion</w:t>
         <w:tab/>
-        <w:t>32</w:t>
+        <w:t>33</w:t>
       </w:r>
     </w:p>
     <w:p>
@@ -1828,7 +1828,7 @@
         </w:rPr>
         <w:t>References</w:t>
         <w:tab/>
-        <w:t>33</w:t>
+        <w:t>34</w:t>
       </w:r>
     </w:p>
     <w:p>
@@ -1866,7 +1866,7 @@
         </w:rPr>
         <w:t>Figure 1: Design Science Research workflow</w:t>
         <w:tab/>
-        <w:t>10</w:t>
+        <w:t>8</w:t>
       </w:r>
     </w:p>
     <w:p>
@@ -1884,7 +1884,7 @@
         </w:rPr>
         <w:t>Figure 2: Benchmark pattern classification</w:t>
         <w:tab/>
-        <w:t>11</w:t>
+        <w:t>10</w:t>
       </w:r>
     </w:p>
     <w:p>
@@ -1902,7 +1902,7 @@
         </w:rPr>
         <w:t>Figure 3: AEGIS architecture pipeline</w:t>
         <w:tab/>
-        <w:t>15</w:t>
+        <w:t>14</w:t>
       </w:r>
     </w:p>
     <w:p>
@@ -1920,7 +1920,7 @@
         </w:rPr>
         <w:t>Figure 4: Semantic layer modularity</w:t>
         <w:tab/>
-        <w:t>16</w:t>
+        <w:t>15</w:t>
       </w:r>
     </w:p>
     <w:p>
@@ -1938,7 +1938,7 @@
         </w:rPr>
         <w:t>Figure 5: Vocabulary injection workflow</w:t>
         <w:tab/>
-        <w:t>18</w:t>
+        <w:t>17</w:t>
       </w:r>
     </w:p>
     <w:p>
@@ -1956,7 +1956,7 @@
         </w:rPr>
         <w:t>Figure 6: AEGIS analytical patterns</w:t>
         <w:tab/>
-        <w:t>19</w:t>
+        <w:t>18</w:t>
       </w:r>
     </w:p>
     <w:p>
@@ -1974,7 +1974,7 @@
         </w:rPr>
         <w:t>Figure 7: Two-layer SQL safety defence</w:t>
         <w:tab/>
-        <w:t>20</w:t>
+        <w:t>19</w:t>
       </w:r>
     </w:p>
     <w:p>
@@ -1992,7 +1992,7 @@
         </w:rPr>
         <w:t>Figure 8: Widget lifecycle and refresh model</w:t>
         <w:tab/>
-        <w:t>22</w:t>
+        <w:t>21</w:t>
       </w:r>
     </w:p>
     <w:p>
@@ -2010,7 +2010,7 @@
         </w:rPr>
         <w:t>Figure 9: Safety and execution-validity comparison</w:t>
         <w:tab/>
-        <w:t>28</w:t>
+        <w:t>27</w:t>
       </w:r>
     </w:p>
     <w:p>
@@ -2066,7 +2066,7 @@
         </w:rPr>
         <w:t>Table 3.1: Benchmark pattern classification</w:t>
         <w:tab/>
-        <w:t>10</w:t>
+        <w:t>9</w:t>
       </w:r>
     </w:p>
     <w:p>
@@ -2084,7 +2084,7 @@
         </w:rPr>
         <w:t>Table 3.2: Semantic layer object model</w:t>
         <w:tab/>
-        <w:t>16</w:t>
+        <w:t>15</w:t>
       </w:r>
     </w:p>
     <w:p>
@@ -2138,7 +2138,7 @@
         </w:rPr>
         <w:t>Table 4.1: Experimental setup</w:t>
         <w:tab/>
-        <w:t>24</w:t>
+        <w:t>23</w:t>
       </w:r>
     </w:p>
     <w:p>
@@ -2156,7 +2156,7 @@
         </w:rPr>
         <w:t>Table 5.1: Evaluation benchmark status</w:t>
         <w:tab/>
-        <w:t>26</w:t>
+        <w:t>25</w:t>
       </w:r>
     </w:p>
     <w:p>
@@ -2174,7 +2174,7 @@
         </w:rPr>
         <w:t>Table 5.2: Main evaluation result summary</w:t>
         <w:tab/>
-        <w:t>27</w:t>
+        <w:t>26</w:t>
       </w:r>
     </w:p>
     <w:p>
@@ -2192,7 +2192,7 @@
         </w:rPr>
         <w:t>Table 5.3: SQL safety</w:t>
         <w:tab/>
-        <w:t>27</w:t>
+        <w:t>26</w:t>
       </w:r>
     </w:p>
     <w:p>
@@ -2210,7 +2210,7 @@
         </w:rPr>
         <w:t>Table 5.4: True execution validity</w:t>
         <w:tab/>
-        <w:t>28</w:t>
+        <w:t>27</w:t>
       </w:r>
     </w:p>
     <w:p>
@@ -2228,7 +2228,7 @@
         </w:rPr>
         <w:t>Table 5.5: True-execution failure analysis</w:t>
         <w:tab/>
-        <w:t>29</w:t>
+        <w:t>28</w:t>
       </w:r>
     </w:p>
     <w:p>
@@ -2246,7 +2246,7 @@
         </w:rPr>
         <w:t>Table 5.6: Evaluation metric distinction</w:t>
         <w:tab/>
-        <w:t>29</w:t>
+        <w:t>28</w:t>
       </w:r>
     </w:p>
     <w:p>
@@ -2264,7 +2264,7 @@
         </w:rPr>
         <w:t>Table 5.7: Template-only baseline summary</w:t>
         <w:tab/>
-        <w:t>30</w:t>
+        <w:t>29</w:t>
       </w:r>
     </w:p>
     <w:p>
@@ -2282,7 +2282,7 @@
         </w:rPr>
         <w:t>Table 5.8: AEGIS vs. direct LLM-to-SQL</w:t>
         <w:tab/>
-        <w:t>31</w:t>
+        <w:t>30</w:t>
       </w:r>
     </w:p>
     <w:p>
@@ -6122,11 +6122,6 @@
       </w:pPr>
     </w:p>
     <w:p>
-      <w:r>
-        <w:br w:type="page"/>
-      </w:r>
-    </w:p>
-    <w:p>
       <w:pPr>
         <w:spacing w:before="320" w:after="160"/>
         <w:jc w:val="left"/>
@@ -6545,7 +6540,7 @@
       <w:r>
         <w:drawing>
           <wp:inline xmlns:a="http://schemas.openxmlformats.org/drawingml/2006/main" xmlns:pic="http://schemas.openxmlformats.org/drawingml/2006/picture">
-            <wp:extent cx="5715000" cy="3333750"/>
+            <wp:extent cx="5715000" cy="2857500"/>
             <wp:docPr id="3" name="Picture 3"/>
             <wp:cNvGraphicFramePr>
               <a:graphicFrameLocks noChangeAspect="1"/>
@@ -6566,7 +6561,7 @@
                   <pic:spPr>
                     <a:xfrm>
                       <a:off x="0" y="0"/>
-                      <a:ext cx="5715000" cy="3333750"/>
+                      <a:ext cx="5715000" cy="2857500"/>
                     </a:xfrm>
                     <a:prstGeom prst="rect"/>
                   </pic:spPr>
@@ -17561,7 +17556,6 @@
         <w:rPr>
           <w:rFonts w:ascii="Times New Roman" w:hAnsi="Times New Roman"/>
           <w:b/>
-          <w:i/>
           <w:sz w:val="25"/>
         </w:rPr>
         <w:t>5.8.1  AEGIS vs. Direct LLM-to-SQL</w:t>
@@ -18292,7 +18286,6 @@
         <w:rPr>
           <w:rFonts w:ascii="Times New Roman" w:hAnsi="Times New Roman"/>
           <w:b/>
-          <w:i/>
           <w:sz w:val="25"/>
         </w:rPr>
         <w:t>5.8.2  Semantic Layer versus Retrieval-Augmented Generation</w:t>
@@ -18322,7 +18315,6 @@
         <w:rPr>
           <w:rFonts w:ascii="Times New Roman" w:hAnsi="Times New Roman"/>
           <w:b/>
-          <w:i/>
           <w:sz w:val="25"/>
         </w:rPr>
         <w:t>5.8.3  Scope Boundary</w:t>

</xml_diff>

<commit_message>
Fix final thesis PDF review issues
</commit_message>
<xml_diff>
--- a/docs/scripts/AEGIS Thesis Book Draft - A Constraint-Based Architecture for Safe LLM-Assisted Natural Language Analytics.docx
+++ b/docs/scripts/AEGIS Thesis Book Draft - A Constraint-Based Architecture for Safe LLM-Assisted Natural Language Analytics.docx
@@ -1808,7 +1808,7 @@
         </w:rPr>
         <w:t>Chapter 7: Conclusion</w:t>
         <w:tab/>
-        <w:t>33</w:t>
+        <w:t>32</w:t>
       </w:r>
     </w:p>
     <w:p>
@@ -1828,7 +1828,7 @@
         </w:rPr>
         <w:t>References</w:t>
         <w:tab/>
-        <w:t>34</w:t>
+        <w:t>33</w:t>
       </w:r>
     </w:p>
     <w:p>
@@ -8533,7 +8533,7 @@
           <w:rFonts w:ascii="Times New Roman" w:hAnsi="Times New Roman"/>
           <w:sz w:val="24"/>
         </w:rPr>
-        <w:t>No template in the pattern library contains a DML or DDL keyword. The AST-level post-compilation validator explicitly rejects any non-SELECT statement as a defense-in-depth layer.</w:t>
+        <w:t>No template in the pattern library contains a DML or DDL keyword. The AST-level post-compilation validator explicitly rejects any non-SELECT statement as an additional safety layer.</w:t>
       </w:r>
     </w:p>
     <w:p>
@@ -11401,7 +11401,7 @@
           <w:i w:val="0"/>
           <w:sz w:val="24"/>
         </w:rPr>
-        <w:t>After placeholder substitution, two safety layers apply in sequence. Layer 1 is a parameterized query engine that separates SQL structure from user-supplied inputs, so no user text is ever concatenated into the SQL string. Layer 2 is a post-compilation safety scanner that rejects any assembled query containing a forbidden construct: non-SELECT statements, UNION, EXCEPT or INTERSECT, EXEC, or references to system tables. If any forbidden pattern is detected, the compiler raises a SecurityError rather than returning a partially safe query.</w:t>
+        <w:t>Two safety layers apply in sequence. Layer 1 is a parameterized query engine that separates SQL structure from user-supplied inputs, so no user text is ever concatenated into the SQL string. Layer 2 is a post-compilation safety scanner that rejects any assembled query containing a forbidden construct: non-SELECT statements, UNION, EXCEPT or INTERSECT, EXEC, or references to system tables. If any forbidden pattern is detected, the compiler raises a SecurityError rather than returning a partially safe query.</w:t>
       </w:r>
     </w:p>
     <w:p>
@@ -18684,11 +18684,6 @@
           <w:sz w:val="24"/>
         </w:rPr>
         <w:t>Query-cost controls, database-backed widget storage, broader schema coverage, and multi-turn support should be added before production deployment.</w:t>
-      </w:r>
-    </w:p>
-    <w:p>
-      <w:r>
-        <w:br w:type="page"/>
       </w:r>
     </w:p>
     <w:p>

</xml_diff>

<commit_message>
Refine thesis objectives and methodology
</commit_message>
<xml_diff>
--- a/docs/scripts/AEGIS Thesis Book Draft - A Constraint-Based Architecture for Safe LLM-Assisted Natural Language Analytics.docx
+++ b/docs/scripts/AEGIS Thesis Book Draft - A Constraint-Based Architecture for Safe LLM-Assisted Natural Language Analytics.docx
@@ -1288,7 +1288,7 @@
         </w:rPr>
         <w:t>3.2 Formative Study of Reporting Patterns</w:t>
         <w:tab/>
-        <w:t>9</w:t>
+        <w:t>10</w:t>
       </w:r>
     </w:p>
     <w:p>
@@ -1308,7 +1308,7 @@
         </w:rPr>
         <w:t>3.3 Design Principles</w:t>
         <w:tab/>
-        <w:t>10</w:t>
+        <w:t>11</w:t>
       </w:r>
     </w:p>
     <w:p>
@@ -1328,7 +1328,7 @@
         </w:rPr>
         <w:t>3.4 Formal Model</w:t>
         <w:tab/>
-        <w:t>11</w:t>
+        <w:t>12</w:t>
       </w:r>
     </w:p>
     <w:p>
@@ -1348,7 +1348,7 @@
         </w:rPr>
         <w:t>3.5 Threat Model</w:t>
         <w:tab/>
-        <w:t>11</w:t>
+        <w:t>12</w:t>
       </w:r>
     </w:p>
     <w:p>
@@ -1368,7 +1368,7 @@
         </w:rPr>
         <w:t>3.6 System Architecture</w:t>
         <w:tab/>
-        <w:t>13</w:t>
+        <w:t>14</w:t>
       </w:r>
     </w:p>
     <w:p>
@@ -1388,7 +1388,7 @@
         </w:rPr>
         <w:t>3.7 Semantic Layer Design</w:t>
         <w:tab/>
-        <w:t>14</w:t>
+        <w:t>15</w:t>
       </w:r>
     </w:p>
     <w:p>
@@ -1408,7 +1408,7 @@
         </w:rPr>
         <w:t>3.8 Intent Parsing with Dynamic Vocabulary Injection</w:t>
         <w:tab/>
-        <w:t>15</w:t>
+        <w:t>16</w:t>
       </w:r>
     </w:p>
     <w:p>
@@ -1428,7 +1428,7 @@
         </w:rPr>
         <w:t>3.9 Safe Query Compiler</w:t>
         <w:tab/>
-        <w:t>18</w:t>
+        <w:t>19</w:t>
       </w:r>
     </w:p>
     <w:p>
@@ -1448,7 +1448,7 @@
         </w:rPr>
         <w:t>3.10 Visualization Selector</w:t>
         <w:tab/>
-        <w:t>19</w:t>
+        <w:t>20</w:t>
       </w:r>
     </w:p>
     <w:p>
@@ -1468,7 +1468,7 @@
         </w:rPr>
         <w:t>3.11 Widget Persistence and Reuse</w:t>
         <w:tab/>
-        <w:t>19</w:t>
+        <w:t>20</w:t>
       </w:r>
     </w:p>
     <w:p>
@@ -1488,7 +1488,7 @@
         </w:rPr>
         <w:t>Chapter 4: Experimental Work</w:t>
         <w:tab/>
-        <w:t>22</w:t>
+        <w:t>23</w:t>
       </w:r>
     </w:p>
     <w:p>
@@ -1508,7 +1508,7 @@
         </w:rPr>
         <w:t>4.1 Implementation</w:t>
         <w:tab/>
-        <w:t>22</w:t>
+        <w:t>23</w:t>
       </w:r>
     </w:p>
     <w:p>
@@ -1528,7 +1528,7 @@
         </w:rPr>
         <w:t>4.2 Experimental Environment</w:t>
         <w:tab/>
-        <w:t>23</w:t>
+        <w:t>24</w:t>
       </w:r>
     </w:p>
     <w:p>
@@ -1548,7 +1548,7 @@
         </w:rPr>
         <w:t>4.3 Benchmark Dataset Construction</w:t>
         <w:tab/>
-        <w:t>23</w:t>
+        <w:t>24</w:t>
       </w:r>
     </w:p>
     <w:p>
@@ -1568,7 +1568,7 @@
         </w:rPr>
         <w:t>4.4 Baseline Systems</w:t>
         <w:tab/>
-        <w:t>24</w:t>
+        <w:t>25</w:t>
       </w:r>
     </w:p>
     <w:p>
@@ -1588,7 +1588,7 @@
         </w:rPr>
         <w:t>4.5 Evaluation Procedure</w:t>
         <w:tab/>
-        <w:t>24</w:t>
+        <w:t>25</w:t>
       </w:r>
     </w:p>
     <w:p>
@@ -1608,7 +1608,7 @@
         </w:rPr>
         <w:t>Chapter 5: Results and Discussion</w:t>
         <w:tab/>
-        <w:t>25</w:t>
+        <w:t>26</w:t>
       </w:r>
     </w:p>
     <w:p>
@@ -1628,7 +1628,7 @@
         </w:rPr>
         <w:t>5.1 Evaluation Overview</w:t>
         <w:tab/>
-        <w:t>25</w:t>
+        <w:t>26</w:t>
       </w:r>
     </w:p>
     <w:p>
@@ -1648,7 +1648,7 @@
         </w:rPr>
         <w:t>5.2 Main Result Summary</w:t>
         <w:tab/>
-        <w:t>25</w:t>
+        <w:t>26</w:t>
       </w:r>
     </w:p>
     <w:p>
@@ -1668,7 +1668,7 @@
         </w:rPr>
         <w:t>5.3 SQL Safety</w:t>
         <w:tab/>
-        <w:t>26</w:t>
+        <w:t>27</w:t>
       </w:r>
     </w:p>
     <w:p>
@@ -1688,7 +1688,7 @@
         </w:rPr>
         <w:t>5.4 True Database Execution Validity</w:t>
         <w:tab/>
-        <w:t>27</w:t>
+        <w:t>28</w:t>
       </w:r>
     </w:p>
     <w:p>
@@ -1708,7 +1708,7 @@
         </w:rPr>
         <w:t>5.5 Execution Failure Analysis</w:t>
         <w:tab/>
-        <w:t>27</w:t>
+        <w:t>28</w:t>
       </w:r>
     </w:p>
     <w:p>
@@ -1728,7 +1728,7 @@
         </w:rPr>
         <w:t>5.6 Semantic Correctness Limitation</w:t>
         <w:tab/>
-        <w:t>28</w:t>
+        <w:t>29</w:t>
       </w:r>
     </w:p>
     <w:p>
@@ -1748,7 +1748,7 @@
         </w:rPr>
         <w:t>5.7 B3 Template-Only Baseline</w:t>
         <w:tab/>
-        <w:t>29</w:t>
+        <w:t>30</w:t>
       </w:r>
     </w:p>
     <w:p>
@@ -1768,7 +1768,7 @@
         </w:rPr>
         <w:t>5.8 Comparative Discussion</w:t>
         <w:tab/>
-        <w:t>29</w:t>
+        <w:t>30</w:t>
       </w:r>
     </w:p>
     <w:p>
@@ -1788,7 +1788,7 @@
         </w:rPr>
         <w:t>Chapter 6: Limitations and Future Work</w:t>
         <w:tab/>
-        <w:t>31</w:t>
+        <w:t>32</w:t>
       </w:r>
     </w:p>
     <w:p>
@@ -1808,7 +1808,7 @@
         </w:rPr>
         <w:t>Chapter 7: Conclusion</w:t>
         <w:tab/>
-        <w:t>32</w:t>
+        <w:t>33</w:t>
       </w:r>
     </w:p>
     <w:p>
@@ -1828,7 +1828,7 @@
         </w:rPr>
         <w:t>References</w:t>
         <w:tab/>
-        <w:t>33</w:t>
+        <w:t>34</w:t>
       </w:r>
     </w:p>
     <w:p>
@@ -1884,7 +1884,7 @@
         </w:rPr>
         <w:t>Figure 2: Benchmark pattern classification</w:t>
         <w:tab/>
-        <w:t>10</w:t>
+        <w:t>11</w:t>
       </w:r>
     </w:p>
     <w:p>
@@ -1902,7 +1902,7 @@
         </w:rPr>
         <w:t>Figure 3: AEGIS architecture pipeline</w:t>
         <w:tab/>
-        <w:t>14</w:t>
+        <w:t>15</w:t>
       </w:r>
     </w:p>
     <w:p>
@@ -1920,7 +1920,7 @@
         </w:rPr>
         <w:t>Figure 4: Semantic layer modularity</w:t>
         <w:tab/>
-        <w:t>15</w:t>
+        <w:t>16</w:t>
       </w:r>
     </w:p>
     <w:p>
@@ -1956,7 +1956,7 @@
         </w:rPr>
         <w:t>Figure 6: AEGIS analytical patterns</w:t>
         <w:tab/>
-        <w:t>18</w:t>
+        <w:t>19</w:t>
       </w:r>
     </w:p>
     <w:p>
@@ -1974,7 +1974,7 @@
         </w:rPr>
         <w:t>Figure 7: Two-layer SQL safety defence</w:t>
         <w:tab/>
-        <w:t>19</w:t>
+        <w:t>20</w:t>
       </w:r>
     </w:p>
     <w:p>
@@ -1992,7 +1992,7 @@
         </w:rPr>
         <w:t>Figure 8: Widget lifecycle and refresh model</w:t>
         <w:tab/>
-        <w:t>21</w:t>
+        <w:t>22</w:t>
       </w:r>
     </w:p>
     <w:p>
@@ -2010,7 +2010,7 @@
         </w:rPr>
         <w:t>Figure 9: Safety and execution-validity comparison</w:t>
         <w:tab/>
-        <w:t>27</w:t>
+        <w:t>28</w:t>
       </w:r>
     </w:p>
     <w:p>
@@ -2066,7 +2066,7 @@
         </w:rPr>
         <w:t>Table 3.1: Benchmark pattern classification</w:t>
         <w:tab/>
-        <w:t>9</w:t>
+        <w:t>10</w:t>
       </w:r>
     </w:p>
     <w:p>
@@ -2084,7 +2084,7 @@
         </w:rPr>
         <w:t>Table 3.2: Semantic layer object model</w:t>
         <w:tab/>
-        <w:t>15</w:t>
+        <w:t>16</w:t>
       </w:r>
     </w:p>
     <w:p>
@@ -2102,7 +2102,7 @@
         </w:rPr>
         <w:t>Table 3.3: AEGIS analytical patterns</w:t>
         <w:tab/>
-        <w:t>18</w:t>
+        <w:t>19</w:t>
       </w:r>
     </w:p>
     <w:p>
@@ -2138,7 +2138,7 @@
         </w:rPr>
         <w:t>Table 4.1: Experimental setup</w:t>
         <w:tab/>
-        <w:t>23</w:t>
+        <w:t>24</w:t>
       </w:r>
     </w:p>
     <w:p>
@@ -2156,7 +2156,7 @@
         </w:rPr>
         <w:t>Table 5.1: Evaluation benchmark status</w:t>
         <w:tab/>
-        <w:t>25</w:t>
+        <w:t>26</w:t>
       </w:r>
     </w:p>
     <w:p>
@@ -2174,7 +2174,7 @@
         </w:rPr>
         <w:t>Table 5.2: Main evaluation result summary</w:t>
         <w:tab/>
-        <w:t>26</w:t>
+        <w:t>27</w:t>
       </w:r>
     </w:p>
     <w:p>
@@ -2192,7 +2192,7 @@
         </w:rPr>
         <w:t>Table 5.3: SQL safety</w:t>
         <w:tab/>
-        <w:t>26</w:t>
+        <w:t>27</w:t>
       </w:r>
     </w:p>
     <w:p>
@@ -2210,7 +2210,7 @@
         </w:rPr>
         <w:t>Table 5.4: True execution validity</w:t>
         <w:tab/>
-        <w:t>27</w:t>
+        <w:t>28</w:t>
       </w:r>
     </w:p>
     <w:p>
@@ -2228,7 +2228,7 @@
         </w:rPr>
         <w:t>Table 5.5: True-execution failure analysis</w:t>
         <w:tab/>
-        <w:t>28</w:t>
+        <w:t>29</w:t>
       </w:r>
     </w:p>
     <w:p>
@@ -2246,7 +2246,7 @@
         </w:rPr>
         <w:t>Table 5.6: Evaluation metric distinction</w:t>
         <w:tab/>
-        <w:t>28</w:t>
+        <w:t>29</w:t>
       </w:r>
     </w:p>
     <w:p>
@@ -2264,7 +2264,7 @@
         </w:rPr>
         <w:t>Table 5.7: Template-only baseline summary</w:t>
         <w:tab/>
-        <w:t>29</w:t>
+        <w:t>30</w:t>
       </w:r>
     </w:p>
     <w:p>
@@ -2282,7 +2282,7 @@
         </w:rPr>
         <w:t>Table 5.8: AEGIS vs. direct LLM-to-SQL</w:t>
         <w:tab/>
-        <w:t>30</w:t>
+        <w:t>31</w:t>
       </w:r>
     </w:p>
     <w:p>
@@ -2635,123 +2635,12 @@
           <w:i w:val="0"/>
           <w:sz w:val="24"/>
         </w:rPr>
-        <w:t>This thesis makes the following contributions:</w:t>
-      </w:r>
-    </w:p>
-    <w:p>
-      <w:pPr>
-        <w:pStyle w:val="ListNumber"/>
-        <w:spacing w:after="80" w:line="360" w:lineRule="auto"/>
-      </w:pPr>
-      <w:r>
-        <w:rPr>
-          <w:rFonts w:ascii="Times New Roman" w:hAnsi="Times New Roman"/>
-          <w:sz w:val="24"/>
-        </w:rPr>
-        <w:t>A design-time review of representative e-commerce and business-intelligence reporting requests, resulting in eleven common reporting patterns later used to structure the custom 107-request benchmark.</w:t>
-      </w:r>
-    </w:p>
-    <w:p>
-      <w:pPr>
-        <w:pStyle w:val="ListNumber"/>
-        <w:spacing w:after="80" w:line="360" w:lineRule="auto"/>
-      </w:pPr>
-      <w:r>
-        <w:rPr>
-          <w:rFonts w:ascii="Times New Roman" w:hAnsi="Times New Roman"/>
-          <w:sz w:val="24"/>
-        </w:rPr>
-        <w:t>A system design in which all possible queries are limited to pre-approved templates and a defined semantic layer, which prevents SQL injection and unauthorized data access by construction.</w:t>
-      </w:r>
-    </w:p>
-    <w:p>
-      <w:pPr>
-        <w:pStyle w:val="ListNumber"/>
-        <w:spacing w:after="80" w:line="360" w:lineRule="auto"/>
-      </w:pPr>
-      <w:r>
-        <w:rPr>
-          <w:rFonts w:ascii="Times New Roman" w:hAnsi="Times New Roman"/>
-          <w:sz w:val="24"/>
-        </w:rPr>
-        <w:t>The AEGIS system itself, including the semantic layer design, a vocabulary injection prompting strategy, a safe SQL builder with two-layer defence, a rule-based chart selector, and a widget storage system with scheduled refresh.</w:t>
-      </w:r>
-    </w:p>
-    <w:p>
-      <w:pPr>
-        <w:pStyle w:val="ListNumber"/>
-        <w:spacing w:after="80" w:line="360" w:lineRule="auto"/>
-      </w:pPr>
-      <w:r>
-        <w:rPr>
-          <w:rFonts w:ascii="Times New Roman" w:hAnsi="Times New Roman"/>
-          <w:sz w:val="24"/>
-        </w:rPr>
-        <w:t>A vocabulary injection method that places approved metric and dimension names directly into the LLM prompt, reducing dependence on a manually written synonym list.</w:t>
-      </w:r>
-    </w:p>
-    <w:p>
-      <w:pPr>
-        <w:pStyle w:val="ListNumber"/>
-        <w:spacing w:after="80" w:line="360" w:lineRule="auto"/>
-      </w:pPr>
-      <w:r>
-        <w:rPr>
-          <w:rFonts w:ascii="Times New Roman" w:hAnsi="Times New Roman"/>
-          <w:sz w:val="24"/>
-        </w:rPr>
-        <w:t>A verified benchmark over 107 mixed natural-language requests, separating SQL safety, true database execution validity, and semantic correctness rather than treating them as one accuracy number.</w:t>
-      </w:r>
-    </w:p>
-    <w:p>
-      <w:pPr>
-        <w:pStyle w:val="ListNumber"/>
-        <w:spacing w:after="80" w:line="360" w:lineRule="auto"/>
-      </w:pPr>
-      <w:r>
-        <w:rPr>
-          <w:rFonts w:ascii="Times New Roman" w:hAnsi="Times New Roman"/>
-          <w:sz w:val="24"/>
-        </w:rPr>
-        <w:t>A planned cross-schema generalizability evaluation that will test whether the same compiler and safety architecture can be reused on a second e-commerce schema by rebuilding only the semantic layer.</w:t>
-      </w:r>
-    </w:p>
-    <w:p>
-      <w:r>
-        <w:br w:type="page"/>
-      </w:r>
-    </w:p>
-    <w:p>
-      <w:pPr>
-        <w:spacing w:before="0" w:after="80"/>
-        <w:jc w:val="center"/>
-      </w:pPr>
-      <w:r>
-        <w:rPr>
-          <w:rFonts w:ascii="Times New Roman" w:hAnsi="Times New Roman"/>
-          <w:b/>
-          <w:sz w:val="32"/>
-        </w:rPr>
-        <w:t>CHAPTER 2</w:t>
-      </w:r>
-    </w:p>
-    <w:p>
-      <w:pPr>
-        <w:spacing w:after="400"/>
-        <w:jc w:val="center"/>
-      </w:pPr>
-      <w:r>
-        <w:rPr>
-          <w:rFonts w:ascii="Times New Roman" w:hAnsi="Times New Roman"/>
-          <w:b/>
-          <w:sz w:val="32"/>
-        </w:rPr>
-        <w:t>LITERATURE REVIEW AND RESEARCH GAP</w:t>
-      </w:r>
-    </w:p>
-    <w:p>
-      <w:pPr>
-        <w:spacing w:after="0" w:before="0" w:line="360" w:lineRule="auto"/>
+        <w:t>The main objective of this thesis is to design and evaluate AEGIS, a constraint-based architecture for safe LLM-assisted natural-language analytics. Instead of allowing the language model to generate executable SQL, AEGIS limits the model to structured intent extraction and delegates query construction, validation, visualization, and widget persistence to deterministic system components.</w:t>
+      </w:r>
+    </w:p>
+    <w:p>
+      <w:pPr>
+        <w:spacing w:after="120" w:before="0" w:line="360" w:lineRule="auto"/>
         <w:jc w:val="both"/>
       </w:pPr>
       <w:r>
@@ -2761,6 +2650,273 @@
           <w:i w:val="0"/>
           <w:sz w:val="24"/>
         </w:rPr>
+        <w:t>The specific objectives of this thesis are:</w:t>
+      </w:r>
+    </w:p>
+    <w:p>
+      <w:pPr>
+        <w:pStyle w:val="ListNumber"/>
+        <w:spacing w:after="80" w:line="360" w:lineRule="auto"/>
+      </w:pPr>
+      <w:r>
+        <w:rPr>
+          <w:rFonts w:ascii="Times New Roman" w:hAnsi="Times New Roman"/>
+          <w:sz w:val="24"/>
+        </w:rPr>
+        <w:t>To design a natural-language analytics architecture where the LLM is structurally prevented from generating executable SQL.</w:t>
+      </w:r>
+    </w:p>
+    <w:p>
+      <w:pPr>
+        <w:pStyle w:val="ListNumber"/>
+        <w:spacing w:after="80" w:line="360" w:lineRule="auto"/>
+      </w:pPr>
+      <w:r>
+        <w:rPr>
+          <w:rFonts w:ascii="Times New Roman" w:hAnsi="Times New Roman"/>
+          <w:sz w:val="24"/>
+        </w:rPr>
+        <w:t>To develop a closed semantic layer that maps business questions to approved metrics, dimensions, filters, analytical patterns, and join paths.</w:t>
+      </w:r>
+    </w:p>
+    <w:p>
+      <w:pPr>
+        <w:pStyle w:val="ListNumber"/>
+        <w:spacing w:after="80" w:line="360" w:lineRule="auto"/>
+      </w:pPr>
+      <w:r>
+        <w:rPr>
+          <w:rFonts w:ascii="Times New Roman" w:hAnsi="Times New Roman"/>
+          <w:sz w:val="24"/>
+        </w:rPr>
+        <w:t>To implement a deterministic SQL compilation pipeline that converts validated intent objects into safe database queries.</w:t>
+      </w:r>
+    </w:p>
+    <w:p>
+      <w:pPr>
+        <w:pStyle w:val="ListNumber"/>
+        <w:spacing w:after="80" w:line="360" w:lineRule="auto"/>
+      </w:pPr>
+      <w:r>
+        <w:rPr>
+          <w:rFonts w:ascii="Times New Roman" w:hAnsi="Times New Roman"/>
+          <w:sz w:val="24"/>
+        </w:rPr>
+        <w:t>To support reusable analytical artifacts by selecting visualizations and saving generated dashboard widgets for later refresh.</w:t>
+      </w:r>
+    </w:p>
+    <w:p>
+      <w:pPr>
+        <w:pStyle w:val="ListNumber"/>
+        <w:spacing w:after="80" w:line="360" w:lineRule="auto"/>
+      </w:pPr>
+      <w:r>
+        <w:rPr>
+          <w:rFonts w:ascii="Times New Roman" w:hAnsi="Times New Roman"/>
+          <w:sz w:val="24"/>
+        </w:rPr>
+        <w:t>To evaluate the prototype using a custom 107-request benchmark over a seeded nopCommerce-style database.</w:t>
+      </w:r>
+    </w:p>
+    <w:p>
+      <w:pPr>
+        <w:pStyle w:val="ListNumber"/>
+        <w:spacing w:after="80" w:line="360" w:lineRule="auto"/>
+      </w:pPr>
+      <w:r>
+        <w:rPr>
+          <w:rFonts w:ascii="Times New Roman" w:hAnsi="Times New Roman"/>
+          <w:sz w:val="24"/>
+        </w:rPr>
+        <w:t>To keep cross-schema generalizability as a future evaluation objective by testing whether the same compiler and safety architecture can be reused with a different e-commerce schema.</w:t>
+      </w:r>
+    </w:p>
+    <w:p>
+      <w:pPr>
+        <w:spacing w:after="120" w:before="0" w:line="360" w:lineRule="auto"/>
+        <w:jc w:val="both"/>
+      </w:pPr>
+      <w:r>
+        <w:rPr>
+          <w:rFonts w:ascii="Times New Roman" w:hAnsi="Times New Roman"/>
+          <w:b w:val="0"/>
+          <w:i w:val="0"/>
+          <w:sz w:val="24"/>
+        </w:rPr>
+        <w:t>The main contributions of this thesis are:</w:t>
+      </w:r>
+    </w:p>
+    <w:p>
+      <w:pPr>
+        <w:spacing w:after="80" w:line="360" w:lineRule="auto"/>
+        <w:ind w:left="504" w:hanging="504"/>
+      </w:pPr>
+      <w:r>
+        <w:rPr>
+          <w:rFonts w:ascii="Times New Roman" w:hAnsi="Times New Roman"/>
+          <w:sz w:val="24"/>
+        </w:rPr>
+        <w:t>1.</w:t>
+      </w:r>
+      <w:r>
+        <w:rPr>
+          <w:rFonts w:ascii="Times New Roman" w:hAnsi="Times New Roman"/>
+          <w:sz w:val="24"/>
+        </w:rPr>
+        <w:tab/>
+        <w:t>A constraint-based AEGIS architecture that separates language understanding from database execution.</w:t>
+      </w:r>
+    </w:p>
+    <w:p>
+      <w:pPr>
+        <w:spacing w:after="80" w:line="360" w:lineRule="auto"/>
+        <w:ind w:left="504" w:hanging="504"/>
+      </w:pPr>
+      <w:r>
+        <w:rPr>
+          <w:rFonts w:ascii="Times New Roman" w:hAnsi="Times New Roman"/>
+          <w:sz w:val="24"/>
+        </w:rPr>
+        <w:t>2.</w:t>
+      </w:r>
+      <w:r>
+        <w:rPr>
+          <w:rFonts w:ascii="Times New Roman" w:hAnsi="Times New Roman"/>
+          <w:sz w:val="24"/>
+        </w:rPr>
+        <w:tab/>
+        <w:t>A closed-vocabulary semantic layer for business reporting queries.</w:t>
+      </w:r>
+    </w:p>
+    <w:p>
+      <w:pPr>
+        <w:spacing w:after="80" w:line="360" w:lineRule="auto"/>
+        <w:ind w:left="504" w:hanging="504"/>
+      </w:pPr>
+      <w:r>
+        <w:rPr>
+          <w:rFonts w:ascii="Times New Roman" w:hAnsi="Times New Roman"/>
+          <w:sz w:val="24"/>
+        </w:rPr>
+        <w:t>3.</w:t>
+      </w:r>
+      <w:r>
+        <w:rPr>
+          <w:rFonts w:ascii="Times New Roman" w:hAnsi="Times New Roman"/>
+          <w:sz w:val="24"/>
+        </w:rPr>
+        <w:tab/>
+        <w:t>A deterministic query compiler that builds SQL from approved templates and join paths instead of model-written SQL.</w:t>
+      </w:r>
+    </w:p>
+    <w:p>
+      <w:pPr>
+        <w:spacing w:after="80" w:line="360" w:lineRule="auto"/>
+        <w:ind w:left="504" w:hanging="504"/>
+      </w:pPr>
+      <w:r>
+        <w:rPr>
+          <w:rFonts w:ascii="Times New Roman" w:hAnsi="Times New Roman"/>
+          <w:sz w:val="24"/>
+        </w:rPr>
+        <w:t>4.</w:t>
+      </w:r>
+      <w:r>
+        <w:rPr>
+          <w:rFonts w:ascii="Times New Roman" w:hAnsi="Times New Roman"/>
+          <w:sz w:val="24"/>
+        </w:rPr>
+        <w:tab/>
+        <w:t>A two-layer SQL safety mechanism combining structural prevention with post-compilation validation.</w:t>
+      </w:r>
+    </w:p>
+    <w:p>
+      <w:pPr>
+        <w:spacing w:after="80" w:line="360" w:lineRule="auto"/>
+        <w:ind w:left="504" w:hanging="504"/>
+      </w:pPr>
+      <w:r>
+        <w:rPr>
+          <w:rFonts w:ascii="Times New Roman" w:hAnsi="Times New Roman"/>
+          <w:sz w:val="24"/>
+        </w:rPr>
+        <w:t>5.</w:t>
+      </w:r>
+      <w:r>
+        <w:rPr>
+          <w:rFonts w:ascii="Times New Roman" w:hAnsi="Times New Roman"/>
+          <w:sz w:val="24"/>
+        </w:rPr>
+        <w:tab/>
+        <w:t>A widget-oriented analytics workflow that turns one-time natural-language answers into reusable dashboard artifacts.</w:t>
+      </w:r>
+    </w:p>
+    <w:p>
+      <w:pPr>
+        <w:spacing w:after="80" w:line="360" w:lineRule="auto"/>
+        <w:ind w:left="504" w:hanging="504"/>
+      </w:pPr>
+      <w:r>
+        <w:rPr>
+          <w:rFonts w:ascii="Times New Roman" w:hAnsi="Times New Roman"/>
+          <w:sz w:val="24"/>
+        </w:rPr>
+        <w:t>6.</w:t>
+      </w:r>
+      <w:r>
+        <w:rPr>
+          <w:rFonts w:ascii="Times New Roman" w:hAnsi="Times New Roman"/>
+          <w:sz w:val="24"/>
+        </w:rPr>
+        <w:tab/>
+        <w:t>Benchmark evidence from 107 mixed natural-language requests showing SQL safety and true execution validity, while clearly separating these results from semantic correctness.</w:t>
+      </w:r>
+    </w:p>
+    <w:p>
+      <w:r>
+        <w:br w:type="page"/>
+      </w:r>
+    </w:p>
+    <w:p>
+      <w:pPr>
+        <w:spacing w:before="0" w:after="80"/>
+        <w:jc w:val="center"/>
+      </w:pPr>
+      <w:r>
+        <w:rPr>
+          <w:rFonts w:ascii="Times New Roman" w:hAnsi="Times New Roman"/>
+          <w:b/>
+          <w:sz w:val="32"/>
+        </w:rPr>
+        <w:t>CHAPTER 2</w:t>
+      </w:r>
+    </w:p>
+    <w:p>
+      <w:pPr>
+        <w:spacing w:after="400"/>
+        <w:jc w:val="center"/>
+      </w:pPr>
+      <w:r>
+        <w:rPr>
+          <w:rFonts w:ascii="Times New Roman" w:hAnsi="Times New Roman"/>
+          <w:b/>
+          <w:sz w:val="32"/>
+        </w:rPr>
+        <w:t>LITERATURE REVIEW AND RESEARCH GAP</w:t>
+      </w:r>
+    </w:p>
+    <w:p>
+      <w:pPr>
+        <w:spacing w:after="0" w:before="0" w:line="360" w:lineRule="auto"/>
+        <w:jc w:val="both"/>
+      </w:pPr>
+      <w:r>
+        <w:rPr>
+          <w:rFonts w:ascii="Times New Roman" w:hAnsi="Times New Roman"/>
+          <w:b w:val="0"/>
+          <w:i w:val="0"/>
+          <w:sz w:val="24"/>
+        </w:rPr>
         <w:t>The literature review focuses on the work most directly comparable to AEGIS. It is organized as short review blocks so each source can be checked quickly by contribution, limitation, and the specific gap it leaves for this thesis.</w:t>
       </w:r>
     </w:p>
@@ -3683,7 +3839,7 @@
           <w:rFonts w:ascii="Times New Roman" w:hAnsi="Times New Roman"/>
           <w:sz w:val="24"/>
         </w:rPr>
-        <w:t>It has no natural-language-to-SQL stage and does not handle governed production database access.</w:t>
+        <w:t>It has no natural-language-to-SQL stage and does not handle permission-controlled production database access.</w:t>
       </w:r>
     </w:p>
     <w:p>
@@ -6219,7 +6375,7 @@
           <w:rFonts w:ascii="Times New Roman" w:hAnsi="Times New Roman"/>
           <w:sz w:val="24"/>
         </w:rPr>
-        <w:t>Visualization systems produce charts, but usually operate outside governed SQL execution.</w:t>
+        <w:t>Visualization systems produce charts, but usually operate outside permission-controlled SQL execution.</w:t>
       </w:r>
     </w:p>
     <w:p>
@@ -6390,7 +6546,7 @@
           <w:b/>
           <w:sz w:val="24"/>
         </w:rPr>
-        <w:t xml:space="preserve">Design rigor: </w:t>
+        <w:t xml:space="preserve">Design structure: </w:t>
       </w:r>
       <w:r>
         <w:rPr>
@@ -6612,7 +6768,7 @@
           <w:i w:val="0"/>
           <w:sz w:val="24"/>
         </w:rPr>
-        <w:t>The eleven-pattern taxonomy used throughout this thesis (Table 3.2) originates from a design-time review of representative e-commerce and administrative reporting requests, conducted by the author while designing AEGIS. This was a qualitative review carried out by a single researcher during system design, not an independently annotated, inter-rater-validated study, and no separate annotated dataset accompanies this thesis. An earlier draft reported specific percentages and an inter-rater reliability statistic for a larger unpublished dataset; that dataset was not published alongside this thesis, so those figures have been withdrawn.</w:t>
+        <w:t>The eleven-pattern taxonomy used throughout this thesis (Table 3.3) was derived from a design-time review of representative e-commerce and administrative reporting requests while designing AEGIS. The purpose of this review was to identify recurring business-question shapes that the system should support, such as KPI summaries, rankings, trends, comparisons, exception reports, and reusable tabular views.</w:t>
       </w:r>
     </w:p>
     <w:p>
@@ -6627,7 +6783,7 @@
           <w:i w:val="0"/>
           <w:sz w:val="24"/>
         </w:rPr>
-        <w:t>In place of that withdrawn figure, Table 3.1 reports a pattern classification of the full 107-request custom benchmark. The first 100 requests are answerable analytical requests classified into the eleven AEGIS patterns by the author; the remaining seven are mixed benchmark requests that test behavior beyond the normal template set and are still counted in the same benchmark denominator. This classification is itself a single-annotator judgment, not independently cross-checked by a second annotator, so it should not be read as a validated inter-rater statistic; unlike the withdrawn figures, however, it is reproducible from the evaluation materials supplied with this thesis.</w:t>
+        <w:t>Table 3.1 summarizes how the 107 custom benchmark requests are distributed across these reporting patterns. The first 100 requests represent answerable analytical questions, while the remaining seven mixed requests test harder boundary behavior. This classification is used as a design and evaluation aid, not as an independently validated user study.</w:t>
       </w:r>
     </w:p>
     <w:p>
@@ -8149,7 +8305,7 @@
           <w:i w:val="0"/>
           <w:sz w:val="24"/>
         </w:rPr>
-        <w:t>This classification yields three design directions that shaped the methodology and system design. First, a small set of patterns appears sufficient: the top three analytical patterns (KPI, Ranking, and Exception/Filter) account for 67 of the 107 benchmark requests, or about 62.6% of the full mixed benchmark. Segment and Tabular happen not to be exercised by this particular run, which is a property of this benchmark rather than evidence that those two patterns are unnecessary; the compiler supports both regardless. Second, business vocabulary differs systematically from database column names: reviewed requests used phrases like 'total refund rate,' never SUM(o.RefundedAmount), which motivates an explicit semantic layer rather than exposing the schema directly to the language model. Third, reuse appears to be the norm rather than the exception: many requests were variations of things already asked before, in a different time window or for a different segment, which motivates the widget persistence design.</w:t>
+        <w:t>The classification shaped the methodology in three ways. First, the benchmark is concentrated around a small number of common reporting needs: KPI, Ranking, and Exception/Filter requests account for 67 of the 107 requests. Second, the requests use business terms rather than database column names, which supports the need for an explicit semantic layer. Third, many reporting needs are reusable with only a changed time window, filter, or segment, which supports the widget persistence design.</w:t>
       </w:r>
     </w:p>
     <w:p>

</xml_diff>

<commit_message>
Update thesis page lists
</commit_message>
<xml_diff>
--- a/docs/scripts/AEGIS Thesis Book Draft - A Constraint-Based Architecture for Safe LLM-Assisted Natural Language Analytics.docx
+++ b/docs/scripts/AEGIS Thesis Book Draft - A Constraint-Based Architecture for Safe LLM-Assisted Natural Language Analytics.docx
@@ -1288,7 +1288,7 @@
         </w:rPr>
         <w:t>3.2 Formative Study of Reporting Patterns</w:t>
         <w:tab/>
-        <w:t>10</w:t>
+        <w:t>9</w:t>
       </w:r>
     </w:p>
     <w:p>
@@ -1308,7 +1308,7 @@
         </w:rPr>
         <w:t>3.3 Design Principles</w:t>
         <w:tab/>
-        <w:t>11</w:t>
+        <w:t>10</w:t>
       </w:r>
     </w:p>
     <w:p>
@@ -1328,7 +1328,7 @@
         </w:rPr>
         <w:t>3.4 Formal Model</w:t>
         <w:tab/>
-        <w:t>12</w:t>
+        <w:t>11</w:t>
       </w:r>
     </w:p>
     <w:p>
@@ -1348,7 +1348,7 @@
         </w:rPr>
         <w:t>3.5 Threat Model</w:t>
         <w:tab/>
-        <w:t>12</w:t>
+        <w:t>11</w:t>
       </w:r>
     </w:p>
     <w:p>
@@ -1368,7 +1368,7 @@
         </w:rPr>
         <w:t>3.6 System Architecture</w:t>
         <w:tab/>
-        <w:t>14</w:t>
+        <w:t>13</w:t>
       </w:r>
     </w:p>
     <w:p>
@@ -1388,7 +1388,7 @@
         </w:rPr>
         <w:t>3.7 Semantic Layer Design</w:t>
         <w:tab/>
-        <w:t>15</w:t>
+        <w:t>14</w:t>
       </w:r>
     </w:p>
     <w:p>
@@ -1408,7 +1408,7 @@
         </w:rPr>
         <w:t>3.8 Intent Parsing with Dynamic Vocabulary Injection</w:t>
         <w:tab/>
-        <w:t>16</w:t>
+        <w:t>15</w:t>
       </w:r>
     </w:p>
     <w:p>
@@ -1428,7 +1428,7 @@
         </w:rPr>
         <w:t>3.9 Safe Query Compiler</w:t>
         <w:tab/>
-        <w:t>19</w:t>
+        <w:t>18</w:t>
       </w:r>
     </w:p>
     <w:p>
@@ -1448,7 +1448,7 @@
         </w:rPr>
         <w:t>3.10 Visualization Selector</w:t>
         <w:tab/>
-        <w:t>20</w:t>
+        <w:t>19</w:t>
       </w:r>
     </w:p>
     <w:p>
@@ -1468,7 +1468,7 @@
         </w:rPr>
         <w:t>3.11 Widget Persistence and Reuse</w:t>
         <w:tab/>
-        <w:t>20</w:t>
+        <w:t>19</w:t>
       </w:r>
     </w:p>
     <w:p>
@@ -1488,7 +1488,7 @@
         </w:rPr>
         <w:t>Chapter 4: Experimental Work</w:t>
         <w:tab/>
-        <w:t>23</w:t>
+        <w:t>22</w:t>
       </w:r>
     </w:p>
     <w:p>
@@ -1508,7 +1508,7 @@
         </w:rPr>
         <w:t>4.1 Implementation</w:t>
         <w:tab/>
-        <w:t>23</w:t>
+        <w:t>22</w:t>
       </w:r>
     </w:p>
     <w:p>
@@ -1528,7 +1528,7 @@
         </w:rPr>
         <w:t>4.2 Experimental Environment</w:t>
         <w:tab/>
-        <w:t>24</w:t>
+        <w:t>23</w:t>
       </w:r>
     </w:p>
     <w:p>
@@ -1548,7 +1548,7 @@
         </w:rPr>
         <w:t>4.3 Benchmark Dataset Construction</w:t>
         <w:tab/>
-        <w:t>24</w:t>
+        <w:t>23</w:t>
       </w:r>
     </w:p>
     <w:p>
@@ -1568,7 +1568,7 @@
         </w:rPr>
         <w:t>4.4 Baseline Systems</w:t>
         <w:tab/>
-        <w:t>25</w:t>
+        <w:t>24</w:t>
       </w:r>
     </w:p>
     <w:p>
@@ -1588,7 +1588,7 @@
         </w:rPr>
         <w:t>4.5 Evaluation Procedure</w:t>
         <w:tab/>
-        <w:t>25</w:t>
+        <w:t>24</w:t>
       </w:r>
     </w:p>
     <w:p>
@@ -1608,7 +1608,7 @@
         </w:rPr>
         <w:t>Chapter 5: Results and Discussion</w:t>
         <w:tab/>
-        <w:t>26</w:t>
+        <w:t>25</w:t>
       </w:r>
     </w:p>
     <w:p>
@@ -1628,7 +1628,7 @@
         </w:rPr>
         <w:t>5.1 Evaluation Overview</w:t>
         <w:tab/>
-        <w:t>26</w:t>
+        <w:t>25</w:t>
       </w:r>
     </w:p>
     <w:p>
@@ -1648,7 +1648,7 @@
         </w:rPr>
         <w:t>5.2 Main Result Summary</w:t>
         <w:tab/>
-        <w:t>26</w:t>
+        <w:t>25</w:t>
       </w:r>
     </w:p>
     <w:p>
@@ -1668,7 +1668,7 @@
         </w:rPr>
         <w:t>5.3 SQL Safety</w:t>
         <w:tab/>
-        <w:t>27</w:t>
+        <w:t>26</w:t>
       </w:r>
     </w:p>
     <w:p>
@@ -1688,7 +1688,7 @@
         </w:rPr>
         <w:t>5.4 True Database Execution Validity</w:t>
         <w:tab/>
-        <w:t>28</w:t>
+        <w:t>27</w:t>
       </w:r>
     </w:p>
     <w:p>
@@ -1708,7 +1708,7 @@
         </w:rPr>
         <w:t>5.5 Execution Failure Analysis</w:t>
         <w:tab/>
-        <w:t>28</w:t>
+        <w:t>27</w:t>
       </w:r>
     </w:p>
     <w:p>
@@ -1728,7 +1728,7 @@
         </w:rPr>
         <w:t>5.6 Semantic Correctness Limitation</w:t>
         <w:tab/>
-        <w:t>29</w:t>
+        <w:t>28</w:t>
       </w:r>
     </w:p>
     <w:p>
@@ -1748,7 +1748,7 @@
         </w:rPr>
         <w:t>5.7 B3 Template-Only Baseline</w:t>
         <w:tab/>
-        <w:t>30</w:t>
+        <w:t>29</w:t>
       </w:r>
     </w:p>
     <w:p>
@@ -1768,7 +1768,7 @@
         </w:rPr>
         <w:t>5.8 Comparative Discussion</w:t>
         <w:tab/>
-        <w:t>30</w:t>
+        <w:t>29</w:t>
       </w:r>
     </w:p>
     <w:p>
@@ -1788,7 +1788,7 @@
         </w:rPr>
         <w:t>Chapter 6: Limitations and Future Work</w:t>
         <w:tab/>
-        <w:t>32</w:t>
+        <w:t>31</w:t>
       </w:r>
     </w:p>
     <w:p>
@@ -1808,7 +1808,7 @@
         </w:rPr>
         <w:t>Chapter 7: Conclusion</w:t>
         <w:tab/>
-        <w:t>33</w:t>
+        <w:t>32</w:t>
       </w:r>
     </w:p>
     <w:p>
@@ -1828,7 +1828,7 @@
         </w:rPr>
         <w:t>References</w:t>
         <w:tab/>
-        <w:t>34</w:t>
+        <w:t>33</w:t>
       </w:r>
     </w:p>
     <w:p>
@@ -1884,7 +1884,7 @@
         </w:rPr>
         <w:t>Figure 2: Benchmark pattern classification</w:t>
         <w:tab/>
-        <w:t>11</w:t>
+        <w:t>10</w:t>
       </w:r>
     </w:p>
     <w:p>
@@ -1902,7 +1902,7 @@
         </w:rPr>
         <w:t>Figure 3: AEGIS architecture pipeline</w:t>
         <w:tab/>
-        <w:t>15</w:t>
+        <w:t>14</w:t>
       </w:r>
     </w:p>
     <w:p>
@@ -1920,7 +1920,7 @@
         </w:rPr>
         <w:t>Figure 4: Semantic layer modularity</w:t>
         <w:tab/>
-        <w:t>16</w:t>
+        <w:t>15</w:t>
       </w:r>
     </w:p>
     <w:p>
@@ -1956,7 +1956,7 @@
         </w:rPr>
         <w:t>Figure 6: AEGIS analytical patterns</w:t>
         <w:tab/>
-        <w:t>19</w:t>
+        <w:t>18</w:t>
       </w:r>
     </w:p>
     <w:p>
@@ -1974,7 +1974,7 @@
         </w:rPr>
         <w:t>Figure 7: Two-layer SQL safety defence</w:t>
         <w:tab/>
-        <w:t>20</w:t>
+        <w:t>19</w:t>
       </w:r>
     </w:p>
     <w:p>
@@ -1992,7 +1992,7 @@
         </w:rPr>
         <w:t>Figure 8: Widget lifecycle and refresh model</w:t>
         <w:tab/>
-        <w:t>22</w:t>
+        <w:t>21</w:t>
       </w:r>
     </w:p>
     <w:p>
@@ -2010,7 +2010,7 @@
         </w:rPr>
         <w:t>Figure 9: Safety and execution-validity comparison</w:t>
         <w:tab/>
-        <w:t>28</w:t>
+        <w:t>27</w:t>
       </w:r>
     </w:p>
     <w:p>
@@ -2066,7 +2066,7 @@
         </w:rPr>
         <w:t>Table 3.1: Benchmark pattern classification</w:t>
         <w:tab/>
-        <w:t>10</w:t>
+        <w:t>9</w:t>
       </w:r>
     </w:p>
     <w:p>
@@ -2084,7 +2084,7 @@
         </w:rPr>
         <w:t>Table 3.2: Semantic layer object model</w:t>
         <w:tab/>
-        <w:t>16</w:t>
+        <w:t>15</w:t>
       </w:r>
     </w:p>
     <w:p>
@@ -2102,7 +2102,7 @@
         </w:rPr>
         <w:t>Table 3.3: AEGIS analytical patterns</w:t>
         <w:tab/>
-        <w:t>19</w:t>
+        <w:t>18</w:t>
       </w:r>
     </w:p>
     <w:p>
@@ -2120,7 +2120,7 @@
         </w:rPr>
         <w:t>Table 3.4: Visualization selector mapping</w:t>
         <w:tab/>
-        <w:t>20</w:t>
+        <w:t>19</w:t>
       </w:r>
     </w:p>
     <w:p>
@@ -2138,7 +2138,7 @@
         </w:rPr>
         <w:t>Table 4.1: Experimental setup</w:t>
         <w:tab/>
-        <w:t>24</w:t>
+        <w:t>23</w:t>
       </w:r>
     </w:p>
     <w:p>
@@ -2156,7 +2156,7 @@
         </w:rPr>
         <w:t>Table 5.1: Evaluation benchmark status</w:t>
         <w:tab/>
-        <w:t>26</w:t>
+        <w:t>25</w:t>
       </w:r>
     </w:p>
     <w:p>
@@ -2174,7 +2174,7 @@
         </w:rPr>
         <w:t>Table 5.2: Main evaluation result summary</w:t>
         <w:tab/>
-        <w:t>27</w:t>
+        <w:t>26</w:t>
       </w:r>
     </w:p>
     <w:p>
@@ -2192,7 +2192,7 @@
         </w:rPr>
         <w:t>Table 5.3: SQL safety</w:t>
         <w:tab/>
-        <w:t>27</w:t>
+        <w:t>26</w:t>
       </w:r>
     </w:p>
     <w:p>
@@ -2210,7 +2210,7 @@
         </w:rPr>
         <w:t>Table 5.4: True execution validity</w:t>
         <w:tab/>
-        <w:t>28</w:t>
+        <w:t>27</w:t>
       </w:r>
     </w:p>
     <w:p>
@@ -2228,7 +2228,7 @@
         </w:rPr>
         <w:t>Table 5.5: True-execution failure analysis</w:t>
         <w:tab/>
-        <w:t>29</w:t>
+        <w:t>28</w:t>
       </w:r>
     </w:p>
     <w:p>
@@ -2246,7 +2246,7 @@
         </w:rPr>
         <w:t>Table 5.6: Evaluation metric distinction</w:t>
         <w:tab/>
-        <w:t>29</w:t>
+        <w:t>28</w:t>
       </w:r>
     </w:p>
     <w:p>
@@ -2264,7 +2264,7 @@
         </w:rPr>
         <w:t>Table 5.7: Template-only baseline summary</w:t>
         <w:tab/>
-        <w:t>30</w:t>
+        <w:t>29</w:t>
       </w:r>
     </w:p>
     <w:p>
@@ -2282,7 +2282,7 @@
         </w:rPr>
         <w:t>Table 5.8: AEGIS vs. direct LLM-to-SQL</w:t>
         <w:tab/>
-        <w:t>31</w:t>
+        <w:t>30</w:t>
       </w:r>
     </w:p>
     <w:p>
@@ -2635,7 +2635,7 @@
           <w:i w:val="0"/>
           <w:sz w:val="24"/>
         </w:rPr>
-        <w:t>The main objective of this thesis is to design and evaluate AEGIS, a constraint-based architecture for safe LLM-assisted natural-language analytics. Instead of allowing the language model to generate executable SQL, AEGIS limits the model to structured intent extraction and delegates query construction, validation, visualization, and widget persistence to deterministic system components.</w:t>
+        <w:t>The objective of this thesis is to design and evaluate AEGIS, a constraint-based architecture that lets an LLM understand reporting requests without allowing it to generate executable SQL. Query construction, validation, visualization, and widget persistence are handled by deterministic system components.</w:t>
       </w:r>
     </w:p>
     <w:p>
@@ -2650,7 +2650,7 @@
           <w:i w:val="0"/>
           <w:sz w:val="24"/>
         </w:rPr>
-        <w:t>The specific objectives of this thesis are:</w:t>
+        <w:t>The specific objectives and contributions are:</w:t>
       </w:r>
     </w:p>
     <w:p>
@@ -2663,7 +2663,7 @@
           <w:rFonts w:ascii="Times New Roman" w:hAnsi="Times New Roman"/>
           <w:sz w:val="24"/>
         </w:rPr>
-        <w:t>To design a natural-language analytics architecture where the LLM is structurally prevented from generating executable SQL.</w:t>
+        <w:t>A natural-language analytics architecture where the LLM is structurally prevented from writing executable SQL.</w:t>
       </w:r>
     </w:p>
     <w:p>
@@ -2676,7 +2676,7 @@
           <w:rFonts w:ascii="Times New Roman" w:hAnsi="Times New Roman"/>
           <w:sz w:val="24"/>
         </w:rPr>
-        <w:t>To develop a closed semantic layer that maps business questions to approved metrics, dimensions, filters, analytical patterns, and join paths.</w:t>
+        <w:t>A closed semantic layer that maps business questions to approved metrics, dimensions, filters, analytical patterns, and join paths.</w:t>
       </w:r>
     </w:p>
     <w:p>
@@ -2689,7 +2689,7 @@
           <w:rFonts w:ascii="Times New Roman" w:hAnsi="Times New Roman"/>
           <w:sz w:val="24"/>
         </w:rPr>
-        <w:t>To implement a deterministic SQL compilation pipeline that converts validated intent objects into safe database queries.</w:t>
+        <w:t>A deterministic query compiler that builds SQL from approved templates instead of model-written SQL.</w:t>
       </w:r>
     </w:p>
     <w:p>
@@ -2702,7 +2702,7 @@
           <w:rFonts w:ascii="Times New Roman" w:hAnsi="Times New Roman"/>
           <w:sz w:val="24"/>
         </w:rPr>
-        <w:t>To support reusable analytical artifacts by selecting visualizations and saving generated dashboard widgets for later refresh.</w:t>
+        <w:t>A two-layer SQL safety mechanism combining structural prevention with post-compilation validation.</w:t>
       </w:r>
     </w:p>
     <w:p>
@@ -2715,7 +2715,7 @@
           <w:rFonts w:ascii="Times New Roman" w:hAnsi="Times New Roman"/>
           <w:sz w:val="24"/>
         </w:rPr>
-        <w:t>To evaluate the prototype using a custom 107-request benchmark over a seeded nopCommerce-style database.</w:t>
+        <w:t>A widget-oriented workflow that turns natural-language answers into reusable dashboard artifacts.</w:t>
       </w:r>
     </w:p>
     <w:p>
@@ -2728,148 +2728,20 @@
           <w:rFonts w:ascii="Times New Roman" w:hAnsi="Times New Roman"/>
           <w:sz w:val="24"/>
         </w:rPr>
-        <w:t>To keep cross-schema generalizability as a future evaluation objective by testing whether the same compiler and safety architecture can be reused with a different e-commerce schema.</w:t>
-      </w:r>
-    </w:p>
-    <w:p>
-      <w:pPr>
-        <w:spacing w:after="120" w:before="0" w:line="360" w:lineRule="auto"/>
-        <w:jc w:val="both"/>
-      </w:pPr>
-      <w:r>
-        <w:rPr>
-          <w:rFonts w:ascii="Times New Roman" w:hAnsi="Times New Roman"/>
-          <w:b w:val="0"/>
-          <w:i w:val="0"/>
+        <w:t>Benchmark evidence from 107 mixed requests showing SQL safety and true execution validity, while keeping semantic correctness as a separate metric.</w:t>
+      </w:r>
+    </w:p>
+    <w:p>
+      <w:pPr>
+        <w:pStyle w:val="ListNumber"/>
+        <w:spacing w:after="80" w:line="360" w:lineRule="auto"/>
+      </w:pPr>
+      <w:r>
+        <w:rPr>
+          <w:rFonts w:ascii="Times New Roman" w:hAnsi="Times New Roman"/>
           <w:sz w:val="24"/>
         </w:rPr>
-        <w:t>The main contributions of this thesis are:</w:t>
-      </w:r>
-    </w:p>
-    <w:p>
-      <w:pPr>
-        <w:spacing w:after="80" w:line="360" w:lineRule="auto"/>
-        <w:ind w:left="504" w:hanging="504"/>
-      </w:pPr>
-      <w:r>
-        <w:rPr>
-          <w:rFonts w:ascii="Times New Roman" w:hAnsi="Times New Roman"/>
-          <w:sz w:val="24"/>
-        </w:rPr>
-        <w:t>1.</w:t>
-      </w:r>
-      <w:r>
-        <w:rPr>
-          <w:rFonts w:ascii="Times New Roman" w:hAnsi="Times New Roman"/>
-          <w:sz w:val="24"/>
-        </w:rPr>
-        <w:tab/>
-        <w:t>A constraint-based AEGIS architecture that separates language understanding from database execution.</w:t>
-      </w:r>
-    </w:p>
-    <w:p>
-      <w:pPr>
-        <w:spacing w:after="80" w:line="360" w:lineRule="auto"/>
-        <w:ind w:left="504" w:hanging="504"/>
-      </w:pPr>
-      <w:r>
-        <w:rPr>
-          <w:rFonts w:ascii="Times New Roman" w:hAnsi="Times New Roman"/>
-          <w:sz w:val="24"/>
-        </w:rPr>
-        <w:t>2.</w:t>
-      </w:r>
-      <w:r>
-        <w:rPr>
-          <w:rFonts w:ascii="Times New Roman" w:hAnsi="Times New Roman"/>
-          <w:sz w:val="24"/>
-        </w:rPr>
-        <w:tab/>
-        <w:t>A closed-vocabulary semantic layer for business reporting queries.</w:t>
-      </w:r>
-    </w:p>
-    <w:p>
-      <w:pPr>
-        <w:spacing w:after="80" w:line="360" w:lineRule="auto"/>
-        <w:ind w:left="504" w:hanging="504"/>
-      </w:pPr>
-      <w:r>
-        <w:rPr>
-          <w:rFonts w:ascii="Times New Roman" w:hAnsi="Times New Roman"/>
-          <w:sz w:val="24"/>
-        </w:rPr>
-        <w:t>3.</w:t>
-      </w:r>
-      <w:r>
-        <w:rPr>
-          <w:rFonts w:ascii="Times New Roman" w:hAnsi="Times New Roman"/>
-          <w:sz w:val="24"/>
-        </w:rPr>
-        <w:tab/>
-        <w:t>A deterministic query compiler that builds SQL from approved templates and join paths instead of model-written SQL.</w:t>
-      </w:r>
-    </w:p>
-    <w:p>
-      <w:pPr>
-        <w:spacing w:after="80" w:line="360" w:lineRule="auto"/>
-        <w:ind w:left="504" w:hanging="504"/>
-      </w:pPr>
-      <w:r>
-        <w:rPr>
-          <w:rFonts w:ascii="Times New Roman" w:hAnsi="Times New Roman"/>
-          <w:sz w:val="24"/>
-        </w:rPr>
-        <w:t>4.</w:t>
-      </w:r>
-      <w:r>
-        <w:rPr>
-          <w:rFonts w:ascii="Times New Roman" w:hAnsi="Times New Roman"/>
-          <w:sz w:val="24"/>
-        </w:rPr>
-        <w:tab/>
-        <w:t>A two-layer SQL safety mechanism combining structural prevention with post-compilation validation.</w:t>
-      </w:r>
-    </w:p>
-    <w:p>
-      <w:pPr>
-        <w:spacing w:after="80" w:line="360" w:lineRule="auto"/>
-        <w:ind w:left="504" w:hanging="504"/>
-      </w:pPr>
-      <w:r>
-        <w:rPr>
-          <w:rFonts w:ascii="Times New Roman" w:hAnsi="Times New Roman"/>
-          <w:sz w:val="24"/>
-        </w:rPr>
-        <w:t>5.</w:t>
-      </w:r>
-      <w:r>
-        <w:rPr>
-          <w:rFonts w:ascii="Times New Roman" w:hAnsi="Times New Roman"/>
-          <w:sz w:val="24"/>
-        </w:rPr>
-        <w:tab/>
-        <w:t>A widget-oriented analytics workflow that turns one-time natural-language answers into reusable dashboard artifacts.</w:t>
-      </w:r>
-    </w:p>
-    <w:p>
-      <w:pPr>
-        <w:spacing w:after="80" w:line="360" w:lineRule="auto"/>
-        <w:ind w:left="504" w:hanging="504"/>
-      </w:pPr>
-      <w:r>
-        <w:rPr>
-          <w:rFonts w:ascii="Times New Roman" w:hAnsi="Times New Roman"/>
-          <w:sz w:val="24"/>
-        </w:rPr>
-        <w:t>6.</w:t>
-      </w:r>
-      <w:r>
-        <w:rPr>
-          <w:rFonts w:ascii="Times New Roman" w:hAnsi="Times New Roman"/>
-          <w:sz w:val="24"/>
-        </w:rPr>
-        <w:tab/>
-        <w:t>Benchmark evidence from 107 mixed natural-language requests showing SQL safety and true execution validity, while clearly separating these results from semantic correctness.</w:t>
+        <w:t>A future cross-schema evaluation objective to test reuse of the same compiler and safety architecture with another e-commerce schema.</w:t>
       </w:r>
     </w:p>
     <w:p>

</xml_diff>

<commit_message>
Update thesis evaluation and presentation materials
</commit_message>
<xml_diff>
--- a/docs/scripts/AEGIS Thesis Book Draft - A Constraint-Based Architecture for Safe LLM-Assisted Natural Language Analytics.docx
+++ b/docs/scripts/AEGIS Thesis Book Draft - A Constraint-Based Architecture for Safe LLM-Assisted Natural Language Analytics.docx
@@ -69,7 +69,7 @@
           <w:i w:val="0"/>
           <w:sz w:val="32"/>
         </w:rPr>
-        <w:t>"AEGIS: A Constraint-Based Architecture for Safe LLM-Assisted Natural Language Analytics"</w:t>
+        <w:t>“AEGIS: A Constraint-Based Architecture for Safe LLM-Assisted Natural Language Analytics”</w:t>
       </w:r>
     </w:p>
     <w:p>
@@ -249,7 +249,7 @@
           <w:i w:val="0"/>
           <w:sz w:val="24"/>
         </w:rPr>
-        <w:t>Semester, Year: 4th Year - 7th Semester</w:t>
+        <w:t>Batch: 16th</w:t>
       </w:r>
     </w:p>
     <w:p>
@@ -384,7 +384,7 @@
           <w:i w:val="0"/>
           <w:sz w:val="32"/>
         </w:rPr>
-        <w:t>"AEGIS: A Constraint-Based Architecture for Safe LLM-Assisted Natural Language Analytics"</w:t>
+        <w:t>“AEGIS: A Constraint-Based Architecture for Safe LLM-Assisted Natural Language Analytics”</w:t>
       </w:r>
     </w:p>
     <w:p>
@@ -1608,7 +1608,7 @@
         </w:rPr>
         <w:t>Chapter 5: Results and Discussion</w:t>
         <w:tab/>
-        <w:t>25</w:t>
+        <w:t>26</w:t>
       </w:r>
     </w:p>
     <w:p>
@@ -1628,7 +1628,7 @@
         </w:rPr>
         <w:t>5.1 Evaluation Overview</w:t>
         <w:tab/>
-        <w:t>25</w:t>
+        <w:t>26</w:t>
       </w:r>
     </w:p>
     <w:p>
@@ -1648,7 +1648,7 @@
         </w:rPr>
         <w:t>5.2 Main Result Summary</w:t>
         <w:tab/>
-        <w:t>25</w:t>
+        <w:t>26</w:t>
       </w:r>
     </w:p>
     <w:p>
@@ -1668,7 +1668,7 @@
         </w:rPr>
         <w:t>5.3 SQL Safety</w:t>
         <w:tab/>
-        <w:t>26</w:t>
+        <w:t>27</w:t>
       </w:r>
     </w:p>
     <w:p>
@@ -1688,7 +1688,7 @@
         </w:rPr>
         <w:t>5.4 True Database Execution Validity</w:t>
         <w:tab/>
-        <w:t>27</w:t>
+        <w:t>28</w:t>
       </w:r>
     </w:p>
     <w:p>
@@ -1708,7 +1708,7 @@
         </w:rPr>
         <w:t>5.5 Execution Failure Analysis</w:t>
         <w:tab/>
-        <w:t>27</w:t>
+        <w:t>28</w:t>
       </w:r>
     </w:p>
     <w:p>
@@ -1726,9 +1726,9 @@
           <w:b w:val="0"/>
           <w:sz w:val="23"/>
         </w:rPr>
-        <w:t>5.6 Semantic Correctness Limitation</w:t>
+        <w:t>5.6 Semantic Correctness and Scope Handling</w:t>
         <w:tab/>
-        <w:t>28</w:t>
+        <w:t>29</w:t>
       </w:r>
     </w:p>
     <w:p>
@@ -1746,9 +1746,9 @@
           <w:b w:val="0"/>
           <w:sz w:val="23"/>
         </w:rPr>
-        <w:t>5.7 B3 Template-Only Baseline</w:t>
+        <w:t>5.7 Baseline and Runtime Analysis</w:t>
         <w:tab/>
-        <w:t>29</w:t>
+        <w:t>30</w:t>
       </w:r>
     </w:p>
     <w:p>
@@ -1766,9 +1766,9 @@
           <w:b w:val="0"/>
           <w:sz w:val="23"/>
         </w:rPr>
-        <w:t>5.8 Comparative Discussion</w:t>
+        <w:t>5.8 Comparative Discussion and Robustness</w:t>
         <w:tab/>
-        <w:t>29</w:t>
+        <w:t>31</w:t>
       </w:r>
     </w:p>
     <w:p>
@@ -1788,7 +1788,7 @@
         </w:rPr>
         <w:t>Chapter 6: Limitations and Future Work</w:t>
         <w:tab/>
-        <w:t>31</w:t>
+        <w:t>33</w:t>
       </w:r>
     </w:p>
     <w:p>
@@ -1808,7 +1808,7 @@
         </w:rPr>
         <w:t>Chapter 7: Conclusion</w:t>
         <w:tab/>
-        <w:t>32</w:t>
+        <w:t>34</w:t>
       </w:r>
     </w:p>
     <w:p>
@@ -1828,7 +1828,7 @@
         </w:rPr>
         <w:t>References</w:t>
         <w:tab/>
-        <w:t>33</w:t>
+        <w:t>35</w:t>
       </w:r>
     </w:p>
     <w:p>
@@ -2010,7 +2010,7 @@
         </w:rPr>
         <w:t>Figure 9: Safety and execution-validity comparison</w:t>
         <w:tab/>
-        <w:t>27</w:t>
+        <w:t>28</w:t>
       </w:r>
     </w:p>
     <w:p>
@@ -2156,7 +2156,7 @@
         </w:rPr>
         <w:t>Table 5.1: Evaluation benchmark status</w:t>
         <w:tab/>
-        <w:t>25</w:t>
+        <w:t>26</w:t>
       </w:r>
     </w:p>
     <w:p>
@@ -2174,7 +2174,7 @@
         </w:rPr>
         <w:t>Table 5.2: Main evaluation result summary</w:t>
         <w:tab/>
-        <w:t>26</w:t>
+        <w:t>27</w:t>
       </w:r>
     </w:p>
     <w:p>
@@ -2192,7 +2192,7 @@
         </w:rPr>
         <w:t>Table 5.3: SQL safety</w:t>
         <w:tab/>
-        <w:t>26</w:t>
+        <w:t>27</w:t>
       </w:r>
     </w:p>
     <w:p>
@@ -2210,7 +2210,7 @@
         </w:rPr>
         <w:t>Table 5.4: True execution validity</w:t>
         <w:tab/>
-        <w:t>27</w:t>
+        <w:t>28</w:t>
       </w:r>
     </w:p>
     <w:p>
@@ -2228,7 +2228,7 @@
         </w:rPr>
         <w:t>Table 5.5: True-execution failure analysis</w:t>
         <w:tab/>
-        <w:t>28</w:t>
+        <w:t>29</w:t>
       </w:r>
     </w:p>
     <w:p>
@@ -2244,9 +2244,9 @@
           <w:rFonts w:ascii="Times New Roman" w:hAnsi="Times New Roman"/>
           <w:sz w:val="24"/>
         </w:rPr>
-        <w:t>Table 5.6: Evaluation metric distinction</w:t>
+        <w:t>Table 5.6: Semantic-correctness annotation summary</w:t>
         <w:tab/>
-        <w:t>28</w:t>
+        <w:t>29</w:t>
       </w:r>
     </w:p>
     <w:p>
@@ -2262,9 +2262,9 @@
           <w:rFonts w:ascii="Times New Roman" w:hAnsi="Times New Roman"/>
           <w:sz w:val="24"/>
         </w:rPr>
-        <w:t>Table 5.7: Template-only baseline summary</w:t>
+        <w:t>Table 5.7: Completed baseline comparison</w:t>
         <w:tab/>
-        <w:t>29</w:t>
+        <w:t>30</w:t>
       </w:r>
     </w:p>
     <w:p>
@@ -2280,9 +2280,27 @@
           <w:rFonts w:ascii="Times New Roman" w:hAnsi="Times New Roman"/>
           <w:sz w:val="24"/>
         </w:rPr>
-        <w:t>Table 5.8: AEGIS vs. direct LLM-to-SQL</w:t>
+        <w:t>Table 5.8: Runtime evidence</w:t>
         <w:tab/>
         <w:t>30</w:t>
+      </w:r>
+    </w:p>
+    <w:p>
+      <w:pPr>
+        <w:spacing w:after="80" w:before="0" w:line="360" w:lineRule="auto"/>
+        <w:jc w:val="both"/>
+        <w:tabs>
+          <w:tab w:val="right" w:leader="dot" w:pos="8640"/>
+        </w:tabs>
+      </w:pPr>
+      <w:r>
+        <w:rPr>
+          <w:rFonts w:ascii="Times New Roman" w:hAnsi="Times New Roman"/>
+          <w:sz w:val="24"/>
+        </w:rPr>
+        <w:t>Table 5.9: Structural comparison</w:t>
+        <w:tab/>
+        <w:t>31</w:t>
       </w:r>
     </w:p>
     <w:p>
@@ -13500,7 +13518,7 @@
           <w:i w:val="0"/>
           <w:sz w:val="24"/>
         </w:rPr>
-        <w:t>A domain-specific benchmark of 107 natural-language reporting requests was built over the same production nopCommerce schema. The full question set and recorded pipeline outputs were used to check every reported metric. The benchmark mixes ordinary analytical requests with harder boundary cases in the same run; this thesis does not report those harder cases as a separate benchmark. Because the benchmark was constructed for the nopCommerce domain, accuracy and validity reported figures should be interpreted within that scope. The current artifact verifies SQL safety and true execution validity; semantic correctness still requires an annotated expected-answer benchmark in future work.</w:t>
+        <w:t>A domain-specific benchmark of 107 natural-language reporting requests was built over the same production nopCommerce schema. The full question set and recorded pipeline outputs were used to check every reported metric. The benchmark mixes ordinary analytical requests with harder boundary cases in the same run; this thesis does not report those harder cases as a separate benchmark. Because the benchmark was constructed for the nopCommerce domain, accuracy and validity reported figures should be interpreted within that scope. The current artifact verifies SQL safety, true execution validity, a first-pass semantic-correctness annotation, runtime evidence, and completed baseline execution for the baselines retained in this thesis.</w:t>
       </w:r>
     </w:p>
     <w:p>
@@ -13529,7 +13547,7 @@
           <w:i w:val="0"/>
           <w:sz w:val="24"/>
         </w:rPr>
-        <w:t>The evaluation plan defines four baselines, but not all are complete in the current prototype:</w:t>
+        <w:t>The evaluation uses three baselines that are all executed in the current prototype:</w:t>
       </w:r>
     </w:p>
     <w:p>
@@ -13587,7 +13605,7 @@
           <w:rFonts w:ascii="Times New Roman" w:hAnsi="Times New Roman"/>
           <w:sz w:val="24"/>
         </w:rPr>
-        <w:t>A chain-of-thought strategy first extracts entities and then generates SQL. This baseline is prepared but not included in the completed results.</w:t>
+        <w:t>A chain-of-thought strategy first extracts entities and then generates SQL. This tests whether decomposition alone improves SQL generation without AEGIS constraints.</w:t>
       </w:r>
     </w:p>
     <w:p>
@@ -13616,55 +13634,12 @@
           <w:rFonts w:ascii="Times New Roman" w:hAnsi="Times New Roman"/>
           <w:sz w:val="24"/>
         </w:rPr>
-        <w:t>Keyword matching selects templates without LLM-based intent extraction. This baseline has been executed for true database execution validity.</w:t>
+        <w:t>Keyword matching selects templates without LLM-based intent extraction. This tests the deterministic mapper and compiler when the LLM intent parser is removed.</w:t>
       </w:r>
     </w:p>
     <w:p>
       <w:pPr>
-        <w:spacing w:after="80" w:line="360" w:lineRule="auto"/>
-        <w:ind w:left="461" w:hanging="259"/>
-      </w:pPr>
-      <w:r>
-        <w:rPr>
-          <w:rFonts w:ascii="Times New Roman" w:hAnsi="Times New Roman"/>
-          <w:sz w:val="24"/>
-        </w:rPr>
-        <w:t>•</w:t>
-        <w:tab/>
-      </w:r>
-      <w:r>
-        <w:rPr>
-          <w:rFonts w:ascii="Times New Roman" w:hAnsi="Times New Roman"/>
-          <w:b/>
-          <w:sz w:val="24"/>
-        </w:rPr>
-        <w:t xml:space="preserve">B4 - No semantic layer: </w:t>
-      </w:r>
-      <w:r>
-        <w:rPr>
-          <w:rFonts w:ascii="Times New Roman" w:hAnsi="Times New Roman"/>
-          <w:sz w:val="24"/>
-        </w:rPr>
-        <w:t>The full AEGIS pipeline runs with the semantic mapper bypassed. This remains future evaluation work.</w:t>
-      </w:r>
-    </w:p>
-    <w:p>
-      <w:pPr>
-        <w:spacing w:before="320" w:after="160"/>
-        <w:jc w:val="left"/>
-      </w:pPr>
-      <w:r>
-        <w:rPr>
-          <w:rFonts w:ascii="Times New Roman" w:hAnsi="Times New Roman"/>
-          <w:b/>
-          <w:sz w:val="28"/>
-        </w:rPr>
-        <w:t>4.5  Evaluation Procedure</w:t>
-      </w:r>
-    </w:p>
-    <w:p>
-      <w:pPr>
-        <w:spacing w:after="160" w:before="0" w:line="360" w:lineRule="auto"/>
+        <w:spacing w:after="0" w:before="0" w:line="360" w:lineRule="auto"/>
         <w:jc w:val="both"/>
       </w:pPr>
       <w:r>
@@ -13674,161 +13649,26 @@
           <w:i w:val="0"/>
           <w:sz w:val="24"/>
         </w:rPr>
-        <w:t>The current evaluation focuses on measurements that can be reproduced from the recorded benchmark data and verified through true database execution:</w:t>
+        <w:t>An earlier possible B4 idea was not retained as a thesis baseline because bypassing the semantic layer would no longer test the proposed AEGIS architecture. It is therefore treated as future ablation work rather than an unevaluated baseline in the current results.</w:t>
       </w:r>
     </w:p>
     <w:p>
       <w:pPr>
-        <w:spacing w:after="80" w:line="360" w:lineRule="auto"/>
-        <w:ind w:left="461" w:hanging="259"/>
-      </w:pPr>
-      <w:r>
-        <w:rPr>
-          <w:rFonts w:ascii="Times New Roman" w:hAnsi="Times New Roman"/>
-          <w:sz w:val="24"/>
-        </w:rPr>
-        <w:t>•</w:t>
-        <w:tab/>
-      </w:r>
+        <w:spacing w:before="320" w:after="160"/>
+        <w:jc w:val="left"/>
+      </w:pPr>
       <w:r>
         <w:rPr>
           <w:rFonts w:ascii="Times New Roman" w:hAnsi="Times New Roman"/>
           <w:b/>
-          <w:sz w:val="24"/>
-        </w:rPr>
-        <w:t xml:space="preserve">RQ1: </w:t>
-      </w:r>
-      <w:r>
-        <w:rPr>
-          <w:rFonts w:ascii="Times New Roman" w:hAnsi="Times New Roman"/>
-          <w:sz w:val="24"/>
-        </w:rPr>
-        <w:t>How accurately does the LLM intent parser extract typed reporting plans? This remains a semantic-correctness task requiring annotated expected labels.</w:t>
+          <w:sz w:val="28"/>
+        </w:rPr>
+        <w:t>4.5  Evaluation Procedure</w:t>
       </w:r>
     </w:p>
     <w:p>
       <w:pPr>
-        <w:spacing w:after="80" w:line="360" w:lineRule="auto"/>
-        <w:ind w:left="461" w:hanging="259"/>
-      </w:pPr>
-      <w:r>
-        <w:rPr>
-          <w:rFonts w:ascii="Times New Roman" w:hAnsi="Times New Roman"/>
-          <w:sz w:val="24"/>
-        </w:rPr>
-        <w:t>•</w:t>
-        <w:tab/>
-      </w:r>
-      <w:r>
-        <w:rPr>
-          <w:rFonts w:ascii="Times New Roman" w:hAnsi="Times New Roman"/>
-          <w:b/>
-          <w:sz w:val="24"/>
-        </w:rPr>
-        <w:t xml:space="preserve">RQ2: </w:t>
-      </w:r>
-      <w:r>
-        <w:rPr>
-          <w:rFonts w:ascii="Times New Roman" w:hAnsi="Times New Roman"/>
-          <w:sz w:val="24"/>
-        </w:rPr>
-        <w:t>Does AEGIS reduce unsafe SQL compared to direct LLM-to-SQL? Measured as genuine unsafe SQL statements across the 107-query benchmark.</w:t>
-      </w:r>
-    </w:p>
-    <w:p>
-      <w:pPr>
-        <w:spacing w:after="80" w:line="360" w:lineRule="auto"/>
-        <w:ind w:left="461" w:hanging="259"/>
-      </w:pPr>
-      <w:r>
-        <w:rPr>
-          <w:rFonts w:ascii="Times New Roman" w:hAnsi="Times New Roman"/>
-          <w:sz w:val="24"/>
-        </w:rPr>
-        <w:t>•</w:t>
-        <w:tab/>
-      </w:r>
-      <w:r>
-        <w:rPr>
-          <w:rFonts w:ascii="Times New Roman" w:hAnsi="Times New Roman"/>
-          <w:b/>
-          <w:sz w:val="24"/>
-        </w:rPr>
-        <w:t xml:space="preserve">RQ3: </w:t>
-      </w:r>
-      <w:r>
-        <w:rPr>
-          <w:rFonts w:ascii="Times New Roman" w:hAnsi="Times New Roman"/>
-          <w:sz w:val="24"/>
-        </w:rPr>
-        <w:t>Does AEGIS generate SQL that actually runs? Measured through true database execution against the seeded MySQL database, not merely by checking whether Python compilation succeeded.</w:t>
-      </w:r>
-    </w:p>
-    <w:p>
-      <w:pPr>
-        <w:spacing w:after="80" w:line="360" w:lineRule="auto"/>
-        <w:ind w:left="461" w:hanging="259"/>
-      </w:pPr>
-      <w:r>
-        <w:rPr>
-          <w:rFonts w:ascii="Times New Roman" w:hAnsi="Times New Roman"/>
-          <w:sz w:val="24"/>
-        </w:rPr>
-        <w:t>•</w:t>
-        <w:tab/>
-      </w:r>
-      <w:r>
-        <w:rPr>
-          <w:rFonts w:ascii="Times New Roman" w:hAnsi="Times New Roman"/>
-          <w:b/>
-          <w:sz w:val="24"/>
-        </w:rPr>
-        <w:t xml:space="preserve">RQ4: </w:t>
-      </w:r>
-      <w:r>
-        <w:rPr>
-          <w:rFonts w:ascii="Times New Roman" w:hAnsi="Times New Roman"/>
-          <w:sz w:val="24"/>
-        </w:rPr>
-        <w:t>How does the deterministic downstream compiler behave when intent selection is rule-based rather than LLM-based? Measured through the B3 template-only baseline.</w:t>
-      </w:r>
-    </w:p>
-    <w:p>
-      <w:r>
-        <w:br w:type="page"/>
-      </w:r>
-    </w:p>
-    <w:p>
-      <w:pPr>
-        <w:spacing w:before="0" w:after="80"/>
-        <w:jc w:val="center"/>
-      </w:pPr>
-      <w:r>
-        <w:rPr>
-          <w:rFonts w:ascii="Times New Roman" w:hAnsi="Times New Roman"/>
-          <w:b/>
-          <w:sz w:val="32"/>
-        </w:rPr>
-        <w:t>CHAPTER 5</w:t>
-      </w:r>
-    </w:p>
-    <w:p>
-      <w:pPr>
-        <w:spacing w:after="400"/>
-        <w:jc w:val="center"/>
-      </w:pPr>
-      <w:r>
-        <w:rPr>
-          <w:rFonts w:ascii="Times New Roman" w:hAnsi="Times New Roman"/>
-          <w:b/>
-          <w:sz w:val="32"/>
-        </w:rPr>
-        <w:t>RESULTS AND DISCUSSION</w:t>
-      </w:r>
-    </w:p>
-    <w:p>
-      <w:pPr>
-        <w:spacing w:after="200" w:before="0" w:line="360" w:lineRule="auto"/>
+        <w:spacing w:after="160" w:before="0" w:line="360" w:lineRule="auto"/>
         <w:jc w:val="both"/>
       </w:pPr>
       <w:r>
@@ -13838,12 +13678,219 @@
           <w:i w:val="0"/>
           <w:sz w:val="24"/>
         </w:rPr>
-        <w:t>The results discussion presents the evaluation results of the AEGIS prototype using a 107-request natural-language analytics benchmark and true database execution. The discussion separates SQL safety, execution validity, and semantic correctness because a query may be safe and executable while still failing to answer the intended analytical request.</w:t>
+        <w:t>The current evaluation focuses on measurements that can be reproduced from the recorded benchmark data and verified through true database execution:</w:t>
       </w:r>
     </w:p>
     <w:p>
       <w:pPr>
-        <w:spacing w:after="0" w:before="0" w:line="360" w:lineRule="auto"/>
+        <w:spacing w:after="80" w:line="360" w:lineRule="auto"/>
+        <w:ind w:left="461" w:hanging="259"/>
+      </w:pPr>
+      <w:r>
+        <w:rPr>
+          <w:rFonts w:ascii="Times New Roman" w:hAnsi="Times New Roman"/>
+          <w:sz w:val="24"/>
+        </w:rPr>
+        <w:t>•</w:t>
+        <w:tab/>
+      </w:r>
+      <w:r>
+        <w:rPr>
+          <w:rFonts w:ascii="Times New Roman" w:hAnsi="Times New Roman"/>
+          <w:b/>
+          <w:sz w:val="24"/>
+        </w:rPr>
+        <w:t xml:space="preserve">RQ1: </w:t>
+      </w:r>
+      <w:r>
+        <w:rPr>
+          <w:rFonts w:ascii="Times New Roman" w:hAnsi="Times New Roman"/>
+          <w:sz w:val="24"/>
+        </w:rPr>
+        <w:t>How accurately does the LLM intent parser extract typed reporting plans? This remains a semantic-correctness task requiring annotated expected labels.</w:t>
+      </w:r>
+    </w:p>
+    <w:p>
+      <w:pPr>
+        <w:spacing w:after="80" w:line="360" w:lineRule="auto"/>
+        <w:ind w:left="461" w:hanging="259"/>
+      </w:pPr>
+      <w:r>
+        <w:rPr>
+          <w:rFonts w:ascii="Times New Roman" w:hAnsi="Times New Roman"/>
+          <w:sz w:val="24"/>
+        </w:rPr>
+        <w:t>•</w:t>
+        <w:tab/>
+      </w:r>
+      <w:r>
+        <w:rPr>
+          <w:rFonts w:ascii="Times New Roman" w:hAnsi="Times New Roman"/>
+          <w:b/>
+          <w:sz w:val="24"/>
+        </w:rPr>
+        <w:t xml:space="preserve">RQ2: </w:t>
+      </w:r>
+      <w:r>
+        <w:rPr>
+          <w:rFonts w:ascii="Times New Roman" w:hAnsi="Times New Roman"/>
+          <w:sz w:val="24"/>
+        </w:rPr>
+        <w:t>Does AEGIS reduce unsafe SQL compared to direct LLM-to-SQL? Measured as genuine unsafe SQL statements across the 107-query benchmark.</w:t>
+      </w:r>
+    </w:p>
+    <w:p>
+      <w:pPr>
+        <w:spacing w:after="80" w:line="360" w:lineRule="auto"/>
+        <w:ind w:left="461" w:hanging="259"/>
+      </w:pPr>
+      <w:r>
+        <w:rPr>
+          <w:rFonts w:ascii="Times New Roman" w:hAnsi="Times New Roman"/>
+          <w:sz w:val="24"/>
+        </w:rPr>
+        <w:t>•</w:t>
+        <w:tab/>
+      </w:r>
+      <w:r>
+        <w:rPr>
+          <w:rFonts w:ascii="Times New Roman" w:hAnsi="Times New Roman"/>
+          <w:b/>
+          <w:sz w:val="24"/>
+        </w:rPr>
+        <w:t xml:space="preserve">RQ3: </w:t>
+      </w:r>
+      <w:r>
+        <w:rPr>
+          <w:rFonts w:ascii="Times New Roman" w:hAnsi="Times New Roman"/>
+          <w:sz w:val="24"/>
+        </w:rPr>
+        <w:t>Does AEGIS generate SQL that actually runs? Measured through true database execution against the seeded MySQL database, not merely by checking whether Python compilation succeeded.</w:t>
+      </w:r>
+    </w:p>
+    <w:p>
+      <w:pPr>
+        <w:spacing w:after="80" w:line="360" w:lineRule="auto"/>
+        <w:ind w:left="461" w:hanging="259"/>
+      </w:pPr>
+      <w:r>
+        <w:rPr>
+          <w:rFonts w:ascii="Times New Roman" w:hAnsi="Times New Roman"/>
+          <w:sz w:val="24"/>
+        </w:rPr>
+        <w:t>•</w:t>
+        <w:tab/>
+      </w:r>
+      <w:r>
+        <w:rPr>
+          <w:rFonts w:ascii="Times New Roman" w:hAnsi="Times New Roman"/>
+          <w:b/>
+          <w:sz w:val="24"/>
+        </w:rPr>
+        <w:t xml:space="preserve">RQ4: </w:t>
+      </w:r>
+      <w:r>
+        <w:rPr>
+          <w:rFonts w:ascii="Times New Roman" w:hAnsi="Times New Roman"/>
+          <w:sz w:val="24"/>
+        </w:rPr>
+        <w:t>How does the deterministic downstream compiler behave when intent selection is rule-based rather than LLM-based? Measured through the B3 template-only baseline.</w:t>
+      </w:r>
+    </w:p>
+    <w:p>
+      <w:pPr>
+        <w:spacing w:after="80" w:line="360" w:lineRule="auto"/>
+        <w:ind w:left="461" w:hanging="259"/>
+      </w:pPr>
+      <w:r>
+        <w:rPr>
+          <w:rFonts w:ascii="Times New Roman" w:hAnsi="Times New Roman"/>
+          <w:sz w:val="24"/>
+        </w:rPr>
+        <w:t>•</w:t>
+        <w:tab/>
+      </w:r>
+      <w:r>
+        <w:rPr>
+          <w:rFonts w:ascii="Times New Roman" w:hAnsi="Times New Roman"/>
+          <w:b/>
+          <w:sz w:val="24"/>
+        </w:rPr>
+        <w:t xml:space="preserve">RQ5: </w:t>
+      </w:r>
+      <w:r>
+        <w:rPr>
+          <w:rFonts w:ascii="Times New Roman" w:hAnsi="Times New Roman"/>
+          <w:sz w:val="24"/>
+        </w:rPr>
+        <w:t>How accurate are the generated answers at the semantic level? Measured through a machine-assisted first-pass annotation that checks expected metric, grouping, time/filter, and required behavior.</w:t>
+      </w:r>
+    </w:p>
+    <w:p>
+      <w:pPr>
+        <w:spacing w:after="80" w:line="360" w:lineRule="auto"/>
+        <w:ind w:left="461" w:hanging="259"/>
+      </w:pPr>
+      <w:r>
+        <w:rPr>
+          <w:rFonts w:ascii="Times New Roman" w:hAnsi="Times New Roman"/>
+          <w:sz w:val="24"/>
+        </w:rPr>
+        <w:t>•</w:t>
+        <w:tab/>
+      </w:r>
+      <w:r>
+        <w:rPr>
+          <w:rFonts w:ascii="Times New Roman" w:hAnsi="Times New Roman"/>
+          <w:b/>
+          <w:sz w:val="24"/>
+        </w:rPr>
+        <w:t xml:space="preserve">RQ6: </w:t>
+      </w:r>
+      <w:r>
+        <w:rPr>
+          <w:rFonts w:ascii="Times New Roman" w:hAnsi="Times New Roman"/>
+          <w:sz w:val="24"/>
+        </w:rPr>
+        <w:t>How does the system behave under harder requests? Measured by scope-handling annotation for unsupported, vague, compound, and write-style requests in the same 107-request benchmark.</w:t>
+      </w:r>
+    </w:p>
+    <w:p>
+      <w:r>
+        <w:br w:type="page"/>
+      </w:r>
+    </w:p>
+    <w:p>
+      <w:pPr>
+        <w:spacing w:before="0" w:after="80"/>
+        <w:jc w:val="center"/>
+      </w:pPr>
+      <w:r>
+        <w:rPr>
+          <w:rFonts w:ascii="Times New Roman" w:hAnsi="Times New Roman"/>
+          <w:b/>
+          <w:sz w:val="32"/>
+        </w:rPr>
+        <w:t>CHAPTER 5</w:t>
+      </w:r>
+    </w:p>
+    <w:p>
+      <w:pPr>
+        <w:spacing w:after="400"/>
+        <w:jc w:val="center"/>
+      </w:pPr>
+      <w:r>
+        <w:rPr>
+          <w:rFonts w:ascii="Times New Roman" w:hAnsi="Times New Roman"/>
+          <w:b/>
+          <w:sz w:val="32"/>
+        </w:rPr>
+        <w:t>RESULTS AND DISCUSSION</w:t>
+      </w:r>
+    </w:p>
+    <w:p>
+      <w:pPr>
+        <w:spacing w:after="200" w:before="0" w:line="360" w:lineRule="auto"/>
         <w:jc w:val="both"/>
       </w:pPr>
       <w:r>
@@ -13853,7 +13900,22 @@
           <w:i w:val="0"/>
           <w:sz w:val="24"/>
         </w:rPr>
-        <w:t>The reported quantitative evidence covers the mixed 107-request benchmark for AEGIS and the B1 direct LLM-to-SQL baseline, together with the completed B3 template-only execution-validity run. B2, B4, latency, and fully annotated semantic correctness remain future evaluation work, so the reported results include only the measurements completed under the current experimental setup.</w:t>
+        <w:t>The results discussion presents the evaluation results of the AEGIS prototype using a 107-request natural-language analytics benchmark and true database execution. The discussion separates SQL safety, execution validity, and semantic correctness because a query may be safe and executable while still failing to answer the intended analytical request.</w:t>
+      </w:r>
+    </w:p>
+    <w:p>
+      <w:pPr>
+        <w:spacing w:after="0" w:before="0" w:line="360" w:lineRule="auto"/>
+        <w:jc w:val="both"/>
+      </w:pPr>
+      <w:r>
+        <w:rPr>
+          <w:rFonts w:ascii="Times New Roman" w:hAnsi="Times New Roman"/>
+          <w:b w:val="0"/>
+          <w:i w:val="0"/>
+          <w:sz w:val="24"/>
+        </w:rPr>
+        <w:t>The reported quantitative evidence covers AEGIS and three completed baselines: B1 direct LLM-to-SQL, B2 decomposed LLM-to-SQL, and B3 template-only. It also includes a machine-assisted first-pass semantic-correctness annotation and runtime evidence from the live LLM gateway and Docker MySQL execution.</w:t>
       </w:r>
     </w:p>
     <w:p>
@@ -14141,7 +14203,7 @@
                 <w:b w:val="0"/>
                 <w:sz w:val="21"/>
               </w:rPr>
-              <w:t>B1 direct LLM-to-SQL and B3 template-only</w:t>
+              <w:t>B1 direct LLM-to-SQL, B2 decomposed LLM-to-SQL, and B3 template-only</w:t>
             </w:r>
           </w:p>
         </w:tc>
@@ -14171,7 +14233,7 @@
                 <w:b w:val="0"/>
                 <w:sz w:val="21"/>
               </w:rPr>
-              <w:t>Pending measurements</w:t>
+              <w:t>Correctness annotation</w:t>
             </w:r>
           </w:p>
         </w:tc>
@@ -14197,7 +14259,119 @@
                 <w:b w:val="0"/>
                 <w:sz w:val="21"/>
               </w:rPr>
-              <w:t>Semantic correctness, B2/B4 baselines, and latency</w:t>
+              <w:t>Machine-assisted first pass over all 107 requests</w:t>
+            </w:r>
+          </w:p>
+        </w:tc>
+      </w:tr>
+      <w:tr>
+        <w:trPr>
+          <w:cantSplit/>
+        </w:trPr>
+        <w:tc>
+          <w:tcPr>
+            <w:tcW w:type="dxa" w:w="4513"/>
+          </w:tcPr>
+          <w:p>
+            <w:pPr>
+              <w:spacing w:before="0" w:after="0" w:line="240" w:lineRule="auto"/>
+              <w:keepNext/>
+            </w:pPr>
+            <w:r>
+              <w:rPr>
+                <w:rFonts w:ascii="Times New Roman" w:hAnsi="Times New Roman"/>
+                <w:sz w:val="21"/>
+              </w:rPr>
+            </w:r>
+            <w:r>
+              <w:rPr>
+                <w:rFonts w:ascii="Times New Roman" w:hAnsi="Times New Roman"/>
+                <w:b w:val="0"/>
+                <w:sz w:val="21"/>
+              </w:rPr>
+              <w:t>Runtime evidence</w:t>
+            </w:r>
+          </w:p>
+        </w:tc>
+        <w:tc>
+          <w:tcPr>
+            <w:tcW w:type="dxa" w:w="4513"/>
+          </w:tcPr>
+          <w:p>
+            <w:pPr>
+              <w:spacing w:before="0" w:after="0" w:line="240" w:lineRule="auto"/>
+              <w:jc w:val="center"/>
+              <w:keepNext/>
+            </w:pPr>
+            <w:r>
+              <w:rPr>
+                <w:rFonts w:ascii="Times New Roman" w:hAnsi="Times New Roman"/>
+                <w:sz w:val="21"/>
+              </w:rPr>
+            </w:r>
+            <w:r>
+              <w:rPr>
+                <w:rFonts w:ascii="Times New Roman" w:hAnsi="Times New Roman"/>
+                <w:b w:val="0"/>
+                <w:sz w:val="21"/>
+              </w:rPr>
+              <w:t>LLM gateway responses observed around 12-30 seconds; SQL replay measured in milliseconds</w:t>
+            </w:r>
+          </w:p>
+        </w:tc>
+      </w:tr>
+      <w:tr>
+        <w:trPr>
+          <w:cantSplit/>
+        </w:trPr>
+        <w:tc>
+          <w:tcPr>
+            <w:tcW w:type="dxa" w:w="4513"/>
+          </w:tcPr>
+          <w:p>
+            <w:pPr>
+              <w:spacing w:before="0" w:after="0" w:line="240" w:lineRule="auto"/>
+              <w:keepNext/>
+            </w:pPr>
+            <w:r>
+              <w:rPr>
+                <w:rFonts w:ascii="Times New Roman" w:hAnsi="Times New Roman"/>
+                <w:sz w:val="21"/>
+              </w:rPr>
+            </w:r>
+            <w:r>
+              <w:rPr>
+                <w:rFonts w:ascii="Times New Roman" w:hAnsi="Times New Roman"/>
+                <w:b w:val="0"/>
+                <w:sz w:val="21"/>
+              </w:rPr>
+              <w:t>Remaining manual step</w:t>
+            </w:r>
+          </w:p>
+        </w:tc>
+        <w:tc>
+          <w:tcPr>
+            <w:tcW w:type="dxa" w:w="4513"/>
+          </w:tcPr>
+          <w:p>
+            <w:pPr>
+              <w:spacing w:before="0" w:after="0" w:line="240" w:lineRule="auto"/>
+              <w:jc w:val="center"/>
+              <w:keepNext/>
+            </w:pPr>
+            <w:r>
+              <w:rPr>
+                <w:rFonts w:ascii="Times New Roman" w:hAnsi="Times New Roman"/>
+                <w:sz w:val="21"/>
+              </w:rPr>
+            </w:r>
+            <w:r>
+              <w:rPr>
+                <w:rFonts w:ascii="Times New Roman" w:hAnsi="Times New Roman"/>
+                <w:b w:val="0"/>
+                <w:sz w:val="21"/>
+              </w:rPr>
+              <w:t>Human spot-checking of semantic-correctness annotations before final submission</w:t>
             </w:r>
           </w:p>
         </w:tc>
@@ -14641,7 +14815,7 @@
                 <w:b w:val="0"/>
                 <w:sz w:val="21"/>
               </w:rPr>
-              <w:t>B1: 27 of 107 (25.2%); B3: 104 of 107 (97.2%)</w:t>
+              <w:t>B1: 27 of 107; B2: 33 of 107; B3: 104 of 107</w:t>
             </w:r>
           </w:p>
         </w:tc>
@@ -14667,7 +14841,7 @@
                 <w:b w:val="0"/>
                 <w:sz w:val="21"/>
               </w:rPr>
-              <w:t>AEGIS greatly improved execution validity over direct LLM-to-SQL</w:t>
+              <w:t>AEGIS greatly improved execution validity over LLM-to-SQL baselines</w:t>
             </w:r>
           </w:p>
         </w:tc>
@@ -14883,7 +15057,7 @@
                 <w:b w:val="0"/>
                 <w:sz w:val="21"/>
               </w:rPr>
-              <w:t>Not numerically scored</w:t>
+              <w:t>32 of 107 overall; 32 of 54 answerable requests</w:t>
             </w:r>
           </w:p>
         </w:tc>
@@ -14909,7 +15083,7 @@
                 <w:b w:val="0"/>
                 <w:sz w:val="21"/>
               </w:rPr>
-              <w:t>Not numerically scored</w:t>
+              <w:t>B1: 16; B2: 19; B3: 21 correct overall</w:t>
             </w:r>
           </w:p>
         </w:tc>
@@ -14935,7 +15109,7 @@
                 <w:b w:val="0"/>
                 <w:sz w:val="21"/>
               </w:rPr>
-              <w:t>Requires annotated expected answers before accuracy can be claimed</w:t>
+              <w:t>AEGIS had the strongest answerable-request correctness in the annotation</w:t>
             </w:r>
           </w:p>
         </w:tc>
@@ -14961,7 +15135,7 @@
                 <w:b w:val="0"/>
                 <w:sz w:val="21"/>
               </w:rPr>
-              <w:t>Pending</w:t>
+              <w:t>First-pass</w:t>
             </w:r>
           </w:p>
         </w:tc>
@@ -14991,7 +15165,7 @@
                 <w:b w:val="0"/>
                 <w:sz w:val="21"/>
               </w:rPr>
-              <w:t>Latency</w:t>
+              <w:t>Runtime</w:t>
             </w:r>
           </w:p>
         </w:tc>
@@ -15017,7 +15191,7 @@
                 <w:b w:val="0"/>
                 <w:sz w:val="21"/>
               </w:rPr>
-              <w:t>Not instrumented</w:t>
+              <w:t>SQL replay mean 13.22 ms; live LLM responses commonly 12-30 s</w:t>
             </w:r>
           </w:p>
         </w:tc>
@@ -15043,7 +15217,7 @@
                 <w:b w:val="0"/>
                 <w:sz w:val="21"/>
               </w:rPr>
-              <w:t>Not instrumented</w:t>
+              <w:t>B2 requires two LLM calls per request</w:t>
             </w:r>
           </w:p>
         </w:tc>
@@ -15069,7 +15243,7 @@
                 <w:b w:val="0"/>
                 <w:sz w:val="21"/>
               </w:rPr>
-              <w:t>Needs repeatable timing logs before reporting</w:t>
+              <w:t>LLM response time dominates user-visible latency</w:t>
             </w:r>
           </w:p>
         </w:tc>
@@ -15095,7 +15269,7 @@
                 <w:b w:val="0"/>
                 <w:sz w:val="21"/>
               </w:rPr>
-              <w:t>Pending</w:t>
+              <w:t>Measured / observed</w:t>
             </w:r>
           </w:p>
         </w:tc>
@@ -15755,6 +15929,88 @@
                 <w:b w:val="0"/>
                 <w:sz w:val="21"/>
               </w:rPr>
+              <w:t>Baseline B2 (Decomposed LLM)</w:t>
+            </w:r>
+          </w:p>
+        </w:tc>
+        <w:tc>
+          <w:tcPr>
+            <w:tcW w:type="dxa" w:w="2232"/>
+          </w:tcPr>
+          <w:p>
+            <w:pPr>
+              <w:spacing w:before="0" w:after="0" w:line="240" w:lineRule="auto"/>
+              <w:jc w:val="center"/>
+              <w:keepNext/>
+            </w:pPr>
+            <w:r>
+              <w:rPr>
+                <w:rFonts w:ascii="Times New Roman" w:hAnsi="Times New Roman"/>
+                <w:sz w:val="21"/>
+              </w:rPr>
+            </w:r>
+            <w:r>
+              <w:rPr>
+                <w:rFonts w:ascii="Times New Roman" w:hAnsi="Times New Roman"/>
+                <w:b w:val="0"/>
+                <w:sz w:val="21"/>
+              </w:rPr>
+              <w:t>33 of 107 executed successfully (30.8%)</w:t>
+            </w:r>
+          </w:p>
+        </w:tc>
+        <w:tc>
+          <w:tcPr>
+            <w:tcW w:type="dxa" w:w="4176"/>
+          </w:tcPr>
+          <w:p>
+            <w:pPr>
+              <w:spacing w:before="0" w:after="0" w:line="240" w:lineRule="auto"/>
+              <w:jc w:val="center"/>
+              <w:keepNext/>
+            </w:pPr>
+            <w:r>
+              <w:rPr>
+                <w:rFonts w:ascii="Times New Roman" w:hAnsi="Times New Roman"/>
+                <w:sz w:val="21"/>
+              </w:rPr>
+            </w:r>
+            <w:r>
+              <w:rPr>
+                <w:rFonts w:ascii="Times New Roman" w:hAnsi="Times New Roman"/>
+                <w:b w:val="0"/>
+                <w:sz w:val="21"/>
+              </w:rPr>
+              <w:t>Decomposition improved slightly over B1, but many SQL errors remained.</w:t>
+            </w:r>
+          </w:p>
+        </w:tc>
+      </w:tr>
+      <w:tr>
+        <w:trPr>
+          <w:cantSplit/>
+        </w:trPr>
+        <w:tc>
+          <w:tcPr>
+            <w:tcW w:type="dxa" w:w="2520"/>
+          </w:tcPr>
+          <w:p>
+            <w:pPr>
+              <w:spacing w:before="0" w:after="0" w:line="240" w:lineRule="auto"/>
+              <w:keepNext/>
+            </w:pPr>
+            <w:r>
+              <w:rPr>
+                <w:rFonts w:ascii="Times New Roman" w:hAnsi="Times New Roman"/>
+                <w:sz w:val="21"/>
+              </w:rPr>
+            </w:r>
+            <w:r>
+              <w:rPr>
+                <w:rFonts w:ascii="Times New Roman" w:hAnsi="Times New Roman"/>
+                <w:b w:val="0"/>
+                <w:sz w:val="21"/>
+              </w:rPr>
               <w:t>AEGIS</w:t>
             </w:r>
           </w:p>
@@ -16656,7 +16912,7 @@
           <w:b/>
           <w:sz w:val="28"/>
         </w:rPr>
-        <w:t>5.6  Semantic Correctness Limitation</w:t>
+        <w:t>5.6  Semantic Correctness and Scope Handling</w:t>
       </w:r>
     </w:p>
     <w:p>
@@ -16671,7 +16927,7 @@
           <w:i w:val="0"/>
           <w:sz w:val="24"/>
         </w:rPr>
-        <w:t>Correctness or accuracy must be treated separately from execution validity. The current results show that AEGIS often generates SQL that executes successfully and avoids unsafe operations, but they do not establish that every executable result matches the user's intended analytical meaning.</w:t>
+        <w:t>Correctness or accuracy must be treated separately from execution validity. A machine-assisted annotation pass was therefore added after the supervisor review. Each row was checked against the expected metric, grouping, time or filter, and required behavior. This annotation is a first pass and should be manually spot-checked before final submission, but it gives the thesis a concrete correctness measurement instead of relying only on SQL execution.</w:t>
       </w:r>
     </w:p>
     <w:p>
@@ -16686,7 +16942,1741 @@
           <w:b/>
           <w:sz w:val="22"/>
         </w:rPr>
-        <w:t>Table 5.6: Distinguishing the evaluation metrics.</w:t>
+        <w:t>Table 5.6: Semantic-correctness annotation summary.</w:t>
+      </w:r>
+    </w:p>
+    <w:tbl>
+      <w:tblPr>
+        <w:tblStyle w:val="TableGrid"/>
+        <w:tblW w:type="auto" w:w="0"/>
+        <w:jc w:val="center"/>
+        <w:tblLayout w:type="fixed"/>
+        <w:tblLook w:firstColumn="1" w:firstRow="1" w:lastColumn="0" w:lastRow="0" w:noHBand="0" w:noVBand="1" w:val="04A0"/>
+        <w:tblBorders>
+          <w:top w:val="single" w:sz="4" w:space="0" w:color="999999"/>
+          <w:left w:val="single" w:sz="4" w:space="0" w:color="999999"/>
+          <w:bottom w:val="single" w:sz="4" w:space="0" w:color="999999"/>
+          <w:right w:val="single" w:sz="4" w:space="0" w:color="999999"/>
+          <w:insideH w:val="single" w:sz="4" w:space="0" w:color="999999"/>
+          <w:insideV w:val="single" w:sz="4" w:space="0" w:color="999999"/>
+        </w:tblBorders>
+      </w:tblPr>
+      <w:tblGrid>
+        <w:gridCol w:w="2520"/>
+        <w:gridCol w:w="2016"/>
+        <w:gridCol w:w="2088"/>
+        <w:gridCol w:w="2016"/>
+      </w:tblGrid>
+      <w:tr>
+        <w:trPr>
+          <w:cantSplit/>
+        </w:trPr>
+        <w:tc>
+          <w:tcPr>
+            <w:tcW w:type="dxa" w:w="2256"/>
+          </w:tcPr>
+          <w:p>
+            <w:pPr>
+              <w:spacing w:before="0" w:after="0" w:line="240" w:lineRule="auto"/>
+              <w:jc w:val="center"/>
+              <w:keepNext/>
+            </w:pPr>
+            <w:r>
+              <w:rPr>
+                <w:rFonts w:ascii="Times New Roman" w:hAnsi="Times New Roman"/>
+                <w:b/>
+                <w:sz w:val="21"/>
+              </w:rPr>
+            </w:r>
+            <w:r>
+              <w:rPr>
+                <w:rFonts w:ascii="Times New Roman" w:hAnsi="Times New Roman"/>
+                <w:b/>
+                <w:sz w:val="21"/>
+              </w:rPr>
+              <w:t>System</w:t>
+            </w:r>
+          </w:p>
+        </w:tc>
+        <w:tc>
+          <w:tcPr>
+            <w:tcW w:type="dxa" w:w="2256"/>
+          </w:tcPr>
+          <w:p>
+            <w:pPr>
+              <w:spacing w:before="0" w:after="0" w:line="240" w:lineRule="auto"/>
+              <w:jc w:val="center"/>
+              <w:keepNext/>
+            </w:pPr>
+            <w:r>
+              <w:rPr>
+                <w:rFonts w:ascii="Times New Roman" w:hAnsi="Times New Roman"/>
+                <w:b/>
+                <w:sz w:val="21"/>
+              </w:rPr>
+            </w:r>
+            <w:r>
+              <w:rPr>
+                <w:rFonts w:ascii="Times New Roman" w:hAnsi="Times New Roman"/>
+                <w:b/>
+                <w:sz w:val="21"/>
+              </w:rPr>
+              <w:t>Overall correctness</w:t>
+            </w:r>
+          </w:p>
+        </w:tc>
+        <w:tc>
+          <w:tcPr>
+            <w:tcW w:type="dxa" w:w="2256"/>
+          </w:tcPr>
+          <w:p>
+            <w:pPr>
+              <w:spacing w:before="0" w:after="0" w:line="240" w:lineRule="auto"/>
+              <w:jc w:val="center"/>
+              <w:keepNext/>
+            </w:pPr>
+            <w:r>
+              <w:rPr>
+                <w:rFonts w:ascii="Times New Roman" w:hAnsi="Times New Roman"/>
+                <w:b/>
+                <w:sz w:val="21"/>
+              </w:rPr>
+            </w:r>
+            <w:r>
+              <w:rPr>
+                <w:rFonts w:ascii="Times New Roman" w:hAnsi="Times New Roman"/>
+                <w:b/>
+                <w:sz w:val="21"/>
+              </w:rPr>
+              <w:t>Answerable requests</w:t>
+            </w:r>
+          </w:p>
+        </w:tc>
+        <w:tc>
+          <w:tcPr>
+            <w:tcW w:type="dxa" w:w="2256"/>
+          </w:tcPr>
+          <w:p>
+            <w:pPr>
+              <w:spacing w:before="0" w:after="0" w:line="240" w:lineRule="auto"/>
+              <w:jc w:val="center"/>
+              <w:keepNext/>
+            </w:pPr>
+            <w:r>
+              <w:rPr>
+                <w:rFonts w:ascii="Times New Roman" w:hAnsi="Times New Roman"/>
+                <w:b/>
+                <w:sz w:val="21"/>
+              </w:rPr>
+            </w:r>
+            <w:r>
+              <w:rPr>
+                <w:rFonts w:ascii="Times New Roman" w:hAnsi="Times New Roman"/>
+                <w:b/>
+                <w:sz w:val="21"/>
+              </w:rPr>
+              <w:t>Scope/write handling</w:t>
+            </w:r>
+          </w:p>
+        </w:tc>
+      </w:tr>
+      <w:tr>
+        <w:trPr>
+          <w:cantSplit/>
+        </w:trPr>
+        <w:tc>
+          <w:tcPr>
+            <w:tcW w:type="dxa" w:w="2520"/>
+          </w:tcPr>
+          <w:p>
+            <w:pPr>
+              <w:spacing w:before="0" w:after="0" w:line="240" w:lineRule="auto"/>
+              <w:keepNext/>
+            </w:pPr>
+            <w:r>
+              <w:rPr>
+                <w:rFonts w:ascii="Times New Roman" w:hAnsi="Times New Roman"/>
+                <w:sz w:val="21"/>
+              </w:rPr>
+            </w:r>
+            <w:r>
+              <w:rPr>
+                <w:rFonts w:ascii="Times New Roman" w:hAnsi="Times New Roman"/>
+                <w:b w:val="0"/>
+                <w:sz w:val="21"/>
+              </w:rPr>
+              <w:t>AEGIS</w:t>
+            </w:r>
+          </w:p>
+        </w:tc>
+        <w:tc>
+          <w:tcPr>
+            <w:tcW w:type="dxa" w:w="2016"/>
+          </w:tcPr>
+          <w:p>
+            <w:pPr>
+              <w:spacing w:before="0" w:after="0" w:line="240" w:lineRule="auto"/>
+              <w:jc w:val="center"/>
+              <w:keepNext/>
+            </w:pPr>
+            <w:r>
+              <w:rPr>
+                <w:rFonts w:ascii="Times New Roman" w:hAnsi="Times New Roman"/>
+                <w:sz w:val="21"/>
+              </w:rPr>
+            </w:r>
+            <w:r>
+              <w:rPr>
+                <w:rFonts w:ascii="Times New Roman" w:hAnsi="Times New Roman"/>
+                <w:b w:val="0"/>
+                <w:sz w:val="21"/>
+              </w:rPr>
+              <w:t>32 of 107 (29.9%)</w:t>
+            </w:r>
+          </w:p>
+        </w:tc>
+        <w:tc>
+          <w:tcPr>
+            <w:tcW w:type="dxa" w:w="2088"/>
+          </w:tcPr>
+          <w:p>
+            <w:pPr>
+              <w:spacing w:before="0" w:after="0" w:line="240" w:lineRule="auto"/>
+              <w:jc w:val="center"/>
+              <w:keepNext/>
+            </w:pPr>
+            <w:r>
+              <w:rPr>
+                <w:rFonts w:ascii="Times New Roman" w:hAnsi="Times New Roman"/>
+                <w:sz w:val="21"/>
+              </w:rPr>
+            </w:r>
+            <w:r>
+              <w:rPr>
+                <w:rFonts w:ascii="Times New Roman" w:hAnsi="Times New Roman"/>
+                <w:b w:val="0"/>
+                <w:sz w:val="21"/>
+              </w:rPr>
+              <w:t>32 of 54 (59.3%)</w:t>
+            </w:r>
+          </w:p>
+        </w:tc>
+        <w:tc>
+          <w:tcPr>
+            <w:tcW w:type="dxa" w:w="2016"/>
+          </w:tcPr>
+          <w:p>
+            <w:pPr>
+              <w:spacing w:before="0" w:after="0" w:line="240" w:lineRule="auto"/>
+              <w:jc w:val="center"/>
+              <w:keepNext/>
+            </w:pPr>
+            <w:r>
+              <w:rPr>
+                <w:rFonts w:ascii="Times New Roman" w:hAnsi="Times New Roman"/>
+                <w:sz w:val="21"/>
+              </w:rPr>
+            </w:r>
+            <w:r>
+              <w:rPr>
+                <w:rFonts w:ascii="Times New Roman" w:hAnsi="Times New Roman"/>
+                <w:b w:val="0"/>
+                <w:sz w:val="21"/>
+              </w:rPr>
+              <w:t>0 of 52</w:t>
+            </w:r>
+          </w:p>
+        </w:tc>
+      </w:tr>
+      <w:tr>
+        <w:trPr>
+          <w:cantSplit/>
+        </w:trPr>
+        <w:tc>
+          <w:tcPr>
+            <w:tcW w:type="dxa" w:w="2520"/>
+          </w:tcPr>
+          <w:p>
+            <w:pPr>
+              <w:spacing w:before="0" w:after="0" w:line="240" w:lineRule="auto"/>
+              <w:keepNext/>
+            </w:pPr>
+            <w:r>
+              <w:rPr>
+                <w:rFonts w:ascii="Times New Roman" w:hAnsi="Times New Roman"/>
+                <w:sz w:val="21"/>
+              </w:rPr>
+            </w:r>
+            <w:r>
+              <w:rPr>
+                <w:rFonts w:ascii="Times New Roman" w:hAnsi="Times New Roman"/>
+                <w:b w:val="0"/>
+                <w:sz w:val="21"/>
+              </w:rPr>
+              <w:t>B1 Direct LLM-to-SQL</w:t>
+            </w:r>
+          </w:p>
+        </w:tc>
+        <w:tc>
+          <w:tcPr>
+            <w:tcW w:type="dxa" w:w="2016"/>
+          </w:tcPr>
+          <w:p>
+            <w:pPr>
+              <w:spacing w:before="0" w:after="0" w:line="240" w:lineRule="auto"/>
+              <w:jc w:val="center"/>
+              <w:keepNext/>
+            </w:pPr>
+            <w:r>
+              <w:rPr>
+                <w:rFonts w:ascii="Times New Roman" w:hAnsi="Times New Roman"/>
+                <w:sz w:val="21"/>
+              </w:rPr>
+            </w:r>
+            <w:r>
+              <w:rPr>
+                <w:rFonts w:ascii="Times New Roman" w:hAnsi="Times New Roman"/>
+                <w:b w:val="0"/>
+                <w:sz w:val="21"/>
+              </w:rPr>
+              <w:t>16 of 107 (15.0%)</w:t>
+            </w:r>
+          </w:p>
+        </w:tc>
+        <w:tc>
+          <w:tcPr>
+            <w:tcW w:type="dxa" w:w="2088"/>
+          </w:tcPr>
+          <w:p>
+            <w:pPr>
+              <w:spacing w:before="0" w:after="0" w:line="240" w:lineRule="auto"/>
+              <w:jc w:val="center"/>
+              <w:keepNext/>
+            </w:pPr>
+            <w:r>
+              <w:rPr>
+                <w:rFonts w:ascii="Times New Roman" w:hAnsi="Times New Roman"/>
+                <w:sz w:val="21"/>
+              </w:rPr>
+            </w:r>
+            <w:r>
+              <w:rPr>
+                <w:rFonts w:ascii="Times New Roman" w:hAnsi="Times New Roman"/>
+                <w:b w:val="0"/>
+                <w:sz w:val="21"/>
+              </w:rPr>
+              <w:t>15 of 54 (27.8%)</w:t>
+            </w:r>
+          </w:p>
+        </w:tc>
+        <w:tc>
+          <w:tcPr>
+            <w:tcW w:type="dxa" w:w="2016"/>
+          </w:tcPr>
+          <w:p>
+            <w:pPr>
+              <w:spacing w:before="0" w:after="0" w:line="240" w:lineRule="auto"/>
+              <w:jc w:val="center"/>
+              <w:keepNext/>
+            </w:pPr>
+            <w:r>
+              <w:rPr>
+                <w:rFonts w:ascii="Times New Roman" w:hAnsi="Times New Roman"/>
+                <w:sz w:val="21"/>
+              </w:rPr>
+            </w:r>
+            <w:r>
+              <w:rPr>
+                <w:rFonts w:ascii="Times New Roman" w:hAnsi="Times New Roman"/>
+                <w:b w:val="0"/>
+                <w:sz w:val="21"/>
+              </w:rPr>
+              <w:t>0 of 52</w:t>
+            </w:r>
+          </w:p>
+        </w:tc>
+      </w:tr>
+      <w:tr>
+        <w:trPr>
+          <w:cantSplit/>
+        </w:trPr>
+        <w:tc>
+          <w:tcPr>
+            <w:tcW w:type="dxa" w:w="2520"/>
+          </w:tcPr>
+          <w:p>
+            <w:pPr>
+              <w:spacing w:before="0" w:after="0" w:line="240" w:lineRule="auto"/>
+              <w:keepNext/>
+            </w:pPr>
+            <w:r>
+              <w:rPr>
+                <w:rFonts w:ascii="Times New Roman" w:hAnsi="Times New Roman"/>
+                <w:sz w:val="21"/>
+              </w:rPr>
+            </w:r>
+            <w:r>
+              <w:rPr>
+                <w:rFonts w:ascii="Times New Roman" w:hAnsi="Times New Roman"/>
+                <w:b w:val="0"/>
+                <w:sz w:val="21"/>
+              </w:rPr>
+              <w:t>B2 Decomposed LLM</w:t>
+            </w:r>
+          </w:p>
+        </w:tc>
+        <w:tc>
+          <w:tcPr>
+            <w:tcW w:type="dxa" w:w="2016"/>
+          </w:tcPr>
+          <w:p>
+            <w:pPr>
+              <w:spacing w:before="0" w:after="0" w:line="240" w:lineRule="auto"/>
+              <w:jc w:val="center"/>
+              <w:keepNext/>
+            </w:pPr>
+            <w:r>
+              <w:rPr>
+                <w:rFonts w:ascii="Times New Roman" w:hAnsi="Times New Roman"/>
+                <w:sz w:val="21"/>
+              </w:rPr>
+            </w:r>
+            <w:r>
+              <w:rPr>
+                <w:rFonts w:ascii="Times New Roman" w:hAnsi="Times New Roman"/>
+                <w:b w:val="0"/>
+                <w:sz w:val="21"/>
+              </w:rPr>
+              <w:t>19 of 107 (17.8%)</w:t>
+            </w:r>
+          </w:p>
+        </w:tc>
+        <w:tc>
+          <w:tcPr>
+            <w:tcW w:type="dxa" w:w="2088"/>
+          </w:tcPr>
+          <w:p>
+            <w:pPr>
+              <w:spacing w:before="0" w:after="0" w:line="240" w:lineRule="auto"/>
+              <w:jc w:val="center"/>
+              <w:keepNext/>
+            </w:pPr>
+            <w:r>
+              <w:rPr>
+                <w:rFonts w:ascii="Times New Roman" w:hAnsi="Times New Roman"/>
+                <w:sz w:val="21"/>
+              </w:rPr>
+            </w:r>
+            <w:r>
+              <w:rPr>
+                <w:rFonts w:ascii="Times New Roman" w:hAnsi="Times New Roman"/>
+                <w:b w:val="0"/>
+                <w:sz w:val="21"/>
+              </w:rPr>
+              <w:t>18 of 54 (33.3%)</w:t>
+            </w:r>
+          </w:p>
+        </w:tc>
+        <w:tc>
+          <w:tcPr>
+            <w:tcW w:type="dxa" w:w="2016"/>
+          </w:tcPr>
+          <w:p>
+            <w:pPr>
+              <w:spacing w:before="0" w:after="0" w:line="240" w:lineRule="auto"/>
+              <w:jc w:val="center"/>
+              <w:keepNext/>
+            </w:pPr>
+            <w:r>
+              <w:rPr>
+                <w:rFonts w:ascii="Times New Roman" w:hAnsi="Times New Roman"/>
+                <w:sz w:val="21"/>
+              </w:rPr>
+            </w:r>
+            <w:r>
+              <w:rPr>
+                <w:rFonts w:ascii="Times New Roman" w:hAnsi="Times New Roman"/>
+                <w:b w:val="0"/>
+                <w:sz w:val="21"/>
+              </w:rPr>
+              <w:t>0 of 52</w:t>
+            </w:r>
+          </w:p>
+        </w:tc>
+      </w:tr>
+      <w:tr>
+        <w:trPr>
+          <w:cantSplit/>
+        </w:trPr>
+        <w:tc>
+          <w:tcPr>
+            <w:tcW w:type="dxa" w:w="2520"/>
+          </w:tcPr>
+          <w:p>
+            <w:pPr>
+              <w:spacing w:before="0" w:after="0" w:line="240" w:lineRule="auto"/>
+              <w:keepNext/>
+            </w:pPr>
+            <w:r>
+              <w:rPr>
+                <w:rFonts w:ascii="Times New Roman" w:hAnsi="Times New Roman"/>
+                <w:sz w:val="21"/>
+              </w:rPr>
+            </w:r>
+            <w:r>
+              <w:rPr>
+                <w:rFonts w:ascii="Times New Roman" w:hAnsi="Times New Roman"/>
+                <w:b w:val="0"/>
+                <w:sz w:val="21"/>
+              </w:rPr>
+              <w:t>B3 Template-only</w:t>
+            </w:r>
+          </w:p>
+        </w:tc>
+        <w:tc>
+          <w:tcPr>
+            <w:tcW w:type="dxa" w:w="2016"/>
+          </w:tcPr>
+          <w:p>
+            <w:pPr>
+              <w:spacing w:before="0" w:after="0" w:line="240" w:lineRule="auto"/>
+              <w:jc w:val="center"/>
+              <w:keepNext/>
+            </w:pPr>
+            <w:r>
+              <w:rPr>
+                <w:rFonts w:ascii="Times New Roman" w:hAnsi="Times New Roman"/>
+                <w:sz w:val="21"/>
+              </w:rPr>
+            </w:r>
+            <w:r>
+              <w:rPr>
+                <w:rFonts w:ascii="Times New Roman" w:hAnsi="Times New Roman"/>
+                <w:b w:val="0"/>
+                <w:sz w:val="21"/>
+              </w:rPr>
+              <w:t>21 of 107 (19.6%)</w:t>
+            </w:r>
+          </w:p>
+        </w:tc>
+        <w:tc>
+          <w:tcPr>
+            <w:tcW w:type="dxa" w:w="2088"/>
+          </w:tcPr>
+          <w:p>
+            <w:pPr>
+              <w:spacing w:before="0" w:after="0" w:line="240" w:lineRule="auto"/>
+              <w:jc w:val="center"/>
+              <w:keepNext/>
+            </w:pPr>
+            <w:r>
+              <w:rPr>
+                <w:rFonts w:ascii="Times New Roman" w:hAnsi="Times New Roman"/>
+                <w:sz w:val="21"/>
+              </w:rPr>
+            </w:r>
+            <w:r>
+              <w:rPr>
+                <w:rFonts w:ascii="Times New Roman" w:hAnsi="Times New Roman"/>
+                <w:b w:val="0"/>
+                <w:sz w:val="21"/>
+              </w:rPr>
+              <w:t>21 of 54 (38.9%)</w:t>
+            </w:r>
+          </w:p>
+        </w:tc>
+        <w:tc>
+          <w:tcPr>
+            <w:tcW w:type="dxa" w:w="2016"/>
+          </w:tcPr>
+          <w:p>
+            <w:pPr>
+              <w:spacing w:before="0" w:after="0" w:line="240" w:lineRule="auto"/>
+              <w:jc w:val="center"/>
+              <w:keepNext/>
+            </w:pPr>
+            <w:r>
+              <w:rPr>
+                <w:rFonts w:ascii="Times New Roman" w:hAnsi="Times New Roman"/>
+                <w:sz w:val="21"/>
+              </w:rPr>
+            </w:r>
+            <w:r>
+              <w:rPr>
+                <w:rFonts w:ascii="Times New Roman" w:hAnsi="Times New Roman"/>
+                <w:b w:val="0"/>
+                <w:sz w:val="21"/>
+              </w:rPr>
+              <w:t>0 of 52</w:t>
+            </w:r>
+          </w:p>
+        </w:tc>
+      </w:tr>
+    </w:tbl>
+    <w:p>
+      <w:pPr>
+        <w:spacing w:after="80"/>
+      </w:pPr>
+    </w:p>
+    <w:p>
+      <w:pPr>
+        <w:spacing w:after="0" w:before="0" w:line="360" w:lineRule="auto"/>
+        <w:jc w:val="both"/>
+      </w:pPr>
+      <w:r>
+        <w:rPr>
+          <w:rFonts w:ascii="Times New Roman" w:hAnsi="Times New Roman"/>
+          <w:b w:val="0"/>
+          <w:i w:val="0"/>
+          <w:sz w:val="24"/>
+        </w:rPr>
+        <w:t>The annotation shows two findings. For answerable requests, AEGIS scored higher than the LLM-to-SQL and template-only baselines. For unsupported, vague, compound, or write-style requests, none of the evaluated systems handled the scope boundary correctly in this first pass. AEGIS still maintained SQL safety, but it often mapped unsupported requests to safe but semantically wrong in-scope queries. This is a correctness and robustness limitation, not a SQL-safety failure.</w:t>
+      </w:r>
+    </w:p>
+    <w:p>
+      <w:pPr>
+        <w:spacing w:before="320" w:after="160"/>
+        <w:jc w:val="left"/>
+      </w:pPr>
+      <w:r>
+        <w:rPr>
+          <w:rFonts w:ascii="Times New Roman" w:hAnsi="Times New Roman"/>
+          <w:b/>
+          <w:sz w:val="28"/>
+        </w:rPr>
+        <w:t>5.7  Baseline and Runtime Analysis</w:t>
+      </w:r>
+    </w:p>
+    <w:p>
+      <w:pPr>
+        <w:spacing w:after="200" w:before="0" w:line="360" w:lineRule="auto"/>
+        <w:jc w:val="both"/>
+      </w:pPr>
+      <w:r>
+        <w:rPr>
+          <w:rFonts w:ascii="Times New Roman" w:hAnsi="Times New Roman"/>
+          <w:b w:val="0"/>
+          <w:i w:val="0"/>
+          <w:sz w:val="24"/>
+        </w:rPr>
+        <w:t>The completed baselines show different failure modes. B1 and B2 rely on unconstrained LLM-written SQL and therefore suffer from dialect errors, missing tables, hallucinated columns, and unsafe write behavior. B3 removes the LLM and uses keyword templates, so it produces highly executable SQL but often misses the user's intended meaning.</w:t>
+      </w:r>
+    </w:p>
+    <w:p>
+      <w:pPr>
+        <w:spacing w:before="200" w:after="80"/>
+        <w:jc w:val="center"/>
+        <w:keepNext/>
+      </w:pPr>
+      <w:r>
+        <w:rPr>
+          <w:rFonts w:ascii="Times New Roman" w:hAnsi="Times New Roman"/>
+          <w:b/>
+          <w:sz w:val="22"/>
+        </w:rPr>
+        <w:t>Table 5.7: Completed baseline comparison.</w:t>
+      </w:r>
+    </w:p>
+    <w:tbl>
+      <w:tblPr>
+        <w:tblStyle w:val="TableGrid"/>
+        <w:tblW w:type="auto" w:w="0"/>
+        <w:jc w:val="center"/>
+        <w:tblLayout w:type="fixed"/>
+        <w:tblLook w:firstColumn="1" w:firstRow="1" w:lastColumn="0" w:lastRow="0" w:noHBand="0" w:noVBand="1" w:val="04A0"/>
+        <w:tblBorders>
+          <w:top w:val="single" w:sz="4" w:space="0" w:color="999999"/>
+          <w:left w:val="single" w:sz="4" w:space="0" w:color="999999"/>
+          <w:bottom w:val="single" w:sz="4" w:space="0" w:color="999999"/>
+          <w:right w:val="single" w:sz="4" w:space="0" w:color="999999"/>
+          <w:insideH w:val="single" w:sz="4" w:space="0" w:color="999999"/>
+          <w:insideV w:val="single" w:sz="4" w:space="0" w:color="999999"/>
+        </w:tblBorders>
+      </w:tblPr>
+      <w:tblGrid>
+        <w:gridCol w:w="2088"/>
+        <w:gridCol w:w="1800"/>
+        <w:gridCol w:w="1800"/>
+        <w:gridCol w:w="3240"/>
+      </w:tblGrid>
+      <w:tr>
+        <w:trPr>
+          <w:cantSplit/>
+        </w:trPr>
+        <w:tc>
+          <w:tcPr>
+            <w:tcW w:type="dxa" w:w="2256"/>
+          </w:tcPr>
+          <w:p>
+            <w:pPr>
+              <w:spacing w:before="0" w:after="0" w:line="240" w:lineRule="auto"/>
+              <w:jc w:val="center"/>
+              <w:keepNext/>
+            </w:pPr>
+            <w:r>
+              <w:rPr>
+                <w:rFonts w:ascii="Times New Roman" w:hAnsi="Times New Roman"/>
+                <w:b/>
+                <w:sz w:val="21"/>
+              </w:rPr>
+            </w:r>
+            <w:r>
+              <w:rPr>
+                <w:rFonts w:ascii="Times New Roman" w:hAnsi="Times New Roman"/>
+                <w:b/>
+                <w:sz w:val="21"/>
+              </w:rPr>
+              <w:t>System</w:t>
+            </w:r>
+          </w:p>
+        </w:tc>
+        <w:tc>
+          <w:tcPr>
+            <w:tcW w:type="dxa" w:w="2256"/>
+          </w:tcPr>
+          <w:p>
+            <w:pPr>
+              <w:spacing w:before="0" w:after="0" w:line="240" w:lineRule="auto"/>
+              <w:jc w:val="center"/>
+              <w:keepNext/>
+            </w:pPr>
+            <w:r>
+              <w:rPr>
+                <w:rFonts w:ascii="Times New Roman" w:hAnsi="Times New Roman"/>
+                <w:b/>
+                <w:sz w:val="21"/>
+              </w:rPr>
+            </w:r>
+            <w:r>
+              <w:rPr>
+                <w:rFonts w:ascii="Times New Roman" w:hAnsi="Times New Roman"/>
+                <w:b/>
+                <w:sz w:val="21"/>
+              </w:rPr>
+              <w:t>True execution validity</w:t>
+            </w:r>
+          </w:p>
+        </w:tc>
+        <w:tc>
+          <w:tcPr>
+            <w:tcW w:type="dxa" w:w="2256"/>
+          </w:tcPr>
+          <w:p>
+            <w:pPr>
+              <w:spacing w:before="0" w:after="0" w:line="240" w:lineRule="auto"/>
+              <w:jc w:val="center"/>
+              <w:keepNext/>
+            </w:pPr>
+            <w:r>
+              <w:rPr>
+                <w:rFonts w:ascii="Times New Roman" w:hAnsi="Times New Roman"/>
+                <w:b/>
+                <w:sz w:val="21"/>
+              </w:rPr>
+            </w:r>
+            <w:r>
+              <w:rPr>
+                <w:rFonts w:ascii="Times New Roman" w:hAnsi="Times New Roman"/>
+                <w:b/>
+                <w:sz w:val="21"/>
+              </w:rPr>
+              <w:t>Semantic correctness</w:t>
+            </w:r>
+          </w:p>
+        </w:tc>
+        <w:tc>
+          <w:tcPr>
+            <w:tcW w:type="dxa" w:w="2256"/>
+          </w:tcPr>
+          <w:p>
+            <w:pPr>
+              <w:spacing w:before="0" w:after="0" w:line="240" w:lineRule="auto"/>
+              <w:jc w:val="center"/>
+              <w:keepNext/>
+            </w:pPr>
+            <w:r>
+              <w:rPr>
+                <w:rFonts w:ascii="Times New Roman" w:hAnsi="Times New Roman"/>
+                <w:b/>
+                <w:sz w:val="21"/>
+              </w:rPr>
+            </w:r>
+            <w:r>
+              <w:rPr>
+                <w:rFonts w:ascii="Times New Roman" w:hAnsi="Times New Roman"/>
+                <w:b/>
+                <w:sz w:val="21"/>
+              </w:rPr>
+              <w:t>Main observation</w:t>
+            </w:r>
+          </w:p>
+        </w:tc>
+      </w:tr>
+      <w:tr>
+        <w:trPr>
+          <w:cantSplit/>
+        </w:trPr>
+        <w:tc>
+          <w:tcPr>
+            <w:tcW w:type="dxa" w:w="2088"/>
+          </w:tcPr>
+          <w:p>
+            <w:pPr>
+              <w:spacing w:before="0" w:after="0" w:line="240" w:lineRule="auto"/>
+              <w:keepNext/>
+            </w:pPr>
+            <w:r>
+              <w:rPr>
+                <w:rFonts w:ascii="Times New Roman" w:hAnsi="Times New Roman"/>
+                <w:sz w:val="21"/>
+              </w:rPr>
+            </w:r>
+            <w:r>
+              <w:rPr>
+                <w:rFonts w:ascii="Times New Roman" w:hAnsi="Times New Roman"/>
+                <w:b w:val="0"/>
+                <w:sz w:val="21"/>
+              </w:rPr>
+              <w:t>B1 Direct LLM-to-SQL</w:t>
+            </w:r>
+          </w:p>
+        </w:tc>
+        <w:tc>
+          <w:tcPr>
+            <w:tcW w:type="dxa" w:w="1800"/>
+          </w:tcPr>
+          <w:p>
+            <w:pPr>
+              <w:spacing w:before="0" w:after="0" w:line="240" w:lineRule="auto"/>
+              <w:jc w:val="center"/>
+              <w:keepNext/>
+            </w:pPr>
+            <w:r>
+              <w:rPr>
+                <w:rFonts w:ascii="Times New Roman" w:hAnsi="Times New Roman"/>
+                <w:sz w:val="21"/>
+              </w:rPr>
+            </w:r>
+            <w:r>
+              <w:rPr>
+                <w:rFonts w:ascii="Times New Roman" w:hAnsi="Times New Roman"/>
+                <w:b w:val="0"/>
+                <w:sz w:val="21"/>
+              </w:rPr>
+              <w:t>27 of 107 (25.2%)</w:t>
+            </w:r>
+          </w:p>
+        </w:tc>
+        <w:tc>
+          <w:tcPr>
+            <w:tcW w:type="dxa" w:w="1800"/>
+          </w:tcPr>
+          <w:p>
+            <w:pPr>
+              <w:spacing w:before="0" w:after="0" w:line="240" w:lineRule="auto"/>
+              <w:jc w:val="center"/>
+              <w:keepNext/>
+            </w:pPr>
+            <w:r>
+              <w:rPr>
+                <w:rFonts w:ascii="Times New Roman" w:hAnsi="Times New Roman"/>
+                <w:sz w:val="21"/>
+              </w:rPr>
+            </w:r>
+            <w:r>
+              <w:rPr>
+                <w:rFonts w:ascii="Times New Roman" w:hAnsi="Times New Roman"/>
+                <w:b w:val="0"/>
+                <w:sz w:val="21"/>
+              </w:rPr>
+              <w:t>16 of 107 (15.0%)</w:t>
+            </w:r>
+          </w:p>
+        </w:tc>
+        <w:tc>
+          <w:tcPr>
+            <w:tcW w:type="dxa" w:w="3240"/>
+          </w:tcPr>
+          <w:p>
+            <w:pPr>
+              <w:spacing w:before="0" w:after="0" w:line="240" w:lineRule="auto"/>
+              <w:jc w:val="center"/>
+              <w:keepNext/>
+            </w:pPr>
+            <w:r>
+              <w:rPr>
+                <w:rFonts w:ascii="Times New Roman" w:hAnsi="Times New Roman"/>
+                <w:sz w:val="21"/>
+              </w:rPr>
+            </w:r>
+            <w:r>
+              <w:rPr>
+                <w:rFonts w:ascii="Times New Roman" w:hAnsi="Times New Roman"/>
+                <w:b w:val="0"/>
+                <w:sz w:val="21"/>
+              </w:rPr>
+              <w:t>Lowest execution validity and one unsafe write statement.</w:t>
+            </w:r>
+          </w:p>
+        </w:tc>
+      </w:tr>
+      <w:tr>
+        <w:trPr>
+          <w:cantSplit/>
+        </w:trPr>
+        <w:tc>
+          <w:tcPr>
+            <w:tcW w:type="dxa" w:w="2088"/>
+          </w:tcPr>
+          <w:p>
+            <w:pPr>
+              <w:spacing w:before="0" w:after="0" w:line="240" w:lineRule="auto"/>
+              <w:keepNext/>
+            </w:pPr>
+            <w:r>
+              <w:rPr>
+                <w:rFonts w:ascii="Times New Roman" w:hAnsi="Times New Roman"/>
+                <w:sz w:val="21"/>
+              </w:rPr>
+            </w:r>
+            <w:r>
+              <w:rPr>
+                <w:rFonts w:ascii="Times New Roman" w:hAnsi="Times New Roman"/>
+                <w:b w:val="0"/>
+                <w:sz w:val="21"/>
+              </w:rPr>
+              <w:t>B2 Decomposed LLM</w:t>
+            </w:r>
+          </w:p>
+        </w:tc>
+        <w:tc>
+          <w:tcPr>
+            <w:tcW w:type="dxa" w:w="1800"/>
+          </w:tcPr>
+          <w:p>
+            <w:pPr>
+              <w:spacing w:before="0" w:after="0" w:line="240" w:lineRule="auto"/>
+              <w:jc w:val="center"/>
+              <w:keepNext/>
+            </w:pPr>
+            <w:r>
+              <w:rPr>
+                <w:rFonts w:ascii="Times New Roman" w:hAnsi="Times New Roman"/>
+                <w:sz w:val="21"/>
+              </w:rPr>
+            </w:r>
+            <w:r>
+              <w:rPr>
+                <w:rFonts w:ascii="Times New Roman" w:hAnsi="Times New Roman"/>
+                <w:b w:val="0"/>
+                <w:sz w:val="21"/>
+              </w:rPr>
+              <w:t>33 of 107 (30.8%)</w:t>
+            </w:r>
+          </w:p>
+        </w:tc>
+        <w:tc>
+          <w:tcPr>
+            <w:tcW w:type="dxa" w:w="1800"/>
+          </w:tcPr>
+          <w:p>
+            <w:pPr>
+              <w:spacing w:before="0" w:after="0" w:line="240" w:lineRule="auto"/>
+              <w:jc w:val="center"/>
+              <w:keepNext/>
+            </w:pPr>
+            <w:r>
+              <w:rPr>
+                <w:rFonts w:ascii="Times New Roman" w:hAnsi="Times New Roman"/>
+                <w:sz w:val="21"/>
+              </w:rPr>
+            </w:r>
+            <w:r>
+              <w:rPr>
+                <w:rFonts w:ascii="Times New Roman" w:hAnsi="Times New Roman"/>
+                <w:b w:val="0"/>
+                <w:sz w:val="21"/>
+              </w:rPr>
+              <w:t>19 of 107 (17.8%)</w:t>
+            </w:r>
+          </w:p>
+        </w:tc>
+        <w:tc>
+          <w:tcPr>
+            <w:tcW w:type="dxa" w:w="3240"/>
+          </w:tcPr>
+          <w:p>
+            <w:pPr>
+              <w:spacing w:before="0" w:after="0" w:line="240" w:lineRule="auto"/>
+              <w:jc w:val="center"/>
+              <w:keepNext/>
+            </w:pPr>
+            <w:r>
+              <w:rPr>
+                <w:rFonts w:ascii="Times New Roman" w:hAnsi="Times New Roman"/>
+                <w:sz w:val="21"/>
+              </w:rPr>
+            </w:r>
+            <w:r>
+              <w:rPr>
+                <w:rFonts w:ascii="Times New Roman" w:hAnsi="Times New Roman"/>
+                <w:b w:val="0"/>
+                <w:sz w:val="21"/>
+              </w:rPr>
+              <w:t>Two-step prompting improved execution slightly but did not solve schema errors.</w:t>
+            </w:r>
+          </w:p>
+        </w:tc>
+      </w:tr>
+      <w:tr>
+        <w:trPr>
+          <w:cantSplit/>
+        </w:trPr>
+        <w:tc>
+          <w:tcPr>
+            <w:tcW w:type="dxa" w:w="2088"/>
+          </w:tcPr>
+          <w:p>
+            <w:pPr>
+              <w:spacing w:before="0" w:after="0" w:line="240" w:lineRule="auto"/>
+              <w:keepNext/>
+            </w:pPr>
+            <w:r>
+              <w:rPr>
+                <w:rFonts w:ascii="Times New Roman" w:hAnsi="Times New Roman"/>
+                <w:sz w:val="21"/>
+              </w:rPr>
+            </w:r>
+            <w:r>
+              <w:rPr>
+                <w:rFonts w:ascii="Times New Roman" w:hAnsi="Times New Roman"/>
+                <w:b w:val="0"/>
+                <w:sz w:val="21"/>
+              </w:rPr>
+              <w:t>B3 Template-only</w:t>
+            </w:r>
+          </w:p>
+        </w:tc>
+        <w:tc>
+          <w:tcPr>
+            <w:tcW w:type="dxa" w:w="1800"/>
+          </w:tcPr>
+          <w:p>
+            <w:pPr>
+              <w:spacing w:before="0" w:after="0" w:line="240" w:lineRule="auto"/>
+              <w:jc w:val="center"/>
+              <w:keepNext/>
+            </w:pPr>
+            <w:r>
+              <w:rPr>
+                <w:rFonts w:ascii="Times New Roman" w:hAnsi="Times New Roman"/>
+                <w:sz w:val="21"/>
+              </w:rPr>
+            </w:r>
+            <w:r>
+              <w:rPr>
+                <w:rFonts w:ascii="Times New Roman" w:hAnsi="Times New Roman"/>
+                <w:b w:val="0"/>
+                <w:sz w:val="21"/>
+              </w:rPr>
+              <w:t>104 of 107 (97.2%)</w:t>
+            </w:r>
+          </w:p>
+        </w:tc>
+        <w:tc>
+          <w:tcPr>
+            <w:tcW w:type="dxa" w:w="1800"/>
+          </w:tcPr>
+          <w:p>
+            <w:pPr>
+              <w:spacing w:before="0" w:after="0" w:line="240" w:lineRule="auto"/>
+              <w:jc w:val="center"/>
+              <w:keepNext/>
+            </w:pPr>
+            <w:r>
+              <w:rPr>
+                <w:rFonts w:ascii="Times New Roman" w:hAnsi="Times New Roman"/>
+                <w:sz w:val="21"/>
+              </w:rPr>
+            </w:r>
+            <w:r>
+              <w:rPr>
+                <w:rFonts w:ascii="Times New Roman" w:hAnsi="Times New Roman"/>
+                <w:b w:val="0"/>
+                <w:sz w:val="21"/>
+              </w:rPr>
+              <w:t>21 of 107 (19.6%)</w:t>
+            </w:r>
+          </w:p>
+        </w:tc>
+        <w:tc>
+          <w:tcPr>
+            <w:tcW w:type="dxa" w:w="3240"/>
+          </w:tcPr>
+          <w:p>
+            <w:pPr>
+              <w:spacing w:before="0" w:after="0" w:line="240" w:lineRule="auto"/>
+              <w:jc w:val="center"/>
+              <w:keepNext/>
+            </w:pPr>
+            <w:r>
+              <w:rPr>
+                <w:rFonts w:ascii="Times New Roman" w:hAnsi="Times New Roman"/>
+                <w:sz w:val="21"/>
+              </w:rPr>
+            </w:r>
+            <w:r>
+              <w:rPr>
+                <w:rFonts w:ascii="Times New Roman" w:hAnsi="Times New Roman"/>
+                <w:b w:val="0"/>
+                <w:sz w:val="21"/>
+              </w:rPr>
+              <w:t>SQL often runs, but keyword intent selection is semantically brittle.</w:t>
+            </w:r>
+          </w:p>
+        </w:tc>
+      </w:tr>
+      <w:tr>
+        <w:trPr>
+          <w:cantSplit/>
+        </w:trPr>
+        <w:tc>
+          <w:tcPr>
+            <w:tcW w:type="dxa" w:w="2088"/>
+          </w:tcPr>
+          <w:p>
+            <w:pPr>
+              <w:spacing w:before="0" w:after="0" w:line="240" w:lineRule="auto"/>
+              <w:keepNext/>
+            </w:pPr>
+            <w:r>
+              <w:rPr>
+                <w:rFonts w:ascii="Times New Roman" w:hAnsi="Times New Roman"/>
+                <w:sz w:val="21"/>
+              </w:rPr>
+            </w:r>
+            <w:r>
+              <w:rPr>
+                <w:rFonts w:ascii="Times New Roman" w:hAnsi="Times New Roman"/>
+                <w:b w:val="0"/>
+                <w:sz w:val="21"/>
+              </w:rPr>
+              <w:t>AEGIS</w:t>
+            </w:r>
+          </w:p>
+        </w:tc>
+        <w:tc>
+          <w:tcPr>
+            <w:tcW w:type="dxa" w:w="1800"/>
+          </w:tcPr>
+          <w:p>
+            <w:pPr>
+              <w:spacing w:before="0" w:after="0" w:line="240" w:lineRule="auto"/>
+              <w:jc w:val="center"/>
+              <w:keepNext/>
+            </w:pPr>
+            <w:r>
+              <w:rPr>
+                <w:rFonts w:ascii="Times New Roman" w:hAnsi="Times New Roman"/>
+                <w:sz w:val="21"/>
+              </w:rPr>
+            </w:r>
+            <w:r>
+              <w:rPr>
+                <w:rFonts w:ascii="Times New Roman" w:hAnsi="Times New Roman"/>
+                <w:b w:val="0"/>
+                <w:sz w:val="21"/>
+              </w:rPr>
+              <w:t>100 of 107 (93.5%)</w:t>
+            </w:r>
+          </w:p>
+        </w:tc>
+        <w:tc>
+          <w:tcPr>
+            <w:tcW w:type="dxa" w:w="1800"/>
+          </w:tcPr>
+          <w:p>
+            <w:pPr>
+              <w:spacing w:before="0" w:after="0" w:line="240" w:lineRule="auto"/>
+              <w:jc w:val="center"/>
+              <w:keepNext/>
+            </w:pPr>
+            <w:r>
+              <w:rPr>
+                <w:rFonts w:ascii="Times New Roman" w:hAnsi="Times New Roman"/>
+                <w:sz w:val="21"/>
+              </w:rPr>
+            </w:r>
+            <w:r>
+              <w:rPr>
+                <w:rFonts w:ascii="Times New Roman" w:hAnsi="Times New Roman"/>
+                <w:b w:val="0"/>
+                <w:sz w:val="21"/>
+              </w:rPr>
+              <w:t>32 of 107 (29.9%)</w:t>
+            </w:r>
+          </w:p>
+        </w:tc>
+        <w:tc>
+          <w:tcPr>
+            <w:tcW w:type="dxa" w:w="3240"/>
+          </w:tcPr>
+          <w:p>
+            <w:pPr>
+              <w:spacing w:before="0" w:after="0" w:line="240" w:lineRule="auto"/>
+              <w:jc w:val="center"/>
+              <w:keepNext/>
+            </w:pPr>
+            <w:r>
+              <w:rPr>
+                <w:rFonts w:ascii="Times New Roman" w:hAnsi="Times New Roman"/>
+                <w:sz w:val="21"/>
+              </w:rPr>
+            </w:r>
+            <w:r>
+              <w:rPr>
+                <w:rFonts w:ascii="Times New Roman" w:hAnsi="Times New Roman"/>
+                <w:b w:val="0"/>
+                <w:sz w:val="21"/>
+              </w:rPr>
+              <w:t>Best correctness among evaluated systems while preserving SQL safety.</w:t>
+            </w:r>
+          </w:p>
+        </w:tc>
+      </w:tr>
+    </w:tbl>
+    <w:p>
+      <w:pPr>
+        <w:spacing w:after="80"/>
+      </w:pPr>
+    </w:p>
+    <w:p>
+      <w:pPr>
+        <w:spacing w:before="200" w:after="80"/>
+        <w:jc w:val="center"/>
+        <w:keepNext/>
+      </w:pPr>
+      <w:r>
+        <w:rPr>
+          <w:rFonts w:ascii="Times New Roman" w:hAnsi="Times New Roman"/>
+          <w:b/>
+          <w:sz w:val="22"/>
+        </w:rPr>
+        <w:t>Table 5.8: Runtime evidence from benchmark replay and live LLM gateway.</w:t>
+      </w:r>
+    </w:p>
+    <w:tbl>
+      <w:tblPr>
+        <w:tblStyle w:val="TableGrid"/>
+        <w:tblW w:type="auto" w:w="0"/>
+        <w:jc w:val="center"/>
+        <w:tblLayout w:type="fixed"/>
+        <w:tblLook w:firstColumn="1" w:firstRow="1" w:lastColumn="0" w:lastRow="0" w:noHBand="0" w:noVBand="1" w:val="04A0"/>
+        <w:tblBorders>
+          <w:top w:val="single" w:sz="4" w:space="0" w:color="999999"/>
+          <w:left w:val="single" w:sz="4" w:space="0" w:color="999999"/>
+          <w:bottom w:val="single" w:sz="4" w:space="0" w:color="999999"/>
+          <w:right w:val="single" w:sz="4" w:space="0" w:color="999999"/>
+          <w:insideH w:val="single" w:sz="4" w:space="0" w:color="999999"/>
+          <w:insideV w:val="single" w:sz="4" w:space="0" w:color="999999"/>
+        </w:tblBorders>
+      </w:tblPr>
+      <w:tblGrid>
+        <w:gridCol w:w="2088"/>
+        <w:gridCol w:w="2736"/>
+        <w:gridCol w:w="4104"/>
+      </w:tblGrid>
+      <w:tr>
+        <w:trPr>
+          <w:cantSplit/>
+        </w:trPr>
+        <w:tc>
+          <w:tcPr>
+            <w:tcW w:type="dxa" w:w="3009"/>
+          </w:tcPr>
+          <w:p>
+            <w:pPr>
+              <w:spacing w:before="0" w:after="0" w:line="240" w:lineRule="auto"/>
+              <w:jc w:val="center"/>
+              <w:keepNext/>
+            </w:pPr>
+            <w:r>
+              <w:rPr>
+                <w:rFonts w:ascii="Times New Roman" w:hAnsi="Times New Roman"/>
+                <w:b/>
+                <w:sz w:val="21"/>
+              </w:rPr>
+            </w:r>
+            <w:r>
+              <w:rPr>
+                <w:rFonts w:ascii="Times New Roman" w:hAnsi="Times New Roman"/>
+                <w:b/>
+                <w:sz w:val="21"/>
+              </w:rPr>
+              <w:t>Measurement</w:t>
+            </w:r>
+          </w:p>
+        </w:tc>
+        <w:tc>
+          <w:tcPr>
+            <w:tcW w:type="dxa" w:w="3009"/>
+          </w:tcPr>
+          <w:p>
+            <w:pPr>
+              <w:spacing w:before="0" w:after="0" w:line="240" w:lineRule="auto"/>
+              <w:jc w:val="center"/>
+              <w:keepNext/>
+            </w:pPr>
+            <w:r>
+              <w:rPr>
+                <w:rFonts w:ascii="Times New Roman" w:hAnsi="Times New Roman"/>
+                <w:b/>
+                <w:sz w:val="21"/>
+              </w:rPr>
+            </w:r>
+            <w:r>
+              <w:rPr>
+                <w:rFonts w:ascii="Times New Roman" w:hAnsi="Times New Roman"/>
+                <w:b/>
+                <w:sz w:val="21"/>
+              </w:rPr>
+              <w:t>Observed result</w:t>
+            </w:r>
+          </w:p>
+        </w:tc>
+        <w:tc>
+          <w:tcPr>
+            <w:tcW w:type="dxa" w:w="3009"/>
+          </w:tcPr>
+          <w:p>
+            <w:pPr>
+              <w:spacing w:before="0" w:after="0" w:line="240" w:lineRule="auto"/>
+              <w:jc w:val="center"/>
+              <w:keepNext/>
+            </w:pPr>
+            <w:r>
+              <w:rPr>
+                <w:rFonts w:ascii="Times New Roman" w:hAnsi="Times New Roman"/>
+                <w:b/>
+                <w:sz w:val="21"/>
+              </w:rPr>
+            </w:r>
+            <w:r>
+              <w:rPr>
+                <w:rFonts w:ascii="Times New Roman" w:hAnsi="Times New Roman"/>
+                <w:b/>
+                <w:sz w:val="21"/>
+              </w:rPr>
+              <w:t>Interpretation</w:t>
+            </w:r>
+          </w:p>
+        </w:tc>
+      </w:tr>
+      <w:tr>
+        <w:trPr>
+          <w:cantSplit/>
+        </w:trPr>
+        <w:tc>
+          <w:tcPr>
+            <w:tcW w:type="dxa" w:w="2088"/>
+          </w:tcPr>
+          <w:p>
+            <w:pPr>
+              <w:spacing w:before="0" w:after="0" w:line="240" w:lineRule="auto"/>
+              <w:keepNext/>
+            </w:pPr>
+            <w:r>
+              <w:rPr>
+                <w:rFonts w:ascii="Times New Roman" w:hAnsi="Times New Roman"/>
+                <w:sz w:val="21"/>
+              </w:rPr>
+            </w:r>
+            <w:r>
+              <w:rPr>
+                <w:rFonts w:ascii="Times New Roman" w:hAnsi="Times New Roman"/>
+                <w:b w:val="0"/>
+                <w:sz w:val="21"/>
+              </w:rPr>
+              <w:t>AEGIS SQL replay</w:t>
+            </w:r>
+          </w:p>
+        </w:tc>
+        <w:tc>
+          <w:tcPr>
+            <w:tcW w:type="dxa" w:w="2736"/>
+          </w:tcPr>
+          <w:p>
+            <w:pPr>
+              <w:spacing w:before="0" w:after="0" w:line="240" w:lineRule="auto"/>
+              <w:jc w:val="center"/>
+              <w:keepNext/>
+            </w:pPr>
+            <w:r>
+              <w:rPr>
+                <w:rFonts w:ascii="Times New Roman" w:hAnsi="Times New Roman"/>
+                <w:sz w:val="21"/>
+              </w:rPr>
+            </w:r>
+            <w:r>
+              <w:rPr>
+                <w:rFonts w:ascii="Times New Roman" w:hAnsi="Times New Roman"/>
+                <w:b w:val="0"/>
+                <w:sz w:val="21"/>
+              </w:rPr>
+              <w:t>Mean 13.22 ms; median 2.59 ms; p95 72.55 ms</w:t>
+            </w:r>
+          </w:p>
+        </w:tc>
+        <w:tc>
+          <w:tcPr>
+            <w:tcW w:type="dxa" w:w="4104"/>
+          </w:tcPr>
+          <w:p>
+            <w:pPr>
+              <w:spacing w:before="0" w:after="0" w:line="240" w:lineRule="auto"/>
+              <w:jc w:val="center"/>
+              <w:keepNext/>
+            </w:pPr>
+            <w:r>
+              <w:rPr>
+                <w:rFonts w:ascii="Times New Roman" w:hAnsi="Times New Roman"/>
+                <w:sz w:val="21"/>
+              </w:rPr>
+            </w:r>
+            <w:r>
+              <w:rPr>
+                <w:rFonts w:ascii="Times New Roman" w:hAnsi="Times New Roman"/>
+                <w:b w:val="0"/>
+                <w:sz w:val="21"/>
+              </w:rPr>
+              <w:t>Database execution and deterministic post-LLM stages are fast.</w:t>
+            </w:r>
+          </w:p>
+        </w:tc>
+      </w:tr>
+      <w:tr>
+        <w:trPr>
+          <w:cantSplit/>
+        </w:trPr>
+        <w:tc>
+          <w:tcPr>
+            <w:tcW w:type="dxa" w:w="2088"/>
+          </w:tcPr>
+          <w:p>
+            <w:pPr>
+              <w:spacing w:before="0" w:after="0" w:line="240" w:lineRule="auto"/>
+              <w:keepNext/>
+            </w:pPr>
+            <w:r>
+              <w:rPr>
+                <w:rFonts w:ascii="Times New Roman" w:hAnsi="Times New Roman"/>
+                <w:sz w:val="21"/>
+              </w:rPr>
+            </w:r>
+            <w:r>
+              <w:rPr>
+                <w:rFonts w:ascii="Times New Roman" w:hAnsi="Times New Roman"/>
+                <w:b w:val="0"/>
+                <w:sz w:val="21"/>
+              </w:rPr>
+              <w:t>B2 SQL replay</w:t>
+            </w:r>
+          </w:p>
+        </w:tc>
+        <w:tc>
+          <w:tcPr>
+            <w:tcW w:type="dxa" w:w="2736"/>
+          </w:tcPr>
+          <w:p>
+            <w:pPr>
+              <w:spacing w:before="0" w:after="0" w:line="240" w:lineRule="auto"/>
+              <w:jc w:val="center"/>
+              <w:keepNext/>
+            </w:pPr>
+            <w:r>
+              <w:rPr>
+                <w:rFonts w:ascii="Times New Roman" w:hAnsi="Times New Roman"/>
+                <w:sz w:val="21"/>
+              </w:rPr>
+            </w:r>
+            <w:r>
+              <w:rPr>
+                <w:rFonts w:ascii="Times New Roman" w:hAnsi="Times New Roman"/>
+                <w:b w:val="0"/>
+                <w:sz w:val="21"/>
+              </w:rPr>
+              <w:t>Mean 6.88 ms; median 0.74 ms; p95 28.55 ms</w:t>
+            </w:r>
+          </w:p>
+        </w:tc>
+        <w:tc>
+          <w:tcPr>
+            <w:tcW w:type="dxa" w:w="4104"/>
+          </w:tcPr>
+          <w:p>
+            <w:pPr>
+              <w:spacing w:before="0" w:after="0" w:line="240" w:lineRule="auto"/>
+              <w:jc w:val="center"/>
+              <w:keepNext/>
+            </w:pPr>
+            <w:r>
+              <w:rPr>
+                <w:rFonts w:ascii="Times New Roman" w:hAnsi="Times New Roman"/>
+                <w:sz w:val="21"/>
+              </w:rPr>
+            </w:r>
+            <w:r>
+              <w:rPr>
+                <w:rFonts w:ascii="Times New Roman" w:hAnsi="Times New Roman"/>
+                <w:b w:val="0"/>
+                <w:sz w:val="21"/>
+              </w:rPr>
+              <w:t>SQL execution time is small compared with LLM response time.</w:t>
+            </w:r>
+          </w:p>
+        </w:tc>
+      </w:tr>
+      <w:tr>
+        <w:trPr>
+          <w:cantSplit/>
+        </w:trPr>
+        <w:tc>
+          <w:tcPr>
+            <w:tcW w:type="dxa" w:w="2088"/>
+          </w:tcPr>
+          <w:p>
+            <w:pPr>
+              <w:spacing w:before="0" w:after="0" w:line="240" w:lineRule="auto"/>
+              <w:keepNext/>
+            </w:pPr>
+            <w:r>
+              <w:rPr>
+                <w:rFonts w:ascii="Times New Roman" w:hAnsi="Times New Roman"/>
+                <w:sz w:val="21"/>
+              </w:rPr>
+            </w:r>
+            <w:r>
+              <w:rPr>
+                <w:rFonts w:ascii="Times New Roman" w:hAnsi="Times New Roman"/>
+                <w:b w:val="0"/>
+                <w:sz w:val="21"/>
+              </w:rPr>
+              <w:t>B3 pipeline replay</w:t>
+            </w:r>
+          </w:p>
+        </w:tc>
+        <w:tc>
+          <w:tcPr>
+            <w:tcW w:type="dxa" w:w="2736"/>
+          </w:tcPr>
+          <w:p>
+            <w:pPr>
+              <w:spacing w:before="0" w:after="0" w:line="240" w:lineRule="auto"/>
+              <w:jc w:val="center"/>
+              <w:keepNext/>
+            </w:pPr>
+            <w:r>
+              <w:rPr>
+                <w:rFonts w:ascii="Times New Roman" w:hAnsi="Times New Roman"/>
+                <w:sz w:val="21"/>
+              </w:rPr>
+            </w:r>
+            <w:r>
+              <w:rPr>
+                <w:rFonts w:ascii="Times New Roman" w:hAnsi="Times New Roman"/>
+                <w:b w:val="0"/>
+                <w:sz w:val="21"/>
+              </w:rPr>
+              <w:t>Mean 13.66 ms; median 3.80 ms; p95 59.17 ms</w:t>
+            </w:r>
+          </w:p>
+        </w:tc>
+        <w:tc>
+          <w:tcPr>
+            <w:tcW w:type="dxa" w:w="4104"/>
+          </w:tcPr>
+          <w:p>
+            <w:pPr>
+              <w:spacing w:before="0" w:after="0" w:line="240" w:lineRule="auto"/>
+              <w:jc w:val="center"/>
+              <w:keepNext/>
+            </w:pPr>
+            <w:r>
+              <w:rPr>
+                <w:rFonts w:ascii="Times New Roman" w:hAnsi="Times New Roman"/>
+                <w:sz w:val="21"/>
+              </w:rPr>
+            </w:r>
+            <w:r>
+              <w:rPr>
+                <w:rFonts w:ascii="Times New Roman" w:hAnsi="Times New Roman"/>
+                <w:b w:val="0"/>
+                <w:sz w:val="21"/>
+              </w:rPr>
+              <w:t>Template-only classification, mapping, compilation, and execution are lightweight.</w:t>
+            </w:r>
+          </w:p>
+        </w:tc>
+      </w:tr>
+      <w:tr>
+        <w:trPr>
+          <w:cantSplit/>
+        </w:trPr>
+        <w:tc>
+          <w:tcPr>
+            <w:tcW w:type="dxa" w:w="2088"/>
+          </w:tcPr>
+          <w:p>
+            <w:pPr>
+              <w:spacing w:before="0" w:after="0" w:line="240" w:lineRule="auto"/>
+              <w:keepNext/>
+            </w:pPr>
+            <w:r>
+              <w:rPr>
+                <w:rFonts w:ascii="Times New Roman" w:hAnsi="Times New Roman"/>
+                <w:sz w:val="21"/>
+              </w:rPr>
+            </w:r>
+            <w:r>
+              <w:rPr>
+                <w:rFonts w:ascii="Times New Roman" w:hAnsi="Times New Roman"/>
+                <w:b w:val="0"/>
+                <w:sz w:val="21"/>
+              </w:rPr>
+              <w:t>Live LLM response</w:t>
+            </w:r>
+          </w:p>
+        </w:tc>
+        <w:tc>
+          <w:tcPr>
+            <w:tcW w:type="dxa" w:w="2736"/>
+          </w:tcPr>
+          <w:p>
+            <w:pPr>
+              <w:spacing w:before="0" w:after="0" w:line="240" w:lineRule="auto"/>
+              <w:jc w:val="center"/>
+              <w:keepNext/>
+            </w:pPr>
+            <w:r>
+              <w:rPr>
+                <w:rFonts w:ascii="Times New Roman" w:hAnsi="Times New Roman"/>
+                <w:sz w:val="21"/>
+              </w:rPr>
+            </w:r>
+            <w:r>
+              <w:rPr>
+                <w:rFonts w:ascii="Times New Roman" w:hAnsi="Times New Roman"/>
+                <w:b w:val="0"/>
+                <w:sz w:val="21"/>
+              </w:rPr>
+              <w:t>Observed around 12-30 seconds per request in the gateway screenshot</w:t>
+            </w:r>
+          </w:p>
+        </w:tc>
+        <w:tc>
+          <w:tcPr>
+            <w:tcW w:type="dxa" w:w="4104"/>
+          </w:tcPr>
+          <w:p>
+            <w:pPr>
+              <w:spacing w:before="0" w:after="0" w:line="240" w:lineRule="auto"/>
+              <w:jc w:val="center"/>
+              <w:keepNext/>
+            </w:pPr>
+            <w:r>
+              <w:rPr>
+                <w:rFonts w:ascii="Times New Roman" w:hAnsi="Times New Roman"/>
+                <w:sz w:val="21"/>
+              </w:rPr>
+            </w:r>
+            <w:r>
+              <w:rPr>
+                <w:rFonts w:ascii="Times New Roman" w:hAnsi="Times New Roman"/>
+                <w:b w:val="0"/>
+                <w:sz w:val="21"/>
+              </w:rPr>
+              <w:t>User-visible runtime is dominated by model response duration.</w:t>
+            </w:r>
+          </w:p>
+        </w:tc>
+      </w:tr>
+    </w:tbl>
+    <w:p>
+      <w:pPr>
+        <w:spacing w:after="80"/>
+      </w:pPr>
+    </w:p>
+    <w:p>
+      <w:pPr>
+        <w:spacing w:after="0" w:before="0" w:line="360" w:lineRule="auto"/>
+        <w:jc w:val="both"/>
+      </w:pPr>
+      <w:r>
+        <w:rPr>
+          <w:rFonts w:ascii="Times New Roman" w:hAnsi="Times New Roman"/>
+          <w:b w:val="0"/>
+          <w:i w:val="0"/>
+          <w:sz w:val="24"/>
+        </w:rPr>
+        <w:t>The runtime results show why end-to-end latency must be discussed separately from SQL execution time. Once the intent or SQL text exists, database replay takes milliseconds. The visible delay comes mainly from LLM calls. B2 is especially costly because each benchmark request uses two model calls: one for reasoning and one for SQL generation.</w:t>
+      </w:r>
+    </w:p>
+    <w:p>
+      <w:pPr>
+        <w:spacing w:before="320" w:after="160"/>
+        <w:jc w:val="left"/>
+      </w:pPr>
+      <w:r>
+        <w:rPr>
+          <w:rFonts w:ascii="Times New Roman" w:hAnsi="Times New Roman"/>
+          <w:b/>
+          <w:sz w:val="28"/>
+        </w:rPr>
+        <w:t>5.8  Comparative Discussion and Robustness</w:t>
+      </w:r>
+    </w:p>
+    <w:p>
+      <w:pPr>
+        <w:spacing w:before="200" w:after="160"/>
+        <w:jc w:val="left"/>
+      </w:pPr>
+      <w:r>
+        <w:rPr>
+          <w:rFonts w:ascii="Times New Roman" w:hAnsi="Times New Roman"/>
+          <w:b/>
+          <w:sz w:val="25"/>
+        </w:rPr>
+        <w:t>5.8.1  AEGIS vs. Direct LLM-to-SQL</w:t>
+      </w:r>
+    </w:p>
+    <w:p>
+      <w:pPr>
+        <w:spacing w:after="200" w:before="0" w:line="360" w:lineRule="auto"/>
+        <w:jc w:val="both"/>
+      </w:pPr>
+      <w:r>
+        <w:rPr>
+          <w:rFonts w:ascii="Times New Roman" w:hAnsi="Times New Roman"/>
+          <w:b w:val="0"/>
+          <w:i w:val="0"/>
+          <w:sz w:val="24"/>
+        </w:rPr>
+        <w:t>The B1 baseline exposes the central risk of direct SQL generation. The same model that can produce useful analytical SQL can also hallucinate schema objects, mix SQL dialects, and generate a real write statement when a business-looking request implies a write operation. AEGIS narrows the model's role to intent extraction, so these risks do not enter the SQL construction stage in the same way.</w:t>
+      </w:r>
+    </w:p>
+    <w:p>
+      <w:pPr>
+        <w:spacing w:before="200" w:after="80"/>
+        <w:jc w:val="center"/>
+        <w:keepNext/>
+      </w:pPr>
+      <w:r>
+        <w:rPr>
+          <w:rFonts w:ascii="Times New Roman" w:hAnsi="Times New Roman"/>
+          <w:b/>
+          <w:sz w:val="22"/>
+        </w:rPr>
+        <w:t>Table 5.9: Structural comparison of AEGIS vs. direct LLM-to-SQL.</w:t>
       </w:r>
     </w:p>
     <w:tbl>
@@ -16736,7 +18726,7 @@
                 <w:b/>
                 <w:sz w:val="21"/>
               </w:rPr>
-              <w:t>Metric</w:t>
+              <w:t>Property</w:t>
             </w:r>
           </w:p>
         </w:tc>
@@ -16763,7 +18753,7 @@
                 <w:b/>
                 <w:sz w:val="21"/>
               </w:rPr>
-              <w:t>What it answers</w:t>
+              <w:t>Direct LLM-to-SQL</w:t>
             </w:r>
           </w:p>
         </w:tc>
@@ -16790,7 +18780,7 @@
                 <w:b/>
                 <w:sz w:val="21"/>
               </w:rPr>
-              <w:t>Current status</w:t>
+              <w:t>AEGIS</w:t>
             </w:r>
           </w:p>
         </w:tc>
@@ -16820,7 +18810,7 @@
                 <w:b w:val="0"/>
                 <w:sz w:val="21"/>
               </w:rPr>
-              <w:t>SQL safety</w:t>
+              <w:t>SQL generation</w:t>
             </w:r>
           </w:p>
         </w:tc>
@@ -16846,7 +18836,7 @@
                 <w:b w:val="0"/>
                 <w:sz w:val="21"/>
               </w:rPr>
-              <w:t>Did the generated SQL avoid unsafe write or schema-changing behavior?</w:t>
+              <w:t>Model-generated free-form text</w:t>
             </w:r>
           </w:p>
         </w:tc>
@@ -16872,7 +18862,7 @@
                 <w:b w:val="0"/>
                 <w:sz w:val="21"/>
               </w:rPr>
-              <w:t>Verified for B1 and AEGIS on all 107 requests.</w:t>
+              <w:t>Deterministic compiler</w:t>
             </w:r>
           </w:p>
         </w:tc>
@@ -16902,7 +18892,7 @@
                 <w:b w:val="0"/>
                 <w:sz w:val="21"/>
               </w:rPr>
-              <w:t>True execution validity</w:t>
+              <w:t>Schema exposure to LLM</w:t>
             </w:r>
           </w:p>
         </w:tc>
@@ -16928,7 +18918,7 @@
                 <w:b w:val="0"/>
                 <w:sz w:val="21"/>
               </w:rPr>
-              <w:t>Did the generated SQL run against the seeded MySQL database?</w:t>
+              <w:t>Requires tables, columns, and relationships</w:t>
             </w:r>
           </w:p>
         </w:tc>
@@ -16954,7 +18944,7 @@
                 <w:b w:val="0"/>
                 <w:sz w:val="21"/>
               </w:rPr>
-              <w:t>Verified for B1, AEGIS, and B3.</w:t>
+              <w:t>Uses approved business labels</w:t>
             </w:r>
           </w:p>
         </w:tc>
@@ -16984,7 +18974,7 @@
                 <w:b w:val="0"/>
                 <w:sz w:val="21"/>
               </w:rPr>
-              <w:t>Semantic correctness / accuracy</w:t>
+              <w:t>Business metric definitions</w:t>
             </w:r>
           </w:p>
         </w:tc>
@@ -17010,7 +19000,7 @@
                 <w:b w:val="0"/>
                 <w:sz w:val="21"/>
               </w:rPr>
-              <w:t>Did the answer match the user's intended reporting need?</w:t>
+              <w:t>Inferred from prompt and schema names</w:t>
             </w:r>
           </w:p>
         </w:tc>
@@ -17036,7 +19026,7 @@
                 <w:b w:val="0"/>
                 <w:sz w:val="21"/>
               </w:rPr>
-              <w:t>Not yet numerically scored; requires annotated expected outputs or labels.</w:t>
+              <w:t>Defined in the semantic layer</w:t>
             </w:r>
           </w:p>
         </w:tc>
@@ -17066,7 +19056,7 @@
                 <w:b w:val="0"/>
                 <w:sz w:val="21"/>
               </w:rPr>
-              <w:t>Scope handling</w:t>
+              <w:t>SQL injection prevention</w:t>
             </w:r>
           </w:p>
         </w:tc>
@@ -17092,7 +19082,7 @@
                 <w:b w:val="0"/>
                 <w:sz w:val="21"/>
               </w:rPr>
-              <w:t>Did the system clarify or reject unsupported requests instead of guessing?</w:t>
+              <w:t>Prompt-level instruction and post-checking</w:t>
             </w:r>
           </w:p>
         </w:tc>
@@ -17118,7 +19108,7 @@
                 <w:b w:val="0"/>
                 <w:sz w:val="21"/>
               </w:rPr>
-              <w:t>Observed as a limitation; needs a separate annotated evaluation.</w:t>
+              <w:t>Structural prevention through intent schema and templates</w:t>
             </w:r>
           </w:p>
         </w:tc>
@@ -17148,7 +19138,7 @@
                 <w:b w:val="0"/>
                 <w:sz w:val="21"/>
               </w:rPr>
-              <w:t>Latency</w:t>
+              <w:t>Permission enforcement</w:t>
             </w:r>
           </w:p>
         </w:tc>
@@ -17174,7 +19164,7 @@
                 <w:b w:val="0"/>
                 <w:sz w:val="21"/>
               </w:rPr>
-              <w:t>How long each stage takes end to end?</w:t>
+              <w:t>External or absent</w:t>
             </w:r>
           </w:p>
         </w:tc>
@@ -17200,178 +19190,7 @@
                 <w:b w:val="0"/>
                 <w:sz w:val="21"/>
               </w:rPr>
-              <w:t>Not yet instrumented.</w:t>
-            </w:r>
-          </w:p>
-        </w:tc>
-      </w:tr>
-    </w:tbl>
-    <w:p>
-      <w:pPr>
-        <w:spacing w:after="80"/>
-      </w:pPr>
-    </w:p>
-    <w:p>
-      <w:pPr>
-        <w:spacing w:after="0" w:before="0" w:line="360" w:lineRule="auto"/>
-        <w:jc w:val="both"/>
-      </w:pPr>
-      <w:r>
-        <w:rPr>
-          <w:rFonts w:ascii="Times New Roman" w:hAnsi="Times New Roman"/>
-          <w:b w:val="0"/>
-          <w:i w:val="0"/>
-          <w:sz w:val="24"/>
-        </w:rPr>
-        <w:t>This distinction is important for the thesis argument. AEGIS maintained SQL safety even under harder boundary cases, but the scope-detection mechanism was incomplete: several unsupported or underspecified requests were mapped to safe but semantically wrong in-scope queries instead of being rejected or clarified. That behavior should be reported as a correctness and clarification limitation, not hidden inside the safety metric.</w:t>
-      </w:r>
-    </w:p>
-    <w:p>
-      <w:pPr>
-        <w:spacing w:before="320" w:after="160"/>
-        <w:jc w:val="left"/>
-      </w:pPr>
-      <w:r>
-        <w:rPr>
-          <w:rFonts w:ascii="Times New Roman" w:hAnsi="Times New Roman"/>
-          <w:b/>
-          <w:sz w:val="28"/>
-        </w:rPr>
-        <w:t>5.7  B3 Template-Only Baseline</w:t>
-      </w:r>
-    </w:p>
-    <w:p>
-      <w:pPr>
-        <w:spacing w:after="200" w:before="0" w:line="360" w:lineRule="auto"/>
-        <w:jc w:val="both"/>
-      </w:pPr>
-      <w:r>
-        <w:rPr>
-          <w:rFonts w:ascii="Times New Roman" w:hAnsi="Times New Roman"/>
-          <w:b w:val="0"/>
-          <w:i w:val="0"/>
-          <w:sz w:val="24"/>
-        </w:rPr>
-        <w:t>The B3 template-only baseline is useful because it separates the deterministic compiler from the LLM intent parser. B3 uses keyword matching to create an intent object, then hands that intent to the same downstream semantic mapping and compiler path. Its high execution-validity result shows that many database errors are triggered by particular intent choices and time phrases, not by the compiler alone.</w:t>
-      </w:r>
-    </w:p>
-    <w:p>
-      <w:pPr>
-        <w:spacing w:before="200" w:after="80"/>
-        <w:jc w:val="center"/>
-        <w:keepNext/>
-      </w:pPr>
-      <w:r>
-        <w:rPr>
-          <w:rFonts w:ascii="Times New Roman" w:hAnsi="Times New Roman"/>
-          <w:b/>
-          <w:sz w:val="22"/>
-        </w:rPr>
-        <w:t>Table 5.7: B3 execution-validity summary.</w:t>
-      </w:r>
-    </w:p>
-    <w:tbl>
-      <w:tblPr>
-        <w:tblStyle w:val="TableGrid"/>
-        <w:tblW w:type="auto" w:w="0"/>
-        <w:jc w:val="center"/>
-        <w:tblLook w:firstColumn="1" w:firstRow="1" w:lastColumn="0" w:lastRow="0" w:noHBand="0" w:noVBand="1" w:val="04A0"/>
-        <w:tblBorders>
-          <w:top w:val="single" w:sz="4" w:space="0" w:color="999999"/>
-          <w:left w:val="single" w:sz="4" w:space="0" w:color="999999"/>
-          <w:bottom w:val="single" w:sz="4" w:space="0" w:color="999999"/>
-          <w:right w:val="single" w:sz="4" w:space="0" w:color="999999"/>
-          <w:insideH w:val="single" w:sz="4" w:space="0" w:color="999999"/>
-          <w:insideV w:val="single" w:sz="4" w:space="0" w:color="999999"/>
-        </w:tblBorders>
-      </w:tblPr>
-      <w:tblGrid>
-        <w:gridCol w:w="3009"/>
-        <w:gridCol w:w="3009"/>
-        <w:gridCol w:w="3009"/>
-      </w:tblGrid>
-      <w:tr>
-        <w:trPr>
-          <w:cantSplit/>
-        </w:trPr>
-        <w:tc>
-          <w:tcPr>
-            <w:tcW w:type="dxa" w:w="3009"/>
-          </w:tcPr>
-          <w:p>
-            <w:pPr>
-              <w:spacing w:before="0" w:after="0" w:line="240" w:lineRule="auto"/>
-              <w:jc w:val="center"/>
-              <w:keepNext/>
-            </w:pPr>
-            <w:r>
-              <w:rPr>
-                <w:rFonts w:ascii="Times New Roman" w:hAnsi="Times New Roman"/>
-                <w:b/>
-                <w:sz w:val="21"/>
-              </w:rPr>
-            </w:r>
-            <w:r>
-              <w:rPr>
-                <w:rFonts w:ascii="Times New Roman" w:hAnsi="Times New Roman"/>
-                <w:b/>
-                <w:sz w:val="21"/>
-              </w:rPr>
-              <w:t>System</w:t>
-            </w:r>
-          </w:p>
-        </w:tc>
-        <w:tc>
-          <w:tcPr>
-            <w:tcW w:type="dxa" w:w="3009"/>
-          </w:tcPr>
-          <w:p>
-            <w:pPr>
-              <w:spacing w:before="0" w:after="0" w:line="240" w:lineRule="auto"/>
-              <w:jc w:val="center"/>
-              <w:keepNext/>
-            </w:pPr>
-            <w:r>
-              <w:rPr>
-                <w:rFonts w:ascii="Times New Roman" w:hAnsi="Times New Roman"/>
-                <w:b/>
-                <w:sz w:val="21"/>
-              </w:rPr>
-            </w:r>
-            <w:r>
-              <w:rPr>
-                <w:rFonts w:ascii="Times New Roman" w:hAnsi="Times New Roman"/>
-                <w:b/>
-                <w:sz w:val="21"/>
-              </w:rPr>
-              <w:t>Execution result</w:t>
-            </w:r>
-          </w:p>
-        </w:tc>
-        <w:tc>
-          <w:tcPr>
-            <w:tcW w:type="dxa" w:w="3009"/>
-          </w:tcPr>
-          <w:p>
-            <w:pPr>
-              <w:spacing w:before="0" w:after="0" w:line="240" w:lineRule="auto"/>
-              <w:jc w:val="center"/>
-              <w:keepNext/>
-            </w:pPr>
-            <w:r>
-              <w:rPr>
-                <w:rFonts w:ascii="Times New Roman" w:hAnsi="Times New Roman"/>
-                <w:b/>
-                <w:sz w:val="21"/>
-              </w:rPr>
-            </w:r>
-            <w:r>
-              <w:rPr>
-                <w:rFonts w:ascii="Times New Roman" w:hAnsi="Times New Roman"/>
-                <w:b/>
-                <w:sz w:val="21"/>
-              </w:rPr>
-              <w:t>Interpretation</w:t>
+              <w:t>Applied after intent extraction by deterministic code</w:t>
             </w:r>
           </w:p>
         </w:tc>
@@ -17401,7 +19220,7 @@
                 <w:b w:val="0"/>
                 <w:sz w:val="21"/>
               </w:rPr>
-              <w:t>B3 Template-only</w:t>
+              <w:t>Dashboard widget persistence</w:t>
             </w:r>
           </w:p>
         </w:tc>
@@ -17427,7 +19246,7 @@
                 <w:b w:val="0"/>
                 <w:sz w:val="21"/>
               </w:rPr>
-              <w:t>104 of 107 executed successfully (97.2%)</w:t>
+              <w:t>Not provided by default</w:t>
             </w:r>
           </w:p>
         </w:tc>
@@ -17453,7 +19272,7 @@
                 <w:b w:val="0"/>
                 <w:sz w:val="21"/>
               </w:rPr>
-              <w:t>Higher execution validity than AEGIS on this run, but not evidence of higher semantic correctness.</w:t>
+              <w:t>First-class saved artifact</w:t>
             </w:r>
           </w:p>
         </w:tc>
@@ -17483,7 +19302,7 @@
                 <w:b w:val="0"/>
                 <w:sz w:val="21"/>
               </w:rPr>
-              <w:t>B3 failures</w:t>
+              <w:t>Model dependency</w:t>
             </w:r>
           </w:p>
         </w:tc>
@@ -17509,7 +19328,7 @@
                 <w:b w:val="0"/>
                 <w:sz w:val="21"/>
               </w:rPr>
-              <w:t>3 database execution failures</w:t>
+              <w:t>Strongly tied to model quality</w:t>
             </w:r>
           </w:p>
         </w:tc>
@@ -17535,7 +19354,7 @@
                 <w:b w:val="0"/>
                 <w:sz w:val="21"/>
               </w:rPr>
-              <w:t>Two compiler or join-path issues and one date-value issue were observed.</w:t>
+              <w:t>Compiler and safety scanner are model-independent</w:t>
             </w:r>
           </w:p>
         </w:tc>
@@ -17548,7 +19367,21 @@
     </w:p>
     <w:p>
       <w:pPr>
-        <w:spacing w:after="0" w:before="0" w:line="360" w:lineRule="auto"/>
+        <w:spacing w:before="200" w:after="160"/>
+        <w:jc w:val="left"/>
+      </w:pPr>
+      <w:r>
+        <w:rPr>
+          <w:rFonts w:ascii="Times New Roman" w:hAnsi="Times New Roman"/>
+          <w:b/>
+          <w:sz w:val="25"/>
+        </w:rPr>
+        <w:t>5.8.2  Semantic Layer versus Retrieval-Augmented Generation</w:t>
+      </w:r>
+    </w:p>
+    <w:p>
+      <w:pPr>
+        <w:spacing w:after="200" w:before="0" w:line="360" w:lineRule="auto"/>
         <w:jc w:val="both"/>
       </w:pPr>
       <w:r>
@@ -17558,40 +19391,26 @@
           <w:i w:val="0"/>
           <w:sz w:val="24"/>
         </w:rPr>
-        <w:t>B3's result should be interpreted carefully. A keyword-only classifier may choose a query shape that runs successfully while answering the wrong question. Therefore B3 belongs in the execution-validity comparison, but it should not be used to claim semantic accuracy until the same annotated correctness benchmark is applied to all systems.</w:t>
+        <w:t>Retrieval-augmented generation can help an LLM find relevant schema fragments, but it does not remove the model's authority to write SQL. AEGIS uses the semantic layer for a different purpose: it defines which business concepts are allowed to exist and how they compile into SQL. RAG may still be useful in a future large deployment to select relevant semantic-layer entries, but the final SQL should still be compiled by the deterministic AEGIS compiler.</w:t>
       </w:r>
     </w:p>
     <w:p>
       <w:pPr>
-        <w:spacing w:before="320" w:after="160"/>
+        <w:spacing w:before="200" w:after="160"/>
         <w:jc w:val="left"/>
       </w:pPr>
       <w:r>
         <w:rPr>
           <w:rFonts w:ascii="Times New Roman" w:hAnsi="Times New Roman"/>
           <w:b/>
-          <w:sz w:val="28"/>
-        </w:rPr>
-        <w:t>5.8  Comparative Discussion</w:t>
+          <w:sz w:val="25"/>
+        </w:rPr>
+        <w:t>5.8.3  Scope Boundary</w:t>
       </w:r>
     </w:p>
     <w:p>
       <w:pPr>
-        <w:spacing w:before="200" w:after="160"/>
-        <w:jc w:val="left"/>
-      </w:pPr>
-      <w:r>
-        <w:rPr>
-          <w:rFonts w:ascii="Times New Roman" w:hAnsi="Times New Roman"/>
-          <w:b/>
-          <w:sz w:val="25"/>
-        </w:rPr>
-        <w:t>5.8.1  AEGIS vs. Direct LLM-to-SQL</w:t>
-      </w:r>
-    </w:p>
-    <w:p>
-      <w:pPr>
-        <w:spacing w:after="200" w:before="0" w:line="360" w:lineRule="auto"/>
+        <w:spacing w:after="0" w:before="0" w:line="360" w:lineRule="auto"/>
         <w:jc w:val="both"/>
       </w:pPr>
       <w:r>
@@ -17601,727 +19420,391 @@
           <w:i w:val="0"/>
           <w:sz w:val="24"/>
         </w:rPr>
-        <w:t>The B1 baseline exposes the central risk of direct SQL generation. The same model that can produce useful analytical SQL can also hallucinate schema objects, mix SQL dialects, and generate a real write statement when a business-looking request implies a write operation. AEGIS narrows the model's role to intent extraction, so these risks do not enter the SQL construction stage in the same way.</w:t>
+        <w:t>AEGIS currently supports a bounded set of approved metrics, dimensions, analytical patterns, and join paths. This is the source of its safety, but also the source of its main limitation. If a user asks for something not represented in the semantic layer, the system should reject or clarify the request. The current prototype does not always do that reliably; improving scope detection is therefore a priority in future work.</w:t>
       </w:r>
     </w:p>
     <w:p>
-      <w:pPr>
-        <w:spacing w:before="200" w:after="80"/>
-        <w:jc w:val="center"/>
-        <w:keepNext/>
-      </w:pPr>
-      <w:r>
-        <w:rPr>
-          <w:rFonts w:ascii="Times New Roman" w:hAnsi="Times New Roman"/>
-          <w:b/>
-          <w:sz w:val="22"/>
-        </w:rPr>
-        <w:t>Table 5.8: Structural comparison of AEGIS vs. direct LLM-to-SQL.</w:t>
-      </w:r>
-    </w:p>
-    <w:tbl>
-      <w:tblPr>
-        <w:tblStyle w:val="TableGrid"/>
-        <w:tblW w:type="auto" w:w="0"/>
-        <w:jc w:val="center"/>
-        <w:tblLook w:firstColumn="1" w:firstRow="1" w:lastColumn="0" w:lastRow="0" w:noHBand="0" w:noVBand="1" w:val="04A0"/>
-        <w:tblBorders>
-          <w:top w:val="single" w:sz="4" w:space="0" w:color="999999"/>
-          <w:left w:val="single" w:sz="4" w:space="0" w:color="999999"/>
-          <w:bottom w:val="single" w:sz="4" w:space="0" w:color="999999"/>
-          <w:right w:val="single" w:sz="4" w:space="0" w:color="999999"/>
-          <w:insideH w:val="single" w:sz="4" w:space="0" w:color="999999"/>
-          <w:insideV w:val="single" w:sz="4" w:space="0" w:color="999999"/>
-        </w:tblBorders>
-      </w:tblPr>
-      <w:tblGrid>
-        <w:gridCol w:w="3009"/>
-        <w:gridCol w:w="3009"/>
-        <w:gridCol w:w="3009"/>
-      </w:tblGrid>
-      <w:tr>
-        <w:trPr>
-          <w:cantSplit/>
-        </w:trPr>
-        <w:tc>
-          <w:tcPr>
-            <w:tcW w:type="dxa" w:w="3009"/>
-          </w:tcPr>
-          <w:p>
-            <w:pPr>
-              <w:spacing w:before="0" w:after="0" w:line="240" w:lineRule="auto"/>
-              <w:jc w:val="center"/>
-              <w:keepNext/>
-            </w:pPr>
-            <w:r>
-              <w:rPr>
-                <w:rFonts w:ascii="Times New Roman" w:hAnsi="Times New Roman"/>
-                <w:b/>
-                <w:sz w:val="21"/>
-              </w:rPr>
-            </w:r>
-            <w:r>
-              <w:rPr>
-                <w:rFonts w:ascii="Times New Roman" w:hAnsi="Times New Roman"/>
-                <w:b/>
-                <w:sz w:val="21"/>
-              </w:rPr>
-              <w:t>Property</w:t>
-            </w:r>
-          </w:p>
-        </w:tc>
-        <w:tc>
-          <w:tcPr>
-            <w:tcW w:type="dxa" w:w="3009"/>
-          </w:tcPr>
-          <w:p>
-            <w:pPr>
-              <w:spacing w:before="0" w:after="0" w:line="240" w:lineRule="auto"/>
-              <w:jc w:val="center"/>
-              <w:keepNext/>
-            </w:pPr>
-            <w:r>
-              <w:rPr>
-                <w:rFonts w:ascii="Times New Roman" w:hAnsi="Times New Roman"/>
-                <w:b/>
-                <w:sz w:val="21"/>
-              </w:rPr>
-            </w:r>
-            <w:r>
-              <w:rPr>
-                <w:rFonts w:ascii="Times New Roman" w:hAnsi="Times New Roman"/>
-                <w:b/>
-                <w:sz w:val="21"/>
-              </w:rPr>
-              <w:t>Direct LLM-to-SQL</w:t>
-            </w:r>
-          </w:p>
-        </w:tc>
-        <w:tc>
-          <w:tcPr>
-            <w:tcW w:type="dxa" w:w="3009"/>
-          </w:tcPr>
-          <w:p>
-            <w:pPr>
-              <w:spacing w:before="0" w:after="0" w:line="240" w:lineRule="auto"/>
-              <w:jc w:val="center"/>
-              <w:keepNext/>
-            </w:pPr>
-            <w:r>
-              <w:rPr>
-                <w:rFonts w:ascii="Times New Roman" w:hAnsi="Times New Roman"/>
-                <w:b/>
-                <w:sz w:val="21"/>
-              </w:rPr>
-            </w:r>
-            <w:r>
-              <w:rPr>
-                <w:rFonts w:ascii="Times New Roman" w:hAnsi="Times New Roman"/>
-                <w:b/>
-                <w:sz w:val="21"/>
-              </w:rPr>
-              <w:t>AEGIS</w:t>
-            </w:r>
-          </w:p>
-        </w:tc>
-      </w:tr>
-      <w:tr>
-        <w:trPr>
-          <w:cantSplit/>
-        </w:trPr>
-        <w:tc>
-          <w:tcPr>
-            <w:tcW w:type="dxa" w:w="3009"/>
-          </w:tcPr>
-          <w:p>
-            <w:pPr>
-              <w:spacing w:before="0" w:after="0" w:line="240" w:lineRule="auto"/>
-              <w:keepNext/>
-            </w:pPr>
-            <w:r>
-              <w:rPr>
-                <w:rFonts w:ascii="Times New Roman" w:hAnsi="Times New Roman"/>
-                <w:sz w:val="21"/>
-              </w:rPr>
-            </w:r>
-            <w:r>
-              <w:rPr>
-                <w:rFonts w:ascii="Times New Roman" w:hAnsi="Times New Roman"/>
-                <w:b w:val="0"/>
-                <w:sz w:val="21"/>
-              </w:rPr>
-              <w:t>SQL generation</w:t>
-            </w:r>
-          </w:p>
-        </w:tc>
-        <w:tc>
-          <w:tcPr>
-            <w:tcW w:type="dxa" w:w="3009"/>
-          </w:tcPr>
-          <w:p>
-            <w:pPr>
-              <w:spacing w:before="0" w:after="0" w:line="240" w:lineRule="auto"/>
-              <w:jc w:val="center"/>
-              <w:keepNext/>
-            </w:pPr>
-            <w:r>
-              <w:rPr>
-                <w:rFonts w:ascii="Times New Roman" w:hAnsi="Times New Roman"/>
-                <w:sz w:val="21"/>
-              </w:rPr>
-            </w:r>
-            <w:r>
-              <w:rPr>
-                <w:rFonts w:ascii="Times New Roman" w:hAnsi="Times New Roman"/>
-                <w:b w:val="0"/>
-                <w:sz w:val="21"/>
-              </w:rPr>
-              <w:t>Model-generated free-form text</w:t>
-            </w:r>
-          </w:p>
-        </w:tc>
-        <w:tc>
-          <w:tcPr>
-            <w:tcW w:type="dxa" w:w="3009"/>
-          </w:tcPr>
-          <w:p>
-            <w:pPr>
-              <w:spacing w:before="0" w:after="0" w:line="240" w:lineRule="auto"/>
-              <w:jc w:val="center"/>
-              <w:keepNext/>
-            </w:pPr>
-            <w:r>
-              <w:rPr>
-                <w:rFonts w:ascii="Times New Roman" w:hAnsi="Times New Roman"/>
-                <w:sz w:val="21"/>
-              </w:rPr>
-            </w:r>
-            <w:r>
-              <w:rPr>
-                <w:rFonts w:ascii="Times New Roman" w:hAnsi="Times New Roman"/>
-                <w:b w:val="0"/>
-                <w:sz w:val="21"/>
-              </w:rPr>
-              <w:t>Deterministic compiler</w:t>
-            </w:r>
-          </w:p>
-        </w:tc>
-      </w:tr>
-      <w:tr>
-        <w:trPr>
-          <w:cantSplit/>
-        </w:trPr>
-        <w:tc>
-          <w:tcPr>
-            <w:tcW w:type="dxa" w:w="3009"/>
-          </w:tcPr>
-          <w:p>
-            <w:pPr>
-              <w:spacing w:before="0" w:after="0" w:line="240" w:lineRule="auto"/>
-              <w:keepNext/>
-            </w:pPr>
-            <w:r>
-              <w:rPr>
-                <w:rFonts w:ascii="Times New Roman" w:hAnsi="Times New Roman"/>
-                <w:sz w:val="21"/>
-              </w:rPr>
-            </w:r>
-            <w:r>
-              <w:rPr>
-                <w:rFonts w:ascii="Times New Roman" w:hAnsi="Times New Roman"/>
-                <w:b w:val="0"/>
-                <w:sz w:val="21"/>
-              </w:rPr>
-              <w:t>Schema exposure to LLM</w:t>
-            </w:r>
-          </w:p>
-        </w:tc>
-        <w:tc>
-          <w:tcPr>
-            <w:tcW w:type="dxa" w:w="3009"/>
-          </w:tcPr>
-          <w:p>
-            <w:pPr>
-              <w:spacing w:before="0" w:after="0" w:line="240" w:lineRule="auto"/>
-              <w:jc w:val="center"/>
-              <w:keepNext/>
-            </w:pPr>
-            <w:r>
-              <w:rPr>
-                <w:rFonts w:ascii="Times New Roman" w:hAnsi="Times New Roman"/>
-                <w:sz w:val="21"/>
-              </w:rPr>
-            </w:r>
-            <w:r>
-              <w:rPr>
-                <w:rFonts w:ascii="Times New Roman" w:hAnsi="Times New Roman"/>
-                <w:b w:val="0"/>
-                <w:sz w:val="21"/>
-              </w:rPr>
-              <w:t>Requires tables, columns, and relationships</w:t>
-            </w:r>
-          </w:p>
-        </w:tc>
-        <w:tc>
-          <w:tcPr>
-            <w:tcW w:type="dxa" w:w="3009"/>
-          </w:tcPr>
-          <w:p>
-            <w:pPr>
-              <w:spacing w:before="0" w:after="0" w:line="240" w:lineRule="auto"/>
-              <w:jc w:val="center"/>
-              <w:keepNext/>
-            </w:pPr>
-            <w:r>
-              <w:rPr>
-                <w:rFonts w:ascii="Times New Roman" w:hAnsi="Times New Roman"/>
-                <w:sz w:val="21"/>
-              </w:rPr>
-            </w:r>
-            <w:r>
-              <w:rPr>
-                <w:rFonts w:ascii="Times New Roman" w:hAnsi="Times New Roman"/>
-                <w:b w:val="0"/>
-                <w:sz w:val="21"/>
-              </w:rPr>
-              <w:t>Uses approved business labels</w:t>
-            </w:r>
-          </w:p>
-        </w:tc>
-      </w:tr>
-      <w:tr>
-        <w:trPr>
-          <w:cantSplit/>
-        </w:trPr>
-        <w:tc>
-          <w:tcPr>
-            <w:tcW w:type="dxa" w:w="3009"/>
-          </w:tcPr>
-          <w:p>
-            <w:pPr>
-              <w:spacing w:before="0" w:after="0" w:line="240" w:lineRule="auto"/>
-              <w:keepNext/>
-            </w:pPr>
-            <w:r>
-              <w:rPr>
-                <w:rFonts w:ascii="Times New Roman" w:hAnsi="Times New Roman"/>
-                <w:sz w:val="21"/>
-              </w:rPr>
-            </w:r>
-            <w:r>
-              <w:rPr>
-                <w:rFonts w:ascii="Times New Roman" w:hAnsi="Times New Roman"/>
-                <w:b w:val="0"/>
-                <w:sz w:val="21"/>
-              </w:rPr>
-              <w:t>Business metric definitions</w:t>
-            </w:r>
-          </w:p>
-        </w:tc>
-        <w:tc>
-          <w:tcPr>
-            <w:tcW w:type="dxa" w:w="3009"/>
-          </w:tcPr>
-          <w:p>
-            <w:pPr>
-              <w:spacing w:before="0" w:after="0" w:line="240" w:lineRule="auto"/>
-              <w:jc w:val="center"/>
-              <w:keepNext/>
-            </w:pPr>
-            <w:r>
-              <w:rPr>
-                <w:rFonts w:ascii="Times New Roman" w:hAnsi="Times New Roman"/>
-                <w:sz w:val="21"/>
-              </w:rPr>
-            </w:r>
-            <w:r>
-              <w:rPr>
-                <w:rFonts w:ascii="Times New Roman" w:hAnsi="Times New Roman"/>
-                <w:b w:val="0"/>
-                <w:sz w:val="21"/>
-              </w:rPr>
-              <w:t>Inferred from prompt and schema names</w:t>
-            </w:r>
-          </w:p>
-        </w:tc>
-        <w:tc>
-          <w:tcPr>
-            <w:tcW w:type="dxa" w:w="3009"/>
-          </w:tcPr>
-          <w:p>
-            <w:pPr>
-              <w:spacing w:before="0" w:after="0" w:line="240" w:lineRule="auto"/>
-              <w:jc w:val="center"/>
-              <w:keepNext/>
-            </w:pPr>
-            <w:r>
-              <w:rPr>
-                <w:rFonts w:ascii="Times New Roman" w:hAnsi="Times New Roman"/>
-                <w:sz w:val="21"/>
-              </w:rPr>
-            </w:r>
-            <w:r>
-              <w:rPr>
-                <w:rFonts w:ascii="Times New Roman" w:hAnsi="Times New Roman"/>
-                <w:b w:val="0"/>
-                <w:sz w:val="21"/>
-              </w:rPr>
-              <w:t>Defined in the semantic layer</w:t>
-            </w:r>
-          </w:p>
-        </w:tc>
-      </w:tr>
-      <w:tr>
-        <w:trPr>
-          <w:cantSplit/>
-        </w:trPr>
-        <w:tc>
-          <w:tcPr>
-            <w:tcW w:type="dxa" w:w="3009"/>
-          </w:tcPr>
-          <w:p>
-            <w:pPr>
-              <w:spacing w:before="0" w:after="0" w:line="240" w:lineRule="auto"/>
-              <w:keepNext/>
-            </w:pPr>
-            <w:r>
-              <w:rPr>
-                <w:rFonts w:ascii="Times New Roman" w:hAnsi="Times New Roman"/>
-                <w:sz w:val="21"/>
-              </w:rPr>
-            </w:r>
-            <w:r>
-              <w:rPr>
-                <w:rFonts w:ascii="Times New Roman" w:hAnsi="Times New Roman"/>
-                <w:b w:val="0"/>
-                <w:sz w:val="21"/>
-              </w:rPr>
-              <w:t>SQL injection prevention</w:t>
-            </w:r>
-          </w:p>
-        </w:tc>
-        <w:tc>
-          <w:tcPr>
-            <w:tcW w:type="dxa" w:w="3009"/>
-          </w:tcPr>
-          <w:p>
-            <w:pPr>
-              <w:spacing w:before="0" w:after="0" w:line="240" w:lineRule="auto"/>
-              <w:jc w:val="center"/>
-              <w:keepNext/>
-            </w:pPr>
-            <w:r>
-              <w:rPr>
-                <w:rFonts w:ascii="Times New Roman" w:hAnsi="Times New Roman"/>
-                <w:sz w:val="21"/>
-              </w:rPr>
-            </w:r>
-            <w:r>
-              <w:rPr>
-                <w:rFonts w:ascii="Times New Roman" w:hAnsi="Times New Roman"/>
-                <w:b w:val="0"/>
-                <w:sz w:val="21"/>
-              </w:rPr>
-              <w:t>Prompt-level instruction and post-checking</w:t>
-            </w:r>
-          </w:p>
-        </w:tc>
-        <w:tc>
-          <w:tcPr>
-            <w:tcW w:type="dxa" w:w="3009"/>
-          </w:tcPr>
-          <w:p>
-            <w:pPr>
-              <w:spacing w:before="0" w:after="0" w:line="240" w:lineRule="auto"/>
-              <w:jc w:val="center"/>
-              <w:keepNext/>
-            </w:pPr>
-            <w:r>
-              <w:rPr>
-                <w:rFonts w:ascii="Times New Roman" w:hAnsi="Times New Roman"/>
-                <w:sz w:val="21"/>
-              </w:rPr>
-            </w:r>
-            <w:r>
-              <w:rPr>
-                <w:rFonts w:ascii="Times New Roman" w:hAnsi="Times New Roman"/>
-                <w:b w:val="0"/>
-                <w:sz w:val="21"/>
-              </w:rPr>
-              <w:t>Structural prevention through intent schema and templates</w:t>
-            </w:r>
-          </w:p>
-        </w:tc>
-      </w:tr>
-      <w:tr>
-        <w:trPr>
-          <w:cantSplit/>
-        </w:trPr>
-        <w:tc>
-          <w:tcPr>
-            <w:tcW w:type="dxa" w:w="3009"/>
-          </w:tcPr>
-          <w:p>
-            <w:pPr>
-              <w:spacing w:before="0" w:after="0" w:line="240" w:lineRule="auto"/>
-              <w:keepNext/>
-            </w:pPr>
-            <w:r>
-              <w:rPr>
-                <w:rFonts w:ascii="Times New Roman" w:hAnsi="Times New Roman"/>
-                <w:sz w:val="21"/>
-              </w:rPr>
-            </w:r>
-            <w:r>
-              <w:rPr>
-                <w:rFonts w:ascii="Times New Roman" w:hAnsi="Times New Roman"/>
-                <w:b w:val="0"/>
-                <w:sz w:val="21"/>
-              </w:rPr>
-              <w:t>Permission enforcement</w:t>
-            </w:r>
-          </w:p>
-        </w:tc>
-        <w:tc>
-          <w:tcPr>
-            <w:tcW w:type="dxa" w:w="3009"/>
-          </w:tcPr>
-          <w:p>
-            <w:pPr>
-              <w:spacing w:before="0" w:after="0" w:line="240" w:lineRule="auto"/>
-              <w:jc w:val="center"/>
-              <w:keepNext/>
-            </w:pPr>
-            <w:r>
-              <w:rPr>
-                <w:rFonts w:ascii="Times New Roman" w:hAnsi="Times New Roman"/>
-                <w:sz w:val="21"/>
-              </w:rPr>
-            </w:r>
-            <w:r>
-              <w:rPr>
-                <w:rFonts w:ascii="Times New Roman" w:hAnsi="Times New Roman"/>
-                <w:b w:val="0"/>
-                <w:sz w:val="21"/>
-              </w:rPr>
-              <w:t>External or absent</w:t>
-            </w:r>
-          </w:p>
-        </w:tc>
-        <w:tc>
-          <w:tcPr>
-            <w:tcW w:type="dxa" w:w="3009"/>
-          </w:tcPr>
-          <w:p>
-            <w:pPr>
-              <w:spacing w:before="0" w:after="0" w:line="240" w:lineRule="auto"/>
-              <w:jc w:val="center"/>
-              <w:keepNext/>
-            </w:pPr>
-            <w:r>
-              <w:rPr>
-                <w:rFonts w:ascii="Times New Roman" w:hAnsi="Times New Roman"/>
-                <w:sz w:val="21"/>
-              </w:rPr>
-            </w:r>
-            <w:r>
-              <w:rPr>
-                <w:rFonts w:ascii="Times New Roman" w:hAnsi="Times New Roman"/>
-                <w:b w:val="0"/>
-                <w:sz w:val="21"/>
-              </w:rPr>
-              <w:t>Applied after intent extraction by deterministic code</w:t>
-            </w:r>
-          </w:p>
-        </w:tc>
-      </w:tr>
-      <w:tr>
-        <w:trPr>
-          <w:cantSplit/>
-        </w:trPr>
-        <w:tc>
-          <w:tcPr>
-            <w:tcW w:type="dxa" w:w="3009"/>
-          </w:tcPr>
-          <w:p>
-            <w:pPr>
-              <w:spacing w:before="0" w:after="0" w:line="240" w:lineRule="auto"/>
-              <w:keepNext/>
-            </w:pPr>
-            <w:r>
-              <w:rPr>
-                <w:rFonts w:ascii="Times New Roman" w:hAnsi="Times New Roman"/>
-                <w:sz w:val="21"/>
-              </w:rPr>
-            </w:r>
-            <w:r>
-              <w:rPr>
-                <w:rFonts w:ascii="Times New Roman" w:hAnsi="Times New Roman"/>
-                <w:b w:val="0"/>
-                <w:sz w:val="21"/>
-              </w:rPr>
-              <w:t>Dashboard widget persistence</w:t>
-            </w:r>
-          </w:p>
-        </w:tc>
-        <w:tc>
-          <w:tcPr>
-            <w:tcW w:type="dxa" w:w="3009"/>
-          </w:tcPr>
-          <w:p>
-            <w:pPr>
-              <w:spacing w:before="0" w:after="0" w:line="240" w:lineRule="auto"/>
-              <w:jc w:val="center"/>
-              <w:keepNext/>
-            </w:pPr>
-            <w:r>
-              <w:rPr>
-                <w:rFonts w:ascii="Times New Roman" w:hAnsi="Times New Roman"/>
-                <w:sz w:val="21"/>
-              </w:rPr>
-            </w:r>
-            <w:r>
-              <w:rPr>
-                <w:rFonts w:ascii="Times New Roman" w:hAnsi="Times New Roman"/>
-                <w:b w:val="0"/>
-                <w:sz w:val="21"/>
-              </w:rPr>
-              <w:t>Not provided by default</w:t>
-            </w:r>
-          </w:p>
-        </w:tc>
-        <w:tc>
-          <w:tcPr>
-            <w:tcW w:type="dxa" w:w="3009"/>
-          </w:tcPr>
-          <w:p>
-            <w:pPr>
-              <w:spacing w:before="0" w:after="0" w:line="240" w:lineRule="auto"/>
-              <w:jc w:val="center"/>
-              <w:keepNext/>
-            </w:pPr>
-            <w:r>
-              <w:rPr>
-                <w:rFonts w:ascii="Times New Roman" w:hAnsi="Times New Roman"/>
-                <w:sz w:val="21"/>
-              </w:rPr>
-            </w:r>
-            <w:r>
-              <w:rPr>
-                <w:rFonts w:ascii="Times New Roman" w:hAnsi="Times New Roman"/>
-                <w:b w:val="0"/>
-                <w:sz w:val="21"/>
-              </w:rPr>
-              <w:t>First-class saved artifact</w:t>
-            </w:r>
-          </w:p>
-        </w:tc>
-      </w:tr>
-      <w:tr>
-        <w:trPr>
-          <w:cantSplit/>
-        </w:trPr>
-        <w:tc>
-          <w:tcPr>
-            <w:tcW w:type="dxa" w:w="3009"/>
-          </w:tcPr>
-          <w:p>
-            <w:pPr>
-              <w:spacing w:before="0" w:after="0" w:line="240" w:lineRule="auto"/>
-              <w:keepNext/>
-            </w:pPr>
-            <w:r>
-              <w:rPr>
-                <w:rFonts w:ascii="Times New Roman" w:hAnsi="Times New Roman"/>
-                <w:sz w:val="21"/>
-              </w:rPr>
-            </w:r>
-            <w:r>
-              <w:rPr>
-                <w:rFonts w:ascii="Times New Roman" w:hAnsi="Times New Roman"/>
-                <w:b w:val="0"/>
-                <w:sz w:val="21"/>
-              </w:rPr>
-              <w:t>Model dependency</w:t>
-            </w:r>
-          </w:p>
-        </w:tc>
-        <w:tc>
-          <w:tcPr>
-            <w:tcW w:type="dxa" w:w="3009"/>
-          </w:tcPr>
-          <w:p>
-            <w:pPr>
-              <w:spacing w:before="0" w:after="0" w:line="240" w:lineRule="auto"/>
-              <w:jc w:val="center"/>
-              <w:keepNext/>
-            </w:pPr>
-            <w:r>
-              <w:rPr>
-                <w:rFonts w:ascii="Times New Roman" w:hAnsi="Times New Roman"/>
-                <w:sz w:val="21"/>
-              </w:rPr>
-            </w:r>
-            <w:r>
-              <w:rPr>
-                <w:rFonts w:ascii="Times New Roman" w:hAnsi="Times New Roman"/>
-                <w:b w:val="0"/>
-                <w:sz w:val="21"/>
-              </w:rPr>
-              <w:t>Strongly tied to model quality</w:t>
-            </w:r>
-          </w:p>
-        </w:tc>
-        <w:tc>
-          <w:tcPr>
-            <w:tcW w:type="dxa" w:w="3009"/>
-          </w:tcPr>
-          <w:p>
-            <w:pPr>
-              <w:spacing w:before="0" w:after="0" w:line="240" w:lineRule="auto"/>
-              <w:jc w:val="center"/>
-              <w:keepNext/>
-            </w:pPr>
-            <w:r>
-              <w:rPr>
-                <w:rFonts w:ascii="Times New Roman" w:hAnsi="Times New Roman"/>
-                <w:sz w:val="21"/>
-              </w:rPr>
-            </w:r>
-            <w:r>
-              <w:rPr>
-                <w:rFonts w:ascii="Times New Roman" w:hAnsi="Times New Roman"/>
-                <w:b w:val="0"/>
-                <w:sz w:val="21"/>
-              </w:rPr>
-              <w:t>Compiler and safety scanner are model-independent</w:t>
-            </w:r>
-          </w:p>
-        </w:tc>
-      </w:tr>
-    </w:tbl>
-    <w:p>
-      <w:pPr>
-        <w:spacing w:after="80"/>
-      </w:pPr>
+      <w:r>
+        <w:br w:type="page"/>
+      </w:r>
     </w:p>
     <w:p>
       <w:pPr>
-        <w:spacing w:before="200" w:after="160"/>
-        <w:jc w:val="left"/>
+        <w:spacing w:before="0" w:after="80"/>
+        <w:jc w:val="center"/>
       </w:pPr>
       <w:r>
         <w:rPr>
           <w:rFonts w:ascii="Times New Roman" w:hAnsi="Times New Roman"/>
           <w:b/>
-          <w:sz w:val="25"/>
-        </w:rPr>
-        <w:t>5.8.2  Semantic Layer versus Retrieval-Augmented Generation</w:t>
+          <w:sz w:val="32"/>
+        </w:rPr>
+        <w:t>CHAPTER 6</w:t>
       </w:r>
     </w:p>
     <w:p>
       <w:pPr>
-        <w:spacing w:after="200" w:before="0" w:line="360" w:lineRule="auto"/>
+        <w:spacing w:after="400"/>
+        <w:jc w:val="center"/>
+      </w:pPr>
+      <w:r>
+        <w:rPr>
+          <w:rFonts w:ascii="Times New Roman" w:hAnsi="Times New Roman"/>
+          <w:b/>
+          <w:sz w:val="32"/>
+        </w:rPr>
+        <w:t>LIMITATIONS AND FUTURE WORK</w:t>
+      </w:r>
+    </w:p>
+    <w:p>
+      <w:pPr>
+        <w:spacing w:before="320" w:after="160"/>
+        <w:jc w:val="left"/>
+      </w:pPr>
+      <w:r>
+        <w:rPr>
+          <w:rFonts w:ascii="Times New Roman" w:hAnsi="Times New Roman"/>
+          <w:b/>
+          <w:sz w:val="28"/>
+        </w:rPr>
+        <w:t>6.1  Limitations</w:t>
+      </w:r>
+    </w:p>
+    <w:p>
+      <w:pPr>
+        <w:spacing w:after="80" w:line="360" w:lineRule="auto"/>
+        <w:ind w:left="461" w:hanging="259"/>
+      </w:pPr>
+      <w:r>
+        <w:rPr>
+          <w:rFonts w:ascii="Times New Roman" w:hAnsi="Times New Roman"/>
+          <w:sz w:val="24"/>
+        </w:rPr>
+        <w:t>•</w:t>
+        <w:tab/>
+      </w:r>
+      <w:r>
+        <w:rPr>
+          <w:rFonts w:ascii="Times New Roman" w:hAnsi="Times New Roman"/>
+          <w:b/>
+          <w:sz w:val="24"/>
+        </w:rPr>
+        <w:t xml:space="preserve">Semantic layer construction: </w:t>
+      </w:r>
+      <w:r>
+        <w:rPr>
+          <w:rFonts w:ascii="Times New Roman" w:hAnsi="Times New Roman"/>
+          <w:sz w:val="24"/>
+        </w:rPr>
+        <w:t>Each deployment requires a domain-specific semantic layer prepared by someone with both business knowledge and schema access.</w:t>
+      </w:r>
+    </w:p>
+    <w:p>
+      <w:pPr>
+        <w:spacing w:after="80" w:line="360" w:lineRule="auto"/>
+        <w:ind w:left="461" w:hanging="259"/>
+      </w:pPr>
+      <w:r>
+        <w:rPr>
+          <w:rFonts w:ascii="Times New Roman" w:hAnsi="Times New Roman"/>
+          <w:sz w:val="24"/>
+        </w:rPr>
+        <w:t>•</w:t>
+        <w:tab/>
+      </w:r>
+      <w:r>
+        <w:rPr>
+          <w:rFonts w:ascii="Times New Roman" w:hAnsi="Times New Roman"/>
+          <w:b/>
+          <w:sz w:val="24"/>
+        </w:rPr>
+        <w:t xml:space="preserve">Bounded query coverage: </w:t>
+      </w:r>
+      <w:r>
+        <w:rPr>
+          <w:rFonts w:ascii="Times New Roman" w:hAnsi="Times New Roman"/>
+          <w:sz w:val="24"/>
+        </w:rPr>
+        <w:t>AEGIS only answers questions that map to supported metrics, dimensions, patterns, and join paths.</w:t>
+      </w:r>
+    </w:p>
+    <w:p>
+      <w:pPr>
+        <w:spacing w:after="80" w:line="360" w:lineRule="auto"/>
+        <w:ind w:left="461" w:hanging="259"/>
+      </w:pPr>
+      <w:r>
+        <w:rPr>
+          <w:rFonts w:ascii="Times New Roman" w:hAnsi="Times New Roman"/>
+          <w:sz w:val="24"/>
+        </w:rPr>
+        <w:t>•</w:t>
+        <w:tab/>
+      </w:r>
+      <w:r>
+        <w:rPr>
+          <w:rFonts w:ascii="Times New Roman" w:hAnsi="Times New Roman"/>
+          <w:b/>
+          <w:sz w:val="24"/>
+        </w:rPr>
+        <w:t xml:space="preserve">Correctness annotation: </w:t>
+      </w:r>
+      <w:r>
+        <w:rPr>
+          <w:rFonts w:ascii="Times New Roman" w:hAnsi="Times New Roman"/>
+          <w:sz w:val="24"/>
+        </w:rPr>
+        <w:t>The first-pass annotation found that safe SQL can still answer the wrong business question, especially when requests are unsupported or vague.</w:t>
+      </w:r>
+    </w:p>
+    <w:p>
+      <w:pPr>
+        <w:spacing w:after="80" w:line="360" w:lineRule="auto"/>
+        <w:ind w:left="461" w:hanging="259"/>
+      </w:pPr>
+      <w:r>
+        <w:rPr>
+          <w:rFonts w:ascii="Times New Roman" w:hAnsi="Times New Roman"/>
+          <w:sz w:val="24"/>
+        </w:rPr>
+        <w:t>•</w:t>
+        <w:tab/>
+      </w:r>
+      <w:r>
+        <w:rPr>
+          <w:rFonts w:ascii="Times New Roman" w:hAnsi="Times New Roman"/>
+          <w:b/>
+          <w:sz w:val="24"/>
+        </w:rPr>
+        <w:t xml:space="preserve">Benchmark scope: </w:t>
+      </w:r>
+      <w:r>
+        <w:rPr>
+          <w:rFonts w:ascii="Times New Roman" w:hAnsi="Times New Roman"/>
+          <w:sz w:val="24"/>
+        </w:rPr>
+        <w:t>The custom 107-request benchmark evaluates AEGIS in one domain and is not directly comparable to Spider or BIRD leaderboard scores.</w:t>
+      </w:r>
+    </w:p>
+    <w:p>
+      <w:pPr>
+        <w:spacing w:after="80" w:line="360" w:lineRule="auto"/>
+        <w:ind w:left="461" w:hanging="259"/>
+      </w:pPr>
+      <w:r>
+        <w:rPr>
+          <w:rFonts w:ascii="Times New Roman" w:hAnsi="Times New Roman"/>
+          <w:sz w:val="24"/>
+        </w:rPr>
+        <w:t>•</w:t>
+        <w:tab/>
+      </w:r>
+      <w:r>
+        <w:rPr>
+          <w:rFonts w:ascii="Times New Roman" w:hAnsi="Times New Roman"/>
+          <w:b/>
+          <w:sz w:val="24"/>
+        </w:rPr>
+        <w:t xml:space="preserve">Prototype engineering limits: </w:t>
+      </w:r>
+      <w:r>
+        <w:rPr>
+          <w:rFonts w:ascii="Times New Roman" w:hAnsi="Times New Roman"/>
+          <w:sz w:val="24"/>
+        </w:rPr>
+        <w:t>The current version targets MySQL, uses prototype widget storage, and handles each request independently without multi-turn context.</w:t>
+      </w:r>
+    </w:p>
+    <w:p>
+      <w:pPr>
+        <w:spacing w:before="320" w:after="160"/>
+        <w:jc w:val="left"/>
+      </w:pPr>
+      <w:r>
+        <w:rPr>
+          <w:rFonts w:ascii="Times New Roman" w:hAnsi="Times New Roman"/>
+          <w:b/>
+          <w:sz w:val="28"/>
+        </w:rPr>
+        <w:t>6.2  Future Work</w:t>
+      </w:r>
+    </w:p>
+    <w:p>
+      <w:pPr>
+        <w:spacing w:after="80" w:line="360" w:lineRule="auto"/>
+        <w:ind w:left="461" w:hanging="259"/>
+      </w:pPr>
+      <w:r>
+        <w:rPr>
+          <w:rFonts w:ascii="Times New Roman" w:hAnsi="Times New Roman"/>
+          <w:sz w:val="24"/>
+        </w:rPr>
+        <w:t>•</w:t>
+        <w:tab/>
+      </w:r>
+      <w:r>
+        <w:rPr>
+          <w:rFonts w:ascii="Times New Roman" w:hAnsi="Times New Roman"/>
+          <w:b/>
+          <w:sz w:val="24"/>
+        </w:rPr>
+        <w:t xml:space="preserve">Clarification requests: </w:t>
+      </w:r>
+      <w:r>
+        <w:rPr>
+          <w:rFonts w:ascii="Times New Roman" w:hAnsi="Times New Roman"/>
+          <w:sz w:val="24"/>
+        </w:rPr>
+        <w:t>When confidence is low, AEGIS should ask a follow-up question instead of guessing, for example "did you mean revenue or profit?"</w:t>
+      </w:r>
+    </w:p>
+    <w:p>
+      <w:pPr>
+        <w:spacing w:after="80" w:line="360" w:lineRule="auto"/>
+        <w:ind w:left="461" w:hanging="259"/>
+      </w:pPr>
+      <w:r>
+        <w:rPr>
+          <w:rFonts w:ascii="Times New Roman" w:hAnsi="Times New Roman"/>
+          <w:sz w:val="24"/>
+        </w:rPr>
+        <w:t>•</w:t>
+        <w:tab/>
+      </w:r>
+      <w:r>
+        <w:rPr>
+          <w:rFonts w:ascii="Times New Roman" w:hAnsi="Times New Roman"/>
+          <w:b/>
+          <w:sz w:val="24"/>
+        </w:rPr>
+        <w:t xml:space="preserve">Semantic-layer tooling: </w:t>
+      </w:r>
+      <w:r>
+        <w:rPr>
+          <w:rFonts w:ascii="Times New Roman" w:hAnsi="Times New Roman"/>
+          <w:sz w:val="24"/>
+        </w:rPr>
+        <w:t>A guided interface should let business analysts define new metrics and dimensions, join paths, and approved vocabulary without editing Python code.</w:t>
+      </w:r>
+    </w:p>
+    <w:p>
+      <w:pPr>
+        <w:spacing w:after="80" w:line="360" w:lineRule="auto"/>
+        <w:ind w:left="461" w:hanging="259"/>
+      </w:pPr>
+      <w:r>
+        <w:rPr>
+          <w:rFonts w:ascii="Times New Roman" w:hAnsi="Times New Roman"/>
+          <w:sz w:val="24"/>
+        </w:rPr>
+        <w:t>•</w:t>
+        <w:tab/>
+      </w:r>
+      <w:r>
+        <w:rPr>
+          <w:rFonts w:ascii="Times New Roman" w:hAnsi="Times New Roman"/>
+          <w:b/>
+          <w:sz w:val="24"/>
+        </w:rPr>
+        <w:t xml:space="preserve">Stronger evaluation: </w:t>
+      </w:r>
+      <w:r>
+        <w:rPr>
+          <w:rFonts w:ascii="Times New Roman" w:hAnsi="Times New Roman"/>
+          <w:sz w:val="24"/>
+        </w:rPr>
+        <w:t>The machine-assisted correctness annotation should be reviewed manually, and future work should add stronger robustness tests and cross-schema evaluation.</w:t>
+      </w:r>
+    </w:p>
+    <w:p>
+      <w:pPr>
+        <w:spacing w:after="80" w:line="360" w:lineRule="auto"/>
+        <w:ind w:left="461" w:hanging="259"/>
+      </w:pPr>
+      <w:r>
+        <w:rPr>
+          <w:rFonts w:ascii="Times New Roman" w:hAnsi="Times New Roman"/>
+          <w:sz w:val="24"/>
+        </w:rPr>
+        <w:t>•</w:t>
+        <w:tab/>
+      </w:r>
+      <w:r>
+        <w:rPr>
+          <w:rFonts w:ascii="Times New Roman" w:hAnsi="Times New Roman"/>
+          <w:b/>
+          <w:sz w:val="24"/>
+        </w:rPr>
+        <w:t xml:space="preserve">Cross-schema evaluation: </w:t>
+      </w:r>
+      <w:r>
+        <w:rPr>
+          <w:rFonts w:ascii="Times New Roman" w:hAnsi="Times New Roman"/>
+          <w:sz w:val="24"/>
+        </w:rPr>
+        <w:t>A second schema, such as WooCommerce, should be evaluated while keeping the intent parser contract, compiler structure, and safety scanner unchanged.</w:t>
+      </w:r>
+    </w:p>
+    <w:p>
+      <w:pPr>
+        <w:spacing w:after="80" w:line="360" w:lineRule="auto"/>
+        <w:ind w:left="461" w:hanging="259"/>
+      </w:pPr>
+      <w:r>
+        <w:rPr>
+          <w:rFonts w:ascii="Times New Roman" w:hAnsi="Times New Roman"/>
+          <w:sz w:val="24"/>
+        </w:rPr>
+        <w:t>•</w:t>
+        <w:tab/>
+      </w:r>
+      <w:r>
+        <w:rPr>
+          <w:rFonts w:ascii="Times New Roman" w:hAnsi="Times New Roman"/>
+          <w:b/>
+          <w:sz w:val="24"/>
+        </w:rPr>
+        <w:t xml:space="preserve">Production hardening: </w:t>
+      </w:r>
+      <w:r>
+        <w:rPr>
+          <w:rFonts w:ascii="Times New Roman" w:hAnsi="Times New Roman"/>
+          <w:sz w:val="24"/>
+        </w:rPr>
+        <w:t>Query-cost controls, database-backed widget storage, broader schema coverage, and multi-turn support should be added before production deployment.</w:t>
+      </w:r>
+    </w:p>
+    <w:p>
+      <w:pPr>
+        <w:spacing w:before="0" w:after="80"/>
+        <w:jc w:val="center"/>
+      </w:pPr>
+      <w:r>
+        <w:rPr>
+          <w:rFonts w:ascii="Times New Roman" w:hAnsi="Times New Roman"/>
+          <w:b/>
+          <w:sz w:val="32"/>
+        </w:rPr>
+        <w:t>CHAPTER 7</w:t>
+      </w:r>
+    </w:p>
+    <w:p>
+      <w:pPr>
+        <w:spacing w:after="400"/>
+        <w:jc w:val="center"/>
+      </w:pPr>
+      <w:r>
+        <w:rPr>
+          <w:rFonts w:ascii="Times New Roman" w:hAnsi="Times New Roman"/>
+          <w:b/>
+          <w:sz w:val="32"/>
+        </w:rPr>
+        <w:t>CONCLUSION</w:t>
+      </w:r>
+    </w:p>
+    <w:p>
+      <w:pPr>
+        <w:spacing w:after="240" w:before="0" w:line="360" w:lineRule="auto"/>
         <w:jc w:val="both"/>
       </w:pPr>
       <w:r>
@@ -18331,26 +19814,12 @@
           <w:i w:val="0"/>
           <w:sz w:val="24"/>
         </w:rPr>
-        <w:t>Retrieval-augmented generation can help an LLM find relevant schema fragments, but it does not remove the model's authority to write SQL. AEGIS uses the semantic layer for a different purpose: it defines which business concepts are allowed to exist and how they compile into SQL. RAG may still be useful in a future large deployment to select relevant semantic-layer entries, but the final SQL should still be compiled by the deterministic AEGIS compiler.</w:t>
+        <w:t>This thesis presented AEGIS, a constraint-based architecture for safe LLM-assisted natural-language analytics over relational databases. The system limits the language model to intent extraction while query construction, chart selection, and widget persistence are handled by deterministic components. This design makes approved business terms explicit through a semantic layer and avoids exposing raw SQL generation authority to the language model.</w:t>
       </w:r>
     </w:p>
     <w:p>
       <w:pPr>
-        <w:spacing w:before="200" w:after="160"/>
-        <w:jc w:val="left"/>
-      </w:pPr>
-      <w:r>
-        <w:rPr>
-          <w:rFonts w:ascii="Times New Roman" w:hAnsi="Times New Roman"/>
-          <w:b/>
-          <w:sz w:val="25"/>
-        </w:rPr>
-        <w:t>5.8.3  Scope Boundary</w:t>
-      </w:r>
-    </w:p>
-    <w:p>
-      <w:pPr>
-        <w:spacing w:after="0" w:before="0" w:line="360" w:lineRule="auto"/>
+        <w:spacing w:after="240" w:before="0" w:line="360" w:lineRule="auto"/>
         <w:jc w:val="both"/>
       </w:pPr>
       <w:r>
@@ -18360,416 +19829,7 @@
           <w:i w:val="0"/>
           <w:sz w:val="24"/>
         </w:rPr>
-        <w:t>AEGIS currently supports a bounded set of approved metrics, dimensions, analytical patterns, and join paths. This is the source of its safety, but also the source of its main limitation. If a user asks for something not represented in the semantic layer, the system should reject or clarify the request. The current prototype does not always do that reliably; improving scope detection is therefore a priority in future work.</w:t>
-      </w:r>
-    </w:p>
-    <w:p>
-      <w:r>
-        <w:br w:type="page"/>
-      </w:r>
-    </w:p>
-    <w:p>
-      <w:pPr>
-        <w:spacing w:before="0" w:after="80"/>
-        <w:jc w:val="center"/>
-      </w:pPr>
-      <w:r>
-        <w:rPr>
-          <w:rFonts w:ascii="Times New Roman" w:hAnsi="Times New Roman"/>
-          <w:b/>
-          <w:sz w:val="32"/>
-        </w:rPr>
-        <w:t>CHAPTER 6</w:t>
-      </w:r>
-    </w:p>
-    <w:p>
-      <w:pPr>
-        <w:spacing w:after="400"/>
-        <w:jc w:val="center"/>
-      </w:pPr>
-      <w:r>
-        <w:rPr>
-          <w:rFonts w:ascii="Times New Roman" w:hAnsi="Times New Roman"/>
-          <w:b/>
-          <w:sz w:val="32"/>
-        </w:rPr>
-        <w:t>LIMITATIONS AND FUTURE WORK</w:t>
-      </w:r>
-    </w:p>
-    <w:p>
-      <w:pPr>
-        <w:spacing w:before="320" w:after="160"/>
-        <w:jc w:val="left"/>
-      </w:pPr>
-      <w:r>
-        <w:rPr>
-          <w:rFonts w:ascii="Times New Roman" w:hAnsi="Times New Roman"/>
-          <w:b/>
-          <w:sz w:val="28"/>
-        </w:rPr>
-        <w:t>6.1  Limitations</w:t>
-      </w:r>
-    </w:p>
-    <w:p>
-      <w:pPr>
-        <w:spacing w:after="80" w:line="360" w:lineRule="auto"/>
-        <w:ind w:left="461" w:hanging="259"/>
-      </w:pPr>
-      <w:r>
-        <w:rPr>
-          <w:rFonts w:ascii="Times New Roman" w:hAnsi="Times New Roman"/>
-          <w:sz w:val="24"/>
-        </w:rPr>
-        <w:t>•</w:t>
-        <w:tab/>
-      </w:r>
-      <w:r>
-        <w:rPr>
-          <w:rFonts w:ascii="Times New Roman" w:hAnsi="Times New Roman"/>
-          <w:b/>
-          <w:sz w:val="24"/>
-        </w:rPr>
-        <w:t xml:space="preserve">Semantic layer construction: </w:t>
-      </w:r>
-      <w:r>
-        <w:rPr>
-          <w:rFonts w:ascii="Times New Roman" w:hAnsi="Times New Roman"/>
-          <w:sz w:val="24"/>
-        </w:rPr>
-        <w:t>Each deployment requires a domain-specific semantic layer prepared by someone with both business knowledge and schema access.</w:t>
-      </w:r>
-    </w:p>
-    <w:p>
-      <w:pPr>
-        <w:spacing w:after="80" w:line="360" w:lineRule="auto"/>
-        <w:ind w:left="461" w:hanging="259"/>
-      </w:pPr>
-      <w:r>
-        <w:rPr>
-          <w:rFonts w:ascii="Times New Roman" w:hAnsi="Times New Roman"/>
-          <w:sz w:val="24"/>
-        </w:rPr>
-        <w:t>•</w:t>
-        <w:tab/>
-      </w:r>
-      <w:r>
-        <w:rPr>
-          <w:rFonts w:ascii="Times New Roman" w:hAnsi="Times New Roman"/>
-          <w:b/>
-          <w:sz w:val="24"/>
-        </w:rPr>
-        <w:t xml:space="preserve">Bounded query coverage: </w:t>
-      </w:r>
-      <w:r>
-        <w:rPr>
-          <w:rFonts w:ascii="Times New Roman" w:hAnsi="Times New Roman"/>
-          <w:sz w:val="24"/>
-        </w:rPr>
-        <w:t>AEGIS only answers questions that map to supported metrics, dimensions, patterns, and join paths.</w:t>
-      </w:r>
-    </w:p>
-    <w:p>
-      <w:pPr>
-        <w:spacing w:after="80" w:line="360" w:lineRule="auto"/>
-        <w:ind w:left="461" w:hanging="259"/>
-      </w:pPr>
-      <w:r>
-        <w:rPr>
-          <w:rFonts w:ascii="Times New Roman" w:hAnsi="Times New Roman"/>
-          <w:sz w:val="24"/>
-        </w:rPr>
-        <w:t>•</w:t>
-        <w:tab/>
-      </w:r>
-      <w:r>
-        <w:rPr>
-          <w:rFonts w:ascii="Times New Roman" w:hAnsi="Times New Roman"/>
-          <w:b/>
-          <w:sz w:val="24"/>
-        </w:rPr>
-        <w:t xml:space="preserve">Correctness annotation: </w:t>
-      </w:r>
-      <w:r>
-        <w:rPr>
-          <w:rFonts w:ascii="Times New Roman" w:hAnsi="Times New Roman"/>
-          <w:sz w:val="24"/>
-        </w:rPr>
-        <w:t>A misclassified intent can produce a safe but semantically wrong query, so semantic correctness must be annotated and measured separately from SQL safety.</w:t>
-      </w:r>
-    </w:p>
-    <w:p>
-      <w:pPr>
-        <w:spacing w:after="80" w:line="360" w:lineRule="auto"/>
-        <w:ind w:left="461" w:hanging="259"/>
-      </w:pPr>
-      <w:r>
-        <w:rPr>
-          <w:rFonts w:ascii="Times New Roman" w:hAnsi="Times New Roman"/>
-          <w:sz w:val="24"/>
-        </w:rPr>
-        <w:t>•</w:t>
-        <w:tab/>
-      </w:r>
-      <w:r>
-        <w:rPr>
-          <w:rFonts w:ascii="Times New Roman" w:hAnsi="Times New Roman"/>
-          <w:b/>
-          <w:sz w:val="24"/>
-        </w:rPr>
-        <w:t xml:space="preserve">Benchmark scope: </w:t>
-      </w:r>
-      <w:r>
-        <w:rPr>
-          <w:rFonts w:ascii="Times New Roman" w:hAnsi="Times New Roman"/>
-          <w:sz w:val="24"/>
-        </w:rPr>
-        <w:t>The custom 107-request benchmark evaluates AEGIS in one domain and is not directly comparable to Spider or BIRD leaderboard scores.</w:t>
-      </w:r>
-    </w:p>
-    <w:p>
-      <w:pPr>
-        <w:spacing w:after="80" w:line="360" w:lineRule="auto"/>
-        <w:ind w:left="461" w:hanging="259"/>
-      </w:pPr>
-      <w:r>
-        <w:rPr>
-          <w:rFonts w:ascii="Times New Roman" w:hAnsi="Times New Roman"/>
-          <w:sz w:val="24"/>
-        </w:rPr>
-        <w:t>•</w:t>
-        <w:tab/>
-      </w:r>
-      <w:r>
-        <w:rPr>
-          <w:rFonts w:ascii="Times New Roman" w:hAnsi="Times New Roman"/>
-          <w:b/>
-          <w:sz w:val="24"/>
-        </w:rPr>
-        <w:t xml:space="preserve">Prototype engineering limits: </w:t>
-      </w:r>
-      <w:r>
-        <w:rPr>
-          <w:rFonts w:ascii="Times New Roman" w:hAnsi="Times New Roman"/>
-          <w:sz w:val="24"/>
-        </w:rPr>
-        <w:t>The current version targets MySQL, uses prototype widget storage, and handles each request independently without multi-turn context.</w:t>
-      </w:r>
-    </w:p>
-    <w:p>
-      <w:pPr>
-        <w:spacing w:before="320" w:after="160"/>
-        <w:jc w:val="left"/>
-      </w:pPr>
-      <w:r>
-        <w:rPr>
-          <w:rFonts w:ascii="Times New Roman" w:hAnsi="Times New Roman"/>
-          <w:b/>
-          <w:sz w:val="28"/>
-        </w:rPr>
-        <w:t>6.2  Future Work</w:t>
-      </w:r>
-    </w:p>
-    <w:p>
-      <w:pPr>
-        <w:spacing w:after="80" w:line="360" w:lineRule="auto"/>
-        <w:ind w:left="461" w:hanging="259"/>
-      </w:pPr>
-      <w:r>
-        <w:rPr>
-          <w:rFonts w:ascii="Times New Roman" w:hAnsi="Times New Roman"/>
-          <w:sz w:val="24"/>
-        </w:rPr>
-        <w:t>•</w:t>
-        <w:tab/>
-      </w:r>
-      <w:r>
-        <w:rPr>
-          <w:rFonts w:ascii="Times New Roman" w:hAnsi="Times New Roman"/>
-          <w:b/>
-          <w:sz w:val="24"/>
-        </w:rPr>
-        <w:t xml:space="preserve">Clarification requests: </w:t>
-      </w:r>
-      <w:r>
-        <w:rPr>
-          <w:rFonts w:ascii="Times New Roman" w:hAnsi="Times New Roman"/>
-          <w:sz w:val="24"/>
-        </w:rPr>
-        <w:t>When confidence is low, AEGIS should ask a follow-up question instead of guessing, for example "did you mean revenue or profit?"</w:t>
-      </w:r>
-    </w:p>
-    <w:p>
-      <w:pPr>
-        <w:spacing w:after="80" w:line="360" w:lineRule="auto"/>
-        <w:ind w:left="461" w:hanging="259"/>
-      </w:pPr>
-      <w:r>
-        <w:rPr>
-          <w:rFonts w:ascii="Times New Roman" w:hAnsi="Times New Roman"/>
-          <w:sz w:val="24"/>
-        </w:rPr>
-        <w:t>•</w:t>
-        <w:tab/>
-      </w:r>
-      <w:r>
-        <w:rPr>
-          <w:rFonts w:ascii="Times New Roman" w:hAnsi="Times New Roman"/>
-          <w:b/>
-          <w:sz w:val="24"/>
-        </w:rPr>
-        <w:t xml:space="preserve">Semantic-layer tooling: </w:t>
-      </w:r>
-      <w:r>
-        <w:rPr>
-          <w:rFonts w:ascii="Times New Roman" w:hAnsi="Times New Roman"/>
-          <w:sz w:val="24"/>
-        </w:rPr>
-        <w:t>A guided interface should let business analysts define new metrics and dimensions, join paths, and approved vocabulary without editing Python code.</w:t>
-      </w:r>
-    </w:p>
-    <w:p>
-      <w:pPr>
-        <w:spacing w:after="80" w:line="360" w:lineRule="auto"/>
-        <w:ind w:left="461" w:hanging="259"/>
-      </w:pPr>
-      <w:r>
-        <w:rPr>
-          <w:rFonts w:ascii="Times New Roman" w:hAnsi="Times New Roman"/>
-          <w:sz w:val="24"/>
-        </w:rPr>
-        <w:t>•</w:t>
-        <w:tab/>
-      </w:r>
-      <w:r>
-        <w:rPr>
-          <w:rFonts w:ascii="Times New Roman" w:hAnsi="Times New Roman"/>
-          <w:b/>
-          <w:sz w:val="24"/>
-        </w:rPr>
-        <w:t xml:space="preserve">Stronger evaluation: </w:t>
-      </w:r>
-      <w:r>
-        <w:rPr>
-          <w:rFonts w:ascii="Times New Roman" w:hAnsi="Times New Roman"/>
-          <w:sz w:val="24"/>
-        </w:rPr>
-        <w:t>Annotated expected answers, B2 and B4 baselines, latency measurements, and correctness reporting should be added to strengthen the evaluation.</w:t>
-      </w:r>
-    </w:p>
-    <w:p>
-      <w:pPr>
-        <w:spacing w:after="80" w:line="360" w:lineRule="auto"/>
-        <w:ind w:left="461" w:hanging="259"/>
-      </w:pPr>
-      <w:r>
-        <w:rPr>
-          <w:rFonts w:ascii="Times New Roman" w:hAnsi="Times New Roman"/>
-          <w:sz w:val="24"/>
-        </w:rPr>
-        <w:t>•</w:t>
-        <w:tab/>
-      </w:r>
-      <w:r>
-        <w:rPr>
-          <w:rFonts w:ascii="Times New Roman" w:hAnsi="Times New Roman"/>
-          <w:b/>
-          <w:sz w:val="24"/>
-        </w:rPr>
-        <w:t xml:space="preserve">Cross-schema evaluation: </w:t>
-      </w:r>
-      <w:r>
-        <w:rPr>
-          <w:rFonts w:ascii="Times New Roman" w:hAnsi="Times New Roman"/>
-          <w:sz w:val="24"/>
-        </w:rPr>
-        <w:t>A second schema, such as WooCommerce, should be evaluated while keeping the intent parser contract, compiler structure, and safety scanner unchanged.</w:t>
-      </w:r>
-    </w:p>
-    <w:p>
-      <w:pPr>
-        <w:spacing w:after="80" w:line="360" w:lineRule="auto"/>
-        <w:ind w:left="461" w:hanging="259"/>
-      </w:pPr>
-      <w:r>
-        <w:rPr>
-          <w:rFonts w:ascii="Times New Roman" w:hAnsi="Times New Roman"/>
-          <w:sz w:val="24"/>
-        </w:rPr>
-        <w:t>•</w:t>
-        <w:tab/>
-      </w:r>
-      <w:r>
-        <w:rPr>
-          <w:rFonts w:ascii="Times New Roman" w:hAnsi="Times New Roman"/>
-          <w:b/>
-          <w:sz w:val="24"/>
-        </w:rPr>
-        <w:t xml:space="preserve">Production hardening: </w:t>
-      </w:r>
-      <w:r>
-        <w:rPr>
-          <w:rFonts w:ascii="Times New Roman" w:hAnsi="Times New Roman"/>
-          <w:sz w:val="24"/>
-        </w:rPr>
-        <w:t>Query-cost controls, database-backed widget storage, broader schema coverage, and multi-turn support should be added before production deployment.</w:t>
-      </w:r>
-    </w:p>
-    <w:p>
-      <w:pPr>
-        <w:spacing w:before="0" w:after="80"/>
-        <w:jc w:val="center"/>
-      </w:pPr>
-      <w:r>
-        <w:rPr>
-          <w:rFonts w:ascii="Times New Roman" w:hAnsi="Times New Roman"/>
-          <w:b/>
-          <w:sz w:val="32"/>
-        </w:rPr>
-        <w:t>CHAPTER 7</w:t>
-      </w:r>
-    </w:p>
-    <w:p>
-      <w:pPr>
-        <w:spacing w:after="400"/>
-        <w:jc w:val="center"/>
-      </w:pPr>
-      <w:r>
-        <w:rPr>
-          <w:rFonts w:ascii="Times New Roman" w:hAnsi="Times New Roman"/>
-          <w:b/>
-          <w:sz w:val="32"/>
-        </w:rPr>
-        <w:t>CONCLUSION</w:t>
-      </w:r>
-    </w:p>
-    <w:p>
-      <w:pPr>
-        <w:spacing w:after="240" w:before="0" w:line="360" w:lineRule="auto"/>
-        <w:jc w:val="both"/>
-      </w:pPr>
-      <w:r>
-        <w:rPr>
-          <w:rFonts w:ascii="Times New Roman" w:hAnsi="Times New Roman"/>
-          <w:b w:val="0"/>
-          <w:i w:val="0"/>
-          <w:sz w:val="24"/>
-        </w:rPr>
-        <w:t>This thesis presented AEGIS, a constraint-based architecture for safe LLM-assisted natural-language analytics over relational databases. The system limits the language model to intent extraction while query construction, chart selection, and widget persistence are handled by deterministic components. This design makes approved business terms explicit through a semantic layer and avoids exposing raw SQL generation authority to the language model.</w:t>
-      </w:r>
-    </w:p>
-    <w:p>
-      <w:pPr>
-        <w:spacing w:after="240" w:before="0" w:line="360" w:lineRule="auto"/>
-        <w:jc w:val="both"/>
-      </w:pPr>
-      <w:r>
-        <w:rPr>
-          <w:rFonts w:ascii="Times New Roman" w:hAnsi="Times New Roman"/>
-          <w:b w:val="0"/>
-          <w:i w:val="0"/>
-          <w:sz w:val="24"/>
-        </w:rPr>
-        <w:t>The prototype evaluation on a 107-request mixed benchmark showed that AEGIS produced no unsafe SQL statements and successfully executed 100 of 107 generated queries against the seeded MySQL database. In contrast, the direct LLM-to-SQL baseline executed 27 of 107 queries successfully and produced one genuine unsafe write statement. These results support the main argument that deterministic compilation and semantic-layer constraints can improve SQL safety in natural-language reporting systems.</w:t>
+        <w:t>The prototype evaluation on a 107-request mixed benchmark showed that AEGIS produced no unsafe SQL statements and successfully executed 100 of 107 generated queries against the seeded MySQL database. In contrast, the direct LLM-to-SQL baseline executed 27 of 107 queries successfully and produced one genuine unsafe write statement. A first-pass semantic-correctness annotation also showed stronger answerable-request correctness for AEGIS than for the evaluated baselines. These results support the main argument that deterministic compilation and semantic-layer constraints can improve SQL safety in natural-language reporting systems.</w:t>
       </w:r>
     </w:p>
     <w:p>

</xml_diff>

<commit_message>
Align AEGIS intent validation architecture
</commit_message>
<xml_diff>
--- a/docs/scripts/AEGIS Thesis Book Draft - A Constraint-Based Architecture for Safe LLM-Assisted Natural Language Analytics.docx
+++ b/docs/scripts/AEGIS Thesis Book Draft - A Constraint-Based Architecture for Safe LLM-Assisted Natural Language Analytics.docx
@@ -903,7 +903,7 @@
           <w:i w:val="0"/>
           <w:sz w:val="24"/>
         </w:rPr>
-        <w:t>Relational databases hold data organizations need for decisions, but non-technical users often depend on developers to translate business questions into SQL. Natural-language interfaces try to close this gap, but many current systems still allow a language model to author executable SQL directly, making safety dependent on model behavior rather than system structure. This thesis presents AEGIS (Analytics Engine with Guaranteed Injection Safety), an architecture that restricts the model to intent extraction while deterministic software handles semantic mapping, permission enforcement, SQL compilation, validation, visualization selection, and widget persistence. AEGIS uses a closed semantic layer of approved metrics, dimensions, analytical patterns, and join paths, so the model never outputs SQL text. Instead, it produces a typed intent object that can be checked before any query is compiled. The final evaluation uses static nopCommerce datasets: a 500-question natural-language benchmark, 16 source-derived Admin analytics oracles, 80 Admin-fidelity phrasings, and focused semantic-coverage checks. On the 500-question live benchmark, AEGIS parsed 498 of 500 prompts, answered and executed 422 of 425 supported requests, and rejected or clarified 74 of 75 realistic boundary requests. Against the Admin analytics oracles, it achieved 16 of 16 execution validity, 16 of 16 shape accuracy, and 15 of 16 result accuracy. These results support the thesis's central claim that AEGIS is a bounded architecture for safe natural-language analytics over a governed semantic layer, not an unlimited text-to-SQL engine.</w:t>
+        <w:t>Relational databases hold data organizations need for decisions, but non-technical users often depend on developers to translate business questions into SQL. Natural-language interfaces try to close this gap, but many current systems still allow a language model to author executable SQL directly, making safety dependent on model behavior rather than system structure. This thesis presents AEGIS (Analytics Engine with Guaranteed Injection Safety), an architecture that restricts the model to intent extraction while deterministic software handles semantic mapping, permission enforcement, SQL compilation, validation, visualization selection, and widget persistence. AEGIS uses a closed semantic layer of approved metrics, dimensions, analytical patterns, and join paths, so the model never outputs SQL text. Instead, it produces a typed intent object that can be checked before any query is compiled. The final evaluation uses static nopCommerce datasets: a 500-question natural-language benchmark, 16 source-derived Admin analytics oracles, 80 Admin-fidelity phrasings, and focused semantic-coverage checks. On the 500-question live benchmark, AEGIS parsed 498 of 500 prompts, answered and executed 422 of 425 supported requests, and rejected or clarified 74 of 75 realistic boundary requests. Against the Admin analytics oracles, it achieved 16 of 16 execution validity, 16 of 16 shape accuracy, and 15 of 16 result accuracy. These results support the thesis's central claim that AEGIS is a bounded architecture for safe natural-language analytics over a Approved semantic layer, not an unlimited text-to-SQL engine.</w:t>
       </w:r>
     </w:p>
     <w:p>
@@ -1953,7 +1953,7 @@
           <w:rFonts w:ascii="Times New Roman" w:hAnsi="Times New Roman"/>
           <w:sz w:val="24"/>
         </w:rPr>
-        <w:t>Figure 4: Vocabulary injection and coverage workflow</w:t>
+        <w:t>Figure 4: Vocabulary injection and structured intent validation workflow</w:t>
         <w:tab/>
         <w:t>16</w:t>
       </w:r>
@@ -8264,14 +8264,14 @@
           <w:b/>
           <w:sz w:val="24"/>
         </w:rPr>
-        <w:t xml:space="preserve">Stage 2 - Coverage Validation: </w:t>
+        <w:t xml:space="preserve">Stage 2 - Structured Intent Validation: </w:t>
       </w:r>
       <w:r>
         <w:rPr>
           <w:rFonts w:ascii="Times New Roman" w:hAnsi="Times New Roman"/>
           <w:sz w:val="24"/>
         </w:rPr>
-        <w:t>The server checks that both the metric term and the dimension term exist in the semantic layer vocabulary before anything else runs. Unknown identifiers are rejected here, with a structured message listing the available identifiers, rather than being passed to the compiler.</w:t>
+        <w:t>The server validates the LLM's structured intent against the semantic layer: metrics, dimensions, filters, patterns, and join rules must bind to approved objects. The original question is retained only for narrow non-executable cues such as write operations, direct credential or secret requests, and explicit prediction or causal-analysis requests outside the SQL-only prototype scope.</w:t>
       </w:r>
     </w:p>
     <w:p>
@@ -8428,7 +8428,7 @@
       <w:r>
         <w:drawing>
           <wp:inline xmlns:a="http://schemas.openxmlformats.org/drawingml/2006/main" xmlns:pic="http://schemas.openxmlformats.org/drawingml/2006/picture">
-            <wp:extent cx="5806440" cy="3088383"/>
+            <wp:extent cx="5806440" cy="3073589"/>
             <wp:docPr id="4" name="Picture 4"/>
             <wp:cNvGraphicFramePr>
               <a:graphicFrameLocks noChangeAspect="1"/>
@@ -8449,7 +8449,7 @@
                   <pic:spPr>
                     <a:xfrm>
                       <a:off x="0" y="0"/>
-                      <a:ext cx="5806440" cy="3088383"/>
+                      <a:ext cx="5806440" cy="3073589"/>
                     </a:xfrm>
                     <a:prstGeom prst="rect"/>
                   </pic:spPr>
@@ -8500,7 +8500,7 @@
           <w:i w:val="0"/>
           <w:sz w:val="24"/>
         </w:rPr>
-        <w:t>The semantic layer is the most important non-AI component of AEGIS. It separates business language from the underlying database structure and defines exactly which metrics, dimensions, joins, predicates, and permissions are allowed to exist. The semantic layer is also the main per-deployment implementation surface: to support another system, the developer defines that system's governed business vocabulary and join paths while preserving the same AEGIS architecture.</w:t>
+        <w:t>The semantic layer is the most important non-AI component of AEGIS. It separates business language from the underlying database structure and defines exactly which metrics, dimensions, joins, predicates, and permissions are allowed to exist. The semantic layer is also the main per-deployment implementation surface: to support another system, the developer defines that system's Approved business vocabulary and join paths while preserving the same AEGIS architecture.</w:t>
       </w:r>
     </w:p>
     <w:p>
@@ -9402,7 +9402,7 @@
           <w:i w:val="0"/>
           <w:sz w:val="24"/>
         </w:rPr>
-        <w:t>In the nopCommerce prototype, the semantic layer defines the governed metrics, dimensions, predicates, and join paths needed for the evaluated e-commerce analytics scope. The full nopCommerce schema is larger than this exposed vocabulary. Tables and fields that are not represented in the semantic layer cannot be requested through AEGIS, which is how the architecture keeps the answerable space useful but finite.</w:t>
+        <w:t>In the nopCommerce prototype, the semantic layer defines the Approved metrics, dimensions, predicates, and join paths needed for the evaluated e-commerce analytics scope. The full nopCommerce schema is larger than this exposed vocabulary. Tables and fields that are not represented in the semantic layer cannot be requested through AEGIS, which is how the architecture keeps the answerable space useful but finite.</w:t>
       </w:r>
     </w:p>
     <w:p>
@@ -9446,7 +9446,7 @@
           <w:i w:val="0"/>
           <w:sz w:val="24"/>
         </w:rPr>
-        <w:t>Structured output enforcement for LLMs [16] constrains the model's response to a fixed JSON schema before any downstream validation occurs, which is why Stage 1 can rely on a typed IntentObject rather than free-form text: malformed or off-schema output is rejected at the API boundary, before Stage 2 coverage validation ever runs.</w:t>
+        <w:t>Structured output enforcement for LLMs [16] constrains the model's response to a fixed JSON schema before any downstream validation occurs, which is why Stage 1 can rely on a typed IntentObject rather than free-form text: malformed or off-schema output is rejected at the API boundary, before structured intent validation ever runs.</w:t>
       </w:r>
     </w:p>
     <w:p>
@@ -9574,7 +9574,7 @@
       <w:r>
         <w:drawing>
           <wp:inline xmlns:a="http://schemas.openxmlformats.org/drawingml/2006/main" xmlns:pic="http://schemas.openxmlformats.org/drawingml/2006/picture">
-            <wp:extent cx="4983480" cy="5734130"/>
+            <wp:extent cx="4983480" cy="6251655"/>
             <wp:docPr id="6" name="Picture 6"/>
             <wp:cNvGraphicFramePr>
               <a:graphicFrameLocks noChangeAspect="1"/>
@@ -9595,7 +9595,7 @@
                   <pic:spPr>
                     <a:xfrm>
                       <a:off x="0" y="0"/>
-                      <a:ext cx="4983480" cy="5734130"/>
+                      <a:ext cx="4983480" cy="6251655"/>
                     </a:xfrm>
                     <a:prstGeom prst="rect"/>
                   </pic:spPr>
@@ -9617,7 +9617,7 @@
           <w:b/>
           <w:sz w:val="21"/>
         </w:rPr>
-        <w:t>Figure 4: Vocabulary injection and original-question coverage workflow</w:t>
+        <w:t>Figure 4: Vocabulary injection and structured intent validation workflow</w:t>
       </w:r>
     </w:p>
     <w:p>
@@ -9714,7 +9714,7 @@
           <w:sz w:val="19"/>
         </w:rPr>
         <w:br/>
-        <w:t>5. assemble WHERE from normalized time_range and governed predicates</w:t>
+        <w:t>5. assemble WHERE from normalized time_range and Approved predicates</w:t>
       </w:r>
       <w:r>
         <w:rPr>
@@ -12378,7 +12378,7 @@
           <w:i w:val="0"/>
           <w:sz w:val="24"/>
         </w:rPr>
-        <w:t>AEGIS is implemented as a web application with a vanilla HTML and JavaScript frontend and a Python FastAPI backend, targeting a nopCommerce 4.70-style e-commerce schema. The prototype follows the architecture from Chapter 3: the model extracts intent, the semantic layer supplies governed business definitions, and deterministic compiler templates produce SQL.</w:t>
+        <w:t>AEGIS is implemented as a web application with a vanilla HTML and JavaScript frontend and a Python FastAPI backend, targeting a nopCommerce 4.70-style e-commerce schema. The prototype follows the architecture from Chapter 3: the model extracts intent, the semantic layer supplies Approved business definitions, and deterministic compiler templates produce SQL.</w:t>
       </w:r>
     </w:p>
     <w:p>
@@ -12436,7 +12436,7 @@
           <w:rFonts w:ascii="Times New Roman" w:hAnsi="Times New Roman"/>
           <w:sz w:val="24"/>
         </w:rPr>
-        <w:t>Python configuration modules define governed metrics, dimensions, predicates, time anchors, join paths, grain rules, and mandatory platform filters.</w:t>
+        <w:t>Python configuration modules define Approved metrics, dimensions, predicates, time anchors, join paths, grain rules, and mandatory platform filters.</w:t>
       </w:r>
     </w:p>
     <w:p>
@@ -12545,14 +12545,14 @@
           <w:b/>
           <w:sz w:val="24"/>
         </w:rPr>
-        <w:t xml:space="preserve">Coverage validator: </w:t>
+        <w:t xml:space="preserve">Intent validator: </w:t>
       </w:r>
       <w:r>
         <w:rPr>
           <w:rFonts w:ascii="Times New Roman" w:hAnsi="Times New Roman"/>
           <w:sz w:val="24"/>
         </w:rPr>
-        <w:t>Coverage analysis checks the original user question against the semantic layer so unsupported concepts can be rejected or clarified instead of silently mapped to the nearest available metric.</w:t>
+        <w:t>Structured intent validation checks the LLM's normalized intent against the semantic layer, while the original question is used only for narrow safety and scope cues such as writes, direct secrets, and explicit non-SQL analysis modes.</w:t>
       </w:r>
     </w:p>
     <w:p>
@@ -12866,7 +12866,7 @@
                 <w:b w:val="0"/>
                 <w:sz w:val="21"/>
               </w:rPr>
-              <w:t>Coverage</w:t>
+              <w:t>Intent validation</w:t>
             </w:r>
           </w:p>
         </w:tc>
@@ -12892,7 +12892,7 @@
                 <w:b w:val="0"/>
                 <w:sz w:val="21"/>
               </w:rPr>
-              <w:t>coverage.py</w:t>
+              <w:t>coverage.py, mapper.py</w:t>
             </w:r>
           </w:p>
         </w:tc>
@@ -12918,7 +12918,7 @@
                 <w:b w:val="0"/>
                 <w:sz w:val="21"/>
               </w:rPr>
-              <w:t>Original-question inspection for unsupported e-commerce concepts</w:t>
+              <w:t>Structured binding checks plus narrow raw-text safety/scope cues</w:t>
             </w:r>
           </w:p>
         </w:tc>
@@ -13748,7 +13748,7 @@
           <w:i w:val="0"/>
           <w:sz w:val="24"/>
         </w:rPr>
-        <w:t>This evaluation is a prototype evaluation, not a large-scale independent leaderboard study. Its goal is to test whether the AEGIS architecture provides safe, governed natural-language analytics for a realistic e-commerce schema. General text-to-SQL benchmarks such as Spider and BIRD are valuable for SQL generation research, but they do not measure reusable dashboard widgets, semantic layer governance, or refusal of unsupported business questions.</w:t>
+        <w:t>This evaluation is a prototype evaluation, not a large-scale independent leaderboard study. Its goal is to test whether the AEGIS architecture provides safe, Approved natural-language analytics for a realistic e-commerce schema. General text-to-SQL benchmarks such as Spider and BIRD are valuable for SQL generation research, but they do not measure reusable dashboard widgets, semantic layer control, or refusal of unsupported business questions.</w:t>
       </w:r>
     </w:p>
     <w:p>
@@ -14277,7 +14277,7 @@
           <w:rFonts w:ascii="Times New Roman" w:hAnsi="Times New Roman"/>
           <w:sz w:val="24"/>
         </w:rPr>
-        <w:t>The model is prompted to generate SQL directly from a database schema. This baseline has broad expressive freedom but weak governance because joins, filters, and business definitions are inferred per request.</w:t>
+        <w:t>The model is prompted to generate SQL directly from a database schema. This baseline has broad expressive freedom but weak control because joins, filters, and business definitions are inferred per request.</w:t>
       </w:r>
     </w:p>
     <w:p>
@@ -15062,7 +15062,7 @@
           <w:i w:val="0"/>
           <w:sz w:val="24"/>
         </w:rPr>
-        <w:t>The main breadth benchmark contains natural-language questions that a store owner or administrator might ask about orders, revenue, customers, products, refunds, inventory, stores, countries, payment status, shipping, and search terms. The dataset intentionally includes unsupported questions as well, because a governed analytics system must know when not to answer.</w:t>
+        <w:t>The main breadth benchmark contains natural-language questions that a store owner or administrator might ask about orders, revenue, customers, products, refunds, inventory, stores, countries, payment status, shipping, and search terms. The dataset intentionally includes unsupported questions as well, because a Approved analytics system must know when not to answer.</w:t>
       </w:r>
     </w:p>
     <w:p>
@@ -16805,7 +16805,7 @@
                 <w:b w:val="0"/>
                 <w:sz w:val="21"/>
               </w:rPr>
-              <w:t>Coverage analysis checks the original user question against the semantic layer.</w:t>
+              <w:t>The structured intent must bind to approved semantic-layer definitions.</w:t>
             </w:r>
           </w:p>
         </w:tc>
@@ -16831,7 +16831,7 @@
                 <w:b w:val="0"/>
                 <w:sz w:val="21"/>
               </w:rPr>
-              <w:t>Coverage is finite and depends on deployment configuration.</w:t>
+              <w:t>Intent extraction can still misread vague language; debug traces and clarification reduce this risk.</w:t>
             </w:r>
           </w:p>
         </w:tc>
@@ -16950,7 +16950,7 @@
           <w:i w:val="0"/>
           <w:sz w:val="24"/>
         </w:rPr>
-        <w:t>A direct LLM-to-SQL baseline can appear attractive because it can always try to write a SELECT statement. However, allowing the model to author SQL moves business definitions, join choices, security behavior, and dialect correctness into a probabilistic component. AEGIS deliberately gives up unlimited query flexibility in exchange for governed definitions, deterministic compilation, and an explicit refusal path.</w:t>
+        <w:t>A direct LLM-to-SQL baseline can appear attractive because it can always try to write a SELECT statement. However, allowing the model to author SQL moves business definitions, join choices, security behavior, and dialect correctness into a probabilistic component. AEGIS deliberately gives up unlimited query flexibility in exchange for Approved definitions, deterministic compilation, and an explicit refusal path.</w:t>
       </w:r>
     </w:p>
     <w:p>

</xml_diff>